<commit_message>
update hydro ben function
</commit_message>
<xml_diff>
--- a/Kouba_Fish_and_Ag_Benefit_MS.docx
+++ b/Kouba_Fish_and_Ag_Benefit_MS.docx
@@ -153,7 +153,7 @@
       </w:r>
     </w:p>
     <w:bookmarkEnd w:id="20"/>
-    <w:bookmarkStart w:id="24" w:name="introduction"/>
+    <w:bookmarkStart w:id="25" w:name="introduction"/>
     <w:p>
       <w:pPr>
         <w:pStyle w:val="Heading1"/>
@@ -368,6 +368,8 @@
       <w:pPr>
         <w:pStyle w:val="ImageCaption"/>
       </w:pPr>
+      <w:bookmarkStart w:id="24" w:name="fig:scottLanduseMap"/>
+      <w:bookmarkEnd w:id="24"/>
       <w:r>
         <w:t xml:space="preserve">Figure 1: The Scott River flows south to north through Scott Valley before flowing through a canyon and joining the Klamath River. Land uses in the cultivated areas of the Scott River watershed are shown (adapted from the 2016 DWR Land Use Survey), as well as the location of several communities and the Fort Jones streamflow gauge (USGS Station ID 11519500).</w:t>
       </w:r>
@@ -375,8 +377,8 @@
         <w:t xml:space="preserve"> </w:t>
       </w:r>
     </w:p>
-    <w:bookmarkEnd w:id="24"/>
-    <w:bookmarkStart w:id="41" w:name="X525b2f83bcefbf206e3ace342b868d96bb1ee57"/>
+    <w:bookmarkEnd w:id="25"/>
+    <w:bookmarkStart w:id="46" w:name="X525b2f83bcefbf206e3ace342b868d96bb1ee57"/>
     <w:p>
       <w:pPr>
         <w:pStyle w:val="Heading1"/>
@@ -394,7 +396,7 @@
         <w:t xml:space="preserve">Case study and summary of GSP development</w:t>
       </w:r>
     </w:p>
-    <w:bookmarkStart w:id="28" w:name="hydrography-and-climate"/>
+    <w:bookmarkStart w:id="30" w:name="hydrography-and-climate"/>
     <w:p>
       <w:pPr>
         <w:pStyle w:val="Heading2"/>
@@ -548,18 +550,18 @@
           <wp:inline>
             <wp:extent cx="5334000" cy="4445000"/>
             <wp:effectExtent b="0" l="0" r="0" t="0"/>
-            <wp:docPr descr="Figure 2:  Summary of temperature (Panel A), rainfall and reference evapotranspiration (Panel B), and daily streamflow values (Panel C) in Scott Valley. For precipitation, regression relationships between the Callahan and Fort Jones weather station records and the records of NOAA stations in Greenview, Etna, and Yreka (USC00042899, USC00043614, USC00049866, and US1CASK0005) were used to predict missing values (i.e., fill gaps) in the Callahan and Fort Jones records; the daily mean of the two stations was used as the final precipitation record for purposes of this figure and the SVIHM precipitation input." title="" id="26" name="Picture"/>
+            <wp:docPr descr="Figure 2:  Summary of temperature (Panel A), rainfall and reference evapotranspiration (Panel B), and daily streamflow values (Panel C) in Scott Valley. For precipitation, regression relationships between the Callahan and Fort Jones weather station records and the records of NOAA stations in Greenview, Etna, and Yreka (USC00042899, USC00043614, USC00049866, and US1CASK0005) were used to predict missing values (i.e., fill gaps) in the Callahan and Fort Jones records; the daily mean of the two stations was used as the final precipitation record for purposes of this figure and the SVIHM precipitation input." title="" id="27" name="Picture"/>
             <a:graphic>
               <a:graphicData uri="http://schemas.openxmlformats.org/drawingml/2006/picture">
                 <pic:pic>
                   <pic:nvPicPr>
-                    <pic:cNvPr descr="Graphics%20and%20Supplements/Figure%201.png" id="27" name="Picture"/>
+                    <pic:cNvPr descr="Graphics%20and%20Supplements/Figure%201.png" id="28" name="Picture"/>
                     <pic:cNvPicPr>
                       <a:picLocks noChangeArrowheads="1" noChangeAspect="1"/>
                     </pic:cNvPicPr>
                   </pic:nvPicPr>
                   <pic:blipFill>
-                    <a:blip r:embed="rId25"/>
+                    <a:blip r:embed="rId26"/>
                     <a:stretch>
                       <a:fillRect/>
                     </a:stretch>
@@ -590,6 +592,8 @@
       <w:pPr>
         <w:pStyle w:val="ImageCaption"/>
       </w:pPr>
+      <w:bookmarkStart w:id="29" w:name="fig:precipAndTempFigure"/>
+      <w:bookmarkEnd w:id="29"/>
       <w:r>
         <w:t xml:space="preserve">Figure 2:</w:t>
       </w:r>
@@ -603,8 +607,8 @@
         <w:t xml:space="preserve">Summary of temperature (Panel A), rainfall and reference evapotranspiration (Panel B), and daily streamflow values (Panel C) in Scott Valley. For precipitation, regression relationships between the Callahan and Fort Jones weather station records and the records of NOAA stations in Greenview, Etna, and Yreka (USC00042899, USC00043614, USC00049866, and US1CASK0005) were used to predict missing values (i.e., fill gaps) in the Callahan and Fort Jones records; the daily mean of the two stations was used as the final precipitation record for purposes of this figure and the SVIHM precipitation input.</w:t>
       </w:r>
     </w:p>
-    <w:bookmarkEnd w:id="28"/>
-    <w:bookmarkStart w:id="29" w:name="X33d0072624d566dcf1fc914eaa47e60d958b5ff"/>
+    <w:bookmarkEnd w:id="30"/>
+    <w:bookmarkStart w:id="32" w:name="X33d0072624d566dcf1fc914eaa47e60d958b5ff"/>
     <w:p>
       <w:pPr>
         <w:pStyle w:val="Heading2"/>
@@ -705,6 +709,8 @@
       <w:pPr>
         <w:pStyle w:val="TableCaption"/>
       </w:pPr>
+      <w:bookmarkStart w:id="31" w:name="tab:scottLanduseTable"/>
+      <w:bookmarkEnd w:id="31"/>
       <w:r>
         <w:t xml:space="preserve">Table 1:</w:t>
       </w:r>
@@ -2108,8 +2114,8 @@
         </w:tc>
       </w:tr>
     </w:tbl>
-    <w:bookmarkEnd w:id="29"/>
-    <w:bookmarkStart w:id="38" w:name="water-uses-and-management-objectives"/>
+    <w:bookmarkEnd w:id="32"/>
+    <w:bookmarkStart w:id="43" w:name="water-uses-and-management-objectives"/>
     <w:p>
       <w:pPr>
         <w:pStyle w:val="Heading2"/>
@@ -2225,7 +2231,7 @@
         <w:t xml:space="preserve">, are tabulated in units of cubic feet per second (cfs). For consistency, this document will also use primarily cfs units, with metric units in parentheses.”</w:t>
       </w:r>
     </w:p>
-    <w:bookmarkStart w:id="30" w:name="environmental-stream-flows"/>
+    <w:bookmarkStart w:id="33" w:name="environmental-stream-flows"/>
     <w:p>
       <w:pPr>
         <w:pStyle w:val="Heading3"/>
@@ -2331,8 +2337,8 @@
         <w:t xml:space="preserve">], but in this work we focus on coho salmon, the most vulnerable species in the watershed. Future work could evaluate the suite of flows needed by a larger set of species in Scott Valley.</w:t>
       </w:r>
     </w:p>
-    <w:bookmarkEnd w:id="30"/>
-    <w:bookmarkStart w:id="37" w:name="agricultural-water-demand"/>
+    <w:bookmarkEnd w:id="33"/>
+    <w:bookmarkStart w:id="42" w:name="agricultural-water-demand"/>
     <w:p>
       <w:pPr>
         <w:pStyle w:val="Heading3"/>
@@ -2475,96 +2481,12 @@
           <wp:inline>
             <wp:extent cx="5334000" cy="3048000"/>
             <wp:effectExtent b="0" l="0" r="0" t="0"/>
-            <wp:docPr descr="Figure 3:  Average monthly water budget for the soil zone, simulated with SVIHM, for the model simulation period (water years 1991-2018). Positive and negative values indicate average net monthly fluxes into and out of the soil zone, respectively." title="" id="32" name="Picture"/>
+            <wp:docPr descr="Figure 3:  Average monthly water budget for the soil zone, simulated with SVIHM, for the model simulation period (water years 1991-2018). Positive and negative values indicate average net monthly fluxes into and out of the soil zone, respectively." title="" id="35" name="Picture"/>
             <a:graphic>
               <a:graphicData uri="http://schemas.openxmlformats.org/drawingml/2006/picture">
                 <pic:pic>
                   <pic:nvPicPr>
-                    <pic:cNvPr descr="Graphics%20and%20Supplements/Figure%202.png" id="33" name="Picture"/>
-                    <pic:cNvPicPr>
-                      <a:picLocks noChangeArrowheads="1" noChangeAspect="1"/>
-                    </pic:cNvPicPr>
-                  </pic:nvPicPr>
-                  <pic:blipFill>
-                    <a:blip r:embed="rId31"/>
-                    <a:stretch>
-                      <a:fillRect/>
-                    </a:stretch>
-                  </pic:blipFill>
-                  <pic:spPr bwMode="auto">
-                    <a:xfrm>
-                      <a:off x="0" y="0"/>
-                      <a:ext cx="5334000" cy="3048000"/>
-                    </a:xfrm>
-                    <a:prstGeom prst="rect">
-                      <a:avLst/>
-                    </a:prstGeom>
-                    <a:noFill/>
-                    <a:ln w="9525">
-                      <a:noFill/>
-                      <a:headEnd/>
-                      <a:tailEnd/>
-                    </a:ln>
-                  </pic:spPr>
-                </pic:pic>
-              </a:graphicData>
-            </a:graphic>
-          </wp:inline>
-        </w:drawing>
-      </w:r>
-    </w:p>
-    <w:p>
-      <w:pPr>
-        <w:pStyle w:val="ImageCaption"/>
-      </w:pPr>
-      <w:r>
-        <w:t xml:space="preserve">Figure 3:</w:t>
-      </w:r>
-      <w:r>
-        <w:t xml:space="preserve"> </w:t>
-      </w:r>
-      <w:r>
-        <w:t xml:space="preserve"> </w:t>
-      </w:r>
-      <w:r>
-        <w:t xml:space="preserve">Average monthly water budget for the soil zone, simulated with SVIHM, for the model simulation period (water years 1991-2018). Positive and negative values indicate average net monthly fluxes into and out of the soil zone, respectively.</w:t>
-      </w:r>
-    </w:p>
-    <w:p>
-      <w:pPr>
-        <w:pStyle w:val="SourceCode"/>
-      </w:pPr>
-      <w:r>
-        <w:rPr>
-          <w:rStyle w:val="VerbatimChar"/>
-        </w:rPr>
-        <w:t xml:space="preserve">## png </w:t>
-      </w:r>
-      <w:r>
-        <w:br/>
-      </w:r>
-      <w:r>
-        <w:rPr>
-          <w:rStyle w:val="VerbatimChar"/>
-        </w:rPr>
-        <w:t xml:space="preserve">##   2</w:t>
-      </w:r>
-    </w:p>
-    <w:p>
-      <w:pPr>
-        <w:pStyle w:val="CaptionedFigure"/>
-      </w:pPr>
-      <w:r>
-        <w:drawing>
-          <wp:inline>
-            <wp:extent cx="5334000" cy="3048000"/>
-            <wp:effectExtent b="0" l="0" r="0" t="0"/>
-            <wp:docPr descr="Figure 4:  Annual values for inflowing (positive) and outflowing (negative) water budget components in the SVIHM soil zone (historical basecase simulation). Irrigation refers to both groundwater and surface water sources; Recharge refers to water percolating through the soil column and recharging the aquifer below. Both crop ET and ET from native vegetation remain relatively stable year to year, while precipitation inputs, and thus recharge to the aquifer, have higher interannual variability." title="" id="35" name="Picture"/>
-            <a:graphic>
-              <a:graphicData uri="http://schemas.openxmlformats.org/drawingml/2006/picture">
-                <pic:pic>
-                  <pic:nvPicPr>
-                    <pic:cNvPr descr="Graphics%20and%20Supplements/Figure%203.png" id="36" name="Picture"/>
+                    <pic:cNvPr descr="Graphics%20and%20Supplements/Figure%202.png" id="36" name="Picture"/>
                     <pic:cNvPicPr>
                       <a:picLocks noChangeArrowheads="1" noChangeAspect="1"/>
                     </pic:cNvPicPr>
@@ -2601,6 +2523,94 @@
       <w:pPr>
         <w:pStyle w:val="ImageCaption"/>
       </w:pPr>
+      <w:bookmarkStart w:id="37" w:name="fig:avgWaterBudgetFig"/>
+      <w:bookmarkEnd w:id="37"/>
+      <w:r>
+        <w:t xml:space="preserve">Figure 3:</w:t>
+      </w:r>
+      <w:r>
+        <w:t xml:space="preserve"> </w:t>
+      </w:r>
+      <w:r>
+        <w:t xml:space="preserve"> </w:t>
+      </w:r>
+      <w:r>
+        <w:t xml:space="preserve">Average monthly water budget for the soil zone, simulated with SVIHM, for the model simulation period (water years 1991-2018). Positive and negative values indicate average net monthly fluxes into and out of the soil zone, respectively.</w:t>
+      </w:r>
+    </w:p>
+    <w:p>
+      <w:pPr>
+        <w:pStyle w:val="SourceCode"/>
+      </w:pPr>
+      <w:r>
+        <w:rPr>
+          <w:rStyle w:val="VerbatimChar"/>
+        </w:rPr>
+        <w:t xml:space="preserve">## png </w:t>
+      </w:r>
+      <w:r>
+        <w:br/>
+      </w:r>
+      <w:r>
+        <w:rPr>
+          <w:rStyle w:val="VerbatimChar"/>
+        </w:rPr>
+        <w:t xml:space="preserve">##   2</w:t>
+      </w:r>
+    </w:p>
+    <w:p>
+      <w:pPr>
+        <w:pStyle w:val="CaptionedFigure"/>
+      </w:pPr>
+      <w:r>
+        <w:drawing>
+          <wp:inline>
+            <wp:extent cx="5334000" cy="3048000"/>
+            <wp:effectExtent b="0" l="0" r="0" t="0"/>
+            <wp:docPr descr="Figure 4:  Annual values for inflowing (positive) and outflowing (negative) water budget components in the SVIHM soil zone (historical basecase simulation). Irrigation refers to both groundwater and surface water sources; Recharge refers to water percolating through the soil column and recharging the aquifer below. Both crop ET and ET from native vegetation remain relatively stable year to year, while precipitation inputs, and thus recharge to the aquifer, have higher interannual variability." title="" id="39" name="Picture"/>
+            <a:graphic>
+              <a:graphicData uri="http://schemas.openxmlformats.org/drawingml/2006/picture">
+                <pic:pic>
+                  <pic:nvPicPr>
+                    <pic:cNvPr descr="Graphics%20and%20Supplements/Figure%203.png" id="40" name="Picture"/>
+                    <pic:cNvPicPr>
+                      <a:picLocks noChangeArrowheads="1" noChangeAspect="1"/>
+                    </pic:cNvPicPr>
+                  </pic:nvPicPr>
+                  <pic:blipFill>
+                    <a:blip r:embed="rId38"/>
+                    <a:stretch>
+                      <a:fillRect/>
+                    </a:stretch>
+                  </pic:blipFill>
+                  <pic:spPr bwMode="auto">
+                    <a:xfrm>
+                      <a:off x="0" y="0"/>
+                      <a:ext cx="5334000" cy="3048000"/>
+                    </a:xfrm>
+                    <a:prstGeom prst="rect">
+                      <a:avLst/>
+                    </a:prstGeom>
+                    <a:noFill/>
+                    <a:ln w="9525">
+                      <a:noFill/>
+                      <a:headEnd/>
+                      <a:tailEnd/>
+                    </a:ln>
+                  </pic:spPr>
+                </pic:pic>
+              </a:graphicData>
+            </a:graphic>
+          </wp:inline>
+        </w:drawing>
+      </w:r>
+    </w:p>
+    <w:p>
+      <w:pPr>
+        <w:pStyle w:val="ImageCaption"/>
+      </w:pPr>
+      <w:bookmarkStart w:id="41" w:name="fig:annualSWBMBudget"/>
+      <w:bookmarkEnd w:id="41"/>
       <w:r>
         <w:t xml:space="preserve">Figure 4:</w:t>
       </w:r>
@@ -2614,9 +2624,9 @@
         <w:t xml:space="preserve">Annual values for inflowing (positive) and outflowing (negative) water budget components in the SVIHM soil zone (historical basecase simulation). Irrigation refers to both groundwater and surface water sources; Recharge refers to water percolating through the soil column and recharging the aquifer below. Both crop ET and ET from native vegetation remain relatively stable year to year, while precipitation inputs, and thus recharge to the aquifer, have higher interannual variability.</w:t>
       </w:r>
     </w:p>
-    <w:bookmarkEnd w:id="37"/>
-    <w:bookmarkEnd w:id="38"/>
-    <w:bookmarkStart w:id="39" w:name="gsp-development"/>
+    <w:bookmarkEnd w:id="42"/>
+    <w:bookmarkEnd w:id="43"/>
+    <w:bookmarkStart w:id="44" w:name="gsp-development"/>
     <w:p>
       <w:pPr>
         <w:pStyle w:val="Heading2"/>
@@ -2709,8 +2719,8 @@
         <w:t xml:space="preserve">, as described below.</w:t>
       </w:r>
     </w:p>
-    <w:bookmarkEnd w:id="39"/>
-    <w:bookmarkStart w:id="40" w:name="hydrologic-model-summary"/>
+    <w:bookmarkEnd w:id="44"/>
+    <w:bookmarkStart w:id="45" w:name="hydrologic-model-summary"/>
     <w:p>
       <w:pPr>
         <w:pStyle w:val="Heading2"/>
@@ -2812,9 +2822,9 @@
         <w:t xml:space="preserve">Simulated total ET of crops and native vegetation within the model domain.</w:t>
       </w:r>
     </w:p>
-    <w:bookmarkEnd w:id="40"/>
-    <w:bookmarkEnd w:id="41"/>
-    <w:bookmarkStart w:id="66" w:name="methods"/>
+    <w:bookmarkEnd w:id="45"/>
+    <w:bookmarkEnd w:id="46"/>
+    <w:bookmarkStart w:id="78" w:name="methods"/>
     <w:p>
       <w:pPr>
         <w:pStyle w:val="Heading1"/>
@@ -2870,6 +2880,8 @@
       <w:pPr>
         <w:pStyle w:val="TableCaption"/>
       </w:pPr>
+      <w:bookmarkStart w:id="47" w:name="tab:objFunctionTable"/>
+      <w:bookmarkEnd w:id="47"/>
       <w:r>
         <w:t xml:space="preserve">Table 2:</w:t>
       </w:r>
@@ -3268,7 +3280,7 @@
         </w:tc>
       </w:tr>
     </w:tbl>
-    <w:bookmarkStart w:id="45" w:name="objective-functions"/>
+    <w:bookmarkStart w:id="51" w:name="objective-functions"/>
     <w:p>
       <w:pPr>
         <w:pStyle w:val="Heading2"/>
@@ -3286,7 +3298,7 @@
         <w:t xml:space="preserve">Objective functions</w:t>
       </w:r>
     </w:p>
-    <w:bookmarkStart w:id="42" w:name="hydrologic-benefit-function"/>
+    <w:bookmarkStart w:id="48" w:name="hydrologic-benefit-function"/>
     <w:p>
       <w:pPr>
         <w:pStyle w:val="Heading3"/>
@@ -3561,7 +3573,7 @@
           <m:t>=</m:t>
         </m:r>
         <m:r>
-          <m:t>93.4</m:t>
+          <m:t>87.4</m:t>
         </m:r>
       </m:oMath>
       <w:r>
@@ -3601,14 +3613,14 @@
           <m:t>−</m:t>
         </m:r>
         <m:r>
-          <m:t>1.15</m:t>
+          <m:t>0.030</m:t>
         </m:r>
       </m:oMath>
       <w:r>
         <w:t xml:space="preserve"> </w:t>
       </w:r>
       <w:r>
-        <w:t xml:space="preserve">coho spf equiv. per day of reconnection after Aug. 31, 10 cfs</w:t>
+        <w:t xml:space="preserve">coho spf equiv. per day of reconnection after Aug. 31, 100 cfs</w:t>
       </w:r>
     </w:p>
     <w:p>
@@ -3641,14 +3653,14 @@
           <m:t>−</m:t>
         </m:r>
         <m:r>
-          <m:t>0.17</m:t>
+          <m:t>0.365</m:t>
         </m:r>
       </m:oMath>
       <w:r>
         <w:t xml:space="preserve"> </w:t>
       </w:r>
       <w:r>
-        <w:t xml:space="preserve">coho spf equiv. per day of reconnection after Aug. 31, 100 cfs</w:t>
+        <w:t xml:space="preserve">coho spf equiv. per day of reconnection after Aug. 31, 200 cfs</w:t>
       </w:r>
     </w:p>
     <w:p>
@@ -3675,20 +3687,14 @@
           <m:t>=</m:t>
         </m:r>
         <m:r>
-          <m:rPr>
-            <m:sty m:val="p"/>
-          </m:rPr>
-          <m:t>−</m:t>
-        </m:r>
-        <m:r>
-          <m:t>0.20</m:t>
+          <m:t>0.033</m:t>
         </m:r>
       </m:oMath>
       <w:r>
         <w:t xml:space="preserve"> </w:t>
       </w:r>
       <w:r>
-        <w:t xml:space="preserve">coho spf equiv. per day of wet season onset after Sep. 30</w:t>
+        <w:t xml:space="preserve">coho spf equiv. per day of disconnection after Aug. 31, 200 cfs</w:t>
       </w:r>
     </w:p>
     <w:p>
@@ -3715,14 +3721,60 @@
           <m:t>=</m:t>
         </m:r>
         <m:r>
-          <m:t>0.12</m:t>
+          <m:rPr>
+            <m:sty m:val="p"/>
+          </m:rPr>
+          <m:t>−</m:t>
+        </m:r>
+        <m:r>
+          <m:t>0.191</m:t>
         </m:r>
       </m:oMath>
       <w:r>
         <w:t xml:space="preserve"> </w:t>
       </w:r>
       <w:r>
-        <w:t xml:space="preserve">coho spf equiv. per day of wet season baseflow duration</w:t>
+        <w:t xml:space="preserve">coho spf equiv. per day of reconnection after Aug. 31, 8 cfs</w:t>
+      </w:r>
+    </w:p>
+    <w:p>
+      <w:pPr>
+        <w:pStyle w:val="BodyText"/>
+      </w:pPr>
+      <m:oMath>
+        <m:sSub>
+          <m:e>
+            <m:r>
+              <m:t>m</m:t>
+            </m:r>
+          </m:e>
+          <m:sub>
+            <m:r>
+              <m:t>5</m:t>
+            </m:r>
+          </m:sub>
+        </m:sSub>
+        <m:r>
+          <m:rPr>
+            <m:sty m:val="p"/>
+          </m:rPr>
+          <m:t>=</m:t>
+        </m:r>
+        <m:r>
+          <m:rPr>
+            <m:sty m:val="p"/>
+          </m:rPr>
+          <m:t>−</m:t>
+        </m:r>
+        <m:r>
+          <m:t>0.004</m:t>
+        </m:r>
+      </m:oMath>
+      <w:r>
+        <w:t xml:space="preserve"> </w:t>
+      </w:r>
+      <w:r>
+        <w:t xml:space="preserve">coho spf equiv. per cubic meter of lower dry season flow magnitude</w:t>
       </w:r>
     </w:p>
     <w:p>
@@ -4088,8 +4140,8 @@
         <w:t xml:space="preserve">, making them directly comparable to HB values derived from the simulated FJ flow records in the hypothetical management scenarios.</w:t>
       </w:r>
     </w:p>
-    <w:bookmarkEnd w:id="42"/>
-    <w:bookmarkStart w:id="43" w:name="Xb6ca5dd654202e76d1db9f1bc12c98cced9d6aa"/>
+    <w:bookmarkEnd w:id="48"/>
+    <w:bookmarkStart w:id="49" w:name="Xb6ca5dd654202e76d1db9f1bc12c98cced9d6aa"/>
     <w:p>
       <w:pPr>
         <w:pStyle w:val="Heading3"/>
@@ -4176,8 +4228,8 @@
         <w:t xml:space="preserve">. The assumption that crop ET is consistently related to yield or revenue breaks down for a management scenario that includes changing crops; this is explored further in the Discussion section. But on the merits of these options, annual crop ET was selected to represent agricultural benefit.</w:t>
       </w:r>
     </w:p>
-    <w:bookmarkEnd w:id="43"/>
-    <w:bookmarkStart w:id="44" w:name="Xfd5664932b25b1108017cbc6e0e75c8014ecd36"/>
+    <w:bookmarkEnd w:id="49"/>
+    <w:bookmarkStart w:id="50" w:name="Xfd5664932b25b1108017cbc6e0e75c8014ecd36"/>
     <w:p>
       <w:pPr>
         <w:pStyle w:val="Heading3"/>
@@ -4274,7 +4326,7 @@
         <w:t xml:space="preserve"> </w:t>
       </w:r>
       <w:r>
-        <w:t xml:space="preserve">??</w:t>
+        <w:t xml:space="preserve">4</w:t>
       </w:r>
       <w:r>
         <w:t xml:space="preserve"> </w:t>
@@ -4283,9 +4335,9 @@
         <w:t xml:space="preserve">for full list of assigned categories.</w:t>
       </w:r>
     </w:p>
-    <w:bookmarkEnd w:id="44"/>
-    <w:bookmarkEnd w:id="45"/>
-    <w:bookmarkStart w:id="48" w:name="analyses-of-objective-function-values"/>
+    <w:bookmarkEnd w:id="50"/>
+    <w:bookmarkEnd w:id="51"/>
+    <w:bookmarkStart w:id="54" w:name="analyses-of-objective-function-values"/>
     <w:p>
       <w:pPr>
         <w:pStyle w:val="Heading2"/>
@@ -4303,7 +4355,7 @@
         <w:t xml:space="preserve">Analyses of objective function values</w:t>
       </w:r>
     </w:p>
-    <w:bookmarkStart w:id="46" w:name="trade-off-efficiency-and-low-coho-years"/>
+    <w:bookmarkStart w:id="52" w:name="trade-off-efficiency-and-low-coho-years"/>
     <w:p>
       <w:pPr>
         <w:pStyle w:val="Heading3"/>
@@ -4370,7 +4422,43 @@
         <w:pStyle w:val="BodyText"/>
       </w:pPr>
       <w:r>
-        <w:t xml:space="preserve">For this analysis, which is not intended to identify one âbestâ or optimal solution, these trade-offs can be considered using scenario objective value differences relative to their basecase (historical simulated) values. We will call this quantity the âtrade-off efficiencyâ of a management scenario. For a given scenario, the trade-off efficiency, or Eff</w:t>
+        <w:t xml:space="preserve">For this analysis, which is not intended to identify one</w:t>
+      </w:r>
+      <w:r>
+        <w:t xml:space="preserve"> </w:t>
+      </w:r>
+      <w:r>
+        <w:t xml:space="preserve">“</w:t>
+      </w:r>
+      <w:r>
+        <w:t xml:space="preserve">best</w:t>
+      </w:r>
+      <w:r>
+        <w:t xml:space="preserve">”</w:t>
+      </w:r>
+      <w:r>
+        <w:t xml:space="preserve"> </w:t>
+      </w:r>
+      <w:r>
+        <w:t xml:space="preserve">or optimal solution, these trade-offs can be considered using scenario objective value differences relative to their basecase (historical simulated) values. We will call this quantity the</w:t>
+      </w:r>
+      <w:r>
+        <w:t xml:space="preserve"> </w:t>
+      </w:r>
+      <w:r>
+        <w:t xml:space="preserve">“</w:t>
+      </w:r>
+      <w:r>
+        <w:t xml:space="preserve">trade-off efficiency</w:t>
+      </w:r>
+      <w:r>
+        <w:t xml:space="preserve">”</w:t>
+      </w:r>
+      <w:r>
+        <w:t xml:space="preserve"> </w:t>
+      </w:r>
+      <w:r>
+        <w:t xml:space="preserve">of a management scenario. For a given scenario, the trade-off efficiency, or Eff</w:t>
       </w:r>
       <w:r>
         <w:rPr>
@@ -4496,8 +4584,8 @@
             <m:naryPr>
               <m:chr m:val="∑"/>
               <m:limLoc m:val="undOvr"/>
-              <m:subHide m:val="0"/>
-              <m:supHide m:val="0"/>
+              <m:subHide m:val="off"/>
+              <m:supHide m:val="off"/>
             </m:naryPr>
             <m:sub>
               <m:r>
@@ -4642,8 +4730,8 @@
             <m:naryPr>
               <m:chr m:val="∑"/>
               <m:limLoc m:val="undOvr"/>
-              <m:subHide m:val="0"/>
-              <m:supHide m:val="0"/>
+              <m:subHide m:val="off"/>
+              <m:supHide m:val="off"/>
             </m:naryPr>
             <m:sub>
               <m:r>
@@ -5176,8 +5264,8 @@
         </m:oMath>
       </m:oMathPara>
     </w:p>
-    <w:bookmarkEnd w:id="46"/>
-    <w:bookmarkStart w:id="47" w:name="pareto-optimal-set-of-management-actions"/>
+    <w:bookmarkEnd w:id="52"/>
+    <w:bookmarkStart w:id="53" w:name="pareto-optimal-set-of-management-actions"/>
     <w:p>
       <w:pPr>
         <w:pStyle w:val="Heading3"/>
@@ -5283,9 +5371,9 @@
         <w:t xml:space="preserve">in more than one objective, it must be included in the Pareto-optimal set.</w:t>
       </w:r>
     </w:p>
-    <w:bookmarkEnd w:id="47"/>
-    <w:bookmarkEnd w:id="48"/>
-    <w:bookmarkStart w:id="49" w:name="scenario-descriptions"/>
+    <w:bookmarkEnd w:id="53"/>
+    <w:bookmarkEnd w:id="54"/>
+    <w:bookmarkStart w:id="56" w:name="scenario-descriptions"/>
     <w:p>
       <w:pPr>
         <w:pStyle w:val="Heading2"/>
@@ -5366,6 +5454,8 @@
       <w:pPr>
         <w:pStyle w:val="TableCaption"/>
       </w:pPr>
+      <w:bookmarkStart w:id="55" w:name="tab:scenCategoryTab"/>
+      <w:bookmarkEnd w:id="55"/>
       <w:r>
         <w:t xml:space="preserve">Table 3:</w:t>
       </w:r>
@@ -8103,8 +8193,8 @@
         </w:tc>
       </w:tr>
     </w:tbl>
-    <w:bookmarkEnd w:id="49"/>
-    <w:bookmarkStart w:id="65" w:name="results"/>
+    <w:bookmarkEnd w:id="56"/>
+    <w:bookmarkStart w:id="77" w:name="results"/>
     <w:p>
       <w:pPr>
         <w:pStyle w:val="Heading2"/>
@@ -8133,7 +8223,7 @@
         <w:t xml:space="preserve">).</w:t>
       </w:r>
     </w:p>
-    <w:bookmarkStart w:id="56" w:name="X7919b09686293416b4bcb59483f48ae87a57064"/>
+    <w:bookmarkStart w:id="66" w:name="X7919b09686293416b4bcb59483f48ae87a57064"/>
     <w:p>
       <w:pPr>
         <w:pStyle w:val="Heading3"/>
@@ -8180,18 +8270,18 @@
           <wp:inline>
             <wp:extent cx="5334000" cy="5334000"/>
             <wp:effectExtent b="0" l="0" r="0" t="0"/>
-            <wp:docPr descr="(#fig:benefit_by_wy) Comparison of annual performance in two objective functions (HB and ET, representing environmental and agricultural objectives, respectively), in the basecase (black circles) and management scenarios (diamond, cross or x symbols) for water years 1991-2018. Panels A and B show comparisons between basecase and one example scenario in each of three categories: Enhanced Recharge, Low Flow Diversion Limits, and Curtailment. Panels C and D show comparisons between basecase and different cutoff dates within the Alfalfa Irrigation category: July 10th, August 1st and August 15th. Dry-type water years (vertical bars) are 1991, ’92, ’94, 2001, ’09, ’13, ’14, and ’18." title="" id="51" name="Picture"/>
+            <wp:docPr descr="Figure 5:  Comparison of annual performance in two objective functions (HB and ET, representing environmental and agricultural objectives, respectively), in the basecase (black circles) and management scenarios (diamond, cross or x symbols) for water years 1991-2018. Panels A and B show comparisons between basecase and one example scenario in each of three categories: Enhanced Recharge, Low Flow Diversion Limits, and Curtailment. Panels C and D show comparisons between basecase and different cutoff dates within the Alfalfa Irrigation category: July 10th, August 1st and August 15th. Dry-type water years (vertical bars) are 1991, ’92, ’94, 2001, ’09, ’13, ’14, and ’18." title="" id="58" name="Picture"/>
             <a:graphic>
               <a:graphicData uri="http://schemas.openxmlformats.org/drawingml/2006/picture">
                 <pic:pic>
                   <pic:nvPicPr>
-                    <pic:cNvPr descr="Graphics%20and%20Supplements/Figure%204.png" id="52" name="Picture"/>
+                    <pic:cNvPr descr="Graphics%20and%20Supplements/Figure%204.png" id="59" name="Picture"/>
                     <pic:cNvPicPr>
                       <a:picLocks noChangeArrowheads="1" noChangeAspect="1"/>
                     </pic:cNvPicPr>
                   </pic:nvPicPr>
                   <pic:blipFill>
-                    <a:blip r:embed="rId50"/>
+                    <a:blip r:embed="rId57"/>
                     <a:stretch>
                       <a:fillRect/>
                     </a:stretch>
@@ -8222,8 +8312,13 @@
       <w:pPr>
         <w:pStyle w:val="ImageCaption"/>
       </w:pPr>
-      <w:r>
-        <w:t xml:space="preserve">(#fig:benefit_by_wy)</w:t>
+      <w:bookmarkStart w:id="60" w:name="fig:benefitByWY"/>
+      <w:bookmarkEnd w:id="60"/>
+      <w:r>
+        <w:t xml:space="preserve">Figure 5:</w:t>
+      </w:r>
+      <w:r>
+        <w:t xml:space="preserve"> </w:t>
       </w:r>
       <w:r>
         <w:t xml:space="preserve"> </w:t>
@@ -8261,18 +8356,18 @@
           <wp:inline>
             <wp:extent cx="5334000" cy="5334000"/>
             <wp:effectExtent b="0" l="0" r="0" t="0"/>
-            <wp:docPr descr="(#fig:farmer_fish_tradeoff_figure) Environmental and agricultural objective function performance (in terms of Hydrologic Benefit, or HB, value; and crop ET volume) for basecase (black circle in upper left) and 39 management scenarios. Symbol x and y coordinates are the average of 28 annual HB and ET values for each scenario over the full model period (water years 1991-2018). Whiskers show standard error of the 28 years of annual HB values; standard errors in the direction of the y-axis are smaller than the height covered by each symbol." title="" id="54" name="Picture"/>
+            <wp:docPr descr="Figure 6:  Environmental and agricultural objective function performance (in terms of Hydrologic Benefit, or HB, value; and crop ET volume) for basecase (black circle in upper left) and 39 management scenarios. Symbol x and y coordinates are the average of 28 annual HB and ET values for each scenario over the full model period (water years 1991-2018). Whiskers show standard error of the 28 years of annual HB values; standard errors in the direction of the y-axis are smaller than the height covered by each symbol." title="" id="62" name="Picture"/>
             <a:graphic>
               <a:graphicData uri="http://schemas.openxmlformats.org/drawingml/2006/picture">
                 <pic:pic>
                   <pic:nvPicPr>
-                    <pic:cNvPr descr="Graphics%20and%20Supplements/Figure%205.png" id="55" name="Picture"/>
+                    <pic:cNvPr descr="Graphics%20and%20Supplements/Figure%205.png" id="63" name="Picture"/>
                     <pic:cNvPicPr>
                       <a:picLocks noChangeArrowheads="1" noChangeAspect="1"/>
                     </pic:cNvPicPr>
                   </pic:nvPicPr>
                   <pic:blipFill>
-                    <a:blip r:embed="rId53"/>
+                    <a:blip r:embed="rId61"/>
                     <a:stretch>
                       <a:fillRect/>
                     </a:stretch>
@@ -8303,8 +8398,13 @@
       <w:pPr>
         <w:pStyle w:val="ImageCaption"/>
       </w:pPr>
-      <w:r>
-        <w:t xml:space="preserve">(#fig:farmer_fish_tradeoff_figure)</w:t>
+      <w:bookmarkStart w:id="64" w:name="fig:farmerFishTradeoffFigure"/>
+      <w:bookmarkEnd w:id="64"/>
+      <w:r>
+        <w:t xml:space="preserve">Figure 6:</w:t>
+      </w:r>
+      <w:r>
+        <w:t xml:space="preserve"> </w:t>
       </w:r>
       <w:r>
         <w:t xml:space="preserve"> </w:t>
@@ -8684,8 +8784,13 @@
       <w:pPr>
         <w:pStyle w:val="TableCaption"/>
       </w:pPr>
-      <w:r>
-        <w:t xml:space="preserve">(#tab:scenario_results_tab)</w:t>
+      <w:bookmarkStart w:id="65" w:name="tab:scenarioResultsTab"/>
+      <w:bookmarkEnd w:id="65"/>
+      <w:r>
+        <w:t xml:space="preserve">Table 4:</w:t>
+      </w:r>
+      <w:r>
+        <w:t xml:space="preserve"> </w:t>
       </w:r>
       <w:r>
         <w:t xml:space="preserve">Scenario attributes for 40 scenarios. Units for Hydrologic Benefit (HB) value are coho smolt per female-equivalent; for ET are million cubic meters; both are averages of 28 annual values. Efficiency not calculated for scenarios with no average ET loss. (L-C) indicates the efficiency is averaged over the six low-coho years that occurred within that period, rather than the full model period 1991-2018.</w:t>
@@ -23387,8 +23492,8 @@
         </w:tc>
       </w:tr>
     </w:tbl>
-    <w:bookmarkEnd w:id="56"/>
-    <w:bookmarkStart w:id="60" w:name="X5717be130d28923be971a1bdea556d769a5487a"/>
+    <w:bookmarkEnd w:id="66"/>
+    <w:bookmarkStart w:id="71" w:name="X5717be130d28923be971a1bdea556d769a5487a"/>
     <w:p>
       <w:pPr>
         <w:pStyle w:val="Heading3"/>
@@ -23511,18 +23616,18 @@
           <wp:inline>
             <wp:extent cx="4620126" cy="5544151"/>
             <wp:effectExtent b="0" l="0" r="0" t="0"/>
-            <wp:docPr descr="Figure 5:  Scenario trade-off efficiencies, or average HB value gained per crop ET value lost (normalized to average basecase HB and ET values, respectively), in all 28 years (x-axis) and in six low-coho years (y-axis; i.e., the six years with basecase predicted HB values of less than 45 coho spf-equiv.). Basecase, Reservoir scenarios and one Enhanced Recharge scenario (MAR) are not included as they have on average no or negative ET loss." title="" id="58" name="Picture"/>
+            <wp:docPr descr="Figure 7:  Scenario trade-off efficiencies, or average HB value gained per crop ET value lost (normalized to average basecase HB and ET values, respectively), in all 28 years (x-axis) and in six low-coho years (y-axis; i.e., the six years with basecase predicted HB values of less than 45 coho spf-equiv.). Basecase, Reservoir scenarios and one Enhanced Recharge scenario (MAR) are not included as they have on average no or negative ET loss." title="" id="68" name="Picture"/>
             <a:graphic>
               <a:graphicData uri="http://schemas.openxmlformats.org/drawingml/2006/picture">
                 <pic:pic>
                   <pic:nvPicPr>
-                    <pic:cNvPr descr="Kouba_Fish_and_Ag_Benefit_MS_files/figure-docx/efficiency-1.png" id="59" name="Picture"/>
+                    <pic:cNvPr descr="Kouba_Fish_and_Ag_Benefit_MS_files/figure-docx/efficiency-1.png" id="69" name="Picture"/>
                     <pic:cNvPicPr>
                       <a:picLocks noChangeArrowheads="1" noChangeAspect="1"/>
                     </pic:cNvPicPr>
                   </pic:nvPicPr>
                   <pic:blipFill>
-                    <a:blip r:embed="rId57"/>
+                    <a:blip r:embed="rId67"/>
                     <a:stretch>
                       <a:fillRect/>
                     </a:stretch>
@@ -23553,8 +23658,10 @@
       <w:pPr>
         <w:pStyle w:val="ImageCaption"/>
       </w:pPr>
-      <w:r>
-        <w:t xml:space="preserve">Figure 5:</w:t>
+      <w:bookmarkStart w:id="70" w:name="fig:efficiency"/>
+      <w:bookmarkEnd w:id="70"/>
+      <w:r>
+        <w:t xml:space="preserve">Figure 7:</w:t>
       </w:r>
       <w:r>
         <w:t xml:space="preserve"> </w:t>
@@ -23566,8 +23673,8 @@
         <w:t xml:space="preserve">Scenario trade-off efficiencies, or average HB value gained per crop ET value lost (normalized to average basecase HB and ET values, respectively), in all 28 years (x-axis) and in six low-coho years (y-axis; i.e., the six years with basecase predicted HB values of less than 45 coho spf-equiv.). Basecase, Reservoir scenarios and one Enhanced Recharge scenario (MAR) are not included as they have on average no or negative ET loss.</w:t>
       </w:r>
     </w:p>
-    <w:bookmarkEnd w:id="60"/>
-    <w:bookmarkStart w:id="64" w:name="Xfbc83626841bb94e70b2ed42e58f7fe62bf81a6"/>
+    <w:bookmarkEnd w:id="71"/>
+    <w:bookmarkStart w:id="76" w:name="Xfbc83626841bb94e70b2ed42e58f7fe62bf81a6"/>
     <w:p>
       <w:pPr>
         <w:pStyle w:val="Heading3"/>
@@ -23699,20 +23806,20 @@
       <w:r>
         <w:drawing>
           <wp:inline>
-            <wp:extent cx="5334000" cy="4907534"/>
+            <wp:extent cx="4267200" cy="3926027"/>
             <wp:effectExtent b="0" l="0" r="0" t="0"/>
-            <wp:docPr descr="(#fig:farmer_fish_infra_figure_3d) A three-dimensional scatter plot of the objective function values for basecase and 39 management scenarios, averaged over 28 water years (1991-2018). Larger spheres are shown for the Pareto-optimal set of scenarios. Scenario colors correspond to legend in Figures 6 and 7." title="" id="62" name="Picture"/>
+            <wp:docPr descr="Figure 8:  A three-dimensional scatter plot of the objective function values for basecase and 39 management scenarios, averaged over 28 water years (1991-2018). Larger spheres are shown for the Pareto-optimal set of scenarios. Scenario colors correspond to legend in Figures 6 and 7." title="" id="73" name="Picture"/>
             <a:graphic>
               <a:graphicData uri="http://schemas.openxmlformats.org/drawingml/2006/picture">
                 <pic:pic>
                   <pic:nvPicPr>
-                    <pic:cNvPr descr="Graphics%20and%20Supplements/hbf%20et%20infra%20plot3d.PNG" id="63" name="Picture"/>
+                    <pic:cNvPr descr="Graphics%20and%20Supplements/hbf%20et%20infra%20plot3d.PNG" id="74" name="Picture"/>
                     <pic:cNvPicPr>
                       <a:picLocks noChangeArrowheads="1" noChangeAspect="1"/>
                     </pic:cNvPicPr>
                   </pic:nvPicPr>
                   <pic:blipFill>
-                    <a:blip r:embed="rId61"/>
+                    <a:blip r:embed="rId72"/>
                     <a:stretch>
                       <a:fillRect/>
                     </a:stretch>
@@ -23720,7 +23827,7 @@
                   <pic:spPr bwMode="auto">
                     <a:xfrm>
                       <a:off x="0" y="0"/>
-                      <a:ext cx="5334000" cy="4907534"/>
+                      <a:ext cx="4267200" cy="3926027"/>
                     </a:xfrm>
                     <a:prstGeom prst="rect">
                       <a:avLst/>
@@ -23743,8 +23850,13 @@
       <w:pPr>
         <w:pStyle w:val="ImageCaption"/>
       </w:pPr>
-      <w:r>
-        <w:t xml:space="preserve">(#fig:farmer_fish_infra_figure_3d)</w:t>
+      <w:bookmarkStart w:id="75" w:name="fig:farmerFishInfraFigure3D"/>
+      <w:bookmarkEnd w:id="75"/>
+      <w:r>
+        <w:t xml:space="preserve">Figure 8:</w:t>
+      </w:r>
+      <w:r>
+        <w:t xml:space="preserve"> </w:t>
       </w:r>
       <w:r>
         <w:t xml:space="preserve"> </w:t>
@@ -26740,10 +26852,10 @@
         <w:br w:type="page"/>
       </w:r>
     </w:p>
-    <w:bookmarkEnd w:id="64"/>
-    <w:bookmarkEnd w:id="65"/>
-    <w:bookmarkEnd w:id="66"/>
-    <w:bookmarkStart w:id="136" w:name="reference-section"/>
+    <w:bookmarkEnd w:id="76"/>
+    <w:bookmarkEnd w:id="77"/>
+    <w:bookmarkEnd w:id="78"/>
+    <w:bookmarkStart w:id="148" w:name="reference-section"/>
     <w:p>
       <w:pPr>
         <w:pStyle w:val="Heading1"/>
@@ -26752,8 +26864,8 @@
         <w:t xml:space="preserve">Reference section</w:t>
       </w:r>
     </w:p>
-    <w:bookmarkStart w:id="135" w:name="refs"/>
-    <w:bookmarkStart w:id="68" w:name="ref-Brown2015"/>
+    <w:bookmarkStart w:id="147" w:name="refs"/>
+    <w:bookmarkStart w:id="80" w:name="ref-Brown2015"/>
     <w:p>
       <w:pPr>
         <w:pStyle w:val="Bibliography"/>
@@ -26792,7 +26904,7 @@
       <w:r>
         <w:t xml:space="preserve"> </w:t>
       </w:r>
-      <w:hyperlink r:id="rId67">
+      <w:hyperlink r:id="rId79">
         <w:r>
           <w:rPr>
             <w:rStyle w:val="Hyperlink"/>
@@ -26804,8 +26916,8 @@
         <w:t xml:space="preserve">.</w:t>
       </w:r>
     </w:p>
-    <w:bookmarkEnd w:id="68"/>
-    <w:bookmarkStart w:id="70" w:name="ref-Brown1994"/>
+    <w:bookmarkEnd w:id="80"/>
+    <w:bookmarkStart w:id="82" w:name="ref-Brown1994"/>
     <w:p>
       <w:pPr>
         <w:pStyle w:val="Bibliography"/>
@@ -26844,7 +26956,7 @@
       <w:r>
         <w:t xml:space="preserve"> </w:t>
       </w:r>
-      <w:hyperlink r:id="rId69">
+      <w:hyperlink r:id="rId81">
         <w:r>
           <w:rPr>
             <w:rStyle w:val="Hyperlink"/>
@@ -26856,8 +26968,8 @@
         <w:t xml:space="preserve">.</w:t>
       </w:r>
     </w:p>
-    <w:bookmarkEnd w:id="70"/>
-    <w:bookmarkStart w:id="72" w:name="ref-CDFW2017"/>
+    <w:bookmarkEnd w:id="82"/>
+    <w:bookmarkStart w:id="84" w:name="ref-CDFW2017"/>
     <w:p>
       <w:pPr>
         <w:pStyle w:val="Bibliography"/>
@@ -26880,7 +26992,7 @@
       <w:r>
         <w:t xml:space="preserve"> </w:t>
       </w:r>
-      <w:hyperlink r:id="rId71">
+      <w:hyperlink r:id="rId83">
         <w:r>
           <w:rPr>
             <w:rStyle w:val="Hyperlink"/>
@@ -26892,8 +27004,8 @@
         <w:t xml:space="preserve">.</w:t>
       </w:r>
     </w:p>
-    <w:bookmarkEnd w:id="72"/>
-    <w:bookmarkStart w:id="74" w:name="ref-DWR2017"/>
+    <w:bookmarkEnd w:id="84"/>
+    <w:bookmarkStart w:id="86" w:name="ref-DWR2017"/>
     <w:p>
       <w:pPr>
         <w:pStyle w:val="Bibliography"/>
@@ -26916,7 +27028,7 @@
       <w:r>
         <w:t xml:space="preserve"> </w:t>
       </w:r>
-      <w:hyperlink r:id="rId73">
+      <w:hyperlink r:id="rId85">
         <w:r>
           <w:rPr>
             <w:rStyle w:val="Hyperlink"/>
@@ -26928,8 +27040,8 @@
         <w:t xml:space="preserve">.</w:t>
       </w:r>
     </w:p>
-    <w:bookmarkEnd w:id="74"/>
-    <w:bookmarkStart w:id="75" w:name="ref-SWRCB1975"/>
+    <w:bookmarkEnd w:id="86"/>
+    <w:bookmarkStart w:id="87" w:name="ref-SWRCB1975"/>
     <w:p>
       <w:pPr>
         <w:pStyle w:val="Bibliography"/>
@@ -26950,8 +27062,8 @@
         <w:t xml:space="preserve">.”</w:t>
       </w:r>
     </w:p>
-    <w:bookmarkEnd w:id="75"/>
-    <w:bookmarkStart w:id="77" w:name="ref-Carter1983"/>
+    <w:bookmarkEnd w:id="87"/>
+    <w:bookmarkStart w:id="89" w:name="ref-Carter1983"/>
     <w:p>
       <w:pPr>
         <w:pStyle w:val="Bibliography"/>
@@ -26990,7 +27102,7 @@
       <w:r>
         <w:t xml:space="preserve"> </w:t>
       </w:r>
-      <w:hyperlink r:id="rId76">
+      <w:hyperlink r:id="rId88">
         <w:r>
           <w:rPr>
             <w:rStyle w:val="Hyperlink"/>
@@ -27002,8 +27114,8 @@
         <w:t xml:space="preserve">.</w:t>
       </w:r>
     </w:p>
-    <w:bookmarkEnd w:id="77"/>
-    <w:bookmarkStart w:id="79" w:name="ref-CDFW2021c"/>
+    <w:bookmarkEnd w:id="89"/>
+    <w:bookmarkStart w:id="91" w:name="ref-CDFW2021c"/>
     <w:p>
       <w:pPr>
         <w:pStyle w:val="Bibliography"/>
@@ -27032,7 +27144,7 @@
       <w:r>
         <w:t xml:space="preserve"> </w:t>
       </w:r>
-      <w:hyperlink r:id="rId78">
+      <w:hyperlink r:id="rId90">
         <w:r>
           <w:rPr>
             <w:rStyle w:val="Hyperlink"/>
@@ -27044,8 +27156,8 @@
         <w:t xml:space="preserve">.</w:t>
       </w:r>
     </w:p>
-    <w:bookmarkEnd w:id="79"/>
-    <w:bookmarkStart w:id="81" w:name="ref-Cohon1973"/>
+    <w:bookmarkEnd w:id="91"/>
+    <w:bookmarkStart w:id="93" w:name="ref-Cohon1973"/>
     <w:p>
       <w:pPr>
         <w:pStyle w:val="Bibliography"/>
@@ -27084,7 +27196,7 @@
       <w:r>
         <w:t xml:space="preserve"> </w:t>
       </w:r>
-      <w:hyperlink r:id="rId80">
+      <w:hyperlink r:id="rId92">
         <w:r>
           <w:rPr>
             <w:rStyle w:val="Hyperlink"/>
@@ -27096,8 +27208,8 @@
         <w:t xml:space="preserve">.</w:t>
       </w:r>
     </w:p>
-    <w:bookmarkEnd w:id="81"/>
-    <w:bookmarkStart w:id="83" w:name="ref-Cohon1975"/>
+    <w:bookmarkEnd w:id="93"/>
+    <w:bookmarkStart w:id="95" w:name="ref-Cohon1975"/>
     <w:p>
       <w:pPr>
         <w:pStyle w:val="Bibliography"/>
@@ -27136,7 +27248,7 @@
       <w:r>
         <w:t xml:space="preserve"> </w:t>
       </w:r>
-      <w:hyperlink r:id="rId82">
+      <w:hyperlink r:id="rId94">
         <w:r>
           <w:rPr>
             <w:rStyle w:val="Hyperlink"/>
@@ -27148,8 +27260,8 @@
         <w:t xml:space="preserve">.</w:t>
       </w:r>
     </w:p>
-    <w:bookmarkEnd w:id="83"/>
-    <w:bookmarkStart w:id="84" w:name="ref-Cole2021"/>
+    <w:bookmarkEnd w:id="95"/>
+    <w:bookmarkStart w:id="96" w:name="ref-Cole2021"/>
     <w:p>
       <w:pPr>
         <w:pStyle w:val="Bibliography"/>
@@ -27176,8 +27288,8 @@
         <w:t xml:space="preserve">Merced, CA: University of California, Merced.</w:t>
       </w:r>
     </w:p>
-    <w:bookmarkEnd w:id="84"/>
-    <w:bookmarkStart w:id="86" w:name="ref-DiBaldassarre2019"/>
+    <w:bookmarkEnd w:id="96"/>
+    <w:bookmarkStart w:id="98" w:name="ref-DiBaldassarre2019"/>
     <w:p>
       <w:pPr>
         <w:pStyle w:val="Bibliography"/>
@@ -27216,7 +27328,7 @@
       <w:r>
         <w:t xml:space="preserve"> </w:t>
       </w:r>
-      <w:hyperlink r:id="rId85">
+      <w:hyperlink r:id="rId97">
         <w:r>
           <w:rPr>
             <w:rStyle w:val="Hyperlink"/>
@@ -27228,8 +27340,8 @@
         <w:t xml:space="preserve">.</w:t>
       </w:r>
     </w:p>
-    <w:bookmarkEnd w:id="86"/>
-    <w:bookmarkStart w:id="88" w:name="ref-DWR2019"/>
+    <w:bookmarkEnd w:id="98"/>
+    <w:bookmarkStart w:id="100" w:name="ref-DWR2019"/>
     <w:p>
       <w:pPr>
         <w:pStyle w:val="Bibliography"/>
@@ -27258,7 +27370,7 @@
       <w:r>
         <w:t xml:space="preserve"> </w:t>
       </w:r>
-      <w:hyperlink r:id="rId87">
+      <w:hyperlink r:id="rId99">
         <w:r>
           <w:rPr>
             <w:rStyle w:val="Hyperlink"/>
@@ -27270,8 +27382,8 @@
         <w:t xml:space="preserve">.</w:t>
       </w:r>
     </w:p>
-    <w:bookmarkEnd w:id="88"/>
-    <w:bookmarkStart w:id="90" w:name="ref-Foglia2013a"/>
+    <w:bookmarkEnd w:id="100"/>
+    <w:bookmarkStart w:id="102" w:name="ref-Foglia2013a"/>
     <w:p>
       <w:pPr>
         <w:pStyle w:val="Bibliography"/>
@@ -27300,7 +27412,7 @@
       <w:r>
         <w:t xml:space="preserve"> </w:t>
       </w:r>
-      <w:hyperlink r:id="rId89">
+      <w:hyperlink r:id="rId101">
         <w:r>
           <w:rPr>
             <w:rStyle w:val="Hyperlink"/>
@@ -27312,8 +27424,8 @@
         <w:t xml:space="preserve">.</w:t>
       </w:r>
     </w:p>
-    <w:bookmarkEnd w:id="90"/>
-    <w:bookmarkStart w:id="92" w:name="ref-FCGMA2019"/>
+    <w:bookmarkEnd w:id="102"/>
+    <w:bookmarkStart w:id="104" w:name="ref-FCGMA2019"/>
     <w:p>
       <w:pPr>
         <w:pStyle w:val="Bibliography"/>
@@ -27342,7 +27454,7 @@
       <w:r>
         <w:t xml:space="preserve"> </w:t>
       </w:r>
-      <w:hyperlink r:id="rId91">
+      <w:hyperlink r:id="rId103">
         <w:r>
           <w:rPr>
             <w:rStyle w:val="Hyperlink"/>
@@ -27354,8 +27466,8 @@
         <w:t xml:space="preserve">.</w:t>
       </w:r>
     </w:p>
-    <w:bookmarkEnd w:id="92"/>
-    <w:bookmarkStart w:id="94" w:name="ref-Gorelick1983"/>
+    <w:bookmarkEnd w:id="104"/>
+    <w:bookmarkStart w:id="106" w:name="ref-Gorelick1983"/>
     <w:p>
       <w:pPr>
         <w:pStyle w:val="Bibliography"/>
@@ -27394,7 +27506,7 @@
       <w:r>
         <w:t xml:space="preserve"> </w:t>
       </w:r>
-      <w:hyperlink r:id="rId93">
+      <w:hyperlink r:id="rId105">
         <w:r>
           <w:rPr>
             <w:rStyle w:val="Hyperlink"/>
@@ -27406,8 +27518,8 @@
         <w:t xml:space="preserve">.</w:t>
       </w:r>
     </w:p>
-    <w:bookmarkEnd w:id="94"/>
-    <w:bookmarkStart w:id="96" w:name="ref-Graham2012"/>
+    <w:bookmarkEnd w:id="106"/>
+    <w:bookmarkStart w:id="108" w:name="ref-Graham2012"/>
     <w:p>
       <w:pPr>
         <w:pStyle w:val="Bibliography"/>
@@ -27430,7 +27542,7 @@
       <w:r>
         <w:t xml:space="preserve"> </w:t>
       </w:r>
-      <w:hyperlink r:id="rId95">
+      <w:hyperlink r:id="rId107">
         <w:r>
           <w:rPr>
             <w:rStyle w:val="Hyperlink"/>
@@ -27442,8 +27554,8 @@
         <w:t xml:space="preserve">.</w:t>
       </w:r>
     </w:p>
-    <w:bookmarkEnd w:id="96"/>
-    <w:bookmarkStart w:id="98" w:name="ref-Harter2008"/>
+    <w:bookmarkEnd w:id="108"/>
+    <w:bookmarkStart w:id="110" w:name="ref-Harter2008"/>
     <w:p>
       <w:pPr>
         <w:pStyle w:val="Bibliography"/>
@@ -27472,7 +27584,7 @@
       <w:r>
         <w:t xml:space="preserve"> </w:t>
       </w:r>
-      <w:hyperlink r:id="rId97">
+      <w:hyperlink r:id="rId109">
         <w:r>
           <w:rPr>
             <w:rStyle w:val="Hyperlink"/>
@@ -27484,8 +27596,8 @@
         <w:t xml:space="preserve">.</w:t>
       </w:r>
     </w:p>
-    <w:bookmarkEnd w:id="98"/>
-    <w:bookmarkStart w:id="100" w:name="ref-Howitt1995"/>
+    <w:bookmarkEnd w:id="110"/>
+    <w:bookmarkStart w:id="112" w:name="ref-Howitt1995"/>
     <w:p>
       <w:pPr>
         <w:pStyle w:val="Bibliography"/>
@@ -27524,7 +27636,7 @@
       <w:r>
         <w:t xml:space="preserve"> </w:t>
       </w:r>
-      <w:hyperlink r:id="rId99">
+      <w:hyperlink r:id="rId111">
         <w:r>
           <w:rPr>
             <w:rStyle w:val="Hyperlink"/>
@@ -27536,8 +27648,8 @@
         <w:t xml:space="preserve">.</w:t>
       </w:r>
     </w:p>
-    <w:bookmarkEnd w:id="100"/>
-    <w:bookmarkStart w:id="102" w:name="ref-Kapelan2005"/>
+    <w:bookmarkEnd w:id="112"/>
+    <w:bookmarkStart w:id="114" w:name="ref-Kapelan2005"/>
     <w:p>
       <w:pPr>
         <w:pStyle w:val="Bibliography"/>
@@ -27576,7 +27688,7 @@
       <w:r>
         <w:t xml:space="preserve"> </w:t>
       </w:r>
-      <w:hyperlink r:id="rId101">
+      <w:hyperlink r:id="rId113">
         <w:r>
           <w:rPr>
             <w:rStyle w:val="Hyperlink"/>
@@ -27588,8 +27700,8 @@
         <w:t xml:space="preserve">.</w:t>
       </w:r>
     </w:p>
-    <w:bookmarkEnd w:id="102"/>
-    <w:bookmarkStart w:id="104" w:name="ref-Maass1962"/>
+    <w:bookmarkEnd w:id="114"/>
+    <w:bookmarkStart w:id="116" w:name="ref-Maass1962"/>
     <w:p>
       <w:pPr>
         <w:pStyle w:val="Bibliography"/>
@@ -27613,7 +27725,7 @@
       <w:r>
         <w:t xml:space="preserve"> </w:t>
       </w:r>
-      <w:hyperlink r:id="rId103">
+      <w:hyperlink r:id="rId115">
         <w:r>
           <w:rPr>
             <w:rStyle w:val="Hyperlink"/>
@@ -27625,8 +27737,8 @@
         <w:t xml:space="preserve">.</w:t>
       </w:r>
     </w:p>
-    <w:bookmarkEnd w:id="104"/>
-    <w:bookmarkStart w:id="106" w:name="ref-Mack1958"/>
+    <w:bookmarkEnd w:id="116"/>
+    <w:bookmarkStart w:id="118" w:name="ref-Mack1958"/>
     <w:p>
       <w:pPr>
         <w:pStyle w:val="Bibliography"/>
@@ -27652,7 +27764,7 @@
       <w:r>
         <w:t xml:space="preserve"> </w:t>
       </w:r>
-      <w:hyperlink r:id="rId105">
+      <w:hyperlink r:id="rId117">
         <w:r>
           <w:rPr>
             <w:rStyle w:val="Hyperlink"/>
@@ -27664,8 +27776,8 @@
         <w:t xml:space="preserve">.</w:t>
       </w:r>
     </w:p>
-    <w:bookmarkEnd w:id="106"/>
-    <w:bookmarkStart w:id="108" w:name="ref-Mahoney1998"/>
+    <w:bookmarkEnd w:id="118"/>
+    <w:bookmarkStart w:id="120" w:name="ref-Mahoney1998"/>
     <w:p>
       <w:pPr>
         <w:pStyle w:val="Bibliography"/>
@@ -27704,7 +27816,7 @@
       <w:r>
         <w:t xml:space="preserve"> </w:t>
       </w:r>
-      <w:hyperlink r:id="rId107">
+      <w:hyperlink r:id="rId119">
         <w:r>
           <w:rPr>
             <w:rStyle w:val="Hyperlink"/>
@@ -27716,8 +27828,8 @@
         <w:t xml:space="preserve">.</w:t>
       </w:r>
     </w:p>
-    <w:bookmarkEnd w:id="108"/>
-    <w:bookmarkStart w:id="110" w:name="ref-Monarchi1973"/>
+    <w:bookmarkEnd w:id="120"/>
+    <w:bookmarkStart w:id="122" w:name="ref-Monarchi1973"/>
     <w:p>
       <w:pPr>
         <w:pStyle w:val="Bibliography"/>
@@ -27756,7 +27868,7 @@
       <w:r>
         <w:t xml:space="preserve"> </w:t>
       </w:r>
-      <w:hyperlink r:id="rId109">
+      <w:hyperlink r:id="rId121">
         <w:r>
           <w:rPr>
             <w:rStyle w:val="Hyperlink"/>
@@ -27768,8 +27880,8 @@
         <w:t xml:space="preserve">.</w:t>
       </w:r>
     </w:p>
-    <w:bookmarkEnd w:id="110"/>
-    <w:bookmarkStart w:id="111" w:name="ref-NCRWQCB2006b"/>
+    <w:bookmarkEnd w:id="122"/>
+    <w:bookmarkStart w:id="123" w:name="ref-NCRWQCB2006b"/>
     <w:p>
       <w:pPr>
         <w:pStyle w:val="Bibliography"/>
@@ -27790,8 +27902,8 @@
         <w:t xml:space="preserve">.”</w:t>
       </w:r>
     </w:p>
-    <w:bookmarkEnd w:id="111"/>
-    <w:bookmarkStart w:id="112" w:name="ref-Pareto1896"/>
+    <w:bookmarkEnd w:id="123"/>
+    <w:bookmarkStart w:id="124" w:name="ref-Pareto1896"/>
     <w:p>
       <w:pPr>
         <w:pStyle w:val="Bibliography"/>
@@ -27813,8 +27925,8 @@
         <w:t xml:space="preserve">. Lausanne.</w:t>
       </w:r>
     </w:p>
-    <w:bookmarkEnd w:id="112"/>
-    <w:bookmarkStart w:id="113" w:name="ref-Reuss1992"/>
+    <w:bookmarkEnd w:id="124"/>
+    <w:bookmarkStart w:id="125" w:name="ref-Reuss1992"/>
     <w:p>
       <w:pPr>
         <w:pStyle w:val="Bibliography"/>
@@ -27851,8 +27963,8 @@
         <w:t xml:space="preserve">32 (1): 101–35.</w:t>
       </w:r>
     </w:p>
-    <w:bookmarkEnd w:id="113"/>
-    <w:bookmarkStart w:id="115" w:name="ref-Rodell2018"/>
+    <w:bookmarkEnd w:id="125"/>
+    <w:bookmarkStart w:id="127" w:name="ref-Rodell2018"/>
     <w:p>
       <w:pPr>
         <w:pStyle w:val="Bibliography"/>
@@ -27891,7 +28003,7 @@
       <w:r>
         <w:t xml:space="preserve"> </w:t>
       </w:r>
-      <w:hyperlink r:id="rId114">
+      <w:hyperlink r:id="rId126">
         <w:r>
           <w:rPr>
             <w:rStyle w:val="Hyperlink"/>
@@ -27903,8 +28015,8 @@
         <w:t xml:space="preserve">.</w:t>
       </w:r>
     </w:p>
-    <w:bookmarkEnd w:id="115"/>
-    <w:bookmarkStart w:id="117" w:name="ref-Rogers1986a"/>
+    <w:bookmarkEnd w:id="127"/>
+    <w:bookmarkStart w:id="129" w:name="ref-Rogers1986a"/>
     <w:p>
       <w:pPr>
         <w:pStyle w:val="Bibliography"/>
@@ -27943,7 +28055,7 @@
       <w:r>
         <w:t xml:space="preserve"> </w:t>
       </w:r>
-      <w:hyperlink r:id="rId116">
+      <w:hyperlink r:id="rId128">
         <w:r>
           <w:rPr>
             <w:rStyle w:val="Hyperlink"/>
@@ -27955,8 +28067,8 @@
         <w:t xml:space="preserve">.</w:t>
       </w:r>
     </w:p>
-    <w:bookmarkEnd w:id="117"/>
-    <w:bookmarkStart w:id="118" w:name="ref-SVAP1980"/>
+    <w:bookmarkEnd w:id="129"/>
+    <w:bookmarkStart w:id="130" w:name="ref-SVAP1980"/>
     <w:p>
       <w:pPr>
         <w:pStyle w:val="Bibliography"/>
@@ -27977,8 +28089,8 @@
         <w:t xml:space="preserve">.”</w:t>
       </w:r>
     </w:p>
-    <w:bookmarkEnd w:id="118"/>
-    <w:bookmarkStart w:id="120" w:name="ref-SiskiyouCounty2021"/>
+    <w:bookmarkEnd w:id="130"/>
+    <w:bookmarkStart w:id="132" w:name="ref-SiskiyouCounty2021"/>
     <w:p>
       <w:pPr>
         <w:pStyle w:val="Bibliography"/>
@@ -28007,7 +28119,7 @@
       <w:r>
         <w:t xml:space="preserve"> </w:t>
       </w:r>
-      <w:hyperlink r:id="rId119">
+      <w:hyperlink r:id="rId131">
         <w:r>
           <w:rPr>
             <w:rStyle w:val="Hyperlink"/>
@@ -28019,8 +28131,8 @@
         <w:t xml:space="preserve">.</w:t>
       </w:r>
     </w:p>
-    <w:bookmarkEnd w:id="120"/>
-    <w:bookmarkStart w:id="122" w:name="ref-Sunding1996"/>
+    <w:bookmarkEnd w:id="132"/>
+    <w:bookmarkStart w:id="134" w:name="ref-Sunding1996"/>
     <w:p>
       <w:pPr>
         <w:pStyle w:val="Bibliography"/>
@@ -28059,7 +28171,7 @@
       <w:r>
         <w:t xml:space="preserve"> </w:t>
       </w:r>
-      <w:hyperlink r:id="rId121">
+      <w:hyperlink r:id="rId133">
         <w:r>
           <w:rPr>
             <w:rStyle w:val="Hyperlink"/>
@@ -28071,8 +28183,8 @@
         <w:t xml:space="preserve">.</w:t>
       </w:r>
     </w:p>
-    <w:bookmarkEnd w:id="122"/>
-    <w:bookmarkStart w:id="124" w:name="ref-SuperiorCourtofSiskiyouCounty1980"/>
+    <w:bookmarkEnd w:id="134"/>
+    <w:bookmarkStart w:id="136" w:name="ref-SuperiorCourtofSiskiyouCounty1980"/>
     <w:p>
       <w:pPr>
         <w:pStyle w:val="Bibliography"/>
@@ -28098,7 +28210,7 @@
       <w:r>
         <w:t xml:space="preserve"> </w:t>
       </w:r>
-      <w:hyperlink r:id="rId123">
+      <w:hyperlink r:id="rId135">
         <w:r>
           <w:rPr>
             <w:rStyle w:val="Hyperlink"/>
@@ -28110,8 +28222,8 @@
         <w:t xml:space="preserve">.</w:t>
       </w:r>
     </w:p>
-    <w:bookmarkEnd w:id="124"/>
-    <w:bookmarkStart w:id="126" w:name="ref-Tolley2019"/>
+    <w:bookmarkEnd w:id="136"/>
+    <w:bookmarkStart w:id="138" w:name="ref-Tolley2019"/>
     <w:p>
       <w:pPr>
         <w:pStyle w:val="Bibliography"/>
@@ -28150,7 +28262,7 @@
       <w:r>
         <w:t xml:space="preserve"> </w:t>
       </w:r>
-      <w:hyperlink r:id="rId125">
+      <w:hyperlink r:id="rId137">
         <w:r>
           <w:rPr>
             <w:rStyle w:val="Hyperlink"/>
@@ -28162,8 +28274,8 @@
         <w:t xml:space="preserve">.</w:t>
       </w:r>
     </w:p>
-    <w:bookmarkEnd w:id="126"/>
-    <w:bookmarkStart w:id="128" w:name="ref-USCensusBureau2018"/>
+    <w:bookmarkEnd w:id="138"/>
+    <w:bookmarkStart w:id="140" w:name="ref-USCensusBureau2018"/>
     <w:p>
       <w:pPr>
         <w:pStyle w:val="Bibliography"/>
@@ -28186,7 +28298,7 @@
       <w:r>
         <w:t xml:space="preserve"> </w:t>
       </w:r>
-      <w:hyperlink r:id="rId127">
+      <w:hyperlink r:id="rId139">
         <w:r>
           <w:rPr>
             <w:rStyle w:val="Hyperlink"/>
@@ -28198,8 +28310,8 @@
         <w:t xml:space="preserve">.</w:t>
       </w:r>
     </w:p>
-    <w:bookmarkEnd w:id="128"/>
-    <w:bookmarkStart w:id="130" w:name="ref-USCensus2021"/>
+    <w:bookmarkEnd w:id="140"/>
+    <w:bookmarkStart w:id="142" w:name="ref-USCensus2021"/>
     <w:p>
       <w:pPr>
         <w:pStyle w:val="Bibliography"/>
@@ -28222,7 +28334,7 @@
       <w:r>
         <w:t xml:space="preserve"> </w:t>
       </w:r>
-      <w:hyperlink r:id="rId129">
+      <w:hyperlink r:id="rId141">
         <w:r>
           <w:rPr>
             <w:rStyle w:val="Hyperlink"/>
@@ -28234,8 +28346,8 @@
         <w:t xml:space="preserve">.</w:t>
       </w:r>
     </w:p>
-    <w:bookmarkEnd w:id="130"/>
-    <w:bookmarkStart w:id="131" w:name="ref-Williams2020"/>
+    <w:bookmarkEnd w:id="142"/>
+    <w:bookmarkStart w:id="143" w:name="ref-Williams2020"/>
     <w:p>
       <w:pPr>
         <w:pStyle w:val="Bibliography"/>
@@ -28272,8 +28384,8 @@
         <w:t xml:space="preserve">In press (April): 314–18.</w:t>
       </w:r>
     </w:p>
-    <w:bookmarkEnd w:id="131"/>
-    <w:bookmarkStart w:id="133" w:name="ref-Yeh1982"/>
+    <w:bookmarkEnd w:id="143"/>
+    <w:bookmarkStart w:id="145" w:name="ref-Yeh1982"/>
     <w:p>
       <w:pPr>
         <w:pStyle w:val="Bibliography"/>
@@ -28312,7 +28424,7 @@
       <w:r>
         <w:t xml:space="preserve"> </w:t>
       </w:r>
-      <w:hyperlink r:id="rId132">
+      <w:hyperlink r:id="rId144">
         <w:r>
           <w:rPr>
             <w:rStyle w:val="Hyperlink"/>
@@ -28324,8 +28436,8 @@
         <w:t xml:space="preserve">.</w:t>
       </w:r>
     </w:p>
-    <w:bookmarkEnd w:id="133"/>
-    <w:bookmarkStart w:id="134" w:name="ref-YSGA2022"/>
+    <w:bookmarkEnd w:id="145"/>
+    <w:bookmarkStart w:id="146" w:name="ref-YSGA2022"/>
     <w:p>
       <w:pPr>
         <w:pStyle w:val="Bibliography"/>
@@ -28352,9 +28464,9 @@
         <w:t xml:space="preserve">Woodland, CA.</w:t>
       </w:r>
     </w:p>
-    <w:bookmarkEnd w:id="134"/>
-    <w:bookmarkEnd w:id="135"/>
-    <w:bookmarkEnd w:id="136"/>
+    <w:bookmarkEnd w:id="146"/>
+    <w:bookmarkEnd w:id="147"/>
+    <w:bookmarkEnd w:id="148"/>
     <w:sectPr/>
   </w:body>
 </w:document>
@@ -28877,6 +28989,25 @@
       <w:jc w:val="center"/>
     </w:pPr>
   </w:style>
+  <w:style w:customStyle="1" w:styleId="AbstractTitle" w:type="paragraph">
+    <w:name w:val="Abstract Title"/>
+    <w:basedOn w:val="Normal"/>
+    <w:next w:val="Abstract"/>
+    <w:qFormat/>
+    <w:pPr>
+      <w:keepNext/>
+      <w:keepLines/>
+      <w:jc w:val="center"/>
+      <w:spacing w:after="0" w:before="300"/>
+    </w:pPr>
+    <w:rPr>
+      <w:sz w:val="20"/>
+      <w:szCs w:val="20"/>
+      <w:b/>
+      <w:color w:val="345A8A"/>
+      &gt;
+    </w:rPr>
+  </w:style>
   <w:style w:customStyle="1" w:styleId="Abstract" w:type="paragraph">
     <w:name w:val="Abstract"/>
     <w:basedOn w:val="Normal"/>
@@ -28885,7 +29016,7 @@
     <w:pPr>
       <w:keepNext/>
       <w:keepLines/>
-      <w:spacing w:after="300" w:before="300"/>
+      <w:spacing w:after="300" w:before="100"/>
     </w:pPr>
     <w:rPr>
       <w:sz w:val="20"/>
@@ -29108,6 +29239,18 @@
     <w:unhideWhenUsed/>
     <w:qFormat/>
   </w:style>
+  <w:style w:styleId="FootnoteBlockText" w:type="paragraph">
+    <w:name w:val="Footnote Block Text"/>
+    <w:basedOn w:val="Footnote Text"/>
+    <w:next w:val="Footnote Text"/>
+    <w:uiPriority w:val="9"/>
+    <w:unhideWhenUsed/>
+    <w:qFormat/>
+    <w:pPr>
+      <w:spacing w:after="100" w:before="100"/>
+      <w:ind w:firstLine="0" w:left="480" w:right="480"/>
+    </w:pPr>
+  </w:style>
   <w:style w:default="1" w:styleId="DefaultParagraphFont" w:type="character">
     <w:name w:val="Default Paragraph Font"/>
     <w:semiHidden/>
@@ -29297,7 +29440,7 @@
     <w:name w:val="ConstantTok"/>
     <w:basedOn w:val="VerbatimChar"/>
     <w:rPr>
-      <w:color w:val="000000"/>
+      <w:color w:val="8f5902"/>
       <w:shd w:val="clear" w:fill="f8f8f8"/>
     </w:rPr>
   </w:style>
@@ -29313,8 +29456,9 @@
     <w:name w:val="SpecialCharTok"/>
     <w:basedOn w:val="VerbatimChar"/>
     <w:rPr>
-      <w:color w:val="000000"/>
+      <w:color w:val="ce5c00"/>
       <w:shd w:val="clear" w:fill="f8f8f8"/>
+      <w:b/>
     </w:rPr>
   </w:style>
   <w:style w:type="character" w:customStyle="1" w:styleId="StringTok">
@@ -29399,8 +29543,9 @@
     <w:name w:val="FunctionTok"/>
     <w:basedOn w:val="VerbatimChar"/>
     <w:rPr>
-      <w:color w:val="000000"/>
+      <w:color w:val="204a87"/>
       <w:shd w:val="clear" w:fill="f8f8f8"/>
+      <w:b/>
     </w:rPr>
   </w:style>
   <w:style w:type="character" w:customStyle="1" w:styleId="VariableTok">
@@ -29456,7 +29601,7 @@
     <w:name w:val="AttributeTok"/>
     <w:basedOn w:val="VerbatimChar"/>
     <w:rPr>
-      <w:color w:val="c4a000"/>
+      <w:color w:val="204a87"/>
       <w:shd w:val="clear" w:fill="f8f8f8"/>
     </w:rPr>
   </w:style>

</xml_diff>

<commit_message>
now knits through discussion
</commit_message>
<xml_diff>
--- a/Kouba_Fish_and_Ag_Benefit_MS.docx
+++ b/Kouba_Fish_and_Ag_Benefit_MS.docx
@@ -153,7 +153,7 @@
       </w:r>
     </w:p>
     <w:bookmarkEnd w:id="20"/>
-    <w:bookmarkStart w:id="24" w:name="introduction"/>
+    <w:bookmarkStart w:id="25" w:name="introduction"/>
     <w:p>
       <w:pPr>
         <w:pStyle w:val="Heading1"/>
@@ -368,6 +368,8 @@
       <w:pPr>
         <w:pStyle w:val="ImageCaption"/>
       </w:pPr>
+      <w:bookmarkStart w:id="24" w:name="fig:scottLanduseMap"/>
+      <w:bookmarkEnd w:id="24"/>
       <w:r>
         <w:t xml:space="preserve">Figure 1: The Scott River flows south to north through Scott Valley before flowing through a canyon and joining the Klamath River. Land uses in the cultivated areas of the Scott River watershed are shown (adapted from the 2016 DWR Land Use Survey), as well as the location of several communities and the Fort Jones streamflow gauge (USGS Station ID 11519500).</w:t>
       </w:r>
@@ -375,8 +377,8 @@
         <w:t xml:space="preserve"> </w:t>
       </w:r>
     </w:p>
-    <w:bookmarkEnd w:id="24"/>
-    <w:bookmarkStart w:id="41" w:name="X525b2f83bcefbf206e3ace342b868d96bb1ee57"/>
+    <w:bookmarkEnd w:id="25"/>
+    <w:bookmarkStart w:id="46" w:name="X525b2f83bcefbf206e3ace342b868d96bb1ee57"/>
     <w:p>
       <w:pPr>
         <w:pStyle w:val="Heading1"/>
@@ -394,7 +396,7 @@
         <w:t xml:space="preserve">Case study and summary of GSP development</w:t>
       </w:r>
     </w:p>
-    <w:bookmarkStart w:id="28" w:name="hydrography-and-climate"/>
+    <w:bookmarkStart w:id="30" w:name="hydrography-and-climate"/>
     <w:p>
       <w:pPr>
         <w:pStyle w:val="Heading2"/>
@@ -521,6 +523,26 @@
     </w:p>
     <w:p>
       <w:pPr>
+        <w:pStyle w:val="SourceCode"/>
+      </w:pPr>
+      <w:r>
+        <w:rPr>
+          <w:rStyle w:val="VerbatimChar"/>
+        </w:rPr>
+        <w:t xml:space="preserve">## png </w:t>
+      </w:r>
+      <w:r>
+        <w:br/>
+      </w:r>
+      <w:r>
+        <w:rPr>
+          <w:rStyle w:val="VerbatimChar"/>
+        </w:rPr>
+        <w:t xml:space="preserve">##   2</w:t>
+      </w:r>
+    </w:p>
+    <w:p>
+      <w:pPr>
         <w:pStyle w:val="CaptionedFigure"/>
       </w:pPr>
       <w:r>
@@ -528,18 +550,18 @@
           <wp:inline>
             <wp:extent cx="5334000" cy="4445000"/>
             <wp:effectExtent b="0" l="0" r="0" t="0"/>
-            <wp:docPr descr="Figure 2:  Summary of temperature (Panel A), rainfall and reference evapotranspiration (Panel B), and daily streamflow values (Panel C) in Scott Valley. For precipitation, regression relationships between the Callahan and Fort Jones weather station records and the records of NOAA stations in Greenview, Etna, and Yreka (USC00042899, USC00043614, USC00049866, and US1CASK0005) were used to predict missing values (i.e., fill gaps) in the Callahan and Fort Jones records; the daily mean of the two stations was used as the final precipitation record for purposes of this figure and the SVIHM precipitation input." title="" id="26" name="Picture"/>
+            <wp:docPr descr="Figure 2:  Summary of temperature (Panel A), rainfall and reference evapotranspiration (Panel B), and daily streamflow values (Panel C) in Scott Valley. For precipitation, regression relationships between the Callahan and Fort Jones weather station records and the records of NOAA stations in Greenview, Etna, and Yreka (USC00042899, USC00043614, USC00049866, and US1CASK0005) were used to predict missing values (i.e., fill gaps) in the Callahan and Fort Jones records; the daily mean of the two stations was used as the final precipitation record for purposes of this figure and the SVIHM precipitation input." title="" id="27" name="Picture"/>
             <a:graphic>
               <a:graphicData uri="http://schemas.openxmlformats.org/drawingml/2006/picture">
                 <pic:pic>
                   <pic:nvPicPr>
-                    <pic:cNvPr descr="Graphics%20and%20Supplements/Figure%201.png" id="27" name="Picture"/>
+                    <pic:cNvPr descr="Graphics%20and%20Supplements/Figure%201.png" id="28" name="Picture"/>
                     <pic:cNvPicPr>
                       <a:picLocks noChangeArrowheads="1" noChangeAspect="1"/>
                     </pic:cNvPicPr>
                   </pic:nvPicPr>
                   <pic:blipFill>
-                    <a:blip r:embed="rId25"/>
+                    <a:blip r:embed="rId26"/>
                     <a:stretch>
                       <a:fillRect/>
                     </a:stretch>
@@ -570,6 +592,8 @@
       <w:pPr>
         <w:pStyle w:val="ImageCaption"/>
       </w:pPr>
+      <w:bookmarkStart w:id="29" w:name="fig:precipAndTempFigure"/>
+      <w:bookmarkEnd w:id="29"/>
       <w:r>
         <w:t xml:space="preserve">Figure 2:</w:t>
       </w:r>
@@ -583,8 +607,8 @@
         <w:t xml:space="preserve">Summary of temperature (Panel A), rainfall and reference evapotranspiration (Panel B), and daily streamflow values (Panel C) in Scott Valley. For precipitation, regression relationships between the Callahan and Fort Jones weather station records and the records of NOAA stations in Greenview, Etna, and Yreka (USC00042899, USC00043614, USC00049866, and US1CASK0005) were used to predict missing values (i.e., fill gaps) in the Callahan and Fort Jones records; the daily mean of the two stations was used as the final precipitation record for purposes of this figure and the SVIHM precipitation input.</w:t>
       </w:r>
     </w:p>
-    <w:bookmarkEnd w:id="28"/>
-    <w:bookmarkStart w:id="29" w:name="X33d0072624d566dcf1fc914eaa47e60d958b5ff"/>
+    <w:bookmarkEnd w:id="30"/>
+    <w:bookmarkStart w:id="32" w:name="X33d0072624d566dcf1fc914eaa47e60d958b5ff"/>
     <w:p>
       <w:pPr>
         <w:pStyle w:val="Heading2"/>
@@ -685,6 +709,8 @@
       <w:pPr>
         <w:pStyle w:val="TableCaption"/>
       </w:pPr>
+      <w:bookmarkStart w:id="31" w:name="tab:scottLanduseTable"/>
+      <w:bookmarkEnd w:id="31"/>
       <w:r>
         <w:t xml:space="preserve">Table 1:</w:t>
       </w:r>
@@ -2088,8 +2114,8 @@
         </w:tc>
       </w:tr>
     </w:tbl>
-    <w:bookmarkEnd w:id="29"/>
-    <w:bookmarkStart w:id="38" w:name="water-uses-and-management-objectives"/>
+    <w:bookmarkEnd w:id="32"/>
+    <w:bookmarkStart w:id="43" w:name="water-uses-and-management-objectives"/>
     <w:p>
       <w:pPr>
         <w:pStyle w:val="Heading2"/>
@@ -2205,7 +2231,7 @@
         <w:t xml:space="preserve">, are tabulated in units of cubic feet per second (cfs). For consistency, this document will also use primarily cfs units, with metric units in parentheses.”</w:t>
       </w:r>
     </w:p>
-    <w:bookmarkStart w:id="30" w:name="environmental-stream-flows"/>
+    <w:bookmarkStart w:id="33" w:name="environmental-stream-flows"/>
     <w:p>
       <w:pPr>
         <w:pStyle w:val="Heading3"/>
@@ -2311,8 +2337,8 @@
         <w:t xml:space="preserve">], but in this work we focus on coho salmon, the most vulnerable species in the watershed. Future work could evaluate the suite of flows needed by a larger set of species in Scott Valley.</w:t>
       </w:r>
     </w:p>
-    <w:bookmarkEnd w:id="30"/>
-    <w:bookmarkStart w:id="37" w:name="agricultural-water-demand"/>
+    <w:bookmarkEnd w:id="33"/>
+    <w:bookmarkStart w:id="42" w:name="agricultural-water-demand"/>
     <w:p>
       <w:pPr>
         <w:pStyle w:val="Heading3"/>
@@ -2455,76 +2481,12 @@
           <wp:inline>
             <wp:extent cx="5334000" cy="3048000"/>
             <wp:effectExtent b="0" l="0" r="0" t="0"/>
-            <wp:docPr descr="Figure 3:  Average monthly water budget for the soil zone, simulated with SVIHM, for the model simulation period (water years 1991-2018). Positive and negative values indicate average net monthly fluxes into and out of the soil zone, respectively." title="" id="32" name="Picture"/>
+            <wp:docPr descr="Figure 3:  Average monthly water budget for the soil zone, simulated with SVIHM, for the model simulation period (water years 1991-2018). Positive and negative values indicate average net monthly fluxes into and out of the soil zone, respectively." title="" id="35" name="Picture"/>
             <a:graphic>
               <a:graphicData uri="http://schemas.openxmlformats.org/drawingml/2006/picture">
                 <pic:pic>
                   <pic:nvPicPr>
-                    <pic:cNvPr descr="Graphics%20and%20Supplements/Figure%202.png" id="33" name="Picture"/>
-                    <pic:cNvPicPr>
-                      <a:picLocks noChangeArrowheads="1" noChangeAspect="1"/>
-                    </pic:cNvPicPr>
-                  </pic:nvPicPr>
-                  <pic:blipFill>
-                    <a:blip r:embed="rId31"/>
-                    <a:stretch>
-                      <a:fillRect/>
-                    </a:stretch>
-                  </pic:blipFill>
-                  <pic:spPr bwMode="auto">
-                    <a:xfrm>
-                      <a:off x="0" y="0"/>
-                      <a:ext cx="5334000" cy="3048000"/>
-                    </a:xfrm>
-                    <a:prstGeom prst="rect">
-                      <a:avLst/>
-                    </a:prstGeom>
-                    <a:noFill/>
-                    <a:ln w="9525">
-                      <a:noFill/>
-                      <a:headEnd/>
-                      <a:tailEnd/>
-                    </a:ln>
-                  </pic:spPr>
-                </pic:pic>
-              </a:graphicData>
-            </a:graphic>
-          </wp:inline>
-        </w:drawing>
-      </w:r>
-    </w:p>
-    <w:p>
-      <w:pPr>
-        <w:pStyle w:val="ImageCaption"/>
-      </w:pPr>
-      <w:r>
-        <w:t xml:space="preserve">Figure 3:</w:t>
-      </w:r>
-      <w:r>
-        <w:t xml:space="preserve"> </w:t>
-      </w:r>
-      <w:r>
-        <w:t xml:space="preserve"> </w:t>
-      </w:r>
-      <w:r>
-        <w:t xml:space="preserve">Average monthly water budget for the soil zone, simulated with SVIHM, for the model simulation period (water years 1991-2018). Positive and negative values indicate average net monthly fluxes into and out of the soil zone, respectively.</w:t>
-      </w:r>
-    </w:p>
-    <w:p>
-      <w:pPr>
-        <w:pStyle w:val="CaptionedFigure"/>
-      </w:pPr>
-      <w:r>
-        <w:drawing>
-          <wp:inline>
-            <wp:extent cx="5334000" cy="3048000"/>
-            <wp:effectExtent b="0" l="0" r="0" t="0"/>
-            <wp:docPr descr="Figure 4:  Annual values for inflowing (positive) and outflowing (negative) water budget components in the SVIHM soil zone (historical basecase simulation). Irrigation refers to both groundwater and surface water sources; Recharge refers to water percolating through the soil column and recharging the aquifer below. Both crop ET and ET from native vegetation remain relatively stable year to year, while precipitation inputs, and thus recharge to the aquifer, have higher interannual variability." title="" id="35" name="Picture"/>
-            <a:graphic>
-              <a:graphicData uri="http://schemas.openxmlformats.org/drawingml/2006/picture">
-                <pic:pic>
-                  <pic:nvPicPr>
-                    <pic:cNvPr descr="Graphics%20and%20Supplements/Figure%203.png" id="36" name="Picture"/>
+                    <pic:cNvPr descr="Graphics%20and%20Supplements/Figure%202.png" id="36" name="Picture"/>
                     <pic:cNvPicPr>
                       <a:picLocks noChangeArrowheads="1" noChangeAspect="1"/>
                     </pic:cNvPicPr>
@@ -2561,6 +2523,94 @@
       <w:pPr>
         <w:pStyle w:val="ImageCaption"/>
       </w:pPr>
+      <w:bookmarkStart w:id="37" w:name="fig:avgWaterBudgetFig"/>
+      <w:bookmarkEnd w:id="37"/>
+      <w:r>
+        <w:t xml:space="preserve">Figure 3:</w:t>
+      </w:r>
+      <w:r>
+        <w:t xml:space="preserve"> </w:t>
+      </w:r>
+      <w:r>
+        <w:t xml:space="preserve"> </w:t>
+      </w:r>
+      <w:r>
+        <w:t xml:space="preserve">Average monthly water budget for the soil zone, simulated with SVIHM, for the model simulation period (water years 1991-2018). Positive and negative values indicate average net monthly fluxes into and out of the soil zone, respectively.</w:t>
+      </w:r>
+    </w:p>
+    <w:p>
+      <w:pPr>
+        <w:pStyle w:val="SourceCode"/>
+      </w:pPr>
+      <w:r>
+        <w:rPr>
+          <w:rStyle w:val="VerbatimChar"/>
+        </w:rPr>
+        <w:t xml:space="preserve">## png </w:t>
+      </w:r>
+      <w:r>
+        <w:br/>
+      </w:r>
+      <w:r>
+        <w:rPr>
+          <w:rStyle w:val="VerbatimChar"/>
+        </w:rPr>
+        <w:t xml:space="preserve">##   2</w:t>
+      </w:r>
+    </w:p>
+    <w:p>
+      <w:pPr>
+        <w:pStyle w:val="CaptionedFigure"/>
+      </w:pPr>
+      <w:r>
+        <w:drawing>
+          <wp:inline>
+            <wp:extent cx="5334000" cy="3048000"/>
+            <wp:effectExtent b="0" l="0" r="0" t="0"/>
+            <wp:docPr descr="Figure 4:  Annual values for inflowing (positive) and outflowing (negative) water budget components in the SVIHM soil zone (historical basecase simulation). Irrigation refers to both groundwater and surface water sources; Recharge refers to water percolating through the soil column and recharging the aquifer below. Both crop ET and ET from native vegetation remain relatively stable year to year, while precipitation inputs, and thus recharge to the aquifer, have higher interannual variability." title="" id="39" name="Picture"/>
+            <a:graphic>
+              <a:graphicData uri="http://schemas.openxmlformats.org/drawingml/2006/picture">
+                <pic:pic>
+                  <pic:nvPicPr>
+                    <pic:cNvPr descr="Graphics%20and%20Supplements/Figure%203.png" id="40" name="Picture"/>
+                    <pic:cNvPicPr>
+                      <a:picLocks noChangeArrowheads="1" noChangeAspect="1"/>
+                    </pic:cNvPicPr>
+                  </pic:nvPicPr>
+                  <pic:blipFill>
+                    <a:blip r:embed="rId38"/>
+                    <a:stretch>
+                      <a:fillRect/>
+                    </a:stretch>
+                  </pic:blipFill>
+                  <pic:spPr bwMode="auto">
+                    <a:xfrm>
+                      <a:off x="0" y="0"/>
+                      <a:ext cx="5334000" cy="3048000"/>
+                    </a:xfrm>
+                    <a:prstGeom prst="rect">
+                      <a:avLst/>
+                    </a:prstGeom>
+                    <a:noFill/>
+                    <a:ln w="9525">
+                      <a:noFill/>
+                      <a:headEnd/>
+                      <a:tailEnd/>
+                    </a:ln>
+                  </pic:spPr>
+                </pic:pic>
+              </a:graphicData>
+            </a:graphic>
+          </wp:inline>
+        </w:drawing>
+      </w:r>
+    </w:p>
+    <w:p>
+      <w:pPr>
+        <w:pStyle w:val="ImageCaption"/>
+      </w:pPr>
+      <w:bookmarkStart w:id="41" w:name="fig:annualSWBMBudget"/>
+      <w:bookmarkEnd w:id="41"/>
       <w:r>
         <w:t xml:space="preserve">Figure 4:</w:t>
       </w:r>
@@ -2574,9 +2624,9 @@
         <w:t xml:space="preserve">Annual values for inflowing (positive) and outflowing (negative) water budget components in the SVIHM soil zone (historical basecase simulation). Irrigation refers to both groundwater and surface water sources; Recharge refers to water percolating through the soil column and recharging the aquifer below. Both crop ET and ET from native vegetation remain relatively stable year to year, while precipitation inputs, and thus recharge to the aquifer, have higher interannual variability.</w:t>
       </w:r>
     </w:p>
-    <w:bookmarkEnd w:id="37"/>
-    <w:bookmarkEnd w:id="38"/>
-    <w:bookmarkStart w:id="39" w:name="gsp-development"/>
+    <w:bookmarkEnd w:id="42"/>
+    <w:bookmarkEnd w:id="43"/>
+    <w:bookmarkStart w:id="44" w:name="gsp-development"/>
     <w:p>
       <w:pPr>
         <w:pStyle w:val="Heading2"/>
@@ -2669,8 +2719,8 @@
         <w:t xml:space="preserve">, as described below.</w:t>
       </w:r>
     </w:p>
-    <w:bookmarkEnd w:id="39"/>
-    <w:bookmarkStart w:id="40" w:name="hydrologic-model-summary"/>
+    <w:bookmarkEnd w:id="44"/>
+    <w:bookmarkStart w:id="45" w:name="hydrologic-model-summary"/>
     <w:p>
       <w:pPr>
         <w:pStyle w:val="Heading2"/>
@@ -2772,9 +2822,9 @@
         <w:t xml:space="preserve">Simulated total ET of crops and native vegetation within the model domain.</w:t>
       </w:r>
     </w:p>
-    <w:bookmarkEnd w:id="40"/>
-    <w:bookmarkEnd w:id="41"/>
-    <w:bookmarkStart w:id="66" w:name="methods"/>
+    <w:bookmarkEnd w:id="45"/>
+    <w:bookmarkEnd w:id="46"/>
+    <w:bookmarkStart w:id="79" w:name="methods"/>
     <w:p>
       <w:pPr>
         <w:pStyle w:val="Heading1"/>
@@ -2830,6 +2880,8 @@
       <w:pPr>
         <w:pStyle w:val="TableCaption"/>
       </w:pPr>
+      <w:bookmarkStart w:id="47" w:name="tab:objFunctionTable"/>
+      <w:bookmarkEnd w:id="47"/>
       <w:r>
         <w:t xml:space="preserve">Table 2:</w:t>
       </w:r>
@@ -3228,7 +3280,7 @@
         </w:tc>
       </w:tr>
     </w:tbl>
-    <w:bookmarkStart w:id="45" w:name="objective-functions"/>
+    <w:bookmarkStart w:id="51" w:name="objective-functions"/>
     <w:p>
       <w:pPr>
         <w:pStyle w:val="Heading2"/>
@@ -3246,7 +3298,7 @@
         <w:t xml:space="preserve">Objective functions</w:t>
       </w:r>
     </w:p>
-    <w:bookmarkStart w:id="42" w:name="hydrologic-benefit-function"/>
+    <w:bookmarkStart w:id="48" w:name="hydrologic-benefit-function"/>
     <w:p>
       <w:pPr>
         <w:pStyle w:val="Heading3"/>
@@ -4088,8 +4140,8 @@
         <w:t xml:space="preserve">, making them directly comparable to HB values derived from the simulated FJ flow records in the hypothetical management scenarios.</w:t>
       </w:r>
     </w:p>
-    <w:bookmarkEnd w:id="42"/>
-    <w:bookmarkStart w:id="43" w:name="Xb6ca5dd654202e76d1db9f1bc12c98cced9d6aa"/>
+    <w:bookmarkEnd w:id="48"/>
+    <w:bookmarkStart w:id="49" w:name="Xb6ca5dd654202e76d1db9f1bc12c98cced9d6aa"/>
     <w:p>
       <w:pPr>
         <w:pStyle w:val="Heading3"/>
@@ -4176,8 +4228,8 @@
         <w:t xml:space="preserve">. The assumption that crop ET is consistently related to yield or revenue breaks down for a management scenario that includes changing crops; this is explored further in the Discussion section. But on the merits of these options, annual crop ET was selected to represent agricultural benefit.</w:t>
       </w:r>
     </w:p>
-    <w:bookmarkEnd w:id="43"/>
-    <w:bookmarkStart w:id="44" w:name="Xfd5664932b25b1108017cbc6e0e75c8014ecd36"/>
+    <w:bookmarkEnd w:id="49"/>
+    <w:bookmarkStart w:id="50" w:name="Xfd5664932b25b1108017cbc6e0e75c8014ecd36"/>
     <w:p>
       <w:pPr>
         <w:pStyle w:val="Heading3"/>
@@ -4283,9 +4335,9 @@
         <w:t xml:space="preserve">for full list of assigned categories.</w:t>
       </w:r>
     </w:p>
-    <w:bookmarkEnd w:id="44"/>
-    <w:bookmarkEnd w:id="45"/>
-    <w:bookmarkStart w:id="48" w:name="analyses-of-objective-function-values"/>
+    <w:bookmarkEnd w:id="50"/>
+    <w:bookmarkEnd w:id="51"/>
+    <w:bookmarkStart w:id="54" w:name="analyses-of-objective-function-values"/>
     <w:p>
       <w:pPr>
         <w:pStyle w:val="Heading2"/>
@@ -4303,7 +4355,7 @@
         <w:t xml:space="preserve">Analyses of objective function values</w:t>
       </w:r>
     </w:p>
-    <w:bookmarkStart w:id="46" w:name="trade-off-efficiency-and-low-coho-years"/>
+    <w:bookmarkStart w:id="52" w:name="trade-off-efficiency-and-low-coho-years"/>
     <w:p>
       <w:pPr>
         <w:pStyle w:val="Heading3"/>
@@ -4532,8 +4584,8 @@
             <m:naryPr>
               <m:chr m:val="∑"/>
               <m:limLoc m:val="undOvr"/>
-              <m:subHide m:val="0"/>
-              <m:supHide m:val="0"/>
+              <m:subHide m:val="off"/>
+              <m:supHide m:val="off"/>
             </m:naryPr>
             <m:sub>
               <m:r>
@@ -4678,8 +4730,8 @@
             <m:naryPr>
               <m:chr m:val="∑"/>
               <m:limLoc m:val="undOvr"/>
-              <m:subHide m:val="0"/>
-              <m:supHide m:val="0"/>
+              <m:subHide m:val="off"/>
+              <m:supHide m:val="off"/>
             </m:naryPr>
             <m:sub>
               <m:r>
@@ -5212,8 +5264,8 @@
         </m:oMath>
       </m:oMathPara>
     </w:p>
-    <w:bookmarkEnd w:id="46"/>
-    <w:bookmarkStart w:id="47" w:name="pareto-optimal-set-of-management-actions"/>
+    <w:bookmarkEnd w:id="52"/>
+    <w:bookmarkStart w:id="53" w:name="pareto-optimal-set-of-management-actions"/>
     <w:p>
       <w:pPr>
         <w:pStyle w:val="Heading3"/>
@@ -5319,9 +5371,9 @@
         <w:t xml:space="preserve">in more than one objective, it must be included in the Pareto-optimal set.</w:t>
       </w:r>
     </w:p>
-    <w:bookmarkEnd w:id="47"/>
-    <w:bookmarkEnd w:id="48"/>
-    <w:bookmarkStart w:id="49" w:name="scenario-descriptions"/>
+    <w:bookmarkEnd w:id="53"/>
+    <w:bookmarkEnd w:id="54"/>
+    <w:bookmarkStart w:id="56" w:name="scenario-descriptions"/>
     <w:p>
       <w:pPr>
         <w:pStyle w:val="Heading2"/>
@@ -5402,6 +5454,8 @@
       <w:pPr>
         <w:pStyle w:val="TableCaption"/>
       </w:pPr>
+      <w:bookmarkStart w:id="55" w:name="tab:scenCategoryTab"/>
+      <w:bookmarkEnd w:id="55"/>
       <w:r>
         <w:t xml:space="preserve">Table 3:</w:t>
       </w:r>
@@ -8139,8 +8193,8 @@
         </w:tc>
       </w:tr>
     </w:tbl>
-    <w:bookmarkEnd w:id="49"/>
-    <w:bookmarkStart w:id="65" w:name="results"/>
+    <w:bookmarkEnd w:id="56"/>
+    <w:bookmarkStart w:id="78" w:name="results"/>
     <w:p>
       <w:pPr>
         <w:pStyle w:val="Heading2"/>
@@ -8175,7 +8229,7 @@
         <w:t xml:space="preserve">).</w:t>
       </w:r>
     </w:p>
-    <w:bookmarkStart w:id="56" w:name="X7919b09686293416b4bcb59483f48ae87a57064"/>
+    <w:bookmarkStart w:id="66" w:name="X7919b09686293416b4bcb59483f48ae87a57064"/>
     <w:p>
       <w:pPr>
         <w:pStyle w:val="Heading3"/>
@@ -8191,6 +8245,26 @@
       </w:r>
       <w:r>
         <w:t xml:space="preserve">Environmental and agricultural objective function values</w:t>
+      </w:r>
+    </w:p>
+    <w:p>
+      <w:pPr>
+        <w:pStyle w:val="SourceCode"/>
+      </w:pPr>
+      <w:r>
+        <w:rPr>
+          <w:rStyle w:val="VerbatimChar"/>
+        </w:rPr>
+        <w:t xml:space="preserve">## png </w:t>
+      </w:r>
+      <w:r>
+        <w:br/>
+      </w:r>
+      <w:r>
+        <w:rPr>
+          <w:rStyle w:val="VerbatimChar"/>
+        </w:rPr>
+        <w:t xml:space="preserve">##   2</w:t>
       </w:r>
     </w:p>
     <w:p>
@@ -8202,18 +8276,18 @@
           <wp:inline>
             <wp:extent cx="5334000" cy="5334000"/>
             <wp:effectExtent b="0" l="0" r="0" t="0"/>
-            <wp:docPr descr="Figure 5:  Comparison of annual performance in two objective functions (HB and ET, representing environmental and agricultural objectives, respectively), in the basecase (black circles) and management scenarios (diamond, cross or x symbols) for water years 1991-2018. Panels A and B show comparisons between basecase and one example scenario in each of three categories: Enhanced Recharge, Low Flow Diversion Limits, and Curtailment. Panels C and D show comparisons between basecase and different cutoff dates within the Alfalfa Irrigation category: July 10th, August 1st and August 15th. Dry-type water years (vertical bars) are 1991, ’92, ’94, 2001, ’09, ’13, ’14, and ’18." title="" id="51" name="Picture"/>
+            <wp:docPr descr="Figure 5:  Comparison of annual performance in two objective functions (HB and ET, representing environmental and agricultural objectives, respectively), in the basecase (black circles) and management scenarios (diamond, cross or x symbols) for water years 1991-2018. Panels A and B show comparisons between basecase and one example scenario in each of three categories: Enhanced Recharge, Low Flow Diversion Limits, and Curtailment. Panels C and D show comparisons between basecase and different cutoff dates within the Alfalfa Irrigation category: July 10th, August 1st and August 15th. Dry-type water years (vertical bars) are 1991, ’92, ’94, 2001, ’09, ’13, ’14, and ’18." title="" id="58" name="Picture"/>
             <a:graphic>
               <a:graphicData uri="http://schemas.openxmlformats.org/drawingml/2006/picture">
                 <pic:pic>
                   <pic:nvPicPr>
-                    <pic:cNvPr descr="Graphics%20and%20Supplements/Figure%204.png" id="52" name="Picture"/>
+                    <pic:cNvPr descr="Graphics%20and%20Supplements/Figure%204.png" id="59" name="Picture"/>
                     <pic:cNvPicPr>
                       <a:picLocks noChangeArrowheads="1" noChangeAspect="1"/>
                     </pic:cNvPicPr>
                   </pic:nvPicPr>
                   <pic:blipFill>
-                    <a:blip r:embed="rId50"/>
+                    <a:blip r:embed="rId57"/>
                     <a:stretch>
                       <a:fillRect/>
                     </a:stretch>
@@ -8244,6 +8318,8 @@
       <w:pPr>
         <w:pStyle w:val="ImageCaption"/>
       </w:pPr>
+      <w:bookmarkStart w:id="60" w:name="fig:benefitByWY"/>
+      <w:bookmarkEnd w:id="60"/>
       <w:r>
         <w:t xml:space="preserve">Figure 5:</w:t>
       </w:r>
@@ -8255,6 +8331,26 @@
       </w:r>
       <w:r>
         <w:t xml:space="preserve">Comparison of annual performance in two objective functions (HB and ET, representing environmental and agricultural objectives, respectively), in the basecase (black circles) and management scenarios (diamond, cross or x symbols) for water years 1991-2018. Panels A and B show comparisons between basecase and one example scenario in each of three categories: Enhanced Recharge, Low Flow Diversion Limits, and Curtailment. Panels C and D show comparisons between basecase and different cutoff dates within the Alfalfa Irrigation category: July 10th, August 1st and August 15th. Dry-type water years (vertical bars) are 1991, ’92, ’94, 2001, ’09, ’13, ’14, and ’18.</w:t>
+      </w:r>
+    </w:p>
+    <w:p>
+      <w:pPr>
+        <w:pStyle w:val="SourceCode"/>
+      </w:pPr>
+      <w:r>
+        <w:rPr>
+          <w:rStyle w:val="VerbatimChar"/>
+        </w:rPr>
+        <w:t xml:space="preserve">## png </w:t>
+      </w:r>
+      <w:r>
+        <w:br/>
+      </w:r>
+      <w:r>
+        <w:rPr>
+          <w:rStyle w:val="VerbatimChar"/>
+        </w:rPr>
+        <w:t xml:space="preserve">##   2</w:t>
       </w:r>
     </w:p>
     <w:p>
@@ -8266,18 +8362,18 @@
           <wp:inline>
             <wp:extent cx="5334000" cy="5334000"/>
             <wp:effectExtent b="0" l="0" r="0" t="0"/>
-            <wp:docPr descr="Figure 6:  Environmental and agricultural objective function performance (in terms of Hydrologic Benefit, or HB, value; and crop ET volume) for basecase (black circle in upper left) and 39 management scenarios. Symbol x and y coordinates are the average of 28 annual HB and ET values for each scenario over the full model period (water years 1991-2018). Whiskers show standard error of the 28 years of annual HB values; standard errors in the direction of the y-axis are smaller than the height covered by each symbol." title="" id="54" name="Picture"/>
+            <wp:docPr descr="Figure 6:  Environmental and agricultural objective function performance (in terms of Hydrologic Benefit, or HB, value; and crop ET volume) for basecase (black circle in upper left) and 39 management scenarios. Symbol x and y coordinates are the average of 28 annual HB and ET values for each scenario over the full model period (water years 1991-2018). Whiskers show standard error of the 28 years of annual HB values; standard errors in the direction of the y-axis are smaller than the height covered by each symbol." title="" id="62" name="Picture"/>
             <a:graphic>
               <a:graphicData uri="http://schemas.openxmlformats.org/drawingml/2006/picture">
                 <pic:pic>
                   <pic:nvPicPr>
-                    <pic:cNvPr descr="Graphics%20and%20Supplements/Figure%205.png" id="55" name="Picture"/>
+                    <pic:cNvPr descr="Graphics%20and%20Supplements/Figure%205.png" id="63" name="Picture"/>
                     <pic:cNvPicPr>
                       <a:picLocks noChangeArrowheads="1" noChangeAspect="1"/>
                     </pic:cNvPicPr>
                   </pic:nvPicPr>
                   <pic:blipFill>
-                    <a:blip r:embed="rId53"/>
+                    <a:blip r:embed="rId61"/>
                     <a:stretch>
                       <a:fillRect/>
                     </a:stretch>
@@ -8308,6 +8404,8 @@
       <w:pPr>
         <w:pStyle w:val="ImageCaption"/>
       </w:pPr>
+      <w:bookmarkStart w:id="64" w:name="fig:farmerFishTradeoffFigure"/>
+      <w:bookmarkEnd w:id="64"/>
       <w:r>
         <w:t xml:space="preserve">Figure 6:</w:t>
       </w:r>
@@ -8319,6 +8417,103 @@
       </w:r>
       <w:r>
         <w:t xml:space="preserve">Environmental and agricultural objective function performance (in terms of Hydrologic Benefit, or HB, value; and crop ET volume) for basecase (black circle in upper left) and 39 management scenarios. Symbol x and y coordinates are the average of 28 annual HB and ET values for each scenario over the full model period (water years 1991-2018). Whiskers show standard error of the 28 years of annual HB values; standard errors in the direction of the y-axis are smaller than the height covered by each symbol.</w:t>
+      </w:r>
+    </w:p>
+    <w:p>
+      <w:pPr>
+        <w:pStyle w:val="SourceCode"/>
+      </w:pPr>
+      <w:r>
+        <w:rPr>
+          <w:rStyle w:val="VerbatimChar"/>
+        </w:rPr>
+        <w:t xml:space="preserve">## png </w:t>
+      </w:r>
+      <w:r>
+        <w:br/>
+      </w:r>
+      <w:r>
+        <w:rPr>
+          <w:rStyle w:val="VerbatimChar"/>
+        </w:rPr>
+        <w:t xml:space="preserve">##   2</w:t>
+      </w:r>
+    </w:p>
+    <w:p>
+      <w:pPr>
+        <w:pStyle w:val="FirstParagraph"/>
+      </w:pPr>
+      <w:r>
+        <w:t xml:space="preserve">The aggregate hydrologic impact of each management scenario can be compared against the historical basecase using the annual objective function values over the full 28-year record (e.g., Figure</w:t>
+      </w:r>
+      <w:r>
+        <w:t xml:space="preserve"> </w:t>
+      </w:r>
+      <w:r>
+        <w:t xml:space="preserve">5</w:t>
+      </w:r>
+      <w:r>
+        <w:t xml:space="preserve">) or using the 28-year mean values for each scenario (Figure</w:t>
+      </w:r>
+      <w:r>
+        <w:t xml:space="preserve"> </w:t>
+      </w:r>
+      <w:r>
+        <w:t xml:space="preserve">6</w:t>
+      </w:r>
+      <w:r>
+        <w:t xml:space="preserve">; Table</w:t>
+      </w:r>
+      <w:r>
+        <w:t xml:space="preserve"> </w:t>
+      </w:r>
+      <w:r>
+        <w:t xml:space="preserve">4</w:t>
+      </w:r>
+      <w:r>
+        <w:t xml:space="preserve">). In the basecase scenario, the 28-year mean annual ET volume is 111 million m</w:t>
+      </w:r>
+      <w:r>
+        <w:rPr>
+          <w:vertAlign w:val="superscript"/>
+        </w:rPr>
+        <w:t xml:space="preserve">3</w:t>
+      </w:r>
+      <w:r>
+        <w:t xml:space="preserve"> </w:t>
+      </w:r>
+      <w:r>
+        <w:t xml:space="preserve">of water, and the 28-year mean of annual HB values is 55.9 coho spf-equivalent (Table</w:t>
+      </w:r>
+      <w:r>
+        <w:t xml:space="preserve"> </w:t>
+      </w:r>
+      <w:r>
+        <w:t xml:space="preserve">4</w:t>
+      </w:r>
+      <w:r>
+        <w:t xml:space="preserve">). Annual ET volume is relatively stable over the model period of water years 1991-2018, while annual HB values are much more variable (Figure</w:t>
+      </w:r>
+      <w:r>
+        <w:t xml:space="preserve"> </w:t>
+      </w:r>
+      <w:r>
+        <w:t xml:space="preserve">5</w:t>
+      </w:r>
+      <w:r>
+        <w:t xml:space="preserve">). Among the 39 management scenarios, mean ET values ranged from 0 to 112 million m</w:t>
+      </w:r>
+      <w:r>
+        <w:rPr>
+          <w:vertAlign w:val="superscript"/>
+        </w:rPr>
+        <w:t xml:space="preserve">3</w:t>
+      </w:r>
+      <w:r>
+        <w:t xml:space="preserve"> </w:t>
+      </w:r>
+      <w:r>
+        <w:t xml:space="preserve">of water, while HB values ranged from 56 to 66.5 coho spf-equivalent.</w:t>
       </w:r>
     </w:p>
     <w:p>
@@ -8326,16 +8521,7 @@
         <w:pStyle w:val="BodyText"/>
       </w:pPr>
       <w:r>
-        <w:t xml:space="preserve">The aggregate hydrologic impact of each management scenario can be compared against the historical basecase using the annual objective function values over the full 28-year record (e.g., Figure</w:t>
-      </w:r>
-      <w:r>
-        <w:t xml:space="preserve"> </w:t>
-      </w:r>
-      <w:r>
-        <w:t xml:space="preserve">5</w:t>
-      </w:r>
-      <w:r>
-        <w:t xml:space="preserve">) or using the 28-year mean values for each scenario (Figure</w:t>
+        <w:t xml:space="preserve">Four scenario categories fall in a cluster with relatively high ET values, indicating that these scenarios conserve nearly all the basecase economic benefits for local growers: Enhanced Recharge, Expanded Enhanced Recharge, Irrigation Efficiency, and Small Reservoir (Figure</w:t>
       </w:r>
       <w:r>
         <w:t xml:space="preserve"> </w:t>
@@ -8344,16 +8530,7 @@
         <w:t xml:space="preserve">6</w:t>
       </w:r>
       <w:r>
-        <w:t xml:space="preserve">; Table</w:t>
-      </w:r>
-      <w:r>
-        <w:t xml:space="preserve"> </w:t>
-      </w:r>
-      <w:r>
-        <w:t xml:space="preserve">4</w:t>
-      </w:r>
-      <w:r>
-        <w:t xml:space="preserve">). In the basecase scenario, the 28-year mean annual ET volume is 111 million m</w:t>
+        <w:t xml:space="preserve">). The scenarios in this group all require some degree of infrastructure investment, and they have a minimal impact on crop ET: the mean ET values of scenarios in this cluster are 109 to 112 million m</w:t>
       </w:r>
       <w:r>
         <w:rPr>
@@ -8362,40 +8539,7 @@
         <w:t xml:space="preserve">3</w:t>
       </w:r>
       <w:r>
-        <w:t xml:space="preserve"> </w:t>
-      </w:r>
-      <w:r>
-        <w:t xml:space="preserve">of water, and the 28-year mean of annual HB values is 55.9 coho spf-equivalent (Table</w:t>
-      </w:r>
-      <w:r>
-        <w:t xml:space="preserve"> </w:t>
-      </w:r>
-      <w:r>
-        <w:t xml:space="preserve">4</w:t>
-      </w:r>
-      <w:r>
-        <w:t xml:space="preserve">). Annual ET volume is relatively stable over the model period of water years 1991-2018, while annual HB values are much more variable (Figure</w:t>
-      </w:r>
-      <w:r>
-        <w:t xml:space="preserve"> </w:t>
-      </w:r>
-      <w:r>
-        <w:t xml:space="preserve">5</w:t>
-      </w:r>
-      <w:r>
-        <w:t xml:space="preserve">). Among the 39 management scenarios, mean ET values ranged from 0 to 112 million m</w:t>
-      </w:r>
-      <w:r>
-        <w:rPr>
-          <w:vertAlign w:val="superscript"/>
-        </w:rPr>
-        <w:t xml:space="preserve">3</w:t>
-      </w:r>
-      <w:r>
-        <w:t xml:space="preserve"> </w:t>
-      </w:r>
-      <w:r>
-        <w:t xml:space="preserve">of water, while HB values ranged from 56 to 66.5 coho spf-equivalent.</w:t>
+        <w:t xml:space="preserve">, or 2 percent less to 0.6 percent more than basecase. Their mean improvement in HB values over the basecase ranges from 0 to 2 coho spf-equivalent.</w:t>
       </w:r>
     </w:p>
     <w:p>
@@ -8403,16 +8547,7 @@
         <w:pStyle w:val="BodyText"/>
       </w:pPr>
       <w:r>
-        <w:t xml:space="preserve">Four scenario categories fall in a cluster with relatively high ET values, indicating that these scenarios conserve nearly all the basecase economic benefits for local growers: Enhanced Recharge, Expanded Enhanced Recharge, Irrigation Efficiency, and Small Reservoir (Figure</w:t>
-      </w:r>
-      <w:r>
-        <w:t xml:space="preserve"> </w:t>
-      </w:r>
-      <w:r>
-        <w:t xml:space="preserve">6</w:t>
-      </w:r>
-      <w:r>
-        <w:t xml:space="preserve">). The scenarios in this group all require some degree of infrastructure investment, and they have a minimal impact on crop ET: the mean ET values of scenarios in this cluster are 109 to 112 million m</w:t>
+        <w:t xml:space="preserve">The mean ET volumes of the two Crop Change scenarios fall below those in the aforementioned cluster, with 90 and 101 million m</w:t>
       </w:r>
       <w:r>
         <w:rPr>
@@ -8421,7 +8556,34 @@
         <w:t xml:space="preserve">3</w:t>
       </w:r>
       <w:r>
-        <w:t xml:space="preserve">, or 2 percent less to 0.6 percent more than basecase. Their mean improvement in HB values over the basecase ranges from 0 to 2 coho spf-equivalent.</w:t>
+        <w:t xml:space="preserve">, while HB values are 57.5 and 56.9 respectively (Figure</w:t>
+      </w:r>
+      <w:r>
+        <w:t xml:space="preserve"> </w:t>
+      </w:r>
+      <w:r>
+        <w:t xml:space="preserve">6</w:t>
+      </w:r>
+      <w:r>
+        <w:t xml:space="preserve">). In these scenarios, existing crop coefficients are multiplied by a factor of 0.8 or 0.9; conceptually, this would involve replacing all existing irrigated acreage with unspecified crops which had a designated 80% and 90% of historical ET demand. As discussed later, in this scenario the relationship between water use and revenue may be distinctly different from that of alfalfa and pasture, so the actual</w:t>
+      </w:r>
+      <w:r>
+        <w:t xml:space="preserve"> </w:t>
+      </w:r>
+      <w:r>
+        <w:t xml:space="preserve">“</w:t>
+      </w:r>
+      <w:r>
+        <w:t xml:space="preserve">farmer benefit</w:t>
+      </w:r>
+      <w:r>
+        <w:t xml:space="preserve">”</w:t>
+      </w:r>
+      <w:r>
+        <w:t xml:space="preserve"> </w:t>
+      </w:r>
+      <w:r>
+        <w:t xml:space="preserve">may be higher or lower than this proxy suggests.</w:t>
       </w:r>
     </w:p>
     <w:p>
@@ -8429,7 +8591,34 @@
         <w:pStyle w:val="BodyText"/>
       </w:pPr>
       <w:r>
-        <w:t xml:space="preserve">The mean ET volumes of the two Crop Change scenarios fall below those in the aforementioned cluster, with 90 and 101 million m</w:t>
+        <w:t xml:space="preserve">Two regulatory management categories, Alfalfa Irrigation and Curtailment, involve irrigation schedule changes, and result in a range of reductions in applied irrigation volume, depending on the date of intervention. The scenarios in these categories trace two trade-off arcs in average HB-ET space (Figure</w:t>
+      </w:r>
+      <w:r>
+        <w:t xml:space="preserve"> </w:t>
+      </w:r>
+      <w:r>
+        <w:t xml:space="preserve">6</w:t>
+      </w:r>
+      <w:r>
+        <w:t xml:space="preserve">). The first category, early cessation of alfalfa irrigation (during all or only dry water years), is intended to simulate growers harvesting two cuttings only (i.e., one or two fewer cuttings than current) in a given year. This was simulated by ceasing alfalfa irrigation earlier in the growing season (with cutoff dates on July 10, August 1 and August 15) than the basecase default date of Sept. 1. (The Sept. 1 cutoff date assumes that growers obtain three cuttings, but does not incorporate the known small number of growers which occasionally irrigate longer to obtain a fourth cutting.) Alfalfa acreage is concentrated near the Scott River channel, much of it in the Adjudicated Zone (Figure</w:t>
+      </w:r>
+      <w:r>
+        <w:t xml:space="preserve"> </w:t>
+      </w:r>
+      <w:r>
+        <w:t xml:space="preserve">1</w:t>
+      </w:r>
+      <w:r>
+        <w:t xml:space="preserve">), with predominately groundwater irrigation sources. The second regulatory category, Curtailment of all irrigation starting on a range of dates (June 1st through August 15th), represent book-end scenario simulations to approximate regulatory actions proposed by state resource management agencies in response to extreme drought conditions</w:t>
+      </w:r>
+      <w:r>
+        <w:t xml:space="preserve"> </w:t>
+      </w:r>
+      <w:r>
+        <w:t xml:space="preserve">(CDFW 2021)</w:t>
+      </w:r>
+      <w:r>
+        <w:t xml:space="preserve">. The mean ET values of scenarios in these two categories are 34 to 111 million m</w:t>
       </w:r>
       <w:r>
         <w:rPr>
@@ -8438,34 +8627,7 @@
         <w:t xml:space="preserve">3</w:t>
       </w:r>
       <w:r>
-        <w:t xml:space="preserve">, while HB values are 57.5 and 56.9 respectively (Figure</w:t>
-      </w:r>
-      <w:r>
-        <w:t xml:space="preserve"> </w:t>
-      </w:r>
-      <w:r>
-        <w:t xml:space="preserve">6</w:t>
-      </w:r>
-      <w:r>
-        <w:t xml:space="preserve">). In these scenarios, existing crop coefficients are multiplied by a factor of 0.8 or 0.9; conceptually, this would involve replacing all existing irrigated acreage with unspecified crops which had a designated 80% and 90% of historical ET demand. As discussed later, in this scenario the relationship between water use and revenue may be distinctly different from that of alfalfa and pasture, so the actual</w:t>
-      </w:r>
-      <w:r>
-        <w:t xml:space="preserve"> </w:t>
-      </w:r>
-      <w:r>
-        <w:t xml:space="preserve">“</w:t>
-      </w:r>
-      <w:r>
-        <w:t xml:space="preserve">farmer benefit</w:t>
-      </w:r>
-      <w:r>
-        <w:t xml:space="preserve">”</w:t>
-      </w:r>
-      <w:r>
-        <w:t xml:space="preserve"> </w:t>
-      </w:r>
-      <w:r>
-        <w:t xml:space="preserve">may be higher or lower than this proxy suggests.</w:t>
+        <w:t xml:space="preserve">, or 69 to 0.3 percent less than basecase; HB gains over basecase are 1 to 11 coho spf-equivalent.</w:t>
       </w:r>
     </w:p>
     <w:p>
@@ -8473,7 +8635,7 @@
         <w:pStyle w:val="BodyText"/>
       </w:pPr>
       <w:r>
-        <w:t xml:space="preserve">Two regulatory management categories, Alfalfa Irrigation and Curtailment, involve irrigation schedule changes, and result in a range of reductions in applied irrigation volume, depending on the date of intervention. The scenarios in these categories trace two trade-off arcs in average HB-ET space (Figure</w:t>
+        <w:t xml:space="preserve">The third regulatory category, Low Flow Diversion Limits, regulates surface water diversion for irrigation, and contains only one scenario (Figure</w:t>
       </w:r>
       <w:r>
         <w:t xml:space="preserve"> </w:t>
@@ -8482,25 +8644,16 @@
         <w:t xml:space="preserve">6</w:t>
       </w:r>
       <w:r>
-        <w:t xml:space="preserve">). The first category, early cessation of alfalfa irrigation (during all or only dry water years), is intended to simulate growers harvesting two cuttings only (i.e., one or two fewer cuttings than current) in a given year. This was simulated by ceasing alfalfa irrigation earlier in the growing season (with cutoff dates on July 10, August 1 and August 15) than the basecase default date of Sept. 1. (The Sept. 1 cutoff date assumes that growers obtain three cuttings, but does not incorporate the known small number of growers which occasionally irrigate longer to obtain a fourth cutting.) Alfalfa acreage is concentrated near the Scott River channel, much of it in the Adjudicated Zone (Figure</w:t>
-      </w:r>
-      <w:r>
-        <w:t xml:space="preserve"> </w:t>
-      </w:r>
-      <w:r>
-        <w:t xml:space="preserve">1</w:t>
-      </w:r>
-      <w:r>
-        <w:t xml:space="preserve">), with predominately groundwater irrigation sources. The second regulatory category, Curtailment of all irrigation starting on a range of dates (June 1st through August 15th), represent book-end scenario simulations to approximate regulatory actions proposed by state resource management agencies in response to extreme drought conditions</w:t>
-      </w:r>
-      <w:r>
-        <w:t xml:space="preserve"> </w:t>
-      </w:r>
-      <w:r>
-        <w:t xml:space="preserve">(CDFW 2021)</w:t>
-      </w:r>
-      <w:r>
-        <w:t xml:space="preserve">. The mean ET values of scenarios in these two categories are 34 to 111 million m</w:t>
+        <w:t xml:space="preserve">). Among all scenarios, it is the only scenario that focuses solely on management of surface water diversions for irrigation. It assumes the FJ Gauge flowrate is representative of watershed conditions, and limits diversions of surface water from all tributaries on days when the FJ Gauge flowrate falls below a recently proposed instream flow regime that is considered to be protective of anadromous fish in the Scott River</w:t>
+      </w:r>
+      <w:r>
+        <w:t xml:space="preserve"> </w:t>
+      </w:r>
+      <w:r>
+        <w:t xml:space="preserve">(CDFW 2017)</w:t>
+      </w:r>
+      <w:r>
+        <w:t xml:space="preserve">. Under this Low Flow Diversion Limits scenario, the mean crop ET volume is 6 million m</w:t>
       </w:r>
       <w:r>
         <w:rPr>
@@ -8509,7 +8662,10 @@
         <w:t xml:space="preserve">3</w:t>
       </w:r>
       <w:r>
-        <w:t xml:space="preserve">, or 69 to 0.3 percent less than basecase; HB gains over basecase are 1 to 11 coho spf-equivalent.</w:t>
+        <w:t xml:space="preserve"> </w:t>
+      </w:r>
+      <w:r>
+        <w:t xml:space="preserve">(~6%) less than basecase, while the mean HB value is 2 coho spf-equivalent greater than basecase.</w:t>
       </w:r>
     </w:p>
     <w:p>
@@ -8517,7 +8673,88 @@
         <w:pStyle w:val="BodyText"/>
       </w:pPr>
       <w:r>
-        <w:t xml:space="preserve">The third regulatory category, Low Flow Diversion Limits, regulates surface water diversion for irrigation, and contains only one scenario (Figure</w:t>
+        <w:t xml:space="preserve">The remaining two categories, abbreviated as</w:t>
+      </w:r>
+      <w:r>
+        <w:t xml:space="preserve"> </w:t>
+      </w:r>
+      <w:r>
+        <w:t xml:space="preserve">“</w:t>
+      </w:r>
+      <w:r>
+        <w:t xml:space="preserve">NatVeg</w:t>
+      </w:r>
+      <w:r>
+        <w:t xml:space="preserve">”</w:t>
+      </w:r>
+      <w:r>
+        <w:t xml:space="preserve"> </w:t>
+      </w:r>
+      <w:r>
+        <w:t xml:space="preserve">and</w:t>
+      </w:r>
+      <w:r>
+        <w:t xml:space="preserve"> </w:t>
+      </w:r>
+      <w:r>
+        <w:t xml:space="preserve">“</w:t>
+      </w:r>
+      <w:r>
+        <w:t xml:space="preserve">NatVegET</w:t>
+      </w:r>
+      <w:r>
+        <w:t xml:space="preserve">”</w:t>
+      </w:r>
+      <w:r>
+        <w:t xml:space="preserve">, relate to land cover type and are not proposed as management actions. Rather, these provide reference scenarios for conditions in some or all parts of the valley that could be considered to stand in for undefined</w:t>
+      </w:r>
+      <w:r>
+        <w:t xml:space="preserve"> </w:t>
+      </w:r>
+      <w:r>
+        <w:t xml:space="preserve">“</w:t>
+      </w:r>
+      <w:r>
+        <w:t xml:space="preserve">pre-historic</w:t>
+      </w:r>
+      <w:r>
+        <w:t xml:space="preserve">”</w:t>
+      </w:r>
+      <w:r>
+        <w:t xml:space="preserve">,</w:t>
+      </w:r>
+      <w:r>
+        <w:t xml:space="preserve"> </w:t>
+      </w:r>
+      <w:r>
+        <w:t xml:space="preserve">“</w:t>
+      </w:r>
+      <w:r>
+        <w:t xml:space="preserve">unimpaired</w:t>
+      </w:r>
+      <w:r>
+        <w:t xml:space="preserve">”</w:t>
+      </w:r>
+      <w:r>
+        <w:t xml:space="preserve">, or</w:t>
+      </w:r>
+      <w:r>
+        <w:t xml:space="preserve"> </w:t>
+      </w:r>
+      <w:r>
+        <w:t xml:space="preserve">“</w:t>
+      </w:r>
+      <w:r>
+        <w:t xml:space="preserve">conservation</w:t>
+      </w:r>
+      <w:r>
+        <w:t xml:space="preserve">”</w:t>
+      </w:r>
+      <w:r>
+        <w:t xml:space="preserve"> </w:t>
+      </w:r>
+      <w:r>
+        <w:t xml:space="preserve">conditions. They involve simulating native vegetation in place of irrigated acreage, and were designed to estimate the streamflow depletion attributable to agricultural water use in different areas of Scott Valley. These scenarios produce substantial HB gains at a high ET cost relative to basecase (Figure</w:t>
       </w:r>
       <w:r>
         <w:t xml:space="preserve"> </w:t>
@@ -8526,28 +8763,7 @@
         <w:t xml:space="preserve">6</w:t>
       </w:r>
       <w:r>
-        <w:t xml:space="preserve">). Among all scenarios, it is the only scenario that focuses solely on management of surface water diversions for irrigation. It assumes the FJ Gauge flowrate is representative of watershed conditions, and limits diversions of surface water from all tributaries on days when the FJ Gauge flowrate falls below a recently proposed instream flow regime that is considered to be protective of anadromous fish in the Scott River</w:t>
-      </w:r>
-      <w:r>
-        <w:t xml:space="preserve"> </w:t>
-      </w:r>
-      <w:r>
-        <w:t xml:space="preserve">(CDFW 2017)</w:t>
-      </w:r>
-      <w:r>
-        <w:t xml:space="preserve">. Under this Low Flow Diversion Limits scenario, the mean crop ET volume is 6 million m</w:t>
-      </w:r>
-      <w:r>
-        <w:rPr>
-          <w:vertAlign w:val="superscript"/>
-        </w:rPr>
-        <w:t xml:space="preserve">3</w:t>
-      </w:r>
-      <w:r>
-        <w:t xml:space="preserve"> </w:t>
-      </w:r>
-      <w:r>
-        <w:t xml:space="preserve">(~6%) less than basecase, while the mean HB value is 2 coho spf-equivalent greater than basecase.</w:t>
+        <w:t xml:space="preserve">).</w:t>
       </w:r>
     </w:p>
     <w:p>
@@ -8555,7 +8771,7 @@
         <w:pStyle w:val="BodyText"/>
       </w:pPr>
       <w:r>
-        <w:t xml:space="preserve">The remaining two categories, abbreviated as</w:t>
+        <w:t xml:space="preserve">The key geographic feature in the NatVeg and NatVegET scenarios is the</w:t>
       </w:r>
       <w:r>
         <w:t xml:space="preserve"> </w:t>
@@ -8564,7 +8780,7 @@
         <w:t xml:space="preserve">“</w:t>
       </w:r>
       <w:r>
-        <w:t xml:space="preserve">NatVeg</w:t>
+        <w:t xml:space="preserve">Interconnected Zone</w:t>
       </w:r>
       <w:r>
         <w:t xml:space="preserve">”</w:t>
@@ -8573,7 +8789,16 @@
         <w:t xml:space="preserve"> </w:t>
       </w:r>
       <w:r>
-        <w:t xml:space="preserve">and</w:t>
+        <w:t xml:space="preserve">in the 1980 Scott Valley surface water adjudication</w:t>
+      </w:r>
+      <w:r>
+        <w:t xml:space="preserve"> </w:t>
+      </w:r>
+      <w:r>
+        <w:t xml:space="preserve">(Superior Court of Siskiyou County 1980)</w:t>
+      </w:r>
+      <w:r>
+        <w:t xml:space="preserve">, referred to here as the</w:t>
       </w:r>
       <w:r>
         <w:t xml:space="preserve"> </w:t>
@@ -8582,70 +8807,25 @@
         <w:t xml:space="preserve">“</w:t>
       </w:r>
       <w:r>
-        <w:t xml:space="preserve">NatVegET</w:t>
+        <w:t xml:space="preserve">adjudicated zone</w:t>
       </w:r>
       <w:r>
         <w:t xml:space="preserve">”</w:t>
       </w:r>
       <w:r>
-        <w:t xml:space="preserve">, relate to land cover type and are not proposed as management actions. Rather, these provide reference scenarios for conditions in some or all parts of the valley that could be considered to stand in for undefined</w:t>
-      </w:r>
-      <w:r>
-        <w:t xml:space="preserve"> </w:t>
-      </w:r>
-      <w:r>
-        <w:t xml:space="preserve">“</w:t>
-      </w:r>
-      <w:r>
-        <w:t xml:space="preserve">pre-historic</w:t>
-      </w:r>
-      <w:r>
-        <w:t xml:space="preserve">”</w:t>
-      </w:r>
-      <w:r>
-        <w:t xml:space="preserve">,</w:t>
-      </w:r>
-      <w:r>
-        <w:t xml:space="preserve"> </w:t>
-      </w:r>
-      <w:r>
-        <w:t xml:space="preserve">“</w:t>
-      </w:r>
-      <w:r>
-        <w:t xml:space="preserve">unimpaired</w:t>
-      </w:r>
-      <w:r>
-        <w:t xml:space="preserve">”</w:t>
-      </w:r>
-      <w:r>
-        <w:t xml:space="preserve">, or</w:t>
-      </w:r>
-      <w:r>
-        <w:t xml:space="preserve"> </w:t>
-      </w:r>
-      <w:r>
-        <w:t xml:space="preserve">“</w:t>
-      </w:r>
-      <w:r>
-        <w:t xml:space="preserve">conservation</w:t>
-      </w:r>
-      <w:r>
-        <w:t xml:space="preserve">”</w:t>
-      </w:r>
-      <w:r>
-        <w:t xml:space="preserve"> </w:t>
-      </w:r>
-      <w:r>
-        <w:t xml:space="preserve">conditions. They involve simulating native vegetation in place of irrigated acreage, and were designed to estimate the streamflow depletion attributable to agricultural water use in different areas of Scott Valley. These scenarios produce substantial HB gains at a high ET cost relative to basecase (Figure</w:t>
-      </w:r>
-      <w:r>
-        <w:t xml:space="preserve"> </w:t>
-      </w:r>
-      <w:r>
-        <w:t xml:space="preserve">6</w:t>
-      </w:r>
-      <w:r>
-        <w:t xml:space="preserve">).</w:t>
+        <w:t xml:space="preserve"> </w:t>
+      </w:r>
+      <w:r>
+        <w:t xml:space="preserve">of groundwater pumping (Figure</w:t>
+      </w:r>
+      <w:r>
+        <w:t xml:space="preserve"> </w:t>
+      </w:r>
+      <w:r>
+        <w:t xml:space="preserve">1</w:t>
+      </w:r>
+      <w:r>
+        <w:t xml:space="preserve">), and the six scenarios in each category represent the cessation of all irrigation or the cessation of only groundwater pumping in three spatial configurations: within the adjudicated zone, outside of the adjudicated zone, or in both areas. All areas where irrigation or pumping is turned off are assumed to return to (unirrigated) native vegetation.</w:t>
       </w:r>
     </w:p>
     <w:p>
@@ -8653,68 +8833,6 @@
         <w:pStyle w:val="BodyText"/>
       </w:pPr>
       <w:r>
-        <w:t xml:space="preserve">The key geographic feature in the NatVeg and NatVegET scenarios is the</w:t>
-      </w:r>
-      <w:r>
-        <w:t xml:space="preserve"> </w:t>
-      </w:r>
-      <w:r>
-        <w:t xml:space="preserve">“</w:t>
-      </w:r>
-      <w:r>
-        <w:t xml:space="preserve">Interconnected Zone</w:t>
-      </w:r>
-      <w:r>
-        <w:t xml:space="preserve">”</w:t>
-      </w:r>
-      <w:r>
-        <w:t xml:space="preserve"> </w:t>
-      </w:r>
-      <w:r>
-        <w:t xml:space="preserve">in the 1980 Scott Valley surface water adjudication</w:t>
-      </w:r>
-      <w:r>
-        <w:t xml:space="preserve"> </w:t>
-      </w:r>
-      <w:r>
-        <w:t xml:space="preserve">(Superior Court of Siskiyou County 1980)</w:t>
-      </w:r>
-      <w:r>
-        <w:t xml:space="preserve">, referred to here as the</w:t>
-      </w:r>
-      <w:r>
-        <w:t xml:space="preserve"> </w:t>
-      </w:r>
-      <w:r>
-        <w:t xml:space="preserve">“</w:t>
-      </w:r>
-      <w:r>
-        <w:t xml:space="preserve">adjudicated zone</w:t>
-      </w:r>
-      <w:r>
-        <w:t xml:space="preserve">”</w:t>
-      </w:r>
-      <w:r>
-        <w:t xml:space="preserve"> </w:t>
-      </w:r>
-      <w:r>
-        <w:t xml:space="preserve">of groundwater pumping (Figure</w:t>
-      </w:r>
-      <w:r>
-        <w:t xml:space="preserve"> </w:t>
-      </w:r>
-      <w:r>
-        <w:t xml:space="preserve">1</w:t>
-      </w:r>
-      <w:r>
-        <w:t xml:space="preserve">), and the six scenarios in each category represent the cessation of all irrigation or the cessation of only groundwater pumping in three spatial configurations: within the adjudicated zone, outside of the adjudicated zone, or in both areas. All areas where irrigation or pumping is turned off are assumed to return to (unirrigated) native vegetation.</w:t>
-      </w:r>
-    </w:p>
-    <w:p>
-      <w:pPr>
-        <w:pStyle w:val="BodyText"/>
-      </w:pPr>
-      <w:r>
         <w:t xml:space="preserve">On average, area-normalized ET from native vegetation is 45 cm/year (56% of average annual crop ET). Simulating native vegetation in place of irrigated acreage results in a greater proportion of water leaving the SVIHM model domain via surface flows rather than as transpiration. Consequently the NatVeg and NatVeg ET scenarios generate higher simulated FJ streamflow in most months of the model period. The first category (NatVeg) assumes a native vegetation crop coefficient of 0.6, while the second category (NatVegET) assumes a native vegetation crop coefficient of 1.0 and a maximum rooting depth of 4.5 m. The first category could be interpreted as chaparral or sage scrub-type vegetation cover, while the second category could represent a mixed bunchgrass and clover prairie with extensive riparian vegetation corridors and wetlands. (See</w:t>
       </w:r>
       <w:r>
@@ -8738,6 +8856,8 @@
       <w:pPr>
         <w:pStyle w:val="TableCaption"/>
       </w:pPr>
+      <w:bookmarkStart w:id="65" w:name="tab:scenarioResultsTab"/>
+      <w:bookmarkEnd w:id="65"/>
       <w:r>
         <w:t xml:space="preserve">Table 4:</w:t>
       </w:r>
@@ -23444,8 +23564,8 @@
         </w:tc>
       </w:tr>
     </w:tbl>
-    <w:bookmarkEnd w:id="56"/>
-    <w:bookmarkStart w:id="60" w:name="X5717be130d28923be971a1bdea556d769a5487a"/>
+    <w:bookmarkEnd w:id="66"/>
+    <w:bookmarkStart w:id="71" w:name="X5717be130d28923be971a1bdea556d769a5487a"/>
     <w:p>
       <w:pPr>
         <w:pStyle w:val="Heading3"/>
@@ -23580,18 +23700,18 @@
           <wp:inline>
             <wp:extent cx="4620126" cy="5544151"/>
             <wp:effectExtent b="0" l="0" r="0" t="0"/>
-            <wp:docPr descr="Figure 7:  Scenario trade-off efficiencies, or average HB value gained per crop ET value lost (normalized to average basecase HB and ET values, respectively), in all 28 years (x-axis) and in six low-coho years (y-axis; i.e., the six years with basecase predicted HB values of less than 45 coho spf-equiv.). Basecase, Reservoir scenarios and one Enhanced Recharge scenario (MAR) are not included as they have on average no or negative ET loss." title="" id="58" name="Picture"/>
+            <wp:docPr descr="Figure 7:  Scenario trade-off efficiencies, or average HB value gained per crop ET value lost (normalized to average basecase HB and ET values, respectively), in all 28 years (x-axis) and in six low-coho years (y-axis; i.e., the six years with basecase predicted HB values of less than 45 coho spf-equiv.). Basecase, Reservoir scenarios and one Enhanced Recharge scenario (MAR) are not included as they have on average no or negative ET loss." title="" id="68" name="Picture"/>
             <a:graphic>
               <a:graphicData uri="http://schemas.openxmlformats.org/drawingml/2006/picture">
                 <pic:pic>
                   <pic:nvPicPr>
-                    <pic:cNvPr descr="Kouba_Fish_and_Ag_Benefit_MS_files/figure-docx/efficiency-1.png" id="59" name="Picture"/>
+                    <pic:cNvPr descr="Kouba_Fish_and_Ag_Benefit_MS_files/figure-docx/efficiency-1.png" id="69" name="Picture"/>
                     <pic:cNvPicPr>
                       <a:picLocks noChangeArrowheads="1" noChangeAspect="1"/>
                     </pic:cNvPicPr>
                   </pic:nvPicPr>
                   <pic:blipFill>
-                    <a:blip r:embed="rId57"/>
+                    <a:blip r:embed="rId67"/>
                     <a:stretch>
                       <a:fillRect/>
                     </a:stretch>
@@ -23622,6 +23742,8 @@
       <w:pPr>
         <w:pStyle w:val="ImageCaption"/>
       </w:pPr>
+      <w:bookmarkStart w:id="70" w:name="fig:efficiency"/>
+      <w:bookmarkEnd w:id="70"/>
       <w:r>
         <w:t xml:space="preserve">Figure 7:</w:t>
       </w:r>
@@ -23635,8 +23757,8 @@
         <w:t xml:space="preserve">Scenario trade-off efficiencies, or average HB value gained per crop ET value lost (normalized to average basecase HB and ET values, respectively), in all 28 years (x-axis) and in six low-coho years (y-axis; i.e., the six years with basecase predicted HB values of less than 45 coho spf-equiv.). Basecase, Reservoir scenarios and one Enhanced Recharge scenario (MAR) are not included as they have on average no or negative ET loss.</w:t>
       </w:r>
     </w:p>
-    <w:bookmarkEnd w:id="60"/>
-    <w:bookmarkStart w:id="64" w:name="Xfbc83626841bb94e70b2ed42e58f7fe62bf81a6"/>
+    <w:bookmarkEnd w:id="71"/>
+    <w:bookmarkStart w:id="77" w:name="Xfbc83626841bb94e70b2ed42e58f7fe62bf81a6"/>
     <w:p>
       <w:pPr>
         <w:pStyle w:val="Heading3"/>
@@ -23795,20 +23917,20 @@
       <w:r>
         <w:drawing>
           <wp:inline>
-            <wp:extent cx="5334000" cy="4909038"/>
+            <wp:extent cx="4267200" cy="3927230"/>
             <wp:effectExtent b="0" l="0" r="0" t="0"/>
-            <wp:docPr descr="Figure 8:  A three-dimensional scatter plot of the objective function values for basecase and 39 management scenarios, averaged over 28 water years (1991-2018). Larger spheres are shown for the Pareto-optimal set of scenarios. Scenario colors correspond to legend in Figures 6 and 7." title="" id="62" name="Picture"/>
+            <wp:docPr descr="Figure 8:  A three-dimensional scatter plot of the objective function values for basecase and 39 management scenarios, averaged over 28 water years (1991-2018). Larger spheres are shown for the Pareto-optimal set of scenarios. Scenario colors correspond to legend in Figures 6 and 7." title="" id="73" name="Picture"/>
             <a:graphic>
               <a:graphicData uri="http://schemas.openxmlformats.org/drawingml/2006/picture">
                 <pic:pic>
                   <pic:nvPicPr>
-                    <pic:cNvPr descr="Graphics%20and%20Supplements/hbf%20et%20infra%20plot3d_2024.11.PNG" id="63" name="Picture"/>
+                    <pic:cNvPr descr="Graphics%20and%20Supplements/hbf%20et%20infra%20plot3d_2024.11.PNG" id="74" name="Picture"/>
                     <pic:cNvPicPr>
                       <a:picLocks noChangeArrowheads="1" noChangeAspect="1"/>
                     </pic:cNvPicPr>
                   </pic:nvPicPr>
                   <pic:blipFill>
-                    <a:blip r:embed="rId61"/>
+                    <a:blip r:embed="rId72"/>
                     <a:stretch>
                       <a:fillRect/>
                     </a:stretch>
@@ -23816,7 +23938,7 @@
                   <pic:spPr bwMode="auto">
                     <a:xfrm>
                       <a:off x="0" y="0"/>
-                      <a:ext cx="5334000" cy="4909038"/>
+                      <a:ext cx="4267200" cy="3927230"/>
                     </a:xfrm>
                     <a:prstGeom prst="rect">
                       <a:avLst/>
@@ -23839,6 +23961,8 @@
       <w:pPr>
         <w:pStyle w:val="ImageCaption"/>
       </w:pPr>
+      <w:bookmarkStart w:id="75" w:name="fig:farmerFishInfraFigure3D"/>
+      <w:bookmarkEnd w:id="75"/>
       <w:r>
         <w:t xml:space="preserve">Figure 8:</w:t>
       </w:r>
@@ -23856,6 +23980,8 @@
       <w:pPr>
         <w:pStyle w:val="TableCaption"/>
       </w:pPr>
+      <w:bookmarkStart w:id="76" w:name="tab:gspMgmtList"/>
+      <w:bookmarkEnd w:id="76"/>
       <w:r>
         <w:t xml:space="preserve">Table 5:</w:t>
       </w:r>
@@ -26848,10 +26974,10 @@
         <w:br w:type="page"/>
       </w:r>
     </w:p>
-    <w:bookmarkEnd w:id="64"/>
-    <w:bookmarkEnd w:id="65"/>
-    <w:bookmarkEnd w:id="66"/>
-    <w:bookmarkStart w:id="72" w:name="discussion"/>
+    <w:bookmarkEnd w:id="77"/>
+    <w:bookmarkEnd w:id="78"/>
+    <w:bookmarkEnd w:id="79"/>
+    <w:bookmarkStart w:id="85" w:name="discussion"/>
     <w:p>
       <w:pPr>
         <w:pStyle w:val="Heading1"/>
@@ -26886,7 +27012,7 @@
         <w:t xml:space="preserve">]. Though the ultimate future effect of these management actions would depend on climate variability and implementation details that have not been explicitly simulated (e.g., the precise location of pumps needed to divert surface water for the expanded enhanced recharge scenarios), it is possible to use objective functions and historical climate records to draw some high-level findings regarding their relative merits.</w:t>
       </w:r>
     </w:p>
-    <w:bookmarkStart w:id="67" w:name="Xa151cb59b4ad5c02348e31b83bab4d8169de230"/>
+    <w:bookmarkStart w:id="80" w:name="Xa151cb59b4ad5c02348e31b83bab4d8169de230"/>
     <w:p>
       <w:pPr>
         <w:pStyle w:val="Heading2"/>
@@ -26955,8 +27081,8 @@
         <w:t xml:space="preserve">These predicted on-the-ground consequences can facilitate interpretation of scenario results.</w:t>
       </w:r>
     </w:p>
-    <w:bookmarkEnd w:id="67"/>
-    <w:bookmarkStart w:id="68" w:name="Xeb4407dfc59ea709d91a13199c8e469abf09cea"/>
+    <w:bookmarkEnd w:id="80"/>
+    <w:bookmarkStart w:id="81" w:name="Xeb4407dfc59ea709d91a13199c8e469abf09cea"/>
     <w:p>
       <w:pPr>
         <w:pStyle w:val="Heading2"/>
@@ -27058,8 +27184,8 @@
         <w:t xml:space="preserve">), the low-coho year HB performance of various model scenarios is a key scenario differentiator.</w:t>
       </w:r>
     </w:p>
-    <w:bookmarkEnd w:id="68"/>
-    <w:bookmarkStart w:id="69" w:name="environmental-agricultural-trade-offs"/>
+    <w:bookmarkEnd w:id="81"/>
+    <w:bookmarkStart w:id="82" w:name="environmental-agricultural-trade-offs"/>
     <w:p>
       <w:pPr>
         <w:pStyle w:val="Heading2"/>
@@ -27335,8 +27461,8 @@
         <w:t xml:space="preserve">).</w:t>
       </w:r>
     </w:p>
-    <w:bookmarkEnd w:id="69"/>
-    <w:bookmarkStart w:id="70" w:name="Xb48c0b1c357814727cacf50afe35e98b0bf92dd"/>
+    <w:bookmarkEnd w:id="82"/>
+    <w:bookmarkStart w:id="83" w:name="Xb48c0b1c357814727cacf50afe35e98b0bf92dd"/>
     <w:p>
       <w:pPr>
         <w:pStyle w:val="Heading2"/>
@@ -27431,8 +27557,8 @@
         <w:t xml:space="preserve">). Although the GSP management priorities emphasized infrastructure, in a strict application of these objective functions, both infrastructure-based and regulatory approaches fell within the Pareto-optimal set of management options.</w:t>
       </w:r>
     </w:p>
-    <w:bookmarkEnd w:id="70"/>
-    <w:bookmarkStart w:id="71" w:name="policy-implications"/>
+    <w:bookmarkEnd w:id="83"/>
+    <w:bookmarkStart w:id="84" w:name="policy-implications"/>
     <w:p>
       <w:pPr>
         <w:pStyle w:val="Heading2"/>
@@ -27550,9 +27676,9 @@
         <w:t xml:space="preserve">).</w:t>
       </w:r>
     </w:p>
-    <w:bookmarkEnd w:id="71"/>
-    <w:bookmarkEnd w:id="72"/>
-    <w:bookmarkStart w:id="73" w:name="conclusion"/>
+    <w:bookmarkEnd w:id="84"/>
+    <w:bookmarkEnd w:id="85"/>
+    <w:bookmarkStart w:id="86" w:name="conclusion"/>
     <w:p>
       <w:pPr>
         <w:pStyle w:val="Heading1"/>
@@ -27616,8 +27742,8 @@
         <w:br w:type="page"/>
       </w:r>
     </w:p>
-    <w:bookmarkEnd w:id="73"/>
-    <w:bookmarkStart w:id="149" w:name="references"/>
+    <w:bookmarkEnd w:id="86"/>
+    <w:bookmarkStart w:id="162" w:name="references"/>
     <w:p>
       <w:pPr>
         <w:pStyle w:val="Heading1"/>
@@ -27626,8 +27752,8 @@
         <w:t xml:space="preserve">References</w:t>
       </w:r>
     </w:p>
-    <w:bookmarkStart w:id="148" w:name="refs"/>
-    <w:bookmarkStart w:id="75" w:name="ref-Brown2015"/>
+    <w:bookmarkStart w:id="161" w:name="refs"/>
+    <w:bookmarkStart w:id="88" w:name="ref-Brown2015"/>
     <w:p>
       <w:pPr>
         <w:pStyle w:val="Bibliography"/>
@@ -27666,7 +27792,7 @@
       <w:r>
         <w:t xml:space="preserve"> </w:t>
       </w:r>
-      <w:hyperlink r:id="rId74">
+      <w:hyperlink r:id="rId87">
         <w:r>
           <w:rPr>
             <w:rStyle w:val="Hyperlink"/>
@@ -27678,8 +27804,8 @@
         <w:t xml:space="preserve">.</w:t>
       </w:r>
     </w:p>
-    <w:bookmarkEnd w:id="75"/>
-    <w:bookmarkStart w:id="77" w:name="ref-Brown1994"/>
+    <w:bookmarkEnd w:id="88"/>
+    <w:bookmarkStart w:id="90" w:name="ref-Brown1994"/>
     <w:p>
       <w:pPr>
         <w:pStyle w:val="Bibliography"/>
@@ -27718,7 +27844,7 @@
       <w:r>
         <w:t xml:space="preserve"> </w:t>
       </w:r>
-      <w:hyperlink r:id="rId76">
+      <w:hyperlink r:id="rId89">
         <w:r>
           <w:rPr>
             <w:rStyle w:val="Hyperlink"/>
@@ -27730,8 +27856,8 @@
         <w:t xml:space="preserve">.</w:t>
       </w:r>
     </w:p>
-    <w:bookmarkEnd w:id="77"/>
-    <w:bookmarkStart w:id="79" w:name="ref-CDFW2015a"/>
+    <w:bookmarkEnd w:id="90"/>
+    <w:bookmarkStart w:id="92" w:name="ref-CDFW2015a"/>
     <w:p>
       <w:pPr>
         <w:pStyle w:val="Bibliography"/>
@@ -27760,7 +27886,7 @@
       <w:r>
         <w:t xml:space="preserve"> </w:t>
       </w:r>
-      <w:hyperlink r:id="rId78">
+      <w:hyperlink r:id="rId91">
         <w:r>
           <w:rPr>
             <w:rStyle w:val="Hyperlink"/>
@@ -27772,8 +27898,8 @@
         <w:t xml:space="preserve">.</w:t>
       </w:r>
     </w:p>
-    <w:bookmarkEnd w:id="79"/>
-    <w:bookmarkStart w:id="81" w:name="ref-CDFW2017"/>
+    <w:bookmarkEnd w:id="92"/>
+    <w:bookmarkStart w:id="94" w:name="ref-CDFW2017"/>
     <w:p>
       <w:pPr>
         <w:pStyle w:val="Bibliography"/>
@@ -27796,7 +27922,7 @@
       <w:r>
         <w:t xml:space="preserve"> </w:t>
       </w:r>
-      <w:hyperlink r:id="rId80">
+      <w:hyperlink r:id="rId93">
         <w:r>
           <w:rPr>
             <w:rStyle w:val="Hyperlink"/>
@@ -27808,8 +27934,8 @@
         <w:t xml:space="preserve">.</w:t>
       </w:r>
     </w:p>
-    <w:bookmarkEnd w:id="81"/>
-    <w:bookmarkStart w:id="83" w:name="ref-DWR2017"/>
+    <w:bookmarkEnd w:id="94"/>
+    <w:bookmarkStart w:id="96" w:name="ref-DWR2017"/>
     <w:p>
       <w:pPr>
         <w:pStyle w:val="Bibliography"/>
@@ -27832,7 +27958,7 @@
       <w:r>
         <w:t xml:space="preserve"> </w:t>
       </w:r>
-      <w:hyperlink r:id="rId82">
+      <w:hyperlink r:id="rId95">
         <w:r>
           <w:rPr>
             <w:rStyle w:val="Hyperlink"/>
@@ -27844,8 +27970,8 @@
         <w:t xml:space="preserve">.</w:t>
       </w:r>
     </w:p>
-    <w:bookmarkEnd w:id="83"/>
-    <w:bookmarkStart w:id="84" w:name="ref-SWRCB1975"/>
+    <w:bookmarkEnd w:id="96"/>
+    <w:bookmarkStart w:id="97" w:name="ref-SWRCB1975"/>
     <w:p>
       <w:pPr>
         <w:pStyle w:val="Bibliography"/>
@@ -27866,8 +27992,8 @@
         <w:t xml:space="preserve">.”</w:t>
       </w:r>
     </w:p>
-    <w:bookmarkEnd w:id="84"/>
-    <w:bookmarkStart w:id="86" w:name="ref-Carter1983"/>
+    <w:bookmarkEnd w:id="97"/>
+    <w:bookmarkStart w:id="99" w:name="ref-Carter1983"/>
     <w:p>
       <w:pPr>
         <w:pStyle w:val="Bibliography"/>
@@ -27906,7 +28032,7 @@
       <w:r>
         <w:t xml:space="preserve"> </w:t>
       </w:r>
-      <w:hyperlink r:id="rId85">
+      <w:hyperlink r:id="rId98">
         <w:r>
           <w:rPr>
             <w:rStyle w:val="Hyperlink"/>
@@ -27918,8 +28044,8 @@
         <w:t xml:space="preserve">.</w:t>
       </w:r>
     </w:p>
-    <w:bookmarkEnd w:id="86"/>
-    <w:bookmarkStart w:id="88" w:name="ref-CDFW2021c"/>
+    <w:bookmarkEnd w:id="99"/>
+    <w:bookmarkStart w:id="101" w:name="ref-CDFW2021c"/>
     <w:p>
       <w:pPr>
         <w:pStyle w:val="Bibliography"/>
@@ -27948,7 +28074,7 @@
       <w:r>
         <w:t xml:space="preserve"> </w:t>
       </w:r>
-      <w:hyperlink r:id="rId87">
+      <w:hyperlink r:id="rId100">
         <w:r>
           <w:rPr>
             <w:rStyle w:val="Hyperlink"/>
@@ -27960,8 +28086,8 @@
         <w:t xml:space="preserve">.</w:t>
       </w:r>
     </w:p>
-    <w:bookmarkEnd w:id="88"/>
-    <w:bookmarkStart w:id="90" w:name="ref-Cohon1973"/>
+    <w:bookmarkEnd w:id="101"/>
+    <w:bookmarkStart w:id="103" w:name="ref-Cohon1973"/>
     <w:p>
       <w:pPr>
         <w:pStyle w:val="Bibliography"/>
@@ -28000,7 +28126,7 @@
       <w:r>
         <w:t xml:space="preserve"> </w:t>
       </w:r>
-      <w:hyperlink r:id="rId89">
+      <w:hyperlink r:id="rId102">
         <w:r>
           <w:rPr>
             <w:rStyle w:val="Hyperlink"/>
@@ -28012,8 +28138,8 @@
         <w:t xml:space="preserve">.</w:t>
       </w:r>
     </w:p>
-    <w:bookmarkEnd w:id="90"/>
-    <w:bookmarkStart w:id="92" w:name="ref-Cohon1975"/>
+    <w:bookmarkEnd w:id="103"/>
+    <w:bookmarkStart w:id="105" w:name="ref-Cohon1975"/>
     <w:p>
       <w:pPr>
         <w:pStyle w:val="Bibliography"/>
@@ -28052,7 +28178,7 @@
       <w:r>
         <w:t xml:space="preserve"> </w:t>
       </w:r>
-      <w:hyperlink r:id="rId91">
+      <w:hyperlink r:id="rId104">
         <w:r>
           <w:rPr>
             <w:rStyle w:val="Hyperlink"/>
@@ -28064,8 +28190,8 @@
         <w:t xml:space="preserve">.</w:t>
       </w:r>
     </w:p>
-    <w:bookmarkEnd w:id="92"/>
-    <w:bookmarkStart w:id="93" w:name="ref-Cole2021"/>
+    <w:bookmarkEnd w:id="105"/>
+    <w:bookmarkStart w:id="106" w:name="ref-Cole2021"/>
     <w:p>
       <w:pPr>
         <w:pStyle w:val="Bibliography"/>
@@ -28092,8 +28218,8 @@
         <w:t xml:space="preserve">Merced, CA: University of California, Merced.</w:t>
       </w:r>
     </w:p>
-    <w:bookmarkEnd w:id="93"/>
-    <w:bookmarkStart w:id="95" w:name="ref-DiBaldassarre2019"/>
+    <w:bookmarkEnd w:id="106"/>
+    <w:bookmarkStart w:id="108" w:name="ref-DiBaldassarre2019"/>
     <w:p>
       <w:pPr>
         <w:pStyle w:val="Bibliography"/>
@@ -28132,7 +28258,7 @@
       <w:r>
         <w:t xml:space="preserve"> </w:t>
       </w:r>
-      <w:hyperlink r:id="rId94">
+      <w:hyperlink r:id="rId107">
         <w:r>
           <w:rPr>
             <w:rStyle w:val="Hyperlink"/>
@@ -28144,8 +28270,8 @@
         <w:t xml:space="preserve">.</w:t>
       </w:r>
     </w:p>
-    <w:bookmarkEnd w:id="95"/>
-    <w:bookmarkStart w:id="97" w:name="ref-DWR2019"/>
+    <w:bookmarkEnd w:id="108"/>
+    <w:bookmarkStart w:id="110" w:name="ref-DWR2019"/>
     <w:p>
       <w:pPr>
         <w:pStyle w:val="Bibliography"/>
@@ -28174,7 +28300,7 @@
       <w:r>
         <w:t xml:space="preserve"> </w:t>
       </w:r>
-      <w:hyperlink r:id="rId96">
+      <w:hyperlink r:id="rId109">
         <w:r>
           <w:rPr>
             <w:rStyle w:val="Hyperlink"/>
@@ -28186,8 +28312,8 @@
         <w:t xml:space="preserve">.</w:t>
       </w:r>
     </w:p>
-    <w:bookmarkEnd w:id="97"/>
-    <w:bookmarkStart w:id="99" w:name="ref-Foglia2013a"/>
+    <w:bookmarkEnd w:id="110"/>
+    <w:bookmarkStart w:id="112" w:name="ref-Foglia2013a"/>
     <w:p>
       <w:pPr>
         <w:pStyle w:val="Bibliography"/>
@@ -28216,7 +28342,7 @@
       <w:r>
         <w:t xml:space="preserve"> </w:t>
       </w:r>
-      <w:hyperlink r:id="rId98">
+      <w:hyperlink r:id="rId111">
         <w:r>
           <w:rPr>
             <w:rStyle w:val="Hyperlink"/>
@@ -28228,8 +28354,8 @@
         <w:t xml:space="preserve">.</w:t>
       </w:r>
     </w:p>
-    <w:bookmarkEnd w:id="99"/>
-    <w:bookmarkStart w:id="101" w:name="ref-FCGMA2019"/>
+    <w:bookmarkEnd w:id="112"/>
+    <w:bookmarkStart w:id="114" w:name="ref-FCGMA2019"/>
     <w:p>
       <w:pPr>
         <w:pStyle w:val="Bibliography"/>
@@ -28258,7 +28384,7 @@
       <w:r>
         <w:t xml:space="preserve"> </w:t>
       </w:r>
-      <w:hyperlink r:id="rId100">
+      <w:hyperlink r:id="rId113">
         <w:r>
           <w:rPr>
             <w:rStyle w:val="Hyperlink"/>
@@ -28270,8 +28396,8 @@
         <w:t xml:space="preserve">.</w:t>
       </w:r>
     </w:p>
-    <w:bookmarkEnd w:id="101"/>
-    <w:bookmarkStart w:id="103" w:name="ref-Gorelick1983"/>
+    <w:bookmarkEnd w:id="114"/>
+    <w:bookmarkStart w:id="116" w:name="ref-Gorelick1983"/>
     <w:p>
       <w:pPr>
         <w:pStyle w:val="Bibliography"/>
@@ -28310,7 +28436,7 @@
       <w:r>
         <w:t xml:space="preserve"> </w:t>
       </w:r>
-      <w:hyperlink r:id="rId102">
+      <w:hyperlink r:id="rId115">
         <w:r>
           <w:rPr>
             <w:rStyle w:val="Hyperlink"/>
@@ -28322,8 +28448,8 @@
         <w:t xml:space="preserve">.</w:t>
       </w:r>
     </w:p>
-    <w:bookmarkEnd w:id="103"/>
-    <w:bookmarkStart w:id="105" w:name="ref-Graham2012"/>
+    <w:bookmarkEnd w:id="116"/>
+    <w:bookmarkStart w:id="118" w:name="ref-Graham2012"/>
     <w:p>
       <w:pPr>
         <w:pStyle w:val="Bibliography"/>
@@ -28346,7 +28472,7 @@
       <w:r>
         <w:t xml:space="preserve"> </w:t>
       </w:r>
-      <w:hyperlink r:id="rId104">
+      <w:hyperlink r:id="rId117">
         <w:r>
           <w:rPr>
             <w:rStyle w:val="Hyperlink"/>
@@ -28358,8 +28484,8 @@
         <w:t xml:space="preserve">.</w:t>
       </w:r>
     </w:p>
-    <w:bookmarkEnd w:id="105"/>
-    <w:bookmarkStart w:id="107" w:name="ref-Harter2008"/>
+    <w:bookmarkEnd w:id="118"/>
+    <w:bookmarkStart w:id="120" w:name="ref-Harter2008"/>
     <w:p>
       <w:pPr>
         <w:pStyle w:val="Bibliography"/>
@@ -28388,7 +28514,7 @@
       <w:r>
         <w:t xml:space="preserve"> </w:t>
       </w:r>
-      <w:hyperlink r:id="rId106">
+      <w:hyperlink r:id="rId119">
         <w:r>
           <w:rPr>
             <w:rStyle w:val="Hyperlink"/>
@@ -28400,8 +28526,8 @@
         <w:t xml:space="preserve">.</w:t>
       </w:r>
     </w:p>
-    <w:bookmarkEnd w:id="107"/>
-    <w:bookmarkStart w:id="109" w:name="ref-Howitt1995"/>
+    <w:bookmarkEnd w:id="120"/>
+    <w:bookmarkStart w:id="122" w:name="ref-Howitt1995"/>
     <w:p>
       <w:pPr>
         <w:pStyle w:val="Bibliography"/>
@@ -28440,7 +28566,7 @@
       <w:r>
         <w:t xml:space="preserve"> </w:t>
       </w:r>
-      <w:hyperlink r:id="rId108">
+      <w:hyperlink r:id="rId121">
         <w:r>
           <w:rPr>
             <w:rStyle w:val="Hyperlink"/>
@@ -28452,8 +28578,8 @@
         <w:t xml:space="preserve">.</w:t>
       </w:r>
     </w:p>
-    <w:bookmarkEnd w:id="109"/>
-    <w:bookmarkStart w:id="111" w:name="ref-Kapelan2005"/>
+    <w:bookmarkEnd w:id="122"/>
+    <w:bookmarkStart w:id="124" w:name="ref-Kapelan2005"/>
     <w:p>
       <w:pPr>
         <w:pStyle w:val="Bibliography"/>
@@ -28492,7 +28618,7 @@
       <w:r>
         <w:t xml:space="preserve"> </w:t>
       </w:r>
-      <w:hyperlink r:id="rId110">
+      <w:hyperlink r:id="rId123">
         <w:r>
           <w:rPr>
             <w:rStyle w:val="Hyperlink"/>
@@ -28504,8 +28630,8 @@
         <w:t xml:space="preserve">.</w:t>
       </w:r>
     </w:p>
-    <w:bookmarkEnd w:id="111"/>
-    <w:bookmarkStart w:id="113" w:name="ref-Maass1962"/>
+    <w:bookmarkEnd w:id="124"/>
+    <w:bookmarkStart w:id="126" w:name="ref-Maass1962"/>
     <w:p>
       <w:pPr>
         <w:pStyle w:val="Bibliography"/>
@@ -28529,7 +28655,7 @@
       <w:r>
         <w:t xml:space="preserve"> </w:t>
       </w:r>
-      <w:hyperlink r:id="rId112">
+      <w:hyperlink r:id="rId125">
         <w:r>
           <w:rPr>
             <w:rStyle w:val="Hyperlink"/>
@@ -28541,8 +28667,8 @@
         <w:t xml:space="preserve">.</w:t>
       </w:r>
     </w:p>
-    <w:bookmarkEnd w:id="113"/>
-    <w:bookmarkStart w:id="115" w:name="ref-Mack1958"/>
+    <w:bookmarkEnd w:id="126"/>
+    <w:bookmarkStart w:id="128" w:name="ref-Mack1958"/>
     <w:p>
       <w:pPr>
         <w:pStyle w:val="Bibliography"/>
@@ -28568,7 +28694,7 @@
       <w:r>
         <w:t xml:space="preserve"> </w:t>
       </w:r>
-      <w:hyperlink r:id="rId114">
+      <w:hyperlink r:id="rId127">
         <w:r>
           <w:rPr>
             <w:rStyle w:val="Hyperlink"/>
@@ -28580,8 +28706,8 @@
         <w:t xml:space="preserve">.</w:t>
       </w:r>
     </w:p>
-    <w:bookmarkEnd w:id="115"/>
-    <w:bookmarkStart w:id="117" w:name="ref-Mahoney1998"/>
+    <w:bookmarkEnd w:id="128"/>
+    <w:bookmarkStart w:id="130" w:name="ref-Mahoney1998"/>
     <w:p>
       <w:pPr>
         <w:pStyle w:val="Bibliography"/>
@@ -28620,7 +28746,7 @@
       <w:r>
         <w:t xml:space="preserve"> </w:t>
       </w:r>
-      <w:hyperlink r:id="rId116">
+      <w:hyperlink r:id="rId129">
         <w:r>
           <w:rPr>
             <w:rStyle w:val="Hyperlink"/>
@@ -28632,8 +28758,8 @@
         <w:t xml:space="preserve">.</w:t>
       </w:r>
     </w:p>
-    <w:bookmarkEnd w:id="117"/>
-    <w:bookmarkStart w:id="119" w:name="ref-Monarchi1973"/>
+    <w:bookmarkEnd w:id="130"/>
+    <w:bookmarkStart w:id="132" w:name="ref-Monarchi1973"/>
     <w:p>
       <w:pPr>
         <w:pStyle w:val="Bibliography"/>
@@ -28672,7 +28798,7 @@
       <w:r>
         <w:t xml:space="preserve"> </w:t>
       </w:r>
-      <w:hyperlink r:id="rId118">
+      <w:hyperlink r:id="rId131">
         <w:r>
           <w:rPr>
             <w:rStyle w:val="Hyperlink"/>
@@ -28684,8 +28810,8 @@
         <w:t xml:space="preserve">.</w:t>
       </w:r>
     </w:p>
-    <w:bookmarkEnd w:id="119"/>
-    <w:bookmarkStart w:id="120" w:name="ref-NCRWQCB2006b"/>
+    <w:bookmarkEnd w:id="132"/>
+    <w:bookmarkStart w:id="133" w:name="ref-NCRWQCB2006b"/>
     <w:p>
       <w:pPr>
         <w:pStyle w:val="Bibliography"/>
@@ -28706,8 +28832,8 @@
         <w:t xml:space="preserve">.”</w:t>
       </w:r>
     </w:p>
-    <w:bookmarkEnd w:id="120"/>
-    <w:bookmarkStart w:id="122" w:name="ref-Ohlberger2018"/>
+    <w:bookmarkEnd w:id="133"/>
+    <w:bookmarkStart w:id="135" w:name="ref-Ohlberger2018"/>
     <w:p>
       <w:pPr>
         <w:pStyle w:val="Bibliography"/>
@@ -28746,7 +28872,7 @@
       <w:r>
         <w:t xml:space="preserve"> </w:t>
       </w:r>
-      <w:hyperlink r:id="rId121">
+      <w:hyperlink r:id="rId134">
         <w:r>
           <w:rPr>
             <w:rStyle w:val="Hyperlink"/>
@@ -28758,8 +28884,8 @@
         <w:t xml:space="preserve">.</w:t>
       </w:r>
     </w:p>
-    <w:bookmarkEnd w:id="122"/>
-    <w:bookmarkStart w:id="123" w:name="ref-Pareto1896"/>
+    <w:bookmarkEnd w:id="135"/>
+    <w:bookmarkStart w:id="136" w:name="ref-Pareto1896"/>
     <w:p>
       <w:pPr>
         <w:pStyle w:val="Bibliography"/>
@@ -28781,8 +28907,8 @@
         <w:t xml:space="preserve">. Lausanne.</w:t>
       </w:r>
     </w:p>
-    <w:bookmarkEnd w:id="123"/>
-    <w:bookmarkStart w:id="124" w:name="ref-Reuss1992"/>
+    <w:bookmarkEnd w:id="136"/>
+    <w:bookmarkStart w:id="137" w:name="ref-Reuss1992"/>
     <w:p>
       <w:pPr>
         <w:pStyle w:val="Bibliography"/>
@@ -28819,8 +28945,8 @@
         <w:t xml:space="preserve">32 (1): 101–35.</w:t>
       </w:r>
     </w:p>
-    <w:bookmarkEnd w:id="124"/>
-    <w:bookmarkStart w:id="126" w:name="ref-Rodell2018"/>
+    <w:bookmarkEnd w:id="137"/>
+    <w:bookmarkStart w:id="139" w:name="ref-Rodell2018"/>
     <w:p>
       <w:pPr>
         <w:pStyle w:val="Bibliography"/>
@@ -28859,7 +28985,7 @@
       <w:r>
         <w:t xml:space="preserve"> </w:t>
       </w:r>
-      <w:hyperlink r:id="rId125">
+      <w:hyperlink r:id="rId138">
         <w:r>
           <w:rPr>
             <w:rStyle w:val="Hyperlink"/>
@@ -28871,8 +28997,8 @@
         <w:t xml:space="preserve">.</w:t>
       </w:r>
     </w:p>
-    <w:bookmarkEnd w:id="126"/>
-    <w:bookmarkStart w:id="128" w:name="ref-Rogers1986a"/>
+    <w:bookmarkEnd w:id="139"/>
+    <w:bookmarkStart w:id="141" w:name="ref-Rogers1986a"/>
     <w:p>
       <w:pPr>
         <w:pStyle w:val="Bibliography"/>
@@ -28911,7 +29037,7 @@
       <w:r>
         <w:t xml:space="preserve"> </w:t>
       </w:r>
-      <w:hyperlink r:id="rId127">
+      <w:hyperlink r:id="rId140">
         <w:r>
           <w:rPr>
             <w:rStyle w:val="Hyperlink"/>
@@ -28923,8 +29049,8 @@
         <w:t xml:space="preserve">.</w:t>
       </w:r>
     </w:p>
-    <w:bookmarkEnd w:id="128"/>
-    <w:bookmarkStart w:id="129" w:name="ref-SVAP1980"/>
+    <w:bookmarkEnd w:id="141"/>
+    <w:bookmarkStart w:id="142" w:name="ref-SVAP1980"/>
     <w:p>
       <w:pPr>
         <w:pStyle w:val="Bibliography"/>
@@ -28945,8 +29071,8 @@
         <w:t xml:space="preserve">.”</w:t>
       </w:r>
     </w:p>
-    <w:bookmarkEnd w:id="129"/>
-    <w:bookmarkStart w:id="131" w:name="ref-SiskiyouCounty2021"/>
+    <w:bookmarkEnd w:id="142"/>
+    <w:bookmarkStart w:id="144" w:name="ref-SiskiyouCounty2021"/>
     <w:p>
       <w:pPr>
         <w:pStyle w:val="Bibliography"/>
@@ -28975,7 +29101,7 @@
       <w:r>
         <w:t xml:space="preserve"> </w:t>
       </w:r>
-      <w:hyperlink r:id="rId130">
+      <w:hyperlink r:id="rId143">
         <w:r>
           <w:rPr>
             <w:rStyle w:val="Hyperlink"/>
@@ -28987,8 +29113,8 @@
         <w:t xml:space="preserve">.</w:t>
       </w:r>
     </w:p>
-    <w:bookmarkEnd w:id="131"/>
-    <w:bookmarkStart w:id="133" w:name="ref-SVGAC2021_June"/>
+    <w:bookmarkEnd w:id="144"/>
+    <w:bookmarkStart w:id="146" w:name="ref-SVGAC2021_June"/>
     <w:p>
       <w:pPr>
         <w:pStyle w:val="Bibliography"/>
@@ -29017,7 +29143,7 @@
       <w:r>
         <w:t xml:space="preserve"> </w:t>
       </w:r>
-      <w:hyperlink r:id="rId132">
+      <w:hyperlink r:id="rId145">
         <w:r>
           <w:rPr>
             <w:rStyle w:val="Hyperlink"/>
@@ -29029,8 +29155,8 @@
         <w:t xml:space="preserve">.</w:t>
       </w:r>
     </w:p>
-    <w:bookmarkEnd w:id="133"/>
-    <w:bookmarkStart w:id="135" w:name="ref-Sunding1996"/>
+    <w:bookmarkEnd w:id="146"/>
+    <w:bookmarkStart w:id="148" w:name="ref-Sunding1996"/>
     <w:p>
       <w:pPr>
         <w:pStyle w:val="Bibliography"/>
@@ -29069,7 +29195,7 @@
       <w:r>
         <w:t xml:space="preserve"> </w:t>
       </w:r>
-      <w:hyperlink r:id="rId134">
+      <w:hyperlink r:id="rId147">
         <w:r>
           <w:rPr>
             <w:rStyle w:val="Hyperlink"/>
@@ -29081,8 +29207,8 @@
         <w:t xml:space="preserve">.</w:t>
       </w:r>
     </w:p>
-    <w:bookmarkEnd w:id="135"/>
-    <w:bookmarkStart w:id="137" w:name="ref-SuperiorCourtofSiskiyouCounty1980"/>
+    <w:bookmarkEnd w:id="148"/>
+    <w:bookmarkStart w:id="150" w:name="ref-SuperiorCourtofSiskiyouCounty1980"/>
     <w:p>
       <w:pPr>
         <w:pStyle w:val="Bibliography"/>
@@ -29108,7 +29234,7 @@
       <w:r>
         <w:t xml:space="preserve"> </w:t>
       </w:r>
-      <w:hyperlink r:id="rId136">
+      <w:hyperlink r:id="rId149">
         <w:r>
           <w:rPr>
             <w:rStyle w:val="Hyperlink"/>
@@ -29120,8 +29246,8 @@
         <w:t xml:space="preserve">.</w:t>
       </w:r>
     </w:p>
-    <w:bookmarkEnd w:id="137"/>
-    <w:bookmarkStart w:id="139" w:name="ref-Tolley2019"/>
+    <w:bookmarkEnd w:id="150"/>
+    <w:bookmarkStart w:id="152" w:name="ref-Tolley2019"/>
     <w:p>
       <w:pPr>
         <w:pStyle w:val="Bibliography"/>
@@ -29160,7 +29286,7 @@
       <w:r>
         <w:t xml:space="preserve"> </w:t>
       </w:r>
-      <w:hyperlink r:id="rId138">
+      <w:hyperlink r:id="rId151">
         <w:r>
           <w:rPr>
             <w:rStyle w:val="Hyperlink"/>
@@ -29172,8 +29298,8 @@
         <w:t xml:space="preserve">.</w:t>
       </w:r>
     </w:p>
-    <w:bookmarkEnd w:id="139"/>
-    <w:bookmarkStart w:id="141" w:name="ref-USCensusBureau2018"/>
+    <w:bookmarkEnd w:id="152"/>
+    <w:bookmarkStart w:id="154" w:name="ref-USCensusBureau2018"/>
     <w:p>
       <w:pPr>
         <w:pStyle w:val="Bibliography"/>
@@ -29196,7 +29322,7 @@
       <w:r>
         <w:t xml:space="preserve"> </w:t>
       </w:r>
-      <w:hyperlink r:id="rId140">
+      <w:hyperlink r:id="rId153">
         <w:r>
           <w:rPr>
             <w:rStyle w:val="Hyperlink"/>
@@ -29208,8 +29334,8 @@
         <w:t xml:space="preserve">.</w:t>
       </w:r>
     </w:p>
-    <w:bookmarkEnd w:id="141"/>
-    <w:bookmarkStart w:id="143" w:name="ref-USCensus2021"/>
+    <w:bookmarkEnd w:id="154"/>
+    <w:bookmarkStart w:id="156" w:name="ref-USCensus2021"/>
     <w:p>
       <w:pPr>
         <w:pStyle w:val="Bibliography"/>
@@ -29232,7 +29358,7 @@
       <w:r>
         <w:t xml:space="preserve"> </w:t>
       </w:r>
-      <w:hyperlink r:id="rId142">
+      <w:hyperlink r:id="rId155">
         <w:r>
           <w:rPr>
             <w:rStyle w:val="Hyperlink"/>
@@ -29244,8 +29370,8 @@
         <w:t xml:space="preserve">.</w:t>
       </w:r>
     </w:p>
-    <w:bookmarkEnd w:id="143"/>
-    <w:bookmarkStart w:id="144" w:name="ref-Williams2020"/>
+    <w:bookmarkEnd w:id="156"/>
+    <w:bookmarkStart w:id="157" w:name="ref-Williams2020"/>
     <w:p>
       <w:pPr>
         <w:pStyle w:val="Bibliography"/>
@@ -29282,8 +29408,8 @@
         <w:t xml:space="preserve">In press (April): 314–18.</w:t>
       </w:r>
     </w:p>
-    <w:bookmarkEnd w:id="144"/>
-    <w:bookmarkStart w:id="146" w:name="ref-Yeh1982"/>
+    <w:bookmarkEnd w:id="157"/>
+    <w:bookmarkStart w:id="159" w:name="ref-Yeh1982"/>
     <w:p>
       <w:pPr>
         <w:pStyle w:val="Bibliography"/>
@@ -29322,7 +29448,7 @@
       <w:r>
         <w:t xml:space="preserve"> </w:t>
       </w:r>
-      <w:hyperlink r:id="rId145">
+      <w:hyperlink r:id="rId158">
         <w:r>
           <w:rPr>
             <w:rStyle w:val="Hyperlink"/>
@@ -29334,8 +29460,8 @@
         <w:t xml:space="preserve">.</w:t>
       </w:r>
     </w:p>
-    <w:bookmarkEnd w:id="146"/>
-    <w:bookmarkStart w:id="147" w:name="ref-YSGA2022"/>
+    <w:bookmarkEnd w:id="159"/>
+    <w:bookmarkStart w:id="160" w:name="ref-YSGA2022"/>
     <w:p>
       <w:pPr>
         <w:pStyle w:val="Bibliography"/>
@@ -29362,9 +29488,9 @@
         <w:t xml:space="preserve">Woodland, CA.</w:t>
       </w:r>
     </w:p>
-    <w:bookmarkEnd w:id="147"/>
-    <w:bookmarkEnd w:id="148"/>
-    <w:bookmarkEnd w:id="149"/>
+    <w:bookmarkEnd w:id="160"/>
+    <w:bookmarkEnd w:id="161"/>
+    <w:bookmarkEnd w:id="162"/>
     <w:sectPr/>
   </w:body>
 </w:document>
@@ -29890,6 +30016,25 @@
       <w:jc w:val="center"/>
     </w:pPr>
   </w:style>
+  <w:style w:customStyle="1" w:styleId="AbstractTitle" w:type="paragraph">
+    <w:name w:val="Abstract Title"/>
+    <w:basedOn w:val="Normal"/>
+    <w:next w:val="Abstract"/>
+    <w:qFormat/>
+    <w:pPr>
+      <w:keepNext/>
+      <w:keepLines/>
+      <w:jc w:val="center"/>
+      <w:spacing w:after="0" w:before="300"/>
+    </w:pPr>
+    <w:rPr>
+      <w:sz w:val="20"/>
+      <w:szCs w:val="20"/>
+      <w:b/>
+      <w:color w:val="345A8A"/>
+      &gt;
+    </w:rPr>
+  </w:style>
   <w:style w:customStyle="1" w:styleId="Abstract" w:type="paragraph">
     <w:name w:val="Abstract"/>
     <w:basedOn w:val="Normal"/>
@@ -29898,7 +30043,7 @@
     <w:pPr>
       <w:keepNext/>
       <w:keepLines/>
-      <w:spacing w:after="300" w:before="300"/>
+      <w:spacing w:after="300" w:before="100"/>
     </w:pPr>
     <w:rPr>
       <w:sz w:val="20"/>
@@ -30121,6 +30266,18 @@
     <w:unhideWhenUsed/>
     <w:qFormat/>
   </w:style>
+  <w:style w:styleId="FootnoteBlockText" w:type="paragraph">
+    <w:name w:val="Footnote Block Text"/>
+    <w:basedOn w:val="Footnote Text"/>
+    <w:next w:val="Footnote Text"/>
+    <w:uiPriority w:val="9"/>
+    <w:unhideWhenUsed/>
+    <w:qFormat/>
+    <w:pPr>
+      <w:spacing w:after="100" w:before="100"/>
+      <w:ind w:firstLine="0" w:left="480" w:right="480"/>
+    </w:pPr>
+  </w:style>
   <w:style w:default="1" w:styleId="DefaultParagraphFont" w:type="character">
     <w:name w:val="Default Paragraph Font"/>
     <w:semiHidden/>
@@ -30310,7 +30467,7 @@
     <w:name w:val="ConstantTok"/>
     <w:basedOn w:val="VerbatimChar"/>
     <w:rPr>
-      <w:color w:val="000000"/>
+      <w:color w:val="8f5902"/>
       <w:shd w:val="clear" w:fill="f8f8f8"/>
     </w:rPr>
   </w:style>
@@ -30326,8 +30483,9 @@
     <w:name w:val="SpecialCharTok"/>
     <w:basedOn w:val="VerbatimChar"/>
     <w:rPr>
-      <w:color w:val="000000"/>
+      <w:color w:val="ce5c00"/>
       <w:shd w:val="clear" w:fill="f8f8f8"/>
+      <w:b/>
     </w:rPr>
   </w:style>
   <w:style w:type="character" w:customStyle="1" w:styleId="StringTok">
@@ -30412,8 +30570,9 @@
     <w:name w:val="FunctionTok"/>
     <w:basedOn w:val="VerbatimChar"/>
     <w:rPr>
-      <w:color w:val="000000"/>
+      <w:color w:val="204a87"/>
       <w:shd w:val="clear" w:fill="f8f8f8"/>
+      <w:b/>
     </w:rPr>
   </w:style>
   <w:style w:type="character" w:customStyle="1" w:styleId="VariableTok">
@@ -30469,7 +30628,7 @@
     <w:name w:val="AttributeTok"/>
     <w:basedOn w:val="VerbatimChar"/>
     <w:rPr>
-      <w:color w:val="c4a000"/>
+      <w:color w:val="204a87"/>
       <w:shd w:val="clear" w:fill="f8f8f8"/>
     </w:rPr>
   </w:style>

</xml_diff>

<commit_message>
organize. lit review for intro
</commit_message>
<xml_diff>
--- a/Kouba_Fish_and_Ag_Benefit_MS.docx
+++ b/Kouba_Fish_and_Ag_Benefit_MS.docx
@@ -7,7 +7,7 @@
         <w:pStyle w:val="Title"/>
       </w:pPr>
       <w:r>
-        <w:t xml:space="preserve">Multi-objective assessment of a stakeholder-defined portfolio of groundwater and stream management actions in an agricultural basin</w:t>
+        <w:t xml:space="preserve">Multi-objective assessment of stakeholder-defined portfolio of management options clarifies trade-offs in an active local water planning process</w:t>
       </w:r>
     </w:p>
     <w:p>
@@ -23,7 +23,7 @@
         <w:pStyle w:val="Date"/>
       </w:pPr>
       <w:r>
-        <w:t xml:space="preserve">2025-08-29</w:t>
+        <w:t xml:space="preserve">2025-11-12</w:t>
       </w:r>
     </w:p>
     <w:bookmarkStart w:id="20" w:name="abstract"/>
@@ -109,40 +109,6 @@
       </w:r>
       <w:r>
         <w:t xml:space="preserve">The development of basin-specific objective functions, especially ones using output from existing hydrologic models, could help quantify management decision trade-offs and improve stakeholder communication in ongoing water planning efforts throughout the region.</w:t>
-      </w:r>
-    </w:p>
-    <w:p>
-      <w:pPr>
-        <w:pStyle w:val="BodyText"/>
-      </w:pPr>
-      <w:r>
-        <w:rPr>
-          <w:b/>
-          <w:bCs/>
-        </w:rPr>
-        <w:t xml:space="preserve">to do:</w:t>
-      </w:r>
-      <w:r>
-        <w:t xml:space="preserve"> </w:t>
-      </w:r>
-      <w:r>
-        <w:t xml:space="preserve">add citations from</w:t>
-      </w:r>
-      <w:r>
-        <w:t xml:space="preserve"> </w:t>
-      </w:r>
-      <w:r>
-        <w:t xml:space="preserve">(</w:t>
-      </w:r>
-      <w:r>
-        <w:rPr>
-          <w:b/>
-          <w:bCs/>
-        </w:rPr>
-        <w:t xml:space="preserve">NullLundFISH2012?</w:t>
-      </w:r>
-      <w:r>
-        <w:t xml:space="preserve">)</w:t>
       </w:r>
     </w:p>
     <w:p>
@@ -174,61 +140,11 @@
         <w:pStyle w:val="FirstParagraph"/>
       </w:pPr>
       <w:r>
-        <w:t xml:space="preserve">Sustainable development of water resources, in an era of climate change and increasing human water consumption</w:t>
-      </w:r>
-      <w:r>
-        <w:t xml:space="preserve"> </w:t>
-      </w:r>
-      <w:r>
-        <w:t xml:space="preserve">(e.g., Williams et al. 2020; Rodell et al. 2018)</w:t>
-      </w:r>
-      <w:r>
-        <w:t xml:space="preserve">, requires an interdisciplinary understanding of connected socio-hydrologic systems</w:t>
-      </w:r>
-      <w:r>
-        <w:t xml:space="preserve"> </w:t>
-      </w:r>
-      <w:r>
-        <w:t xml:space="preserve">(Reuss 1992; Di Baldassarre et al. 2019)</w:t>
-      </w:r>
-      <w:r>
-        <w:t xml:space="preserve">. One such interdisciplinary approach is water resources systems analysis (WRSA), which involves applying optimization methods to water resource planning</w:t>
-      </w:r>
-      <w:r>
-        <w:t xml:space="preserve"> </w:t>
-      </w:r>
-      <w:r>
-        <w:t xml:space="preserve">(Maass et al. 1962; Cohon and Marks 1975; C. M. Brown et al. 2015)</w:t>
-      </w:r>
-      <w:r>
-        <w:t xml:space="preserve">. The utility of such studies typically depends on robust definitions of the</w:t>
-      </w:r>
-      <w:r>
-        <w:t xml:space="preserve"> </w:t>
-      </w:r>
-      <w:r>
-        <w:t xml:space="preserve">“objective function(s)”</w:t>
-      </w:r>
-      <w:r>
-        <w:t xml:space="preserve">, which summarize and quantify the desired outcome(s) of the proposed project or management scenario</w:t>
-      </w:r>
-      <w:r>
-        <w:t xml:space="preserve"> </w:t>
-      </w:r>
-      <w:r>
-        <w:t xml:space="preserve">(Gorelick 1983)</w:t>
-      </w:r>
-      <w:r>
-        <w:t xml:space="preserve">. In practice, classical WRSA approaches have been criticized as being too removed from stakeholder concerns</w:t>
-      </w:r>
-      <w:r>
-        <w:t xml:space="preserve"> </w:t>
-      </w:r>
-      <w:r>
-        <w:t xml:space="preserve">(e.g., Rogers and Fiering 1986)</w:t>
-      </w:r>
-      <w:r>
-        <w:t xml:space="preserve">. In this study, we take advantage of the authors’ involvement in an existing water resource planning process, and a previously-developed integrated surface- and groundwater model, to test the utility of introducing elements of multi-objective optimization into the prioritization of groundwater management alternatives.</w:t>
+        <w:rPr>
+          <w:b/>
+          <w:bCs/>
+        </w:rPr>
+        <w:t xml:space="preserve">no reservoir</w:t>
       </w:r>
     </w:p>
     <w:p>
@@ -236,34 +152,174 @@
         <w:pStyle w:val="BodyText"/>
       </w:pPr>
       <w:r>
-        <w:t xml:space="preserve">In our study area, the intermontane rural Scott Valley in northern California (Figure</w:t>
-      </w:r>
-      <w:r>
-        <w:t xml:space="preserve"> </w:t>
-      </w:r>
-      <w:r>
-        <w:t xml:space="preserve">1</w:t>
-      </w:r>
-      <w:r>
-        <w:t xml:space="preserve">), the local government and public stakeholders spent three years (2018-2021) developing a plan for the long-term use of groundwater (a Groundwater Sustainability Plan or GSP). In that process, they evaluated dozens of potential water management scenarios</w:t>
-      </w:r>
-      <w:r>
-        <w:t xml:space="preserve"> </w:t>
-      </w:r>
-      <w:r>
-        <w:t xml:space="preserve">(Siskiyou County 2021)</w:t>
-      </w:r>
-      <w:r>
-        <w:t xml:space="preserve">. In public meetings, different objectives were often championed by individual stakeholders or interest groups. An integrated hydrologic model, the Scott Valley Integrated Hydrologic Model, or SVIHM</w:t>
-      </w:r>
-      <w:r>
-        <w:t xml:space="preserve"> </w:t>
-      </w:r>
-      <w:r>
-        <w:t xml:space="preserve">(Tolley, Foglia, and Harter 2019)</w:t>
-      </w:r>
-      <w:r>
-        <w:t xml:space="preserve">, was available to support this policy-making process. The numerical streamflow results of simulated management scenarios drove decision-making, but discussions on the balancing of multiple objectives were typically qualitative. In effect, the optimization framework used to arrive at the ultimate list of management priorities was implicit, and the conceptual weight given to different objectives varied between stakeholders.</w:t>
+        <w:t xml:space="preserve">Climate adaptation in the water sector, in its many facets - such as securing our water and food supply, updating our infrastructure, and preserving ecosystem function - will by and large be implemented at the local level (</w:t>
+      </w:r>
+      <w:r>
+        <w:rPr>
+          <w:b/>
+          <w:bCs/>
+        </w:rPr>
+        <w:t xml:space="preserve">CITE</w:t>
+      </w:r>
+      <w:r>
+        <w:t xml:space="preserve">). Local water managers operate in a complex regulatory landscape and serve diverse stakeholders, and typically have unmet knowledge needs</w:t>
+      </w:r>
+      <w:r>
+        <w:t xml:space="preserve"> </w:t>
+      </w:r>
+      <w:r>
+        <w:t xml:space="preserve">(</w:t>
+      </w:r>
+      <w:r>
+        <w:rPr>
+          <w:b/>
+          <w:bCs/>
+        </w:rPr>
+        <w:t xml:space="preserve">BorkHirokawaTrends2021?</w:t>
+      </w:r>
+      <w:r>
+        <w:t xml:space="preserve">;</w:t>
+      </w:r>
+      <w:r>
+        <w:t xml:space="preserve"> </w:t>
+      </w:r>
+      <w:r>
+        <w:rPr>
+          <w:b/>
+          <w:bCs/>
+        </w:rPr>
+        <w:t xml:space="preserve">NordgrenEtAlSupporting2016?</w:t>
+      </w:r>
+      <w:r>
+        <w:t xml:space="preserve">)</w:t>
+      </w:r>
+      <w:r>
+        <w:t xml:space="preserve">.</w:t>
+      </w:r>
+      <w:r>
+        <w:t xml:space="preserve"> </w:t>
+      </w:r>
+      <w:r>
+        <w:rPr>
+          <w:b/>
+          <w:bCs/>
+        </w:rPr>
+        <w:t xml:space="preserve">Local gw mgmt is good</w:t>
+      </w:r>
+      <w:r>
+        <w:rPr>
+          <w:b/>
+          <w:bCs/>
+        </w:rPr>
+        <w:t xml:space="preserve"> </w:t>
+      </w:r>
+      <w:r>
+        <w:rPr>
+          <w:b/>
+          <w:bCs/>
+        </w:rPr>
+        <w:t xml:space="preserve">(</w:t>
+      </w:r>
+      <w:r>
+        <w:rPr>
+          <w:b/>
+          <w:b/>
+          <w:bCs/>
+          <w:bCs/>
+        </w:rPr>
+        <w:t xml:space="preserve">vanSteenberger?</w:t>
+      </w:r>
+      <w:r>
+        <w:rPr>
+          <w:b/>
+          <w:bCs/>
+        </w:rPr>
+        <w:t xml:space="preserve">)</w:t>
+      </w:r>
+      <w:r>
+        <w:rPr>
+          <w:b/>
+          <w:bCs/>
+        </w:rPr>
+        <w:t xml:space="preserve">. Local resource mgmt districts are understudied and should be the focus of more work to improve research into</w:t>
+      </w:r>
+      <w:r>
+        <w:rPr>
+          <w:b/>
+          <w:bCs/>
+        </w:rPr>
+        <w:t xml:space="preserve"> </w:t>
+      </w:r>
+      <w:r>
+        <w:rPr>
+          <w:b/>
+          <w:bCs/>
+        </w:rPr>
+        <w:t xml:space="preserve">“wicked”</w:t>
+      </w:r>
+      <w:r>
+        <w:rPr>
+          <w:b/>
+          <w:bCs/>
+        </w:rPr>
+        <w:t xml:space="preserve"> </w:t>
+      </w:r>
+      <w:r>
+        <w:rPr>
+          <w:b/>
+          <w:bCs/>
+        </w:rPr>
+        <w:t xml:space="preserve">water challenges</w:t>
+      </w:r>
+      <w:r>
+        <w:rPr>
+          <w:b/>
+          <w:bCs/>
+        </w:rPr>
+        <w:t xml:space="preserve"> </w:t>
+      </w:r>
+      <w:r>
+        <w:rPr>
+          <w:b/>
+          <w:bCs/>
+        </w:rPr>
+        <w:t xml:space="preserve">(</w:t>
+      </w:r>
+      <w:r>
+        <w:rPr>
+          <w:b/>
+          <w:b/>
+          <w:bCs/>
+          <w:bCs/>
+        </w:rPr>
+        <w:t xml:space="preserve">Freeman20007?</w:t>
+      </w:r>
+      <w:r>
+        <w:rPr>
+          <w:b/>
+          <w:bCs/>
+        </w:rPr>
+        <w:t xml:space="preserve">)</w:t>
+      </w:r>
+      <w:r>
+        <w:rPr>
+          <w:b/>
+          <w:bCs/>
+        </w:rPr>
+        <w:t xml:space="preserve">.</w:t>
+      </w:r>
+      <w:r>
+        <w:rPr>
+          <w:b/>
+          <w:bCs/>
+        </w:rPr>
+        <w:t xml:space="preserve"> </w:t>
+      </w:r>
+      <w:r>
+        <w:t xml:space="preserve"> </w:t>
+      </w:r>
+      <w:r>
+        <w:t xml:space="preserve">In this study, we take advantage of the authors’ familiarity with an existing water resource planning process, and a previously-developed integrated surface- and groundwater model, to test the utility of introducing elements of multi-objective optimization into the prioritization of groundwater management alternatives.</w:t>
       </w:r>
     </w:p>
     <w:p>
@@ -271,6 +327,39 @@
         <w:pStyle w:val="BodyText"/>
       </w:pPr>
       <w:r>
+        <w:t xml:space="preserve">In our study area, the intermontane rural Scott Valley in northern California (Figure</w:t>
+      </w:r>
+      <w:r>
+        <w:t xml:space="preserve"> </w:t>
+      </w:r>
+      <w:r>
+        <w:t xml:space="preserve">1</w:t>
+      </w:r>
+      <w:r>
+        <w:t xml:space="preserve">), the local government and public stakeholders spent three years (2018-2021) developing a plan for the long-term use of groundwater (a Groundwater Sustainability Plan or GSP). In that process, they evaluated dozens of potential water management scenarios</w:t>
+      </w:r>
+      <w:r>
+        <w:t xml:space="preserve"> </w:t>
+      </w:r>
+      <w:r>
+        <w:t xml:space="preserve">(Siskiyou County 2021)</w:t>
+      </w:r>
+      <w:r>
+        <w:t xml:space="preserve">. In public meetings, different objectives were often championed by individual stakeholders or interest groups. An integrated hydrologic model, the Scott Valley Integrated Hydrologic Model, or SVIHM</w:t>
+      </w:r>
+      <w:r>
+        <w:t xml:space="preserve"> </w:t>
+      </w:r>
+      <w:r>
+        <w:t xml:space="preserve">(Tolley, Foglia, and Harter 2019)</w:t>
+      </w:r>
+      <w:r>
+        <w:t xml:space="preserve">, was available to support this policy-making process. The numerical streamflow results of simulated management scenarios drove decision-making, but discussions on the balancing of multiple objectives were typically qualitative. In effect, the optimization framework used to arrive at the ultimate list of management priorities was implicit, and the conceptual weight given to different objectives varied between stakeholders.</w:t>
+      </w:r>
+      <w:r>
+        <w:t xml:space="preserve"> </w:t>
+      </w:r>
+      <w:r>
         <w:t xml:space="preserve">Differences between stakeholders in what is considered an acceptable trade-off are common in policy decisions</w:t>
       </w:r>
       <w:r>
@@ -306,19 +395,7 @@
         <w:pStyle w:val="BodyText"/>
       </w:pPr>
       <w:r>
-        <w:t xml:space="preserve">To investigate whether an explicit optimization framework would yield different prioritization of management actions than the set agreed upon in public meetings, we developed numerical representations of three objectives: 1) maximizing specific environmental flows, 2) minimizing reduction in agricultural water supplies, and 3) minimizing new infrastructure costs. With these, we quantitatively summarized the management benefits and trade-offs within the existing suite of several dozen stakeholder-proposed management scenarios.</w:t>
-      </w:r>
-    </w:p>
-    <w:p>
-      <w:pPr>
-        <w:pStyle w:val="BodyText"/>
-      </w:pPr>
-      <w:r>
-        <w:rPr>
-          <w:b/>
-          <w:bCs/>
-        </w:rPr>
-        <w:t xml:space="preserve">Possibly reframe as hypothesis or research question</w:t>
+        <w:t xml:space="preserve">In this study we developed numerical representations of three objectives: 1) maximizing specific environmental flows, 2) minimizing reduction in agricultural water supplies, and 3) minimizing new infrastructure costs. With these, we quantitatively summarized the management benefits and trade-offs within the existing suite of several dozen stakeholder-proposed management scenarios. Our hypothesis: that an explicit objective function framework would yield different prioritization of management actions than the set agreed upon in public meetings, as recorded in the 2021 GSP. This work could help frame ongoing water planning efforts in Scott Valley, and constitutes an approach for supporting locally-driven water planning efforts in California and elsewhere.</w:t>
       </w:r>
     </w:p>
     <w:p>
@@ -2310,7 +2387,7 @@
         <w:t xml:space="preserve"> </w:t>
       </w:r>
       <w:r>
-        <w:t xml:space="preserve">(L. R. Brown, Moyle, and Yoshiyama 1994)</w:t>
+        <w:t xml:space="preserve">(Brown, Moyle, and Yoshiyama 1994)</w:t>
       </w:r>
       <w:r>
         <w:t xml:space="preserve">.</w:t>
@@ -18563,19 +18640,39 @@
     </w:p>
     <w:p>
       <w:pPr>
+        <w:pStyle w:val="SourceCode"/>
+      </w:pPr>
+      <w:r>
+        <w:rPr>
+          <w:rStyle w:val="VerbatimChar"/>
+        </w:rPr>
+        <w:t xml:space="preserve">## png </w:t>
+      </w:r>
+      <w:r>
+        <w:br/>
+      </w:r>
+      <w:r>
+        <w:rPr>
+          <w:rStyle w:val="VerbatimChar"/>
+        </w:rPr>
+        <w:t xml:space="preserve">##   2</w:t>
+      </w:r>
+    </w:p>
+    <w:p>
+      <w:pPr>
         <w:pStyle w:val="CaptionedFigure"/>
       </w:pPr>
       <w:r>
         <w:drawing>
           <wp:inline>
-            <wp:extent cx="4620126" cy="5544151"/>
+            <wp:extent cx="5334000" cy="4000499"/>
             <wp:effectExtent b="0" l="0" r="0" t="0"/>
-            <wp:docPr descr="Figure 7:  Scenario trade-off efficiencies, or average HB value gained per crop ET value lost (normalized to average basecase HB and ET values, respectively), in all 28 years (x-axis) and in six low-coho years (y-axis; i.e., the six years with basecase predicted HB values of less than 45 coho spf-equiv.). Basecase, Reservoir scenarios and one Enhanced Recharge scenario (MAR) are not included as they have on average no or negative ET loss." title="" id="69" name="Picture"/>
+            <wp:docPr descr="Figure 7:  Scenario trade-off efficiencies, or average HB value (a proxy for environmental benefit) gained per crop ET value lost (a proxy for farmer cost) (normalized to average basecase HB and ET values, respectively), in all 35 years. Basecase, Reservoir scenarios and Enhanced Recharge scenarios are not included as they have on average no or negative ET loss, producing infinite or negative efficiency values." title="" id="69" name="Picture"/>
             <a:graphic>
               <a:graphicData uri="http://schemas.openxmlformats.org/drawingml/2006/picture">
                 <pic:pic>
                   <pic:nvPicPr>
-                    <pic:cNvPr descr="Kouba_Fish_and_Ag_Benefit_MS_files/figure-docx/efficiency-1.png" id="70" name="Picture"/>
+                    <pic:cNvPr descr="Graphics%20and%20Supplements/Figure%207.png" id="70" name="Picture"/>
                     <pic:cNvPicPr>
                       <a:picLocks noChangeArrowheads="1" noChangeAspect="1"/>
                     </pic:cNvPicPr>
@@ -18589,7 +18686,7 @@
                   <pic:spPr bwMode="auto">
                     <a:xfrm>
                       <a:off x="0" y="0"/>
-                      <a:ext cx="4620126" cy="5544151"/>
+                      <a:ext cx="5334000" cy="4000499"/>
                     </a:xfrm>
                     <a:prstGeom prst="rect">
                       <a:avLst/>
@@ -18624,7 +18721,7 @@
         <w:t xml:space="preserve"> </w:t>
       </w:r>
       <w:r>
-        <w:t xml:space="preserve">Scenario trade-off efficiencies, or average HB value gained per crop ET value lost (normalized to average basecase HB and ET values, respectively), in all 28 years (x-axis) and in six low-coho years (y-axis; i.e., the six years with basecase predicted HB values of less than 45 coho spf-equiv.). Basecase, Reservoir scenarios and one Enhanced Recharge scenario (MAR) are not included as they have on average no or negative ET loss.</w:t>
+        <w:t xml:space="preserve">Scenario trade-off efficiencies, or average HB value (a proxy for environmental benefit) gained per crop ET value lost (a proxy for farmer cost) (normalized to average basecase HB and ET values, respectively), in all 35 years. Basecase, Reservoir scenarios and Enhanced Recharge scenarios are not included as they have on average no or negative ET loss, producing infinite or negative efficiency values.</w:t>
       </w:r>
     </w:p>
     <w:bookmarkEnd w:id="72"/>
@@ -22609,7 +22706,7 @@
       </w:r>
     </w:p>
     <w:bookmarkEnd w:id="87"/>
-    <w:bookmarkStart w:id="163" w:name="references"/>
+    <w:bookmarkStart w:id="149" w:name="references"/>
     <w:p>
       <w:pPr>
         <w:pStyle w:val="Heading1"/>
@@ -22618,60 +22715,8 @@
         <w:t xml:space="preserve">References</w:t>
       </w:r>
     </w:p>
-    <w:bookmarkStart w:id="162" w:name="refs"/>
-    <w:bookmarkStart w:id="89" w:name="ref-Brown2015"/>
-    <w:p>
-      <w:pPr>
-        <w:pStyle w:val="Bibliography"/>
-      </w:pPr>
-      <w:r>
-        <w:t xml:space="preserve">Brown, Casey M, Jay R Lund, Ximing Cai, Patrick M Reed, Edith A Zagona, Avi Ostfeld, Jim Hall, Gregory W Characklis, Winston Yu, and Levi Brekke. 2015.</w:t>
-      </w:r>
-      <w:r>
-        <w:t xml:space="preserve"> </w:t>
-      </w:r>
-      <w:r>
-        <w:t xml:space="preserve">“</w:t>
-      </w:r>
-      <w:r>
-        <w:t xml:space="preserve">The future of water resources systems analysis: Toward a scientific framework for sustainable water management</w:t>
-      </w:r>
-      <w:r>
-        <w:t xml:space="preserve">.”</w:t>
-      </w:r>
-      <w:r>
-        <w:t xml:space="preserve"> </w:t>
-      </w:r>
-      <w:r>
-        <w:rPr>
-          <w:i/>
-          <w:iCs/>
-        </w:rPr>
-        <w:t xml:space="preserve">Water Resources Research</w:t>
-      </w:r>
-      <w:r>
-        <w:t xml:space="preserve"> </w:t>
-      </w:r>
-      <w:r>
-        <w:t xml:space="preserve">51: 6110–24.</w:t>
-      </w:r>
-      <w:r>
-        <w:t xml:space="preserve"> </w:t>
-      </w:r>
-      <w:hyperlink r:id="rId88">
-        <w:r>
-          <w:rPr>
-            <w:rStyle w:val="Hyperlink"/>
-          </w:rPr>
-          <w:t xml:space="preserve">https://doi.org/10.1002/2015WR017114.Received</w:t>
-        </w:r>
-      </w:hyperlink>
-      <w:r>
-        <w:t xml:space="preserve">.</w:t>
-      </w:r>
-    </w:p>
-    <w:bookmarkEnd w:id="89"/>
-    <w:bookmarkStart w:id="91" w:name="ref-Brown1994"/>
+    <w:bookmarkStart w:id="148" w:name="refs"/>
+    <w:bookmarkStart w:id="89" w:name="ref-Brown1994"/>
     <w:p>
       <w:pPr>
         <w:pStyle w:val="Bibliography"/>
@@ -22710,7 +22755,7 @@
       <w:r>
         <w:t xml:space="preserve"> </w:t>
       </w:r>
-      <w:hyperlink r:id="rId90">
+      <w:hyperlink r:id="rId88">
         <w:r>
           <w:rPr>
             <w:rStyle w:val="Hyperlink"/>
@@ -22722,8 +22767,8 @@
         <w:t xml:space="preserve">.</w:t>
       </w:r>
     </w:p>
-    <w:bookmarkEnd w:id="91"/>
-    <w:bookmarkStart w:id="93" w:name="ref-CDFW2015a"/>
+    <w:bookmarkEnd w:id="89"/>
+    <w:bookmarkStart w:id="91" w:name="ref-CDFW2015a"/>
     <w:p>
       <w:pPr>
         <w:pStyle w:val="Bibliography"/>
@@ -22752,7 +22797,7 @@
       <w:r>
         <w:t xml:space="preserve"> </w:t>
       </w:r>
-      <w:hyperlink r:id="rId92">
+      <w:hyperlink r:id="rId90">
         <w:r>
           <w:rPr>
             <w:rStyle w:val="Hyperlink"/>
@@ -22764,8 +22809,8 @@
         <w:t xml:space="preserve">.</w:t>
       </w:r>
     </w:p>
-    <w:bookmarkEnd w:id="93"/>
-    <w:bookmarkStart w:id="95" w:name="ref-CDFW2017"/>
+    <w:bookmarkEnd w:id="91"/>
+    <w:bookmarkStart w:id="93" w:name="ref-CDFW2017"/>
     <w:p>
       <w:pPr>
         <w:pStyle w:val="Bibliography"/>
@@ -22788,7 +22833,7 @@
       <w:r>
         <w:t xml:space="preserve"> </w:t>
       </w:r>
-      <w:hyperlink r:id="rId94">
+      <w:hyperlink r:id="rId92">
         <w:r>
           <w:rPr>
             <w:rStyle w:val="Hyperlink"/>
@@ -22800,8 +22845,8 @@
         <w:t xml:space="preserve">.</w:t>
       </w:r>
     </w:p>
-    <w:bookmarkEnd w:id="95"/>
-    <w:bookmarkStart w:id="97" w:name="ref-DWR2017"/>
+    <w:bookmarkEnd w:id="93"/>
+    <w:bookmarkStart w:id="95" w:name="ref-DWR2017"/>
     <w:p>
       <w:pPr>
         <w:pStyle w:val="Bibliography"/>
@@ -22824,7 +22869,7 @@
       <w:r>
         <w:t xml:space="preserve"> </w:t>
       </w:r>
-      <w:hyperlink r:id="rId96">
+      <w:hyperlink r:id="rId94">
         <w:r>
           <w:rPr>
             <w:rStyle w:val="Hyperlink"/>
@@ -22836,8 +22881,8 @@
         <w:t xml:space="preserve">.</w:t>
       </w:r>
     </w:p>
-    <w:bookmarkEnd w:id="97"/>
-    <w:bookmarkStart w:id="98" w:name="ref-SWRCB1975"/>
+    <w:bookmarkEnd w:id="95"/>
+    <w:bookmarkStart w:id="96" w:name="ref-SWRCB1975"/>
     <w:p>
       <w:pPr>
         <w:pStyle w:val="Bibliography"/>
@@ -22858,8 +22903,8 @@
         <w:t xml:space="preserve">.”</w:t>
       </w:r>
     </w:p>
-    <w:bookmarkEnd w:id="98"/>
-    <w:bookmarkStart w:id="100" w:name="ref-Carter1983"/>
+    <w:bookmarkEnd w:id="96"/>
+    <w:bookmarkStart w:id="98" w:name="ref-Carter1983"/>
     <w:p>
       <w:pPr>
         <w:pStyle w:val="Bibliography"/>
@@ -22898,7 +22943,7 @@
       <w:r>
         <w:t xml:space="preserve"> </w:t>
       </w:r>
-      <w:hyperlink r:id="rId99">
+      <w:hyperlink r:id="rId97">
         <w:r>
           <w:rPr>
             <w:rStyle w:val="Hyperlink"/>
@@ -22910,8 +22955,8 @@
         <w:t xml:space="preserve">.</w:t>
       </w:r>
     </w:p>
-    <w:bookmarkEnd w:id="100"/>
-    <w:bookmarkStart w:id="102" w:name="ref-CDFW2021c"/>
+    <w:bookmarkEnd w:id="98"/>
+    <w:bookmarkStart w:id="100" w:name="ref-CDFW2021c"/>
     <w:p>
       <w:pPr>
         <w:pStyle w:val="Bibliography"/>
@@ -22940,7 +22985,7 @@
       <w:r>
         <w:t xml:space="preserve"> </w:t>
       </w:r>
-      <w:hyperlink r:id="rId101">
+      <w:hyperlink r:id="rId99">
         <w:r>
           <w:rPr>
             <w:rStyle w:val="Hyperlink"/>
@@ -22952,8 +22997,8 @@
         <w:t xml:space="preserve">.</w:t>
       </w:r>
     </w:p>
-    <w:bookmarkEnd w:id="102"/>
-    <w:bookmarkStart w:id="104" w:name="ref-Cohon1973"/>
+    <w:bookmarkEnd w:id="100"/>
+    <w:bookmarkStart w:id="102" w:name="ref-Cohon1973"/>
     <w:p>
       <w:pPr>
         <w:pStyle w:val="Bibliography"/>
@@ -22992,7 +23037,7 @@
       <w:r>
         <w:t xml:space="preserve"> </w:t>
       </w:r>
-      <w:hyperlink r:id="rId103">
+      <w:hyperlink r:id="rId101">
         <w:r>
           <w:rPr>
             <w:rStyle w:val="Hyperlink"/>
@@ -23004,8 +23049,8 @@
         <w:t xml:space="preserve">.</w:t>
       </w:r>
     </w:p>
-    <w:bookmarkEnd w:id="104"/>
-    <w:bookmarkStart w:id="106" w:name="ref-Cohon1975"/>
+    <w:bookmarkEnd w:id="102"/>
+    <w:bookmarkStart w:id="104" w:name="ref-Cohon1975"/>
     <w:p>
       <w:pPr>
         <w:pStyle w:val="Bibliography"/>
@@ -23044,7 +23089,7 @@
       <w:r>
         <w:t xml:space="preserve"> </w:t>
       </w:r>
-      <w:hyperlink r:id="rId105">
+      <w:hyperlink r:id="rId103">
         <w:r>
           <w:rPr>
             <w:rStyle w:val="Hyperlink"/>
@@ -23056,8 +23101,8 @@
         <w:t xml:space="preserve">.</w:t>
       </w:r>
     </w:p>
-    <w:bookmarkEnd w:id="106"/>
-    <w:bookmarkStart w:id="107" w:name="ref-Cole2021"/>
+    <w:bookmarkEnd w:id="104"/>
+    <w:bookmarkStart w:id="105" w:name="ref-Cole2021"/>
     <w:p>
       <w:pPr>
         <w:pStyle w:val="Bibliography"/>
@@ -23084,14 +23129,14 @@
         <w:t xml:space="preserve">Merced, CA: University of California, Merced.</w:t>
       </w:r>
     </w:p>
-    <w:bookmarkEnd w:id="107"/>
-    <w:bookmarkStart w:id="109" w:name="ref-DiBaldassarre2019"/>
+    <w:bookmarkEnd w:id="105"/>
+    <w:bookmarkStart w:id="107" w:name="ref-DWR2019"/>
     <w:p>
       <w:pPr>
         <w:pStyle w:val="Bibliography"/>
       </w:pPr>
       <w:r>
-        <w:t xml:space="preserve">Di Baldassarre, Giuliano, Murugesu Sivapalan, Maria Rusca, Christophe Cudennec, Margaret Garcia, Heidi Kreibich, Megan Konar, et al. 2019.</w:t>
+        <w:t xml:space="preserve">DWR. 2019.</w:t>
       </w:r>
       <w:r>
         <w:t xml:space="preserve"> </w:t>
@@ -23100,7 +23145,7 @@
         <w:t xml:space="preserve">“</w:t>
       </w:r>
       <w:r>
-        <w:t xml:space="preserve">Sociohydrology: Scientific Challenges in Addressing the Sustainable Development Goals</w:t>
+        <w:t xml:space="preserve">Sustainable Groundwater Management Act 2019 Basin Prioritization</w:t>
       </w:r>
       <w:r>
         <w:t xml:space="preserve">.”</w:t>
@@ -23109,64 +23154,12 @@
         <w:t xml:space="preserve"> </w:t>
       </w:r>
       <w:r>
-        <w:rPr>
-          <w:i/>
-          <w:iCs/>
-        </w:rPr>
-        <w:t xml:space="preserve">Water Resources Research</w:t>
-      </w:r>
-      <w:r>
-        <w:t xml:space="preserve"> </w:t>
-      </w:r>
-      <w:r>
-        <w:t xml:space="preserve">55 (8): 6327–55.</w:t>
-      </w:r>
-      <w:r>
-        <w:t xml:space="preserve"> </w:t>
-      </w:r>
-      <w:hyperlink r:id="rId108">
-        <w:r>
-          <w:rPr>
-            <w:rStyle w:val="Hyperlink"/>
-          </w:rPr>
-          <w:t xml:space="preserve">https://doi.org/10.1029/2018WR023901</w:t>
-        </w:r>
-      </w:hyperlink>
-      <w:r>
-        <w:t xml:space="preserve">.</w:t>
-      </w:r>
-    </w:p>
-    <w:bookmarkEnd w:id="109"/>
-    <w:bookmarkStart w:id="111" w:name="ref-DWR2019"/>
-    <w:p>
-      <w:pPr>
-        <w:pStyle w:val="Bibliography"/>
-      </w:pPr>
-      <w:r>
-        <w:t xml:space="preserve">DWR. 2019.</w:t>
-      </w:r>
-      <w:r>
-        <w:t xml:space="preserve"> </w:t>
-      </w:r>
-      <w:r>
-        <w:t xml:space="preserve">“</w:t>
-      </w:r>
-      <w:r>
-        <w:t xml:space="preserve">Sustainable Groundwater Management Act 2019 Basin Prioritization</w:t>
-      </w:r>
-      <w:r>
-        <w:t xml:space="preserve">.”</w:t>
-      </w:r>
-      <w:r>
-        <w:t xml:space="preserve"> </w:t>
-      </w:r>
-      <w:r>
         <w:t xml:space="preserve">April.</w:t>
       </w:r>
       <w:r>
         <w:t xml:space="preserve"> </w:t>
       </w:r>
-      <w:hyperlink r:id="rId110">
+      <w:hyperlink r:id="rId106">
         <w:r>
           <w:rPr>
             <w:rStyle w:val="Hyperlink"/>
@@ -23178,8 +23171,8 @@
         <w:t xml:space="preserve">.</w:t>
       </w:r>
     </w:p>
-    <w:bookmarkEnd w:id="111"/>
-    <w:bookmarkStart w:id="113" w:name="ref-Foglia2013a"/>
+    <w:bookmarkEnd w:id="107"/>
+    <w:bookmarkStart w:id="109" w:name="ref-Foglia2013a"/>
     <w:p>
       <w:pPr>
         <w:pStyle w:val="Bibliography"/>
@@ -23208,7 +23201,7 @@
       <w:r>
         <w:t xml:space="preserve"> </w:t>
       </w:r>
-      <w:hyperlink r:id="rId112">
+      <w:hyperlink r:id="rId108">
         <w:r>
           <w:rPr>
             <w:rStyle w:val="Hyperlink"/>
@@ -23220,8 +23213,8 @@
         <w:t xml:space="preserve">.</w:t>
       </w:r>
     </w:p>
-    <w:bookmarkEnd w:id="113"/>
-    <w:bookmarkStart w:id="115" w:name="ref-FCGMA2019"/>
+    <w:bookmarkEnd w:id="109"/>
+    <w:bookmarkStart w:id="111" w:name="ref-FCGMA2019"/>
     <w:p>
       <w:pPr>
         <w:pStyle w:val="Bibliography"/>
@@ -23250,7 +23243,7 @@
       <w:r>
         <w:t xml:space="preserve"> </w:t>
       </w:r>
-      <w:hyperlink r:id="rId114">
+      <w:hyperlink r:id="rId110">
         <w:r>
           <w:rPr>
             <w:rStyle w:val="Hyperlink"/>
@@ -23262,14 +23255,14 @@
         <w:t xml:space="preserve">.</w:t>
       </w:r>
     </w:p>
-    <w:bookmarkEnd w:id="115"/>
-    <w:bookmarkStart w:id="117" w:name="ref-Gorelick1983"/>
+    <w:bookmarkEnd w:id="111"/>
+    <w:bookmarkStart w:id="113" w:name="ref-Graham2012"/>
     <w:p>
       <w:pPr>
         <w:pStyle w:val="Bibliography"/>
       </w:pPr>
       <w:r>
-        <w:t xml:space="preserve">Gorelick, Steven M. 1983.</w:t>
+        <w:t xml:space="preserve">Graham, Rhea. 2012.</w:t>
       </w:r>
       <w:r>
         <w:t xml:space="preserve"> </w:t>
@@ -23278,7 +23271,7 @@
         <w:t xml:space="preserve">“</w:t>
       </w:r>
       <w:r>
-        <w:t xml:space="preserve">A review of distributed parameter groundwater management modeling methods</w:t>
+        <w:t xml:space="preserve">Klamath River Basin Restoration Nonuse Value Survey Klamath River Basin Restoration Nonuse Value Survey Final Report Prepared by</w:t>
       </w:r>
       <w:r>
         <w:t xml:space="preserve">.”</w:t>
@@ -23286,59 +23279,7 @@
       <w:r>
         <w:t xml:space="preserve"> </w:t>
       </w:r>
-      <w:r>
-        <w:rPr>
-          <w:i/>
-          <w:iCs/>
-        </w:rPr>
-        <w:t xml:space="preserve">Water Resources Research</w:t>
-      </w:r>
-      <w:r>
-        <w:t xml:space="preserve"> </w:t>
-      </w:r>
-      <w:r>
-        <w:t xml:space="preserve">19 (2): 305–19.</w:t>
-      </w:r>
-      <w:r>
-        <w:t xml:space="preserve"> </w:t>
-      </w:r>
-      <w:hyperlink r:id="rId116">
-        <w:r>
-          <w:rPr>
-            <w:rStyle w:val="Hyperlink"/>
-          </w:rPr>
-          <w:t xml:space="preserve">https://doi.org/10.1029/WR019i002p00305</w:t>
-        </w:r>
-      </w:hyperlink>
-      <w:r>
-        <w:t xml:space="preserve">.</w:t>
-      </w:r>
-    </w:p>
-    <w:bookmarkEnd w:id="117"/>
-    <w:bookmarkStart w:id="119" w:name="ref-Graham2012"/>
-    <w:p>
-      <w:pPr>
-        <w:pStyle w:val="Bibliography"/>
-      </w:pPr>
-      <w:r>
-        <w:t xml:space="preserve">Graham, Rhea. 2012.</w:t>
-      </w:r>
-      <w:r>
-        <w:t xml:space="preserve"> </w:t>
-      </w:r>
-      <w:r>
-        <w:t xml:space="preserve">“</w:t>
-      </w:r>
-      <w:r>
-        <w:t xml:space="preserve">Klamath River Basin Restoration Nonuse Value Survey Klamath River Basin Restoration Nonuse Value Survey Final Report Prepared by</w:t>
-      </w:r>
-      <w:r>
-        <w:t xml:space="preserve">.”</w:t>
-      </w:r>
-      <w:r>
-        <w:t xml:space="preserve"> </w:t>
-      </w:r>
-      <w:hyperlink r:id="rId118">
+      <w:hyperlink r:id="rId112">
         <w:r>
           <w:rPr>
             <w:rStyle w:val="Hyperlink"/>
@@ -23350,8 +23291,8 @@
         <w:t xml:space="preserve">.</w:t>
       </w:r>
     </w:p>
-    <w:bookmarkEnd w:id="119"/>
-    <w:bookmarkStart w:id="121" w:name="ref-Harter2008"/>
+    <w:bookmarkEnd w:id="113"/>
+    <w:bookmarkStart w:id="115" w:name="ref-Harter2008"/>
     <w:p>
       <w:pPr>
         <w:pStyle w:val="Bibliography"/>
@@ -23380,7 +23321,7 @@
       <w:r>
         <w:t xml:space="preserve"> </w:t>
       </w:r>
-      <w:hyperlink r:id="rId120">
+      <w:hyperlink r:id="rId114">
         <w:r>
           <w:rPr>
             <w:rStyle w:val="Hyperlink"/>
@@ -23392,8 +23333,8 @@
         <w:t xml:space="preserve">.</w:t>
       </w:r>
     </w:p>
-    <w:bookmarkEnd w:id="121"/>
-    <w:bookmarkStart w:id="123" w:name="ref-Howitt1995"/>
+    <w:bookmarkEnd w:id="115"/>
+    <w:bookmarkStart w:id="117" w:name="ref-Howitt1995"/>
     <w:p>
       <w:pPr>
         <w:pStyle w:val="Bibliography"/>
@@ -23432,7 +23373,7 @@
       <w:r>
         <w:t xml:space="preserve"> </w:t>
       </w:r>
-      <w:hyperlink r:id="rId122">
+      <w:hyperlink r:id="rId116">
         <w:r>
           <w:rPr>
             <w:rStyle w:val="Hyperlink"/>
@@ -23444,8 +23385,8 @@
         <w:t xml:space="preserve">.</w:t>
       </w:r>
     </w:p>
-    <w:bookmarkEnd w:id="123"/>
-    <w:bookmarkStart w:id="125" w:name="ref-Kapelan2005"/>
+    <w:bookmarkEnd w:id="117"/>
+    <w:bookmarkStart w:id="119" w:name="ref-Kapelan2005"/>
     <w:p>
       <w:pPr>
         <w:pStyle w:val="Bibliography"/>
@@ -23484,7 +23425,7 @@
       <w:r>
         <w:t xml:space="preserve"> </w:t>
       </w:r>
-      <w:hyperlink r:id="rId124">
+      <w:hyperlink r:id="rId118">
         <w:r>
           <w:rPr>
             <w:rStyle w:val="Hyperlink"/>
@@ -23496,50 +23437,13 @@
         <w:t xml:space="preserve">.</w:t>
       </w:r>
     </w:p>
-    <w:bookmarkEnd w:id="125"/>
-    <w:bookmarkStart w:id="127" w:name="ref-Maass1962"/>
+    <w:bookmarkEnd w:id="119"/>
+    <w:bookmarkStart w:id="121" w:name="ref-Mack1958"/>
     <w:p>
       <w:pPr>
         <w:pStyle w:val="Bibliography"/>
       </w:pPr>
       <w:r>
-        <w:t xml:space="preserve">Maass, Arthur, Maynard M. Hufschmidt, Robert Dorfman, Harold A. Thomas, Stephen A. Marglin, and Gordon Maskew Fair. 1962.</w:t>
-      </w:r>
-      <w:r>
-        <w:t xml:space="preserve"> </w:t>
-      </w:r>
-      <w:r>
-        <w:rPr>
-          <w:i/>
-          <w:iCs/>
-        </w:rPr>
-        <w:t xml:space="preserve">Design of Water-Resource Systems: New Techniques for Relating Economic Objectives, Engineering Analysis, and Governmental Planning</w:t>
-      </w:r>
-      <w:r>
-        <w:t xml:space="preserve">. Cambridge, Mass.: Harvard University Press.</w:t>
-      </w:r>
-      <w:r>
-        <w:t xml:space="preserve"> </w:t>
-      </w:r>
-      <w:hyperlink r:id="rId126">
-        <w:r>
-          <w:rPr>
-            <w:rStyle w:val="Hyperlink"/>
-          </w:rPr>
-          <w:t xml:space="preserve">https://doi.org/10.4159/harvard.9780674421042</w:t>
-        </w:r>
-      </w:hyperlink>
-      <w:r>
-        <w:t xml:space="preserve">.</w:t>
-      </w:r>
-    </w:p>
-    <w:bookmarkEnd w:id="127"/>
-    <w:bookmarkStart w:id="129" w:name="ref-Mack1958"/>
-    <w:p>
-      <w:pPr>
-        <w:pStyle w:val="Bibliography"/>
-      </w:pPr>
-      <w:r>
         <w:t xml:space="preserve">Mack, Seymour. 1958.</w:t>
       </w:r>
       <w:r>
@@ -23560,7 +23464,7 @@
       <w:r>
         <w:t xml:space="preserve"> </w:t>
       </w:r>
-      <w:hyperlink r:id="rId128">
+      <w:hyperlink r:id="rId120">
         <w:r>
           <w:rPr>
             <w:rStyle w:val="Hyperlink"/>
@@ -23572,8 +23476,8 @@
         <w:t xml:space="preserve">.</w:t>
       </w:r>
     </w:p>
-    <w:bookmarkEnd w:id="129"/>
-    <w:bookmarkStart w:id="131" w:name="ref-Mahoney1998"/>
+    <w:bookmarkEnd w:id="121"/>
+    <w:bookmarkStart w:id="123" w:name="ref-Mahoney1998"/>
     <w:p>
       <w:pPr>
         <w:pStyle w:val="Bibliography"/>
@@ -23612,7 +23516,7 @@
       <w:r>
         <w:t xml:space="preserve"> </w:t>
       </w:r>
-      <w:hyperlink r:id="rId130">
+      <w:hyperlink r:id="rId122">
         <w:r>
           <w:rPr>
             <w:rStyle w:val="Hyperlink"/>
@@ -23624,8 +23528,8 @@
         <w:t xml:space="preserve">.</w:t>
       </w:r>
     </w:p>
-    <w:bookmarkEnd w:id="131"/>
-    <w:bookmarkStart w:id="133" w:name="ref-Monarchi1973"/>
+    <w:bookmarkEnd w:id="123"/>
+    <w:bookmarkStart w:id="125" w:name="ref-Monarchi1973"/>
     <w:p>
       <w:pPr>
         <w:pStyle w:val="Bibliography"/>
@@ -23664,7 +23568,7 @@
       <w:r>
         <w:t xml:space="preserve"> </w:t>
       </w:r>
-      <w:hyperlink r:id="rId132">
+      <w:hyperlink r:id="rId124">
         <w:r>
           <w:rPr>
             <w:rStyle w:val="Hyperlink"/>
@@ -23676,8 +23580,8 @@
         <w:t xml:space="preserve">.</w:t>
       </w:r>
     </w:p>
-    <w:bookmarkEnd w:id="133"/>
-    <w:bookmarkStart w:id="134" w:name="ref-NCRWQCB2006b"/>
+    <w:bookmarkEnd w:id="125"/>
+    <w:bookmarkStart w:id="126" w:name="ref-NCRWQCB2006b"/>
     <w:p>
       <w:pPr>
         <w:pStyle w:val="Bibliography"/>
@@ -23698,8 +23602,8 @@
         <w:t xml:space="preserve">.”</w:t>
       </w:r>
     </w:p>
-    <w:bookmarkEnd w:id="134"/>
-    <w:bookmarkStart w:id="136" w:name="ref-Ohlberger2018"/>
+    <w:bookmarkEnd w:id="126"/>
+    <w:bookmarkStart w:id="128" w:name="ref-Ohlberger2018"/>
     <w:p>
       <w:pPr>
         <w:pStyle w:val="Bibliography"/>
@@ -23738,7 +23642,7 @@
       <w:r>
         <w:t xml:space="preserve"> </w:t>
       </w:r>
-      <w:hyperlink r:id="rId135">
+      <w:hyperlink r:id="rId127">
         <w:r>
           <w:rPr>
             <w:rStyle w:val="Hyperlink"/>
@@ -23750,8 +23654,8 @@
         <w:t xml:space="preserve">.</w:t>
       </w:r>
     </w:p>
-    <w:bookmarkEnd w:id="136"/>
-    <w:bookmarkStart w:id="137" w:name="ref-Pareto1896"/>
+    <w:bookmarkEnd w:id="128"/>
+    <w:bookmarkStart w:id="129" w:name="ref-Pareto1896"/>
     <w:p>
       <w:pPr>
         <w:pStyle w:val="Bibliography"/>
@@ -23773,14 +23677,14 @@
         <w:t xml:space="preserve">. Lausanne.</w:t>
       </w:r>
     </w:p>
-    <w:bookmarkEnd w:id="137"/>
-    <w:bookmarkStart w:id="138" w:name="ref-Reuss1992"/>
+    <w:bookmarkEnd w:id="129"/>
+    <w:bookmarkStart w:id="130" w:name="ref-SVAP1980"/>
     <w:p>
       <w:pPr>
         <w:pStyle w:val="Bibliography"/>
       </w:pPr>
       <w:r>
-        <w:t xml:space="preserve">Reuss, M. 1992.</w:t>
+        <w:t xml:space="preserve">Scott Valley Area Plan Committee. 1980.</w:t>
       </w:r>
       <w:r>
         <w:t xml:space="preserve"> </w:t>
@@ -23789,36 +23693,20 @@
         <w:t xml:space="preserve">“</w:t>
       </w:r>
       <w:r>
-        <w:t xml:space="preserve">Coping with uncertainty: social scientists, engineers, and federal water resources planning</w:t>
+        <w:t xml:space="preserve">Scott Valley Area Plan (SVAP)</w:t>
       </w:r>
       <w:r>
         <w:t xml:space="preserve">.”</w:t>
       </w:r>
-      <w:r>
-        <w:t xml:space="preserve"> </w:t>
-      </w:r>
-      <w:r>
-        <w:rPr>
-          <w:i/>
-          <w:iCs/>
-        </w:rPr>
-        <w:t xml:space="preserve">Natural Resources Journal</w:t>
-      </w:r>
-      <w:r>
-        <w:t xml:space="preserve"> </w:t>
-      </w:r>
-      <w:r>
-        <w:t xml:space="preserve">32 (1): 101–35.</w:t>
-      </w:r>
     </w:p>
-    <w:bookmarkEnd w:id="138"/>
-    <w:bookmarkStart w:id="140" w:name="ref-Rodell2018"/>
+    <w:bookmarkEnd w:id="130"/>
+    <w:bookmarkStart w:id="132" w:name="ref-SiskiyouCounty2021"/>
     <w:p>
       <w:pPr>
         <w:pStyle w:val="Bibliography"/>
       </w:pPr>
       <w:r>
-        <w:t xml:space="preserve">Rodell, M., J. S. Famiglietti, D. N. Wiese, J. T. Reager, H. K. Beaudoing, F. W. Landerer, and M. H. Lo. 2018.</w:t>
+        <w:t xml:space="preserve">Siskiyou County Flood Control and Water Conservation District. 2021.</w:t>
       </w:r>
       <w:r>
         <w:t xml:space="preserve"> </w:t>
@@ -23827,7 +23715,7 @@
         <w:t xml:space="preserve">“</w:t>
       </w:r>
       <w:r>
-        <w:t xml:space="preserve">Emerging trends in global freshwater availability</w:t>
+        <w:t xml:space="preserve">Scott Valley Groundwater Sustainability Plan</w:t>
       </w:r>
       <w:r>
         <w:t xml:space="preserve">.”</w:t>
@@ -23836,138 +23724,12 @@
         <w:t xml:space="preserve"> </w:t>
       </w:r>
       <w:r>
-        <w:rPr>
-          <w:i/>
-          <w:iCs/>
-        </w:rPr>
-        <w:t xml:space="preserve">Nature</w:t>
-      </w:r>
-      <w:r>
-        <w:t xml:space="preserve"> </w:t>
-      </w:r>
-      <w:r>
-        <w:t xml:space="preserve">557 (7707): 651–59.</w:t>
-      </w:r>
-      <w:r>
-        <w:t xml:space="preserve"> </w:t>
-      </w:r>
-      <w:hyperlink r:id="rId139">
-        <w:r>
-          <w:rPr>
-            <w:rStyle w:val="Hyperlink"/>
-          </w:rPr>
-          <w:t xml:space="preserve">https://doi.org/10.1038/s41586-018-0123-1</w:t>
-        </w:r>
-      </w:hyperlink>
-      <w:r>
-        <w:t xml:space="preserve">.</w:t>
-      </w:r>
-    </w:p>
-    <w:bookmarkEnd w:id="140"/>
-    <w:bookmarkStart w:id="142" w:name="ref-Rogers1986a"/>
-    <w:p>
-      <w:pPr>
-        <w:pStyle w:val="Bibliography"/>
-      </w:pPr>
-      <w:r>
-        <w:t xml:space="preserve">Rogers, Peter P., and Myron B. Fiering. 1986.</w:t>
-      </w:r>
-      <w:r>
-        <w:t xml:space="preserve"> </w:t>
-      </w:r>
-      <w:r>
-        <w:t xml:space="preserve">“</w:t>
-      </w:r>
-      <w:r>
-        <w:t xml:space="preserve">Use of systems analysis in water management</w:t>
-      </w:r>
-      <w:r>
-        <w:t xml:space="preserve">.”</w:t>
-      </w:r>
-      <w:r>
-        <w:t xml:space="preserve"> </w:t>
-      </w:r>
-      <w:r>
-        <w:rPr>
-          <w:i/>
-          <w:iCs/>
-        </w:rPr>
-        <w:t xml:space="preserve">Water Resources Research</w:t>
-      </w:r>
-      <w:r>
-        <w:t xml:space="preserve"> </w:t>
-      </w:r>
-      <w:r>
-        <w:t xml:space="preserve">22 (9 S): 146S–158S.</w:t>
-      </w:r>
-      <w:r>
-        <w:t xml:space="preserve"> </w:t>
-      </w:r>
-      <w:hyperlink r:id="rId141">
-        <w:r>
-          <w:rPr>
-            <w:rStyle w:val="Hyperlink"/>
-          </w:rPr>
-          <w:t xml:space="preserve">https://doi.org/10.1029/WR022i09Sp0146S</w:t>
-        </w:r>
-      </w:hyperlink>
-      <w:r>
-        <w:t xml:space="preserve">.</w:t>
-      </w:r>
-    </w:p>
-    <w:bookmarkEnd w:id="142"/>
-    <w:bookmarkStart w:id="143" w:name="ref-SVAP1980"/>
-    <w:p>
-      <w:pPr>
-        <w:pStyle w:val="Bibliography"/>
-      </w:pPr>
-      <w:r>
-        <w:t xml:space="preserve">Scott Valley Area Plan Committee. 1980.</w:t>
-      </w:r>
-      <w:r>
-        <w:t xml:space="preserve"> </w:t>
-      </w:r>
-      <w:r>
-        <w:t xml:space="preserve">“</w:t>
-      </w:r>
-      <w:r>
-        <w:t xml:space="preserve">Scott Valley Area Plan (SVAP)</w:t>
-      </w:r>
-      <w:r>
-        <w:t xml:space="preserve">.”</w:t>
-      </w:r>
-    </w:p>
-    <w:bookmarkEnd w:id="143"/>
-    <w:bookmarkStart w:id="145" w:name="ref-SiskiyouCounty2021"/>
-    <w:p>
-      <w:pPr>
-        <w:pStyle w:val="Bibliography"/>
-      </w:pPr>
-      <w:r>
-        <w:t xml:space="preserve">Siskiyou County Flood Control and Water Conservation District. 2021.</w:t>
-      </w:r>
-      <w:r>
-        <w:t xml:space="preserve"> </w:t>
-      </w:r>
-      <w:r>
-        <w:t xml:space="preserve">“</w:t>
-      </w:r>
-      <w:r>
-        <w:t xml:space="preserve">Scott Valley Groundwater Sustainability Plan</w:t>
-      </w:r>
-      <w:r>
-        <w:t xml:space="preserve">.”</w:t>
-      </w:r>
-      <w:r>
-        <w:t xml:space="preserve"> </w:t>
-      </w:r>
-      <w:r>
         <w:t xml:space="preserve">Siskiyou County Flood Control; Water Conservation District.</w:t>
       </w:r>
       <w:r>
         <w:t xml:space="preserve"> </w:t>
       </w:r>
-      <w:hyperlink r:id="rId144">
+      <w:hyperlink r:id="rId131">
         <w:r>
           <w:rPr>
             <w:rStyle w:val="Hyperlink"/>
@@ -23979,8 +23741,8 @@
         <w:t xml:space="preserve">.</w:t>
       </w:r>
     </w:p>
-    <w:bookmarkEnd w:id="145"/>
-    <w:bookmarkStart w:id="147" w:name="ref-SVGAC2021_June"/>
+    <w:bookmarkEnd w:id="132"/>
+    <w:bookmarkStart w:id="134" w:name="ref-SVGAC2021_June"/>
     <w:p>
       <w:pPr>
         <w:pStyle w:val="Bibliography"/>
@@ -24009,7 +23771,7 @@
       <w:r>
         <w:t xml:space="preserve"> </w:t>
       </w:r>
-      <w:hyperlink r:id="rId146">
+      <w:hyperlink r:id="rId133">
         <w:r>
           <w:rPr>
             <w:rStyle w:val="Hyperlink"/>
@@ -24021,8 +23783,8 @@
         <w:t xml:space="preserve">.</w:t>
       </w:r>
     </w:p>
-    <w:bookmarkEnd w:id="147"/>
-    <w:bookmarkStart w:id="149" w:name="ref-Sunding1996"/>
+    <w:bookmarkEnd w:id="134"/>
+    <w:bookmarkStart w:id="136" w:name="ref-Sunding1996"/>
     <w:p>
       <w:pPr>
         <w:pStyle w:val="Bibliography"/>
@@ -24061,7 +23823,7 @@
       <w:r>
         <w:t xml:space="preserve"> </w:t>
       </w:r>
-      <w:hyperlink r:id="rId148">
+      <w:hyperlink r:id="rId135">
         <w:r>
           <w:rPr>
             <w:rStyle w:val="Hyperlink"/>
@@ -24073,8 +23835,8 @@
         <w:t xml:space="preserve">.</w:t>
       </w:r>
     </w:p>
-    <w:bookmarkEnd w:id="149"/>
-    <w:bookmarkStart w:id="151" w:name="ref-SuperiorCourtofSiskiyouCounty1980"/>
+    <w:bookmarkEnd w:id="136"/>
+    <w:bookmarkStart w:id="138" w:name="ref-SuperiorCourtofSiskiyouCounty1980"/>
     <w:p>
       <w:pPr>
         <w:pStyle w:val="Bibliography"/>
@@ -24100,7 +23862,7 @@
       <w:r>
         <w:t xml:space="preserve"> </w:t>
       </w:r>
-      <w:hyperlink r:id="rId150">
+      <w:hyperlink r:id="rId137">
         <w:r>
           <w:rPr>
             <w:rStyle w:val="Hyperlink"/>
@@ -24112,8 +23874,8 @@
         <w:t xml:space="preserve">.</w:t>
       </w:r>
     </w:p>
-    <w:bookmarkEnd w:id="151"/>
-    <w:bookmarkStart w:id="153" w:name="ref-Tolley2019"/>
+    <w:bookmarkEnd w:id="138"/>
+    <w:bookmarkStart w:id="140" w:name="ref-Tolley2019"/>
     <w:p>
       <w:pPr>
         <w:pStyle w:val="Bibliography"/>
@@ -24152,7 +23914,7 @@
       <w:r>
         <w:t xml:space="preserve"> </w:t>
       </w:r>
-      <w:hyperlink r:id="rId152">
+      <w:hyperlink r:id="rId139">
         <w:r>
           <w:rPr>
             <w:rStyle w:val="Hyperlink"/>
@@ -24164,8 +23926,8 @@
         <w:t xml:space="preserve">.</w:t>
       </w:r>
     </w:p>
-    <w:bookmarkEnd w:id="153"/>
-    <w:bookmarkStart w:id="155" w:name="ref-USCensusBureau2018"/>
+    <w:bookmarkEnd w:id="140"/>
+    <w:bookmarkStart w:id="142" w:name="ref-USCensusBureau2018"/>
     <w:p>
       <w:pPr>
         <w:pStyle w:val="Bibliography"/>
@@ -24188,7 +23950,7 @@
       <w:r>
         <w:t xml:space="preserve"> </w:t>
       </w:r>
-      <w:hyperlink r:id="rId154">
+      <w:hyperlink r:id="rId141">
         <w:r>
           <w:rPr>
             <w:rStyle w:val="Hyperlink"/>
@@ -24200,8 +23962,8 @@
         <w:t xml:space="preserve">.</w:t>
       </w:r>
     </w:p>
-    <w:bookmarkEnd w:id="155"/>
-    <w:bookmarkStart w:id="157" w:name="ref-USCensus2021"/>
+    <w:bookmarkEnd w:id="142"/>
+    <w:bookmarkStart w:id="144" w:name="ref-USCensus2021"/>
     <w:p>
       <w:pPr>
         <w:pStyle w:val="Bibliography"/>
@@ -24224,7 +23986,7 @@
       <w:r>
         <w:t xml:space="preserve"> </w:t>
       </w:r>
-      <w:hyperlink r:id="rId156">
+      <w:hyperlink r:id="rId143">
         <w:r>
           <w:rPr>
             <w:rStyle w:val="Hyperlink"/>
@@ -24236,46 +23998,8 @@
         <w:t xml:space="preserve">.</w:t>
       </w:r>
     </w:p>
-    <w:bookmarkEnd w:id="157"/>
-    <w:bookmarkStart w:id="158" w:name="ref-Williams2020"/>
-    <w:p>
-      <w:pPr>
-        <w:pStyle w:val="Bibliography"/>
-      </w:pPr>
-      <w:r>
-        <w:t xml:space="preserve">Williams, AP, ER Cook, JE Smerdon, BI Cook, JT Abatzoglou, Kasey Bolles, SH Baek, AM Badger, and Ben Livne. 2020.</w:t>
-      </w:r>
-      <w:r>
-        <w:t xml:space="preserve"> </w:t>
-      </w:r>
-      <w:r>
-        <w:t xml:space="preserve">“</w:t>
-      </w:r>
-      <w:r>
-        <w:t xml:space="preserve">Large contribution from anthropogenic warming to an emerging North American megadrought</w:t>
-      </w:r>
-      <w:r>
-        <w:t xml:space="preserve">.”</w:t>
-      </w:r>
-      <w:r>
-        <w:t xml:space="preserve"> </w:t>
-      </w:r>
-      <w:r>
-        <w:rPr>
-          <w:i/>
-          <w:iCs/>
-        </w:rPr>
-        <w:t xml:space="preserve">Science</w:t>
-      </w:r>
-      <w:r>
-        <w:t xml:space="preserve"> </w:t>
-      </w:r>
-      <w:r>
-        <w:t xml:space="preserve">In press (April): 314–18.</w:t>
-      </w:r>
-    </w:p>
-    <w:bookmarkEnd w:id="158"/>
-    <w:bookmarkStart w:id="160" w:name="ref-Yeh1982"/>
+    <w:bookmarkEnd w:id="144"/>
+    <w:bookmarkStart w:id="146" w:name="ref-Yeh1982"/>
     <w:p>
       <w:pPr>
         <w:pStyle w:val="Bibliography"/>
@@ -24314,7 +24038,7 @@
       <w:r>
         <w:t xml:space="preserve"> </w:t>
       </w:r>
-      <w:hyperlink r:id="rId159">
+      <w:hyperlink r:id="rId145">
         <w:r>
           <w:rPr>
             <w:rStyle w:val="Hyperlink"/>
@@ -24326,8 +24050,8 @@
         <w:t xml:space="preserve">.</w:t>
       </w:r>
     </w:p>
-    <w:bookmarkEnd w:id="160"/>
-    <w:bookmarkStart w:id="161" w:name="ref-YSGA2022"/>
+    <w:bookmarkEnd w:id="146"/>
+    <w:bookmarkStart w:id="147" w:name="ref-YSGA2022"/>
     <w:p>
       <w:pPr>
         <w:pStyle w:val="Bibliography"/>
@@ -24354,9 +24078,9 @@
         <w:t xml:space="preserve">Woodland, CA.</w:t>
       </w:r>
     </w:p>
-    <w:bookmarkEnd w:id="161"/>
-    <w:bookmarkEnd w:id="162"/>
-    <w:bookmarkEnd w:id="163"/>
+    <w:bookmarkEnd w:id="147"/>
+    <w:bookmarkEnd w:id="148"/>
+    <w:bookmarkEnd w:id="149"/>
     <w:sectPr>
       <w:footnotePr>
         <w:numRestart w:val="eachSect"/>

</xml_diff>

<commit_message>
cut text for rewrite
</commit_message>
<xml_diff>
--- a/Kouba_Fish_and_Ag_Benefit_MS.docx
+++ b/Kouba_Fish_and_Ag_Benefit_MS.docx
@@ -64,7 +64,7 @@
         <w:pStyle w:val="BodyText"/>
       </w:pPr>
       <w:r>
-        <w:t xml:space="preserve">We found that a trade-off in benefits for fish and farms was evident in every category of infrastructure investment (a proxy for project cost), though greater infrastructure investment can achieve some reductions in this trade-off. Additionally, although the GSP management priorities emphasized infrastructure investments,</w:t>
+        <w:t xml:space="preserve">We found that a trade-off in benefits for fish and farms was evident in every category of infrastructure investment (a proxy for project cost), though greater infrastructure investment can achieve some reductions in this trade-off. Additionally, although the GSP management priorities emphasized infrastructure investments, both infrastructure-based and regulatory approaches fell within the Pareto-optimal set of management options under a strict application of these objective functions. Finally, regarding regulatory actions, management interventions targeted at low-flow periods produced a more efficient gain in environmental flow value per cost in agricultural productivity. This work demonstrates that developing basin-specific, stakeholder-informed objective functions, especially ones using output from existing hydrologic models, can help clarify trade-offs in ongoing local water planning efforts</w:t>
       </w:r>
       <w:r>
         <w:t xml:space="preserve"> </w:t>
@@ -74,41 +74,17 @@
           <w:b/>
           <w:bCs/>
         </w:rPr>
-        <w:t xml:space="preserve">both infrastructure-based and regulatory approaches fell within the Pareto-optimal set of management options under a strict application of these objective functions</w:t>
-      </w:r>
-      <w:r>
-        <w:t xml:space="preserve">. Finally, regarding regulatory actions,</w:t>
+        <w:t xml:space="preserve">and summarize a rich landscape of many choices.</w:t>
       </w:r>
       <w:r>
         <w:t xml:space="preserve"> </w:t>
       </w:r>
       <w:r>
         <w:rPr>
-          <w:b/>
-          <w:bCs/>
+          <w:i/>
+          <w:iCs/>
         </w:rPr>
-        <w:t xml:space="preserve">management interventions targeted at low-flow periods produced a more efficient gain in environmental flow value per cost in agricultural productivity</w:t>
-      </w:r>
-      <w:r>
-        <w:t xml:space="preserve">.</w:t>
-      </w:r>
-    </w:p>
-    <w:p>
-      <w:pPr>
-        <w:pStyle w:val="BodyText"/>
-      </w:pPr>
-      <w:r>
-        <w:rPr>
-          <w:b/>
-          <w:bCs/>
-        </w:rPr>
-        <w:t xml:space="preserve">revise conclusion statement?</w:t>
-      </w:r>
-      <w:r>
-        <w:t xml:space="preserve"> </w:t>
-      </w:r>
-      <w:r>
-        <w:t xml:space="preserve">The development of basin-specific objective functions, especially ones using output from existing hydrologic models, could help quantify management decision trade-offs and improve stakeholder communication in ongoing water planning efforts throughout the region.</w:t>
+        <w:t xml:space="preserve">fix last sentence</w:t>
       </w:r>
     </w:p>
     <w:p>
@@ -140,11 +116,34 @@
         <w:pStyle w:val="FirstParagraph"/>
       </w:pPr>
       <w:r>
-        <w:rPr>
-          <w:b/>
-          <w:bCs/>
-        </w:rPr>
-        <w:t xml:space="preserve">no reservoir</w:t>
+        <w:t xml:space="preserve">Climate adaptation in the water sector, in its many facets - such as securing our water and food supply, updating infrastructure to reduce flood and drought risk, and preserving ecosystem function - is best implemented at the local level</w:t>
+      </w:r>
+      <w:r>
+        <w:t xml:space="preserve"> </w:t>
+      </w:r>
+      <w:r>
+        <w:t xml:space="preserve">(e.g., Van Steenbergen 2006)</w:t>
+      </w:r>
+      <w:r>
+        <w:t xml:space="preserve">. However, local water managers face a complex regulatory landscape and serve diverse stakeholders, and typically have unmet knowledge needs</w:t>
+      </w:r>
+      <w:r>
+        <w:t xml:space="preserve"> </w:t>
+      </w:r>
+      <w:r>
+        <w:t xml:space="preserve">(Bork and Hirokawa 2021; Nordgren, Stults, and Meerow 2016)</w:t>
+      </w:r>
+      <w:r>
+        <w:t xml:space="preserve">. While academic hydrologists have the tools to fill such knowledge gaps, in many cases they avoid engaging with specific local water organizations, which can reduce the utility of the resulting research</w:t>
+      </w:r>
+      <w:r>
+        <w:t xml:space="preserve"> </w:t>
+      </w:r>
+      <w:r>
+        <w:t xml:space="preserve">(Freeman 2000)</w:t>
+      </w:r>
+      <w:r>
+        <w:t xml:space="preserve">. In this study, we take advantage of the authors’ involvement with an existing water resource planning process, and a previously-developed integrated surface- and groundwater model, to test the utility of introducing quantitative objective functions into the prioritization of groundwater management alternatives.</w:t>
       </w:r>
     </w:p>
     <w:p>
@@ -152,174 +151,34 @@
         <w:pStyle w:val="BodyText"/>
       </w:pPr>
       <w:r>
-        <w:t xml:space="preserve">Climate adaptation in the water sector, in its many facets - such as securing our water and food supply, updating our infrastructure, and preserving ecosystem function - will by and large be implemented at the local level (</w:t>
-      </w:r>
-      <w:r>
-        <w:rPr>
-          <w:b/>
-          <w:bCs/>
-        </w:rPr>
-        <w:t xml:space="preserve">CITE</w:t>
-      </w:r>
-      <w:r>
-        <w:t xml:space="preserve">). Local water managers operate in a complex regulatory landscape and serve diverse stakeholders, and typically have unmet knowledge needs</w:t>
-      </w:r>
-      <w:r>
-        <w:t xml:space="preserve"> </w:t>
-      </w:r>
-      <w:r>
-        <w:t xml:space="preserve">(</w:t>
-      </w:r>
-      <w:r>
-        <w:rPr>
-          <w:b/>
-          <w:bCs/>
-        </w:rPr>
-        <w:t xml:space="preserve">BorkHirokawaTrends2021?</w:t>
-      </w:r>
-      <w:r>
-        <w:t xml:space="preserve">;</w:t>
-      </w:r>
-      <w:r>
-        <w:t xml:space="preserve"> </w:t>
-      </w:r>
-      <w:r>
-        <w:rPr>
-          <w:b/>
-          <w:bCs/>
-        </w:rPr>
-        <w:t xml:space="preserve">NordgrenEtAlSupporting2016?</w:t>
-      </w:r>
-      <w:r>
-        <w:t xml:space="preserve">)</w:t>
-      </w:r>
-      <w:r>
-        <w:t xml:space="preserve">.</w:t>
-      </w:r>
-      <w:r>
-        <w:t xml:space="preserve"> </w:t>
-      </w:r>
-      <w:r>
-        <w:rPr>
-          <w:b/>
-          <w:bCs/>
-        </w:rPr>
-        <w:t xml:space="preserve">Local gw mgmt is good</w:t>
-      </w:r>
-      <w:r>
-        <w:rPr>
-          <w:b/>
-          <w:bCs/>
-        </w:rPr>
-        <w:t xml:space="preserve"> </w:t>
-      </w:r>
-      <w:r>
-        <w:rPr>
-          <w:b/>
-          <w:bCs/>
-        </w:rPr>
-        <w:t xml:space="preserve">(</w:t>
-      </w:r>
-      <w:r>
-        <w:rPr>
-          <w:b/>
-          <w:b/>
-          <w:bCs/>
-          <w:bCs/>
-        </w:rPr>
-        <w:t xml:space="preserve">vanSteenberger?</w:t>
-      </w:r>
-      <w:r>
-        <w:rPr>
-          <w:b/>
-          <w:bCs/>
-        </w:rPr>
-        <w:t xml:space="preserve">)</w:t>
-      </w:r>
-      <w:r>
-        <w:rPr>
-          <w:b/>
-          <w:bCs/>
-        </w:rPr>
-        <w:t xml:space="preserve">. Local resource mgmt districts are understudied and should be the focus of more work to improve research into</w:t>
-      </w:r>
-      <w:r>
-        <w:rPr>
-          <w:b/>
-          <w:bCs/>
-        </w:rPr>
-        <w:t xml:space="preserve"> </w:t>
-      </w:r>
-      <w:r>
-        <w:rPr>
-          <w:b/>
-          <w:bCs/>
-        </w:rPr>
-        <w:t xml:space="preserve">“wicked”</w:t>
-      </w:r>
-      <w:r>
-        <w:rPr>
-          <w:b/>
-          <w:bCs/>
-        </w:rPr>
-        <w:t xml:space="preserve"> </w:t>
-      </w:r>
-      <w:r>
-        <w:rPr>
-          <w:b/>
-          <w:bCs/>
-        </w:rPr>
-        <w:t xml:space="preserve">water challenges</w:t>
-      </w:r>
-      <w:r>
-        <w:rPr>
-          <w:b/>
-          <w:bCs/>
-        </w:rPr>
-        <w:t xml:space="preserve"> </w:t>
-      </w:r>
-      <w:r>
-        <w:rPr>
-          <w:b/>
-          <w:bCs/>
-        </w:rPr>
-        <w:t xml:space="preserve">(</w:t>
-      </w:r>
-      <w:r>
-        <w:rPr>
-          <w:b/>
-          <w:b/>
-          <w:bCs/>
-          <w:bCs/>
-        </w:rPr>
-        <w:t xml:space="preserve">Freeman20007?</w:t>
-      </w:r>
-      <w:r>
-        <w:rPr>
-          <w:b/>
-          <w:bCs/>
-        </w:rPr>
-        <w:t xml:space="preserve">)</w:t>
-      </w:r>
-      <w:r>
-        <w:rPr>
-          <w:b/>
-          <w:bCs/>
-        </w:rPr>
-        <w:t xml:space="preserve">.</w:t>
-      </w:r>
-      <w:r>
-        <w:rPr>
-          <w:b/>
-          <w:bCs/>
-        </w:rPr>
-        <w:t xml:space="preserve"> </w:t>
-      </w:r>
-      <w:r>
-        <w:t xml:space="preserve"> </w:t>
-      </w:r>
-      <w:r>
-        <w:t xml:space="preserve">In this study, we take advantage of the authors’ familiarity with an existing water resource planning process, and a previously-developed integrated surface- and groundwater model, to test the utility of introducing elements of multi-objective optimization into the prioritization of groundwater management alternatives.</w:t>
+        <w:t xml:space="preserve">In our study area, the intermontane rural Scott Valley in northern California (Figure</w:t>
+      </w:r>
+      <w:r>
+        <w:t xml:space="preserve"> </w:t>
+      </w:r>
+      <w:r>
+        <w:t xml:space="preserve">1</w:t>
+      </w:r>
+      <w:r>
+        <w:t xml:space="preserve">), the local government and public stakeholders spent three years (2018-2021) developing a plan for the long-term use of groundwater (a Groundwater Sustainability Plan or GSP). In that process, they evaluated dozens of potential water management scenarios</w:t>
+      </w:r>
+      <w:r>
+        <w:t xml:space="preserve"> </w:t>
+      </w:r>
+      <w:r>
+        <w:t xml:space="preserve">(Siskiyou County 2021)</w:t>
+      </w:r>
+      <w:r>
+        <w:t xml:space="preserve">. In public meetings, different objectives were often championed by individual stakeholders or interest groups. An integrated hydrologic model, the Scott Valley Integrated Hydrologic Model, or SVIHM</w:t>
+      </w:r>
+      <w:r>
+        <w:t xml:space="preserve"> </w:t>
+      </w:r>
+      <w:r>
+        <w:t xml:space="preserve">(Tolley, Foglia, and Harter 2019)</w:t>
+      </w:r>
+      <w:r>
+        <w:t xml:space="preserve">, was available to support this policy-making process. The numerical streamflow results of simulated management scenarios drove decision-making, but discussions on the balancing of multiple objectives were typically qualitative. In effect, the optimization framework used to arrive at the ultimate list of management priorities was implicit, and the conceptual weight given to different objectives varied between stakeholders.</w:t>
       </w:r>
     </w:p>
     <w:p>
@@ -327,39 +186,6 @@
         <w:pStyle w:val="BodyText"/>
       </w:pPr>
       <w:r>
-        <w:t xml:space="preserve">In our study area, the intermontane rural Scott Valley in northern California (Figure</w:t>
-      </w:r>
-      <w:r>
-        <w:t xml:space="preserve"> </w:t>
-      </w:r>
-      <w:r>
-        <w:t xml:space="preserve">1</w:t>
-      </w:r>
-      <w:r>
-        <w:t xml:space="preserve">), the local government and public stakeholders spent three years (2018-2021) developing a plan for the long-term use of groundwater (a Groundwater Sustainability Plan or GSP). In that process, they evaluated dozens of potential water management scenarios</w:t>
-      </w:r>
-      <w:r>
-        <w:t xml:space="preserve"> </w:t>
-      </w:r>
-      <w:r>
-        <w:t xml:space="preserve">(Siskiyou County 2021)</w:t>
-      </w:r>
-      <w:r>
-        <w:t xml:space="preserve">. In public meetings, different objectives were often championed by individual stakeholders or interest groups. An integrated hydrologic model, the Scott Valley Integrated Hydrologic Model, or SVIHM</w:t>
-      </w:r>
-      <w:r>
-        <w:t xml:space="preserve"> </w:t>
-      </w:r>
-      <w:r>
-        <w:t xml:space="preserve">(Tolley, Foglia, and Harter 2019)</w:t>
-      </w:r>
-      <w:r>
-        <w:t xml:space="preserve">, was available to support this policy-making process. The numerical streamflow results of simulated management scenarios drove decision-making, but discussions on the balancing of multiple objectives were typically qualitative. In effect, the optimization framework used to arrive at the ultimate list of management priorities was implicit, and the conceptual weight given to different objectives varied between stakeholders.</w:t>
-      </w:r>
-      <w:r>
-        <w:t xml:space="preserve"> </w:t>
-      </w:r>
-      <w:r>
         <w:t xml:space="preserve">Differences between stakeholders in what is considered an acceptable trade-off are common in policy decisions</w:t>
       </w:r>
       <w:r>
@@ -395,19 +221,17 @@
         <w:pStyle w:val="BodyText"/>
       </w:pPr>
       <w:r>
-        <w:t xml:space="preserve">In this study we developed numerical representations of three objectives: 1) maximizing specific environmental flows, 2) minimizing reduction in agricultural water supplies, and 3) minimizing new infrastructure costs. With these, we quantitatively summarized the management benefits and trade-offs within the existing suite of several dozen stakeholder-proposed management scenarios. Our hypothesis: that an explicit objective function framework would yield different prioritization of management actions than the set agreed upon in public meetings, as recorded in the 2021 GSP. This work could help frame ongoing water planning efforts in Scott Valley, and constitutes an approach for supporting locally-driven water planning efforts in California and elsewhere.</w:t>
-      </w:r>
-    </w:p>
-    <w:p>
-      <w:pPr>
-        <w:pStyle w:val="BodyText"/>
-      </w:pPr>
+        <w:t xml:space="preserve">In this study we developed numerical representations of three objectives: 1) maximizing specific environmental flows, 2) minimizing reduction in agricultural water supplies, and 3) minimizing new infrastructure costs. With these, we quantitatively summarized the management benefits and trade-offs within the existing suite of several dozen stakeholder-proposed management scenarios. Our hypothesis was that an explicit objective function framework would yield different prioritization of management actions than the set agreed upon in public meetings, as recorded in the 2021 GSP. This work could help frame ongoing water planning efforts in Scott Valley, and constitutes an approach for supporting locally-driven water planning efforts in California and elsewhere.</w:t>
+      </w:r>
+      <w:r>
+        <w:t xml:space="preserve"> </w:t>
+      </w:r>
       <w:r>
         <w:rPr>
           <w:b/>
           <w:bCs/>
         </w:rPr>
-        <w:t xml:space="preserve">TO DO: MOVE city labels on map in fig 1</w:t>
+        <w:t xml:space="preserve">possibly remove final sentence</w:t>
       </w:r>
     </w:p>
     <w:p>
@@ -471,7 +295,7 @@
       </w:r>
     </w:p>
     <w:bookmarkEnd w:id="25"/>
-    <w:bookmarkStart w:id="46" w:name="X525b2f83bcefbf206e3ace342b868d96bb1ee57"/>
+    <w:bookmarkStart w:id="45" w:name="X525b2f83bcefbf206e3ace342b868d96bb1ee57"/>
     <w:p>
       <w:pPr>
         <w:pStyle w:val="Heading1"/>
@@ -487,18 +311,6 @@
       </w:r>
       <w:r>
         <w:t xml:space="preserve">Case study and summary of GSP development</w:t>
-      </w:r>
-    </w:p>
-    <w:p>
-      <w:pPr>
-        <w:pStyle w:val="FirstParagraph"/>
-      </w:pPr>
-      <w:r>
-        <w:rPr>
-          <w:b/>
-          <w:bCs/>
-        </w:rPr>
-        <w:t xml:space="preserve">must shorten. possibly move to supplement</w:t>
       </w:r>
     </w:p>
     <w:bookmarkStart w:id="30" w:name="hydrography-and-climate"/>
@@ -536,7 +348,7 @@
         <w:t xml:space="preserve"> </w:t>
       </w:r>
       <w:r>
-        <w:t xml:space="preserve">(814 square mile) intermontane watershed known as Scott Valley, surrounded by several mountain ranges, including the Scott Bar, Marble, Salmon and Scott Mountains to the north, west, southwest, and south, respectively. The valley floor overlies unconsolidated alluvial sediments of up to 79 m (260 ft) thickness</w:t>
+        <w:t xml:space="preserve">(814 square mile) intermontane watershed known as Scott Valley. The valley floor overlies unconsolidated alluvial sediments of up to 79 m (260 ft) thickness</w:t>
       </w:r>
       <w:r>
         <w:t xml:space="preserve"> </w:t>
@@ -554,7 +366,28 @@
         <w:t xml:space="preserve">(Mack 1958)</w:t>
       </w:r>
       <w:r>
-        <w:t xml:space="preserve">.</w:t>
+        <w:t xml:space="preserve">. A key stream gauge (USGS Station ID 11519500, or the Fort Jones Gauge or FJ Gauge) is used to assess hydrologic conditions and inform water management decisions in the populated areas of the valley</w:t>
+      </w:r>
+      <w:r>
+        <w:t xml:space="preserve"> </w:t>
+      </w:r>
+      <w:r>
+        <w:t xml:space="preserve">(e.g., Siskiyou County 2021)</w:t>
+      </w:r>
+      <w:r>
+        <w:t xml:space="preserve"> </w:t>
+      </w:r>
+      <w:r>
+        <w:t xml:space="preserve">(Figure</w:t>
+      </w:r>
+      <w:r>
+        <w:t xml:space="preserve"> </w:t>
+      </w:r>
+      <w:r>
+        <w:t xml:space="preserve">1</w:t>
+      </w:r>
+      <w:r>
+        <w:t xml:space="preserve">).</w:t>
       </w:r>
     </w:p>
     <w:p>
@@ -562,25 +395,25 @@
         <w:pStyle w:val="BodyText"/>
       </w:pPr>
       <w:r>
-        <w:t xml:space="preserve">The Scott River begins near the community of Callahan, where the East and South Forks of the Scott River converge, and flows north through the agricultural and residential areas of Scott Valley (Figure</w:t>
-      </w:r>
-      <w:r>
-        <w:t xml:space="preserve"> </w:t>
-      </w:r>
-      <w:r>
-        <w:t xml:space="preserve">1</w:t>
-      </w:r>
-      <w:r>
-        <w:t xml:space="preserve">). Then, 58.0 km (36.0 mi) downstream of Callahan, it passes a key stream gauge (USGS Station ID 11519500, or the Fort Jones Gauge or FJ Gauge) and enters more rugged terrain, flowing 34.7 km (21.6 mi) through a steep canyon until it meets the Klamath River. Because practically all water use in Scott Valley occurs upgradient of the FJ Gauge, it is used to assess hydrologic conditions and inform water management decisions in the populated areas of the valley</w:t>
-      </w:r>
-      <w:r>
-        <w:t xml:space="preserve"> </w:t>
-      </w:r>
-      <w:r>
-        <w:t xml:space="preserve">(e.g., Siskiyou County 2021)</w:t>
-      </w:r>
-      <w:r>
-        <w:t xml:space="preserve">.</w:t>
+        <w:t xml:space="preserve">Scott Valley has a Mediterranean precipitation regime with distinctive seasons of cold, wet winters and warm, dry summers (Figure</w:t>
+      </w:r>
+      <w:r>
+        <w:t xml:space="preserve"> </w:t>
+      </w:r>
+      <w:r>
+        <w:t xml:space="preserve">2</w:t>
+      </w:r>
+      <w:r>
+        <w:t xml:space="preserve">), panels A and B). Melting snowpack in the surrounding mountains generates streamflow from April through July, though onset and duration of snowmelt varies based on the snowpack volume and timing of warm air temperatures. This seasonality in water input creates seasonal flow in the Scott River and tributary streams, which experience a pronounced wet season and dry season with high and low flows, respectively (Figure</w:t>
+      </w:r>
+      <w:r>
+        <w:t xml:space="preserve"> </w:t>
+      </w:r>
+      <w:r>
+        <w:t xml:space="preserve">2</w:t>
+      </w:r>
+      <w:r>
+        <w:t xml:space="preserve">, panel C).</w:t>
       </w:r>
     </w:p>
     <w:p>
@@ -588,32 +421,6 @@
         <w:pStyle w:val="BodyText"/>
       </w:pPr>
       <w:r>
-        <w:t xml:space="preserve">Scott Valley has a Mediterranean precipitation regime with distinctive seasons of cold, wet winters and warm, dry summers (Figure</w:t>
-      </w:r>
-      <w:r>
-        <w:t xml:space="preserve"> </w:t>
-      </w:r>
-      <w:r>
-        <w:t xml:space="preserve">2</w:t>
-      </w:r>
-      <w:r>
-        <w:t xml:space="preserve">), panels A and B). Melting snowpack in the surrounding mountains generates streamflow from April through July, though onset and duration of snowmelt varies based on the snowpack volume and timing of warm air temperatures. This seasonality in water input creates seasonal flow in the Scott River and tributary streams, which experience a pronounced wet season and dry season with high and low flows, respectively (Figure</w:t>
-      </w:r>
-      <w:r>
-        <w:t xml:space="preserve"> </w:t>
-      </w:r>
-      <w:r>
-        <w:t xml:space="preserve">2</w:t>
-      </w:r>
-      <w:r>
-        <w:t xml:space="preserve">, panel C).</w:t>
-      </w:r>
-    </w:p>
-    <w:p>
-      <w:pPr>
-        <w:pStyle w:val="BodyText"/>
-      </w:pPr>
-      <w:r>
         <w:t xml:space="preserve">Streams and groundwater are highly interconnected in the Scott River watershed. Tributary streams and the Scott River are a source of recharge to the aquifer, and groundwater discharge sustains streamflow in some areas, especially during the dry season of August-October or November. In the past two decades, in most dry-to-average type water years, the water table elevation has fallen below the stream bed and reaches of the Scott River have gone dry</w:t>
       </w:r>
       <w:r>
@@ -624,18 +431,6 @@
       </w:r>
       <w:r>
         <w:t xml:space="preserve">.</w:t>
-      </w:r>
-    </w:p>
-    <w:p>
-      <w:pPr>
-        <w:pStyle w:val="BodyText"/>
-      </w:pPr>
-      <w:r>
-        <w:rPr>
-          <w:b/>
-          <w:bCs/>
-        </w:rPr>
-        <w:t xml:space="preserve">TO DO: ADD 2ND y axes with degrees F and inches on fig 2</w:t>
       </w:r>
     </w:p>
     <w:p>
@@ -725,7 +520,7 @@
       </w:r>
     </w:p>
     <w:bookmarkEnd w:id="30"/>
-    <w:bookmarkStart w:id="32" w:name="X33d0072624d566dcf1fc914eaa47e60d958b5ff"/>
+    <w:bookmarkStart w:id="42" w:name="land-and-water-uses"/>
     <w:p>
       <w:pPr>
         <w:pStyle w:val="Heading2"/>
@@ -740,7 +535,7 @@
         <w:tab/>
       </w:r>
       <w:r>
-        <w:t xml:space="preserve">Human population, land use, and local economy</w:t>
+        <w:t xml:space="preserve">Land and water uses</w:t>
       </w:r>
     </w:p>
     <w:p>
@@ -748,52 +543,16 @@
         <w:pStyle w:val="FirstParagraph"/>
       </w:pPr>
       <w:r>
-        <w:t xml:space="preserve">The population of Scott Valley is approximately 5,200, based on area-weighted block-level 2020 census data, including the populations of the two incorporated towns of Etna and Fort Jones [population 678 and 695, respectively;</w:t>
-      </w:r>
-      <w:r>
-        <w:t xml:space="preserve"> </w:t>
-      </w:r>
-      <w:r>
-        <w:t xml:space="preserve">U.S. Census Bureau (2021)</w:t>
-      </w:r>
-      <w:r>
-        <w:t xml:space="preserve">]. About two thirds of the land within the Scott River watershed is under private ownership with the remaining area managed by the Quartz Valley Indian Reservation, the United States (U.S.) Department of the Interior Bureau of Land Management (BLM) and U.S. Forest Service (USFS)</w:t>
-      </w:r>
-      <w:r>
-        <w:t xml:space="preserve"> </w:t>
-      </w:r>
-      <w:r>
-        <w:t xml:space="preserve">(Harter and Hines 2008)</w:t>
-      </w:r>
-      <w:r>
-        <w:t xml:space="preserve">. Much of the upper mountainous area of the watershed is part of the Klamath National Forest. On the valley floor, according to land use surveys conducted by DWR</w:t>
-      </w:r>
-      <w:r>
-        <w:t xml:space="preserve"> </w:t>
-      </w:r>
-      <w:r>
-        <w:t xml:space="preserve">(DWR 2017)</w:t>
-      </w:r>
-      <w:r>
-        <w:t xml:space="preserve">, half of the area overlying the alluvial aquifer is covered by agriculture, with most of that split approximately evenly between pasture and an alfalfa/grain rotation (Figure</w:t>
-      </w:r>
-      <w:r>
-        <w:t xml:space="preserve"> </w:t>
-      </w:r>
-      <w:r>
-        <w:t xml:space="preserve">1</w:t>
-      </w:r>
-      <w:r>
-        <w:t xml:space="preserve">; Table</w:t>
-      </w:r>
-      <w:r>
-        <w:t xml:space="preserve"> </w:t>
-      </w:r>
-      <w:r>
-        <w:t xml:space="preserve">1</w:t>
-      </w:r>
-      <w:r>
-        <w:t xml:space="preserve">).</w:t>
+        <w:t xml:space="preserve">Because the watershed is undammed, managers and water users influence Scott River flow primarily via diversion of surface waters or pumping of groundwater. Consequently the most powerful tool available to manage Scott River water flow is regulation of land use and thus water demand</w:t>
+      </w:r>
+      <w:r>
+        <w:t xml:space="preserve"> </w:t>
+      </w:r>
+      <w:r>
+        <w:t xml:space="preserve">(Siskiyou County 2021)</w:t>
+      </w:r>
+      <w:r>
+        <w:t xml:space="preserve">.</w:t>
       </w:r>
     </w:p>
     <w:p>
@@ -801,25 +560,63 @@
         <w:pStyle w:val="BodyText"/>
       </w:pPr>
       <w:r>
-        <w:t xml:space="preserve">Fort Jones and Etna are categorized as severely economically disadvantaged (defined as communities with an annual median household income [MHI] of less than 60% of the average annual MHI in California). Based on the 2013-2017 American Community Survey Five Year Estimates, the statewide annual MHI is $67,169, and Fort Jones and Etna both qualify as SDACs with annual MHIs of $29,662 and $35,333, respectively</w:t>
-      </w:r>
-      <w:r>
-        <w:t xml:space="preserve"> </w:t>
-      </w:r>
-      <w:r>
-        <w:t xml:space="preserve">(U.S. Census Bureau 2018)</w:t>
-      </w:r>
-      <w:r>
-        <w:t xml:space="preserve">. The unincorporated community of Greenview is listed in government databases as a disadvantaged community (defined as an MHI of less than 80% of average state MHI), but no MHI data are available for this community</w:t>
-      </w:r>
-      <w:r>
-        <w:t xml:space="preserve"> </w:t>
-      </w:r>
-      <w:r>
-        <w:t xml:space="preserve">(DWR 2019)</w:t>
-      </w:r>
-      <w:r>
-        <w:t xml:space="preserve">.</w:t>
+        <w:t xml:space="preserve">About two thirds of the land within the Scott River watershed is under private ownership with the remaining area managed by the Quartz Valley Indian Reservation, the United States (U.S.) Department of the Interior Bureau of Land Management (BLM) and U.S. Forest Service (USFS)</w:t>
+      </w:r>
+      <w:r>
+        <w:t xml:space="preserve"> </w:t>
+      </w:r>
+      <w:r>
+        <w:t xml:space="preserve">(Harter and Hines 2008)</w:t>
+      </w:r>
+      <w:r>
+        <w:t xml:space="preserve">. Much of the upper mountainous area of the watershed is part of the Klamath National Forest. On the valley floor, according to land use surveys conducted by DWR</w:t>
+      </w:r>
+      <w:r>
+        <w:t xml:space="preserve"> </w:t>
+      </w:r>
+      <w:r>
+        <w:t xml:space="preserve">(DWR 2017)</w:t>
+      </w:r>
+      <w:r>
+        <w:t xml:space="preserve">, half of the area overlying the alluvial aquifer is covered by agriculture, with most of that split approximately evenly between pasture and an alfalfa/grain rotation (Figure</w:t>
+      </w:r>
+      <w:r>
+        <w:t xml:space="preserve"> </w:t>
+      </w:r>
+      <w:r>
+        <w:t xml:space="preserve">1</w:t>
+      </w:r>
+      <w:r>
+        <w:t xml:space="preserve">; Table</w:t>
+      </w:r>
+      <w:r>
+        <w:t xml:space="preserve"> </w:t>
+      </w:r>
+      <w:r>
+        <w:t xml:space="preserve">1</w:t>
+      </w:r>
+      <w:r>
+        <w:t xml:space="preserve">).</w:t>
+      </w:r>
+    </w:p>
+    <w:p>
+      <w:pPr>
+        <w:pStyle w:val="BodyText"/>
+      </w:pPr>
+      <w:r>
+        <w:t xml:space="preserve">Historically, local regulation of land use has focused on maintaining the rural and agricultural character of Scott Valley</w:t>
+      </w:r>
+      <w:r>
+        <w:t xml:space="preserve"> </w:t>
+      </w:r>
+      <w:r>
+        <w:t xml:space="preserve">(Scott Valley Area Plan Committee 1980)</w:t>
+      </w:r>
+      <w:r>
+        <w:t xml:space="preserve">. Regulating land use to improve ecological outcomes entails significant economic, political and social risks, because much of the economic activity in this area is related to agriculture. In addition, Scott River conditions influence fish population dynamics both within the watershed and in the broader Klamath system.</w:t>
+      </w:r>
+      <w:r>
+        <w:t xml:space="preserve"> </w:t>
       </w:r>
     </w:p>
     <w:p>
@@ -2231,23 +2028,22 @@
         </w:tc>
       </w:tr>
     </w:tbl>
-    <w:bookmarkEnd w:id="32"/>
-    <w:bookmarkStart w:id="43" w:name="water-uses-and-management-objectives"/>
+    <w:bookmarkStart w:id="32" w:name="environmental-stream-flows"/>
     <w:p>
       <w:pPr>
-        <w:pStyle w:val="Heading2"/>
+        <w:pStyle w:val="Heading3"/>
       </w:pPr>
       <w:r>
         <w:rPr>
           <w:rStyle w:val="SectionNumber"/>
         </w:rPr>
-        <w:t xml:space="preserve">2.3</w:t>
+        <w:t xml:space="preserve">2.2.1</w:t>
       </w:r>
       <w:r>
         <w:tab/>
       </w:r>
       <w:r>
-        <w:t xml:space="preserve">Water uses and management objectives</w:t>
+        <w:t xml:space="preserve">Environmental stream flows</w:t>
       </w:r>
     </w:p>
     <w:p>
@@ -2255,122 +2051,6 @@
         <w:pStyle w:val="FirstParagraph"/>
       </w:pPr>
       <w:r>
-        <w:t xml:space="preserve">Like many rural watersheds in arid to semi-arid regions, balancing environmental and agricultural water demands is a significant challenge faced by local water managers. Water uses, land management, and the measurement units used in local regulatory documents were discussed in Chapter 1 of this dissertation:</w:t>
-      </w:r>
-    </w:p>
-    <w:p>
-      <w:pPr>
-        <w:pStyle w:val="BlockText"/>
-      </w:pPr>
-      <w:r>
-        <w:t xml:space="preserve">“Water in Scott Valley is used for agricultural, domestic, and municipal supply. It also facilitates recreation and provides Native American cultural services, among other designated beneficial uses</w:t>
-      </w:r>
-      <w:r>
-        <w:t xml:space="preserve"> </w:t>
-      </w:r>
-      <w:r>
-        <w:t xml:space="preserve">(NCRWQCB 2006)</w:t>
-      </w:r>
-      <w:r>
-        <w:t xml:space="preserve">. Because the watershed is undammed, managers and water users influence Scott River flow primarily via diversion of surface waters or pumping of groundwater. Consequently the most powerful tool available to manage Scott River water flow is regulation of land use and thus water demand</w:t>
-      </w:r>
-      <w:r>
-        <w:t xml:space="preserve"> </w:t>
-      </w:r>
-      <w:r>
-        <w:t xml:space="preserve">(Siskiyou County 2021)</w:t>
-      </w:r>
-      <w:r>
-        <w:t xml:space="preserve">.</w:t>
-      </w:r>
-    </w:p>
-    <w:p>
-      <w:pPr>
-        <w:pStyle w:val="BlockText"/>
-      </w:pPr>
-      <w:r>
-        <w:t xml:space="preserve">Historically, local regulation of land use has focused on maintaining the rural and agricultural character of Scott Valley</w:t>
-      </w:r>
-      <w:r>
-        <w:t xml:space="preserve"> </w:t>
-      </w:r>
-      <w:r>
-        <w:t xml:space="preserve">(Scott Valley Area Plan Committee 1980)</w:t>
-      </w:r>
-      <w:r>
-        <w:t xml:space="preserve">. Regulating land use to improve ecological outcomes would entail significant economic, political and social risks, because much of the economic activity in this area is related to agriculture. The primary crops grown in Scott Valley are alfalfa and pasture for cattle feed</w:t>
-      </w:r>
-      <w:r>
-        <w:t xml:space="preserve"> </w:t>
-      </w:r>
-      <w:r>
-        <w:t xml:space="preserve">(Siskiyou County 2021)</w:t>
-      </w:r>
-      <w:r>
-        <w:t xml:space="preserve">. In addition to local economic impact, Scott River conditions influence fish population dynamics both within the watershed and in the broader Klamath system. The health of the Klamath salmon run has implications for commercial fishing, recreational activities, and cultural practices of Native American tribes in the region, including the Quartz Valley Indian Community and the Karuk and Yurok Tribes</w:t>
-      </w:r>
-      <w:r>
-        <w:t xml:space="preserve"> </w:t>
-      </w:r>
-      <w:r>
-        <w:t xml:space="preserve">(Graham 2012)</w:t>
-      </w:r>
-      <w:r>
-        <w:t xml:space="preserve">.</w:t>
-      </w:r>
-    </w:p>
-    <w:p>
-      <w:pPr>
-        <w:pStyle w:val="BlockText"/>
-      </w:pPr>
-      <w:r>
-        <w:t xml:space="preserve">All of the regulatory and management programs in this region, including recommended instream flows</w:t>
-      </w:r>
-      <w:r>
-        <w:t xml:space="preserve"> </w:t>
-      </w:r>
-      <w:r>
-        <w:t xml:space="preserve">(CDFW 2017)</w:t>
-      </w:r>
-      <w:r>
-        <w:t xml:space="preserve"> </w:t>
-      </w:r>
-      <w:r>
-        <w:t xml:space="preserve">and legal rights governing surface water diversion</w:t>
-      </w:r>
-      <w:r>
-        <w:t xml:space="preserve"> </w:t>
-      </w:r>
-      <w:r>
-        <w:t xml:space="preserve">(Superior Court of Siskiyou County 1980)</w:t>
-      </w:r>
-      <w:r>
-        <w:t xml:space="preserve">, are tabulated in units of cubic feet per second (cfs). For consistency, this document will also use primarily cfs units, with metric units in parentheses.”</w:t>
-      </w:r>
-    </w:p>
-    <w:bookmarkStart w:id="33" w:name="environmental-stream-flows"/>
-    <w:p>
-      <w:pPr>
-        <w:pStyle w:val="Heading3"/>
-      </w:pPr>
-      <w:r>
-        <w:rPr>
-          <w:rStyle w:val="SectionNumber"/>
-        </w:rPr>
-        <w:t xml:space="preserve">2.3.1</w:t>
-      </w:r>
-      <w:r>
-        <w:tab/>
-      </w:r>
-      <w:r>
-        <w:t xml:space="preserve">Environmental stream flows</w:t>
-      </w:r>
-    </w:p>
-    <w:p>
-      <w:pPr>
-        <w:pStyle w:val="FirstParagraph"/>
-      </w:pPr>
-      <w:r>
         <w:t xml:space="preserve">Sufficient environmental flows at certain times of year are necessary to the survival of vulnerable species in the Scott River watershed. Coho salmon (</w:t>
       </w:r>
       <w:r>
@@ -2398,7 +2078,16 @@
         <w:pStyle w:val="BodyText"/>
       </w:pPr>
       <w:r>
-        <w:t xml:space="preserve">To complete their life cycle, coho salmon require several key functional flows in the Scott Valley freshwater stream system, including the following:</w:t>
+        <w:t xml:space="preserve">To complete their life cycle, coho salmon require several key functional flows in the Scott Valley freshwater stream system</w:t>
+      </w:r>
+      <w:r>
+        <w:t xml:space="preserve"> </w:t>
+      </w:r>
+      <w:r>
+        <w:t xml:space="preserve">(Kouba et al. 2025)</w:t>
+      </w:r>
+      <w:r>
+        <w:t xml:space="preserve">, including the following:</w:t>
       </w:r>
     </w:p>
     <w:p>
@@ -2410,7 +2099,7 @@
         </w:numPr>
       </w:pPr>
       <w:r>
-        <w:t xml:space="preserve">Fall flows, increasing after the dry season in response to early wet season storms, that occur early enough to provide adult fall-run spawners access to preferred spawning reaches</w:t>
+        <w:t xml:space="preserve">Fall flows, increasing after the dry season in response to early wet season storms, that occur early enough to provide adult fall-run spawners access to preferred spawning reaches;</w:t>
       </w:r>
     </w:p>
     <w:p>
@@ -2422,7 +2111,7 @@
         </w:numPr>
       </w:pPr>
       <w:r>
-        <w:t xml:space="preserve">Flows providing habitat for rearing juvenile salmon for their ~12-15 months of freshwater residence</w:t>
+        <w:t xml:space="preserve">Flows providing habitat for rearing juvenile salmon for their ~12-15 months of freshwater residence; and</w:t>
       </w:r>
     </w:p>
     <w:p>
@@ -2434,7 +2123,7 @@
         </w:numPr>
       </w:pPr>
       <w:r>
-        <w:t xml:space="preserve">Sufficient flow in the spring for yearling smolts to emigrate to the ocean</w:t>
+        <w:t xml:space="preserve">Sufficient flow in the spring for yearling smolts to migrate to the ocean.</w:t>
       </w:r>
     </w:p>
     <w:p>
@@ -2442,20 +2131,29 @@
         <w:pStyle w:val="FirstParagraph"/>
       </w:pPr>
       <w:r>
-        <w:t xml:space="preserve">Other species may require other functional flows [e.g., cottonwood trees require flood-stage flows to disperse their seeds;</w:t>
-      </w:r>
-      <w:r>
-        <w:t xml:space="preserve"> </w:t>
-      </w:r>
-      <w:r>
-        <w:t xml:space="preserve">Mahoney and Rood (1998)</w:t>
-      </w:r>
-      <w:r>
-        <w:t xml:space="preserve">], but in this work we focus on coho salmon, the most vulnerable species in the watershed. Future work could evaluate the suite of flows needed by a larger set of species in Scott Valley.</w:t>
+        <w:t xml:space="preserve">Different functional flows are needed by other fish, such as Chinook</w:t>
+      </w:r>
+      <w:r>
+        <w:t xml:space="preserve"> </w:t>
+      </w:r>
+      <w:r>
+        <w:t xml:space="preserve">(Kouba et al. 2025)</w:t>
+      </w:r>
+      <w:r>
+        <w:t xml:space="preserve">; as well other species, such as cottonwood trees, which require flood-stage flows to disperse their seeds</w:t>
+      </w:r>
+      <w:r>
+        <w:t xml:space="preserve"> </w:t>
+      </w:r>
+      <w:r>
+        <w:t xml:space="preserve">(Mahoney and Rood 1998)</w:t>
+      </w:r>
+      <w:r>
+        <w:t xml:space="preserve">; but in this work we focus on coho salmon as a straightforward examlple in developing an environmental objective function. Alternative objective function formulations are discussed in later sections.</w:t>
       </w:r>
     </w:p>
-    <w:bookmarkEnd w:id="33"/>
-    <w:bookmarkStart w:id="42" w:name="agricultural-water-demand"/>
+    <w:bookmarkEnd w:id="32"/>
+    <w:bookmarkStart w:id="41" w:name="agricultural-water-demand"/>
     <w:p>
       <w:pPr>
         <w:pStyle w:val="Heading3"/>
@@ -2464,7 +2162,7 @@
         <w:rPr>
           <w:rStyle w:val="SectionNumber"/>
         </w:rPr>
-        <w:t xml:space="preserve">2.3.2</w:t>
+        <w:t xml:space="preserve">2.2.2</w:t>
       </w:r>
       <w:r>
         <w:tab/>
@@ -2478,7 +2176,7 @@
         <w:pStyle w:val="FirstParagraph"/>
       </w:pPr>
       <w:r>
-        <w:t xml:space="preserve">Agricultural water demand in Scott Valley has been simulated for a historical model period of water years 1991-2018 (Oct. 1 of 1990 to Sept. 30 of 2018), using the calibrated Scott Valley Integrated Hydrologic Model [SVIHM;</w:t>
+        <w:t xml:space="preserve">Agricultural water demand in Scott Valley has been simulated for a historical model period of water years 1991-2018 (Oct. 1 of 1990 to Sept. 30 of 2025), using the calibrated Scott Valley Integrated Hydrologic Model [SVIHM;</w:t>
       </w:r>
       <w:r>
         <w:t xml:space="preserve"> </w:t>
@@ -2557,29 +2255,6 @@
         <w:pStyle w:val="BodyText"/>
       </w:pPr>
       <w:r>
-        <w:t xml:space="preserve">In the mid-twentieth century, farms and ranches irrigated grain, alfalfa and pasture crops mainly with diverted surface water, which was abundant until mid or late summer, and many utilized flood irrigation. On this schedule two alfalfa cuttings were harvested, with the last irrigation typically occurring in July. Since the 1970s, widespread construction of irrigation wells has effectively extended the irrigation season and allowed alfalfa farmers to harvest three or four cuttings in a growing season. (Additionally, higher-irrigation efficiency technology like wheel-line and center-pivot sprinklers became common, though this does not alter the consumptive demand of the cultivated crops.) Based on historical crop coverage and water demand estimates by Harter and Hines</w:t>
-      </w:r>
-      <w:r>
-        <w:t xml:space="preserve"> </w:t>
-      </w:r>
-      <w:r>
-        <w:t xml:space="preserve">(2008)</w:t>
-      </w:r>
-      <w:r>
-        <w:t xml:space="preserve">,</w:t>
-      </w:r>
-      <w:r>
-        <w:t xml:space="preserve"> </w:t>
-      </w:r>
-      <w:r>
-        <w:t xml:space="preserve">“the amount of water likely used by crops has increased from 1958 to 2000 by between 15 percent (10,000 more acre feet) and 30 percent (20,000 acre feet) depending on the date when surface irrigation [is assumed to have ceased historically], i.e. July 15, Aug 1 or Aug 15.”</w:t>
-      </w:r>
-    </w:p>
-    <w:p>
-      <w:pPr>
-        <w:pStyle w:val="BodyText"/>
-      </w:pPr>
-      <w:r>
         <w:t xml:space="preserve">The tension between agricultural and ecological water demands is highest at the end of the dry season, when groundwater elevations and surface flows are at their lowest, crop demand remains high, and anadromous fish require access to spawning habitat. The management of these fall flows was a central concern of GSP development in 2018-2021.</w:t>
       </w:r>
     </w:p>
@@ -2592,18 +2267,18 @@
           <wp:inline>
             <wp:extent cx="5334000" cy="3048000"/>
             <wp:effectExtent b="0" l="0" r="0" t="0"/>
-            <wp:docPr descr="Figure 3:  Average monthly water budget for the soil zone, simulated with SVIHM, for the model simulation period (water years 1991-2018). Positive and negative values indicate average net monthly fluxes into and out of the soil zone, respectively." title="" id="35" name="Picture"/>
+            <wp:docPr descr="Figure 3:  Average monthly water budget for the soil zone, simulated with SVIHM, for the model simulation period (water years 1991-2018). Positive and negative values indicate average net monthly fluxes into and out of the soil zone, respectively." title="" id="34" name="Picture"/>
             <a:graphic>
               <a:graphicData uri="http://schemas.openxmlformats.org/drawingml/2006/picture">
                 <pic:pic>
                   <pic:nvPicPr>
-                    <pic:cNvPr descr="Graphics%20and%20Supplements/Figure%202.png" id="36" name="Picture"/>
+                    <pic:cNvPr descr="Graphics%20and%20Supplements/Figure%202.png" id="35" name="Picture"/>
                     <pic:cNvPicPr>
                       <a:picLocks noChangeArrowheads="1" noChangeAspect="1"/>
                     </pic:cNvPicPr>
                   </pic:nvPicPr>
                   <pic:blipFill>
-                    <a:blip r:embed="rId34"/>
+                    <a:blip r:embed="rId33"/>
                     <a:stretch>
                       <a:fillRect/>
                     </a:stretch>
@@ -2634,8 +2309,8 @@
       <w:pPr>
         <w:pStyle w:val="ImageCaption"/>
       </w:pPr>
-      <w:bookmarkStart w:id="37" w:name="fig:avgWaterBudgetFig"/>
-      <w:bookmarkEnd w:id="37"/>
+      <w:bookmarkStart w:id="36" w:name="fig:avgWaterBudgetFig"/>
+      <w:bookmarkEnd w:id="36"/>
       <w:r>
         <w:t xml:space="preserve">Figure 3:</w:t>
       </w:r>
@@ -2678,18 +2353,18 @@
           <wp:inline>
             <wp:extent cx="5334000" cy="3048000"/>
             <wp:effectExtent b="0" l="0" r="0" t="0"/>
-            <wp:docPr descr="Figure 4:  Annual values for inflowing (positive) and outflowing (negative) water budget components in the SVIHM soil zone (historical basecase simulation). Irrigation refers to both groundwater and surface water sources; Recharge refers to water percolating through the soil column and recharging the aquifer below. Both crop ET and ET from native vegetation remain relatively stable year to year, while precipitation inputs, and thus recharge to the aquifer, have higher interannual variability." title="" id="39" name="Picture"/>
+            <wp:docPr descr="Figure 4:  Annual values for inflowing (positive) and outflowing (negative) water budget components in the SVIHM soil zone (historical basecase simulation). Irrigation refers to both groundwater and surface water sources; Recharge refers to water percolating through the soil column and recharging the aquifer below. Both crop ET and ET from native vegetation remain relatively stable year to year, while precipitation inputs, and thus recharge to the aquifer, have higher interannual variability." title="" id="38" name="Picture"/>
             <a:graphic>
               <a:graphicData uri="http://schemas.openxmlformats.org/drawingml/2006/picture">
                 <pic:pic>
                   <pic:nvPicPr>
-                    <pic:cNvPr descr="Graphics%20and%20Supplements/Figure%203.png" id="40" name="Picture"/>
+                    <pic:cNvPr descr="Graphics%20and%20Supplements/Figure%203.png" id="39" name="Picture"/>
                     <pic:cNvPicPr>
                       <a:picLocks noChangeArrowheads="1" noChangeAspect="1"/>
                     </pic:cNvPicPr>
                   </pic:nvPicPr>
                   <pic:blipFill>
-                    <a:blip r:embed="rId38"/>
+                    <a:blip r:embed="rId37"/>
                     <a:stretch>
                       <a:fillRect/>
                     </a:stretch>
@@ -2720,8 +2395,8 @@
       <w:pPr>
         <w:pStyle w:val="ImageCaption"/>
       </w:pPr>
-      <w:bookmarkStart w:id="41" w:name="fig:annualSWBMBudget"/>
-      <w:bookmarkEnd w:id="41"/>
+      <w:bookmarkStart w:id="40" w:name="fig:annualSWBMBudget"/>
+      <w:bookmarkEnd w:id="40"/>
       <w:r>
         <w:t xml:space="preserve">Figure 4:</w:t>
       </w:r>
@@ -2735,9 +2410,9 @@
         <w:t xml:space="preserve">Annual values for inflowing (positive) and outflowing (negative) water budget components in the SVIHM soil zone (historical basecase simulation). Irrigation refers to both groundwater and surface water sources; Recharge refers to water percolating through the soil column and recharging the aquifer below. Both crop ET and ET from native vegetation remain relatively stable year to year, while precipitation inputs, and thus recharge to the aquifer, have higher interannual variability.</w:t>
       </w:r>
     </w:p>
+    <w:bookmarkEnd w:id="41"/>
     <w:bookmarkEnd w:id="42"/>
-    <w:bookmarkEnd w:id="43"/>
-    <w:bookmarkStart w:id="44" w:name="gsp-development"/>
+    <w:bookmarkStart w:id="43" w:name="gsp-development"/>
     <w:p>
       <w:pPr>
         <w:pStyle w:val="Heading2"/>
@@ -2746,7 +2421,7 @@
         <w:rPr>
           <w:rStyle w:val="SectionNumber"/>
         </w:rPr>
-        <w:t xml:space="preserve">2.4</w:t>
+        <w:t xml:space="preserve">2.3</w:t>
       </w:r>
       <w:r>
         <w:tab/>
@@ -2818,8 +2493,8 @@
         <w:t xml:space="preserve">, as described below.</w:t>
       </w:r>
     </w:p>
-    <w:bookmarkEnd w:id="44"/>
-    <w:bookmarkStart w:id="45" w:name="hydrologic-model-summary"/>
+    <w:bookmarkEnd w:id="43"/>
+    <w:bookmarkStart w:id="44" w:name="hydrologic-model-summary"/>
     <w:p>
       <w:pPr>
         <w:pStyle w:val="Heading2"/>
@@ -2828,7 +2503,7 @@
         <w:rPr>
           <w:rStyle w:val="SectionNumber"/>
         </w:rPr>
-        <w:t xml:space="preserve">2.5</w:t>
+        <w:t xml:space="preserve">2.4</w:t>
       </w:r>
       <w:r>
         <w:tab/>
@@ -2842,7 +2517,19 @@
         <w:pStyle w:val="FirstParagraph"/>
       </w:pPr>
       <w:r>
-        <w:t xml:space="preserve">The Scott Valley Integrated Hydrologic Model (SVIHM) is a surface and groundwater model driven by tributary stream inflows, precipitation inputs, and reference evapotranspiration (ET</w:t>
+        <w:t xml:space="preserve">The Scott Valley Integrated Hydrologic Model (SVIHM)</w:t>
+      </w:r>
+      <w:r>
+        <w:t xml:space="preserve"> </w:t>
+      </w:r>
+      <w:r>
+        <w:t xml:space="preserve">(2019)</w:t>
+      </w:r>
+      <w:r>
+        <w:t xml:space="preserve"> </w:t>
+      </w:r>
+      <w:r>
+        <w:t xml:space="preserve">is a surface and groundwater model driven by tributary stream inflows, precipitation inputs, and reference evapotranspiration (ET</w:t>
       </w:r>
       <w:r>
         <w:rPr>
@@ -2851,16 +2538,7 @@
         <w:t xml:space="preserve">0</w:t>
       </w:r>
       <w:r>
-        <w:t xml:space="preserve">). The boundary of the model domain corresponds approximately to the extent of the alluvial aquifer. For detailed information about the model structure, sensitivity, calibration, uncertainty, and validation of results, see recent work by Tolley et al.</w:t>
-      </w:r>
-      <w:r>
-        <w:t xml:space="preserve"> </w:t>
-      </w:r>
-      <w:r>
-        <w:t xml:space="preserve">(2019)</w:t>
-      </w:r>
-      <w:r>
-        <w:t xml:space="preserve">. Like all models, it does not perfectly reproduce observed historical measurements, but it successfully captures key watershed-scale hydrologic phenomena that can be used to evaluate potential outcomes of specific management actions.</w:t>
+        <w:t xml:space="preserve">). Like all models, it does not perfectly reproduce observed historical measurements, but it successfully captures key watershed-scale hydrologic phenomena that can be used to evaluate potential outcomes of specific management actions.</w:t>
       </w:r>
     </w:p>
     <w:p>
@@ -2894,7 +2572,7 @@
         <w:pStyle w:val="BodyText"/>
       </w:pPr>
       <w:r>
-        <w:t xml:space="preserve">For GSP development, SVIHM was used extensively to perform what-if scenarios using the historic climate and land use forcing period, 1991-2018. Scenario simulations repeat the calibrated historical basecase simulation of SVIHM using specified sets of changes in SVIHM boundary conditions (BCs). The set of changes in the BCs of a particular scenario represent specific changes in land use, irrigation management, climate, water management rules, etc. Scenario outcomes are compared against those of the basecase simulation. Key results of each SVIHM scenario, used in the objective functions described below, are:</w:t>
+        <w:t xml:space="preserve">For GSP development, SVIHM was used extensively to perform what-if scenarios using the historic climate and land use forcing period, 1991-2018. (For purposes of this study, the model period has been extended through Sept. 30, 2025.) Scenario simulations repeat the calibrated historical basecase simulation of SVIHM using specified sets of changes in SVIHM boundary conditions (BCs). The set of changes in the BCs of a particular scenario represent specific changes in land use, irrigation management, climate, water management rules, etc. Scenario outcomes are compared against those of the basecase simulation. Key results of each SVIHM scenario, used in the objective functions described below, are:</w:t>
       </w:r>
     </w:p>
     <w:p>
@@ -2921,9 +2599,9 @@
         <w:t xml:space="preserve">Simulated total ET of crops and native vegetation within the model domain.</w:t>
       </w:r>
     </w:p>
+    <w:bookmarkEnd w:id="44"/>
     <w:bookmarkEnd w:id="45"/>
-    <w:bookmarkEnd w:id="46"/>
-    <w:bookmarkStart w:id="80" w:name="methods"/>
+    <w:bookmarkStart w:id="79" w:name="methods"/>
     <w:p>
       <w:pPr>
         <w:pStyle w:val="Heading1"/>
@@ -2946,41 +2624,77 @@
         <w:pStyle w:val="FirstParagraph"/>
       </w:pPr>
       <w:r>
-        <w:t xml:space="preserve">We developed two objective functions and one categorical objective proxy to evaluate the management scenarios developed for the GSP. The three objectives were: maximizing specific environmental flows, maintain current levels of agricultural productivity (represented as minimizing reduction in agricultural water use), and minimizing new infrastructure costs (represented as a categorical infrastructure/feasibility proxy) (Table</w:t>
-      </w:r>
-      <w:r>
-        <w:t xml:space="preserve"> </w:t>
-      </w:r>
-      <w:r>
-        <w:t xml:space="preserve">2</w:t>
-      </w:r>
-      <w:r>
-        <w:t xml:space="preserve">). We then applied these to the results of each simulated management scenario, found the Pareto-optimal set of scenarios, and compared them to the prioritization of management actions adopted in the GSP</w:t>
-      </w:r>
-      <w:r>
-        <w:t xml:space="preserve"> </w:t>
-      </w:r>
-      <w:r>
-        <w:t xml:space="preserve">(Siskiyou County 2021)</w:t>
-      </w:r>
-      <w:r>
-        <w:t xml:space="preserve">.</w:t>
+        <w:t xml:space="preserve">We developed two objective functions and one categorical objective proxy to evaluate the management scenarios developed for the GSP. The three objectives were:</w:t>
       </w:r>
     </w:p>
     <w:p>
       <w:pPr>
-        <w:pStyle w:val="BodyText"/>
+        <w:pStyle w:val="Compact"/>
+        <w:numPr>
+          <w:ilvl w:val="0"/>
+          <w:numId w:val="1003"/>
+        </w:numPr>
       </w:pPr>
       <w:r>
-        <w:t xml:space="preserve">We should note that protecting domestic water use was also discussed as a management objective, but this was not evaluated as an objective function in management scenarios, for three main reasons: it was assumed that solving the environmental flows problem would intrinsically keep groundwater levels sufficiently high to protect domestic groundwater use from well outages; the number of reported well outages in recent dry years was minimal; and the data necessary to assess domestic well outages (specifically, total well depth and pump depth information) was available only for a small number of wells.</w:t>
+        <w:t xml:space="preserve">maximize specific environmental flows,</w:t>
+      </w:r>
+    </w:p>
+    <w:p>
+      <w:pPr>
+        <w:pStyle w:val="Compact"/>
+        <w:numPr>
+          <w:ilvl w:val="0"/>
+          <w:numId w:val="1003"/>
+        </w:numPr>
+      </w:pPr>
+      <w:r>
+        <w:t xml:space="preserve">maintain current levels of agricultural productivity (represented as minimizing reduction in agricultural water use), and</w:t>
+      </w:r>
+    </w:p>
+    <w:p>
+      <w:pPr>
+        <w:pStyle w:val="Compact"/>
+        <w:numPr>
+          <w:ilvl w:val="0"/>
+          <w:numId w:val="1003"/>
+        </w:numPr>
+      </w:pPr>
+      <w:r>
+        <w:t xml:space="preserve">minimize new infrastructure costs (represented as a categorical infrastructure/feasibility proxy) (Table</w:t>
+      </w:r>
+      <w:r>
+        <w:t xml:space="preserve"> </w:t>
+      </w:r>
+      <w:r>
+        <w:t xml:space="preserve">2</w:t>
+      </w:r>
+      <w:r>
+        <w:t xml:space="preserve">).</w:t>
+      </w:r>
+    </w:p>
+    <w:p>
+      <w:pPr>
+        <w:pStyle w:val="FirstParagraph"/>
+      </w:pPr>
+      <w:r>
+        <w:t xml:space="preserve">We then applied these to the results of each simulated management scenario, found the Pareto-optimal set of scenarios, and compared them to the prioritization of management actions adopted in the GSP</w:t>
+      </w:r>
+      <w:r>
+        <w:t xml:space="preserve"> </w:t>
+      </w:r>
+      <w:r>
+        <w:t xml:space="preserve">(Siskiyou County 2021)</w:t>
+      </w:r>
+      <w:r>
+        <w:t xml:space="preserve">.</w:t>
       </w:r>
     </w:p>
     <w:p>
       <w:pPr>
         <w:pStyle w:val="TableCaption"/>
       </w:pPr>
-      <w:bookmarkStart w:id="47" w:name="tab:objFunctionTable"/>
-      <w:bookmarkEnd w:id="47"/>
+      <w:bookmarkStart w:id="46" w:name="tab:objFunctionTable"/>
+      <w:bookmarkEnd w:id="46"/>
       <w:r>
         <w:t xml:space="preserve">Table 2:</w:t>
       </w:r>
@@ -3379,7 +3093,7 @@
         </w:tc>
       </w:tr>
     </w:tbl>
-    <w:bookmarkStart w:id="52" w:name="objective-functions"/>
+    <w:bookmarkStart w:id="51" w:name="objective-functions"/>
     <w:p>
       <w:pPr>
         <w:pStyle w:val="Heading2"/>
@@ -3397,7 +3111,7 @@
         <w:t xml:space="preserve">Objective functions</w:t>
       </w:r>
     </w:p>
-    <w:bookmarkStart w:id="49" w:name="hydrologic-benefit-function"/>
+    <w:bookmarkStart w:id="48" w:name="hydrologic-benefit-function"/>
     <w:p>
       <w:pPr>
         <w:pStyle w:val="Heading3"/>
@@ -3420,210 +3134,46 @@
         <w:pStyle w:val="FirstParagraph"/>
       </w:pPr>
       <w:r>
-        <w:t xml:space="preserve">In Chapter 1 of this dissertation, we showed that the degree to which the water year provided ecological services needed by coho salmon can be estimated using a Hydrologic Benefit (HB) function, which summarizes environmental flows in a single index value for a given water year. A set of streamflow metrics related to the timing, amplitude, and duration of flow phenomena were weighted according to their power to predict salmon coho smolt production per female spawner. These weighted metrics are combined linearly to predict a value for coho salmon reproduction. See Chapter 1 for more details on these calculations. Specifically, the HB function predicts a higher number of coho salmon produced per female spawner (coho smolts per female, or coho spf-equivalent) when fall flows rise above 10 and 100 cfs earlier in the fall, when the wet season onset is earlier, and when the wet season duration is longer. The equation to calculate the HB value for a given water year is as follows:</w:t>
+        <w:t xml:space="preserve">In previous work</w:t>
+      </w:r>
+      <w:r>
+        <w:t xml:space="preserve"> </w:t>
+      </w:r>
+      <w:r>
+        <w:t xml:space="preserve">(Kouba et al. 2025)</w:t>
+      </w:r>
+      <w:r>
+        <w:t xml:space="preserve">, we showed that the degree to which the water year provided ecological services needed by coho salmon can be empirically estimated using a Hydrologic Benefit (HB) function, which is represented as a linear combination of annual functional flow values. A set of streamflow metrics related to the timing, amplitude, and duration of flow phenomena were weighted according to their power to predict coho smolt production per female spawner. The combination of these weighted metrics can be interpreted as a prediction of coho salmon reproduction</w:t>
+      </w:r>
+      <w:r>
+        <w:t xml:space="preserve"> </w:t>
+      </w:r>
+      <w:r>
+        <w:rPr>
+          <w:i/>
+          <w:iCs/>
+        </w:rPr>
+        <w:t xml:space="preserve">due to hydrologic factors</w:t>
+      </w:r>
+      <w:r>
+        <w:t xml:space="preserve">. Importantly, the HB function selected for this exercise only explains about 60% of variation in observed smolt abundance, and the remaining 40% of variation is related to other life conditions, e.g., number of returning spawners, water quality, food resources, and internal fishery population dynamics.</w:t>
       </w:r>
     </w:p>
     <w:p>
       <w:pPr>
         <w:pStyle w:val="BodyText"/>
       </w:pPr>
-      <m:oMathPara>
-        <m:oMathParaPr>
-          <m:jc m:val="center"/>
-        </m:oMathParaPr>
-        <m:oMath>
-          <m:r>
-            <m:t>H</m:t>
-          </m:r>
-          <m:sSub>
-            <m:e>
-              <m:r>
-                <m:t>B</m:t>
-              </m:r>
-            </m:e>
-            <m:sub>
-              <m:r>
-                <m:t>w</m:t>
-              </m:r>
-              <m:r>
-                <m:t>y</m:t>
-              </m:r>
-            </m:sub>
-          </m:sSub>
-          <m:r>
-            <m:rPr>
-              <m:sty m:val="p"/>
-            </m:rPr>
-            <m:t>=</m:t>
-          </m:r>
-          <m:r>
-            <m:t>b</m:t>
-          </m:r>
-          <m:r>
-            <m:rPr>
-              <m:sty m:val="p"/>
-            </m:rPr>
-            <m:t>+</m:t>
-          </m:r>
-          <m:sSub>
-            <m:e>
-              <m:r>
-                <m:t>m</m:t>
-              </m:r>
-            </m:e>
-            <m:sub>
-              <m:r>
-                <m:t>1</m:t>
-              </m:r>
-            </m:sub>
-          </m:sSub>
-          <m:r>
-            <m:rPr>
-              <m:sty m:val="p"/>
-            </m:rPr>
-            <m:t>*</m:t>
-          </m:r>
-          <m:r>
-            <m:t>m</m:t>
-          </m:r>
-          <m:r>
-            <m:t>e</m:t>
-          </m:r>
-          <m:r>
-            <m:t>t</m:t>
-          </m:r>
-          <m:r>
-            <m:t>r</m:t>
-          </m:r>
-          <m:r>
-            <m:t>i</m:t>
-          </m:r>
-          <m:sSub>
-            <m:e>
-              <m:r>
-                <m:t>c</m:t>
-              </m:r>
-            </m:e>
-            <m:sub>
-              <m:r>
-                <m:t>1</m:t>
-              </m:r>
-              <m:r>
-                <m:rPr>
-                  <m:sty m:val="p"/>
-                </m:rPr>
-                <m:t>,</m:t>
-              </m:r>
-              <m:r>
-                <m:t> </m:t>
-              </m:r>
-              <m:r>
-                <m:t>w</m:t>
-              </m:r>
-              <m:r>
-                <m:t>y</m:t>
-              </m:r>
-            </m:sub>
-          </m:sSub>
-          <m:r>
-            <m:rPr>
-              <m:sty m:val="p"/>
-            </m:rPr>
-            <m:t>+</m:t>
-          </m:r>
-          <m:r>
-            <m:rPr>
-              <m:sty m:val="p"/>
-            </m:rPr>
-            <m:t>.</m:t>
-          </m:r>
-          <m:r>
-            <m:rPr>
-              <m:sty m:val="p"/>
-            </m:rPr>
-            <m:t>.</m:t>
-          </m:r>
-          <m:r>
-            <m:rPr>
-              <m:sty m:val="p"/>
-            </m:rPr>
-            <m:t>.</m:t>
-          </m:r>
-          <m:r>
-            <m:rPr>
-              <m:sty m:val="p"/>
-            </m:rPr>
-            <m:t>+</m:t>
-          </m:r>
-          <m:sSub>
-            <m:e>
-              <m:r>
-                <m:t>m</m:t>
-              </m:r>
-            </m:e>
-            <m:sub>
-              <m:r>
-                <m:t>4</m:t>
-              </m:r>
-            </m:sub>
-          </m:sSub>
-          <m:r>
-            <m:rPr>
-              <m:sty m:val="p"/>
-            </m:rPr>
-            <m:t>*</m:t>
-          </m:r>
-          <m:r>
-            <m:t>m</m:t>
-          </m:r>
-          <m:r>
-            <m:t>e</m:t>
-          </m:r>
-          <m:r>
-            <m:t>t</m:t>
-          </m:r>
-          <m:r>
-            <m:t>r</m:t>
-          </m:r>
-          <m:r>
-            <m:t>i</m:t>
-          </m:r>
-          <m:sSub>
-            <m:e>
-              <m:r>
-                <m:t>c</m:t>
-              </m:r>
-            </m:e>
-            <m:sub>
-              <m:r>
-                <m:t>4</m:t>
-              </m:r>
-              <m:r>
-                <m:rPr>
-                  <m:sty m:val="p"/>
-                </m:rPr>
-                <m:t>,</m:t>
-              </m:r>
-              <m:r>
-                <m:t> </m:t>
-              </m:r>
-              <m:r>
-                <m:t>w</m:t>
-              </m:r>
-              <m:r>
-                <m:t>y</m:t>
-              </m:r>
-            </m:sub>
-          </m:sSub>
-        </m:oMath>
-      </m:oMathPara>
-    </w:p>
-    <w:p>
-      <w:pPr>
-        <w:pStyle w:val="FirstParagraph"/>
-      </w:pPr>
-      <w:r>
-        <w:t xml:space="preserve">Where:</w:t>
+      <w:r>
+        <w:t xml:space="preserve">Specifically, the HB function predicts a higher number of coho smolt produced (coho smolt-equivalent) is related to higher fall flows during a cohort’s parents’ spawning, lower fall flows during a cohort’s time as overwintering yearlings, and a slower spring recession (see intercept and coefficient values in Table</w:t>
+      </w:r>
+      <w:r>
+        <w:t xml:space="preserve"> </w:t>
+      </w:r>
+      <w:r>
+        <w:t xml:space="preserve">3</w:t>
+      </w:r>
+      <w:r>
+        <w:t xml:space="preserve">).</w:t>
       </w:r>
     </w:p>
     <w:p>
@@ -3635,15 +3185,15 @@
           <w:b/>
           <w:bCs/>
         </w:rPr>
-        <w:t xml:space="preserve">TO DO: ADD MATH TERMS IN TABLE</w:t>
+        <w:t xml:space="preserve">language on selecting smolt based on hydro only predictors, and only for coho</w:t>
       </w:r>
     </w:p>
     <w:p>
       <w:pPr>
         <w:pStyle w:val="TableCaption"/>
       </w:pPr>
-      <w:bookmarkStart w:id="48" w:name="tab:coefTab"/>
-      <w:bookmarkEnd w:id="48"/>
+      <w:bookmarkStart w:id="47" w:name="tab:coefTab"/>
+      <w:bookmarkEnd w:id="47"/>
       <w:r>
         <w:t xml:space="preserve">Table 3:</w:t>
       </w:r>
@@ -3651,7 +3201,7 @@
         <w:t xml:space="preserve"> </w:t>
       </w:r>
       <w:r>
-        <w:t xml:space="preserve">REPLACE CAPTION. </w:t>
+        <w:t xml:space="preserve">Coefficients for the Hydrologic Benefit function, an emperical estimate of ecological services provided to coho salmon by specific functional flows. The predicted value is in units of log10(coho smolt) produced due to hydrologic factors.</w:t>
       </w:r>
     </w:p>
     <w:tbl xmlns:w="http://schemas.openxmlformats.org/wordprocessingml/2006/main" xmlns:r="http://schemas.openxmlformats.org/officeDocument/2006/relationships" xmlns:w14="http://schemas.microsoft.com/office/word/2010/wordml" xmlns:wp="http://schemas.openxmlformats.org/drawingml/2006/wordprocessingDrawing" xmlns:a="http://schemas.openxmlformats.org/drawingml/2006/main" xmlns:pic="http://schemas.openxmlformats.org/drawingml/2006/picture">
@@ -4357,256 +3907,6 @@
         </w:tc>
       </w:tr>
     </w:tbl>
-    <w:p>
-      <w:pPr>
-        <w:pStyle w:val="BodyText"/>
-      </w:pPr>
-      <m:oMath>
-        <m:r>
-          <m:t>H</m:t>
-        </m:r>
-        <m:sSub>
-          <m:e>
-            <m:r>
-              <m:t>B</m:t>
-            </m:r>
-          </m:e>
-          <m:sub>
-            <m:r>
-              <m:t>w</m:t>
-            </m:r>
-            <m:r>
-              <m:t>y</m:t>
-            </m:r>
-          </m:sub>
-        </m:sSub>
-      </m:oMath>
-      <w:r>
-        <w:t xml:space="preserve"> </w:t>
-      </w:r>
-      <w:r>
-        <w:t xml:space="preserve">is the Hydrologic Benefit value for a given water year (predicted coho spf or coho spf equivalent)</w:t>
-      </w:r>
-    </w:p>
-    <w:p>
-      <w:pPr>
-        <w:pStyle w:val="BodyText"/>
-      </w:pPr>
-      <m:oMath>
-        <m:r>
-          <m:t>b</m:t>
-        </m:r>
-        <m:r>
-          <m:rPr>
-            <m:sty m:val="p"/>
-          </m:rPr>
-          <m:t>=</m:t>
-        </m:r>
-        <m:r>
-          <m:t>87.4</m:t>
-        </m:r>
-      </m:oMath>
-      <w:r>
-        <w:t xml:space="preserve"> </w:t>
-      </w:r>
-      <w:r>
-        <w:t xml:space="preserve">coho spf equiv.</w:t>
-      </w:r>
-    </w:p>
-    <w:p>
-      <w:pPr>
-        <w:pStyle w:val="BodyText"/>
-      </w:pPr>
-      <m:oMath>
-        <m:sSub>
-          <m:e>
-            <m:r>
-              <m:t>m</m:t>
-            </m:r>
-          </m:e>
-          <m:sub>
-            <m:r>
-              <m:t>1</m:t>
-            </m:r>
-          </m:sub>
-        </m:sSub>
-        <m:r>
-          <m:rPr>
-            <m:sty m:val="p"/>
-          </m:rPr>
-          <m:t>=</m:t>
-        </m:r>
-        <m:r>
-          <m:rPr>
-            <m:sty m:val="p"/>
-          </m:rPr>
-          <m:t>−</m:t>
-        </m:r>
-        <m:r>
-          <m:t>0.030</m:t>
-        </m:r>
-      </m:oMath>
-      <w:r>
-        <w:t xml:space="preserve"> </w:t>
-      </w:r>
-      <w:r>
-        <w:t xml:space="preserve">coho spf equiv. per day of reconnection after Aug. 31 (100 cfs)</w:t>
-      </w:r>
-    </w:p>
-    <w:p>
-      <w:pPr>
-        <w:pStyle w:val="BodyText"/>
-      </w:pPr>
-      <m:oMath>
-        <m:sSub>
-          <m:e>
-            <m:r>
-              <m:t>m</m:t>
-            </m:r>
-          </m:e>
-          <m:sub>
-            <m:r>
-              <m:t>2</m:t>
-            </m:r>
-          </m:sub>
-        </m:sSub>
-        <m:r>
-          <m:rPr>
-            <m:sty m:val="p"/>
-          </m:rPr>
-          <m:t>=</m:t>
-        </m:r>
-        <m:r>
-          <m:rPr>
-            <m:sty m:val="p"/>
-          </m:rPr>
-          <m:t>−</m:t>
-        </m:r>
-        <m:r>
-          <m:t>0.365</m:t>
-        </m:r>
-      </m:oMath>
-      <w:r>
-        <w:t xml:space="preserve"> </w:t>
-      </w:r>
-      <w:r>
-        <w:t xml:space="preserve">coho spf equiv. per day of reconnection after Aug. 31 (200 cfs)</w:t>
-      </w:r>
-    </w:p>
-    <w:p>
-      <w:pPr>
-        <w:pStyle w:val="BodyText"/>
-      </w:pPr>
-      <m:oMath>
-        <m:sSub>
-          <m:e>
-            <m:r>
-              <m:t>m</m:t>
-            </m:r>
-          </m:e>
-          <m:sub>
-            <m:r>
-              <m:t>3</m:t>
-            </m:r>
-          </m:sub>
-        </m:sSub>
-        <m:r>
-          <m:rPr>
-            <m:sty m:val="p"/>
-          </m:rPr>
-          <m:t>=</m:t>
-        </m:r>
-        <m:r>
-          <m:t>0.033</m:t>
-        </m:r>
-      </m:oMath>
-      <w:r>
-        <w:t xml:space="preserve"> </w:t>
-      </w:r>
-      <w:r>
-        <w:t xml:space="preserve">coho spf equiv. per day of disconnection after Aug. 31 (200 cfs)</w:t>
-      </w:r>
-    </w:p>
-    <w:p>
-      <w:pPr>
-        <w:pStyle w:val="BodyText"/>
-      </w:pPr>
-      <m:oMath>
-        <m:sSub>
-          <m:e>
-            <m:r>
-              <m:t>m</m:t>
-            </m:r>
-          </m:e>
-          <m:sub>
-            <m:r>
-              <m:t>4</m:t>
-            </m:r>
-          </m:sub>
-        </m:sSub>
-        <m:r>
-          <m:rPr>
-            <m:sty m:val="p"/>
-          </m:rPr>
-          <m:t>=</m:t>
-        </m:r>
-        <m:r>
-          <m:rPr>
-            <m:sty m:val="p"/>
-          </m:rPr>
-          <m:t>−</m:t>
-        </m:r>
-        <m:r>
-          <m:t>0.191</m:t>
-        </m:r>
-      </m:oMath>
-      <w:r>
-        <w:t xml:space="preserve"> </w:t>
-      </w:r>
-      <w:r>
-        <w:t xml:space="preserve">coho spf equiv. per day of reconnection after Aug. 31 (8 cfs)</w:t>
-      </w:r>
-    </w:p>
-    <w:p>
-      <w:pPr>
-        <w:pStyle w:val="BodyText"/>
-      </w:pPr>
-      <m:oMath>
-        <m:sSub>
-          <m:e>
-            <m:r>
-              <m:t>m</m:t>
-            </m:r>
-          </m:e>
-          <m:sub>
-            <m:r>
-              <m:t>5</m:t>
-            </m:r>
-          </m:sub>
-        </m:sSub>
-        <m:r>
-          <m:rPr>
-            <m:sty m:val="p"/>
-          </m:rPr>
-          <m:t>=</m:t>
-        </m:r>
-        <m:r>
-          <m:rPr>
-            <m:sty m:val="p"/>
-          </m:rPr>
-          <m:t>−</m:t>
-        </m:r>
-        <m:r>
-          <m:t>0.004</m:t>
-        </m:r>
-      </m:oMath>
-      <w:r>
-        <w:t xml:space="preserve"> </w:t>
-      </w:r>
-      <w:r>
-        <w:t xml:space="preserve">coho spf equiv. per cubic meter of lower dry season flow magnitude</w:t>
-      </w:r>
-    </w:p>
     <w:p>
       <w:pPr>
         <w:pStyle w:val="BodyText"/>
@@ -4897,7 +4197,23 @@
         <w:t xml:space="preserve"> </w:t>
       </w:r>
       <w:r>
-        <w:t xml:space="preserve">by a mean of 4.5 coho spf-equiv.</w:t>
+        <w:t xml:space="preserve">by a mean of</w:t>
+      </w:r>
+      <w:r>
+        <w:t xml:space="preserve"> </w:t>
+      </w:r>
+      <w:r>
+        <w:rPr>
+          <w:b/>
+          <w:bCs/>
+        </w:rPr>
+        <w:t xml:space="preserve">4.5</w:t>
+      </w:r>
+      <w:r>
+        <w:t xml:space="preserve"> </w:t>
+      </w:r>
+      <w:r>
+        <w:t xml:space="preserve">coho spf-equiv.</w:t>
       </w:r>
     </w:p>
     <w:p>
@@ -4970,8 +4286,8 @@
         <w:t xml:space="preserve">, making them directly comparable to HB values derived from the simulated FJ flow records in the hypothetical management scenarios.</w:t>
       </w:r>
     </w:p>
-    <w:bookmarkEnd w:id="49"/>
-    <w:bookmarkStart w:id="50" w:name="Xb6ca5dd654202e76d1db9f1bc12c98cced9d6aa"/>
+    <w:bookmarkEnd w:id="48"/>
+    <w:bookmarkStart w:id="49" w:name="Xb6ca5dd654202e76d1db9f1bc12c98cced9d6aa"/>
     <w:p>
       <w:pPr>
         <w:pStyle w:val="Heading3"/>
@@ -5002,64 +4318,20 @@
         <w:pStyle w:val="BodyText"/>
       </w:pPr>
       <w:r>
-        <w:t xml:space="preserve">Specifically, conversion of ET to yield or revenue would introduce multiple uncertainties, such as those related to marginal crop production costs and available technology</w:t>
-      </w:r>
-      <w:r>
-        <w:t xml:space="preserve"> </w:t>
-      </w:r>
-      <w:r>
-        <w:t xml:space="preserve">(Howitt 1995)</w:t>
-      </w:r>
-      <w:r>
-        <w:t xml:space="preserve">. In studies that do implement a water-to-yield or -revenue conversion, multi-year average values for per-acre yield and/or revenue are commonly used</w:t>
-      </w:r>
-      <w:r>
-        <w:t xml:space="preserve"> </w:t>
-      </w:r>
-      <w:r>
-        <w:t xml:space="preserve">(e.g., Cole and Medellín-Azuara 2021 for the Scott Valley case)</w:t>
-      </w:r>
-      <w:r>
-        <w:t xml:space="preserve">, since those are typically the only values available. This approach is most valid when the marginal change in productivity is small relative to the average</w:t>
-      </w:r>
-      <w:r>
-        <w:t xml:space="preserve"> </w:t>
-      </w:r>
-      <w:r>
-        <w:t xml:space="preserve">(Howitt 1995)</w:t>
-      </w:r>
-      <w:r>
-        <w:t xml:space="preserve">. Additionally, average values cannot account for time-varying costs of a management action</w:t>
-      </w:r>
-      <w:r>
-        <w:t xml:space="preserve"> </w:t>
-      </w:r>
-      <w:r>
-        <w:t xml:space="preserve">(e.g., the increase in cost of lettuce cultivation due to banning a certain pesticide is higher in some seasons than in others, as described in Sunding 1996)</w:t>
-      </w:r>
-      <w:r>
-        <w:t xml:space="preserve">.</w:t>
+        <w:t xml:space="preserve">Additionally, for alfalfa and pasture, which continue growing as long as water is available, a strong relationship between crop ET and yield is assumed</w:t>
+      </w:r>
+      <w:r>
+        <w:t xml:space="preserve"> </w:t>
+      </w:r>
+      <w:r>
+        <w:t xml:space="preserve">(Carter and Sheaffer 1983)</w:t>
+      </w:r>
+      <w:r>
+        <w:t xml:space="preserve">. The assumption that crop ET is consistently related to yield or revenue breaks down for a management scenario that includes changing crops; this is explored further in the Discussion section. But on the merits of these options, annual crop ET was selected to represent agricultural benefit.</w:t>
       </w:r>
     </w:p>
-    <w:p>
-      <w:pPr>
-        <w:pStyle w:val="BodyText"/>
-      </w:pPr>
-      <w:r>
-        <w:t xml:space="preserve">Additionally, for alfalfa and pasture, which continue growing as long as water is available, a strong relationship between crop ET and yield is assumed</w:t>
-      </w:r>
-      <w:r>
-        <w:t xml:space="preserve"> </w:t>
-      </w:r>
-      <w:r>
-        <w:t xml:space="preserve">(Carter and Sheaffer 1983)</w:t>
-      </w:r>
-      <w:r>
-        <w:t xml:space="preserve">. The assumption that crop ET is consistently related to yield or revenue breaks down for a management scenario that includes changing crops; this is explored further in the Discussion section. But on the merits of these options, annual crop ET was selected to represent agricultural benefit.</w:t>
-      </w:r>
-    </w:p>
-    <w:bookmarkEnd w:id="50"/>
-    <w:bookmarkStart w:id="51" w:name="Xfd5664932b25b1108017cbc6e0e75c8014ecd36"/>
+    <w:bookmarkEnd w:id="49"/>
+    <w:bookmarkStart w:id="50" w:name="Xfd5664932b25b1108017cbc6e0e75c8014ecd36"/>
     <w:p>
       <w:pPr>
         <w:pStyle w:val="Heading3"/>
@@ -5090,7 +4362,7 @@
         <w:pStyle w:val="Compact"/>
         <w:numPr>
           <w:ilvl w:val="0"/>
-          <w:numId w:val="1003"/>
+          <w:numId w:val="1004"/>
         </w:numPr>
       </w:pPr>
       <w:r>
@@ -5102,7 +4374,7 @@
         <w:pStyle w:val="Compact"/>
         <w:numPr>
           <w:ilvl w:val="0"/>
-          <w:numId w:val="1003"/>
+          <w:numId w:val="1004"/>
         </w:numPr>
       </w:pPr>
       <w:r>
@@ -5114,7 +4386,7 @@
         <w:pStyle w:val="Compact"/>
         <w:numPr>
           <w:ilvl w:val="0"/>
-          <w:numId w:val="1003"/>
+          <w:numId w:val="1004"/>
         </w:numPr>
       </w:pPr>
       <w:r>
@@ -5126,7 +4398,7 @@
         <w:pStyle w:val="Compact"/>
         <w:numPr>
           <w:ilvl w:val="0"/>
-          <w:numId w:val="1003"/>
+          <w:numId w:val="1004"/>
         </w:numPr>
       </w:pPr>
       <w:r>
@@ -5138,7 +4410,7 @@
         <w:pStyle w:val="Compact"/>
         <w:numPr>
           <w:ilvl w:val="0"/>
-          <w:numId w:val="1003"/>
+          <w:numId w:val="1004"/>
         </w:numPr>
       </w:pPr>
       <w:r>
@@ -5165,9 +4437,9 @@
         <w:t xml:space="preserve">for full list of assigned categories.</w:t>
       </w:r>
     </w:p>
+    <w:bookmarkEnd w:id="50"/>
     <w:bookmarkEnd w:id="51"/>
-    <w:bookmarkEnd w:id="52"/>
-    <w:bookmarkStart w:id="55" w:name="analyses-of-objective-function-values"/>
+    <w:bookmarkStart w:id="54" w:name="analyses-of-objective-function-values"/>
     <w:p>
       <w:pPr>
         <w:pStyle w:val="Heading2"/>
@@ -5185,7 +4457,7 @@
         <w:t xml:space="preserve">Analyses of objective function values</w:t>
       </w:r>
     </w:p>
-    <w:bookmarkStart w:id="53" w:name="trade-off-efficiency-and-low-coho-years"/>
+    <w:bookmarkStart w:id="52" w:name="trade-off-efficiency"/>
     <w:p>
       <w:pPr>
         <w:pStyle w:val="Heading3"/>
@@ -5200,19 +4472,7 @@
         <w:tab/>
       </w:r>
       <w:r>
-        <w:t xml:space="preserve">Trade-off efficiency and</w:t>
-      </w:r>
-      <w:r>
-        <w:t xml:space="preserve"> </w:t>
-      </w:r>
-      <w:r>
-        <w:t xml:space="preserve">“low-coho”</w:t>
-      </w:r>
-      <w:r>
-        <w:t xml:space="preserve"> </w:t>
-      </w:r>
-      <w:r>
-        <w:t xml:space="preserve">years</w:t>
+        <w:t xml:space="preserve">Trade-off efficiency</w:t>
       </w:r>
     </w:p>
     <w:p>
@@ -5220,7 +4480,7 @@
         <w:pStyle w:val="FirstParagraph"/>
       </w:pPr>
       <w:r>
-        <w:t xml:space="preserve">As discussed previously, balancing agricultural and environmental water demands in this watershed typically takes the form of seeking management actions that can improve flow conditions while minimizing the resulting reduction in agricultural water availability. These objectives are non-commensurable (i.e., an estimated level of fish reproduction cannot be converted into units of agricultural productivity), making an explicit quantification and consideration of benefit trade-offs a critical feature of this decision-support analysis</w:t>
+        <w:t xml:space="preserve">As discussed previously, balancing agricultural and environmental water demands in this watershed typically takes the form of seeking management actions that can improve flow conditions while minimizing the resulting reduction in agricultural water availability; in simple terms, to help fish while not harming farms. These objectives are non-commensurable (i.e., an estimated level of fish reproduction cannot be converted into units of agricultural productivity), making an explicit quantification and consideration of benefit trade-offs a critical feature of this decision-support analysis</w:t>
       </w:r>
       <w:r>
         <w:t xml:space="preserve"> </w:t>
@@ -5270,16 +4530,42 @@
         <w:t xml:space="preserve"> </w:t>
       </w:r>
       <w:r>
-        <w:t xml:space="preserve">of a management scenario. For a given scenario, the trade-off efficiency, or Eff</w:t>
-      </w:r>
-      <w:r>
-        <w:rPr>
-          <w:vertAlign w:val="subscript"/>
-        </w:rPr>
-        <w:t xml:space="preserve">scen</w:t>
-      </w:r>
-      <w:r>
-        <w:t xml:space="preserve">, is unitless (i.e., it has units of coho spf-equiv. per coho spf-equiv. / million m</w:t>
+        <w:t xml:space="preserve">of a management scenario. For a given scenario, the trade-off efficiency, or</w:t>
+      </w:r>
+      <w:r>
+        <w:t xml:space="preserve"> </w:t>
+      </w:r>
+      <m:oMath>
+        <m:r>
+          <m:t>E</m:t>
+        </m:r>
+        <m:r>
+          <m:t>f</m:t>
+        </m:r>
+        <m:r>
+          <m:t>f</m:t>
+        </m:r>
+        <m:r>
+          <m:t> </m:t>
+        </m:r>
+        <m:r>
+          <m:t>s</m:t>
+        </m:r>
+        <m:r>
+          <m:t>c</m:t>
+        </m:r>
+        <m:r>
+          <m:t>e</m:t>
+        </m:r>
+        <m:r>
+          <m:t>n</m:t>
+        </m:r>
+        <m:r>
+          <m:t> </m:t>
+        </m:r>
+      </m:oMath>
+      <w:r>
+        <w:t xml:space="preserve">, is unitless (i.e., it has units of smolt-equiv. per smolt-equiv. / million m</w:t>
       </w:r>
       <w:r>
         <w:rPr>
@@ -5300,7 +4586,13 @@
         <w:t xml:space="preserve">3</w:t>
       </w:r>
       <w:r>
-        <w:t xml:space="preserve">), as shown in the formula below.</w:t>
+        <w:t xml:space="preserve">) (Equation (</w:t>
+      </w:r>
+      <w:r>
+        <w:t xml:space="preserve">??</w:t>
+      </w:r>
+      <w:r>
+        <w:t xml:space="preserve">)).</w:t>
       </w:r>
     </w:p>
     <w:p>
@@ -5327,151 +4619,13 @@
       <w:pPr>
         <w:pStyle w:val="BodyText"/>
       </w:pPr>
-      <m:oMathPara>
-        <m:oMathParaPr>
-          <m:jc m:val="center"/>
-        </m:oMathParaPr>
-        <m:oMath>
-          <m:r>
-            <m:t>H</m:t>
-          </m:r>
-          <m:sSub>
-            <m:e>
-              <m:r>
-                <m:t>B</m:t>
-              </m:r>
-            </m:e>
-            <m:sub>
-              <m:r>
-                <m:t>a</m:t>
-              </m:r>
-              <m:r>
-                <m:t>v</m:t>
-              </m:r>
-              <m:r>
-                <m:t>g</m:t>
-              </m:r>
-            </m:sub>
-          </m:sSub>
-          <m:r>
-            <m:rPr>
-              <m:sty m:val="p"/>
-            </m:rPr>
-            <m:t>=</m:t>
-          </m:r>
-          <m:f>
-            <m:fPr>
-              <m:type m:val="bar"/>
-            </m:fPr>
-            <m:num>
-              <m:r>
-                <m:t>1</m:t>
-              </m:r>
-            </m:num>
-            <m:den>
-              <m:sSub>
-                <m:e>
-                  <m:r>
-                    <m:t>n</m:t>
-                  </m:r>
-                </m:e>
-                <m:sub>
-                  <m:r>
-                    <m:t>w</m:t>
-                  </m:r>
-                  <m:r>
-                    <m:t>y</m:t>
-                  </m:r>
-                </m:sub>
-              </m:sSub>
-            </m:den>
-          </m:f>
-          <m:nary>
-            <m:naryPr>
-              <m:chr m:val="∑"/>
-              <m:limLoc m:val="undOvr"/>
-              <m:subHide m:val="off"/>
-              <m:supHide m:val="off"/>
-            </m:naryPr>
-            <m:sub>
-              <m:r>
-                <m:t>i</m:t>
-              </m:r>
-              <m:r>
-                <m:rPr>
-                  <m:sty m:val="p"/>
-                </m:rPr>
-                <m:t>=</m:t>
-              </m:r>
-              <m:r>
-                <m:t>w</m:t>
-              </m:r>
-              <m:sSub>
-                <m:e>
-                  <m:r>
-                    <m:t>y</m:t>
-                  </m:r>
-                </m:e>
-                <m:sub>
-                  <m:r>
-                    <m:t>1</m:t>
-                  </m:r>
-                </m:sub>
-              </m:sSub>
-            </m:sub>
-            <m:sup>
-              <m:r>
-                <m:t>w</m:t>
-              </m:r>
-              <m:sSub>
-                <m:e>
-                  <m:r>
-                    <m:t>y</m:t>
-                  </m:r>
-                </m:e>
-                <m:sub>
-                  <m:r>
-                    <m:t>n</m:t>
-                  </m:r>
-                </m:sub>
-              </m:sSub>
-            </m:sup>
-            <m:e>
-              <m:r>
-                <m:t>H</m:t>
-              </m:r>
-              <m:sSub>
-                <m:e>
-                  <m:r>
-                    <m:t>B</m:t>
-                  </m:r>
-                </m:e>
-                <m:sub>
-                  <m:r>
-                    <m:t>w</m:t>
-                  </m:r>
-                  <m:sSub>
-                    <m:e>
-                      <m:r>
-                        <m:t>y</m:t>
-                      </m:r>
-                    </m:e>
-                    <m:sub>
-                      <m:r>
-                        <m:t>i</m:t>
-                      </m:r>
-                    </m:sub>
-                  </m:sSub>
-                </m:sub>
-              </m:sSub>
-            </m:e>
-          </m:nary>
-        </m:oMath>
-      </m:oMathPara>
+      <w:r>
+        <w:t xml:space="preserve">$$</w:t>
+      </w:r>
     </w:p>
     <w:p>
       <w:pPr>
-        <w:pStyle w:val="FirstParagraph"/>
+        <w:pStyle w:val="BodyText"/>
       </w:pPr>
       <m:oMathPara>
         <m:oMathParaPr>
@@ -6070,8 +5224,8 @@
         </m:oMath>
       </m:oMathPara>
     </w:p>
-    <w:bookmarkEnd w:id="53"/>
-    <w:bookmarkStart w:id="54" w:name="pareto-optimal-set-of-management-actions"/>
+    <w:bookmarkEnd w:id="52"/>
+    <w:bookmarkStart w:id="53" w:name="pareto-optimal-set-of-management-actions"/>
     <w:p>
       <w:pPr>
         <w:pStyle w:val="Heading3"/>
@@ -6177,9 +5331,9 @@
         <w:t xml:space="preserve">in more than one objective, it must be included in the Pareto-optimal set.</w:t>
       </w:r>
     </w:p>
+    <w:bookmarkEnd w:id="53"/>
     <w:bookmarkEnd w:id="54"/>
-    <w:bookmarkEnd w:id="55"/>
-    <w:bookmarkStart w:id="57" w:name="scenario-descriptions"/>
+    <w:bookmarkStart w:id="56" w:name="scenario-descriptions"/>
     <w:p>
       <w:pPr>
         <w:pStyle w:val="Heading2"/>
@@ -6260,8 +5414,8 @@
       <w:pPr>
         <w:pStyle w:val="TableCaption"/>
       </w:pPr>
-      <w:bookmarkStart w:id="56" w:name="tab:scenCategoryTab"/>
-      <w:bookmarkEnd w:id="56"/>
+      <w:bookmarkStart w:id="55" w:name="tab:scenCategoryTab"/>
+      <w:bookmarkEnd w:id="55"/>
       <w:r>
         <w:t xml:space="preserve">Table 4:</w:t>
       </w:r>
@@ -8773,8 +7927,8 @@
         </w:tc>
       </w:tr>
     </w:tbl>
-    <w:bookmarkEnd w:id="57"/>
-    <w:bookmarkStart w:id="79" w:name="results"/>
+    <w:bookmarkEnd w:id="56"/>
+    <w:bookmarkStart w:id="78" w:name="results"/>
     <w:p>
       <w:pPr>
         <w:pStyle w:val="Heading2"/>
@@ -8809,7 +7963,7 @@
         <w:t xml:space="preserve">).</w:t>
       </w:r>
     </w:p>
-    <w:bookmarkStart w:id="67" w:name="X7919b09686293416b4bcb59483f48ae87a57064"/>
+    <w:bookmarkStart w:id="66" w:name="X7919b09686293416b4bcb59483f48ae87a57064"/>
     <w:p>
       <w:pPr>
         <w:pStyle w:val="Heading3"/>
@@ -8856,18 +8010,18 @@
           <wp:inline>
             <wp:extent cx="5334000" cy="5334000"/>
             <wp:effectExtent b="0" l="0" r="0" t="0"/>
-            <wp:docPr descr="Figure 5:  Comparison of annual performance in two objective functions (HB and ET, representing environmental and agricultural objectives, respectively), in the basecase (black circles) and management scenarios (diamond, cross or x symbols) for water years 1991-2018. Panels A and B show comparisons between basecase and one example scenario in each of three categories: Enhanced Recharge, Low Flow Diversion Limits, and Curtailment. Panels C and D show comparisons between basecase and different cutoff dates within the Alfalfa Irrigation category: July 10th, August 1st and August 15th. Dry-type water years (vertical bars) are 1991, ’92, ’94, 2001, ’09, ’13, ’14, and ’18." title="" id="59" name="Picture"/>
+            <wp:docPr descr="Figure 5:  Comparison of annual performance in two objective functions (HB and ET, representing environmental and agricultural objectives, respectively), in the basecase (black circles) and management scenarios (diamond, cross or x symbols) for water years 1991-2018. Panels A and B show comparisons between basecase and one example scenario in each of three categories: Enhanced Recharge, Low Flow Diversion Limits, and Curtailment. Panels C and D show comparisons between basecase and different cutoff dates within the Alfalfa Irrigation category: July 10th, August 1st and August 15th. Dry-type water years (vertical bars) are 1991, ’92, ’94, 2001, ’09, ’13, ’14, and ’18." title="" id="58" name="Picture"/>
             <a:graphic>
               <a:graphicData uri="http://schemas.openxmlformats.org/drawingml/2006/picture">
                 <pic:pic>
                   <pic:nvPicPr>
-                    <pic:cNvPr descr="Graphics%20and%20Supplements/Figure%204.png" id="60" name="Picture"/>
+                    <pic:cNvPr descr="Graphics%20and%20Supplements/Figure%204.png" id="59" name="Picture"/>
                     <pic:cNvPicPr>
                       <a:picLocks noChangeArrowheads="1" noChangeAspect="1"/>
                     </pic:cNvPicPr>
                   </pic:nvPicPr>
                   <pic:blipFill>
-                    <a:blip r:embed="rId58"/>
+                    <a:blip r:embed="rId57"/>
                     <a:stretch>
                       <a:fillRect/>
                     </a:stretch>
@@ -8898,8 +8052,8 @@
       <w:pPr>
         <w:pStyle w:val="ImageCaption"/>
       </w:pPr>
-      <w:bookmarkStart w:id="61" w:name="fig:benefitByWY"/>
-      <w:bookmarkEnd w:id="61"/>
+      <w:bookmarkStart w:id="60" w:name="fig:benefitByWY"/>
+      <w:bookmarkEnd w:id="60"/>
       <w:r>
         <w:t xml:space="preserve">Figure 5:</w:t>
       </w:r>
@@ -8942,18 +8096,18 @@
           <wp:inline>
             <wp:extent cx="5334000" cy="5334000"/>
             <wp:effectExtent b="0" l="0" r="0" t="0"/>
-            <wp:docPr descr="Figure 6:  Environmental and agricultural objective function performance (in terms of Hydrologic Benefit, or HB, value; and crop ET volume) for basecase (black circle in upper left) and 39 management scenarios. Symbol x and y coordinates are the average of 28 annual HB and ET values for each scenario over the full model period (water years 1991-2018). Whiskers show standard error of the 28 years of annual HB values; standard errors in the direction of the y-axis are smaller than the height covered by each symbol." title="" id="63" name="Picture"/>
+            <wp:docPr descr="Figure 6:  Environmental and agricultural objective function performance (in terms of Hydrologic Benefit, or HB, value; and crop ET volume) for basecase (black circle in upper left) and 39 management scenarios. Symbol x and y coordinates are the average of 28 annual HB and ET values for each scenario over the full model period (water years 1991-2018). Whiskers show standard error of the 28 years of annual HB values; standard errors in the direction of the y-axis are smaller than the height covered by each symbol." title="" id="62" name="Picture"/>
             <a:graphic>
               <a:graphicData uri="http://schemas.openxmlformats.org/drawingml/2006/picture">
                 <pic:pic>
                   <pic:nvPicPr>
-                    <pic:cNvPr descr="Graphics%20and%20Supplements/Figure%205.png" id="64" name="Picture"/>
+                    <pic:cNvPr descr="Graphics%20and%20Supplements/Figure%205.png" id="63" name="Picture"/>
                     <pic:cNvPicPr>
                       <a:picLocks noChangeArrowheads="1" noChangeAspect="1"/>
                     </pic:cNvPicPr>
                   </pic:nvPicPr>
                   <pic:blipFill>
-                    <a:blip r:embed="rId62"/>
+                    <a:blip r:embed="rId61"/>
                     <a:stretch>
                       <a:fillRect/>
                     </a:stretch>
@@ -8984,8 +8138,8 @@
       <w:pPr>
         <w:pStyle w:val="ImageCaption"/>
       </w:pPr>
-      <w:bookmarkStart w:id="65" w:name="fig:farmerFishTradeoffFigure"/>
-      <w:bookmarkEnd w:id="65"/>
+      <w:bookmarkStart w:id="64" w:name="fig:farmerFishTradeoffFigure"/>
+      <w:bookmarkEnd w:id="64"/>
       <w:r>
         <w:t xml:space="preserve">Figure 6:</w:t>
       </w:r>
@@ -9388,8 +8542,8 @@
       <w:pPr>
         <w:pStyle w:val="TableCaption"/>
       </w:pPr>
-      <w:bookmarkStart w:id="66" w:name="tab:scenarioResultsTab"/>
-      <w:bookmarkEnd w:id="66"/>
+      <w:bookmarkStart w:id="65" w:name="tab:scenarioResultsTab"/>
+      <w:bookmarkEnd w:id="65"/>
       <w:r>
         <w:t xml:space="preserve">Table 5:</w:t>
       </w:r>
@@ -18523,8 +17677,8 @@
         </w:tc>
       </w:tr>
     </w:tbl>
-    <w:bookmarkEnd w:id="67"/>
-    <w:bookmarkStart w:id="72" w:name="X5717be130d28923be971a1bdea556d769a5487a"/>
+    <w:bookmarkEnd w:id="66"/>
+    <w:bookmarkStart w:id="71" w:name="X5717be130d28923be971a1bdea556d769a5487a"/>
     <w:p>
       <w:pPr>
         <w:pStyle w:val="Heading3"/>
@@ -18667,18 +17821,18 @@
           <wp:inline>
             <wp:extent cx="5334000" cy="4000499"/>
             <wp:effectExtent b="0" l="0" r="0" t="0"/>
-            <wp:docPr descr="Figure 7:  Scenario trade-off efficiencies, or average HB value (a proxy for environmental benefit) gained per crop ET value lost (a proxy for farmer cost) (normalized to average basecase HB and ET values, respectively), in all 35 years. Basecase, Reservoir scenarios and Enhanced Recharge scenarios are not included as they have on average no or negative ET loss, producing infinite or negative efficiency values." title="" id="69" name="Picture"/>
+            <wp:docPr descr="Figure 7:  Scenario trade-off efficiencies, or average HB value (a proxy for environmental benefit) gained per crop ET value lost (a proxy for farmer cost) (normalized to average basecase HB and ET values, respectively), in all 35 years. Basecase, Reservoir scenarios and Enhanced Recharge scenarios are not included as they have on average no or negative ET loss, producing infinite or negative efficiency values." title="" id="68" name="Picture"/>
             <a:graphic>
               <a:graphicData uri="http://schemas.openxmlformats.org/drawingml/2006/picture">
                 <pic:pic>
                   <pic:nvPicPr>
-                    <pic:cNvPr descr="Graphics%20and%20Supplements/Figure%207.png" id="70" name="Picture"/>
+                    <pic:cNvPr descr="Graphics%20and%20Supplements/Figure%207.png" id="69" name="Picture"/>
                     <pic:cNvPicPr>
                       <a:picLocks noChangeArrowheads="1" noChangeAspect="1"/>
                     </pic:cNvPicPr>
                   </pic:nvPicPr>
                   <pic:blipFill>
-                    <a:blip r:embed="rId68"/>
+                    <a:blip r:embed="rId67"/>
                     <a:stretch>
                       <a:fillRect/>
                     </a:stretch>
@@ -18709,8 +17863,8 @@
       <w:pPr>
         <w:pStyle w:val="ImageCaption"/>
       </w:pPr>
-      <w:bookmarkStart w:id="71" w:name="fig:efficiency"/>
-      <w:bookmarkEnd w:id="71"/>
+      <w:bookmarkStart w:id="70" w:name="fig:efficiency"/>
+      <w:bookmarkEnd w:id="70"/>
       <w:r>
         <w:t xml:space="preserve">Figure 7:</w:t>
       </w:r>
@@ -18724,8 +17878,8 @@
         <w:t xml:space="preserve">Scenario trade-off efficiencies, or average HB value (a proxy for environmental benefit) gained per crop ET value lost (a proxy for farmer cost) (normalized to average basecase HB and ET values, respectively), in all 35 years. Basecase, Reservoir scenarios and Enhanced Recharge scenarios are not included as they have on average no or negative ET loss, producing infinite or negative efficiency values.</w:t>
       </w:r>
     </w:p>
-    <w:bookmarkEnd w:id="72"/>
-    <w:bookmarkStart w:id="78" w:name="Xfbc83626841bb94e70b2ed42e58f7fe62bf81a6"/>
+    <w:bookmarkEnd w:id="71"/>
+    <w:bookmarkStart w:id="77" w:name="Xfbc83626841bb94e70b2ed42e58f7fe62bf81a6"/>
     <w:p>
       <w:pPr>
         <w:pStyle w:val="Heading3"/>
@@ -18880,18 +18034,18 @@
           <wp:inline>
             <wp:extent cx="4038600" cy="4019550"/>
             <wp:effectExtent b="0" l="0" r="0" t="0"/>
-            <wp:docPr descr="Figure 8:  A three-dimensional scatter plot of the objective function values for basecase and 39 management scenarios, averaged over 28 water years (1991-2018). Larger spheres are shown for the Pareto-optimal set of scenarios. Scenario colors correspond to legend in Figures 6 and 7." title="" id="74" name="Picture"/>
+            <wp:docPr descr="Figure 8:  A three-dimensional scatter plot of the objective function values for basecase and 39 management scenarios, averaged over 28 water years (1991-2018). Larger spheres are shown for the Pareto-optimal set of scenarios. Scenario colors correspond to legend in Figures 6 and 7." title="" id="73" name="Picture"/>
             <a:graphic>
               <a:graphicData uri="http://schemas.openxmlformats.org/drawingml/2006/picture">
                 <pic:pic>
                   <pic:nvPicPr>
-                    <pic:cNvPr descr="Graphics%20and%20Supplements/hbf%20et%20infra%20plot3d_2025.11.04.jpg" id="75" name="Picture"/>
+                    <pic:cNvPr descr="Graphics%20and%20Supplements/hbf%20et%20infra%20plot3d_2025.11.04.jpg" id="74" name="Picture"/>
                     <pic:cNvPicPr>
                       <a:picLocks noChangeArrowheads="1" noChangeAspect="1"/>
                     </pic:cNvPicPr>
                   </pic:nvPicPr>
                   <pic:blipFill>
-                    <a:blip r:embed="rId73"/>
+                    <a:blip r:embed="rId72"/>
                     <a:stretch>
                       <a:fillRect/>
                     </a:stretch>
@@ -18922,8 +18076,8 @@
       <w:pPr>
         <w:pStyle w:val="ImageCaption"/>
       </w:pPr>
-      <w:bookmarkStart w:id="76" w:name="fig:farmerFishInfraFigure3D"/>
-      <w:bookmarkEnd w:id="76"/>
+      <w:bookmarkStart w:id="75" w:name="fig:farmerFishInfraFigure3D"/>
+      <w:bookmarkEnd w:id="75"/>
       <w:r>
         <w:t xml:space="preserve">Figure 8:</w:t>
       </w:r>
@@ -18941,8 +18095,8 @@
       <w:pPr>
         <w:pStyle w:val="TableCaption"/>
       </w:pPr>
-      <w:bookmarkStart w:id="77" w:name="tab:gspMgmtList"/>
-      <w:bookmarkEnd w:id="77"/>
+      <w:bookmarkStart w:id="76" w:name="tab:gspMgmtList"/>
+      <w:bookmarkEnd w:id="76"/>
       <w:r>
         <w:t xml:space="preserve">Table 6:</w:t>
       </w:r>
@@ -21935,10 +21089,10 @@
         <w:br w:type="page"/>
       </w:r>
     </w:p>
+    <w:bookmarkEnd w:id="77"/>
     <w:bookmarkEnd w:id="78"/>
     <w:bookmarkEnd w:id="79"/>
-    <w:bookmarkEnd w:id="80"/>
-    <w:bookmarkStart w:id="86" w:name="discussion"/>
+    <w:bookmarkStart w:id="85" w:name="discussion"/>
     <w:p>
       <w:pPr>
         <w:pStyle w:val="Heading1"/>
@@ -21961,6 +21115,18 @@
         <w:pStyle w:val="FirstParagraph"/>
       </w:pPr>
       <w:r>
+        <w:rPr>
+          <w:b/>
+          <w:bCs/>
+        </w:rPr>
+        <w:t xml:space="preserve">add discussion of alternative env obj functions: Chinook salmon, indices of alteration</w:t>
+      </w:r>
+    </w:p>
+    <w:p>
+      <w:pPr>
+        <w:pStyle w:val="BodyText"/>
+      </w:pPr>
+      <w:r>
         <w:t xml:space="preserve">The portfolio of scenarios proposed by stakeholders and simulated for this study included a range of infrastructure investments, regulatory actions and major land use changes. The number and diversity of simulated scenarios was made possible by a surface- and groundwater model designed to approximate existing land use and agricultural water use behavior in the local context [SVIHM;</w:t>
       </w:r>
       <w:r>
@@ -21973,7 +21139,7 @@
         <w:t xml:space="preserve">]. Though the ultimate future effect of these management actions would depend on climate variability and implementation details that have not been explicitly simulated (e.g., the precise location of pumps needed to divert surface water for the expanded enhanced recharge scenarios), it is possible to use objective functions and historical climate records to draw some high-level findings regarding their relative merits.</w:t>
       </w:r>
     </w:p>
-    <w:bookmarkStart w:id="81" w:name="Xa151cb59b4ad5c02348e31b83bab4d8169de230"/>
+    <w:bookmarkStart w:id="80" w:name="Xa151cb59b4ad5c02348e31b83bab4d8169de230"/>
     <w:p>
       <w:pPr>
         <w:pStyle w:val="Heading2"/>
@@ -22050,8 +21216,8 @@
         <w:t xml:space="preserve">These predicted on-the-ground consequences can facilitate interpretation of scenario results.</w:t>
       </w:r>
     </w:p>
-    <w:bookmarkEnd w:id="81"/>
-    <w:bookmarkStart w:id="82" w:name="Xeb4407dfc59ea709d91a13199c8e469abf09cea"/>
+    <w:bookmarkEnd w:id="80"/>
+    <w:bookmarkStart w:id="81" w:name="Xeb4407dfc59ea709d91a13199c8e469abf09cea"/>
     <w:p>
       <w:pPr>
         <w:pStyle w:val="Heading2"/>
@@ -22147,8 +21313,8 @@
         <w:t xml:space="preserve">), the low-coho year HB performance of various model scenarios is a key scenario differentiator.</w:t>
       </w:r>
     </w:p>
-    <w:bookmarkEnd w:id="82"/>
-    <w:bookmarkStart w:id="83" w:name="environmental-agricultural-trade-offs"/>
+    <w:bookmarkEnd w:id="81"/>
+    <w:bookmarkStart w:id="82" w:name="environmental-agricultural-trade-offs"/>
     <w:p>
       <w:pPr>
         <w:pStyle w:val="Heading2"/>
@@ -22424,8 +21590,8 @@
         <w:t xml:space="preserve">).</w:t>
       </w:r>
     </w:p>
-    <w:bookmarkEnd w:id="83"/>
-    <w:bookmarkStart w:id="84" w:name="Xb48c0b1c357814727cacf50afe35e98b0bf92dd"/>
+    <w:bookmarkEnd w:id="82"/>
+    <w:bookmarkStart w:id="83" w:name="Xb48c0b1c357814727cacf50afe35e98b0bf92dd"/>
     <w:p>
       <w:pPr>
         <w:pStyle w:val="Heading2"/>
@@ -22520,8 +21686,8 @@
         <w:t xml:space="preserve">). Although the GSP management priorities emphasized infrastructure, in a strict application of these objective functions, both infrastructure-based and regulatory approaches fell within the Pareto-optimal set of management options.</w:t>
       </w:r>
     </w:p>
-    <w:bookmarkEnd w:id="84"/>
-    <w:bookmarkStart w:id="85" w:name="policy-implications"/>
+    <w:bookmarkEnd w:id="83"/>
+    <w:bookmarkStart w:id="84" w:name="policy-implications"/>
     <w:p>
       <w:pPr>
         <w:pStyle w:val="Heading2"/>
@@ -22560,7 +21726,7 @@
         <w:pStyle w:val="Compact"/>
         <w:numPr>
           <w:ilvl w:val="0"/>
-          <w:numId w:val="1004"/>
+          <w:numId w:val="1005"/>
         </w:numPr>
       </w:pPr>
       <w:r>
@@ -22581,7 +21747,7 @@
         <w:pStyle w:val="Compact"/>
         <w:numPr>
           <w:ilvl w:val="0"/>
-          <w:numId w:val="1004"/>
+          <w:numId w:val="1005"/>
         </w:numPr>
       </w:pPr>
       <w:r>
@@ -22593,7 +21759,7 @@
         <w:pStyle w:val="Compact"/>
         <w:numPr>
           <w:ilvl w:val="0"/>
-          <w:numId w:val="1004"/>
+          <w:numId w:val="1005"/>
         </w:numPr>
       </w:pPr>
       <w:r>
@@ -22614,7 +21780,7 @@
         <w:pStyle w:val="Compact"/>
         <w:numPr>
           <w:ilvl w:val="0"/>
-          <w:numId w:val="1004"/>
+          <w:numId w:val="1005"/>
         </w:numPr>
       </w:pPr>
       <w:r>
@@ -22639,9 +21805,9 @@
         <w:t xml:space="preserve">).</w:t>
       </w:r>
     </w:p>
+    <w:bookmarkEnd w:id="84"/>
     <w:bookmarkEnd w:id="85"/>
-    <w:bookmarkEnd w:id="86"/>
-    <w:bookmarkStart w:id="87" w:name="conclusion"/>
+    <w:bookmarkStart w:id="86" w:name="conclusion"/>
     <w:p>
       <w:pPr>
         <w:pStyle w:val="Heading1"/>
@@ -22705,8 +21871,8 @@
         <w:br w:type="page"/>
       </w:r>
     </w:p>
-    <w:bookmarkEnd w:id="87"/>
-    <w:bookmarkStart w:id="149" w:name="references"/>
+    <w:bookmarkEnd w:id="86"/>
+    <w:bookmarkStart w:id="146" w:name="references"/>
     <w:p>
       <w:pPr>
         <w:pStyle w:val="Heading1"/>
@@ -22715,8 +21881,63 @@
         <w:t xml:space="preserve">References</w:t>
       </w:r>
     </w:p>
-    <w:bookmarkStart w:id="148" w:name="refs"/>
-    <w:bookmarkStart w:id="89" w:name="ref-Brown1994"/>
+    <w:bookmarkStart w:id="145" w:name="refs"/>
+    <w:bookmarkStart w:id="88" w:name="ref-BorkHirokawaTrends2021"/>
+    <w:p>
+      <w:pPr>
+        <w:pStyle w:val="Bibliography"/>
+      </w:pPr>
+      <w:r>
+        <w:t xml:space="preserve">Bork, Karrigan, and Keith Hirokawa. 2021.</w:t>
+      </w:r>
+      <w:r>
+        <w:t xml:space="preserve"> </w:t>
+      </w:r>
+      <w:r>
+        <w:t xml:space="preserve">“Trends in</w:t>
+      </w:r>
+      <w:r>
+        <w:t xml:space="preserve"> </w:t>
+      </w:r>
+      <w:r>
+        <w:t xml:space="preserve">Local Ecosystem Governance</w:t>
+      </w:r>
+      <w:r>
+        <w:t xml:space="preserve">.”</w:t>
+      </w:r>
+      <w:r>
+        <w:t xml:space="preserve"> </w:t>
+      </w:r>
+      <w:r>
+        <w:rPr>
+          <w:i/>
+          <w:iCs/>
+        </w:rPr>
+        <w:t xml:space="preserve">Frontiers in Climate</w:t>
+      </w:r>
+      <w:r>
+        <w:t xml:space="preserve"> </w:t>
+      </w:r>
+      <w:r>
+        <w:t xml:space="preserve">3 (September): 719150.</w:t>
+      </w:r>
+      <w:r>
+        <w:t xml:space="preserve"> </w:t>
+      </w:r>
+      <w:hyperlink r:id="rId87">
+        <w:r>
+          <w:rPr>
+            <w:rStyle w:val="Hyperlink"/>
+          </w:rPr>
+          <w:t xml:space="preserve">https://doi.org/10.3389/fclim.2021.719150</w:t>
+        </w:r>
+      </w:hyperlink>
+      <w:r>
+        <w:t xml:space="preserve">.</w:t>
+      </w:r>
+    </w:p>
+    <w:bookmarkEnd w:id="88"/>
+    <w:bookmarkStart w:id="90" w:name="ref-Brown1994"/>
     <w:p>
       <w:pPr>
         <w:pStyle w:val="Bibliography"/>
@@ -22755,7 +21976,7 @@
       <w:r>
         <w:t xml:space="preserve"> </w:t>
       </w:r>
-      <w:hyperlink r:id="rId88">
+      <w:hyperlink r:id="rId89">
         <w:r>
           <w:rPr>
             <w:rStyle w:val="Hyperlink"/>
@@ -22767,8 +21988,8 @@
         <w:t xml:space="preserve">.</w:t>
       </w:r>
     </w:p>
-    <w:bookmarkEnd w:id="89"/>
-    <w:bookmarkStart w:id="91" w:name="ref-CDFW2015a"/>
+    <w:bookmarkEnd w:id="90"/>
+    <w:bookmarkStart w:id="92" w:name="ref-CDFW2015a"/>
     <w:p>
       <w:pPr>
         <w:pStyle w:val="Bibliography"/>
@@ -22797,7 +22018,7 @@
       <w:r>
         <w:t xml:space="preserve"> </w:t>
       </w:r>
-      <w:hyperlink r:id="rId90">
+      <w:hyperlink r:id="rId91">
         <w:r>
           <w:rPr>
             <w:rStyle w:val="Hyperlink"/>
@@ -22809,8 +22030,8 @@
         <w:t xml:space="preserve">.</w:t>
       </w:r>
     </w:p>
-    <w:bookmarkEnd w:id="91"/>
-    <w:bookmarkStart w:id="93" w:name="ref-CDFW2017"/>
+    <w:bookmarkEnd w:id="92"/>
+    <w:bookmarkStart w:id="94" w:name="ref-CDFW2017"/>
     <w:p>
       <w:pPr>
         <w:pStyle w:val="Bibliography"/>
@@ -22833,7 +22054,7 @@
       <w:r>
         <w:t xml:space="preserve"> </w:t>
       </w:r>
-      <w:hyperlink r:id="rId92">
+      <w:hyperlink r:id="rId93">
         <w:r>
           <w:rPr>
             <w:rStyle w:val="Hyperlink"/>
@@ -22845,8 +22066,8 @@
         <w:t xml:space="preserve">.</w:t>
       </w:r>
     </w:p>
-    <w:bookmarkEnd w:id="93"/>
-    <w:bookmarkStart w:id="95" w:name="ref-DWR2017"/>
+    <w:bookmarkEnd w:id="94"/>
+    <w:bookmarkStart w:id="96" w:name="ref-DWR2017"/>
     <w:p>
       <w:pPr>
         <w:pStyle w:val="Bibliography"/>
@@ -22869,7 +22090,7 @@
       <w:r>
         <w:t xml:space="preserve"> </w:t>
       </w:r>
-      <w:hyperlink r:id="rId94">
+      <w:hyperlink r:id="rId95">
         <w:r>
           <w:rPr>
             <w:rStyle w:val="Hyperlink"/>
@@ -22881,8 +22102,8 @@
         <w:t xml:space="preserve">.</w:t>
       </w:r>
     </w:p>
-    <w:bookmarkEnd w:id="95"/>
-    <w:bookmarkStart w:id="96" w:name="ref-SWRCB1975"/>
+    <w:bookmarkEnd w:id="96"/>
+    <w:bookmarkStart w:id="97" w:name="ref-SWRCB1975"/>
     <w:p>
       <w:pPr>
         <w:pStyle w:val="Bibliography"/>
@@ -22903,8 +22124,8 @@
         <w:t xml:space="preserve">.”</w:t>
       </w:r>
     </w:p>
-    <w:bookmarkEnd w:id="96"/>
-    <w:bookmarkStart w:id="98" w:name="ref-Carter1983"/>
+    <w:bookmarkEnd w:id="97"/>
+    <w:bookmarkStart w:id="99" w:name="ref-Carter1983"/>
     <w:p>
       <w:pPr>
         <w:pStyle w:val="Bibliography"/>
@@ -22943,7 +22164,7 @@
       <w:r>
         <w:t xml:space="preserve"> </w:t>
       </w:r>
-      <w:hyperlink r:id="rId97">
+      <w:hyperlink r:id="rId98">
         <w:r>
           <w:rPr>
             <w:rStyle w:val="Hyperlink"/>
@@ -22955,8 +22176,8 @@
         <w:t xml:space="preserve">.</w:t>
       </w:r>
     </w:p>
-    <w:bookmarkEnd w:id="98"/>
-    <w:bookmarkStart w:id="100" w:name="ref-CDFW2021c"/>
+    <w:bookmarkEnd w:id="99"/>
+    <w:bookmarkStart w:id="101" w:name="ref-CDFW2021c"/>
     <w:p>
       <w:pPr>
         <w:pStyle w:val="Bibliography"/>
@@ -22985,7 +22206,7 @@
       <w:r>
         <w:t xml:space="preserve"> </w:t>
       </w:r>
-      <w:hyperlink r:id="rId99">
+      <w:hyperlink r:id="rId100">
         <w:r>
           <w:rPr>
             <w:rStyle w:val="Hyperlink"/>
@@ -22997,8 +22218,8 @@
         <w:t xml:space="preserve">.</w:t>
       </w:r>
     </w:p>
-    <w:bookmarkEnd w:id="100"/>
-    <w:bookmarkStart w:id="102" w:name="ref-Cohon1973"/>
+    <w:bookmarkEnd w:id="101"/>
+    <w:bookmarkStart w:id="103" w:name="ref-Cohon1973"/>
     <w:p>
       <w:pPr>
         <w:pStyle w:val="Bibliography"/>
@@ -23037,7 +22258,7 @@
       <w:r>
         <w:t xml:space="preserve"> </w:t>
       </w:r>
-      <w:hyperlink r:id="rId101">
+      <w:hyperlink r:id="rId102">
         <w:r>
           <w:rPr>
             <w:rStyle w:val="Hyperlink"/>
@@ -23049,8 +22270,8 @@
         <w:t xml:space="preserve">.</w:t>
       </w:r>
     </w:p>
-    <w:bookmarkEnd w:id="102"/>
-    <w:bookmarkStart w:id="104" w:name="ref-Cohon1975"/>
+    <w:bookmarkEnd w:id="103"/>
+    <w:bookmarkStart w:id="105" w:name="ref-Cohon1975"/>
     <w:p>
       <w:pPr>
         <w:pStyle w:val="Bibliography"/>
@@ -23089,7 +22310,7 @@
       <w:r>
         <w:t xml:space="preserve"> </w:t>
       </w:r>
-      <w:hyperlink r:id="rId103">
+      <w:hyperlink r:id="rId104">
         <w:r>
           <w:rPr>
             <w:rStyle w:val="Hyperlink"/>
@@ -23101,14 +22322,14 @@
         <w:t xml:space="preserve">.</w:t>
       </w:r>
     </w:p>
-    <w:bookmarkEnd w:id="104"/>
-    <w:bookmarkStart w:id="105" w:name="ref-Cole2021"/>
+    <w:bookmarkEnd w:id="105"/>
+    <w:bookmarkStart w:id="107" w:name="ref-Foglia2013a"/>
     <w:p>
       <w:pPr>
         <w:pStyle w:val="Bibliography"/>
       </w:pPr>
       <w:r>
-        <w:t xml:space="preserve">Cole, Spencer A., and Josué Medellín-Azuara. 2021.</w:t>
+        <w:t xml:space="preserve">Foglia, Laura, Alison McNally, Courtney Hall, Lauren Ledesma, Ryan Hines, and Thomas Harter. 2013.</w:t>
       </w:r>
       <w:r>
         <w:t xml:space="preserve"> </w:t>
@@ -23117,7 +22338,7 @@
         <w:t xml:space="preserve">“</w:t>
       </w:r>
       <w:r>
-        <w:t xml:space="preserve">Siskiyou County Agricultural Economics Analysis Considering Groundwater Regulation</w:t>
+        <w:t xml:space="preserve">Scott Valley Integrated Hydrologic Model : Data Collection , Analysis , and Water Budget</w:t>
       </w:r>
       <w:r>
         <w:t xml:space="preserve">.”</w:t>
@@ -23126,82 +22347,12 @@
         <w:t xml:space="preserve"> </w:t>
       </w:r>
       <w:r>
-        <w:t xml:space="preserve">Merced, CA: University of California, Merced.</w:t>
-      </w:r>
-    </w:p>
-    <w:bookmarkEnd w:id="105"/>
-    <w:bookmarkStart w:id="107" w:name="ref-DWR2019"/>
-    <w:p>
-      <w:pPr>
-        <w:pStyle w:val="Bibliography"/>
-      </w:pPr>
-      <w:r>
-        <w:t xml:space="preserve">DWR. 2019.</w:t>
-      </w:r>
-      <w:r>
-        <w:t xml:space="preserve"> </w:t>
-      </w:r>
-      <w:r>
-        <w:t xml:space="preserve">“</w:t>
-      </w:r>
-      <w:r>
-        <w:t xml:space="preserve">Sustainable Groundwater Management Act 2019 Basin Prioritization</w:t>
-      </w:r>
-      <w:r>
-        <w:t xml:space="preserve">.”</w:t>
-      </w:r>
-      <w:r>
-        <w:t xml:space="preserve"> </w:t>
-      </w:r>
-      <w:r>
-        <w:t xml:space="preserve">April.</w:t>
+        <w:t xml:space="preserve">April. University of California, Davis.</w:t>
       </w:r>
       <w:r>
         <w:t xml:space="preserve"> </w:t>
       </w:r>
       <w:hyperlink r:id="rId106">
-        <w:r>
-          <w:rPr>
-            <w:rStyle w:val="Hyperlink"/>
-          </w:rPr>
-          <w:t xml:space="preserve">https://data.cnra.ca.gov/dataset/13ebd2d3-4e62-4fee-9342-d7c3ef3e0079/resource/ffafd27b-5e7e-4db3-b846-e7b3cb5c614c/download/sgma{\_}bp{\_}process{\_}document.pdf</w:t>
-        </w:r>
-      </w:hyperlink>
-      <w:r>
-        <w:t xml:space="preserve">.</w:t>
-      </w:r>
-    </w:p>
-    <w:bookmarkEnd w:id="107"/>
-    <w:bookmarkStart w:id="109" w:name="ref-Foglia2013a"/>
-    <w:p>
-      <w:pPr>
-        <w:pStyle w:val="Bibliography"/>
-      </w:pPr>
-      <w:r>
-        <w:t xml:space="preserve">Foglia, Laura, Alison McNally, Courtney Hall, Lauren Ledesma, Ryan Hines, and Thomas Harter. 2013.</w:t>
-      </w:r>
-      <w:r>
-        <w:t xml:space="preserve"> </w:t>
-      </w:r>
-      <w:r>
-        <w:t xml:space="preserve">“</w:t>
-      </w:r>
-      <w:r>
-        <w:t xml:space="preserve">Scott Valley Integrated Hydrologic Model : Data Collection , Analysis , and Water Budget</w:t>
-      </w:r>
-      <w:r>
-        <w:t xml:space="preserve">.”</w:t>
-      </w:r>
-      <w:r>
-        <w:t xml:space="preserve"> </w:t>
-      </w:r>
-      <w:r>
-        <w:t xml:space="preserve">April. University of California, Davis.</w:t>
-      </w:r>
-      <w:r>
-        <w:t xml:space="preserve"> </w:t>
-      </w:r>
-      <w:hyperlink r:id="rId108">
         <w:r>
           <w:rPr>
             <w:rStyle w:val="Hyperlink"/>
@@ -23213,8 +22364,8 @@
         <w:t xml:space="preserve">.</w:t>
       </w:r>
     </w:p>
-    <w:bookmarkEnd w:id="109"/>
-    <w:bookmarkStart w:id="111" w:name="ref-FCGMA2019"/>
+    <w:bookmarkEnd w:id="107"/>
+    <w:bookmarkStart w:id="109" w:name="ref-FCGMA2019"/>
     <w:p>
       <w:pPr>
         <w:pStyle w:val="Bibliography"/>
@@ -23243,7 +22394,7 @@
       <w:r>
         <w:t xml:space="preserve"> </w:t>
       </w:r>
-      <w:hyperlink r:id="rId110">
+      <w:hyperlink r:id="rId108">
         <w:r>
           <w:rPr>
             <w:rStyle w:val="Hyperlink"/>
@@ -23255,14 +22406,14 @@
         <w:t xml:space="preserve">.</w:t>
       </w:r>
     </w:p>
-    <w:bookmarkEnd w:id="111"/>
-    <w:bookmarkStart w:id="113" w:name="ref-Graham2012"/>
+    <w:bookmarkEnd w:id="109"/>
+    <w:bookmarkStart w:id="111" w:name="ref-FreemanWICKED2000"/>
     <w:p>
       <w:pPr>
         <w:pStyle w:val="Bibliography"/>
       </w:pPr>
       <w:r>
-        <w:t xml:space="preserve">Graham, Rhea. 2012.</w:t>
+        <w:t xml:space="preserve">Freeman, David M. 2000.</w:t>
       </w:r>
       <w:r>
         <w:t xml:space="preserve"> </w:t>
@@ -23271,7 +22422,22 @@
         <w:t xml:space="preserve">“</w:t>
       </w:r>
       <w:r>
-        <w:t xml:space="preserve">Klamath River Basin Restoration Nonuse Value Survey Klamath River Basin Restoration Nonuse Value Survey Final Report Prepared by</w:t>
+        <w:t xml:space="preserve">WICKED WATER PROBLEMS</w:t>
+      </w:r>
+      <w:r>
+        <w:t xml:space="preserve">:</w:t>
+      </w:r>
+      <w:r>
+        <w:t xml:space="preserve"> </w:t>
+      </w:r>
+      <w:r>
+        <w:t xml:space="preserve">SOCIOLOGY AND LOCAL WATER ORGANIZATIONS IN ADDRESSING WATER RESOURCES POLICY</w:t>
+      </w:r>
+      <w:r>
+        <w:rPr>
+          <w:vertAlign w:val="superscript"/>
+        </w:rPr>
+        <w:t xml:space="preserve">1</w:t>
       </w:r>
       <w:r>
         <w:t xml:space="preserve">.”</w:t>
@@ -23279,20 +22445,36 @@
       <w:r>
         <w:t xml:space="preserve"> </w:t>
       </w:r>
-      <w:hyperlink r:id="rId112">
+      <w:r>
+        <w:rPr>
+          <w:i/>
+          <w:iCs/>
+        </w:rPr>
+        <w:t xml:space="preserve">JAWRA Journal of the American Water Resources Association</w:t>
+      </w:r>
+      <w:r>
+        <w:t xml:space="preserve"> </w:t>
+      </w:r>
+      <w:r>
+        <w:t xml:space="preserve">36 (3): 483–91.</w:t>
+      </w:r>
+      <w:r>
+        <w:t xml:space="preserve"> </w:t>
+      </w:r>
+      <w:hyperlink r:id="rId110">
         <w:r>
           <w:rPr>
             <w:rStyle w:val="Hyperlink"/>
           </w:rPr>
-          <w:t xml:space="preserve">https://kbifrm.psmfc.org/wp-content/uploads/2016/12/Graham{\_}2012{\_}0010{\_}Klamath-River-Basin-Restoration-Nonuse-Value-Survey-Final-Report.pdf</w:t>
+          <w:t xml:space="preserve">https://doi.org/10.1111/j.1752-1688.2000.tb04280.x</w:t>
         </w:r>
       </w:hyperlink>
       <w:r>
         <w:t xml:space="preserve">.</w:t>
       </w:r>
     </w:p>
-    <w:bookmarkEnd w:id="113"/>
-    <w:bookmarkStart w:id="115" w:name="ref-Harter2008"/>
+    <w:bookmarkEnd w:id="111"/>
+    <w:bookmarkStart w:id="113" w:name="ref-Harter2008"/>
     <w:p>
       <w:pPr>
         <w:pStyle w:val="Bibliography"/>
@@ -23321,7 +22503,7 @@
       <w:r>
         <w:t xml:space="preserve"> </w:t>
       </w:r>
-      <w:hyperlink r:id="rId114">
+      <w:hyperlink r:id="rId112">
         <w:r>
           <w:rPr>
             <w:rStyle w:val="Hyperlink"/>
@@ -23333,60 +22515,8 @@
         <w:t xml:space="preserve">.</w:t>
       </w:r>
     </w:p>
-    <w:bookmarkEnd w:id="115"/>
-    <w:bookmarkStart w:id="117" w:name="ref-Howitt1995"/>
-    <w:p>
-      <w:pPr>
-        <w:pStyle w:val="Bibliography"/>
-      </w:pPr>
-      <w:r>
-        <w:t xml:space="preserve">Howitt, Richard E. 1995.</w:t>
-      </w:r>
-      <w:r>
-        <w:t xml:space="preserve"> </w:t>
-      </w:r>
-      <w:r>
-        <w:t xml:space="preserve">“</w:t>
-      </w:r>
-      <w:r>
-        <w:t xml:space="preserve">Positive Mathematical Programming</w:t>
-      </w:r>
-      <w:r>
-        <w:t xml:space="preserve">.”</w:t>
-      </w:r>
-      <w:r>
-        <w:t xml:space="preserve"> </w:t>
-      </w:r>
-      <w:r>
-        <w:rPr>
-          <w:i/>
-          <w:iCs/>
-        </w:rPr>
-        <w:t xml:space="preserve">American Journal of Agricultural Economics</w:t>
-      </w:r>
-      <w:r>
-        <w:t xml:space="preserve"> </w:t>
-      </w:r>
-      <w:r>
-        <w:t xml:space="preserve">77 (2): 329–42.</w:t>
-      </w:r>
-      <w:r>
-        <w:t xml:space="preserve"> </w:t>
-      </w:r>
-      <w:hyperlink r:id="rId116">
-        <w:r>
-          <w:rPr>
-            <w:rStyle w:val="Hyperlink"/>
-          </w:rPr>
-          <w:t xml:space="preserve">https://doi.org/10.2307/1243543</w:t>
-        </w:r>
-      </w:hyperlink>
-      <w:r>
-        <w:t xml:space="preserve">.</w:t>
-      </w:r>
-    </w:p>
-    <w:bookmarkEnd w:id="117"/>
-    <w:bookmarkStart w:id="119" w:name="ref-Kapelan2005"/>
+    <w:bookmarkEnd w:id="113"/>
+    <w:bookmarkStart w:id="115" w:name="ref-Kapelan2005"/>
     <w:p>
       <w:pPr>
         <w:pStyle w:val="Bibliography"/>
@@ -23425,7 +22555,7 @@
       <w:r>
         <w:t xml:space="preserve"> </w:t>
       </w:r>
-      <w:hyperlink r:id="rId118">
+      <w:hyperlink r:id="rId114">
         <w:r>
           <w:rPr>
             <w:rStyle w:val="Hyperlink"/>
@@ -23437,13 +22567,80 @@
         <w:t xml:space="preserve">.</w:t>
       </w:r>
     </w:p>
-    <w:bookmarkEnd w:id="119"/>
-    <w:bookmarkStart w:id="121" w:name="ref-Mack1958"/>
+    <w:bookmarkEnd w:id="115"/>
+    <w:bookmarkStart w:id="117" w:name="ref-KoubaEtAlWatershedSpecific2025"/>
     <w:p>
       <w:pPr>
         <w:pStyle w:val="Bibliography"/>
       </w:pPr>
       <w:r>
+        <w:t xml:space="preserve">Kouba, Claire, Leland Scantlebury, Jason Wiener, Sarah Yarnell, and Thomas Harter. 2025.</w:t>
+      </w:r>
+      <w:r>
+        <w:t xml:space="preserve"> </w:t>
+      </w:r>
+      <w:r>
+        <w:t xml:space="preserve">“A</w:t>
+      </w:r>
+      <w:r>
+        <w:t xml:space="preserve"> </w:t>
+      </w:r>
+      <w:r>
+        <w:t xml:space="preserve">Watershed-Specific Approach</w:t>
+      </w:r>
+      <w:r>
+        <w:t xml:space="preserve"> </w:t>
+      </w:r>
+      <w:r>
+        <w:t xml:space="preserve">to</w:t>
+      </w:r>
+      <w:r>
+        <w:t xml:space="preserve"> </w:t>
+      </w:r>
+      <w:r>
+        <w:t xml:space="preserve">Identify Key Functional Flow Metrics Supporting Salmon Reproduction</w:t>
+      </w:r>
+      <w:r>
+        <w:t xml:space="preserve">.”</w:t>
+      </w:r>
+      <w:r>
+        <w:t xml:space="preserve"> </w:t>
+      </w:r>
+      <w:r>
+        <w:rPr>
+          <w:i/>
+          <w:iCs/>
+        </w:rPr>
+        <w:t xml:space="preserve">Ecohydrology : Ecosystems, Land and Water Process Interactions, Ecohydrogeomorphology</w:t>
+      </w:r>
+      <w:r>
+        <w:t xml:space="preserve"> </w:t>
+      </w:r>
+      <w:r>
+        <w:t xml:space="preserve">18 (5): e70098.</w:t>
+      </w:r>
+      <w:r>
+        <w:t xml:space="preserve"> </w:t>
+      </w:r>
+      <w:hyperlink r:id="rId116">
+        <w:r>
+          <w:rPr>
+            <w:rStyle w:val="Hyperlink"/>
+          </w:rPr>
+          <w:t xml:space="preserve">https://doi.org/10.1002/eco.70098</w:t>
+        </w:r>
+      </w:hyperlink>
+      <w:r>
+        <w:t xml:space="preserve">.</w:t>
+      </w:r>
+    </w:p>
+    <w:bookmarkEnd w:id="117"/>
+    <w:bookmarkStart w:id="119" w:name="ref-Mack1958"/>
+    <w:p>
+      <w:pPr>
+        <w:pStyle w:val="Bibliography"/>
+      </w:pPr>
+      <w:r>
         <w:t xml:space="preserve">Mack, Seymour. 1958.</w:t>
       </w:r>
       <w:r>
@@ -23464,7 +22661,7 @@
       <w:r>
         <w:t xml:space="preserve"> </w:t>
       </w:r>
-      <w:hyperlink r:id="rId120">
+      <w:hyperlink r:id="rId118">
         <w:r>
           <w:rPr>
             <w:rStyle w:val="Hyperlink"/>
@@ -23476,8 +22673,8 @@
         <w:t xml:space="preserve">.</w:t>
       </w:r>
     </w:p>
-    <w:bookmarkEnd w:id="121"/>
-    <w:bookmarkStart w:id="123" w:name="ref-Mahoney1998"/>
+    <w:bookmarkEnd w:id="119"/>
+    <w:bookmarkStart w:id="121" w:name="ref-Mahoney1998"/>
     <w:p>
       <w:pPr>
         <w:pStyle w:val="Bibliography"/>
@@ -23516,7 +22713,7 @@
       <w:r>
         <w:t xml:space="preserve"> </w:t>
       </w:r>
-      <w:hyperlink r:id="rId122">
+      <w:hyperlink r:id="rId120">
         <w:r>
           <w:rPr>
             <w:rStyle w:val="Hyperlink"/>
@@ -23528,8 +22725,8 @@
         <w:t xml:space="preserve">.</w:t>
       </w:r>
     </w:p>
-    <w:bookmarkEnd w:id="123"/>
-    <w:bookmarkStart w:id="125" w:name="ref-Monarchi1973"/>
+    <w:bookmarkEnd w:id="121"/>
+    <w:bookmarkStart w:id="123" w:name="ref-Monarchi1973"/>
     <w:p>
       <w:pPr>
         <w:pStyle w:val="Bibliography"/>
@@ -23568,7 +22765,7 @@
       <w:r>
         <w:t xml:space="preserve"> </w:t>
       </w:r>
-      <w:hyperlink r:id="rId124">
+      <w:hyperlink r:id="rId122">
         <w:r>
           <w:rPr>
             <w:rStyle w:val="Hyperlink"/>
@@ -23580,30 +22777,66 @@
         <w:t xml:space="preserve">.</w:t>
       </w:r>
     </w:p>
-    <w:bookmarkEnd w:id="125"/>
-    <w:bookmarkStart w:id="126" w:name="ref-NCRWQCB2006b"/>
+    <w:bookmarkEnd w:id="123"/>
+    <w:bookmarkStart w:id="125" w:name="ref-NordgrenEtAlSupporting2016"/>
     <w:p>
       <w:pPr>
         <w:pStyle w:val="Bibliography"/>
       </w:pPr>
       <w:r>
-        <w:t xml:space="preserve">North Coast Regional Water Quality Control Board (NCRWQCB). 2006.</w:t>
-      </w:r>
-      <w:r>
-        <w:t xml:space="preserve"> </w:t>
-      </w:r>
-      <w:r>
-        <w:t xml:space="preserve">“</w:t>
-      </w:r>
-      <w:r>
-        <w:t xml:space="preserve">Action Plan for the Scott River Sediment and Temperature Total Maximum Daily Loads (Basin Plan Language)</w:t>
-      </w:r>
-      <w:r>
-        <w:t xml:space="preserve">.”</w:t>
+        <w:t xml:space="preserve">Nordgren, John, Missy Stults, and Sara Meerow. 2016.</w:t>
+      </w:r>
+      <w:r>
+        <w:t xml:space="preserve"> </w:t>
+      </w:r>
+      <w:r>
+        <w:t xml:space="preserve">“Supporting Local Climate Change Adaptation:</w:t>
+      </w:r>
+      <w:r>
+        <w:t xml:space="preserve"> </w:t>
+      </w:r>
+      <w:r>
+        <w:t xml:space="preserve">Where</w:t>
+      </w:r>
+      <w:r>
+        <w:t xml:space="preserve"> </w:t>
+      </w:r>
+      <w:r>
+        <w:t xml:space="preserve">We Are and Where We Need to Go.”</w:t>
+      </w:r>
+      <w:r>
+        <w:t xml:space="preserve"> </w:t>
+      </w:r>
+      <w:r>
+        <w:rPr>
+          <w:i/>
+          <w:iCs/>
+        </w:rPr>
+        <w:t xml:space="preserve">Environmental Science &amp; Policy</w:t>
+      </w:r>
+      <w:r>
+        <w:t xml:space="preserve"> </w:t>
+      </w:r>
+      <w:r>
+        <w:t xml:space="preserve">66 (December): 344–52.</w:t>
+      </w:r>
+      <w:r>
+        <w:t xml:space="preserve"> </w:t>
+      </w:r>
+      <w:hyperlink r:id="rId124">
+        <w:r>
+          <w:rPr>
+            <w:rStyle w:val="Hyperlink"/>
+          </w:rPr>
+          <w:t xml:space="preserve">https://doi.org/10.1016/j.envsci.2016.05.006</w:t>
+        </w:r>
+      </w:hyperlink>
+      <w:r>
+        <w:t xml:space="preserve">.</w:t>
       </w:r>
     </w:p>
-    <w:bookmarkEnd w:id="126"/>
-    <w:bookmarkStart w:id="128" w:name="ref-Ohlberger2018"/>
+    <w:bookmarkEnd w:id="125"/>
+    <w:bookmarkStart w:id="127" w:name="ref-Ohlberger2018"/>
     <w:p>
       <w:pPr>
         <w:pStyle w:val="Bibliography"/>
@@ -23642,7 +22875,7 @@
       <w:r>
         <w:t xml:space="preserve"> </w:t>
       </w:r>
-      <w:hyperlink r:id="rId127">
+      <w:hyperlink r:id="rId126">
         <w:r>
           <w:rPr>
             <w:rStyle w:val="Hyperlink"/>
@@ -23654,8 +22887,8 @@
         <w:t xml:space="preserve">.</w:t>
       </w:r>
     </w:p>
-    <w:bookmarkEnd w:id="128"/>
-    <w:bookmarkStart w:id="129" w:name="ref-Pareto1896"/>
+    <w:bookmarkEnd w:id="127"/>
+    <w:bookmarkStart w:id="128" w:name="ref-Pareto1896"/>
     <w:p>
       <w:pPr>
         <w:pStyle w:val="Bibliography"/>
@@ -23677,8 +22910,8 @@
         <w:t xml:space="preserve">. Lausanne.</w:t>
       </w:r>
     </w:p>
-    <w:bookmarkEnd w:id="129"/>
-    <w:bookmarkStart w:id="130" w:name="ref-SVAP1980"/>
+    <w:bookmarkEnd w:id="128"/>
+    <w:bookmarkStart w:id="129" w:name="ref-SVAP1980"/>
     <w:p>
       <w:pPr>
         <w:pStyle w:val="Bibliography"/>
@@ -23699,8 +22932,8 @@
         <w:t xml:space="preserve">.”</w:t>
       </w:r>
     </w:p>
-    <w:bookmarkEnd w:id="130"/>
-    <w:bookmarkStart w:id="132" w:name="ref-SiskiyouCounty2021"/>
+    <w:bookmarkEnd w:id="129"/>
+    <w:bookmarkStart w:id="131" w:name="ref-SiskiyouCounty2021"/>
     <w:p>
       <w:pPr>
         <w:pStyle w:val="Bibliography"/>
@@ -23729,7 +22962,7 @@
       <w:r>
         <w:t xml:space="preserve"> </w:t>
       </w:r>
-      <w:hyperlink r:id="rId131">
+      <w:hyperlink r:id="rId130">
         <w:r>
           <w:rPr>
             <w:rStyle w:val="Hyperlink"/>
@@ -23741,8 +22974,8 @@
         <w:t xml:space="preserve">.</w:t>
       </w:r>
     </w:p>
-    <w:bookmarkEnd w:id="132"/>
-    <w:bookmarkStart w:id="134" w:name="ref-SVGAC2021_June"/>
+    <w:bookmarkEnd w:id="131"/>
+    <w:bookmarkStart w:id="133" w:name="ref-SVGAC2021_June"/>
     <w:p>
       <w:pPr>
         <w:pStyle w:val="Bibliography"/>
@@ -23771,7 +23004,7 @@
       <w:r>
         <w:t xml:space="preserve"> </w:t>
       </w:r>
-      <w:hyperlink r:id="rId133">
+      <w:hyperlink r:id="rId132">
         <w:r>
           <w:rPr>
             <w:rStyle w:val="Hyperlink"/>
@@ -23783,8 +23016,8 @@
         <w:t xml:space="preserve">.</w:t>
       </w:r>
     </w:p>
-    <w:bookmarkEnd w:id="134"/>
-    <w:bookmarkStart w:id="136" w:name="ref-Sunding1996"/>
+    <w:bookmarkEnd w:id="133"/>
+    <w:bookmarkStart w:id="135" w:name="ref-Sunding1996"/>
     <w:p>
       <w:pPr>
         <w:pStyle w:val="Bibliography"/>
@@ -23823,7 +23056,7 @@
       <w:r>
         <w:t xml:space="preserve"> </w:t>
       </w:r>
-      <w:hyperlink r:id="rId135">
+      <w:hyperlink r:id="rId134">
         <w:r>
           <w:rPr>
             <w:rStyle w:val="Hyperlink"/>
@@ -23835,8 +23068,8 @@
         <w:t xml:space="preserve">.</w:t>
       </w:r>
     </w:p>
-    <w:bookmarkEnd w:id="136"/>
-    <w:bookmarkStart w:id="138" w:name="ref-SuperiorCourtofSiskiyouCounty1980"/>
+    <w:bookmarkEnd w:id="135"/>
+    <w:bookmarkStart w:id="137" w:name="ref-SuperiorCourtofSiskiyouCounty1980"/>
     <w:p>
       <w:pPr>
         <w:pStyle w:val="Bibliography"/>
@@ -23862,7 +23095,7 @@
       <w:r>
         <w:t xml:space="preserve"> </w:t>
       </w:r>
-      <w:hyperlink r:id="rId137">
+      <w:hyperlink r:id="rId136">
         <w:r>
           <w:rPr>
             <w:rStyle w:val="Hyperlink"/>
@@ -23874,8 +23107,8 @@
         <w:t xml:space="preserve">.</w:t>
       </w:r>
     </w:p>
-    <w:bookmarkEnd w:id="138"/>
-    <w:bookmarkStart w:id="140" w:name="ref-Tolley2019"/>
+    <w:bookmarkEnd w:id="137"/>
+    <w:bookmarkStart w:id="139" w:name="ref-Tolley2019"/>
     <w:p>
       <w:pPr>
         <w:pStyle w:val="Bibliography"/>
@@ -23914,7 +23147,7 @@
       <w:r>
         <w:t xml:space="preserve"> </w:t>
       </w:r>
-      <w:hyperlink r:id="rId139">
+      <w:hyperlink r:id="rId138">
         <w:r>
           <w:rPr>
             <w:rStyle w:val="Hyperlink"/>
@@ -23926,80 +23159,54 @@
         <w:t xml:space="preserve">.</w:t>
       </w:r>
     </w:p>
-    <w:bookmarkEnd w:id="140"/>
-    <w:bookmarkStart w:id="142" w:name="ref-USCensusBureau2018"/>
+    <w:bookmarkEnd w:id="139"/>
+    <w:bookmarkStart w:id="141" w:name="ref-VanSteenbergenPromoting2006"/>
     <w:p>
       <w:pPr>
         <w:pStyle w:val="Bibliography"/>
       </w:pPr>
       <w:r>
-        <w:t xml:space="preserve">U.S. Census Bureau. 2018.</w:t>
-      </w:r>
-      <w:r>
-        <w:t xml:space="preserve"> </w:t>
-      </w:r>
-      <w:r>
-        <w:t xml:space="preserve">“</w:t>
-      </w:r>
-      <w:r>
-        <w:t xml:space="preserve">2013-2017 American Community Survey 5-Year Estimates.</w:t>
-      </w:r>
-      <w:r>
-        <w:t xml:space="preserve">”</w:t>
-      </w:r>
-      <w:r>
-        <w:t xml:space="preserve"> </w:t>
-      </w:r>
-      <w:hyperlink r:id="rId141">
+        <w:t xml:space="preserve">Van Steenbergen, Frank. 2006.</w:t>
+      </w:r>
+      <w:r>
+        <w:t xml:space="preserve"> </w:t>
+      </w:r>
+      <w:r>
+        <w:t xml:space="preserve">“Promoting Local Management in Groundwater.”</w:t>
+      </w:r>
+      <w:r>
+        <w:t xml:space="preserve"> </w:t>
+      </w:r>
+      <w:r>
+        <w:rPr>
+          <w:i/>
+          <w:iCs/>
+        </w:rPr>
+        <w:t xml:space="preserve">Hydrogeology Journal</w:t>
+      </w:r>
+      <w:r>
+        <w:t xml:space="preserve"> </w:t>
+      </w:r>
+      <w:r>
+        <w:t xml:space="preserve">14 (3): 380–91.</w:t>
+      </w:r>
+      <w:r>
+        <w:t xml:space="preserve"> </w:t>
+      </w:r>
+      <w:hyperlink r:id="rId140">
         <w:r>
           <w:rPr>
             <w:rStyle w:val="Hyperlink"/>
           </w:rPr>
-          <w:t xml:space="preserve">http://www.dof.ca.gov/Reports/Demographic{\_}Reports/American{\_}Community{\_}Survey/{\#}ACS2017x5</w:t>
+          <w:t xml:space="preserve">https://doi.org/10.1007/s10040-005-0015-y</w:t>
         </w:r>
       </w:hyperlink>
       <w:r>
         <w:t xml:space="preserve">.</w:t>
       </w:r>
     </w:p>
-    <w:bookmarkEnd w:id="142"/>
-    <w:bookmarkStart w:id="144" w:name="ref-USCensus2021"/>
-    <w:p>
-      <w:pPr>
-        <w:pStyle w:val="Bibliography"/>
-      </w:pPr>
-      <w:r>
-        <w:t xml:space="preserve">———. 2021.</w:t>
-      </w:r>
-      <w:r>
-        <w:t xml:space="preserve"> </w:t>
-      </w:r>
-      <w:r>
-        <w:t xml:space="preserve">“</w:t>
-      </w:r>
-      <w:r>
-        <w:t xml:space="preserve">2020 Decennial Census</w:t>
-      </w:r>
-      <w:r>
-        <w:t xml:space="preserve">.”</w:t>
-      </w:r>
-      <w:r>
-        <w:t xml:space="preserve"> </w:t>
-      </w:r>
-      <w:hyperlink r:id="rId143">
-        <w:r>
-          <w:rPr>
-            <w:rStyle w:val="Hyperlink"/>
-          </w:rPr>
-          <w:t xml:space="preserve">https://data.census.gov/cedsci</w:t>
-        </w:r>
-      </w:hyperlink>
-      <w:r>
-        <w:t xml:space="preserve">.</w:t>
-      </w:r>
-    </w:p>
-    <w:bookmarkEnd w:id="144"/>
-    <w:bookmarkStart w:id="146" w:name="ref-Yeh1982"/>
+    <w:bookmarkEnd w:id="141"/>
+    <w:bookmarkStart w:id="143" w:name="ref-Yeh1982"/>
     <w:p>
       <w:pPr>
         <w:pStyle w:val="Bibliography"/>
@@ -24038,7 +23245,7 @@
       <w:r>
         <w:t xml:space="preserve"> </w:t>
       </w:r>
-      <w:hyperlink r:id="rId145">
+      <w:hyperlink r:id="rId142">
         <w:r>
           <w:rPr>
             <w:rStyle w:val="Hyperlink"/>
@@ -24050,8 +23257,8 @@
         <w:t xml:space="preserve">.</w:t>
       </w:r>
     </w:p>
-    <w:bookmarkEnd w:id="146"/>
-    <w:bookmarkStart w:id="147" w:name="ref-YSGA2022"/>
+    <w:bookmarkEnd w:id="143"/>
+    <w:bookmarkStart w:id="144" w:name="ref-YSGA2022"/>
     <w:p>
       <w:pPr>
         <w:pStyle w:val="Bibliography"/>
@@ -24078,9 +23285,9 @@
         <w:t xml:space="preserve">Woodland, CA.</w:t>
       </w:r>
     </w:p>
-    <w:bookmarkEnd w:id="147"/>
-    <w:bookmarkEnd w:id="148"/>
-    <w:bookmarkEnd w:id="149"/>
+    <w:bookmarkEnd w:id="144"/>
+    <w:bookmarkEnd w:id="145"/>
+    <w:bookmarkEnd w:id="146"/>
     <w:sectPr>
       <w:footnotePr>
         <w:numRestart w:val="eachSect"/>
@@ -24379,6 +23586,91 @@
       </w:pPr>
     </w:lvl>
   </w:abstractNum>
+  <w:abstractNum w:abstractNumId="99421">
+    <w:nsid w:val="00A99421"/>
+    <w:multiLevelType w:val="multilevel"/>
+    <w:lvl w:ilvl="0">
+      <w:start w:val="1"/>
+      <w:numFmt w:val="decimal"/>
+      <w:lvlText w:val="%1)"/>
+      <w:lvlJc w:val="left"/>
+      <w:pPr>
+        <w:ind w:left="720" w:hanging="360"/>
+      </w:pPr>
+    </w:lvl>
+    <w:lvl w:ilvl="1">
+      <w:start w:val="1"/>
+      <w:numFmt w:val="decimal"/>
+      <w:lvlText w:val="%2)"/>
+      <w:lvlJc w:val="left"/>
+      <w:pPr>
+        <w:ind w:left="1440" w:hanging="360"/>
+      </w:pPr>
+    </w:lvl>
+    <w:lvl w:ilvl="2">
+      <w:start w:val="1"/>
+      <w:numFmt w:val="decimal"/>
+      <w:lvlText w:val="%3)"/>
+      <w:lvlJc w:val="left"/>
+      <w:pPr>
+        <w:ind w:left="2160" w:hanging="360"/>
+      </w:pPr>
+    </w:lvl>
+    <w:lvl w:ilvl="3">
+      <w:start w:val="1"/>
+      <w:numFmt w:val="decimal"/>
+      <w:lvlText w:val="%4)"/>
+      <w:lvlJc w:val="left"/>
+      <w:pPr>
+        <w:ind w:left="2880" w:hanging="360"/>
+      </w:pPr>
+    </w:lvl>
+    <w:lvl w:ilvl="4">
+      <w:start w:val="1"/>
+      <w:numFmt w:val="decimal"/>
+      <w:lvlText w:val="%5)"/>
+      <w:lvlJc w:val="left"/>
+      <w:pPr>
+        <w:ind w:left="3600" w:hanging="360"/>
+      </w:pPr>
+    </w:lvl>
+    <w:lvl w:ilvl="5">
+      <w:start w:val="1"/>
+      <w:numFmt w:val="decimal"/>
+      <w:lvlText w:val="%6)"/>
+      <w:lvlJc w:val="left"/>
+      <w:pPr>
+        <w:ind w:left="4320" w:hanging="360"/>
+      </w:pPr>
+    </w:lvl>
+    <w:lvl w:ilvl="6">
+      <w:start w:val="1"/>
+      <w:numFmt w:val="decimal"/>
+      <w:lvlText w:val="%7)"/>
+      <w:lvlJc w:val="left"/>
+      <w:pPr>
+        <w:ind w:left="5040" w:hanging="360"/>
+      </w:pPr>
+    </w:lvl>
+    <w:lvl w:ilvl="7">
+      <w:start w:val="1"/>
+      <w:numFmt w:val="decimal"/>
+      <w:lvlText w:val="%8)"/>
+      <w:lvlJc w:val="left"/>
+      <w:pPr>
+        <w:ind w:left="5760" w:hanging="360"/>
+      </w:pPr>
+    </w:lvl>
+    <w:lvl w:ilvl="8">
+      <w:start w:val="1"/>
+      <w:numFmt w:val="decimal"/>
+      <w:lvlText w:val="%9)"/>
+      <w:lvlJc w:val="left"/>
+      <w:pPr>
+        <w:ind w:left="6480" w:hanging="360"/>
+      </w:pPr>
+    </w:lvl>
+  </w:abstractNum>
   <w:abstractNum w:abstractNumId="99410">
     <w:nsid w:val="00A99410"/>
     <w:multiLevelType w:val="multilevel"/>
@@ -24501,6 +23793,36 @@
     </w:lvlOverride>
   </w:num>
   <w:num w:numId="1003">
+    <w:abstractNumId w:val="99421"/>
+    <w:lvlOverride w:ilvl="0">
+      <w:startOverride w:val="1"/>
+    </w:lvlOverride>
+    <w:lvlOverride w:ilvl="1">
+      <w:startOverride w:val="1"/>
+    </w:lvlOverride>
+    <w:lvlOverride w:ilvl="2">
+      <w:startOverride w:val="1"/>
+    </w:lvlOverride>
+    <w:lvlOverride w:ilvl="3">
+      <w:startOverride w:val="1"/>
+    </w:lvlOverride>
+    <w:lvlOverride w:ilvl="4">
+      <w:startOverride w:val="1"/>
+    </w:lvlOverride>
+    <w:lvlOverride w:ilvl="5">
+      <w:startOverride w:val="1"/>
+    </w:lvlOverride>
+    <w:lvlOverride w:ilvl="6">
+      <w:startOverride w:val="1"/>
+    </w:lvlOverride>
+    <w:lvlOverride w:ilvl="7">
+      <w:startOverride w:val="1"/>
+    </w:lvlOverride>
+    <w:lvlOverride w:ilvl="8">
+      <w:startOverride w:val="1"/>
+    </w:lvlOverride>
+  </w:num>
+  <w:num w:numId="1004">
     <w:abstractNumId w:val="99410"/>
     <w:lvlOverride w:ilvl="0">
       <w:startOverride w:val="0"/>
@@ -24530,7 +23852,7 @@
       <w:startOverride w:val="0"/>
     </w:lvlOverride>
   </w:num>
-  <w:num w:numId="1004">
+  <w:num w:numId="1005">
     <w:abstractNumId w:val="991"/>
   </w:num>
 </w:numbering>

</xml_diff>

<commit_message>
small changes and rewriting
</commit_message>
<xml_diff>
--- a/Kouba_Fish_and_Ag_Benefit_MS.docx
+++ b/Kouba_Fish_and_Ag_Benefit_MS.docx
@@ -4480,45 +4480,7 @@
         <w:pStyle w:val="FirstParagraph"/>
       </w:pPr>
       <w:r>
-        <w:t xml:space="preserve">As discussed previously, balancing agricultural and environmental water demands in this watershed typically takes the form of seeking management actions that can improve flow conditions while minimizing the resulting reduction in agricultural water availability; in simple terms, to help fish while not harming farms. These objectives are non-commensurable (i.e., an estimated level of fish reproduction cannot be converted into units of agricultural productivity), making an explicit quantification and consideration of benefit trade-offs a critical feature of this decision-support analysis</w:t>
-      </w:r>
-      <w:r>
-        <w:t xml:space="preserve"> </w:t>
-      </w:r>
-      <w:r>
-        <w:t xml:space="preserve">(Cohon and Marks 1975)</w:t>
-      </w:r>
-      <w:r>
-        <w:t xml:space="preserve">. Environmental benefits are less commonly quantified than agricultural costs</w:t>
-      </w:r>
-      <w:r>
-        <w:t xml:space="preserve"> </w:t>
-      </w:r>
-      <w:r>
-        <w:t xml:space="preserve">(e.g., Sunding 1996, which assessed numerical costs of a management action and assumed qualitative environmental/human health benefits)</w:t>
-      </w:r>
-      <w:r>
-        <w:t xml:space="preserve">, but the HB function makes this trade-off quantification possible in the Scott Valley case.</w:t>
-      </w:r>
-    </w:p>
-    <w:p>
-      <w:pPr>
-        <w:pStyle w:val="BodyText"/>
-      </w:pPr>
-      <w:r>
-        <w:t xml:space="preserve">For this analysis, which is not intended to identify one</w:t>
-      </w:r>
-      <w:r>
-        <w:t xml:space="preserve"> </w:t>
-      </w:r>
-      <w:r>
-        <w:t xml:space="preserve">“best”</w:t>
-      </w:r>
-      <w:r>
-        <w:t xml:space="preserve"> </w:t>
-      </w:r>
-      <w:r>
-        <w:t xml:space="preserve">or optimal solution, these trade-offs can be considered using scenario objective value differences relative to their basecase (historical simulated) values. We will call this quantity the</w:t>
+        <w:t xml:space="preserve">Combining two of the three objectives, scenarios can also be compared in terms of environmental benefit per agricultural cost. This</w:t>
       </w:r>
       <w:r>
         <w:t xml:space="preserve"> </w:t>
@@ -4530,7 +4492,7 @@
         <w:t xml:space="preserve"> </w:t>
       </w:r>
       <w:r>
-        <w:t xml:space="preserve">of a management scenario. For a given scenario, the trade-off efficiency, or</w:t>
+        <w:t xml:space="preserve">of a management scenario, or</w:t>
       </w:r>
       <w:r>
         <w:t xml:space="preserve"> </w:t>
@@ -4586,46 +4548,158 @@
         <w:t xml:space="preserve">3</w:t>
       </w:r>
       <w:r>
-        <w:t xml:space="preserve">) (Equation (</w:t>
-      </w:r>
-      <w:r>
-        <w:t xml:space="preserve">??</w:t>
-      </w:r>
-      <w:r>
-        <w:t xml:space="preserve">)).</w:t>
+        <w:t xml:space="preserve">) (see equations below).</w:t>
       </w:r>
     </w:p>
     <w:p>
       <w:pPr>
         <w:pStyle w:val="BodyText"/>
       </w:pPr>
-      <w:r>
-        <w:t xml:space="preserve">An efficiency for a subset of years can be calculated by averaging the efficiency values over that set of water years only. The set of years with low basecase HB values (operationally defined as values lower than 45 coho spf-equivalent, composed of 1993, 1995, 2002, and 2014-16) is relevant to water managers (see Discussion), and is henceforth referred to as the set of</w:t>
-      </w:r>
-      <w:r>
-        <w:t xml:space="preserve"> </w:t>
-      </w:r>
-      <w:r>
-        <w:t xml:space="preserve">“low-coho”</w:t>
-      </w:r>
-      <w:r>
-        <w:t xml:space="preserve"> </w:t>
-      </w:r>
-      <w:r>
-        <w:t xml:space="preserve">years. A low-coho year efficiency was calculated in addition to the efficiencies averaged over all water years.</w:t>
-      </w:r>
+      <m:oMathPara>
+        <m:oMathParaPr>
+          <m:jc m:val="center"/>
+        </m:oMathParaPr>
+        <m:oMath>
+          <m:r>
+            <m:t>H</m:t>
+          </m:r>
+          <m:sSub>
+            <m:e>
+              <m:r>
+                <m:t>B</m:t>
+              </m:r>
+            </m:e>
+            <m:sub>
+              <m:r>
+                <m:t>a</m:t>
+              </m:r>
+              <m:r>
+                <m:t>v</m:t>
+              </m:r>
+              <m:r>
+                <m:t>g</m:t>
+              </m:r>
+            </m:sub>
+          </m:sSub>
+          <m:r>
+            <m:rPr>
+              <m:sty m:val="p"/>
+            </m:rPr>
+            <m:t>=</m:t>
+          </m:r>
+          <m:f>
+            <m:fPr>
+              <m:type m:val="bar"/>
+            </m:fPr>
+            <m:num>
+              <m:r>
+                <m:t>1</m:t>
+              </m:r>
+            </m:num>
+            <m:den>
+              <m:sSub>
+                <m:e>
+                  <m:r>
+                    <m:t>n</m:t>
+                  </m:r>
+                </m:e>
+                <m:sub>
+                  <m:r>
+                    <m:t>w</m:t>
+                  </m:r>
+                  <m:r>
+                    <m:t>y</m:t>
+                  </m:r>
+                </m:sub>
+              </m:sSub>
+            </m:den>
+          </m:f>
+          <m:nary>
+            <m:naryPr>
+              <m:chr m:val="∑"/>
+              <m:limLoc m:val="undOvr"/>
+              <m:subHide m:val="off"/>
+              <m:supHide m:val="off"/>
+            </m:naryPr>
+            <m:sub>
+              <m:r>
+                <m:t>i</m:t>
+              </m:r>
+              <m:r>
+                <m:rPr>
+                  <m:sty m:val="p"/>
+                </m:rPr>
+                <m:t>=</m:t>
+              </m:r>
+              <m:r>
+                <m:t>w</m:t>
+              </m:r>
+              <m:sSub>
+                <m:e>
+                  <m:r>
+                    <m:t>y</m:t>
+                  </m:r>
+                </m:e>
+                <m:sub>
+                  <m:r>
+                    <m:t>1</m:t>
+                  </m:r>
+                </m:sub>
+              </m:sSub>
+            </m:sub>
+            <m:sup>
+              <m:r>
+                <m:t>w</m:t>
+              </m:r>
+              <m:sSub>
+                <m:e>
+                  <m:r>
+                    <m:t>y</m:t>
+                  </m:r>
+                </m:e>
+                <m:sub>
+                  <m:r>
+                    <m:t>n</m:t>
+                  </m:r>
+                </m:sub>
+              </m:sSub>
+            </m:sup>
+            <m:e>
+              <m:r>
+                <m:t>H</m:t>
+              </m:r>
+              <m:sSub>
+                <m:e>
+                  <m:r>
+                    <m:t>B</m:t>
+                  </m:r>
+                </m:e>
+                <m:sub>
+                  <m:r>
+                    <m:t>w</m:t>
+                  </m:r>
+                  <m:sSub>
+                    <m:e>
+                      <m:r>
+                        <m:t>y</m:t>
+                      </m:r>
+                    </m:e>
+                    <m:sub>
+                      <m:r>
+                        <m:t>i</m:t>
+                      </m:r>
+                    </m:sub>
+                  </m:sSub>
+                </m:sub>
+              </m:sSub>
+            </m:e>
+          </m:nary>
+        </m:oMath>
+      </m:oMathPara>
     </w:p>
     <w:p>
       <w:pPr>
-        <w:pStyle w:val="BodyText"/>
-      </w:pPr>
-      <w:r>
-        <w:t xml:space="preserve">$$</w:t>
-      </w:r>
-    </w:p>
-    <w:p>
-      <w:pPr>
-        <w:pStyle w:val="BodyText"/>
+        <w:pStyle w:val="FirstParagraph"/>
       </w:pPr>
       <m:oMathPara>
         <m:oMathParaPr>
@@ -21872,7 +21946,7 @@
       </w:r>
     </w:p>
     <w:bookmarkEnd w:id="86"/>
-    <w:bookmarkStart w:id="146" w:name="references"/>
+    <w:bookmarkStart w:id="144" w:name="references"/>
     <w:p>
       <w:pPr>
         <w:pStyle w:val="Heading1"/>
@@ -21881,7 +21955,7 @@
         <w:t xml:space="preserve">References</w:t>
       </w:r>
     </w:p>
-    <w:bookmarkStart w:id="145" w:name="refs"/>
+    <w:bookmarkStart w:id="143" w:name="refs"/>
     <w:bookmarkStart w:id="88" w:name="ref-BorkHirokawaTrends2021"/>
     <w:p>
       <w:pPr>
@@ -22271,13 +22345,13 @@
       </w:r>
     </w:p>
     <w:bookmarkEnd w:id="103"/>
-    <w:bookmarkStart w:id="105" w:name="ref-Cohon1975"/>
+    <w:bookmarkStart w:id="105" w:name="ref-Foglia2013a"/>
     <w:p>
       <w:pPr>
         <w:pStyle w:val="Bibliography"/>
       </w:pPr>
       <w:r>
-        <w:t xml:space="preserve">———. 1975.</w:t>
+        <w:t xml:space="preserve">Foglia, Laura, Alison McNally, Courtney Hall, Lauren Ledesma, Ryan Hines, and Thomas Harter. 2013.</w:t>
       </w:r>
       <w:r>
         <w:t xml:space="preserve"> </w:t>
@@ -22286,7 +22360,7 @@
         <w:t xml:space="preserve">“</w:t>
       </w:r>
       <w:r>
-        <w:t xml:space="preserve">A review and evaluation of multiobjective programing techniques</w:t>
+        <w:t xml:space="preserve">Scott Valley Integrated Hydrologic Model : Data Collection , Analysis , and Water Budget</w:t>
       </w:r>
       <w:r>
         <w:t xml:space="preserve">.”</w:t>
@@ -22295,64 +22369,12 @@
         <w:t xml:space="preserve"> </w:t>
       </w:r>
       <w:r>
-        <w:rPr>
-          <w:i/>
-          <w:iCs/>
-        </w:rPr>
-        <w:t xml:space="preserve">Water Resources Research</w:t>
-      </w:r>
-      <w:r>
-        <w:t xml:space="preserve"> </w:t>
-      </w:r>
-      <w:r>
-        <w:t xml:space="preserve">11 (2): 208–20.</w:t>
+        <w:t xml:space="preserve">April. University of California, Davis.</w:t>
       </w:r>
       <w:r>
         <w:t xml:space="preserve"> </w:t>
       </w:r>
       <w:hyperlink r:id="rId104">
-        <w:r>
-          <w:rPr>
-            <w:rStyle w:val="Hyperlink"/>
-          </w:rPr>
-          <w:t xml:space="preserve">https://doi.org/10.1029/WR011i002p00208</w:t>
-        </w:r>
-      </w:hyperlink>
-      <w:r>
-        <w:t xml:space="preserve">.</w:t>
-      </w:r>
-    </w:p>
-    <w:bookmarkEnd w:id="105"/>
-    <w:bookmarkStart w:id="107" w:name="ref-Foglia2013a"/>
-    <w:p>
-      <w:pPr>
-        <w:pStyle w:val="Bibliography"/>
-      </w:pPr>
-      <w:r>
-        <w:t xml:space="preserve">Foglia, Laura, Alison McNally, Courtney Hall, Lauren Ledesma, Ryan Hines, and Thomas Harter. 2013.</w:t>
-      </w:r>
-      <w:r>
-        <w:t xml:space="preserve"> </w:t>
-      </w:r>
-      <w:r>
-        <w:t xml:space="preserve">“</w:t>
-      </w:r>
-      <w:r>
-        <w:t xml:space="preserve">Scott Valley Integrated Hydrologic Model : Data Collection , Analysis , and Water Budget</w:t>
-      </w:r>
-      <w:r>
-        <w:t xml:space="preserve">.”</w:t>
-      </w:r>
-      <w:r>
-        <w:t xml:space="preserve"> </w:t>
-      </w:r>
-      <w:r>
-        <w:t xml:space="preserve">April. University of California, Davis.</w:t>
-      </w:r>
-      <w:r>
-        <w:t xml:space="preserve"> </w:t>
-      </w:r>
-      <w:hyperlink r:id="rId106">
         <w:r>
           <w:rPr>
             <w:rStyle w:val="Hyperlink"/>
@@ -22364,8 +22386,8 @@
         <w:t xml:space="preserve">.</w:t>
       </w:r>
     </w:p>
-    <w:bookmarkEnd w:id="107"/>
-    <w:bookmarkStart w:id="109" w:name="ref-FCGMA2019"/>
+    <w:bookmarkEnd w:id="105"/>
+    <w:bookmarkStart w:id="107" w:name="ref-FCGMA2019"/>
     <w:p>
       <w:pPr>
         <w:pStyle w:val="Bibliography"/>
@@ -22394,7 +22416,7 @@
       <w:r>
         <w:t xml:space="preserve"> </w:t>
       </w:r>
-      <w:hyperlink r:id="rId108">
+      <w:hyperlink r:id="rId106">
         <w:r>
           <w:rPr>
             <w:rStyle w:val="Hyperlink"/>
@@ -22406,8 +22428,8 @@
         <w:t xml:space="preserve">.</w:t>
       </w:r>
     </w:p>
-    <w:bookmarkEnd w:id="109"/>
-    <w:bookmarkStart w:id="111" w:name="ref-FreemanWICKED2000"/>
+    <w:bookmarkEnd w:id="107"/>
+    <w:bookmarkStart w:id="109" w:name="ref-FreemanWICKED2000"/>
     <w:p>
       <w:pPr>
         <w:pStyle w:val="Bibliography"/>
@@ -22461,7 +22483,7 @@
       <w:r>
         <w:t xml:space="preserve"> </w:t>
       </w:r>
-      <w:hyperlink r:id="rId110">
+      <w:hyperlink r:id="rId108">
         <w:r>
           <w:rPr>
             <w:rStyle w:val="Hyperlink"/>
@@ -22473,8 +22495,8 @@
         <w:t xml:space="preserve">.</w:t>
       </w:r>
     </w:p>
-    <w:bookmarkEnd w:id="111"/>
-    <w:bookmarkStart w:id="113" w:name="ref-Harter2008"/>
+    <w:bookmarkEnd w:id="109"/>
+    <w:bookmarkStart w:id="111" w:name="ref-Harter2008"/>
     <w:p>
       <w:pPr>
         <w:pStyle w:val="Bibliography"/>
@@ -22503,7 +22525,7 @@
       <w:r>
         <w:t xml:space="preserve"> </w:t>
       </w:r>
-      <w:hyperlink r:id="rId112">
+      <w:hyperlink r:id="rId110">
         <w:r>
           <w:rPr>
             <w:rStyle w:val="Hyperlink"/>
@@ -22515,8 +22537,8 @@
         <w:t xml:space="preserve">.</w:t>
       </w:r>
     </w:p>
-    <w:bookmarkEnd w:id="113"/>
-    <w:bookmarkStart w:id="115" w:name="ref-Kapelan2005"/>
+    <w:bookmarkEnd w:id="111"/>
+    <w:bookmarkStart w:id="113" w:name="ref-Kapelan2005"/>
     <w:p>
       <w:pPr>
         <w:pStyle w:val="Bibliography"/>
@@ -22555,7 +22577,7 @@
       <w:r>
         <w:t xml:space="preserve"> </w:t>
       </w:r>
-      <w:hyperlink r:id="rId114">
+      <w:hyperlink r:id="rId112">
         <w:r>
           <w:rPr>
             <w:rStyle w:val="Hyperlink"/>
@@ -22567,8 +22589,8 @@
         <w:t xml:space="preserve">.</w:t>
       </w:r>
     </w:p>
-    <w:bookmarkEnd w:id="115"/>
-    <w:bookmarkStart w:id="117" w:name="ref-KoubaEtAlWatershedSpecific2025"/>
+    <w:bookmarkEnd w:id="113"/>
+    <w:bookmarkStart w:id="115" w:name="ref-KoubaEtAlWatershedSpecific2025"/>
     <w:p>
       <w:pPr>
         <w:pStyle w:val="Bibliography"/>
@@ -22622,7 +22644,7 @@
       <w:r>
         <w:t xml:space="preserve"> </w:t>
       </w:r>
-      <w:hyperlink r:id="rId116">
+      <w:hyperlink r:id="rId114">
         <w:r>
           <w:rPr>
             <w:rStyle w:val="Hyperlink"/>
@@ -22634,8 +22656,8 @@
         <w:t xml:space="preserve">.</w:t>
       </w:r>
     </w:p>
-    <w:bookmarkEnd w:id="117"/>
-    <w:bookmarkStart w:id="119" w:name="ref-Mack1958"/>
+    <w:bookmarkEnd w:id="115"/>
+    <w:bookmarkStart w:id="117" w:name="ref-Mack1958"/>
     <w:p>
       <w:pPr>
         <w:pStyle w:val="Bibliography"/>
@@ -22661,7 +22683,7 @@
       <w:r>
         <w:t xml:space="preserve"> </w:t>
       </w:r>
-      <w:hyperlink r:id="rId118">
+      <w:hyperlink r:id="rId116">
         <w:r>
           <w:rPr>
             <w:rStyle w:val="Hyperlink"/>
@@ -22673,8 +22695,8 @@
         <w:t xml:space="preserve">.</w:t>
       </w:r>
     </w:p>
-    <w:bookmarkEnd w:id="119"/>
-    <w:bookmarkStart w:id="121" w:name="ref-Mahoney1998"/>
+    <w:bookmarkEnd w:id="117"/>
+    <w:bookmarkStart w:id="119" w:name="ref-Mahoney1998"/>
     <w:p>
       <w:pPr>
         <w:pStyle w:val="Bibliography"/>
@@ -22713,7 +22735,7 @@
       <w:r>
         <w:t xml:space="preserve"> </w:t>
       </w:r>
-      <w:hyperlink r:id="rId120">
+      <w:hyperlink r:id="rId118">
         <w:r>
           <w:rPr>
             <w:rStyle w:val="Hyperlink"/>
@@ -22725,8 +22747,8 @@
         <w:t xml:space="preserve">.</w:t>
       </w:r>
     </w:p>
-    <w:bookmarkEnd w:id="121"/>
-    <w:bookmarkStart w:id="123" w:name="ref-Monarchi1973"/>
+    <w:bookmarkEnd w:id="119"/>
+    <w:bookmarkStart w:id="121" w:name="ref-Monarchi1973"/>
     <w:p>
       <w:pPr>
         <w:pStyle w:val="Bibliography"/>
@@ -22765,7 +22787,7 @@
       <w:r>
         <w:t xml:space="preserve"> </w:t>
       </w:r>
-      <w:hyperlink r:id="rId122">
+      <w:hyperlink r:id="rId120">
         <w:r>
           <w:rPr>
             <w:rStyle w:val="Hyperlink"/>
@@ -22777,8 +22799,8 @@
         <w:t xml:space="preserve">.</w:t>
       </w:r>
     </w:p>
-    <w:bookmarkEnd w:id="123"/>
-    <w:bookmarkStart w:id="125" w:name="ref-NordgrenEtAlSupporting2016"/>
+    <w:bookmarkEnd w:id="121"/>
+    <w:bookmarkStart w:id="123" w:name="ref-NordgrenEtAlSupporting2016"/>
     <w:p>
       <w:pPr>
         <w:pStyle w:val="Bibliography"/>
@@ -22823,7 +22845,7 @@
       <w:r>
         <w:t xml:space="preserve"> </w:t>
       </w:r>
-      <w:hyperlink r:id="rId124">
+      <w:hyperlink r:id="rId122">
         <w:r>
           <w:rPr>
             <w:rStyle w:val="Hyperlink"/>
@@ -22835,8 +22857,8 @@
         <w:t xml:space="preserve">.</w:t>
       </w:r>
     </w:p>
-    <w:bookmarkEnd w:id="125"/>
-    <w:bookmarkStart w:id="127" w:name="ref-Ohlberger2018"/>
+    <w:bookmarkEnd w:id="123"/>
+    <w:bookmarkStart w:id="125" w:name="ref-Ohlberger2018"/>
     <w:p>
       <w:pPr>
         <w:pStyle w:val="Bibliography"/>
@@ -22875,7 +22897,7 @@
       <w:r>
         <w:t xml:space="preserve"> </w:t>
       </w:r>
-      <w:hyperlink r:id="rId126">
+      <w:hyperlink r:id="rId124">
         <w:r>
           <w:rPr>
             <w:rStyle w:val="Hyperlink"/>
@@ -22887,8 +22909,8 @@
         <w:t xml:space="preserve">.</w:t>
       </w:r>
     </w:p>
-    <w:bookmarkEnd w:id="127"/>
-    <w:bookmarkStart w:id="128" w:name="ref-Pareto1896"/>
+    <w:bookmarkEnd w:id="125"/>
+    <w:bookmarkStart w:id="126" w:name="ref-Pareto1896"/>
     <w:p>
       <w:pPr>
         <w:pStyle w:val="Bibliography"/>
@@ -22910,8 +22932,8 @@
         <w:t xml:space="preserve">. Lausanne.</w:t>
       </w:r>
     </w:p>
-    <w:bookmarkEnd w:id="128"/>
-    <w:bookmarkStart w:id="129" w:name="ref-SVAP1980"/>
+    <w:bookmarkEnd w:id="126"/>
+    <w:bookmarkStart w:id="127" w:name="ref-SVAP1980"/>
     <w:p>
       <w:pPr>
         <w:pStyle w:val="Bibliography"/>
@@ -22932,8 +22954,8 @@
         <w:t xml:space="preserve">.”</w:t>
       </w:r>
     </w:p>
-    <w:bookmarkEnd w:id="129"/>
-    <w:bookmarkStart w:id="131" w:name="ref-SiskiyouCounty2021"/>
+    <w:bookmarkEnd w:id="127"/>
+    <w:bookmarkStart w:id="129" w:name="ref-SiskiyouCounty2021"/>
     <w:p>
       <w:pPr>
         <w:pStyle w:val="Bibliography"/>
@@ -22962,7 +22984,7 @@
       <w:r>
         <w:t xml:space="preserve"> </w:t>
       </w:r>
-      <w:hyperlink r:id="rId130">
+      <w:hyperlink r:id="rId128">
         <w:r>
           <w:rPr>
             <w:rStyle w:val="Hyperlink"/>
@@ -22974,8 +22996,8 @@
         <w:t xml:space="preserve">.</w:t>
       </w:r>
     </w:p>
-    <w:bookmarkEnd w:id="131"/>
-    <w:bookmarkStart w:id="133" w:name="ref-SVGAC2021_June"/>
+    <w:bookmarkEnd w:id="129"/>
+    <w:bookmarkStart w:id="131" w:name="ref-SVGAC2021_June"/>
     <w:p>
       <w:pPr>
         <w:pStyle w:val="Bibliography"/>
@@ -23004,7 +23026,7 @@
       <w:r>
         <w:t xml:space="preserve"> </w:t>
       </w:r>
-      <w:hyperlink r:id="rId132">
+      <w:hyperlink r:id="rId130">
         <w:r>
           <w:rPr>
             <w:rStyle w:val="Hyperlink"/>
@@ -23016,8 +23038,8 @@
         <w:t xml:space="preserve">.</w:t>
       </w:r>
     </w:p>
-    <w:bookmarkEnd w:id="133"/>
-    <w:bookmarkStart w:id="135" w:name="ref-Sunding1996"/>
+    <w:bookmarkEnd w:id="131"/>
+    <w:bookmarkStart w:id="133" w:name="ref-Sunding1996"/>
     <w:p>
       <w:pPr>
         <w:pStyle w:val="Bibliography"/>
@@ -23056,7 +23078,7 @@
       <w:r>
         <w:t xml:space="preserve"> </w:t>
       </w:r>
-      <w:hyperlink r:id="rId134">
+      <w:hyperlink r:id="rId132">
         <w:r>
           <w:rPr>
             <w:rStyle w:val="Hyperlink"/>
@@ -23068,8 +23090,8 @@
         <w:t xml:space="preserve">.</w:t>
       </w:r>
     </w:p>
-    <w:bookmarkEnd w:id="135"/>
-    <w:bookmarkStart w:id="137" w:name="ref-SuperiorCourtofSiskiyouCounty1980"/>
+    <w:bookmarkEnd w:id="133"/>
+    <w:bookmarkStart w:id="135" w:name="ref-SuperiorCourtofSiskiyouCounty1980"/>
     <w:p>
       <w:pPr>
         <w:pStyle w:val="Bibliography"/>
@@ -23095,7 +23117,7 @@
       <w:r>
         <w:t xml:space="preserve"> </w:t>
       </w:r>
-      <w:hyperlink r:id="rId136">
+      <w:hyperlink r:id="rId134">
         <w:r>
           <w:rPr>
             <w:rStyle w:val="Hyperlink"/>
@@ -23107,8 +23129,8 @@
         <w:t xml:space="preserve">.</w:t>
       </w:r>
     </w:p>
-    <w:bookmarkEnd w:id="137"/>
-    <w:bookmarkStart w:id="139" w:name="ref-Tolley2019"/>
+    <w:bookmarkEnd w:id="135"/>
+    <w:bookmarkStart w:id="137" w:name="ref-Tolley2019"/>
     <w:p>
       <w:pPr>
         <w:pStyle w:val="Bibliography"/>
@@ -23147,7 +23169,7 @@
       <w:r>
         <w:t xml:space="preserve"> </w:t>
       </w:r>
-      <w:hyperlink r:id="rId138">
+      <w:hyperlink r:id="rId136">
         <w:r>
           <w:rPr>
             <w:rStyle w:val="Hyperlink"/>
@@ -23159,8 +23181,8 @@
         <w:t xml:space="preserve">.</w:t>
       </w:r>
     </w:p>
-    <w:bookmarkEnd w:id="139"/>
-    <w:bookmarkStart w:id="141" w:name="ref-VanSteenbergenPromoting2006"/>
+    <w:bookmarkEnd w:id="137"/>
+    <w:bookmarkStart w:id="139" w:name="ref-VanSteenbergenPromoting2006"/>
     <w:p>
       <w:pPr>
         <w:pStyle w:val="Bibliography"/>
@@ -23193,7 +23215,7 @@
       <w:r>
         <w:t xml:space="preserve"> </w:t>
       </w:r>
-      <w:hyperlink r:id="rId140">
+      <w:hyperlink r:id="rId138">
         <w:r>
           <w:rPr>
             <w:rStyle w:val="Hyperlink"/>
@@ -23205,8 +23227,8 @@
         <w:t xml:space="preserve">.</w:t>
       </w:r>
     </w:p>
-    <w:bookmarkEnd w:id="141"/>
-    <w:bookmarkStart w:id="143" w:name="ref-Yeh1982"/>
+    <w:bookmarkEnd w:id="139"/>
+    <w:bookmarkStart w:id="141" w:name="ref-Yeh1982"/>
     <w:p>
       <w:pPr>
         <w:pStyle w:val="Bibliography"/>
@@ -23245,7 +23267,7 @@
       <w:r>
         <w:t xml:space="preserve"> </w:t>
       </w:r>
-      <w:hyperlink r:id="rId142">
+      <w:hyperlink r:id="rId140">
         <w:r>
           <w:rPr>
             <w:rStyle w:val="Hyperlink"/>
@@ -23257,8 +23279,8 @@
         <w:t xml:space="preserve">.</w:t>
       </w:r>
     </w:p>
-    <w:bookmarkEnd w:id="143"/>
-    <w:bookmarkStart w:id="144" w:name="ref-YSGA2022"/>
+    <w:bookmarkEnd w:id="141"/>
+    <w:bookmarkStart w:id="142" w:name="ref-YSGA2022"/>
     <w:p>
       <w:pPr>
         <w:pStyle w:val="Bibliography"/>
@@ -23285,9 +23307,9 @@
         <w:t xml:space="preserve">Woodland, CA.</w:t>
       </w:r>
     </w:p>
+    <w:bookmarkEnd w:id="142"/>
+    <w:bookmarkEnd w:id="143"/>
     <w:bookmarkEnd w:id="144"/>
-    <w:bookmarkEnd w:id="145"/>
-    <w:bookmarkEnd w:id="146"/>
     <w:sectPr>
       <w:footnotePr>
         <w:numRestart w:val="eachSect"/>

</xml_diff>

<commit_message>
begin rewrite jan 2026
</commit_message>
<xml_diff>
--- a/Kouba_Fish_and_Ag_Benefit_MS.docx
+++ b/Kouba_Fish_and_Ag_Benefit_MS.docx
@@ -143,7 +143,7 @@
         <w:t xml:space="preserve">(Freeman 2000)</w:t>
       </w:r>
       <w:r>
-        <w:t xml:space="preserve">. In this study, we take advantage of the authors’ involvement with an existing water resource planning process, and a previously-developed integrated surface- and groundwater model, to test the utility of introducing quantitative objective functions into the prioritization of groundwater management alternatives.</w:t>
+        <w:t xml:space="preserve">. In this study, we take advantage of the authors’ involvement with an existing water resource planning process, and a previously-developed integrated surface- and groundwater model, to test the utility of introducing quantitative objective functions into the prioritization of groundwater management alternatives in a case study jurisdiction.</w:t>
       </w:r>
     </w:p>
     <w:p>
@@ -192,7 +192,17 @@
         <w:t xml:space="preserve"> </w:t>
       </w:r>
       <w:r>
-        <w:t xml:space="preserve">(Monarchi, Kisiel, and Duckstein 1973)</w:t>
+        <w:t xml:space="preserve">(</w:t>
+      </w:r>
+      <w:r>
+        <w:rPr>
+          <w:b/>
+          <w:bCs/>
+        </w:rPr>
+        <w:t xml:space="preserve">Monarchi1973?</w:t>
+      </w:r>
+      <w:r>
+        <w:t xml:space="preserve">)</w:t>
       </w:r>
       <w:r>
         <w:t xml:space="preserve">. Consequently, multi-objective optimization studies commonly avoid proposing a single optimal solution; instead they identify a Pareto-optimal or non-inferior set of options, which can clarify the unavoidable trade-offs in the performance of various system objectives</w:t>
@@ -210,7 +220,46 @@
         <w:t xml:space="preserve"> </w:t>
       </w:r>
       <w:r>
-        <w:t xml:space="preserve">(e.g., Monarchi, Kisiel, and Duckstein 1973; Yeh and Becker 1982; Kapelan, Savic, and Walters 2005)</w:t>
+        <w:t xml:space="preserve">(e.g.,</w:t>
+      </w:r>
+      <w:r>
+        <w:t xml:space="preserve"> </w:t>
+      </w:r>
+      <w:r>
+        <w:rPr>
+          <w:b/>
+          <w:bCs/>
+        </w:rPr>
+        <w:t xml:space="preserve">Monarchi1973?</w:t>
+      </w:r>
+      <w:r>
+        <w:t xml:space="preserve">;</w:t>
+      </w:r>
+      <w:r>
+        <w:t xml:space="preserve"> </w:t>
+      </w:r>
+      <w:r>
+        <w:rPr>
+          <w:b/>
+          <w:bCs/>
+        </w:rPr>
+        <w:t xml:space="preserve">Yeh1982?</w:t>
+      </w:r>
+      <w:r>
+        <w:t xml:space="preserve">;</w:t>
+      </w:r>
+      <w:r>
+        <w:t xml:space="preserve"> </w:t>
+      </w:r>
+      <w:r>
+        <w:rPr>
+          <w:b/>
+          <w:bCs/>
+        </w:rPr>
+        <w:t xml:space="preserve">Kapelan2005?</w:t>
+      </w:r>
+      <w:r>
+        <w:t xml:space="preserve">)</w:t>
       </w:r>
       <w:r>
         <w:t xml:space="preserve">. In the case of the Scott Valley GSP, the management actions considered by stakeholders covered a wide range of decision variables (e.g., land use changes in a variety of spatial configurations, technology and/or infrastructure investment, and regulatory interventions on a range of growing season dates). Because a full randomized sampling of this decision space would be computationally prohibitive, this study instead focused on a set of simulated management scenarios that were effectively pre-screened by stakeholders for feasibility in the landscape of existing land uses and political dynamics.</w:t>
@@ -221,17 +270,10 @@
         <w:pStyle w:val="BodyText"/>
       </w:pPr>
       <w:r>
-        <w:t xml:space="preserve">In this study we developed numerical representations of three objectives: 1) maximizing specific environmental flows, 2) minimizing reduction in agricultural water supplies, and 3) minimizing new infrastructure costs. With these, we quantitatively summarized the management benefits and trade-offs within the existing suite of several dozen stakeholder-proposed management scenarios. Our hypothesis was that an explicit objective function framework would yield different prioritization of management actions than the set agreed upon in public meetings, as recorded in the 2021 GSP. This work could help frame ongoing water planning efforts in Scott Valley, and constitutes an approach for supporting locally-driven water planning efforts in California and elsewhere.</w:t>
-      </w:r>
-      <w:r>
-        <w:t xml:space="preserve"> </w:t>
-      </w:r>
-      <w:r>
-        <w:rPr>
-          <w:b/>
-          <w:bCs/>
-        </w:rPr>
-        <w:t xml:space="preserve">possibly remove final sentence</w:t>
+        <w:t xml:space="preserve">In this study we developed numerical representations of three objectives: 1) maximizing specific environmental flows, 2) minimizing reduction in agricultural water supplies, and 3) minimizing new infrastructure costs. With these, we quantitatively summarized the management benefits and trade-offs within the existing suite of several dozen stakeholder-proposed management scenarios. We hypothesized that an explicit objective function framework would yield different prioritization of management actions than the set agreed upon in public meetings (as recorded in the 2021 GSP) and potentially new insights about the holistic management option landscape.</w:t>
+      </w:r>
+      <w:r>
+        <w:t xml:space="preserve"> </w:t>
       </w:r>
     </w:p>
     <w:p>
@@ -348,37 +390,38 @@
         <w:t xml:space="preserve"> </w:t>
       </w:r>
       <w:r>
-        <w:t xml:space="preserve">(814 square mile) intermontane watershed known as Scott Valley. The valley floor overlies unconsolidated alluvial sediments of up to 79 m (260 ft) thickness</w:t>
-      </w:r>
-      <w:r>
-        <w:t xml:space="preserve"> </w:t>
-      </w:r>
-      <w:r>
-        <w:t xml:space="preserve">(SWRCB 1975)</w:t>
-      </w:r>
-      <w:r>
-        <w:t xml:space="preserve">. The sediments form a mostly unconfined aquifer system bordered by low permeable, fractured underlying and adjacent bedrock composed of mostly Paleozoic metasedimentary formations</w:t>
-      </w:r>
-      <w:r>
-        <w:t xml:space="preserve"> </w:t>
-      </w:r>
-      <w:r>
-        <w:t xml:space="preserve">(Mack 1958)</w:t>
-      </w:r>
-      <w:r>
-        <w:t xml:space="preserve">. A key stream gauge (USGS Station ID 11519500, or the Fort Jones Gauge or FJ Gauge) is used to assess hydrologic conditions and inform water management decisions in the populated areas of the valley</w:t>
-      </w:r>
-      <w:r>
-        <w:t xml:space="preserve"> </w:t>
-      </w:r>
-      <w:r>
-        <w:t xml:space="preserve">(e.g., Siskiyou County 2021)</w:t>
-      </w:r>
-      <w:r>
-        <w:t xml:space="preserve"> </w:t>
-      </w:r>
-      <w:r>
-        <w:t xml:space="preserve">(Figure</w:t>
+        <w:t xml:space="preserve">(814 square mile) intermontane watershed known as Scott Valley, with forested uplands and a largely agricultural valley floor (Figure</w:t>
+      </w:r>
+      <w:r>
+        <w:t xml:space="preserve"> </w:t>
+      </w:r>
+      <w:r>
+        <w:t xml:space="preserve">1</w:t>
+      </w:r>
+      <w:r>
+        <w:t xml:space="preserve">) overlying an alluvial aquifer up to 79 m (260 ft) thick</w:t>
+      </w:r>
+      <w:r>
+        <w:t xml:space="preserve"> </w:t>
+      </w:r>
+      <w:r>
+        <w:t xml:space="preserve">(SWRCB</w:t>
+      </w:r>
+      <w:r>
+        <w:t xml:space="preserve"> </w:t>
+      </w:r>
+      <w:r>
+        <w:rPr>
+          <w:b/>
+          <w:bCs/>
+        </w:rPr>
+        <w:t xml:space="preserve">SWRCB1975?</w:t>
+      </w:r>
+      <w:r>
+        <w:t xml:space="preserve">; Mack 1958)</w:t>
+      </w:r>
+      <w:r>
+        <w:t xml:space="preserve">. A key stream gauge (USGS Station ID 11519500, or the Fort Jones Gauge or FJ Gauge) is located downstream of the watershed’s cultivated areas (Figure</w:t>
       </w:r>
       <w:r>
         <w:t xml:space="preserve"> </w:t>
@@ -404,7 +447,7 @@
         <w:t xml:space="preserve">2</w:t>
       </w:r>
       <w:r>
-        <w:t xml:space="preserve">), panels A and B). Melting snowpack in the surrounding mountains generates streamflow from April through July, though onset and duration of snowmelt varies based on the snowpack volume and timing of warm air temperatures. This seasonality in water input creates seasonal flow in the Scott River and tributary streams, which experience a pronounced wet season and dry season with high and low flows, respectively (Figure</w:t>
+        <w:t xml:space="preserve">), panels A and B). Winter storms (October-April) and melting mountain snowpack (April-July) generate streamflow during the wet and growing seasons. As a result, the Scott River and tributary streams experience seasonal high and low flows (Figure</w:t>
       </w:r>
       <w:r>
         <w:t xml:space="preserve"> </w:t>
@@ -421,7 +464,16 @@
         <w:pStyle w:val="BodyText"/>
       </w:pPr>
       <w:r>
-        <w:t xml:space="preserve">Streams and groundwater are highly interconnected in the Scott River watershed. Tributary streams and the Scott River are a source of recharge to the aquifer, and groundwater discharge sustains streamflow in some areas, especially during the dry season of August-October or November. In the past two decades, in most dry-to-average type water years, the water table elevation has fallen below the stream bed and reaches of the Scott River have gone dry</w:t>
+        <w:t xml:space="preserve">Streams and groundwater are highly interconnected in the Scott River watershed</w:t>
+      </w:r>
+      <w:r>
+        <w:t xml:space="preserve"> </w:t>
+      </w:r>
+      <w:r>
+        <w:t xml:space="preserve">(Tolley, Foglia, and Harter 2019)</w:t>
+      </w:r>
+      <w:r>
+        <w:t xml:space="preserve">. Tributary streams and the Scott River are a source of recharge to the aquifer, and groundwater discharge sustains streamflow in some areas, especially during the dry season of August-October or November. Some streams are ephemeral, i.e., some tributaries or reaches of the Scott River go dry in average-to-dry water years</w:t>
       </w:r>
       <w:r>
         <w:t xml:space="preserve"> </w:t>
@@ -566,16 +618,39 @@
         <w:t xml:space="preserve"> </w:t>
       </w:r>
       <w:r>
-        <w:t xml:space="preserve">(Harter and Hines 2008)</w:t>
-      </w:r>
-      <w:r>
-        <w:t xml:space="preserve">. Much of the upper mountainous area of the watershed is part of the Klamath National Forest. On the valley floor, according to land use surveys conducted by DWR</w:t>
-      </w:r>
-      <w:r>
-        <w:t xml:space="preserve"> </w:t>
-      </w:r>
-      <w:r>
-        <w:t xml:space="preserve">(DWR 2017)</w:t>
+        <w:t xml:space="preserve">(</w:t>
+      </w:r>
+      <w:r>
+        <w:rPr>
+          <w:b/>
+          <w:bCs/>
+        </w:rPr>
+        <w:t xml:space="preserve">Harter2008?</w:t>
+      </w:r>
+      <w:r>
+        <w:t xml:space="preserve">)</w:t>
+      </w:r>
+      <w:r>
+        <w:t xml:space="preserve">. On the valley floor, according to land use surveys conducted by the California Department of Water Resources</w:t>
+      </w:r>
+      <w:r>
+        <w:t xml:space="preserve"> </w:t>
+      </w:r>
+      <w:r>
+        <w:t xml:space="preserve">(DWR</w:t>
+      </w:r>
+      <w:r>
+        <w:t xml:space="preserve"> </w:t>
+      </w:r>
+      <w:r>
+        <w:rPr>
+          <w:b/>
+          <w:bCs/>
+        </w:rPr>
+        <w:t xml:space="preserve">DWR2017?</w:t>
+      </w:r>
+      <w:r>
+        <w:t xml:space="preserve">)</w:t>
       </w:r>
       <w:r>
         <w:t xml:space="preserve">, half of the area overlying the alluvial aquifer is covered by agriculture, with most of that split approximately evenly between pasture and an alfalfa/grain rotation (Figure</w:t>
@@ -610,13 +685,29 @@
         <w:t xml:space="preserve"> </w:t>
       </w:r>
       <w:r>
-        <w:t xml:space="preserve">(Scott Valley Area Plan Committee 1980)</w:t>
-      </w:r>
-      <w:r>
-        <w:t xml:space="preserve">. Regulating land use to improve ecological outcomes entails significant economic, political and social risks, because much of the economic activity in this area is related to agriculture. In addition, Scott River conditions influence fish population dynamics both within the watershed and in the broader Klamath system.</w:t>
-      </w:r>
-      <w:r>
-        <w:t xml:space="preserve"> </w:t>
+        <w:t xml:space="preserve">(</w:t>
+      </w:r>
+      <w:r>
+        <w:rPr>
+          <w:b/>
+          <w:bCs/>
+        </w:rPr>
+        <w:t xml:space="preserve">SVAP1980?</w:t>
+      </w:r>
+      <w:r>
+        <w:t xml:space="preserve">)</w:t>
+      </w:r>
+      <w:r>
+        <w:t xml:space="preserve">. However, during recent declarations of emergency drought conditions, water use has been temporarily curtailed to preserve flows for aquatic species</w:t>
+      </w:r>
+      <w:r>
+        <w:t xml:space="preserve"> </w:t>
+      </w:r>
+      <w:r>
+        <w:t xml:space="preserve">(SWRCB 2021; SWRCB 2024; SWRCB 2024)</w:t>
+      </w:r>
+      <w:r>
+        <w:t xml:space="preserve">.</w:t>
       </w:r>
     </w:p>
     <w:p>
@@ -2146,7 +2237,17 @@
         <w:t xml:space="preserve"> </w:t>
       </w:r>
       <w:r>
-        <w:t xml:space="preserve">(Mahoney and Rood 1998)</w:t>
+        <w:t xml:space="preserve">(</w:t>
+      </w:r>
+      <w:r>
+        <w:rPr>
+          <w:b/>
+          <w:bCs/>
+        </w:rPr>
+        <w:t xml:space="preserve">Mahoney1998?</w:t>
+      </w:r>
+      <w:r>
+        <w:t xml:space="preserve">)</w:t>
       </w:r>
       <w:r>
         <w:t xml:space="preserve">; but in this work we focus on coho salmon as a straightforward examlple in developing an environmental objective function. Alternative objective function formulations are discussed in later sections.</w:t>
@@ -2176,34 +2277,26 @@
         <w:pStyle w:val="FirstParagraph"/>
       </w:pPr>
       <w:r>
-        <w:t xml:space="preserve">Agricultural water demand in Scott Valley has been simulated for a historical model period of water years 1991-2018 (Oct. 1 of 1990 to Sept. 30 of 2025), using the calibrated Scott Valley Integrated Hydrologic Model [SVIHM;</w:t>
-      </w:r>
-      <w:r>
-        <w:t xml:space="preserve"> </w:t>
-      </w:r>
-      <w:r>
-        <w:t xml:space="preserve">Harter and Hines (2008)</w:t>
-      </w:r>
-      <w:r>
-        <w:t xml:space="preserve">;</w:t>
-      </w:r>
-      <w:r>
-        <w:t xml:space="preserve"> </w:t>
-      </w:r>
-      <w:r>
-        <w:t xml:space="preserve">Foglia et al. (2013)</w:t>
-      </w:r>
-      <w:r>
-        <w:t xml:space="preserve">;</w:t>
-      </w:r>
-      <w:r>
-        <w:t xml:space="preserve"> </w:t>
-      </w:r>
-      <w:r>
-        <w:t xml:space="preserve">Tolley, Foglia, and Harter (2019)</w:t>
-      </w:r>
-      <w:r>
-        <w:t xml:space="preserve">]. Water demand for crops and native vegetation (ET in Figure</w:t>
+        <w:t xml:space="preserve">Agricultural water demand in Scott Valley has been simulated for a historical model period of Oct. 1, 1990 to Sept. 30, 2025, using the calibrated Scott Valley Integrated Hydrologic Model (SVIHM)</w:t>
+      </w:r>
+      <w:r>
+        <w:t xml:space="preserve"> </w:t>
+      </w:r>
+      <w:r>
+        <w:t xml:space="preserve">(</w:t>
+      </w:r>
+      <w:r>
+        <w:rPr>
+          <w:b/>
+          <w:bCs/>
+        </w:rPr>
+        <w:t xml:space="preserve">Harter2008?</w:t>
+      </w:r>
+      <w:r>
+        <w:t xml:space="preserve">; Foglia et al. 2013; Tolley, Foglia, and Harter 2019)</w:t>
+      </w:r>
+      <w:r>
+        <w:t xml:space="preserve">. Water demand for crops and native vegetation (ET in Figure</w:t>
       </w:r>
       <w:r>
         <w:t xml:space="preserve"> </w:t>
@@ -2221,7 +2314,7 @@
         <w:t xml:space="preserve">3</w:t>
       </w:r>
       <w:r>
-        <w:t xml:space="preserve">) are highest in the late summer. In dry water years, initial soil moisture levels may be lower, and irrigation demand may be somewhat higher, though annual crop ET and irrigation demand is relatively stable year to year Figure</w:t>
+        <w:t xml:space="preserve">) are highest in the late summer. Annual crop ET and irrigation demand is relatively stable year to year while precipitation, and thus recharge to groundwater, are more variable (Figure</w:t>
       </w:r>
       <w:r>
         <w:t xml:space="preserve"> </w:t>
@@ -2473,7 +2566,7 @@
         <w:t xml:space="preserve">“significant and unreasonable”</w:t>
       </w:r>
       <w:r>
-        <w:t xml:space="preserve">. The central undesirable result in Scott Valley is streamflow depletion due to groundwater pumping. Consequently, a central challenge of GSP development was defining a reasonable amount of streamflow depletion reversal, accounting for environmental water demand and what degree of agricultural water security was necessary to sustain the local economy.</w:t>
+        <w:t xml:space="preserve">. The central undesirable result in Scott Valley is streamflow depletion due to groundwater pumping. Consequently, a central challenge of GSP development was deciding the amount of (estimated) streamflow depletion that the GSA should aim to reverse, accounting for environmental water demand and what degree of water security was owed to local agriculture.</w:t>
       </w:r>
     </w:p>
     <w:p>
@@ -2481,7 +2574,7 @@
         <w:pStyle w:val="BodyText"/>
       </w:pPr>
       <w:r>
-        <w:t xml:space="preserve">The authors of this study simulated dozens of land and water use scenarios to facilitate the comparison of management alternatives that could reduce streamflow depletion to various degrees. Simulations were conducted with a spatially explicit, integrated surface water-groundwater model</w:t>
+        <w:t xml:space="preserve">During GSP development, the authors of this study simulated dozens of land and water use scenarios to facilitate the comparison of management alternatives that could reduce streamflow depletion to various degrees. Simulations were conducted with a spatially explicit, integrated surface water-groundwater model</w:t>
       </w:r>
       <w:r>
         <w:t xml:space="preserve"> </w:t>
@@ -2572,7 +2665,7 @@
         <w:pStyle w:val="BodyText"/>
       </w:pPr>
       <w:r>
-        <w:t xml:space="preserve">For GSP development, SVIHM was used extensively to perform what-if scenarios using the historic climate and land use forcing period, 1991-2018. (For purposes of this study, the model period has been extended through Sept. 30, 2025.) Scenario simulations repeat the calibrated historical basecase simulation of SVIHM using specified sets of changes in SVIHM boundary conditions (BCs). The set of changes in the BCs of a particular scenario represent specific changes in land use, irrigation management, climate, water management rules, etc. Scenario outcomes are compared against those of the basecase simulation. Key results of each SVIHM scenario, used in the objective functions described below, are:</w:t>
+        <w:t xml:space="preserve">For GSP development, SVIHM was used extensively to perform what-if scenarios using the historic climate and land use forcing period, covering 1991-2018. (For purposes of this study, the model period has been extended through Sept. 30, 2025.) Scenario simulations repeat the calibrated historical basecase simulation of SVIHM using specified sets of changes in SVIHM boundary conditions (BCs). The set of changes in the BCs of a particular scenario represent specific changes in land use, irrigation management, climate, water management rules, etc. Scenario outcomes are compared against those of the basecase simulation. Key results of each SVIHM scenario, used in the objective functions described below, are:</w:t>
       </w:r>
     </w:p>
     <w:p>
@@ -5328,7 +5421,17 @@
         <w:t xml:space="preserve"> </w:t>
       </w:r>
       <w:r>
-        <w:t xml:space="preserve">(Pareto 1896)</w:t>
+        <w:t xml:space="preserve">(</w:t>
+      </w:r>
+      <w:r>
+        <w:rPr>
+          <w:b/>
+          <w:bCs/>
+        </w:rPr>
+        <w:t xml:space="preserve">Pareto1896?</w:t>
+      </w:r>
+      <w:r>
+        <w:t xml:space="preserve">)</w:t>
       </w:r>
       <w:r>
         <w:t xml:space="preserve">. A scenario was identified as Pareto-optimal if there were no other scenarios that performed better in two or more objectives. In other words, the Pareto-optimal set is the collection of scenarios in which it is not possible to improve on one objective without reducing performance in another objective. By definition, this set cannot identify a single best scenario or evaluate trade-offs between objectives; we use it here to identify obviously suboptimal scenarios.</w:t>
@@ -8417,7 +8520,20 @@
         <w:t xml:space="preserve"> </w:t>
       </w:r>
       <w:r>
-        <w:t xml:space="preserve">(CDFW 2021)</w:t>
+        <w:t xml:space="preserve">(CDFW</w:t>
+      </w:r>
+      <w:r>
+        <w:t xml:space="preserve"> </w:t>
+      </w:r>
+      <w:r>
+        <w:rPr>
+          <w:b/>
+          <w:bCs/>
+        </w:rPr>
+        <w:t xml:space="preserve">CDFW2021c?</w:t>
+      </w:r>
+      <w:r>
+        <w:t xml:space="preserve">)</w:t>
       </w:r>
       <w:r>
         <w:t xml:space="preserve">. The mean ET values of scenarios in these two categories are 103 to 117 million m</w:t>
@@ -8452,7 +8568,20 @@
         <w:t xml:space="preserve"> </w:t>
       </w:r>
       <w:r>
-        <w:t xml:space="preserve">(CDFW 2017)</w:t>
+        <w:t xml:space="preserve">(CDFW</w:t>
+      </w:r>
+      <w:r>
+        <w:t xml:space="preserve"> </w:t>
+      </w:r>
+      <w:r>
+        <w:rPr>
+          <w:b/>
+          <w:bCs/>
+        </w:rPr>
+        <w:t xml:space="preserve">CDFW2017?</w:t>
+      </w:r>
+      <w:r>
+        <w:t xml:space="preserve">)</w:t>
       </w:r>
       <w:r>
         <w:t xml:space="preserve">. Under this Low Flow Diversion Limits scenario, the mean crop ET volume is 4 million m</w:t>
@@ -8561,7 +8690,17 @@
         <w:t xml:space="preserve"> </w:t>
       </w:r>
       <w:r>
-        <w:t xml:space="preserve">(Superior Court of Siskiyou County 1980)</w:t>
+        <w:t xml:space="preserve">(</w:t>
+      </w:r>
+      <w:r>
+        <w:rPr>
+          <w:b/>
+          <w:bCs/>
+        </w:rPr>
+        <w:t xml:space="preserve">SuperiorCourtofSiskiyouCounty1980?</w:t>
+      </w:r>
+      <w:r>
+        <w:t xml:space="preserve">)</w:t>
       </w:r>
       <w:r>
         <w:t xml:space="preserve">, referred to here as the</w:t>
@@ -21250,7 +21389,20 @@
         <w:t xml:space="preserve"> </w:t>
       </w:r>
       <w:r>
-        <w:t xml:space="preserve">(CDFW 2015)</w:t>
+        <w:t xml:space="preserve">(CDFW</w:t>
+      </w:r>
+      <w:r>
+        <w:t xml:space="preserve"> </w:t>
+      </w:r>
+      <w:r>
+        <w:rPr>
+          <w:b/>
+          <w:bCs/>
+        </w:rPr>
+        <w:t xml:space="preserve">CDFW2015a?</w:t>
+      </w:r>
+      <w:r>
+        <w:t xml:space="preserve">)</w:t>
       </w:r>
       <w:r>
         <w:t xml:space="preserve">.</w:t>
@@ -21267,7 +21419,17 @@
         <w:t xml:space="preserve"> </w:t>
       </w:r>
       <w:r>
-        <w:t xml:space="preserve">(Sunding 1996)</w:t>
+        <w:t xml:space="preserve">(</w:t>
+      </w:r>
+      <w:r>
+        <w:rPr>
+          <w:b/>
+          <w:bCs/>
+        </w:rPr>
+        <w:t xml:space="preserve">Sunding1996?</w:t>
+      </w:r>
+      <w:r>
+        <w:t xml:space="preserve">)</w:t>
       </w:r>
       <w:r>
         <w:t xml:space="preserve">. In the public meetings during GSP development, some informal (i.e., non-quantitative) surveying of stakeholder expectations of the costs of management actions took place. In terms of operational impacts, Scott Valley agricultural stakeholders stated that short-term interventions (such as fallowing an alfalfa field for one year, or curtailing pasture irrigation for a growing season) could have long-term impacts (such as affecting alfalfa yield the following year, or forcing a rancher to sell a herd</w:t>
@@ -21276,7 +21438,20 @@
         <w:t xml:space="preserve"> </w:t>
       </w:r>
       <w:r>
-        <w:t xml:space="preserve">(SVGAC 2021)</w:t>
+        <w:t xml:space="preserve">(SVGAC</w:t>
+      </w:r>
+      <w:r>
+        <w:t xml:space="preserve"> </w:t>
+      </w:r>
+      <w:r>
+        <w:rPr>
+          <w:b/>
+          <w:bCs/>
+        </w:rPr>
+        <w:t xml:space="preserve">SVGAC2021_June?</w:t>
+      </w:r>
+      <w:r>
+        <w:t xml:space="preserve">)</w:t>
       </w:r>
       <w:r>
         <w:t xml:space="preserve">. The current agricultural benefit proxy, annual crop ET, does not capture these multi-year costs to the local agricultural sector, or the regional impact that reduced agricultural productivity will have on economically disadvantaged local communities.</w:t>
@@ -21320,7 +21495,20 @@
         <w:t xml:space="preserve"> </w:t>
       </w:r>
       <w:r>
-        <w:t xml:space="preserve">(e.g., Ohlberger et al. 2018)</w:t>
+        <w:t xml:space="preserve">(e.g.,</w:t>
+      </w:r>
+      <w:r>
+        <w:t xml:space="preserve"> </w:t>
+      </w:r>
+      <w:r>
+        <w:rPr>
+          <w:b/>
+          <w:bCs/>
+        </w:rPr>
+        <w:t xml:space="preserve">Ohlberger2018?</w:t>
+      </w:r>
+      <w:r>
+        <w:t xml:space="preserve">)</w:t>
       </w:r>
       <w:r>
         <w:t xml:space="preserve">. Eight dry years occurred during the 1991-2018 model period: 1991, ’92, ’94, 2001, ’09, ’13, ’14, and ’18 (Figure</w:t>
@@ -21864,7 +22052,20 @@
         <w:t xml:space="preserve"> </w:t>
       </w:r>
       <w:r>
-        <w:t xml:space="preserve">(CDFW 2021)</w:t>
+        <w:t xml:space="preserve">(CDFW</w:t>
+      </w:r>
+      <w:r>
+        <w:t xml:space="preserve"> </w:t>
+      </w:r>
+      <w:r>
+        <w:rPr>
+          <w:b/>
+          <w:bCs/>
+        </w:rPr>
+        <w:t xml:space="preserve">CDFW2021c?</w:t>
+      </w:r>
+      <w:r>
+        <w:t xml:space="preserve">)</w:t>
       </w:r>
       <w:r>
         <w:t xml:space="preserve">. The objective function summary of existing model results could help stakeholders and regulators weigh the trade-offs of various actions and potential irrigation cutoff dates in the context of the consequences of other proposed management scenarios. The modeling results suggest that if a decision is made to regulate water use, some later intervention dates may produce minimal gains in environmental flows in some water years (e.g., an alfalfa irrigation cutoff date of August 15 in water years 1995 or 2002 in panel A of Figure</w:t>
@@ -21946,17 +22147,36 @@
       </w:r>
     </w:p>
     <w:bookmarkEnd w:id="86"/>
-    <w:bookmarkStart w:id="144" w:name="references"/>
+    <w:bookmarkStart w:id="87" w:name="acknowledgments"/>
     <w:p>
       <w:pPr>
         <w:pStyle w:val="Heading1"/>
       </w:pPr>
       <w:r>
+        <w:t xml:space="preserve">Acknowledgments</w:t>
+      </w:r>
+    </w:p>
+    <w:bookmarkEnd w:id="87"/>
+    <w:bookmarkStart w:id="116" w:name="references"/>
+    <w:p>
+      <w:pPr>
+        <w:pStyle w:val="Heading1"/>
+      </w:pPr>
+      <w:r>
+        <w:rPr>
+          <w:rStyle w:val="SectionNumber"/>
+        </w:rPr>
+        <w:t xml:space="preserve">6</w:t>
+      </w:r>
+      <w:r>
+        <w:tab/>
+      </w:r>
+      <w:r>
         <w:t xml:space="preserve">References</w:t>
       </w:r>
     </w:p>
-    <w:bookmarkStart w:id="143" w:name="refs"/>
-    <w:bookmarkStart w:id="88" w:name="ref-BorkHirokawaTrends2021"/>
+    <w:bookmarkStart w:id="115" w:name="refs"/>
+    <w:bookmarkStart w:id="89" w:name="ref-BorkHirokawaTrends2021"/>
     <w:p>
       <w:pPr>
         <w:pStyle w:val="Bibliography"/>
@@ -21998,7 +22218,7 @@
       <w:r>
         <w:t xml:space="preserve"> </w:t>
       </w:r>
-      <w:hyperlink r:id="rId87">
+      <w:hyperlink r:id="rId88">
         <w:r>
           <w:rPr>
             <w:rStyle w:val="Hyperlink"/>
@@ -22010,8 +22230,8 @@
         <w:t xml:space="preserve">.</w:t>
       </w:r>
     </w:p>
-    <w:bookmarkEnd w:id="88"/>
-    <w:bookmarkStart w:id="90" w:name="ref-Brown1994"/>
+    <w:bookmarkEnd w:id="89"/>
+    <w:bookmarkStart w:id="91" w:name="ref-BrownEtAlHistorical1994"/>
     <w:p>
       <w:pPr>
         <w:pStyle w:val="Bibliography"/>
@@ -22023,10 +22243,49 @@
         <w:t xml:space="preserve"> </w:t>
       </w:r>
       <w:r>
-        <w:t xml:space="preserve">“</w:t>
-      </w:r>
-      <w:r>
-        <w:t xml:space="preserve">Historical Decline and Current Status of Coho Salmon in California</w:t>
+        <w:t xml:space="preserve">“Historical</w:t>
+      </w:r>
+      <w:r>
+        <w:t xml:space="preserve"> </w:t>
+      </w:r>
+      <w:r>
+        <w:t xml:space="preserve">Decline</w:t>
+      </w:r>
+      <w:r>
+        <w:t xml:space="preserve"> </w:t>
+      </w:r>
+      <w:r>
+        <w:t xml:space="preserve">and</w:t>
+      </w:r>
+      <w:r>
+        <w:t xml:space="preserve"> </w:t>
+      </w:r>
+      <w:r>
+        <w:t xml:space="preserve">Current Status</w:t>
+      </w:r>
+      <w:r>
+        <w:t xml:space="preserve"> </w:t>
+      </w:r>
+      <w:r>
+        <w:t xml:space="preserve">of</w:t>
+      </w:r>
+      <w:r>
+        <w:t xml:space="preserve"> </w:t>
+      </w:r>
+      <w:r>
+        <w:t xml:space="preserve">Coho Salmon</w:t>
+      </w:r>
+      <w:r>
+        <w:t xml:space="preserve"> </w:t>
+      </w:r>
+      <w:r>
+        <w:t xml:space="preserve">in</w:t>
+      </w:r>
+      <w:r>
+        <w:t xml:space="preserve"> </w:t>
+      </w:r>
+      <w:r>
+        <w:t xml:space="preserve">California</w:t>
       </w:r>
       <w:r>
         <w:t xml:space="preserve">.”</w:t>
@@ -22050,171 +22309,116 @@
       <w:r>
         <w:t xml:space="preserve"> </w:t>
       </w:r>
-      <w:hyperlink r:id="rId89">
+      <w:hyperlink r:id="rId90">
         <w:r>
           <w:rPr>
             <w:rStyle w:val="Hyperlink"/>
           </w:rPr>
-          <w:t xml:space="preserve">https://doi.org/10.1577/1548-8675(1994)014&lt;0237:hdacso&gt;2.3.co;2</w:t>
+          <w:t xml:space="preserve">https://doi.org/10.1577/1548-8675(1994)014&lt;0237:HDACSO&gt;2.3.CO;2</w:t>
         </w:r>
       </w:hyperlink>
       <w:r>
         <w:t xml:space="preserve">.</w:t>
       </w:r>
     </w:p>
-    <w:bookmarkEnd w:id="90"/>
-    <w:bookmarkStart w:id="92" w:name="ref-CDFW2015a"/>
+    <w:bookmarkEnd w:id="91"/>
+    <w:bookmarkStart w:id="93" w:name="ref-CarterSheafferAlfalfa1983"/>
     <w:p>
       <w:pPr>
         <w:pStyle w:val="Bibliography"/>
       </w:pPr>
       <w:r>
-        <w:t xml:space="preserve">California Department of Fish and Wildlife (CDFW). 2015.</w:t>
-      </w:r>
-      <w:r>
-        <w:t xml:space="preserve"> </w:t>
-      </w:r>
-      <w:r>
-        <w:t xml:space="preserve">“</w:t>
-      </w:r>
-      <w:r>
-        <w:t xml:space="preserve">Cooperative Report of the Scott River Coho Salmon Rescue and Relocation Effort: 2014 Drought Emergency</w:t>
-      </w:r>
-      <w:r>
-        <w:t xml:space="preserve">.”</w:t>
-      </w:r>
-      <w:r>
-        <w:t xml:space="preserve"> </w:t>
-      </w:r>
-      <w:r>
-        <w:t xml:space="preserve">August. California Department of Fish; Wildlife (CDFW).</w:t>
-      </w:r>
-      <w:r>
-        <w:t xml:space="preserve"> </w:t>
-      </w:r>
-      <w:hyperlink r:id="rId91">
-        <w:r>
-          <w:rPr>
-            <w:rStyle w:val="Hyperlink"/>
-          </w:rPr>
-          <w:t xml:space="preserve">https://www.fs.usda.gov/Internet/FSE{\_}DOCUMENTS/stelprd3850544.pdf</w:t>
-        </w:r>
-      </w:hyperlink>
+        <w:t xml:space="preserve">Carter, P. R., and C. C. Sheaffer. 1983.</w:t>
+      </w:r>
+      <w:r>
+        <w:t xml:space="preserve"> </w:t>
+      </w:r>
+      <w:r>
+        <w:t xml:space="preserve">“Alfalfa</w:t>
+      </w:r>
+      <w:r>
+        <w:t xml:space="preserve"> </w:t>
+      </w:r>
+      <w:r>
+        <w:t xml:space="preserve">Response</w:t>
+      </w:r>
+      <w:r>
+        <w:t xml:space="preserve"> </w:t>
+      </w:r>
+      <w:r>
+        <w:t xml:space="preserve">to</w:t>
+      </w:r>
+      <w:r>
+        <w:t xml:space="preserve"> </w:t>
+      </w:r>
+      <w:r>
+        <w:t xml:space="preserve">Soil Water Deficits</w:t>
+      </w:r>
       <w:r>
         <w:t xml:space="preserve">.</w:t>
       </w:r>
-    </w:p>
-    <w:bookmarkEnd w:id="92"/>
-    <w:bookmarkStart w:id="94" w:name="ref-CDFW2017"/>
-    <w:p>
-      <w:pPr>
-        <w:pStyle w:val="Bibliography"/>
-      </w:pPr>
-      <w:r>
-        <w:t xml:space="preserve">———. 2017.</w:t>
-      </w:r>
-      <w:r>
-        <w:t xml:space="preserve"> </w:t>
-      </w:r>
-      <w:r>
-        <w:t xml:space="preserve">“</w:t>
-      </w:r>
-      <w:r>
-        <w:t xml:space="preserve">Interim Instream Flow Criteria for the Protection of Fishery</w:t>
-      </w:r>
-      <w:r>
-        <w:t xml:space="preserve">.”</w:t>
-      </w:r>
-      <w:r>
-        <w:t xml:space="preserve"> </w:t>
-      </w:r>
-      <w:hyperlink r:id="rId93">
-        <w:r>
-          <w:rPr>
-            <w:rStyle w:val="Hyperlink"/>
-          </w:rPr>
-          <w:t xml:space="preserve">file:///Users/kelseymcneill/Downloads/Scott River{\_}FINAL 02-10-17.pdf</w:t>
-        </w:r>
-      </w:hyperlink>
+      <w:r>
+        <w:t xml:space="preserve"> </w:t>
+      </w:r>
+      <w:r>
+        <w:t xml:space="preserve">I</w:t>
+      </w:r>
       <w:r>
         <w:t xml:space="preserve">.</w:t>
       </w:r>
-    </w:p>
-    <w:bookmarkEnd w:id="94"/>
-    <w:bookmarkStart w:id="96" w:name="ref-DWR2017"/>
-    <w:p>
-      <w:pPr>
-        <w:pStyle w:val="Bibliography"/>
-      </w:pPr>
-      <w:r>
-        <w:t xml:space="preserve">California Department of Water Resources (DWR). 2017.</w:t>
-      </w:r>
-      <w:r>
-        <w:t xml:space="preserve"> </w:t>
-      </w:r>
-      <w:r>
-        <w:t xml:space="preserve">“</w:t>
-      </w:r>
-      <w:r>
-        <w:t xml:space="preserve">Crop Mapping 2016</w:t>
-      </w:r>
-      <w:r>
-        <w:t xml:space="preserve">.”</w:t>
-      </w:r>
-      <w:r>
-        <w:t xml:space="preserve"> </w:t>
-      </w:r>
-      <w:hyperlink r:id="rId95">
-        <w:r>
-          <w:rPr>
-            <w:rStyle w:val="Hyperlink"/>
-          </w:rPr>
-          <w:t xml:space="preserve">https://data.cnra.ca.gov/dataset/crop-mapping-2016</w:t>
-        </w:r>
-      </w:hyperlink>
-      <w:r>
-        <w:t xml:space="preserve">.</w:t>
-      </w:r>
-    </w:p>
-    <w:bookmarkEnd w:id="96"/>
-    <w:bookmarkStart w:id="97" w:name="ref-SWRCB1975"/>
-    <w:p>
-      <w:pPr>
-        <w:pStyle w:val="Bibliography"/>
-      </w:pPr>
-      <w:r>
-        <w:t xml:space="preserve">California State Water Resources Control Board (SWRCB). 1975.</w:t>
-      </w:r>
-      <w:r>
-        <w:t xml:space="preserve"> </w:t>
-      </w:r>
-      <w:r>
-        <w:t xml:space="preserve">“</w:t>
-      </w:r>
-      <w:r>
-        <w:t xml:space="preserve">Report on Hydrogeologic Conditions, Scott River Valley, Scott River Valley</w:t>
-      </w:r>
-      <w:r>
-        <w:t xml:space="preserve">.”</w:t>
-      </w:r>
-    </w:p>
-    <w:bookmarkEnd w:id="97"/>
-    <w:bookmarkStart w:id="99" w:name="ref-Carter1983"/>
-    <w:p>
-      <w:pPr>
-        <w:pStyle w:val="Bibliography"/>
-      </w:pPr>
-      <w:r>
-        <w:t xml:space="preserve">Carter, P. R., and C. C. Sheaffer. 1983.</w:t>
-      </w:r>
-      <w:r>
-        <w:t xml:space="preserve">“</w:t>
-      </w:r>
-      <w:r>
-        <w:t xml:space="preserve">Alfalfa Response to Soil Water Deficits. I. Growth, Forage Quality, Yield, Water Use, and Water‐Use Efficiency 1</w:t>
-      </w:r>
-      <w:r>
-        <w:t xml:space="preserve"> </w:t>
+      <w:r>
+        <w:t xml:space="preserve"> </w:t>
+      </w:r>
+      <w:r>
+        <w:t xml:space="preserve">Growth</w:t>
+      </w:r>
+      <w:r>
+        <w:t xml:space="preserve">,</w:t>
+      </w:r>
+      <w:r>
+        <w:t xml:space="preserve"> </w:t>
+      </w:r>
+      <w:r>
+        <w:t xml:space="preserve">Forage Quality</w:t>
+      </w:r>
+      <w:r>
+        <w:t xml:space="preserve">,</w:t>
+      </w:r>
+      <w:r>
+        <w:t xml:space="preserve"> </w:t>
+      </w:r>
+      <w:r>
+        <w:t xml:space="preserve">Yield</w:t>
+      </w:r>
+      <w:r>
+        <w:t xml:space="preserve">,</w:t>
+      </w:r>
+      <w:r>
+        <w:t xml:space="preserve"> </w:t>
+      </w:r>
+      <w:r>
+        <w:t xml:space="preserve">Water Use</w:t>
+      </w:r>
+      <w:r>
+        <w:t xml:space="preserve">, and</w:t>
+      </w:r>
+      <w:r>
+        <w:t xml:space="preserve"> </w:t>
+      </w:r>
+      <w:r>
+        <w:t xml:space="preserve">Water</w:t>
+      </w:r>
+      <w:r>
+        <w:t xml:space="preserve">-</w:t>
+      </w:r>
+      <w:r>
+        <w:t xml:space="preserve">Use Efficiency</w:t>
+      </w:r>
+      <w:r>
+        <w:rPr>
+          <w:vertAlign w:val="superscript"/>
+        </w:rPr>
+        <w:t xml:space="preserve">1</w:t>
       </w:r>
       <w:r>
         <w:t xml:space="preserve">.”</w:t>
@@ -22238,80 +22442,32 @@
       <w:r>
         <w:t xml:space="preserve"> </w:t>
       </w:r>
-      <w:hyperlink r:id="rId98">
+      <w:hyperlink r:id="rId92">
         <w:r>
           <w:rPr>
             <w:rStyle w:val="Hyperlink"/>
           </w:rPr>
-          <w:t xml:space="preserve">https://doi.org/10.2135/cropsci1983.0011183x002300040016x</w:t>
+          <w:t xml:space="preserve">https://doi.org/10.2135/cropsci1983.0011183X002300040016x</w:t>
         </w:r>
       </w:hyperlink>
       <w:r>
         <w:t xml:space="preserve">.</w:t>
       </w:r>
     </w:p>
-    <w:bookmarkEnd w:id="99"/>
-    <w:bookmarkStart w:id="101" w:name="ref-CDFW2021c"/>
+    <w:bookmarkEnd w:id="93"/>
+    <w:bookmarkStart w:id="95" w:name="ref-CohonMarksMultiobjective1973"/>
     <w:p>
       <w:pPr>
         <w:pStyle w:val="Bibliography"/>
       </w:pPr>
       <w:r>
-        <w:t xml:space="preserve">CDFW. 2021.</w:t>
-      </w:r>
-      <w:r>
-        <w:t xml:space="preserve"> </w:t>
-      </w:r>
-      <w:r>
-        <w:t xml:space="preserve">“</w:t>
-      </w:r>
-      <w:r>
-        <w:t xml:space="preserve">Minimum Flow Recommendations for the Shasta and Scott Rivers to Inform the 2021 Drought Emergency Regulations</w:t>
-      </w:r>
-      <w:r>
-        <w:t xml:space="preserve">.”</w:t>
-      </w:r>
-      <w:r>
-        <w:t xml:space="preserve"> </w:t>
-      </w:r>
-      <w:r>
-        <w:t xml:space="preserve">Redding, CA: CDFW to the SWB.</w:t>
-      </w:r>
-      <w:r>
-        <w:t xml:space="preserve"> </w:t>
-      </w:r>
-      <w:hyperlink r:id="rId100">
-        <w:r>
-          <w:rPr>
-            <w:rStyle w:val="Hyperlink"/>
-          </w:rPr>
-          <w:t xml:space="preserve">https://www.waterboards.ca.gov/drought/scott{\_}shasta{\_}rivers/docs/swb{\_}2021{\_}shasta{\_}scott{\_}drought{\_}emergency{\_}final.pdf</w:t>
-        </w:r>
-      </w:hyperlink>
-      <w:r>
-        <w:t xml:space="preserve">.</w:t>
-      </w:r>
-    </w:p>
-    <w:bookmarkEnd w:id="101"/>
-    <w:bookmarkStart w:id="103" w:name="ref-Cohon1973"/>
-    <w:p>
-      <w:pPr>
-        <w:pStyle w:val="Bibliography"/>
-      </w:pPr>
-      <w:r>
         <w:t xml:space="preserve">Cohon, Jared L., and David H. Marks. 1973.</w:t>
       </w:r>
       <w:r>
         <w:t xml:space="preserve"> </w:t>
       </w:r>
       <w:r>
-        <w:t xml:space="preserve">“</w:t>
-      </w:r>
-      <w:r>
-        <w:t xml:space="preserve">Multiobjective screening models and water resource investment</w:t>
-      </w:r>
-      <w:r>
-        <w:t xml:space="preserve">.”</w:t>
+        <w:t xml:space="preserve">“Multiobjective Screening Models and Water Resource Investment.”</w:t>
       </w:r>
       <w:r>
         <w:t xml:space="preserve"> </w:t>
@@ -22332,7 +22488,7 @@
       <w:r>
         <w:t xml:space="preserve"> </w:t>
       </w:r>
-      <w:hyperlink r:id="rId102">
+      <w:hyperlink r:id="rId94">
         <w:r>
           <w:rPr>
             <w:rStyle w:val="Hyperlink"/>
@@ -22344,23 +22500,50 @@
         <w:t xml:space="preserve">.</w:t>
       </w:r>
     </w:p>
-    <w:bookmarkEnd w:id="103"/>
-    <w:bookmarkStart w:id="105" w:name="ref-Foglia2013a"/>
+    <w:bookmarkEnd w:id="95"/>
+    <w:bookmarkStart w:id="96" w:name="X57acf74f4e6bbb2dbfb24b295bee561f3691de6"/>
     <w:p>
       <w:pPr>
         <w:pStyle w:val="Bibliography"/>
       </w:pPr>
       <w:r>
-        <w:t xml:space="preserve">Foglia, Laura, Alison McNally, Courtney Hall, Lauren Ledesma, Ryan Hines, and Thomas Harter. 2013.</w:t>
-      </w:r>
-      <w:r>
-        <w:t xml:space="preserve"> </w:t>
-      </w:r>
-      <w:r>
-        <w:t xml:space="preserve">“</w:t>
-      </w:r>
-      <w:r>
-        <w:t xml:space="preserve">Scott Valley Integrated Hydrologic Model : Data Collection , Analysis , and Water Budget</w:t>
+        <w:t xml:space="preserve">“Establishment of</w:t>
+      </w:r>
+      <w:r>
+        <w:t xml:space="preserve"> </w:t>
+      </w:r>
+      <w:r>
+        <w:t xml:space="preserve">Minimum Instream Flow Requirements</w:t>
+      </w:r>
+      <w:r>
+        <w:t xml:space="preserve">,</w:t>
+      </w:r>
+      <w:r>
+        <w:t xml:space="preserve"> </w:t>
+      </w:r>
+      <w:r>
+        <w:t xml:space="preserve">Curtailment Authority</w:t>
+      </w:r>
+      <w:r>
+        <w:t xml:space="preserve">, and</w:t>
+      </w:r>
+      <w:r>
+        <w:t xml:space="preserve"> </w:t>
+      </w:r>
+      <w:r>
+        <w:t xml:space="preserve">Information Order Authority</w:t>
+      </w:r>
+      <w:r>
+        <w:t xml:space="preserve"> </w:t>
+      </w:r>
+      <w:r>
+        <w:t xml:space="preserve">in the</w:t>
+      </w:r>
+      <w:r>
+        <w:t xml:space="preserve"> </w:t>
+      </w:r>
+      <w:r>
+        <w:t xml:space="preserve">Klamath Watershed</w:t>
       </w:r>
       <w:r>
         <w:t xml:space="preserve">.”</w:t>
@@ -22369,40 +22552,65 @@
         <w:t xml:space="preserve"> </w:t>
       </w:r>
       <w:r>
-        <w:t xml:space="preserve">April. University of California, Davis.</w:t>
-      </w:r>
-      <w:r>
-        <w:t xml:space="preserve"> </w:t>
-      </w:r>
-      <w:hyperlink r:id="rId104">
-        <w:r>
-          <w:rPr>
-            <w:rStyle w:val="Hyperlink"/>
-          </w:rPr>
-          <w:t xml:space="preserve">http://groundwater.ucdavis.edu/files/165395.pdf</w:t>
-        </w:r>
-      </w:hyperlink>
-      <w:r>
-        <w:t xml:space="preserve">.</w:t>
+        <w:t xml:space="preserve">2021. {{NOTICE OF APPROVAL OF EMERGENCY REGULATORY ACTION}}.</w:t>
       </w:r>
     </w:p>
-    <w:bookmarkEnd w:id="105"/>
-    <w:bookmarkStart w:id="107" w:name="ref-FCGMA2019"/>
+    <w:bookmarkEnd w:id="96"/>
+    <w:bookmarkStart w:id="97" w:name="X6facecaac3164717d4e5933b1aebd85f9388655"/>
     <w:p>
       <w:pPr>
         <w:pStyle w:val="Bibliography"/>
       </w:pPr>
       <w:r>
-        <w:t xml:space="preserve">Fox Canyon Groundwater Management Agency. 2019.</w:t>
-      </w:r>
-      <w:r>
-        <w:t xml:space="preserve"> </w:t>
-      </w:r>
-      <w:r>
-        <w:t xml:space="preserve">“</w:t>
-      </w:r>
-      <w:r>
-        <w:t xml:space="preserve">Groundwater Sustainability Plan for the Oxnard Subbasin</w:t>
+        <w:t xml:space="preserve">“Establishment of</w:t>
+      </w:r>
+      <w:r>
+        <w:t xml:space="preserve"> </w:t>
+      </w:r>
+      <w:r>
+        <w:t xml:space="preserve">Minimum Instream Flow Requirements</w:t>
+      </w:r>
+      <w:r>
+        <w:t xml:space="preserve">,</w:t>
+      </w:r>
+      <w:r>
+        <w:t xml:space="preserve"> </w:t>
+      </w:r>
+      <w:r>
+        <w:t xml:space="preserve">Curtailment Authority</w:t>
+      </w:r>
+      <w:r>
+        <w:t xml:space="preserve">, and</w:t>
+      </w:r>
+      <w:r>
+        <w:t xml:space="preserve"> </w:t>
+      </w:r>
+      <w:r>
+        <w:t xml:space="preserve">Information Order Authority</w:t>
+      </w:r>
+      <w:r>
+        <w:t xml:space="preserve"> </w:t>
+      </w:r>
+      <w:r>
+        <w:t xml:space="preserve">in the</w:t>
+      </w:r>
+      <w:r>
+        <w:t xml:space="preserve"> </w:t>
+      </w:r>
+      <w:r>
+        <w:t xml:space="preserve">Scott River</w:t>
+      </w:r>
+      <w:r>
+        <w:t xml:space="preserve"> </w:t>
+      </w:r>
+      <w:r>
+        <w:t xml:space="preserve">and</w:t>
+      </w:r>
+      <w:r>
+        <w:t xml:space="preserve"> </w:t>
+      </w:r>
+      <w:r>
+        <w:t xml:space="preserve">Shasta River Watersheds</w:t>
       </w:r>
       <w:r>
         <w:t xml:space="preserve">.”</w:t>
@@ -22411,30 +22619,117 @@
         <w:t xml:space="preserve"> </w:t>
       </w:r>
       <w:r>
-        <w:t xml:space="preserve">December. Ventura, CA.</w:t>
-      </w:r>
-      <w:r>
-        <w:t xml:space="preserve"> </w:t>
-      </w:r>
-      <w:hyperlink r:id="rId106">
-        <w:r>
-          <w:rPr>
-            <w:rStyle w:val="Hyperlink"/>
-          </w:rPr>
-          <w:t xml:space="preserve">https://fcgma.org/groundwater-sustainability-plan</w:t>
-        </w:r>
-      </w:hyperlink>
-      <w:r>
-        <w:t xml:space="preserve">.</w:t>
+        <w:t xml:space="preserve">2024. {{NOTICE OF APPROVAL OF EMERGENCY REGULATORY ACTION}}.</w:t>
       </w:r>
     </w:p>
-    <w:bookmarkEnd w:id="107"/>
-    <w:bookmarkStart w:id="109" w:name="ref-FreemanWICKED2000"/>
+    <w:bookmarkEnd w:id="97"/>
+    <w:bookmarkStart w:id="98" w:name="ref-FogliaEtAlScott2013"/>
     <w:p>
       <w:pPr>
         <w:pStyle w:val="Bibliography"/>
       </w:pPr>
       <w:r>
+        <w:t xml:space="preserve">Foglia, Laura, Alison McNally, Courtney Hall, Lauren Ledesma, Ryan Hines, and Thomas Harter. 2013.</w:t>
+      </w:r>
+      <w:r>
+        <w:t xml:space="preserve"> </w:t>
+      </w:r>
+      <w:r>
+        <w:t xml:space="preserve">“Scott</w:t>
+      </w:r>
+      <w:r>
+        <w:t xml:space="preserve"> </w:t>
+      </w:r>
+      <w:r>
+        <w:t xml:space="preserve">Valley Integrated Hydrologic Model</w:t>
+      </w:r>
+      <w:r>
+        <w:t xml:space="preserve">:</w:t>
+      </w:r>
+      <w:r>
+        <w:t xml:space="preserve"> </w:t>
+      </w:r>
+      <w:r>
+        <w:t xml:space="preserve">Data Collection</w:t>
+      </w:r>
+      <w:r>
+        <w:t xml:space="preserve">,</w:t>
+      </w:r>
+      <w:r>
+        <w:t xml:space="preserve"> </w:t>
+      </w:r>
+      <w:r>
+        <w:t xml:space="preserve">Analysis</w:t>
+      </w:r>
+      <w:r>
+        <w:t xml:space="preserve">, and</w:t>
+      </w:r>
+      <w:r>
+        <w:t xml:space="preserve"> </w:t>
+      </w:r>
+      <w:r>
+        <w:t xml:space="preserve">Water Budget</w:t>
+      </w:r>
+      <w:r>
+        <w:t xml:space="preserve">.”</w:t>
+      </w:r>
+      <w:r>
+        <w:t xml:space="preserve"> </w:t>
+      </w:r>
+      <w:r>
+        <w:t xml:space="preserve">Davis, CA: North Coast Regional Water Quality Control Board.</w:t>
+      </w:r>
+    </w:p>
+    <w:bookmarkEnd w:id="98"/>
+    <w:bookmarkStart w:id="99" w:name="Xff198d1a9510a26c6b6a97c9924d7fdc8be1418"/>
+    <w:p>
+      <w:pPr>
+        <w:pStyle w:val="Bibliography"/>
+      </w:pPr>
+      <w:r>
+        <w:t xml:space="preserve">Fox Canyon Groundwater Management Agency. 2019.</w:t>
+      </w:r>
+      <w:r>
+        <w:t xml:space="preserve"> </w:t>
+      </w:r>
+      <w:r>
+        <w:t xml:space="preserve">“Groundwater</w:t>
+      </w:r>
+      <w:r>
+        <w:t xml:space="preserve"> </w:t>
+      </w:r>
+      <w:r>
+        <w:t xml:space="preserve">Sustainability Plan</w:t>
+      </w:r>
+      <w:r>
+        <w:t xml:space="preserve"> </w:t>
+      </w:r>
+      <w:r>
+        <w:t xml:space="preserve">for the</w:t>
+      </w:r>
+      <w:r>
+        <w:t xml:space="preserve"> </w:t>
+      </w:r>
+      <w:r>
+        <w:t xml:space="preserve">Oxnard Subbasin</w:t>
+      </w:r>
+      <w:r>
+        <w:t xml:space="preserve">.”</w:t>
+      </w:r>
+      <w:r>
+        <w:t xml:space="preserve"> </w:t>
+      </w:r>
+      <w:r>
+        <w:t xml:space="preserve">Ventura, CA: Fox Canyon Groundwater Manegement Agency.</w:t>
+      </w:r>
+    </w:p>
+    <w:bookmarkEnd w:id="99"/>
+    <w:bookmarkStart w:id="101" w:name="ref-FreemanWICKED2000"/>
+    <w:p>
+      <w:pPr>
+        <w:pStyle w:val="Bibliography"/>
+      </w:pPr>
+      <w:r>
         <w:t xml:space="preserve">Freeman, David M. 2000.</w:t>
       </w:r>
       <w:r>
@@ -22454,12 +22749,6 @@
       </w:r>
       <w:r>
         <w:t xml:space="preserve">SOCIOLOGY AND LOCAL WATER ORGANIZATIONS IN ADDRESSING WATER RESOURCES POLICY</w:t>
-      </w:r>
-      <w:r>
-        <w:rPr>
-          <w:vertAlign w:val="superscript"/>
-        </w:rPr>
-        <w:t xml:space="preserve">1</w:t>
       </w:r>
       <w:r>
         <w:t xml:space="preserve">.”</w:t>
@@ -22472,7 +22761,7 @@
           <w:i/>
           <w:iCs/>
         </w:rPr>
-        <w:t xml:space="preserve">JAWRA Journal of the American Water Resources Association</w:t>
+        <w:t xml:space="preserve">Journal of the American Water Resources Association</w:t>
       </w:r>
       <w:r>
         <w:t xml:space="preserve"> </w:t>
@@ -22483,7 +22772,7 @@
       <w:r>
         <w:t xml:space="preserve"> </w:t>
       </w:r>
-      <w:hyperlink r:id="rId108">
+      <w:hyperlink r:id="rId100">
         <w:r>
           <w:rPr>
             <w:rStyle w:val="Hyperlink"/>
@@ -22495,102 +22784,8 @@
         <w:t xml:space="preserve">.</w:t>
       </w:r>
     </w:p>
-    <w:bookmarkEnd w:id="109"/>
-    <w:bookmarkStart w:id="111" w:name="ref-Harter2008"/>
-    <w:p>
-      <w:pPr>
-        <w:pStyle w:val="Bibliography"/>
-      </w:pPr>
-      <w:r>
-        <w:t xml:space="preserve">Harter, Thomas, and Ryan Hines. 2008.</w:t>
-      </w:r>
-      <w:r>
-        <w:t xml:space="preserve"> </w:t>
-      </w:r>
-      <w:r>
-        <w:t xml:space="preserve">“</w:t>
-      </w:r>
-      <w:r>
-        <w:t xml:space="preserve">Scott Valley Community Groundwater Study Plan</w:t>
-      </w:r>
-      <w:r>
-        <w:t xml:space="preserve">.”</w:t>
-      </w:r>
-      <w:r>
-        <w:t xml:space="preserve"> </w:t>
-      </w:r>
-      <w:r>
-        <w:t xml:space="preserve">Davis. CA: Groundwater Cooperative Extension Program University of California, Davis.</w:t>
-      </w:r>
-      <w:r>
-        <w:t xml:space="preserve"> </w:t>
-      </w:r>
-      <w:hyperlink r:id="rId110">
-        <w:r>
-          <w:rPr>
-            <w:rStyle w:val="Hyperlink"/>
-          </w:rPr>
-          <w:t xml:space="preserve">http://groundwater.ucdavis.edu/files/136426.pdf</w:t>
-        </w:r>
-      </w:hyperlink>
-      <w:r>
-        <w:t xml:space="preserve">.</w:t>
-      </w:r>
-    </w:p>
-    <w:bookmarkEnd w:id="111"/>
-    <w:bookmarkStart w:id="113" w:name="ref-Kapelan2005"/>
-    <w:p>
-      <w:pPr>
-        <w:pStyle w:val="Bibliography"/>
-      </w:pPr>
-      <w:r>
-        <w:t xml:space="preserve">Kapelan, Zoran S., Dragan A. Savic, and Godfrey A. Walters. 2005.</w:t>
-      </w:r>
-      <w:r>
-        <w:t xml:space="preserve"> </w:t>
-      </w:r>
-      <w:r>
-        <w:t xml:space="preserve">“</w:t>
-      </w:r>
-      <w:r>
-        <w:t xml:space="preserve">Multiobjective design of water distribution systems under uncertainty</w:t>
-      </w:r>
-      <w:r>
-        <w:t xml:space="preserve">.”</w:t>
-      </w:r>
-      <w:r>
-        <w:t xml:space="preserve"> </w:t>
-      </w:r>
-      <w:r>
-        <w:rPr>
-          <w:i/>
-          <w:iCs/>
-        </w:rPr>
-        <w:t xml:space="preserve">Water Resources Research</w:t>
-      </w:r>
-      <w:r>
-        <w:t xml:space="preserve"> </w:t>
-      </w:r>
-      <w:r>
-        <w:t xml:space="preserve">41 (11): 1–15.</w:t>
-      </w:r>
-      <w:r>
-        <w:t xml:space="preserve"> </w:t>
-      </w:r>
-      <w:hyperlink r:id="rId112">
-        <w:r>
-          <w:rPr>
-            <w:rStyle w:val="Hyperlink"/>
-          </w:rPr>
-          <w:t xml:space="preserve">https://doi.org/10.1029/2004WR003787</w:t>
-        </w:r>
-      </w:hyperlink>
-      <w:r>
-        <w:t xml:space="preserve">.</w:t>
-      </w:r>
-    </w:p>
-    <w:bookmarkEnd w:id="113"/>
-    <w:bookmarkStart w:id="115" w:name="ref-KoubaEtAlWatershedSpecific2025"/>
+    <w:bookmarkEnd w:id="101"/>
+    <w:bookmarkStart w:id="103" w:name="ref-KoubaEtAlWatershedSpecific2025"/>
     <w:p>
       <w:pPr>
         <w:pStyle w:val="Bibliography"/>
@@ -22644,7 +22839,7 @@
       <w:r>
         <w:t xml:space="preserve"> </w:t>
       </w:r>
-      <w:hyperlink r:id="rId114">
+      <w:hyperlink r:id="rId102">
         <w:r>
           <w:rPr>
             <w:rStyle w:val="Hyperlink"/>
@@ -22656,8 +22851,8 @@
         <w:t xml:space="preserve">.</w:t>
       </w:r>
     </w:p>
-    <w:bookmarkEnd w:id="115"/>
-    <w:bookmarkStart w:id="117" w:name="ref-Mack1958"/>
+    <w:bookmarkEnd w:id="103"/>
+    <w:bookmarkStart w:id="105" w:name="ref-MackGeology1958"/>
     <w:p>
       <w:pPr>
         <w:pStyle w:val="Bibliography"/>
@@ -22669,138 +22864,58 @@
         <w:t xml:space="preserve"> </w:t>
       </w:r>
       <w:r>
-        <w:t xml:space="preserve">“</w:t>
-      </w:r>
-      <w:r>
-        <w:t xml:space="preserve">Geology and Ground-Water Features of Scott Valley Siskiyou County, California.</w:t>
-      </w:r>
-      <w:r>
-        <w:t xml:space="preserve">”</w:t>
-      </w:r>
-      <w:r>
-        <w:t xml:space="preserve"> Geological Survey Water-Supply Paper 1462.</w:t>
-      </w:r>
-      <w:r>
-        <w:t xml:space="preserve"> </w:t>
-      </w:r>
-      <w:hyperlink r:id="rId116">
+        <w:t xml:space="preserve">“Geology and Ground-Water Features of</w:t>
+      </w:r>
+      <w:r>
+        <w:t xml:space="preserve"> </w:t>
+      </w:r>
+      <w:r>
+        <w:t xml:space="preserve">Scott Valley</w:t>
+      </w:r>
+      <w:r>
+        <w:t xml:space="preserve">,</w:t>
+      </w:r>
+      <w:r>
+        <w:t xml:space="preserve"> </w:t>
+      </w:r>
+      <w:r>
+        <w:t xml:space="preserve">Siskiyou County</w:t>
+      </w:r>
+      <w:r>
+        <w:t xml:space="preserve">,</w:t>
+      </w:r>
+      <w:r>
+        <w:t xml:space="preserve"> </w:t>
+      </w:r>
+      <w:r>
+        <w:t xml:space="preserve">California</w:t>
+      </w:r>
+      <w:r>
+        <w:t xml:space="preserve">.”</w:t>
+      </w:r>
+      <w:r>
+        <w:t xml:space="preserve"> </w:t>
+      </w:r>
+      <w:r>
+        <w:t xml:space="preserve">Geological {{Survey Water-Supply Paper}} 1462. United States Geological Survey.</w:t>
+      </w:r>
+      <w:r>
+        <w:t xml:space="preserve"> </w:t>
+      </w:r>
+      <w:hyperlink r:id="rId104">
         <w:r>
           <w:rPr>
             <w:rStyle w:val="Hyperlink"/>
           </w:rPr>
-          <w:t xml:space="preserve">https://pubs.usgs.gov/wsp/1462/report.pdf</w:t>
+          <w:t xml:space="preserve">https://doi.org/10.3133/wsp1462</w:t>
         </w:r>
       </w:hyperlink>
       <w:r>
         <w:t xml:space="preserve">.</w:t>
       </w:r>
     </w:p>
-    <w:bookmarkEnd w:id="117"/>
-    <w:bookmarkStart w:id="119" w:name="ref-Mahoney1998"/>
-    <w:p>
-      <w:pPr>
-        <w:pStyle w:val="Bibliography"/>
-      </w:pPr>
-      <w:r>
-        <w:t xml:space="preserve">Mahoney, John M., and Stewart B. Rood. 1998.</w:t>
-      </w:r>
-      <w:r>
-        <w:t xml:space="preserve"> </w:t>
-      </w:r>
-      <w:r>
-        <w:t xml:space="preserve">“</w:t>
-      </w:r>
-      <w:r>
-        <w:t xml:space="preserve">Streamflow requirements for cottonwood seedling recruitment-An integrative model</w:t>
-      </w:r>
-      <w:r>
-        <w:t xml:space="preserve">.”</w:t>
-      </w:r>
-      <w:r>
-        <w:t xml:space="preserve"> </w:t>
-      </w:r>
-      <w:r>
-        <w:rPr>
-          <w:i/>
-          <w:iCs/>
-        </w:rPr>
-        <w:t xml:space="preserve">Wetlands</w:t>
-      </w:r>
-      <w:r>
-        <w:t xml:space="preserve"> </w:t>
-      </w:r>
-      <w:r>
-        <w:t xml:space="preserve">18 (4): 634–45.</w:t>
-      </w:r>
-      <w:r>
-        <w:t xml:space="preserve"> </w:t>
-      </w:r>
-      <w:hyperlink r:id="rId118">
-        <w:r>
-          <w:rPr>
-            <w:rStyle w:val="Hyperlink"/>
-          </w:rPr>
-          <w:t xml:space="preserve">https://doi.org/10.1007/BF03161678</w:t>
-        </w:r>
-      </w:hyperlink>
-      <w:r>
-        <w:t xml:space="preserve">.</w:t>
-      </w:r>
-    </w:p>
-    <w:bookmarkEnd w:id="119"/>
-    <w:bookmarkStart w:id="121" w:name="ref-Monarchi1973"/>
-    <w:p>
-      <w:pPr>
-        <w:pStyle w:val="Bibliography"/>
-      </w:pPr>
-      <w:r>
-        <w:t xml:space="preserve">Monarchi, David E., Chester C. Kisiel, and Lucien Duckstein. 1973.</w:t>
-      </w:r>
-      <w:r>
-        <w:t xml:space="preserve"> </w:t>
-      </w:r>
-      <w:r>
-        <w:t xml:space="preserve">“</w:t>
-      </w:r>
-      <w:r>
-        <w:t xml:space="preserve">Interactive multiobjective programing in water resources: A case study</w:t>
-      </w:r>
-      <w:r>
-        <w:t xml:space="preserve">.”</w:t>
-      </w:r>
-      <w:r>
-        <w:t xml:space="preserve"> </w:t>
-      </w:r>
-      <w:r>
-        <w:rPr>
-          <w:i/>
-          <w:iCs/>
-        </w:rPr>
-        <w:t xml:space="preserve">Water Resources Research</w:t>
-      </w:r>
-      <w:r>
-        <w:t xml:space="preserve"> </w:t>
-      </w:r>
-      <w:r>
-        <w:t xml:space="preserve">9 (4): 837–50.</w:t>
-      </w:r>
-      <w:r>
-        <w:t xml:space="preserve"> </w:t>
-      </w:r>
-      <w:hyperlink r:id="rId120">
-        <w:r>
-          <w:rPr>
-            <w:rStyle w:val="Hyperlink"/>
-          </w:rPr>
-          <w:t xml:space="preserve">https://doi.org/10.1029/WR009i004p00837</w:t>
-        </w:r>
-      </w:hyperlink>
-      <w:r>
-        <w:t xml:space="preserve">.</w:t>
-      </w:r>
-    </w:p>
-    <w:bookmarkEnd w:id="121"/>
-    <w:bookmarkStart w:id="123" w:name="ref-NordgrenEtAlSupporting2016"/>
+    <w:bookmarkEnd w:id="105"/>
+    <w:bookmarkStart w:id="107" w:name="ref-NordgrenEtAlSupporting2016"/>
     <w:p>
       <w:pPr>
         <w:pStyle w:val="Bibliography"/>
@@ -22845,7 +22960,7 @@
       <w:r>
         <w:t xml:space="preserve"> </w:t>
       </w:r>
-      <w:hyperlink r:id="rId122">
+      <w:hyperlink r:id="rId106">
         <w:r>
           <w:rPr>
             <w:rStyle w:val="Hyperlink"/>
@@ -22857,295 +22972,136 @@
         <w:t xml:space="preserve">.</w:t>
       </w:r>
     </w:p>
-    <w:bookmarkEnd w:id="123"/>
-    <w:bookmarkStart w:id="125" w:name="ref-Ohlberger2018"/>
+    <w:bookmarkEnd w:id="107"/>
+    <w:bookmarkStart w:id="108" w:name="ref-SiskiyouCountyScott2021"/>
     <w:p>
       <w:pPr>
         <w:pStyle w:val="Bibliography"/>
       </w:pPr>
       <w:r>
-        <w:t xml:space="preserve">Ohlberger, Jan, Thomas W. Buehrens, Samuel J. Brenkman, Patrick Crain, Thomas P. Quinn, and Ray Hilborn. 2018.</w:t>
-      </w:r>
-      <w:r>
-        <w:t xml:space="preserve"> </w:t>
-      </w:r>
-      <w:r>
-        <w:t xml:space="preserve">“</w:t>
-      </w:r>
-      <w:r>
-        <w:t xml:space="preserve">Effects of past and projected river discharge variability on freshwater production in an anadromous fish</w:t>
+        <w:t xml:space="preserve">Siskiyou County. 2021.</w:t>
+      </w:r>
+      <w:r>
+        <w:t xml:space="preserve"> </w:t>
+      </w:r>
+      <w:r>
+        <w:t xml:space="preserve">“Scott</w:t>
+      </w:r>
+      <w:r>
+        <w:t xml:space="preserve"> </w:t>
+      </w:r>
+      <w:r>
+        <w:t xml:space="preserve">Valley Groundwater Sustainability Plan</w:t>
       </w:r>
       <w:r>
         <w:t xml:space="preserve">.”</w:t>
       </w:r>
-      <w:r>
-        <w:t xml:space="preserve"> </w:t>
-      </w:r>
-      <w:r>
-        <w:rPr>
-          <w:i/>
-          <w:iCs/>
-        </w:rPr>
-        <w:t xml:space="preserve">Freshwater Biology</w:t>
-      </w:r>
-      <w:r>
-        <w:t xml:space="preserve"> </w:t>
-      </w:r>
-      <w:r>
-        <w:t xml:space="preserve">63 (4): 331–40.</w:t>
-      </w:r>
-      <w:r>
-        <w:t xml:space="preserve"> </w:t>
-      </w:r>
-      <w:hyperlink r:id="rId124">
-        <w:r>
-          <w:rPr>
-            <w:rStyle w:val="Hyperlink"/>
-          </w:rPr>
-          <w:t xml:space="preserve">https://doi.org/10.1111/fwb.13070</w:t>
-        </w:r>
-      </w:hyperlink>
-      <w:r>
-        <w:t xml:space="preserve">.</w:t>
-      </w:r>
     </w:p>
-    <w:bookmarkEnd w:id="125"/>
-    <w:bookmarkStart w:id="126" w:name="ref-Pareto1896"/>
+    <w:bookmarkEnd w:id="108"/>
+    <w:bookmarkStart w:id="109" w:name="Xa7b10fbb32571a990cee2341e679d296b855974"/>
     <w:p>
       <w:pPr>
         <w:pStyle w:val="Bibliography"/>
       </w:pPr>
       <w:r>
-        <w:t xml:space="preserve">Pareto, Vilfredo. 1896.</w:t>
-      </w:r>
-      <w:r>
-        <w:t xml:space="preserve"> </w:t>
-      </w:r>
-      <w:r>
-        <w:rPr>
-          <w:i/>
-          <w:iCs/>
-        </w:rPr>
-        <w:t xml:space="preserve">Cours D’Economie Politique</w:t>
-      </w:r>
-      <w:r>
-        <w:t xml:space="preserve">. Lausanne.</w:t>
+        <w:t xml:space="preserve">STATE WATER RESOURCES CONTROL BOARD. 2024.</w:t>
+      </w:r>
+      <w:r>
+        <w:t xml:space="preserve"> </w:t>
+      </w:r>
+      <w:r>
+        <w:t xml:space="preserve">“</w:t>
+      </w:r>
+      <w:r>
+        <w:t xml:space="preserve">RESOLUTION NO</w:t>
+      </w:r>
+      <w:r>
+        <w:t xml:space="preserve">. 2024-0036:</w:t>
+      </w:r>
+      <w:r>
+        <w:t xml:space="preserve"> </w:t>
+      </w:r>
+      <w:r>
+        <w:t xml:space="preserve">REGARDING FLOW EFFORTS IN THE SCOTT RIVER AND SHASTA RIVER WATERSHEDS</w:t>
+      </w:r>
+      <w:r>
+        <w:t xml:space="preserve">.”</w:t>
+      </w:r>
+      <w:r>
+        <w:t xml:space="preserve"> </w:t>
+      </w:r>
+      <w:r>
+        <w:t xml:space="preserve">2024-0036.</w:t>
       </w:r>
     </w:p>
-    <w:bookmarkEnd w:id="126"/>
-    <w:bookmarkStart w:id="127" w:name="ref-SVAP1980"/>
+    <w:bookmarkEnd w:id="109"/>
+    <w:bookmarkStart w:id="111" w:name="ref-TolleyEtAlSensitivity2019"/>
     <w:p>
       <w:pPr>
         <w:pStyle w:val="Bibliography"/>
       </w:pPr>
       <w:r>
-        <w:t xml:space="preserve">Scott Valley Area Plan Committee. 1980.</w:t>
-      </w:r>
-      <w:r>
-        <w:t xml:space="preserve"> </w:t>
-      </w:r>
-      <w:r>
-        <w:t xml:space="preserve">“</w:t>
-      </w:r>
-      <w:r>
-        <w:t xml:space="preserve">Scott Valley Area Plan (SVAP)</w:t>
-      </w:r>
-      <w:r>
-        <w:t xml:space="preserve">.”</w:t>
-      </w:r>
-    </w:p>
-    <w:bookmarkEnd w:id="127"/>
-    <w:bookmarkStart w:id="129" w:name="ref-SiskiyouCounty2021"/>
-    <w:p>
-      <w:pPr>
-        <w:pStyle w:val="Bibliography"/>
-      </w:pPr>
-      <w:r>
-        <w:t xml:space="preserve">Siskiyou County Flood Control and Water Conservation District. 2021.</w:t>
-      </w:r>
-      <w:r>
-        <w:t xml:space="preserve"> </w:t>
-      </w:r>
-      <w:r>
-        <w:t xml:space="preserve">“</w:t>
-      </w:r>
-      <w:r>
-        <w:t xml:space="preserve">Scott Valley Groundwater Sustainability Plan</w:t>
-      </w:r>
-      <w:r>
-        <w:t xml:space="preserve">.”</w:t>
-      </w:r>
-      <w:r>
-        <w:t xml:space="preserve"> </w:t>
-      </w:r>
-      <w:r>
-        <w:t xml:space="preserve">Siskiyou County Flood Control; Water Conservation District.</w:t>
-      </w:r>
-      <w:r>
-        <w:t xml:space="preserve"> </w:t>
-      </w:r>
-      <w:hyperlink r:id="rId128">
-        <w:r>
-          <w:rPr>
-            <w:rStyle w:val="Hyperlink"/>
-          </w:rPr>
-          <w:t xml:space="preserve">https://www.co.siskiyou.ca.us/naturalresources/page/scott-valley-gsp-chapters</w:t>
-        </w:r>
-      </w:hyperlink>
-      <w:r>
-        <w:t xml:space="preserve">.</w:t>
-      </w:r>
-    </w:p>
-    <w:bookmarkEnd w:id="129"/>
-    <w:bookmarkStart w:id="131" w:name="ref-SVGAC2021_June"/>
-    <w:p>
-      <w:pPr>
-        <w:pStyle w:val="Bibliography"/>
-      </w:pPr>
-      <w:r>
-        <w:t xml:space="preserve">Siskiyou County GSA - Scott Valley Groundwater Advisory Committee. 2021.</w:t>
-      </w:r>
-      <w:r>
-        <w:t xml:space="preserve"> </w:t>
-      </w:r>
-      <w:r>
-        <w:t xml:space="preserve">“</w:t>
-      </w:r>
-      <w:r>
-        <w:t xml:space="preserve">Siskiyou County Groundwater Sustainability Agency: Scott Valley Advisory Committee Meeting</w:t>
-      </w:r>
-      <w:r>
-        <w:t xml:space="preserve">.”</w:t>
-      </w:r>
-      <w:r>
-        <w:t xml:space="preserve"> </w:t>
-      </w:r>
-      <w:r>
-        <w:t xml:space="preserve">Fort Jones, CA: Siskiyou County.</w:t>
-      </w:r>
-      <w:r>
-        <w:t xml:space="preserve"> </w:t>
-      </w:r>
-      <w:hyperlink r:id="rId130">
-        <w:r>
-          <w:rPr>
-            <w:rStyle w:val="Hyperlink"/>
-          </w:rPr>
-          <w:t xml:space="preserve">https://www.co.siskiyou.ca.us/scottvga/page/scott-valley-groundwater-advisory-committee-meeting-15</w:t>
-        </w:r>
-      </w:hyperlink>
-      <w:r>
-        <w:t xml:space="preserve">.</w:t>
-      </w:r>
-    </w:p>
-    <w:bookmarkEnd w:id="131"/>
-    <w:bookmarkStart w:id="133" w:name="ref-Sunding1996"/>
-    <w:p>
-      <w:pPr>
-        <w:pStyle w:val="Bibliography"/>
-      </w:pPr>
-      <w:r>
-        <w:t xml:space="preserve">Sunding, David L. 1996.</w:t>
-      </w:r>
-      <w:r>
-        <w:t xml:space="preserve"> </w:t>
-      </w:r>
-      <w:r>
-        <w:t xml:space="preserve">“</w:t>
-      </w:r>
-      <w:r>
-        <w:t xml:space="preserve">Measuring the Marginal Cost of Nonuniform Environmental Regulations</w:t>
-      </w:r>
-      <w:r>
-        <w:t xml:space="preserve">.”</w:t>
-      </w:r>
-      <w:r>
-        <w:t xml:space="preserve"> </w:t>
-      </w:r>
-      <w:r>
-        <w:rPr>
-          <w:i/>
-          <w:iCs/>
-        </w:rPr>
-        <w:t xml:space="preserve">American Journal of Agricultural Economics</w:t>
-      </w:r>
-      <w:r>
-        <w:t xml:space="preserve"> </w:t>
-      </w:r>
-      <w:r>
-        <w:t xml:space="preserve">78 (4): 1098–1107.</w:t>
-      </w:r>
-      <w:r>
-        <w:t xml:space="preserve"> </w:t>
-      </w:r>
-      <w:hyperlink r:id="rId132">
-        <w:r>
-          <w:rPr>
-            <w:rStyle w:val="Hyperlink"/>
-          </w:rPr>
-          <w:t xml:space="preserve">https://doi.org/10.2307/1243866</w:t>
-        </w:r>
-      </w:hyperlink>
-      <w:r>
-        <w:t xml:space="preserve">.</w:t>
-      </w:r>
-    </w:p>
-    <w:bookmarkEnd w:id="133"/>
-    <w:bookmarkStart w:id="135" w:name="ref-SuperiorCourtofSiskiyouCounty1980"/>
-    <w:p>
-      <w:pPr>
-        <w:pStyle w:val="Bibliography"/>
-      </w:pPr>
-      <w:r>
-        <w:t xml:space="preserve">Superior Court of Siskiyou County. 1980.</w:t>
-      </w:r>
-      <w:r>
-        <w:t xml:space="preserve"> </w:t>
-      </w:r>
-      <w:r>
-        <w:t xml:space="preserve">“</w:t>
-      </w:r>
-      <w:r>
-        <w:t xml:space="preserve">Scott River Adjudication, Decree No. 30662. Scott River stream system, Siskiyou County. California State Water Resources Conrol Board.</w:t>
-      </w:r>
-      <w:r>
-        <w:t xml:space="preserve">”</w:t>
-      </w:r>
-      <w:r>
-        <w:t xml:space="preserve"> Sacramento.</w:t>
-      </w:r>
-      <w:r>
-        <w:t xml:space="preserve"> </w:t>
-      </w:r>
-      <w:hyperlink r:id="rId134">
-        <w:r>
-          <w:rPr>
-            <w:rStyle w:val="Hyperlink"/>
-          </w:rPr>
-          <w:t xml:space="preserve">https://www.waterboards.ca.gov/waterrights/board{\_}decisions/adopted{\_}orders/judgments/docs/scottriver{\_}jd.pdf</w:t>
-        </w:r>
-      </w:hyperlink>
-      <w:r>
-        <w:t xml:space="preserve">.</w:t>
-      </w:r>
-    </w:p>
-    <w:bookmarkEnd w:id="135"/>
-    <w:bookmarkStart w:id="137" w:name="ref-Tolley2019"/>
-    <w:p>
-      <w:pPr>
-        <w:pStyle w:val="Bibliography"/>
-      </w:pPr>
-      <w:r>
-        <w:t xml:space="preserve">Tolley, Douglas G., Laura Foglia, and Thomas Harter. 2019.</w:t>
-      </w:r>
-      <w:r>
-        <w:t xml:space="preserve"> </w:t>
-      </w:r>
-      <w:r>
-        <w:t xml:space="preserve">“</w:t>
-      </w:r>
-      <w:r>
-        <w:t xml:space="preserve">Sensitivity Analysis and Calibration of an Integrated Hydrologic Model in an Irrigated Agricultural Basin with a Groundwater-Dependent Ecosystem</w:t>
+        <w:t xml:space="preserve">Tolley, D., L. Foglia, and T. Harter. 2019.</w:t>
+      </w:r>
+      <w:r>
+        <w:t xml:space="preserve"> </w:t>
+      </w:r>
+      <w:r>
+        <w:t xml:space="preserve">“Sensitivity</w:t>
+      </w:r>
+      <w:r>
+        <w:t xml:space="preserve"> </w:t>
+      </w:r>
+      <w:r>
+        <w:t xml:space="preserve">Analysis</w:t>
+      </w:r>
+      <w:r>
+        <w:t xml:space="preserve"> </w:t>
+      </w:r>
+      <w:r>
+        <w:t xml:space="preserve">and</w:t>
+      </w:r>
+      <w:r>
+        <w:t xml:space="preserve"> </w:t>
+      </w:r>
+      <w:r>
+        <w:t xml:space="preserve">Calibration</w:t>
+      </w:r>
+      <w:r>
+        <w:t xml:space="preserve"> </w:t>
+      </w:r>
+      <w:r>
+        <w:t xml:space="preserve">of an</w:t>
+      </w:r>
+      <w:r>
+        <w:t xml:space="preserve"> </w:t>
+      </w:r>
+      <w:r>
+        <w:t xml:space="preserve">Integrated Hydrologic Model</w:t>
+      </w:r>
+      <w:r>
+        <w:t xml:space="preserve"> </w:t>
+      </w:r>
+      <w:r>
+        <w:t xml:space="preserve">in an</w:t>
+      </w:r>
+      <w:r>
+        <w:t xml:space="preserve"> </w:t>
+      </w:r>
+      <w:r>
+        <w:t xml:space="preserve">Irrigated Agricultural Basin With</w:t>
+      </w:r>
+      <w:r>
+        <w:t xml:space="preserve"> </w:t>
+      </w:r>
+      <w:r>
+        <w:t xml:space="preserve">a</w:t>
+      </w:r>
+      <w:r>
+        <w:t xml:space="preserve"> </w:t>
+      </w:r>
+      <w:r>
+        <w:t xml:space="preserve">Groundwater-Dependent Ecosystem</w:t>
       </w:r>
       <w:r>
         <w:t xml:space="preserve">.”</w:t>
@@ -23164,12 +23120,12 @@
         <w:t xml:space="preserve"> </w:t>
       </w:r>
       <w:r>
-        <w:t xml:space="preserve">55 (8).</w:t>
-      </w:r>
-      <w:r>
-        <w:t xml:space="preserve"> </w:t>
-      </w:r>
-      <w:hyperlink r:id="rId136">
+        <w:t xml:space="preserve">55 (9): 7876–7901.</w:t>
+      </w:r>
+      <w:r>
+        <w:t xml:space="preserve"> </w:t>
+      </w:r>
+      <w:hyperlink r:id="rId110">
         <w:r>
           <w:rPr>
             <w:rStyle w:val="Hyperlink"/>
@@ -23181,8 +23137,8 @@
         <w:t xml:space="preserve">.</w:t>
       </w:r>
     </w:p>
-    <w:bookmarkEnd w:id="137"/>
-    <w:bookmarkStart w:id="139" w:name="ref-VanSteenbergenPromoting2006"/>
+    <w:bookmarkEnd w:id="111"/>
+    <w:bookmarkStart w:id="113" w:name="ref-VanSteenbergenPromoting2006"/>
     <w:p>
       <w:pPr>
         <w:pStyle w:val="Bibliography"/>
@@ -23215,7 +23171,7 @@
       <w:r>
         <w:t xml:space="preserve"> </w:t>
       </w:r>
-      <w:hyperlink r:id="rId138">
+      <w:hyperlink r:id="rId112">
         <w:r>
           <w:rPr>
             <w:rStyle w:val="Hyperlink"/>
@@ -23227,23 +23183,26 @@
         <w:t xml:space="preserve">.</w:t>
       </w:r>
     </w:p>
-    <w:bookmarkEnd w:id="139"/>
-    <w:bookmarkStart w:id="141" w:name="ref-Yeh1982"/>
+    <w:bookmarkEnd w:id="113"/>
+    <w:bookmarkStart w:id="114" w:name="X8bf5592004e543b04dfcfc3edb39663c8006d78"/>
     <w:p>
       <w:pPr>
         <w:pStyle w:val="Bibliography"/>
       </w:pPr>
       <w:r>
-        <w:t xml:space="preserve">Yeh, William W‐G, and Leonard Becker. 1982.</w:t>
-      </w:r>
-      <w:r>
-        <w:t xml:space="preserve"> </w:t>
-      </w:r>
-      <w:r>
-        <w:t xml:space="preserve">“</w:t>
-      </w:r>
-      <w:r>
-        <w:t xml:space="preserve">Multiobjective analysis of multireservoir operations</w:t>
+        <w:t xml:space="preserve">Yolo Subbasin Groundwater Agency. 2022.</w:t>
+      </w:r>
+      <w:r>
+        <w:t xml:space="preserve"> </w:t>
+      </w:r>
+      <w:r>
+        <w:t xml:space="preserve">“Yolo</w:t>
+      </w:r>
+      <w:r>
+        <w:t xml:space="preserve"> </w:t>
+      </w:r>
+      <w:r>
+        <w:t xml:space="preserve">Subbasin Groundwater Sustainability Plan</w:t>
       </w:r>
       <w:r>
         <w:t xml:space="preserve">.”</w:t>
@@ -23252,64 +23211,17 @@
         <w:t xml:space="preserve"> </w:t>
       </w:r>
       <w:r>
-        <w:rPr>
-          <w:i/>
-          <w:iCs/>
-        </w:rPr>
-        <w:t xml:space="preserve">Water Resources Research</w:t>
-      </w:r>
-      <w:r>
-        <w:t xml:space="preserve"> </w:t>
-      </w:r>
-      <w:r>
-        <w:t xml:space="preserve">18 (5): 1326–36.</w:t>
-      </w:r>
-      <w:r>
-        <w:t xml:space="preserve"> </w:t>
-      </w:r>
-      <w:hyperlink r:id="rId140">
-        <w:r>
-          <w:rPr>
-            <w:rStyle w:val="Hyperlink"/>
-          </w:rPr>
-          <w:t xml:space="preserve">https://doi.org/10.1029/WR018i005p01326</w:t>
-        </w:r>
-      </w:hyperlink>
-      <w:r>
-        <w:t xml:space="preserve">.</w:t>
+        <w:t xml:space="preserve">Woodland, CA.</w:t>
       </w:r>
     </w:p>
-    <w:bookmarkEnd w:id="141"/>
-    <w:bookmarkStart w:id="142" w:name="ref-YSGA2022"/>
+    <w:bookmarkEnd w:id="114"/>
+    <w:bookmarkEnd w:id="115"/>
     <w:p>
-      <w:pPr>
-        <w:pStyle w:val="Bibliography"/>
-      </w:pPr>
-      <w:r>
-        <w:t xml:space="preserve">Yolo Subbasin Groundwater Agency. 2022.</w:t>
-      </w:r>
-      <w:r>
-        <w:t xml:space="preserve"> </w:t>
-      </w:r>
-      <w:r>
-        <w:t xml:space="preserve">“</w:t>
-      </w:r>
-      <w:r>
-        <w:t xml:space="preserve">Yolo Subbasin Groundwater Agency 2022 Groundwater Sustainability Plan</w:t>
-      </w:r>
-      <w:r>
-        <w:t xml:space="preserve">.”</w:t>
-      </w:r>
-      <w:r>
-        <w:t xml:space="preserve"> </w:t>
-      </w:r>
-      <w:r>
-        <w:t xml:space="preserve">Woodland, CA.</w:t>
+      <w:r>
+        <w:br w:type="page"/>
       </w:r>
     </w:p>
-    <w:bookmarkEnd w:id="142"/>
-    <w:bookmarkEnd w:id="143"/>
-    <w:bookmarkEnd w:id="144"/>
+    <w:bookmarkEnd w:id="116"/>
     <w:sectPr>
       <w:footnotePr>
         <w:numRestart w:val="eachSect"/>

</xml_diff>

<commit_message>
rewrite ms for new results
</commit_message>
<xml_diff>
--- a/Kouba_Fish_and_Ag_Benefit_MS.docx
+++ b/Kouba_Fish_and_Ag_Benefit_MS.docx
@@ -40,7 +40,7 @@
         <w:pStyle w:val="FirstParagraph"/>
       </w:pPr>
       <w:r>
-        <w:t xml:space="preserve">In rural areas of western North America, agricultural and environmental water needs often come into conflict, and robust management of water resources may require predicting the hydrologic response of complex interconnected surface and groundwater systems to various management actions. Increasingly, to support policy choices, managers in California rely on analyses using hydrologic models, but in many cases these models can provide confusing or overwhelming amounts of information. In this study, we address these challenges for a case study jurisdiction in northern California, which is in the process of implementing a long-term Groundwater Sustainability Plan (GSP). We developed a summary statistic or proxy for each of the three primary policy considerations in the GSP (environmental, agricultural, and project cost). We then used them to summarize the results of</w:t>
+        <w:t xml:space="preserve">In the rural American West, water needs of agriculture and ecosystems are often in competition. Furthermore, in places with interconnected surface- and groundwater systems, stream-aquifer exchange increases the difficulty of tracking impacts of diverse water users on each other and on the system as a whole. Hydrologic models can estimate the impacts of water uses and management actions on groundwater elevation and streamflow, but may provide overwhelming amounts of information and/or may be challenging for stakeholders to interpret. In this study, we address these challenges and aim to increase utility of hydrologic model results for a case study jurisdiction in northern California, which is in the process of implementing a long-term Groundwater Sustainability Plan (GSP). We developed a summary statistic or proxy for each of the three primary policy considerations in the GSP (environmental, agricultural, and project cost). We then used them to summarize the results of</w:t>
       </w:r>
       <w:r>
         <w:t xml:space="preserve"> </w:t>
@@ -56,35 +56,7 @@
         <w:t xml:space="preserve"> </w:t>
       </w:r>
       <w:r>
-        <w:t xml:space="preserve">management scenarios developed for the GSP in Scott Valley in Northern California, which were simulated using an existing integrated surface- and groundwater model.</w:t>
-      </w:r>
-    </w:p>
-    <w:p>
-      <w:pPr>
-        <w:pStyle w:val="BodyText"/>
-      </w:pPr>
-      <w:r>
-        <w:t xml:space="preserve">We found that a trade-off in benefits for fish and farms was evident in every category of infrastructure investment (a proxy for project cost), though greater infrastructure investment can achieve some reductions in this trade-off. Additionally, although the GSP management priorities emphasized infrastructure investments, both infrastructure-based and regulatory approaches fell within the Pareto-optimal set of management options under a strict application of these objective functions. Finally, regarding regulatory actions, management interventions targeted at low-flow periods produced a more efficient gain in environmental flow value per cost in agricultural productivity. This work demonstrates that developing basin-specific, stakeholder-informed objective functions, especially ones using output from existing hydrologic models, can help clarify trade-offs in ongoing local water planning efforts</w:t>
-      </w:r>
-      <w:r>
-        <w:t xml:space="preserve"> </w:t>
-      </w:r>
-      <w:r>
-        <w:rPr>
-          <w:b/>
-          <w:bCs/>
-        </w:rPr>
-        <w:t xml:space="preserve">and summarize a rich landscape of many choices.</w:t>
-      </w:r>
-      <w:r>
-        <w:t xml:space="preserve"> </w:t>
-      </w:r>
-      <w:r>
-        <w:rPr>
-          <w:i/>
-          <w:iCs/>
-        </w:rPr>
-        <w:t xml:space="preserve">fix last sentence</w:t>
+        <w:t xml:space="preserve">management scenarios developed for the GSP, which were simulated using an existing integrated surface- and groundwater model. We found that a trade-off in benefits for fish and farms was evident in every category of infrastructure investment (a proxy for project cost), though greater infrastructure investment can achieve some reductions in this trade-off. Additionally, although the GSP management priorities emphasized infrastructure investments, both infrastructure-based and regulatory approaches fell within the Pareto-optimal set of management options under a strict application of these objective functions. Finally, regarding regulatory actions, management interventions targeted at low-flow periods produced a more efficient gain in environmental flow value per cost in agricultural productivity. This work demonstrates that basin-specific, stakeholder-informed objective functions can increase stakeholder-salience of existing hydrologic model results, and can help clarify trade-offs in ongoing local water planning efforts.</w:t>
       </w:r>
     </w:p>
     <w:p>
@@ -116,7 +88,7 @@
         <w:pStyle w:val="FirstParagraph"/>
       </w:pPr>
       <w:r>
-        <w:t xml:space="preserve">Climate adaptation in the water sector, in its many facets - such as securing our water and food supply, updating infrastructure to reduce flood and drought risk, and preserving ecosystem function - is best implemented at the local level</w:t>
+        <w:t xml:space="preserve">Climate adaptation in the water sector, in its many facets - e.g., securing water and food supplies, updating infrastructure to reduce flood and drought risk, and preserving ecosystem function - is often most effective when implemented at the local level</w:t>
       </w:r>
       <w:r>
         <w:t xml:space="preserve"> </w:t>
@@ -134,7 +106,7 @@
         <w:t xml:space="preserve">(Bork and Hirokawa 2021; Nordgren, Stults, and Meerow 2016)</w:t>
       </w:r>
       <w:r>
-        <w:t xml:space="preserve">. While academic hydrologists have the tools to fill such knowledge gaps, in many cases they avoid engaging with specific local water organizations, which can reduce the utility of the resulting research</w:t>
+        <w:t xml:space="preserve">. Academic hydrologists have many tools to fill such knowledge gaps; however, when seeking broadly-relevant findings, they commonly avoid time-consuming engagement with specific local water organizations, which can reduce the utility of the resulting research to the relevant decisionmakers</w:t>
       </w:r>
       <w:r>
         <w:t xml:space="preserve"> </w:t>
@@ -143,7 +115,7 @@
         <w:t xml:space="preserve">(Freeman 2000)</w:t>
       </w:r>
       <w:r>
-        <w:t xml:space="preserve">. In this study, we take advantage of the authors’ involvement with an existing water resource planning process, and a previously-developed integrated surface- and groundwater model, to test the utility of introducing quantitative objective functions into the prioritization of groundwater management alternatives in a case study jurisdiction.</w:t>
+        <w:t xml:space="preserve">. In this study, we take advantage of the authors’ involvement with an existing water resource planning process, and a previously-developed integrated surface- and groundwater model, to test the utility of introducing quantitative objective functions into the public prioritization of groundwater management alternatives in a case study jurisdiction.</w:t>
       </w:r>
     </w:p>
     <w:p>
@@ -192,20 +164,10 @@
         <w:t xml:space="preserve"> </w:t>
       </w:r>
       <w:r>
-        <w:t xml:space="preserve">(</w:t>
-      </w:r>
-      <w:r>
-        <w:rPr>
-          <w:b/>
-          <w:bCs/>
-        </w:rPr>
-        <w:t xml:space="preserve">Monarchi1973?</w:t>
-      </w:r>
-      <w:r>
-        <w:t xml:space="preserve">)</w:t>
-      </w:r>
-      <w:r>
-        <w:t xml:space="preserve">. Consequently, multi-objective optimization studies commonly avoid proposing a single optimal solution; instead they identify a Pareto-optimal or non-inferior set of options, which can clarify the unavoidable trade-offs in the performance of various system objectives</w:t>
+        <w:t xml:space="preserve">(Monarchi, Kisiel, and Duckstein 1973)</w:t>
+      </w:r>
+      <w:r>
+        <w:t xml:space="preserve">. Consequently, multi-objective optimization studies often avoid proposing a single optimal solution; instead they identify a Pareto-optimal or non-inferior set of options, which can clarify the unavoidable trade-offs in the performance of various system objectives</w:t>
       </w:r>
       <w:r>
         <w:t xml:space="preserve"> </w:t>
@@ -220,46 +182,7 @@
         <w:t xml:space="preserve"> </w:t>
       </w:r>
       <w:r>
-        <w:t xml:space="preserve">(e.g.,</w:t>
-      </w:r>
-      <w:r>
-        <w:t xml:space="preserve"> </w:t>
-      </w:r>
-      <w:r>
-        <w:rPr>
-          <w:b/>
-          <w:bCs/>
-        </w:rPr>
-        <w:t xml:space="preserve">Monarchi1973?</w:t>
-      </w:r>
-      <w:r>
-        <w:t xml:space="preserve">;</w:t>
-      </w:r>
-      <w:r>
-        <w:t xml:space="preserve"> </w:t>
-      </w:r>
-      <w:r>
-        <w:rPr>
-          <w:b/>
-          <w:bCs/>
-        </w:rPr>
-        <w:t xml:space="preserve">Yeh1982?</w:t>
-      </w:r>
-      <w:r>
-        <w:t xml:space="preserve">;</w:t>
-      </w:r>
-      <w:r>
-        <w:t xml:space="preserve"> </w:t>
-      </w:r>
-      <w:r>
-        <w:rPr>
-          <w:b/>
-          <w:bCs/>
-        </w:rPr>
-        <w:t xml:space="preserve">Kapelan2005?</w:t>
-      </w:r>
-      <w:r>
-        <w:t xml:space="preserve">)</w:t>
+        <w:t xml:space="preserve">(e.g., Monarchi, Kisiel, and Duckstein 1973; Yeh and Becker 1982; Kapelan, Savic, and Walters 2005)</w:t>
       </w:r>
       <w:r>
         <w:t xml:space="preserve">. In the case of the Scott Valley GSP, the management actions considered by stakeholders covered a wide range of decision variables (e.g., land use changes in a variety of spatial configurations, technology and/or infrastructure investment, and regulatory interventions on a range of growing season dates). Because a full randomized sampling of this decision space would be computationally prohibitive, this study instead focused on a set of simulated management scenarios that were effectively pre-screened by stakeholders for feasibility in the landscape of existing land uses and political dynamics.</w:t>
@@ -337,7 +260,7 @@
       </w:r>
     </w:p>
     <w:bookmarkEnd w:id="25"/>
-    <w:bookmarkStart w:id="45" w:name="X525b2f83bcefbf206e3ace342b868d96bb1ee57"/>
+    <w:bookmarkStart w:id="45" w:name="Xde4259dbdabf52cfea1337f1fb7d346fb9d28b1"/>
     <w:p>
       <w:pPr>
         <w:pStyle w:val="Heading1"/>
@@ -352,7 +275,7 @@
         <w:tab/>
       </w:r>
       <w:r>
-        <w:t xml:space="preserve">Case study and summary of GSP development</w:t>
+        <w:t xml:space="preserve">Methods: Case study, GSP development and hydrologic model</w:t>
       </w:r>
     </w:p>
     <w:bookmarkStart w:id="30" w:name="hydrography-and-climate"/>
@@ -405,20 +328,7 @@
         <w:t xml:space="preserve"> </w:t>
       </w:r>
       <w:r>
-        <w:t xml:space="preserve">(SWRCB</w:t>
-      </w:r>
-      <w:r>
-        <w:t xml:space="preserve"> </w:t>
-      </w:r>
-      <w:r>
-        <w:rPr>
-          <w:b/>
-          <w:bCs/>
-        </w:rPr>
-        <w:t xml:space="preserve">SWRCB1975?</w:t>
-      </w:r>
-      <w:r>
-        <w:t xml:space="preserve">; Mack 1958)</w:t>
+        <w:t xml:space="preserve">(SWRCB 1975; Mack 1958)</w:t>
       </w:r>
       <w:r>
         <w:t xml:space="preserve">. A key stream gauge (USGS Station ID 11519500, or the Fort Jones Gauge or FJ Gauge) is located downstream of the watershed’s cultivated areas (Figure</w:t>
@@ -447,7 +357,7 @@
         <w:t xml:space="preserve">2</w:t>
       </w:r>
       <w:r>
-        <w:t xml:space="preserve">), panels A and B). Winter storms (October-April) and melting mountain snowpack (April-July) generate streamflow during the wet and growing seasons. As a result, the Scott River and tributary streams experience seasonal high and low flows (Figure</w:t>
+        <w:t xml:space="preserve">, panels A and B). Winter storms (October-April) and melting mountain snowpack (April-July) generate streamflow during the wet and growing seasons. As a result, the Scott River and tributary streams experience seasonal high and low flows (Figure</w:t>
       </w:r>
       <w:r>
         <w:t xml:space="preserve"> </w:t>
@@ -618,17 +528,7 @@
         <w:t xml:space="preserve"> </w:t>
       </w:r>
       <w:r>
-        <w:t xml:space="preserve">(</w:t>
-      </w:r>
-      <w:r>
-        <w:rPr>
-          <w:b/>
-          <w:bCs/>
-        </w:rPr>
-        <w:t xml:space="preserve">Harter2008?</w:t>
-      </w:r>
-      <w:r>
-        <w:t xml:space="preserve">)</w:t>
+        <w:t xml:space="preserve">(Harter and Hines 2008)</w:t>
       </w:r>
       <w:r>
         <w:t xml:space="preserve">. On the valley floor, according to land use surveys conducted by the California Department of Water Resources</w:t>
@@ -637,23 +537,10 @@
         <w:t xml:space="preserve"> </w:t>
       </w:r>
       <w:r>
-        <w:t xml:space="preserve">(DWR</w:t>
-      </w:r>
-      <w:r>
-        <w:t xml:space="preserve"> </w:t>
-      </w:r>
-      <w:r>
-        <w:rPr>
-          <w:b/>
-          <w:bCs/>
-        </w:rPr>
-        <w:t xml:space="preserve">DWR2017?</w:t>
-      </w:r>
-      <w:r>
-        <w:t xml:space="preserve">)</w:t>
-      </w:r>
-      <w:r>
-        <w:t xml:space="preserve">, half of the area overlying the alluvial aquifer is covered by agriculture, with most of that split approximately evenly between pasture and an alfalfa/grain rotation (Figure</w:t>
+        <w:t xml:space="preserve">(DWR 2017)</w:t>
+      </w:r>
+      <w:r>
+        <w:t xml:space="preserve">, half of the area overlying the alluvial aquifer is covered by irrigated agriculture, notably pasture for cattle and an alfalfa/grain rotation (Figure</w:t>
       </w:r>
       <w:r>
         <w:t xml:space="preserve"> </w:t>
@@ -685,17 +572,7 @@
         <w:t xml:space="preserve"> </w:t>
       </w:r>
       <w:r>
-        <w:t xml:space="preserve">(</w:t>
-      </w:r>
-      <w:r>
-        <w:rPr>
-          <w:b/>
-          <w:bCs/>
-        </w:rPr>
-        <w:t xml:space="preserve">SVAP1980?</w:t>
-      </w:r>
-      <w:r>
-        <w:t xml:space="preserve">)</w:t>
+        <w:t xml:space="preserve">(Scott Valley Area Plan Committee 1980)</w:t>
       </w:r>
       <w:r>
         <w:t xml:space="preserve">. However, during recent declarations of emergency drought conditions, water use has been temporarily curtailed to preserve flows for aquatic species</w:t>
@@ -704,7 +581,70 @@
         <w:t xml:space="preserve"> </w:t>
       </w:r>
       <w:r>
-        <w:t xml:space="preserve">(SWRCB 2021; SWRCB 2024; SWRCB 2024)</w:t>
+        <w:t xml:space="preserve">(SWRCB 2021;</w:t>
+      </w:r>
+      <w:r>
+        <w:t xml:space="preserve"> </w:t>
+      </w:r>
+      <w:r>
+        <w:t xml:space="preserve">“Establishment of</w:t>
+      </w:r>
+      <w:r>
+        <w:t xml:space="preserve"> </w:t>
+      </w:r>
+      <w:r>
+        <w:t xml:space="preserve">Minimum Instream Flow Requirements</w:t>
+      </w:r>
+      <w:r>
+        <w:t xml:space="preserve">,</w:t>
+      </w:r>
+      <w:r>
+        <w:t xml:space="preserve"> </w:t>
+      </w:r>
+      <w:r>
+        <w:t xml:space="preserve">Curtailment Authority</w:t>
+      </w:r>
+      <w:r>
+        <w:t xml:space="preserve">, and</w:t>
+      </w:r>
+      <w:r>
+        <w:t xml:space="preserve"> </w:t>
+      </w:r>
+      <w:r>
+        <w:t xml:space="preserve">Information Order Authority</w:t>
+      </w:r>
+      <w:r>
+        <w:t xml:space="preserve"> </w:t>
+      </w:r>
+      <w:r>
+        <w:t xml:space="preserve">in the</w:t>
+      </w:r>
+      <w:r>
+        <w:t xml:space="preserve"> </w:t>
+      </w:r>
+      <w:r>
+        <w:t xml:space="preserve">Scott River</w:t>
+      </w:r>
+      <w:r>
+        <w:t xml:space="preserve"> </w:t>
+      </w:r>
+      <w:r>
+        <w:t xml:space="preserve">and</w:t>
+      </w:r>
+      <w:r>
+        <w:t xml:space="preserve"> </w:t>
+      </w:r>
+      <w:r>
+        <w:t xml:space="preserve">Shasta River Watersheds</w:t>
+      </w:r>
+      <w:r>
+        <w:t xml:space="preserve">”</w:t>
+      </w:r>
+      <w:r>
+        <w:t xml:space="preserve"> </w:t>
+      </w:r>
+      <w:r>
+        <w:t xml:space="preserve">2024; STATE WATER RESOURCES CONTROL BOARD 2024)</w:t>
       </w:r>
       <w:r>
         <w:t xml:space="preserve">.</w:t>
@@ -2142,7 +2082,16 @@
         <w:pStyle w:val="FirstParagraph"/>
       </w:pPr>
       <w:r>
-        <w:t xml:space="preserve">Sufficient environmental flows at certain times of year are necessary to the survival of vulnerable species in the Scott River watershed. Coho salmon (</w:t>
+        <w:t xml:space="preserve">Sufficient environmental flows, varying by season, are necessary to the survival of vulnerable species in the Scott River watershed</w:t>
+      </w:r>
+      <w:r>
+        <w:t xml:space="preserve"> </w:t>
+      </w:r>
+      <w:r>
+        <w:t xml:space="preserve">(Scott River Watershed Council 2018)</w:t>
+      </w:r>
+      <w:r>
+        <w:t xml:space="preserve">. Coho salmon (</w:t>
       </w:r>
       <w:r>
         <w:rPr>
@@ -2237,20 +2186,10 @@
         <w:t xml:space="preserve"> </w:t>
       </w:r>
       <w:r>
-        <w:t xml:space="preserve">(</w:t>
-      </w:r>
-      <w:r>
-        <w:rPr>
-          <w:b/>
-          <w:bCs/>
-        </w:rPr>
-        <w:t xml:space="preserve">Mahoney1998?</w:t>
-      </w:r>
-      <w:r>
-        <w:t xml:space="preserve">)</w:t>
-      </w:r>
-      <w:r>
-        <w:t xml:space="preserve">; but in this work we focus on coho salmon as a straightforward examlple in developing an environmental objective function. Alternative objective function formulations are discussed in later sections.</w:t>
+        <w:t xml:space="preserve">(Mahoney and Rood 1998)</w:t>
+      </w:r>
+      <w:r>
+        <w:t xml:space="preserve">; but in this work we focus on coho salmon as a straightforward example in developing an environmental objective function. Alternative objective function formulations are discussed in later sections.</w:t>
       </w:r>
     </w:p>
     <w:bookmarkEnd w:id="32"/>
@@ -2283,20 +2222,10 @@
         <w:t xml:space="preserve"> </w:t>
       </w:r>
       <w:r>
-        <w:t xml:space="preserve">(</w:t>
-      </w:r>
-      <w:r>
-        <w:rPr>
-          <w:b/>
-          <w:bCs/>
-        </w:rPr>
-        <w:t xml:space="preserve">Harter2008?</w:t>
-      </w:r>
-      <w:r>
-        <w:t xml:space="preserve">; Foglia et al. 2013; Tolley, Foglia, and Harter 2019)</w:t>
-      </w:r>
-      <w:r>
-        <w:t xml:space="preserve">. Water demand for crops and native vegetation (ET in Figure</w:t>
+        <w:t xml:space="preserve">(Harter and Hines 2008; Foglia et al. 2013; Tolley, Foglia, and Harter 2019)</w:t>
+      </w:r>
+      <w:r>
+        <w:t xml:space="preserve">. Water demand for crops and native vegetation (evapotranspiration, or ET, in Figure</w:t>
       </w:r>
       <w:r>
         <w:t xml:space="preserve"> </w:t>
@@ -2659,13 +2588,23 @@
       <w:r>
         <w:t xml:space="preserve">.</w:t>
       </w:r>
+      <w:r>
+        <w:t xml:space="preserve"> </w:t>
+      </w:r>
+      <w:r>
+        <w:rPr>
+          <w:b/>
+          <w:bCs/>
+        </w:rPr>
+        <w:t xml:space="preserve">Add text re: Leland’s updates to SVIHM? Bah, should I rerun everything using the latest model version?</w:t>
+      </w:r>
     </w:p>
     <w:p>
       <w:pPr>
         <w:pStyle w:val="BodyText"/>
       </w:pPr>
       <w:r>
-        <w:t xml:space="preserve">For GSP development, SVIHM was used extensively to perform what-if scenarios using the historic climate and land use forcing period, covering 1991-2018. (For purposes of this study, the model period has been extended through Sept. 30, 2025.) Scenario simulations repeat the calibrated historical basecase simulation of SVIHM using specified sets of changes in SVIHM boundary conditions (BCs). The set of changes in the BCs of a particular scenario represent specific changes in land use, irrigation management, climate, water management rules, etc. Scenario outcomes are compared against those of the basecase simulation. Key results of each SVIHM scenario, used in the objective functions described below, are:</w:t>
+        <w:t xml:space="preserve">For GSP development, SVIHM was used extensively to perform what-if scenarios using the historic climate and land use forcing period, covering 1991-2018. (For purposes of this study, the model period has been extended through Sept. 30, 2025.) Scenario simulations repeat the calibrated historical basecase simulation of SVIHM while varying specific changes in SVIHM boundary conditions (BCs). The set of changes in the BCs of a particular scenario represent specific changes in land use, irrigation management, climate, water management rules, etc. Scenario outcomes are compared against those of the basecase simulation. Key results of each SVIHM scenario, used in the objective functions described below, are:</w:t>
       </w:r>
     </w:p>
     <w:p>
@@ -2694,7 +2633,7 @@
     </w:p>
     <w:bookmarkEnd w:id="44"/>
     <w:bookmarkEnd w:id="45"/>
-    <w:bookmarkStart w:id="79" w:name="methods"/>
+    <w:bookmarkStart w:id="57" w:name="methods-quantitative-analysis"/>
     <w:p>
       <w:pPr>
         <w:pStyle w:val="Heading1"/>
@@ -2709,7 +2648,7 @@
         <w:tab/>
       </w:r>
       <w:r>
-        <w:t xml:space="preserve">Methods</w:t>
+        <w:t xml:space="preserve">Methods: Quantitative analysis</w:t>
       </w:r>
     </w:p>
     <w:p>
@@ -3236,7 +3175,7 @@
         <w:t xml:space="preserve">(Kouba et al. 2025)</w:t>
       </w:r>
       <w:r>
-        <w:t xml:space="preserve">, we showed that the degree to which the water year provided ecological services needed by coho salmon can be empirically estimated using a Hydrologic Benefit (HB) function, which is represented as a linear combination of annual functional flow values. A set of streamflow metrics related to the timing, amplitude, and duration of flow phenomena were weighted according to their power to predict coho smolt production per female spawner. The combination of these weighted metrics can be interpreted as a prediction of coho salmon reproduction</w:t>
+        <w:t xml:space="preserve">, we showed that the relative degree to which a given water year provided ecological services needed by coho salmon can be empirically estimated using a Hydrologic Benefit (HB) function, which is represented as a linear combination of annual functional flow values. A set of streamflow metrics related to the timing, amplitude, and duration of flow phenomena were weighted according to their power to predict coho outcomes, such as smolt production or smolt production normalized per female spawner. The combination of these weighted metrics can be interpreted as a prediction of coho salmon reproduction</w:t>
       </w:r>
       <w:r>
         <w:t xml:space="preserve"> </w:t>
@@ -3249,7 +3188,23 @@
         <w:t xml:space="preserve">due to hydrologic factors</w:t>
       </w:r>
       <w:r>
-        <w:t xml:space="preserve">. Importantly, the HB function selected for this exercise only explains about 60% of variation in observed smolt abundance, and the remaining 40% of variation is related to other life conditions, e.g., number of returning spawners, water quality, food resources, and internal fishery population dynamics.</w:t>
+        <w:t xml:space="preserve">. Importantly, the HB function selected for this exercise only explains about</w:t>
+      </w:r>
+      <w:r>
+        <w:t xml:space="preserve"> </w:t>
+      </w:r>
+      <w:r>
+        <w:rPr>
+          <w:b/>
+          <w:bCs/>
+        </w:rPr>
+        <w:t xml:space="preserve">60%</w:t>
+      </w:r>
+      <w:r>
+        <w:t xml:space="preserve"> </w:t>
+      </w:r>
+      <w:r>
+        <w:t xml:space="preserve">of variation in observed smolt abundance, and the remaining 40% of variation is assumed related to other life conditions, e.g., number of returning spawners, water quality, food resources, and internal fishery population dynamics.</w:t>
       </w:r>
     </w:p>
     <w:p>
@@ -4411,7 +4366,20 @@
         <w:pStyle w:val="BodyText"/>
       </w:pPr>
       <w:r>
-        <w:t xml:space="preserve">Additionally, for alfalfa and pasture, which continue growing as long as water is available, a strong relationship between crop ET and yield is assumed</w:t>
+        <w:t xml:space="preserve">Additionally, for alfalfa and pasture</w:t>
+      </w:r>
+      <w:r>
+        <w:t xml:space="preserve"> </w:t>
+      </w:r>
+      <w:r>
+        <w:rPr>
+          <w:b/>
+          <w:bCs/>
+        </w:rPr>
+        <w:t xml:space="preserve">and grain?</w:t>
+      </w:r>
+      <w:r>
+        <w:t xml:space="preserve">, which continue growing as long as water is available, a strong relationship between crop ET and yield is assumed</w:t>
       </w:r>
       <w:r>
         <w:t xml:space="preserve"> </w:t>
@@ -5428,84 +5396,13 @@
           <w:b/>
           <w:bCs/>
         </w:rPr>
-        <w:t xml:space="preserve">Pareto1896?</w:t>
+        <w:t xml:space="preserve">ParetoVilfredoCours1896?</w:t>
       </w:r>
       <w:r>
         <w:t xml:space="preserve">)</w:t>
       </w:r>
       <w:r>
         <w:t xml:space="preserve">. A scenario was identified as Pareto-optimal if there were no other scenarios that performed better in two or more objectives. In other words, the Pareto-optimal set is the collection of scenarios in which it is not possible to improve on one objective without reducing performance in another objective. By definition, this set cannot identify a single best scenario or evaluate trade-offs between objectives; we use it here to identify obviously suboptimal scenarios.</w:t>
-      </w:r>
-    </w:p>
-    <w:p>
-      <w:pPr>
-        <w:pStyle w:val="BodyText"/>
-      </w:pPr>
-      <w:r>
-        <w:t xml:space="preserve">For example, the objective function values for the scenario simulating managed aquifer recharge and in-lieu recharge (MAR and ILR, or scenario identifier</w:t>
-      </w:r>
-      <w:r>
-        <w:t xml:space="preserve"> </w:t>
-      </w:r>
-      <w:r>
-        <w:rPr>
-          <w:rStyle w:val="VerbatimChar"/>
-        </w:rPr>
-        <w:t xml:space="preserve">mar_ilr</w:t>
-      </w:r>
-      <w:r>
-        <w:t xml:space="preserve">) are 76.1 predicted coho smolts per female equivalent (HB value), 111.0 million m</w:t>
-      </w:r>
-      <w:r>
-        <w:rPr>
-          <w:vertAlign w:val="superscript"/>
-        </w:rPr>
-        <w:t xml:space="preserve">3</w:t>
-      </w:r>
-      <w:r>
-        <w:t xml:space="preserve"> </w:t>
-      </w:r>
-      <w:r>
-        <w:t xml:space="preserve">of crop ET, and infrastructure category 3. Most scenarios (33) have a higher HB value than</w:t>
-      </w:r>
-      <w:r>
-        <w:t xml:space="preserve"> </w:t>
-      </w:r>
-      <w:r>
-        <w:rPr>
-          <w:rStyle w:val="VerbatimChar"/>
-        </w:rPr>
-        <w:t xml:space="preserve">mar_ilr</w:t>
-      </w:r>
-      <w:r>
-        <w:t xml:space="preserve">, but only eight have a higher ET value. Only the reservoir scenarios show up in both sets, with higher ET and higher HB value than</w:t>
-      </w:r>
-      <w:r>
-        <w:t xml:space="preserve"> </w:t>
-      </w:r>
-      <w:r>
-        <w:rPr>
-          <w:rStyle w:val="VerbatimChar"/>
-        </w:rPr>
-        <w:t xml:space="preserve">mar_ilr</w:t>
-      </w:r>
-      <w:r>
-        <w:t xml:space="preserve">. However, the reservoir scenarios are more difficult to implement, so any of those scenarios would have less desirable performance on the infrastructure objective. Consequently, since no scenarios perform better than</w:t>
-      </w:r>
-      <w:r>
-        <w:t xml:space="preserve"> </w:t>
-      </w:r>
-      <w:r>
-        <w:rPr>
-          <w:rStyle w:val="VerbatimChar"/>
-        </w:rPr>
-        <w:t xml:space="preserve">mar_ilr</w:t>
-      </w:r>
-      <w:r>
-        <w:t xml:space="preserve"> </w:t>
-      </w:r>
-      <w:r>
-        <w:t xml:space="preserve">in more than one objective, it must be included in the Pareto-optimal set.</w:t>
       </w:r>
     </w:p>
     <w:bookmarkEnd w:id="53"/>
@@ -8105,16 +8002,17 @@
       </w:tr>
     </w:tbl>
     <w:bookmarkEnd w:id="56"/>
-    <w:bookmarkStart w:id="78" w:name="results"/>
+    <w:bookmarkEnd w:id="57"/>
+    <w:bookmarkStart w:id="79" w:name="results"/>
     <w:p>
       <w:pPr>
-        <w:pStyle w:val="Heading2"/>
+        <w:pStyle w:val="Heading1"/>
       </w:pPr>
       <w:r>
         <w:rPr>
           <w:rStyle w:val="SectionNumber"/>
         </w:rPr>
-        <w:t xml:space="preserve">3.4</w:t>
+        <w:t xml:space="preserve">4</w:t>
       </w:r>
       <w:r>
         <w:tab/>
@@ -8140,16 +8038,16 @@
         <w:t xml:space="preserve">).</w:t>
       </w:r>
     </w:p>
-    <w:bookmarkStart w:id="66" w:name="X7919b09686293416b4bcb59483f48ae87a57064"/>
+    <w:bookmarkStart w:id="67" w:name="X7919b09686293416b4bcb59483f48ae87a57064"/>
     <w:p>
       <w:pPr>
-        <w:pStyle w:val="Heading3"/>
+        <w:pStyle w:val="Heading2"/>
       </w:pPr>
       <w:r>
         <w:rPr>
           <w:rStyle w:val="SectionNumber"/>
         </w:rPr>
-        <w:t xml:space="preserve">3.4.1</w:t>
+        <w:t xml:space="preserve">4.1</w:t>
       </w:r>
       <w:r>
         <w:tab/>
@@ -8187,18 +8085,18 @@
           <wp:inline>
             <wp:extent cx="5334000" cy="5334000"/>
             <wp:effectExtent b="0" l="0" r="0" t="0"/>
-            <wp:docPr descr="Figure 5:  Comparison of annual performance in two objective functions (HB and ET, representing environmental and agricultural objectives, respectively), in the basecase (black circles) and management scenarios (diamond, cross or x symbols) for water years 1991-2018. Panels A and B show comparisons between basecase and one example scenario in each of three categories: Enhanced Recharge, Low Flow Diversion Limits, and Curtailment. Panels C and D show comparisons between basecase and different cutoff dates within the Alfalfa Irrigation category: July 10th, August 1st and August 15th. Dry-type water years (vertical bars) are 1991, ’92, ’94, 2001, ’09, ’13, ’14, and ’18." title="" id="58" name="Picture"/>
+            <wp:docPr descr="Figure 5:  Comparison of annual performance in two objective functions (HB and ET, representing environmental and agricultural objectives, respectively), in the basecase (black circles) and management scenarios (diamond, cross or x symbols) for water years 1991-2018. Panels A and B show comparisons between basecase and one example scenario in each of three categories: Enhanced Recharge, Low Flow Diversion Limits, and Curtailment. Panels C and D show comparisons between basecase and different cutoff dates within the Alfalfa Irrigation category: July 10th, August 1st and August 15th. Dry-type water years (vertical bars) are 1991, ’92, ’94, 2001, ’09, ’13, ’14, and ’18." title="" id="59" name="Picture"/>
             <a:graphic>
               <a:graphicData uri="http://schemas.openxmlformats.org/drawingml/2006/picture">
                 <pic:pic>
                   <pic:nvPicPr>
-                    <pic:cNvPr descr="Graphics%20and%20Supplements/Figure%204.png" id="59" name="Picture"/>
+                    <pic:cNvPr descr="Graphics%20and%20Supplements/Figure%204.png" id="60" name="Picture"/>
                     <pic:cNvPicPr>
                       <a:picLocks noChangeArrowheads="1" noChangeAspect="1"/>
                     </pic:cNvPicPr>
                   </pic:nvPicPr>
                   <pic:blipFill>
-                    <a:blip r:embed="rId57"/>
+                    <a:blip r:embed="rId58"/>
                     <a:stretch>
                       <a:fillRect/>
                     </a:stretch>
@@ -8229,8 +8127,8 @@
       <w:pPr>
         <w:pStyle w:val="ImageCaption"/>
       </w:pPr>
-      <w:bookmarkStart w:id="60" w:name="fig:benefitByWY"/>
-      <w:bookmarkEnd w:id="60"/>
+      <w:bookmarkStart w:id="61" w:name="fig:benefitByWY"/>
+      <w:bookmarkEnd w:id="61"/>
       <w:r>
         <w:t xml:space="preserve">Figure 5:</w:t>
       </w:r>
@@ -8273,18 +8171,18 @@
           <wp:inline>
             <wp:extent cx="5334000" cy="5334000"/>
             <wp:effectExtent b="0" l="0" r="0" t="0"/>
-            <wp:docPr descr="Figure 6:  Environmental and agricultural objective function performance (in terms of Hydrologic Benefit, or HB, value; and crop ET volume) for basecase (black circle in upper left) and 39 management scenarios. Symbol x and y coordinates are the average of 28 annual HB and ET values for each scenario over the full model period (water years 1991-2018). Whiskers show standard error of the 28 years of annual HB values; standard errors in the direction of the y-axis are smaller than the height covered by each symbol." title="" id="62" name="Picture"/>
+            <wp:docPr descr="Figure 6:  Environmental and agricultural objective function performance (in terms of Hydrologic Benefit, or HB, value; and crop ET volume) for basecase (black circle in upper left) and 39 management scenarios. Symbol x and y coordinates are the average of 28 annual HB and ET values for each scenario over the full model period (water years 1991-2018). Whiskers show standard error of the 28 years of annual HB values; standard errors in the direction of the y-axis are smaller than the height covered by each symbol." title="" id="63" name="Picture"/>
             <a:graphic>
               <a:graphicData uri="http://schemas.openxmlformats.org/drawingml/2006/picture">
                 <pic:pic>
                   <pic:nvPicPr>
-                    <pic:cNvPr descr="Graphics%20and%20Supplements/Figure%205.png" id="63" name="Picture"/>
+                    <pic:cNvPr descr="Graphics%20and%20Supplements/Figure%205.png" id="64" name="Picture"/>
                     <pic:cNvPicPr>
                       <a:picLocks noChangeArrowheads="1" noChangeAspect="1"/>
                     </pic:cNvPicPr>
                   </pic:nvPicPr>
                   <pic:blipFill>
-                    <a:blip r:embed="rId61"/>
+                    <a:blip r:embed="rId62"/>
                     <a:stretch>
                       <a:fillRect/>
                     </a:stretch>
@@ -8315,8 +8213,8 @@
       <w:pPr>
         <w:pStyle w:val="ImageCaption"/>
       </w:pPr>
-      <w:bookmarkStart w:id="64" w:name="fig:farmerFishTradeoffFigure"/>
-      <w:bookmarkEnd w:id="64"/>
+      <w:bookmarkStart w:id="65" w:name="fig:farmerFishTradeoffFigure"/>
+      <w:bookmarkEnd w:id="65"/>
       <w:r>
         <w:t xml:space="preserve">Figure 6:</w:t>
       </w:r>
@@ -8520,20 +8418,7 @@
         <w:t xml:space="preserve"> </w:t>
       </w:r>
       <w:r>
-        <w:t xml:space="preserve">(CDFW</w:t>
-      </w:r>
-      <w:r>
-        <w:t xml:space="preserve"> </w:t>
-      </w:r>
-      <w:r>
-        <w:rPr>
-          <w:b/>
-          <w:bCs/>
-        </w:rPr>
-        <w:t xml:space="preserve">CDFW2021c?</w:t>
-      </w:r>
-      <w:r>
-        <w:t xml:space="preserve">)</w:t>
+        <w:t xml:space="preserve">(SWRCB 2021)</w:t>
       </w:r>
       <w:r>
         <w:t xml:space="preserve">. The mean ET values of scenarios in these two categories are 103 to 117 million m</w:t>
@@ -8568,20 +8453,7 @@
         <w:t xml:space="preserve"> </w:t>
       </w:r>
       <w:r>
-        <w:t xml:space="preserve">(CDFW</w:t>
-      </w:r>
-      <w:r>
-        <w:t xml:space="preserve"> </w:t>
-      </w:r>
-      <w:r>
-        <w:rPr>
-          <w:b/>
-          <w:bCs/>
-        </w:rPr>
-        <w:t xml:space="preserve">CDFW2017?</w:t>
-      </w:r>
-      <w:r>
-        <w:t xml:space="preserve">)</w:t>
+        <w:t xml:space="preserve">(CDFW 2017)</w:t>
       </w:r>
       <w:r>
         <w:t xml:space="preserve">. Under this Low Flow Diversion Limits scenario, the mean crop ET volume is 4 million m</w:t>
@@ -8690,17 +8562,7 @@
         <w:t xml:space="preserve"> </w:t>
       </w:r>
       <w:r>
-        <w:t xml:space="preserve">(</w:t>
-      </w:r>
-      <w:r>
-        <w:rPr>
-          <w:b/>
-          <w:bCs/>
-        </w:rPr>
-        <w:t xml:space="preserve">SuperiorCourtofSiskiyouCounty1980?</w:t>
-      </w:r>
-      <w:r>
-        <w:t xml:space="preserve">)</w:t>
+        <w:t xml:space="preserve">(California State Water Resources Control Board 1980)</w:t>
       </w:r>
       <w:r>
         <w:t xml:space="preserve">, referred to here as the</w:t>
@@ -8755,8 +8617,8 @@
       <w:pPr>
         <w:pStyle w:val="TableCaption"/>
       </w:pPr>
-      <w:bookmarkStart w:id="65" w:name="tab:scenarioResultsTab"/>
-      <w:bookmarkEnd w:id="65"/>
+      <w:bookmarkStart w:id="66" w:name="tab:scenarioResultsTab"/>
+      <w:bookmarkEnd w:id="66"/>
       <w:r>
         <w:t xml:space="preserve">Table 5:</w:t>
       </w:r>
@@ -17890,17 +17752,17 @@
         </w:tc>
       </w:tr>
     </w:tbl>
-    <w:bookmarkEnd w:id="66"/>
-    <w:bookmarkStart w:id="71" w:name="X5717be130d28923be971a1bdea556d769a5487a"/>
+    <w:bookmarkEnd w:id="67"/>
+    <w:bookmarkStart w:id="72" w:name="X5717be130d28923be971a1bdea556d769a5487a"/>
     <w:p>
       <w:pPr>
-        <w:pStyle w:val="Heading3"/>
+        <w:pStyle w:val="Heading2"/>
       </w:pPr>
       <w:r>
         <w:rPr>
           <w:rStyle w:val="SectionNumber"/>
         </w:rPr>
-        <w:t xml:space="preserve">3.4.2</w:t>
+        <w:t xml:space="preserve">4.2</w:t>
       </w:r>
       <w:r>
         <w:tab/>
@@ -18034,18 +17896,18 @@
           <wp:inline>
             <wp:extent cx="5334000" cy="4000499"/>
             <wp:effectExtent b="0" l="0" r="0" t="0"/>
-            <wp:docPr descr="Figure 7:  Scenario trade-off efficiencies, or average HB value (a proxy for environmental benefit) gained per crop ET value lost (a proxy for farmer cost) (normalized to average basecase HB and ET values, respectively), in all 35 years. Basecase, Reservoir scenarios and Enhanced Recharge scenarios are not included as they have on average no or negative ET loss, producing infinite or negative efficiency values." title="" id="68" name="Picture"/>
+            <wp:docPr descr="Figure 7:  Scenario trade-off efficiencies, or average HB value (a proxy for environmental benefit) gained per crop ET value lost (a proxy for farmer cost) (normalized to average basecase HB and ET values, respectively), in all 35 years. Basecase, Reservoir scenarios and Enhanced Recharge scenarios are not included as they have on average no or negative ET loss, producing infinite or negative efficiency values." title="" id="69" name="Picture"/>
             <a:graphic>
               <a:graphicData uri="http://schemas.openxmlformats.org/drawingml/2006/picture">
                 <pic:pic>
                   <pic:nvPicPr>
-                    <pic:cNvPr descr="Graphics%20and%20Supplements/Figure%207.png" id="69" name="Picture"/>
+                    <pic:cNvPr descr="Graphics%20and%20Supplements/Figure%207.png" id="70" name="Picture"/>
                     <pic:cNvPicPr>
                       <a:picLocks noChangeArrowheads="1" noChangeAspect="1"/>
                     </pic:cNvPicPr>
                   </pic:nvPicPr>
                   <pic:blipFill>
-                    <a:blip r:embed="rId67"/>
+                    <a:blip r:embed="rId68"/>
                     <a:stretch>
                       <a:fillRect/>
                     </a:stretch>
@@ -18076,8 +17938,8 @@
       <w:pPr>
         <w:pStyle w:val="ImageCaption"/>
       </w:pPr>
-      <w:bookmarkStart w:id="70" w:name="fig:efficiency"/>
-      <w:bookmarkEnd w:id="70"/>
+      <w:bookmarkStart w:id="71" w:name="fig:efficiency"/>
+      <w:bookmarkEnd w:id="71"/>
       <w:r>
         <w:t xml:space="preserve">Figure 7:</w:t>
       </w:r>
@@ -18091,17 +17953,17 @@
         <w:t xml:space="preserve">Scenario trade-off efficiencies, or average HB value (a proxy for environmental benefit) gained per crop ET value lost (a proxy for farmer cost) (normalized to average basecase HB and ET values, respectively), in all 35 years. Basecase, Reservoir scenarios and Enhanced Recharge scenarios are not included as they have on average no or negative ET loss, producing infinite or negative efficiency values.</w:t>
       </w:r>
     </w:p>
-    <w:bookmarkEnd w:id="71"/>
-    <w:bookmarkStart w:id="77" w:name="Xfbc83626841bb94e70b2ed42e58f7fe62bf81a6"/>
+    <w:bookmarkEnd w:id="72"/>
+    <w:bookmarkStart w:id="78" w:name="Xfbc83626841bb94e70b2ed42e58f7fe62bf81a6"/>
     <w:p>
       <w:pPr>
-        <w:pStyle w:val="Heading3"/>
+        <w:pStyle w:val="Heading2"/>
       </w:pPr>
       <w:r>
         <w:rPr>
           <w:rStyle w:val="SectionNumber"/>
         </w:rPr>
-        <w:t xml:space="preserve">3.4.3</w:t>
+        <w:t xml:space="preserve">4.3</w:t>
       </w:r>
       <w:r>
         <w:tab/>
@@ -18247,18 +18109,18 @@
           <wp:inline>
             <wp:extent cx="4038600" cy="4019550"/>
             <wp:effectExtent b="0" l="0" r="0" t="0"/>
-            <wp:docPr descr="Figure 8:  A three-dimensional scatter plot of the objective function values for basecase and 39 management scenarios, averaged over 28 water years (1991-2018). Larger spheres are shown for the Pareto-optimal set of scenarios. Scenario colors correspond to legend in Figures 6 and 7." title="" id="73" name="Picture"/>
+            <wp:docPr descr="Figure 8:  A three-dimensional scatter plot of the objective function values for basecase and 39 management scenarios, averaged over 28 water years (1991-2018). Larger spheres are shown for the Pareto-optimal set of scenarios. Scenario colors correspond to legend in Figures 6 and 7." title="" id="74" name="Picture"/>
             <a:graphic>
               <a:graphicData uri="http://schemas.openxmlformats.org/drawingml/2006/picture">
                 <pic:pic>
                   <pic:nvPicPr>
-                    <pic:cNvPr descr="Graphics%20and%20Supplements/hbf%20et%20infra%20plot3d_2025.11.04.jpg" id="74" name="Picture"/>
+                    <pic:cNvPr descr="Graphics%20and%20Supplements/hbf%20et%20infra%20plot3d_2025.11.04.jpg" id="75" name="Picture"/>
                     <pic:cNvPicPr>
                       <a:picLocks noChangeArrowheads="1" noChangeAspect="1"/>
                     </pic:cNvPicPr>
                   </pic:nvPicPr>
                   <pic:blipFill>
-                    <a:blip r:embed="rId72"/>
+                    <a:blip r:embed="rId73"/>
                     <a:stretch>
                       <a:fillRect/>
                     </a:stretch>
@@ -18289,8 +18151,8 @@
       <w:pPr>
         <w:pStyle w:val="ImageCaption"/>
       </w:pPr>
-      <w:bookmarkStart w:id="75" w:name="fig:farmerFishInfraFigure3D"/>
-      <w:bookmarkEnd w:id="75"/>
+      <w:bookmarkStart w:id="76" w:name="fig:farmerFishInfraFigure3D"/>
+      <w:bookmarkEnd w:id="76"/>
       <w:r>
         <w:t xml:space="preserve">Figure 8:</w:t>
       </w:r>
@@ -18308,8 +18170,8 @@
       <w:pPr>
         <w:pStyle w:val="TableCaption"/>
       </w:pPr>
-      <w:bookmarkStart w:id="76" w:name="tab:gspMgmtList"/>
-      <w:bookmarkEnd w:id="76"/>
+      <w:bookmarkStart w:id="77" w:name="tab:gspMgmtList"/>
+      <w:bookmarkEnd w:id="77"/>
       <w:r>
         <w:t xml:space="preserve">Table 6:</w:t>
       </w:r>
@@ -21302,7 +21164,6 @@
         <w:br w:type="page"/>
       </w:r>
     </w:p>
-    <w:bookmarkEnd w:id="77"/>
     <w:bookmarkEnd w:id="78"/>
     <w:bookmarkEnd w:id="79"/>
     <w:bookmarkStart w:id="85" w:name="discussion"/>
@@ -21314,7 +21175,7 @@
         <w:rPr>
           <w:rStyle w:val="SectionNumber"/>
         </w:rPr>
-        <w:t xml:space="preserve">4</w:t>
+        <w:t xml:space="preserve">5</w:t>
       </w:r>
       <w:r>
         <w:tab/>
@@ -21361,7 +21222,7 @@
         <w:rPr>
           <w:rStyle w:val="SectionNumber"/>
         </w:rPr>
-        <w:t xml:space="preserve">4.1</w:t>
+        <w:t xml:space="preserve">5.1</w:t>
       </w:r>
       <w:r>
         <w:tab/>
@@ -21389,20 +21250,7 @@
         <w:t xml:space="preserve"> </w:t>
       </w:r>
       <w:r>
-        <w:t xml:space="preserve">(CDFW</w:t>
-      </w:r>
-      <w:r>
-        <w:t xml:space="preserve"> </w:t>
-      </w:r>
-      <w:r>
-        <w:rPr>
-          <w:b/>
-          <w:bCs/>
-        </w:rPr>
-        <w:t xml:space="preserve">CDFW2015a?</w:t>
-      </w:r>
-      <w:r>
-        <w:t xml:space="preserve">)</w:t>
+        <w:t xml:space="preserve">(CDFW 2015)</w:t>
       </w:r>
       <w:r>
         <w:t xml:space="preserve">.</w:t>
@@ -21419,17 +21267,7 @@
         <w:t xml:space="preserve"> </w:t>
       </w:r>
       <w:r>
-        <w:t xml:space="preserve">(</w:t>
-      </w:r>
-      <w:r>
-        <w:rPr>
-          <w:b/>
-          <w:bCs/>
-        </w:rPr>
-        <w:t xml:space="preserve">Sunding1996?</w:t>
-      </w:r>
-      <w:r>
-        <w:t xml:space="preserve">)</w:t>
+        <w:t xml:space="preserve">(Sunding 1996)</w:t>
       </w:r>
       <w:r>
         <w:t xml:space="preserve">. In the public meetings during GSP development, some informal (i.e., non-quantitative) surveying of stakeholder expectations of the costs of management actions took place. In terms of operational impacts, Scott Valley agricultural stakeholders stated that short-term interventions (such as fallowing an alfalfa field for one year, or curtailing pasture irrigation for a growing season) could have long-term impacts (such as affecting alfalfa yield the following year, or forcing a rancher to sell a herd</w:t>
@@ -21438,20 +21276,7 @@
         <w:t xml:space="preserve"> </w:t>
       </w:r>
       <w:r>
-        <w:t xml:space="preserve">(SVGAC</w:t>
-      </w:r>
-      <w:r>
-        <w:t xml:space="preserve"> </w:t>
-      </w:r>
-      <w:r>
-        <w:rPr>
-          <w:b/>
-          <w:bCs/>
-        </w:rPr>
-        <w:t xml:space="preserve">SVGAC2021_June?</w:t>
-      </w:r>
-      <w:r>
-        <w:t xml:space="preserve">)</w:t>
+        <w:t xml:space="preserve">(SVGAC 2021)</w:t>
       </w:r>
       <w:r>
         <w:t xml:space="preserve">. The current agricultural benefit proxy, annual crop ET, does not capture these multi-year costs to the local agricultural sector, or the regional impact that reduced agricultural productivity will have on economically disadvantaged local communities.</w:t>
@@ -21475,7 +21300,7 @@
         <w:rPr>
           <w:rStyle w:val="SectionNumber"/>
         </w:rPr>
-        <w:t xml:space="preserve">4.2</w:t>
+        <w:t xml:space="preserve">5.2</w:t>
       </w:r>
       <w:r>
         <w:tab/>
@@ -21495,20 +21320,7 @@
         <w:t xml:space="preserve"> </w:t>
       </w:r>
       <w:r>
-        <w:t xml:space="preserve">(e.g.,</w:t>
-      </w:r>
-      <w:r>
-        <w:t xml:space="preserve"> </w:t>
-      </w:r>
-      <w:r>
-        <w:rPr>
-          <w:b/>
-          <w:bCs/>
-        </w:rPr>
-        <w:t xml:space="preserve">Ohlberger2018?</w:t>
-      </w:r>
-      <w:r>
-        <w:t xml:space="preserve">)</w:t>
+        <w:t xml:space="preserve">(e.g., Ohlberger et al. 2018)</w:t>
       </w:r>
       <w:r>
         <w:t xml:space="preserve">. Eight dry years occurred during the 1991-2018 model period: 1991, ’92, ’94, 2001, ’09, ’13, ’14, and ’18 (Figure</w:t>
@@ -21585,7 +21397,7 @@
         <w:rPr>
           <w:rStyle w:val="SectionNumber"/>
         </w:rPr>
-        <w:t xml:space="preserve">4.3</w:t>
+        <w:t xml:space="preserve">5.3</w:t>
       </w:r>
       <w:r>
         <w:tab/>
@@ -21862,7 +21674,7 @@
         <w:rPr>
           <w:rStyle w:val="SectionNumber"/>
         </w:rPr>
-        <w:t xml:space="preserve">4.4</w:t>
+        <w:t xml:space="preserve">5.4</w:t>
       </w:r>
       <w:r>
         <w:tab/>
@@ -21958,7 +21770,7 @@
         <w:rPr>
           <w:rStyle w:val="SectionNumber"/>
         </w:rPr>
-        <w:t xml:space="preserve">4.5</w:t>
+        <w:t xml:space="preserve">5.5</w:t>
       </w:r>
       <w:r>
         <w:tab/>
@@ -22052,20 +21864,7 @@
         <w:t xml:space="preserve"> </w:t>
       </w:r>
       <w:r>
-        <w:t xml:space="preserve">(CDFW</w:t>
-      </w:r>
-      <w:r>
-        <w:t xml:space="preserve"> </w:t>
-      </w:r>
-      <w:r>
-        <w:rPr>
-          <w:b/>
-          <w:bCs/>
-        </w:rPr>
-        <w:t xml:space="preserve">CDFW2021c?</w:t>
-      </w:r>
-      <w:r>
-        <w:t xml:space="preserve">)</w:t>
+        <w:t xml:space="preserve">(SWRCB 2021)</w:t>
       </w:r>
       <w:r>
         <w:t xml:space="preserve">. The objective function summary of existing model results could help stakeholders and regulators weigh the trade-offs of various actions and potential irrigation cutoff dates in the context of the consequences of other proposed management scenarios. The modeling results suggest that if a decision is made to regulate water use, some later intervention dates may produce minimal gains in environmental flows in some water years (e.g., an alfalfa irrigation cutoff date of August 15 in water years 1995 or 2002 in panel A of Figure</w:t>
@@ -22091,7 +21890,7 @@
         <w:rPr>
           <w:rStyle w:val="SectionNumber"/>
         </w:rPr>
-        <w:t xml:space="preserve">5</w:t>
+        <w:t xml:space="preserve">6</w:t>
       </w:r>
       <w:r>
         <w:tab/>
@@ -22157,7 +21956,7 @@
       </w:r>
     </w:p>
     <w:bookmarkEnd w:id="87"/>
-    <w:bookmarkStart w:id="116" w:name="references"/>
+    <w:bookmarkStart w:id="137" w:name="references"/>
     <w:p>
       <w:pPr>
         <w:pStyle w:val="Heading1"/>
@@ -22166,7 +21965,7 @@
         <w:rPr>
           <w:rStyle w:val="SectionNumber"/>
         </w:rPr>
-        <w:t xml:space="preserve">6</w:t>
+        <w:t xml:space="preserve">7</w:t>
       </w:r>
       <w:r>
         <w:tab/>
@@ -22175,7 +21974,7 @@
         <w:t xml:space="preserve">References</w:t>
       </w:r>
     </w:p>
-    <w:bookmarkStart w:id="115" w:name="refs"/>
+    <w:bookmarkStart w:id="136" w:name="refs"/>
     <w:bookmarkStart w:id="89" w:name="ref-BorkHirokawaTrends2021"/>
     <w:p>
       <w:pPr>
@@ -22322,7 +22121,250 @@
       </w:r>
     </w:p>
     <w:bookmarkEnd w:id="91"/>
-    <w:bookmarkStart w:id="93" w:name="ref-CarterSheafferAlfalfa1983"/>
+    <w:bookmarkStart w:id="92" w:name="X534406a913d453049af97ddf853e5acf00f7d45"/>
+    <w:p>
+      <w:pPr>
+        <w:pStyle w:val="Bibliography"/>
+      </w:pPr>
+      <w:r>
+        <w:t xml:space="preserve">California Department of Fish and Wildlife. 2017.</w:t>
+      </w:r>
+      <w:r>
+        <w:t xml:space="preserve"> </w:t>
+      </w:r>
+      <w:r>
+        <w:t xml:space="preserve">“</w:t>
+      </w:r>
+      <w:r>
+        <w:t xml:space="preserve">INTERIM INSTREAM FLOW CRITERIA FOR THE PROTECTION OF FISHERY RESOURCES IN THE SCOTT RIVER WATERSHED</w:t>
+      </w:r>
+      <w:r>
+        <w:t xml:space="preserve">,</w:t>
+      </w:r>
+      <w:r>
+        <w:t xml:space="preserve"> </w:t>
+      </w:r>
+      <w:r>
+        <w:t xml:space="preserve">SISKIYOU COUNTY</w:t>
+      </w:r>
+      <w:r>
+        <w:t xml:space="preserve">.”</w:t>
+      </w:r>
+    </w:p>
+    <w:bookmarkEnd w:id="92"/>
+    <w:bookmarkStart w:id="93" w:name="Xc89eae4adec15389bd12509e9457a9dc8c09d75"/>
+    <w:p>
+      <w:pPr>
+        <w:pStyle w:val="Bibliography"/>
+      </w:pPr>
+      <w:r>
+        <w:t xml:space="preserve">California Department of Fish and Wildlife, NOAA-Fisheries, Scott River Water Trust, Siskiyou Resource Conservation District, and U.S. Forest Service - Klamath National Forest. 2015.</w:t>
+      </w:r>
+      <w:r>
+        <w:t xml:space="preserve"> </w:t>
+      </w:r>
+      <w:r>
+        <w:t xml:space="preserve">“Cooperative</w:t>
+      </w:r>
+      <w:r>
+        <w:t xml:space="preserve"> </w:t>
+      </w:r>
+      <w:r>
+        <w:t xml:space="preserve">Scott River Coho Rescue</w:t>
+      </w:r>
+      <w:r>
+        <w:t xml:space="preserve"> </w:t>
+      </w:r>
+      <w:r>
+        <w:t xml:space="preserve">&amp;</w:t>
+      </w:r>
+      <w:r>
+        <w:t xml:space="preserve"> </w:t>
+      </w:r>
+      <w:r>
+        <w:t xml:space="preserve">Relocation Effort</w:t>
+      </w:r>
+      <w:r>
+        <w:t xml:space="preserve">: 2014</w:t>
+      </w:r>
+      <w:r>
+        <w:t xml:space="preserve"> </w:t>
+      </w:r>
+      <w:r>
+        <w:t xml:space="preserve">Drought Emergency</w:t>
+      </w:r>
+      <w:r>
+        <w:t xml:space="preserve">.”</w:t>
+      </w:r>
+    </w:p>
+    <w:bookmarkEnd w:id="93"/>
+    <w:bookmarkStart w:id="94" w:name="X7c5765d4bf46367820355fe718939efb3be661f"/>
+    <w:p>
+      <w:pPr>
+        <w:pStyle w:val="Bibliography"/>
+      </w:pPr>
+      <w:r>
+        <w:t xml:space="preserve">California Department of Water Resources. 2017.</w:t>
+      </w:r>
+      <w:r>
+        <w:t xml:space="preserve"> </w:t>
+      </w:r>
+      <w:r>
+        <w:t xml:space="preserve">“Statewide</w:t>
+      </w:r>
+      <w:r>
+        <w:t xml:space="preserve"> </w:t>
+      </w:r>
+      <w:r>
+        <w:t xml:space="preserve">Crop Mapping</w:t>
+      </w:r>
+      <w:r>
+        <w:t xml:space="preserve"> </w:t>
+      </w:r>
+      <w:r>
+        <w:t xml:space="preserve">- 2016</w:t>
+      </w:r>
+      <w:r>
+        <w:t xml:space="preserve"> </w:t>
+      </w:r>
+      <w:r>
+        <w:t xml:space="preserve">Statewide Crop Mapping GIS Shapefiles</w:t>
+      </w:r>
+      <w:r>
+        <w:t xml:space="preserve"> </w:t>
+      </w:r>
+      <w:r>
+        <w:t xml:space="preserve">-</w:t>
+      </w:r>
+      <w:r>
+        <w:t xml:space="preserve"> </w:t>
+      </w:r>
+      <w:r>
+        <w:t xml:space="preserve">California Natural Resources Agency Open Data</w:t>
+      </w:r>
+      <w:r>
+        <w:t xml:space="preserve">.”</w:t>
+      </w:r>
+      <w:r>
+        <w:t xml:space="preserve"> </w:t>
+      </w:r>
+      <w:r>
+        <w:rPr>
+          <w:i/>
+          <w:iCs/>
+        </w:rPr>
+        <w:t xml:space="preserve">2016 Statewide Crop Mapping GIS Shapefiles</w:t>
+      </w:r>
+      <w:r>
+        <w:t xml:space="preserve">. https://data.cnra.ca.gov/dataset/statewide-crop-mapping/resource/3b57898b-f013-487a-b472-17f54311edb5.</w:t>
+      </w:r>
+    </w:p>
+    <w:bookmarkEnd w:id="94"/>
+    <w:bookmarkStart w:id="95" w:name="Xe7b7ad2022eadb255e299639b3100f5357e120c"/>
+    <w:p>
+      <w:pPr>
+        <w:pStyle w:val="Bibliography"/>
+      </w:pPr>
+      <w:r>
+        <w:t xml:space="preserve">California State Water Resources Control Board. 1980.</w:t>
+      </w:r>
+      <w:r>
+        <w:t xml:space="preserve"> </w:t>
+      </w:r>
+      <w:r>
+        <w:t xml:space="preserve">“Scott</w:t>
+      </w:r>
+      <w:r>
+        <w:t xml:space="preserve"> </w:t>
+      </w:r>
+      <w:r>
+        <w:t xml:space="preserve">River Adjudication</w:t>
+      </w:r>
+      <w:r>
+        <w:t xml:space="preserve">,</w:t>
+      </w:r>
+      <w:r>
+        <w:t xml:space="preserve"> </w:t>
+      </w:r>
+      <w:r>
+        <w:t xml:space="preserve">Decree No</w:t>
+      </w:r>
+      <w:r>
+        <w:t xml:space="preserve">. 30662.</w:t>
+      </w:r>
+      <w:r>
+        <w:t xml:space="preserve"> </w:t>
+      </w:r>
+      <w:r>
+        <w:t xml:space="preserve">Scott River</w:t>
+      </w:r>
+      <w:r>
+        <w:t xml:space="preserve"> </w:t>
+      </w:r>
+      <w:r>
+        <w:t xml:space="preserve">Stream System,</w:t>
+      </w:r>
+      <w:r>
+        <w:t xml:space="preserve"> </w:t>
+      </w:r>
+      <w:r>
+        <w:t xml:space="preserve">Siskiyou County</w:t>
+      </w:r>
+      <w:r>
+        <w:t xml:space="preserve">.”</w:t>
+      </w:r>
+      <w:r>
+        <w:t xml:space="preserve"> </w:t>
+      </w:r>
+      <w:r>
+        <w:t xml:space="preserve">Superior Court of Siskiyou County.</w:t>
+      </w:r>
+    </w:p>
+    <w:bookmarkEnd w:id="95"/>
+    <w:bookmarkStart w:id="96" w:name="X6ef878f889213098c200c5acad35595649e9db2"/>
+    <w:p>
+      <w:pPr>
+        <w:pStyle w:val="Bibliography"/>
+      </w:pPr>
+      <w:r>
+        <w:t xml:space="preserve">California State Water Resources Control Board (SWRCB). 1975.</w:t>
+      </w:r>
+      <w:r>
+        <w:t xml:space="preserve"> </w:t>
+      </w:r>
+      <w:r>
+        <w:t xml:space="preserve">“Report on</w:t>
+      </w:r>
+      <w:r>
+        <w:t xml:space="preserve"> </w:t>
+      </w:r>
+      <w:r>
+        <w:t xml:space="preserve">Hydrogeologic Conditions</w:t>
+      </w:r>
+      <w:r>
+        <w:t xml:space="preserve">,</w:t>
+      </w:r>
+      <w:r>
+        <w:t xml:space="preserve"> </w:t>
+      </w:r>
+      <w:r>
+        <w:t xml:space="preserve">Scott River Valley</w:t>
+      </w:r>
+      <w:r>
+        <w:t xml:space="preserve">,</w:t>
+      </w:r>
+      <w:r>
+        <w:t xml:space="preserve"> </w:t>
+      </w:r>
+      <w:r>
+        <w:t xml:space="preserve">Scott River Valley</w:t>
+      </w:r>
+      <w:r>
+        <w:t xml:space="preserve">.”</w:t>
+      </w:r>
+    </w:p>
+    <w:bookmarkEnd w:id="96"/>
+    <w:bookmarkStart w:id="98" w:name="ref-CarterSheafferAlfalfa1983"/>
     <w:p>
       <w:pPr>
         <w:pStyle w:val="Bibliography"/>
@@ -22442,7 +22484,7 @@
       <w:r>
         <w:t xml:space="preserve"> </w:t>
       </w:r>
-      <w:hyperlink r:id="rId92">
+      <w:hyperlink r:id="rId97">
         <w:r>
           <w:rPr>
             <w:rStyle w:val="Hyperlink"/>
@@ -22454,8 +22496,8 @@
         <w:t xml:space="preserve">.</w:t>
       </w:r>
     </w:p>
-    <w:bookmarkEnd w:id="93"/>
-    <w:bookmarkStart w:id="95" w:name="ref-CohonMarksMultiobjective1973"/>
+    <w:bookmarkEnd w:id="98"/>
+    <w:bookmarkStart w:id="100" w:name="ref-CohonMarksMultiobjective1973"/>
     <w:p>
       <w:pPr>
         <w:pStyle w:val="Bibliography"/>
@@ -22488,7 +22530,7 @@
       <w:r>
         <w:t xml:space="preserve"> </w:t>
       </w:r>
-      <w:hyperlink r:id="rId94">
+      <w:hyperlink r:id="rId99">
         <w:r>
           <w:rPr>
             <w:rStyle w:val="Hyperlink"/>
@@ -22500,8 +22542,8 @@
         <w:t xml:space="preserve">.</w:t>
       </w:r>
     </w:p>
-    <w:bookmarkEnd w:id="95"/>
-    <w:bookmarkStart w:id="96" w:name="X57acf74f4e6bbb2dbfb24b295bee561f3691de6"/>
+    <w:bookmarkEnd w:id="100"/>
+    <w:bookmarkStart w:id="101" w:name="X57acf74f4e6bbb2dbfb24b295bee561f3691de6"/>
     <w:p>
       <w:pPr>
         <w:pStyle w:val="Bibliography"/>
@@ -22555,8 +22597,8 @@
         <w:t xml:space="preserve">2021. {{NOTICE OF APPROVAL OF EMERGENCY REGULATORY ACTION}}.</w:t>
       </w:r>
     </w:p>
-    <w:bookmarkEnd w:id="96"/>
-    <w:bookmarkStart w:id="97" w:name="X6facecaac3164717d4e5933b1aebd85f9388655"/>
+    <w:bookmarkEnd w:id="101"/>
+    <w:bookmarkStart w:id="102" w:name="X6facecaac3164717d4e5933b1aebd85f9388655"/>
     <w:p>
       <w:pPr>
         <w:pStyle w:val="Bibliography"/>
@@ -22622,8 +22664,8 @@
         <w:t xml:space="preserve">2024. {{NOTICE OF APPROVAL OF EMERGENCY REGULATORY ACTION}}.</w:t>
       </w:r>
     </w:p>
-    <w:bookmarkEnd w:id="97"/>
-    <w:bookmarkStart w:id="98" w:name="ref-FogliaEtAlScott2013"/>
+    <w:bookmarkEnd w:id="102"/>
+    <w:bookmarkStart w:id="103" w:name="ref-FogliaEtAlScott2013"/>
     <w:p>
       <w:pPr>
         <w:pStyle w:val="Bibliography"/>
@@ -22680,8 +22722,8 @@
         <w:t xml:space="preserve">Davis, CA: North Coast Regional Water Quality Control Board.</w:t>
       </w:r>
     </w:p>
-    <w:bookmarkEnd w:id="98"/>
-    <w:bookmarkStart w:id="99" w:name="Xff198d1a9510a26c6b6a97c9924d7fdc8be1418"/>
+    <w:bookmarkEnd w:id="103"/>
+    <w:bookmarkStart w:id="104" w:name="Xff198d1a9510a26c6b6a97c9924d7fdc8be1418"/>
     <w:p>
       <w:pPr>
         <w:pStyle w:val="Bibliography"/>
@@ -22723,8 +22765,8 @@
         <w:t xml:space="preserve">Ventura, CA: Fox Canyon Groundwater Manegement Agency.</w:t>
       </w:r>
     </w:p>
-    <w:bookmarkEnd w:id="99"/>
-    <w:bookmarkStart w:id="101" w:name="ref-FreemanWICKED2000"/>
+    <w:bookmarkEnd w:id="104"/>
+    <w:bookmarkStart w:id="106" w:name="ref-FreemanWICKED2000"/>
     <w:p>
       <w:pPr>
         <w:pStyle w:val="Bibliography"/>
@@ -22772,7 +22814,7 @@
       <w:r>
         <w:t xml:space="preserve"> </w:t>
       </w:r>
-      <w:hyperlink r:id="rId100">
+      <w:hyperlink r:id="rId105">
         <w:r>
           <w:rPr>
             <w:rStyle w:val="Hyperlink"/>
@@ -22784,8 +22826,82 @@
         <w:t xml:space="preserve">.</w:t>
       </w:r>
     </w:p>
-    <w:bookmarkEnd w:id="101"/>
-    <w:bookmarkStart w:id="103" w:name="ref-KoubaEtAlWatershedSpecific2025"/>
+    <w:bookmarkEnd w:id="106"/>
+    <w:bookmarkStart w:id="107" w:name="ref-HarterHinesSCOTT2008"/>
+    <w:p>
+      <w:pPr>
+        <w:pStyle w:val="Bibliography"/>
+      </w:pPr>
+      <w:r>
+        <w:t xml:space="preserve">Harter, Thomas, and Ryan Hines. 2008.</w:t>
+      </w:r>
+      <w:r>
+        <w:t xml:space="preserve"> </w:t>
+      </w:r>
+      <w:r>
+        <w:t xml:space="preserve">“</w:t>
+      </w:r>
+      <w:r>
+        <w:t xml:space="preserve">SCOTT VALLEY COMMUNITY GROUNDWATER STUDY PLAN</w:t>
+      </w:r>
+      <w:r>
+        <w:t xml:space="preserve">.”</w:t>
+      </w:r>
+      <w:r>
+        <w:t xml:space="preserve"> </w:t>
+      </w:r>
+      <w:r>
+        <w:t xml:space="preserve">University of California, Davis.</w:t>
+      </w:r>
+    </w:p>
+    <w:bookmarkEnd w:id="107"/>
+    <w:bookmarkStart w:id="109" w:name="ref-KapelanEtAlMultiobjective2005"/>
+    <w:p>
+      <w:pPr>
+        <w:pStyle w:val="Bibliography"/>
+      </w:pPr>
+      <w:r>
+        <w:t xml:space="preserve">Kapelan, Zoran S., Dragan A. Savic, and Godfrey A. Walters. 2005.</w:t>
+      </w:r>
+      <w:r>
+        <w:t xml:space="preserve"> </w:t>
+      </w:r>
+      <w:r>
+        <w:t xml:space="preserve">“Multiobjective Design of Water Distribution Systems Under Uncertainty.”</w:t>
+      </w:r>
+      <w:r>
+        <w:t xml:space="preserve"> </w:t>
+      </w:r>
+      <w:r>
+        <w:rPr>
+          <w:i/>
+          <w:iCs/>
+        </w:rPr>
+        <w:t xml:space="preserve">Water Resources Research</w:t>
+      </w:r>
+      <w:r>
+        <w:t xml:space="preserve"> </w:t>
+      </w:r>
+      <w:r>
+        <w:t xml:space="preserve">41 (11): 2004WR003787.</w:t>
+      </w:r>
+      <w:r>
+        <w:t xml:space="preserve"> </w:t>
+      </w:r>
+      <w:hyperlink r:id="rId108">
+        <w:r>
+          <w:rPr>
+            <w:rStyle w:val="Hyperlink"/>
+          </w:rPr>
+          <w:t xml:space="preserve">https://doi.org/10.1029/2004WR003787</w:t>
+        </w:r>
+      </w:hyperlink>
+      <w:r>
+        <w:t xml:space="preserve">.</w:t>
+      </w:r>
+    </w:p>
+    <w:bookmarkEnd w:id="109"/>
+    <w:bookmarkStart w:id="111" w:name="ref-KoubaEtAlWatershedSpecific2025"/>
     <w:p>
       <w:pPr>
         <w:pStyle w:val="Bibliography"/>
@@ -22839,7 +22955,7 @@
       <w:r>
         <w:t xml:space="preserve"> </w:t>
       </w:r>
-      <w:hyperlink r:id="rId102">
+      <w:hyperlink r:id="rId110">
         <w:r>
           <w:rPr>
             <w:rStyle w:val="Hyperlink"/>
@@ -22851,8 +22967,8 @@
         <w:t xml:space="preserve">.</w:t>
       </w:r>
     </w:p>
-    <w:bookmarkEnd w:id="103"/>
-    <w:bookmarkStart w:id="105" w:name="ref-MackGeology1958"/>
+    <w:bookmarkEnd w:id="111"/>
+    <w:bookmarkStart w:id="113" w:name="ref-MackGeology1958"/>
     <w:p>
       <w:pPr>
         <w:pStyle w:val="Bibliography"/>
@@ -22902,7 +23018,7 @@
       <w:r>
         <w:t xml:space="preserve"> </w:t>
       </w:r>
-      <w:hyperlink r:id="rId104">
+      <w:hyperlink r:id="rId112">
         <w:r>
           <w:rPr>
             <w:rStyle w:val="Hyperlink"/>
@@ -22914,8 +23030,121 @@
         <w:t xml:space="preserve">.</w:t>
       </w:r>
     </w:p>
-    <w:bookmarkEnd w:id="105"/>
-    <w:bookmarkStart w:id="107" w:name="ref-NordgrenEtAlSupporting2016"/>
+    <w:bookmarkEnd w:id="113"/>
+    <w:bookmarkStart w:id="115" w:name="ref-MahoneyRoodStreamflow1998"/>
+    <w:p>
+      <w:pPr>
+        <w:pStyle w:val="Bibliography"/>
+      </w:pPr>
+      <w:r>
+        <w:t xml:space="preserve">Mahoney, John M., and Stewart B. Rood. 1998.</w:t>
+      </w:r>
+      <w:r>
+        <w:t xml:space="preserve"> </w:t>
+      </w:r>
+      <w:r>
+        <w:t xml:space="preserve">“Streamflow Requirements for Cottonwood Seedling Recruitment—</w:t>
+      </w:r>
+      <w:r>
+        <w:t xml:space="preserve">An</w:t>
+      </w:r>
+      <w:r>
+        <w:t xml:space="preserve"> </w:t>
+      </w:r>
+      <w:r>
+        <w:t xml:space="preserve">Integrative Model.”</w:t>
+      </w:r>
+      <w:r>
+        <w:t xml:space="preserve"> </w:t>
+      </w:r>
+      <w:r>
+        <w:rPr>
+          <w:i/>
+          <w:iCs/>
+        </w:rPr>
+        <w:t xml:space="preserve">Wetlands</w:t>
+      </w:r>
+      <w:r>
+        <w:t xml:space="preserve"> </w:t>
+      </w:r>
+      <w:r>
+        <w:t xml:space="preserve">18 (4): 634–45.</w:t>
+      </w:r>
+      <w:r>
+        <w:t xml:space="preserve"> </w:t>
+      </w:r>
+      <w:hyperlink r:id="rId114">
+        <w:r>
+          <w:rPr>
+            <w:rStyle w:val="Hyperlink"/>
+          </w:rPr>
+          <w:t xml:space="preserve">https://doi.org/10.1007/BF03161678</w:t>
+        </w:r>
+      </w:hyperlink>
+      <w:r>
+        <w:t xml:space="preserve">.</w:t>
+      </w:r>
+    </w:p>
+    <w:bookmarkEnd w:id="115"/>
+    <w:bookmarkStart w:id="117" w:name="ref-MonarchiEtAlInteractive1973"/>
+    <w:p>
+      <w:pPr>
+        <w:pStyle w:val="Bibliography"/>
+      </w:pPr>
+      <w:r>
+        <w:t xml:space="preserve">Monarchi, David E., Chester C. Kisiel, and Lucien Duckstein. 1973.</w:t>
+      </w:r>
+      <w:r>
+        <w:t xml:space="preserve"> </w:t>
+      </w:r>
+      <w:r>
+        <w:t xml:space="preserve">“Interactive Multiobjective Programing in Water Resources:</w:t>
+      </w:r>
+      <w:r>
+        <w:t xml:space="preserve"> </w:t>
+      </w:r>
+      <w:r>
+        <w:t xml:space="preserve">A</w:t>
+      </w:r>
+      <w:r>
+        <w:t xml:space="preserve"> </w:t>
+      </w:r>
+      <w:r>
+        <w:t xml:space="preserve">Case Study.”</w:t>
+      </w:r>
+      <w:r>
+        <w:t xml:space="preserve"> </w:t>
+      </w:r>
+      <w:r>
+        <w:rPr>
+          <w:i/>
+          <w:iCs/>
+        </w:rPr>
+        <w:t xml:space="preserve">Water Resources Research</w:t>
+      </w:r>
+      <w:r>
+        <w:t xml:space="preserve"> </w:t>
+      </w:r>
+      <w:r>
+        <w:t xml:space="preserve">9 (4): 837–50.</w:t>
+      </w:r>
+      <w:r>
+        <w:t xml:space="preserve"> </w:t>
+      </w:r>
+      <w:hyperlink r:id="rId116">
+        <w:r>
+          <w:rPr>
+            <w:rStyle w:val="Hyperlink"/>
+          </w:rPr>
+          <w:t xml:space="preserve">https://doi.org/10.1029/WR009i004p00837</w:t>
+        </w:r>
+      </w:hyperlink>
+      <w:r>
+        <w:t xml:space="preserve">.</w:t>
+      </w:r>
+    </w:p>
+    <w:bookmarkEnd w:id="117"/>
+    <w:bookmarkStart w:id="119" w:name="ref-NordgrenEtAlSupporting2016"/>
     <w:p>
       <w:pPr>
         <w:pStyle w:val="Bibliography"/>
@@ -22960,7 +23189,7 @@
       <w:r>
         <w:t xml:space="preserve"> </w:t>
       </w:r>
-      <w:hyperlink r:id="rId106">
+      <w:hyperlink r:id="rId118">
         <w:r>
           <w:rPr>
             <w:rStyle w:val="Hyperlink"/>
@@ -22972,38 +23201,204 @@
         <w:t xml:space="preserve">.</w:t>
       </w:r>
     </w:p>
-    <w:bookmarkEnd w:id="107"/>
-    <w:bookmarkStart w:id="108" w:name="ref-SiskiyouCountyScott2021"/>
+    <w:bookmarkEnd w:id="119"/>
+    <w:bookmarkStart w:id="121" w:name="ref-OhlbergerEtAlEffects2018"/>
     <w:p>
       <w:pPr>
         <w:pStyle w:val="Bibliography"/>
       </w:pPr>
       <w:r>
-        <w:t xml:space="preserve">Siskiyou County. 2021.</w:t>
-      </w:r>
-      <w:r>
-        <w:t xml:space="preserve"> </w:t>
-      </w:r>
-      <w:r>
-        <w:t xml:space="preserve">“Scott</w:t>
-      </w:r>
-      <w:r>
-        <w:t xml:space="preserve"> </w:t>
-      </w:r>
-      <w:r>
-        <w:t xml:space="preserve">Valley Groundwater Sustainability Plan</w:t>
-      </w:r>
-      <w:r>
-        <w:t xml:space="preserve">.”</w:t>
+        <w:t xml:space="preserve">Ohlberger, Jan, Thomas W. Buehrens, Samuel J. Brenkman, Patrick Crain, Thomas P. Quinn, and Ray Hilborn. 2018.</w:t>
+      </w:r>
+      <w:r>
+        <w:t xml:space="preserve"> </w:t>
+      </w:r>
+      <w:r>
+        <w:t xml:space="preserve">“Effects of Past and Projected River Discharge Variability on Freshwater Production in an Anadromous Fish.”</w:t>
+      </w:r>
+      <w:r>
+        <w:t xml:space="preserve"> </w:t>
+      </w:r>
+      <w:r>
+        <w:rPr>
+          <w:i/>
+          <w:iCs/>
+        </w:rPr>
+        <w:t xml:space="preserve">Freshwater Biology</w:t>
+      </w:r>
+      <w:r>
+        <w:t xml:space="preserve"> </w:t>
+      </w:r>
+      <w:r>
+        <w:t xml:space="preserve">63 (4): 331–40.</w:t>
+      </w:r>
+      <w:r>
+        <w:t xml:space="preserve"> </w:t>
+      </w:r>
+      <w:hyperlink r:id="rId120">
+        <w:r>
+          <w:rPr>
+            <w:rStyle w:val="Hyperlink"/>
+          </w:rPr>
+          <w:t xml:space="preserve">https://doi.org/10.1111/fwb.13070</w:t>
+        </w:r>
+      </w:hyperlink>
+      <w:r>
+        <w:t xml:space="preserve">.</w:t>
       </w:r>
     </w:p>
-    <w:bookmarkEnd w:id="108"/>
-    <w:bookmarkStart w:id="109" w:name="Xa7b10fbb32571a990cee2341e679d296b855974"/>
+    <w:bookmarkEnd w:id="121"/>
+    <w:bookmarkStart w:id="122" w:name="X35601437fc25b0fdd92b478f2f9ddeaed3398df"/>
     <w:p>
       <w:pPr>
         <w:pStyle w:val="Bibliography"/>
       </w:pPr>
       <w:r>
+        <w:t xml:space="preserve">Scott River Watershed Council. 2018.</w:t>
+      </w:r>
+      <w:r>
+        <w:t xml:space="preserve"> </w:t>
+      </w:r>
+      <w:r>
+        <w:t xml:space="preserve">“Restoring</w:t>
+      </w:r>
+      <w:r>
+        <w:t xml:space="preserve"> </w:t>
+      </w:r>
+      <w:r>
+        <w:t xml:space="preserve">Priority Coho Habitat</w:t>
+      </w:r>
+      <w:r>
+        <w:t xml:space="preserve"> </w:t>
+      </w:r>
+      <w:r>
+        <w:t xml:space="preserve">in the</w:t>
+      </w:r>
+      <w:r>
+        <w:t xml:space="preserve"> </w:t>
+      </w:r>
+      <w:r>
+        <w:t xml:space="preserve">Scott River Watershed Modeling</w:t>
+      </w:r>
+      <w:r>
+        <w:t xml:space="preserve"> </w:t>
+      </w:r>
+      <w:r>
+        <w:t xml:space="preserve">and</w:t>
+      </w:r>
+      <w:r>
+        <w:t xml:space="preserve"> </w:t>
+      </w:r>
+      <w:r>
+        <w:t xml:space="preserve">Planning Report</w:t>
+      </w:r>
+      <w:r>
+        <w:t xml:space="preserve">.”</w:t>
+      </w:r>
+    </w:p>
+    <w:bookmarkEnd w:id="122"/>
+    <w:bookmarkStart w:id="123" w:name="X334218043bd9d5b07a848a610917fcfef0168db"/>
+    <w:p>
+      <w:pPr>
+        <w:pStyle w:val="Bibliography"/>
+      </w:pPr>
+      <w:r>
+        <w:t xml:space="preserve">Scott Valley Area Plan Committee. 1980.</w:t>
+      </w:r>
+      <w:r>
+        <w:t xml:space="preserve"> </w:t>
+      </w:r>
+      <w:r>
+        <w:t xml:space="preserve">“Scott</w:t>
+      </w:r>
+      <w:r>
+        <w:t xml:space="preserve"> </w:t>
+      </w:r>
+      <w:r>
+        <w:t xml:space="preserve">Valley Area Plan</w:t>
+      </w:r>
+      <w:r>
+        <w:t xml:space="preserve">.”</w:t>
+      </w:r>
+      <w:r>
+        <w:t xml:space="preserve"> </w:t>
+      </w:r>
+      <w:r>
+        <w:t xml:space="preserve">Siskiyou County.</w:t>
+      </w:r>
+    </w:p>
+    <w:bookmarkEnd w:id="123"/>
+    <w:bookmarkStart w:id="124" w:name="ref-SiskiyouCountyScott2021"/>
+    <w:p>
+      <w:pPr>
+        <w:pStyle w:val="Bibliography"/>
+      </w:pPr>
+      <w:r>
+        <w:t xml:space="preserve">Siskiyou County. 2021.</w:t>
+      </w:r>
+      <w:r>
+        <w:t xml:space="preserve"> </w:t>
+      </w:r>
+      <w:r>
+        <w:t xml:space="preserve">“Scott</w:t>
+      </w:r>
+      <w:r>
+        <w:t xml:space="preserve"> </w:t>
+      </w:r>
+      <w:r>
+        <w:t xml:space="preserve">Valley Groundwater Sustainability Plan</w:t>
+      </w:r>
+      <w:r>
+        <w:t xml:space="preserve">.”</w:t>
+      </w:r>
+    </w:p>
+    <w:bookmarkEnd w:id="124"/>
+    <w:bookmarkStart w:id="125" w:name="X15105b7917297e4641cb2d2cfd1651756f7bcb0"/>
+    <w:p>
+      <w:pPr>
+        <w:pStyle w:val="Bibliography"/>
+      </w:pPr>
+      <w:r>
+        <w:t xml:space="preserve">Siskiyou County GSA - Scott Valley Groundwater Advisory Committee. 2021.</w:t>
+      </w:r>
+      <w:r>
+        <w:t xml:space="preserve"> </w:t>
+      </w:r>
+      <w:r>
+        <w:t xml:space="preserve">“Siskiyou</w:t>
+      </w:r>
+      <w:r>
+        <w:t xml:space="preserve"> </w:t>
+      </w:r>
+      <w:r>
+        <w:t xml:space="preserve">County Groundwater Sustainability Agency</w:t>
+      </w:r>
+      <w:r>
+        <w:t xml:space="preserve">:</w:t>
+      </w:r>
+      <w:r>
+        <w:t xml:space="preserve"> </w:t>
+      </w:r>
+      <w:r>
+        <w:t xml:space="preserve">Scott Valley Advisory Committee Meeting</w:t>
+      </w:r>
+      <w:r>
+        <w:t xml:space="preserve">.”</w:t>
+      </w:r>
+      <w:r>
+        <w:t xml:space="preserve"> </w:t>
+      </w:r>
+      <w:r>
+        <w:t xml:space="preserve">Fort Jones, CA: Siskiyou County.</w:t>
+      </w:r>
+    </w:p>
+    <w:bookmarkEnd w:id="125"/>
+    <w:bookmarkStart w:id="126" w:name="Xa7b10fbb32571a990cee2341e679d296b855974"/>
+    <w:p>
+      <w:pPr>
+        <w:pStyle w:val="Bibliography"/>
+      </w:pPr>
+      <w:r>
         <w:t xml:space="preserve">STATE WATER RESOURCES CONTROL BOARD. 2024.</w:t>
       </w:r>
       <w:r>
@@ -23034,8 +23429,75 @@
         <w:t xml:space="preserve">2024-0036.</w:t>
       </w:r>
     </w:p>
-    <w:bookmarkEnd w:id="109"/>
-    <w:bookmarkStart w:id="111" w:name="ref-TolleyEtAlSensitivity2019"/>
+    <w:bookmarkEnd w:id="126"/>
+    <w:bookmarkStart w:id="128" w:name="ref-SundingMeasuring1996"/>
+    <w:p>
+      <w:pPr>
+        <w:pStyle w:val="Bibliography"/>
+      </w:pPr>
+      <w:r>
+        <w:t xml:space="preserve">Sunding, David L. 1996.</w:t>
+      </w:r>
+      <w:r>
+        <w:t xml:space="preserve"> </w:t>
+      </w:r>
+      <w:r>
+        <w:t xml:space="preserve">“Measuring the</w:t>
+      </w:r>
+      <w:r>
+        <w:t xml:space="preserve"> </w:t>
+      </w:r>
+      <w:r>
+        <w:t xml:space="preserve">Marginal Cost</w:t>
+      </w:r>
+      <w:r>
+        <w:t xml:space="preserve"> </w:t>
+      </w:r>
+      <w:r>
+        <w:t xml:space="preserve">of</w:t>
+      </w:r>
+      <w:r>
+        <w:t xml:space="preserve"> </w:t>
+      </w:r>
+      <w:r>
+        <w:t xml:space="preserve">Nonuniform Environmental Regulations</w:t>
+      </w:r>
+      <w:r>
+        <w:t xml:space="preserve">.”</w:t>
+      </w:r>
+      <w:r>
+        <w:t xml:space="preserve"> </w:t>
+      </w:r>
+      <w:r>
+        <w:rPr>
+          <w:i/>
+          <w:iCs/>
+        </w:rPr>
+        <w:t xml:space="preserve">American Journal of Agricultural Economics</w:t>
+      </w:r>
+      <w:r>
+        <w:t xml:space="preserve"> </w:t>
+      </w:r>
+      <w:r>
+        <w:t xml:space="preserve">78 (4): 1098–1107.</w:t>
+      </w:r>
+      <w:r>
+        <w:t xml:space="preserve"> </w:t>
+      </w:r>
+      <w:hyperlink r:id="rId127">
+        <w:r>
+          <w:rPr>
+            <w:rStyle w:val="Hyperlink"/>
+          </w:rPr>
+          <w:t xml:space="preserve">https://doi.org/10.2307/1243866</w:t>
+        </w:r>
+      </w:hyperlink>
+      <w:r>
+        <w:t xml:space="preserve">.</w:t>
+      </w:r>
+    </w:p>
+    <w:bookmarkEnd w:id="128"/>
+    <w:bookmarkStart w:id="130" w:name="ref-TolleyEtAlSensitivity2019"/>
     <w:p>
       <w:pPr>
         <w:pStyle w:val="Bibliography"/>
@@ -23125,7 +23587,7 @@
       <w:r>
         <w:t xml:space="preserve"> </w:t>
       </w:r>
-      <w:hyperlink r:id="rId110">
+      <w:hyperlink r:id="rId129">
         <w:r>
           <w:rPr>
             <w:rStyle w:val="Hyperlink"/>
@@ -23137,8 +23599,8 @@
         <w:t xml:space="preserve">.</w:t>
       </w:r>
     </w:p>
-    <w:bookmarkEnd w:id="111"/>
-    <w:bookmarkStart w:id="113" w:name="ref-VanSteenbergenPromoting2006"/>
+    <w:bookmarkEnd w:id="130"/>
+    <w:bookmarkStart w:id="132" w:name="ref-VanSteenbergenPromoting2006"/>
     <w:p>
       <w:pPr>
         <w:pStyle w:val="Bibliography"/>
@@ -23171,7 +23633,7 @@
       <w:r>
         <w:t xml:space="preserve"> </w:t>
       </w:r>
-      <w:hyperlink r:id="rId112">
+      <w:hyperlink r:id="rId131">
         <w:r>
           <w:rPr>
             <w:rStyle w:val="Hyperlink"/>
@@ -23183,13 +23645,59 @@
         <w:t xml:space="preserve">.</w:t>
       </w:r>
     </w:p>
-    <w:bookmarkEnd w:id="113"/>
-    <w:bookmarkStart w:id="114" w:name="X8bf5592004e543b04dfcfc3edb39663c8006d78"/>
+    <w:bookmarkEnd w:id="132"/>
+    <w:bookmarkStart w:id="134" w:name="ref-YehBeckerMultiobjective1982"/>
     <w:p>
       <w:pPr>
         <w:pStyle w:val="Bibliography"/>
       </w:pPr>
       <w:r>
+        <w:t xml:space="preserve">Yeh, William W-G., and Leonard Becker. 1982.</w:t>
+      </w:r>
+      <w:r>
+        <w:t xml:space="preserve"> </w:t>
+      </w:r>
+      <w:r>
+        <w:t xml:space="preserve">“Multiobjective Analysis of Multireservoir Operations.”</w:t>
+      </w:r>
+      <w:r>
+        <w:t xml:space="preserve"> </w:t>
+      </w:r>
+      <w:r>
+        <w:rPr>
+          <w:i/>
+          <w:iCs/>
+        </w:rPr>
+        <w:t xml:space="preserve">Water Resources Research</w:t>
+      </w:r>
+      <w:r>
+        <w:t xml:space="preserve"> </w:t>
+      </w:r>
+      <w:r>
+        <w:t xml:space="preserve">18 (5): 1326–36.</w:t>
+      </w:r>
+      <w:r>
+        <w:t xml:space="preserve"> </w:t>
+      </w:r>
+      <w:hyperlink r:id="rId133">
+        <w:r>
+          <w:rPr>
+            <w:rStyle w:val="Hyperlink"/>
+          </w:rPr>
+          <w:t xml:space="preserve">https://doi.org/10.1029/WR018i005p01326</w:t>
+        </w:r>
+      </w:hyperlink>
+      <w:r>
+        <w:t xml:space="preserve">.</w:t>
+      </w:r>
+    </w:p>
+    <w:bookmarkEnd w:id="134"/>
+    <w:bookmarkStart w:id="135" w:name="X8bf5592004e543b04dfcfc3edb39663c8006d78"/>
+    <w:p>
+      <w:pPr>
+        <w:pStyle w:val="Bibliography"/>
+      </w:pPr>
+      <w:r>
         <w:t xml:space="preserve">Yolo Subbasin Groundwater Agency. 2022.</w:t>
       </w:r>
       <w:r>
@@ -23214,14 +23722,14 @@
         <w:t xml:space="preserve">Woodland, CA.</w:t>
       </w:r>
     </w:p>
-    <w:bookmarkEnd w:id="114"/>
-    <w:bookmarkEnd w:id="115"/>
+    <w:bookmarkEnd w:id="135"/>
+    <w:bookmarkEnd w:id="136"/>
     <w:p>
       <w:r>
         <w:br w:type="page"/>
       </w:r>
     </w:p>
-    <w:bookmarkEnd w:id="116"/>
+    <w:bookmarkEnd w:id="137"/>
     <w:sectPr>
       <w:footnotePr>
         <w:numRestart w:val="eachSect"/>

</xml_diff>

<commit_message>
trying to generate coefs for all 12 models
</commit_message>
<xml_diff>
--- a/Kouba_Fish_and_Ag_Benefit_MS.docx
+++ b/Kouba_Fish_and_Ag_Benefit_MS.docx
@@ -40,23 +40,7 @@
         <w:pStyle w:val="FirstParagraph"/>
       </w:pPr>
       <w:r>
-        <w:t xml:space="preserve">In the rural American West, water needs of agriculture and ecosystems are often in competition. Furthermore, in places with interconnected surface- and groundwater systems, stream-aquifer exchange increases the difficulty of tracking impacts of diverse water users on each other and on the system as a whole. Hydrologic models can estimate the impacts of water uses and management actions on groundwater elevation and streamflow, but may provide overwhelming amounts of information and/or may be challenging for stakeholders to interpret. In this study, we address these challenges and aim to increase utility of hydrologic model results for a case study jurisdiction in northern California, which is in the process of implementing a long-term Groundwater Sustainability Plan (GSP). We developed a summary statistic or proxy for each of the three primary policy considerations in the GSP (environmental, agricultural, and project cost). We then used them to summarize the results of</w:t>
-      </w:r>
-      <w:r>
-        <w:t xml:space="preserve"> </w:t>
-      </w:r>
-      <w:r>
-        <w:rPr>
-          <w:b/>
-          <w:bCs/>
-        </w:rPr>
-        <w:t xml:space="preserve">40</w:t>
-      </w:r>
-      <w:r>
-        <w:t xml:space="preserve"> </w:t>
-      </w:r>
-      <w:r>
-        <w:t xml:space="preserve">management scenarios developed for the GSP, which were simulated using an existing integrated surface- and groundwater model. We found that a trade-off in benefits for fish and farms was evident in every category of infrastructure investment (a proxy for project cost), though greater infrastructure investment can achieve some reductions in this trade-off. Additionally, although the GSP management priorities emphasized infrastructure investments, both infrastructure-based and regulatory approaches fell within the Pareto-optimal set of management options under a strict application of these objective functions. Finally, regarding regulatory actions, management interventions targeted at low-flow periods produced a more efficient gain in environmental flow value per cost in agricultural productivity. This work demonstrates that basin-specific, stakeholder-informed objective functions can increase stakeholder-salience of existing hydrologic model results, and can help clarify trade-offs in ongoing local water planning efforts.</w:t>
+        <w:t xml:space="preserve">In the rural American West, water needs of agriculture and ecosystems are often in competition. Furthermore, in places with interconnected surface- and groundwater systems, stream-aquifer exchange increases the difficulty of tracking impacts of diverse water users on each other and on the system as a whole. Hydrologic models can estimate the impacts of water uses and management actions on groundwater elevation and streamflow, but may provide overwhelming amounts of information and/or may be challenging for stakeholders to interpret. In this study, we address these challenges and aim to increase utility of hydrologic model results for a case study jurisdiction in northern California, which is in the process of implementing a long-term Groundwater Sustainability Plan (GSP). We developed a summary statistic or proxy for each of the three primary policy considerations in the GSP (environmental, agricultural, and project cost). We then used them to summarize the results of 25 management scenarios developed for the GSP, which were simulated using an existing integrated surface- and groundwater model. We found that a trade-off in benefits for fish and farms was evident in every category of infrastructure investment (a proxy for project cost), though greater infrastructure investment can achieve some reductions in this trade-off. Additionally, although the GSP management priorities emphasized infrastructure investments, both infrastructure-based and regulatory approaches fell within the Pareto-optimal set of management options under a strict application of these objective functions. Finally, regarding regulatory actions, management interventions targeted at low-flow periods produced a more efficient gain in environmental flow value per cost in agricultural productivity. This work demonstrates that basin-specific, stakeholder-informed objective functions can increase stakeholder-salience of existing hydrologic model results, and can help clarify trade-offs in ongoing local water planning efforts.</w:t>
       </w:r>
     </w:p>
     <w:p>
@@ -260,7 +244,7 @@
       </w:r>
     </w:p>
     <w:bookmarkEnd w:id="25"/>
-    <w:bookmarkStart w:id="45" w:name="Xde4259dbdabf52cfea1337f1fb7d346fb9d28b1"/>
+    <w:bookmarkStart w:id="44" w:name="X1d0ab14f4559910db365e3bb8ee13a97d99320e"/>
     <w:p>
       <w:pPr>
         <w:pStyle w:val="Heading1"/>
@@ -275,7 +259,7 @@
         <w:tab/>
       </w:r>
       <w:r>
-        <w:t xml:space="preserve">Methods: Case study, GSP development and hydrologic model</w:t>
+        <w:t xml:space="preserve">Background: Case study and GSP development</w:t>
       </w:r>
     </w:p>
     <w:bookmarkStart w:id="30" w:name="hydrography-and-climate"/>
@@ -2516,22 +2500,23 @@
       </w:r>
     </w:p>
     <w:bookmarkEnd w:id="43"/>
-    <w:bookmarkStart w:id="44" w:name="hydrologic-model-summary"/>
+    <w:bookmarkEnd w:id="44"/>
+    <w:bookmarkStart w:id="58" w:name="methods"/>
     <w:p>
       <w:pPr>
-        <w:pStyle w:val="Heading2"/>
+        <w:pStyle w:val="Heading1"/>
       </w:pPr>
       <w:r>
         <w:rPr>
           <w:rStyle w:val="SectionNumber"/>
         </w:rPr>
-        <w:t xml:space="preserve">2.4</w:t>
+        <w:t xml:space="preserve">3</w:t>
       </w:r>
       <w:r>
         <w:tab/>
       </w:r>
       <w:r>
-        <w:t xml:space="preserve">Hydrologic model summary</w:t>
+        <w:t xml:space="preserve">Methods</w:t>
       </w:r>
     </w:p>
     <w:p>
@@ -2539,72 +2524,7 @@
         <w:pStyle w:val="FirstParagraph"/>
       </w:pPr>
       <w:r>
-        <w:t xml:space="preserve">The Scott Valley Integrated Hydrologic Model (SVIHM)</w:t>
-      </w:r>
-      <w:r>
-        <w:t xml:space="preserve"> </w:t>
-      </w:r>
-      <w:r>
-        <w:t xml:space="preserve">(2019)</w:t>
-      </w:r>
-      <w:r>
-        <w:t xml:space="preserve"> </w:t>
-      </w:r>
-      <w:r>
-        <w:t xml:space="preserve">is a surface and groundwater model driven by tributary stream inflows, precipitation inputs, and reference evapotranspiration (ET</w:t>
-      </w:r>
-      <w:r>
-        <w:rPr>
-          <w:vertAlign w:val="subscript"/>
-        </w:rPr>
-        <w:t xml:space="preserve">0</w:t>
-      </w:r>
-      <w:r>
-        <w:t xml:space="preserve">). Like all models, it does not perfectly reproduce observed historical measurements, but it successfully captures key watershed-scale hydrologic phenomena that can be used to evaluate potential outcomes of specific management actions.</w:t>
-      </w:r>
-    </w:p>
-    <w:p>
-      <w:pPr>
-        <w:pStyle w:val="BodyText"/>
-      </w:pPr>
-      <w:r>
-        <w:t xml:space="preserve">The SVIHM is composed of three cascading sub-models. First, complete daily records of tributary stream inflow are generated using a statistical streamflow regression model, in which the continuous Fort Jones record was used to predict missing values in the daily flow records of 12 major tributaries</w:t>
-      </w:r>
-      <w:r>
-        <w:t xml:space="preserve"> </w:t>
-      </w:r>
-      <w:r>
-        <w:t xml:space="preserve">(Foglia et al. 2013)</w:t>
-      </w:r>
-      <w:r>
-        <w:t xml:space="preserve">. Second, a custom-built soil water budget model simulated irrigation demand, irrigation applied (surface and groundwater), ET and percolation to aquifer calculated on a field-by-field, daily time step basis. This model simulates individual irrigation applications and assumes the farmer has perfect foresight of daily irrigation demand. Finally, the boundary conditions of stream inflow, aquifer recharge, and groundwater extraction are used to drive an integrated groundwater-surface water model using MODFLOW; stream-aquifer flux and surface flow routing was simulated using the MODFLOW SFR package</w:t>
-      </w:r>
-      <w:r>
-        <w:t xml:space="preserve"> </w:t>
-      </w:r>
-      <w:r>
-        <w:t xml:space="preserve">(Tolley, Foglia, and Harter 2019)</w:t>
-      </w:r>
-      <w:r>
-        <w:t xml:space="preserve">.</w:t>
-      </w:r>
-      <w:r>
-        <w:t xml:space="preserve"> </w:t>
-      </w:r>
-      <w:r>
-        <w:rPr>
-          <w:b/>
-          <w:bCs/>
-        </w:rPr>
-        <w:t xml:space="preserve">Add text re: Leland’s updates to SVIHM? Bah, should I rerun everything using the latest model version?</w:t>
-      </w:r>
-    </w:p>
-    <w:p>
-      <w:pPr>
-        <w:pStyle w:val="BodyText"/>
-      </w:pPr>
-      <w:r>
-        <w:t xml:space="preserve">For GSP development, SVIHM was used extensively to perform what-if scenarios using the historic climate and land use forcing period, covering 1991-2018. (For purposes of this study, the model period has been extended through Sept. 30, 2025.) Scenario simulations repeat the calibrated historical basecase simulation of SVIHM while varying specific changes in SVIHM boundary conditions (BCs). The set of changes in the BCs of a particular scenario represent specific changes in land use, irrigation management, climate, water management rules, etc. Scenario outcomes are compared against those of the basecase simulation. Key results of each SVIHM scenario, used in the objective functions described below, are:</w:t>
+        <w:t xml:space="preserve">We developed two objective functions and one categorical objective proxy to evaluate the management scenarios developed for the GSP. The three objectives were:</w:t>
       </w:r>
     </w:p>
     <w:p>
@@ -2616,7 +2536,7 @@
         </w:numPr>
       </w:pPr>
       <w:r>
-        <w:t xml:space="preserve">A prediction of Scott River daily average flow at the Fort Jones Gauge, which is co-located with the surface water outlet of the model domain; and</w:t>
+        <w:t xml:space="preserve">maximize specific environmental flows,</w:t>
       </w:r>
     </w:p>
     <w:p>
@@ -2628,35 +2548,7 @@
         </w:numPr>
       </w:pPr>
       <w:r>
-        <w:t xml:space="preserve">Simulated total ET of crops and native vegetation within the model domain.</w:t>
-      </w:r>
-    </w:p>
-    <w:bookmarkEnd w:id="44"/>
-    <w:bookmarkEnd w:id="45"/>
-    <w:bookmarkStart w:id="57" w:name="methods-quantitative-analysis"/>
-    <w:p>
-      <w:pPr>
-        <w:pStyle w:val="Heading1"/>
-      </w:pPr>
-      <w:r>
-        <w:rPr>
-          <w:rStyle w:val="SectionNumber"/>
-        </w:rPr>
-        <w:t xml:space="preserve">3</w:t>
-      </w:r>
-      <w:r>
-        <w:tab/>
-      </w:r>
-      <w:r>
-        <w:t xml:space="preserve">Methods: Quantitative analysis</w:t>
-      </w:r>
-    </w:p>
-    <w:p>
-      <w:pPr>
-        <w:pStyle w:val="FirstParagraph"/>
-      </w:pPr>
-      <w:r>
-        <w:t xml:space="preserve">We developed two objective functions and one categorical objective proxy to evaluate the management scenarios developed for the GSP. The three objectives were:</w:t>
+        <w:t xml:space="preserve">maintain current levels of agricultural productivity (represented as minimizing reduction in agricultural water use), and</w:t>
       </w:r>
     </w:p>
     <w:p>
@@ -2664,31 +2556,7 @@
         <w:pStyle w:val="Compact"/>
         <w:numPr>
           <w:ilvl w:val="0"/>
-          <w:numId w:val="1003"/>
-        </w:numPr>
-      </w:pPr>
-      <w:r>
-        <w:t xml:space="preserve">maximize specific environmental flows,</w:t>
-      </w:r>
-    </w:p>
-    <w:p>
-      <w:pPr>
-        <w:pStyle w:val="Compact"/>
-        <w:numPr>
-          <w:ilvl w:val="0"/>
-          <w:numId w:val="1003"/>
-        </w:numPr>
-      </w:pPr>
-      <w:r>
-        <w:t xml:space="preserve">maintain current levels of agricultural productivity (represented as minimizing reduction in agricultural water use), and</w:t>
-      </w:r>
-    </w:p>
-    <w:p>
-      <w:pPr>
-        <w:pStyle w:val="Compact"/>
-        <w:numPr>
-          <w:ilvl w:val="0"/>
-          <w:numId w:val="1003"/>
+          <w:numId w:val="1002"/>
         </w:numPr>
       </w:pPr>
       <w:r>
@@ -2725,8 +2593,8 @@
       <w:pPr>
         <w:pStyle w:val="TableCaption"/>
       </w:pPr>
-      <w:bookmarkStart w:id="46" w:name="tab:objFunctionTable"/>
-      <w:bookmarkEnd w:id="46"/>
+      <w:bookmarkStart w:id="45" w:name="tab:objFunctionTable"/>
+      <w:bookmarkEnd w:id="45"/>
       <w:r>
         <w:t xml:space="preserve">Table 2:</w:t>
       </w:r>
@@ -3143,7 +3011,7 @@
         <w:t xml:space="preserve">Objective functions</w:t>
       </w:r>
     </w:p>
-    <w:bookmarkStart w:id="48" w:name="hydrologic-benefit-function"/>
+    <w:bookmarkStart w:id="46" w:name="hydrologic-benefit-function"/>
     <w:p>
       <w:pPr>
         <w:pStyle w:val="Heading3"/>
@@ -3175,7 +3043,19 @@
         <w:t xml:space="preserve">(Kouba et al. 2025)</w:t>
       </w:r>
       <w:r>
-        <w:t xml:space="preserve">, we showed that the relative degree to which a given water year provided ecological services needed by coho salmon can be empirically estimated using a Hydrologic Benefit (HB) function, which is represented as a linear combination of annual functional flow values. A set of streamflow metrics related to the timing, amplitude, and duration of flow phenomena were weighted according to their power to predict coho outcomes, such as smolt production or smolt production normalized per female spawner. The combination of these weighted metrics can be interpreted as a prediction of coho salmon reproduction</w:t>
+        <w:t xml:space="preserve">, we showed that the relative degree to which a given water year provided ecological services needed by coho salmon can be empirically estimated using a Hydrologic Benefit (HB) function, which is represented as a linear combination of annual functional flow values. Functional flows are set of streamflow metrics related to the timing, amplitude, and duration of flow phenomena</w:t>
+      </w:r>
+      <w:r>
+        <w:t xml:space="preserve"> </w:t>
+      </w:r>
+      <w:r>
+        <w:t xml:space="preserve">(Yarnell et al. 2015; Patterson et al. 2020; Carpenter 2024)</w:t>
+      </w:r>
+      <w:r>
+        <w:t xml:space="preserve"> </w:t>
+      </w:r>
+      <w:r>
+        <w:t xml:space="preserve">were weighted according to their power to predict coho outcomes, such as smolt production or smolt production normalized per female spawner. The combination of these weighted metrics can be interpreted as a prediction of coho salmon reproduction</w:t>
       </w:r>
       <w:r>
         <w:t xml:space="preserve"> </w:t>
@@ -3234,6 +3114,33 @@
           <w:bCs/>
         </w:rPr>
         <w:t xml:space="preserve">language on selecting smolt based on hydro only predictors, and only for coho</w:t>
+      </w:r>
+    </w:p>
+    <w:bookmarkEnd w:id="46"/>
+    <w:bookmarkStart w:id="48" w:name="ensemble-hb-function"/>
+    <w:p>
+      <w:pPr>
+        <w:pStyle w:val="Heading3"/>
+      </w:pPr>
+      <w:r>
+        <w:rPr>
+          <w:rStyle w:val="SectionNumber"/>
+        </w:rPr>
+        <w:t xml:space="preserve">3.1.2</w:t>
+      </w:r>
+      <w:r>
+        <w:tab/>
+      </w:r>
+      <w:r>
+        <w:t xml:space="preserve">Ensemble HB function</w:t>
+      </w:r>
+    </w:p>
+    <w:p>
+      <w:pPr>
+        <w:pStyle w:val="FirstParagraph"/>
+      </w:pPr>
+      <w:r>
+        <w:t xml:space="preserve">For each species, across all statistical methods, the coefficients for any single predictor were consistently negative or positive; e.g.,</w:t>
       </w:r>
     </w:p>
     <w:p>
@@ -3491,7 +3398,7 @@
                 <w:szCs w:val="22"/>
                 <w:color w:val="000000"/>
               </w:rPr>
-              <w:t xml:space="preserve">3.872</w:t>
+              <w:t xml:space="preserve">2.1393</w:t>
             </w:r>
           </w:p>
         </w:tc>
@@ -3585,7 +3492,7 @@
                 <w:szCs w:val="22"/>
                 <w:color w:val="000000"/>
               </w:rPr>
-              <w:t xml:space="preserve">f1_FA_Dif_num</w:t>
+              <w:t xml:space="preserve">d1_DS_Mag_50</w:t>
             </w:r>
           </w:p>
         </w:tc>
@@ -3629,7 +3536,7 @@
                 <w:szCs w:val="22"/>
                 <w:color w:val="000000"/>
               </w:rPr>
-              <w:t xml:space="preserve">0.162</w:t>
+              <w:t xml:space="preserve">0.0148</w:t>
             </w:r>
           </w:p>
         </w:tc>
@@ -3673,7 +3580,7 @@
                 <w:szCs w:val="22"/>
                 <w:color w:val="000000"/>
               </w:rPr>
-              <w:t xml:space="preserve">Larger fall flow increase (during parents' spawning)</w:t>
+              <w:t xml:space="preserve">Higher dry season flow (mid-late season, before parents' spawning)</w:t>
             </w:r>
           </w:p>
         </w:tc>
@@ -3723,7 +3630,7 @@
                 <w:szCs w:val="22"/>
                 <w:color w:val="000000"/>
               </w:rPr>
-              <w:t xml:space="preserve">f2_FA_Dif_num</w:t>
+              <w:t xml:space="preserve">d1_DS_Mag_90</w:t>
             </w:r>
           </w:p>
         </w:tc>
@@ -3767,7 +3674,7 @@
                 <w:szCs w:val="22"/>
                 <w:color w:val="000000"/>
               </w:rPr>
-              <w:t xml:space="preserve">-0.130</w:t>
+              <w:t xml:space="preserve">0.0115</w:t>
             </w:r>
           </w:p>
         </w:tc>
@@ -3811,7 +3718,7 @@
                 <w:szCs w:val="22"/>
                 <w:color w:val="000000"/>
               </w:rPr>
-              <w:t xml:space="preserve">Smaller fall flow increase (as juvenile fish)</w:t>
+              <w:t xml:space="preserve">Higher dry season flow (early season, before parents' spawning)</w:t>
             </w:r>
           </w:p>
         </w:tc>
@@ -3824,7 +3731,7 @@
         <w:tc>
           <w:tcPr>
             <w:tcBorders>
-              <w:bottom w:val="single" w:sz="12" w:space="0" w:color="666666"/>
+              <w:bottom w:val="none" w:sz="0" w:space="0" w:color="000000"/>
               <w:top w:val="none" w:sz="0" w:space="0" w:color="000000"/>
               <w:left w:val="none" w:sz="0" w:space="0" w:color="000000"/>
               <w:right w:val="none" w:sz="0" w:space="0" w:color="000000"/>
@@ -3861,14 +3768,14 @@
                 <w:szCs w:val="22"/>
                 <w:color w:val="000000"/>
               </w:rPr>
-              <w:t xml:space="preserve">s1_SP_ROC</w:t>
-            </w:r>
-          </w:p>
-        </w:tc>
-        <w:tc>
-          <w:tcPr>
-            <w:tcBorders>
-              <w:bottom w:val="single" w:sz="12" w:space="0" w:color="666666"/>
+              <w:t xml:space="preserve">w1_Wet_Tim</w:t>
+            </w:r>
+          </w:p>
+        </w:tc>
+        <w:tc>
+          <w:tcPr>
+            <w:tcBorders>
+              <w:bottom w:val="none" w:sz="0" w:space="0" w:color="000000"/>
               <w:top w:val="none" w:sz="0" w:space="0" w:color="000000"/>
               <w:left w:val="none" w:sz="0" w:space="0" w:color="000000"/>
               <w:right w:val="none" w:sz="0" w:space="0" w:color="000000"/>
@@ -3905,14 +3812,14 @@
                 <w:szCs w:val="22"/>
                 <w:color w:val="000000"/>
               </w:rPr>
-              <w:t xml:space="preserve">-0.020</w:t>
-            </w:r>
-          </w:p>
-        </w:tc>
-        <w:tc>
-          <w:tcPr>
-            <w:tcBorders>
-              <w:bottom w:val="single" w:sz="12" w:space="0" w:color="666666"/>
+              <w:t xml:space="preserve">-0.0020</w:t>
+            </w:r>
+          </w:p>
+        </w:tc>
+        <w:tc>
+          <w:tcPr>
+            <w:tcBorders>
+              <w:bottom w:val="none" w:sz="0" w:space="0" w:color="000000"/>
               <w:top w:val="none" w:sz="0" w:space="0" w:color="000000"/>
               <w:left w:val="none" w:sz="0" w:space="0" w:color="000000"/>
               <w:right w:val="none" w:sz="0" w:space="0" w:color="000000"/>
@@ -3949,7 +3856,421 @@
                 <w:szCs w:val="22"/>
                 <w:color w:val="000000"/>
               </w:rPr>
-              <w:t xml:space="preserve">Slower rate of change, spring recession (as recent hatchlings)</w:t>
+              <w:t xml:space="preserve">Earlier wet season onset (as eggs and hatchlings)</w:t>
+            </w:r>
+          </w:p>
+        </w:tc>
+      </w:tr>
+      <w:tr>
+        <w:trPr>
+          <w:trHeight w:val="360" w:hRule="auto"/>
+        </w:trPr>
+        body5
+        <w:tc>
+          <w:tcPr>
+            <w:tcBorders>
+              <w:bottom w:val="none" w:sz="0" w:space="0" w:color="000000"/>
+              <w:top w:val="none" w:sz="0" w:space="0" w:color="000000"/>
+              <w:left w:val="none" w:sz="0" w:space="0" w:color="000000"/>
+              <w:right w:val="none" w:sz="0" w:space="0" w:color="000000"/>
+            </w:tcBorders>
+            <w:shd w:val="clear" w:color="auto" w:fill="FFFFFF"/>
+            <w:tcMar>
+              <w:top w:w="0" w:type="dxa"/>
+              <w:bottom w:w="0" w:type="dxa"/>
+              <w:left w:w="0" w:type="dxa"/>
+              <w:right w:w="0" w:type="dxa"/>
+            </w:tcMar>
+            <w:vAlign w:val="center"/>
+          </w:tcPr>
+          <w:p>
+            <w:pPr>
+              <w:pStyle w:val="Normal"/>
+              <w:jc w:val="left"/>
+              <w:pBdr>
+                <w:bottom w:val="none" w:sz="0" w:space="0" w:color="000000"/>
+                <w:top w:val="none" w:sz="0" w:space="0" w:color="000000"/>
+                <w:left w:val="none" w:sz="0" w:space="0" w:color="000000"/>
+                <w:right w:val="none" w:sz="0" w:space="0" w:color="000000"/>
+              </w:pBdr>
+              <w:spacing w:after="100" w:before="100" w:line="240"/>
+              <w:ind w:left="100" w:right="100" w:firstLine="0" w:firstLineChars="0"/>
+            </w:pPr>
+            <w:r xmlns:w="http://schemas.openxmlformats.org/wordprocessingml/2006/main" xmlns:wp="http://schemas.openxmlformats.org/drawingml/2006/wordprocessingDrawing" xmlns:r="http://schemas.openxmlformats.org/officeDocument/2006/relationships" xmlns:w14="http://schemas.microsoft.com/office/word/2010/wordml">
+              <w:rPr>
+                <w:rFonts w:ascii="Arial" w:hAnsi="Arial" w:eastAsia="Arial" w:cs="Arial"/>
+                <w:i w:val="false"/>
+                <w:b w:val="false"/>
+                <w:u w:val="none"/>
+                <w:sz w:val="22"/>
+                <w:szCs w:val="22"/>
+                <w:color w:val="000000"/>
+              </w:rPr>
+              <w:t xml:space="preserve">f1_recon_120</w:t>
+            </w:r>
+          </w:p>
+        </w:tc>
+        <w:tc>
+          <w:tcPr>
+            <w:tcBorders>
+              <w:bottom w:val="none" w:sz="0" w:space="0" w:color="000000"/>
+              <w:top w:val="none" w:sz="0" w:space="0" w:color="000000"/>
+              <w:left w:val="none" w:sz="0" w:space="0" w:color="000000"/>
+              <w:right w:val="none" w:sz="0" w:space="0" w:color="000000"/>
+            </w:tcBorders>
+            <w:shd w:val="clear" w:color="auto" w:fill="FFFFFF"/>
+            <w:tcMar>
+              <w:top w:w="0" w:type="dxa"/>
+              <w:bottom w:w="0" w:type="dxa"/>
+              <w:left w:w="0" w:type="dxa"/>
+              <w:right w:w="0" w:type="dxa"/>
+            </w:tcMar>
+            <w:vAlign w:val="center"/>
+          </w:tcPr>
+          <w:p>
+            <w:pPr>
+              <w:pStyle w:val="Normal"/>
+              <w:jc w:val="right"/>
+              <w:pBdr>
+                <w:bottom w:val="none" w:sz="0" w:space="0" w:color="000000"/>
+                <w:top w:val="none" w:sz="0" w:space="0" w:color="000000"/>
+                <w:left w:val="none" w:sz="0" w:space="0" w:color="000000"/>
+                <w:right w:val="none" w:sz="0" w:space="0" w:color="000000"/>
+              </w:pBdr>
+              <w:spacing w:after="100" w:before="100" w:line="240"/>
+              <w:ind w:left="100" w:right="100" w:firstLine="0" w:firstLineChars="0"/>
+            </w:pPr>
+            <w:r xmlns:w="http://schemas.openxmlformats.org/wordprocessingml/2006/main" xmlns:wp="http://schemas.openxmlformats.org/drawingml/2006/wordprocessingDrawing" xmlns:r="http://schemas.openxmlformats.org/officeDocument/2006/relationships" xmlns:w14="http://schemas.microsoft.com/office/word/2010/wordml">
+              <w:rPr>
+                <w:rFonts w:ascii="Arial" w:hAnsi="Arial" w:eastAsia="Arial" w:cs="Arial"/>
+                <w:i w:val="false"/>
+                <w:b w:val="false"/>
+                <w:u w:val="none"/>
+                <w:sz w:val="22"/>
+                <w:szCs w:val="22"/>
+                <w:color w:val="000000"/>
+              </w:rPr>
+              <w:t xml:space="preserve">-0.0168</w:t>
+            </w:r>
+          </w:p>
+        </w:tc>
+        <w:tc>
+          <w:tcPr>
+            <w:tcBorders>
+              <w:bottom w:val="none" w:sz="0" w:space="0" w:color="000000"/>
+              <w:top w:val="none" w:sz="0" w:space="0" w:color="000000"/>
+              <w:left w:val="none" w:sz="0" w:space="0" w:color="000000"/>
+              <w:right w:val="none" w:sz="0" w:space="0" w:color="000000"/>
+            </w:tcBorders>
+            <w:shd w:val="clear" w:color="auto" w:fill="FFFFFF"/>
+            <w:tcMar>
+              <w:top w:w="0" w:type="dxa"/>
+              <w:bottom w:w="0" w:type="dxa"/>
+              <w:left w:w="0" w:type="dxa"/>
+              <w:right w:w="0" w:type="dxa"/>
+            </w:tcMar>
+            <w:vAlign w:val="center"/>
+          </w:tcPr>
+          <w:p>
+            <w:pPr>
+              <w:pStyle w:val="Normal"/>
+              <w:jc w:val="left"/>
+              <w:pBdr>
+                <w:bottom w:val="none" w:sz="0" w:space="0" w:color="000000"/>
+                <w:top w:val="none" w:sz="0" w:space="0" w:color="000000"/>
+                <w:left w:val="none" w:sz="0" w:space="0" w:color="000000"/>
+                <w:right w:val="none" w:sz="0" w:space="0" w:color="000000"/>
+              </w:pBdr>
+              <w:spacing w:after="100" w:before="100" w:line="240"/>
+              <w:ind w:left="100" w:right="100" w:firstLine="0" w:firstLineChars="0"/>
+            </w:pPr>
+            <w:r xmlns:w="http://schemas.openxmlformats.org/wordprocessingml/2006/main" xmlns:wp="http://schemas.openxmlformats.org/drawingml/2006/wordprocessingDrawing" xmlns:r="http://schemas.openxmlformats.org/officeDocument/2006/relationships" xmlns:w14="http://schemas.microsoft.com/office/word/2010/wordml">
+              <w:rPr>
+                <w:rFonts w:ascii="Arial" w:hAnsi="Arial" w:eastAsia="Arial" w:cs="Arial"/>
+                <w:i w:val="false"/>
+                <w:b w:val="false"/>
+                <w:u w:val="none"/>
+                <w:sz w:val="22"/>
+                <w:szCs w:val="22"/>
+                <w:color w:val="000000"/>
+              </w:rPr>
+              <w:t xml:space="preserve">Earlier fall reconnection (during parents' spawning)</w:t>
+            </w:r>
+          </w:p>
+        </w:tc>
+      </w:tr>
+      <w:tr>
+        <w:trPr>
+          <w:trHeight w:val="360" w:hRule="auto"/>
+        </w:trPr>
+        body6
+        <w:tc>
+          <w:tcPr>
+            <w:tcBorders>
+              <w:bottom w:val="none" w:sz="0" w:space="0" w:color="000000"/>
+              <w:top w:val="none" w:sz="0" w:space="0" w:color="000000"/>
+              <w:left w:val="none" w:sz="0" w:space="0" w:color="000000"/>
+              <w:right w:val="none" w:sz="0" w:space="0" w:color="000000"/>
+            </w:tcBorders>
+            <w:shd w:val="clear" w:color="auto" w:fill="FFFFFF"/>
+            <w:tcMar>
+              <w:top w:w="0" w:type="dxa"/>
+              <w:bottom w:w="0" w:type="dxa"/>
+              <w:left w:w="0" w:type="dxa"/>
+              <w:right w:w="0" w:type="dxa"/>
+            </w:tcMar>
+            <w:vAlign w:val="center"/>
+          </w:tcPr>
+          <w:p>
+            <w:pPr>
+              <w:pStyle w:val="Normal"/>
+              <w:jc w:val="left"/>
+              <w:pBdr>
+                <w:bottom w:val="none" w:sz="0" w:space="0" w:color="000000"/>
+                <w:top w:val="none" w:sz="0" w:space="0" w:color="000000"/>
+                <w:left w:val="none" w:sz="0" w:space="0" w:color="000000"/>
+                <w:right w:val="none" w:sz="0" w:space="0" w:color="000000"/>
+              </w:pBdr>
+              <w:spacing w:after="100" w:before="100" w:line="240"/>
+              <w:ind w:left="100" w:right="100" w:firstLine="0" w:firstLineChars="0"/>
+            </w:pPr>
+            <w:r xmlns:w="http://schemas.openxmlformats.org/wordprocessingml/2006/main" xmlns:wp="http://schemas.openxmlformats.org/drawingml/2006/wordprocessingDrawing" xmlns:r="http://schemas.openxmlformats.org/officeDocument/2006/relationships" xmlns:w14="http://schemas.microsoft.com/office/word/2010/wordml">
+              <w:rPr>
+                <w:rFonts w:ascii="Arial" w:hAnsi="Arial" w:eastAsia="Arial" w:cs="Arial"/>
+                <w:i w:val="false"/>
+                <w:b w:val="false"/>
+                <w:u w:val="none"/>
+                <w:sz w:val="22"/>
+                <w:szCs w:val="22"/>
+                <w:color w:val="000000"/>
+              </w:rPr>
+              <w:t xml:space="preserve">s1_SP_ROC_Max</w:t>
+            </w:r>
+          </w:p>
+        </w:tc>
+        <w:tc>
+          <w:tcPr>
+            <w:tcBorders>
+              <w:bottom w:val="none" w:sz="0" w:space="0" w:color="000000"/>
+              <w:top w:val="none" w:sz="0" w:space="0" w:color="000000"/>
+              <w:left w:val="none" w:sz="0" w:space="0" w:color="000000"/>
+              <w:right w:val="none" w:sz="0" w:space="0" w:color="000000"/>
+            </w:tcBorders>
+            <w:shd w:val="clear" w:color="auto" w:fill="FFFFFF"/>
+            <w:tcMar>
+              <w:top w:w="0" w:type="dxa"/>
+              <w:bottom w:w="0" w:type="dxa"/>
+              <w:left w:w="0" w:type="dxa"/>
+              <w:right w:w="0" w:type="dxa"/>
+            </w:tcMar>
+            <w:vAlign w:val="center"/>
+          </w:tcPr>
+          <w:p>
+            <w:pPr>
+              <w:pStyle w:val="Normal"/>
+              <w:jc w:val="right"/>
+              <w:pBdr>
+                <w:bottom w:val="none" w:sz="0" w:space="0" w:color="000000"/>
+                <w:top w:val="none" w:sz="0" w:space="0" w:color="000000"/>
+                <w:left w:val="none" w:sz="0" w:space="0" w:color="000000"/>
+                <w:right w:val="none" w:sz="0" w:space="0" w:color="000000"/>
+              </w:pBdr>
+              <w:spacing w:after="100" w:before="100" w:line="240"/>
+              <w:ind w:left="100" w:right="100" w:firstLine="0" w:firstLineChars="0"/>
+            </w:pPr>
+            <w:r xmlns:w="http://schemas.openxmlformats.org/wordprocessingml/2006/main" xmlns:wp="http://schemas.openxmlformats.org/drawingml/2006/wordprocessingDrawing" xmlns:r="http://schemas.openxmlformats.org/officeDocument/2006/relationships" xmlns:w14="http://schemas.microsoft.com/office/word/2010/wordml">
+              <w:rPr>
+                <w:rFonts w:ascii="Arial" w:hAnsi="Arial" w:eastAsia="Arial" w:cs="Arial"/>
+                <w:i w:val="false"/>
+                <w:b w:val="false"/>
+                <w:u w:val="none"/>
+                <w:sz w:val="22"/>
+                <w:szCs w:val="22"/>
+                <w:color w:val="000000"/>
+              </w:rPr>
+              <w:t xml:space="preserve">-0.0637</w:t>
+            </w:r>
+          </w:p>
+        </w:tc>
+        <w:tc>
+          <w:tcPr>
+            <w:tcBorders>
+              <w:bottom w:val="none" w:sz="0" w:space="0" w:color="000000"/>
+              <w:top w:val="none" w:sz="0" w:space="0" w:color="000000"/>
+              <w:left w:val="none" w:sz="0" w:space="0" w:color="000000"/>
+              <w:right w:val="none" w:sz="0" w:space="0" w:color="000000"/>
+            </w:tcBorders>
+            <w:shd w:val="clear" w:color="auto" w:fill="FFFFFF"/>
+            <w:tcMar>
+              <w:top w:w="0" w:type="dxa"/>
+              <w:bottom w:w="0" w:type="dxa"/>
+              <w:left w:w="0" w:type="dxa"/>
+              <w:right w:w="0" w:type="dxa"/>
+            </w:tcMar>
+            <w:vAlign w:val="center"/>
+          </w:tcPr>
+          <w:p>
+            <w:pPr>
+              <w:pStyle w:val="Normal"/>
+              <w:jc w:val="left"/>
+              <w:pBdr>
+                <w:bottom w:val="none" w:sz="0" w:space="0" w:color="000000"/>
+                <w:top w:val="none" w:sz="0" w:space="0" w:color="000000"/>
+                <w:left w:val="none" w:sz="0" w:space="0" w:color="000000"/>
+                <w:right w:val="none" w:sz="0" w:space="0" w:color="000000"/>
+              </w:pBdr>
+              <w:spacing w:after="100" w:before="100" w:line="240"/>
+              <w:ind w:left="100" w:right="100" w:firstLine="0" w:firstLineChars="0"/>
+            </w:pPr>
+            <w:r xmlns:w="http://schemas.openxmlformats.org/wordprocessingml/2006/main" xmlns:wp="http://schemas.openxmlformats.org/drawingml/2006/wordprocessingDrawing" xmlns:r="http://schemas.openxmlformats.org/officeDocument/2006/relationships" xmlns:w14="http://schemas.microsoft.com/office/word/2010/wordml">
+              <w:rPr>
+                <w:rFonts w:ascii="Arial" w:hAnsi="Arial" w:eastAsia="Arial" w:cs="Arial"/>
+                <w:i w:val="false"/>
+                <w:b w:val="false"/>
+                <w:u w:val="none"/>
+                <w:sz w:val="22"/>
+                <w:szCs w:val="22"/>
+                <w:color w:val="000000"/>
+              </w:rPr>
+              <w:t xml:space="preserve">Slower max. rate of change, spring recession (as outmigrating smolt)</w:t>
+            </w:r>
+          </w:p>
+        </w:tc>
+      </w:tr>
+      <w:tr>
+        <w:trPr>
+          <w:trHeight w:val="360" w:hRule="auto"/>
+        </w:trPr>
+        body7
+        <w:tc>
+          <w:tcPr>
+            <w:tcBorders>
+              <w:bottom w:val="single" w:sz="12" w:space="0" w:color="666666"/>
+              <w:top w:val="none" w:sz="0" w:space="0" w:color="000000"/>
+              <w:left w:val="none" w:sz="0" w:space="0" w:color="000000"/>
+              <w:right w:val="none" w:sz="0" w:space="0" w:color="000000"/>
+            </w:tcBorders>
+            <w:shd w:val="clear" w:color="auto" w:fill="FFFFFF"/>
+            <w:tcMar>
+              <w:top w:w="0" w:type="dxa"/>
+              <w:bottom w:w="0" w:type="dxa"/>
+              <w:left w:w="0" w:type="dxa"/>
+              <w:right w:w="0" w:type="dxa"/>
+            </w:tcMar>
+            <w:vAlign w:val="center"/>
+          </w:tcPr>
+          <w:p>
+            <w:pPr>
+              <w:pStyle w:val="Normal"/>
+              <w:jc w:val="left"/>
+              <w:pBdr>
+                <w:bottom w:val="none" w:sz="0" w:space="0" w:color="000000"/>
+                <w:top w:val="none" w:sz="0" w:space="0" w:color="000000"/>
+                <w:left w:val="none" w:sz="0" w:space="0" w:color="000000"/>
+                <w:right w:val="none" w:sz="0" w:space="0" w:color="000000"/>
+              </w:pBdr>
+              <w:spacing w:after="100" w:before="100" w:line="240"/>
+              <w:ind w:left="100" w:right="100" w:firstLine="0" w:firstLineChars="0"/>
+            </w:pPr>
+            <w:r xmlns:w="http://schemas.openxmlformats.org/wordprocessingml/2006/main" xmlns:wp="http://schemas.openxmlformats.org/drawingml/2006/wordprocessingDrawing" xmlns:r="http://schemas.openxmlformats.org/officeDocument/2006/relationships" xmlns:w14="http://schemas.microsoft.com/office/word/2010/wordml">
+              <w:rPr>
+                <w:rFonts w:ascii="Arial" w:hAnsi="Arial" w:eastAsia="Arial" w:cs="Arial"/>
+                <w:i w:val="false"/>
+                <w:b w:val="false"/>
+                <w:u w:val="none"/>
+                <w:sz w:val="22"/>
+                <w:szCs w:val="22"/>
+                <w:color w:val="000000"/>
+              </w:rPr>
+              <w:t xml:space="preserve">w1_Wet_BFL_Mag_50</w:t>
+            </w:r>
+          </w:p>
+        </w:tc>
+        <w:tc>
+          <w:tcPr>
+            <w:tcBorders>
+              <w:bottom w:val="single" w:sz="12" w:space="0" w:color="666666"/>
+              <w:top w:val="none" w:sz="0" w:space="0" w:color="000000"/>
+              <w:left w:val="none" w:sz="0" w:space="0" w:color="000000"/>
+              <w:right w:val="none" w:sz="0" w:space="0" w:color="000000"/>
+            </w:tcBorders>
+            <w:shd w:val="clear" w:color="auto" w:fill="FFFFFF"/>
+            <w:tcMar>
+              <w:top w:w="0" w:type="dxa"/>
+              <w:bottom w:w="0" w:type="dxa"/>
+              <w:left w:w="0" w:type="dxa"/>
+              <w:right w:w="0" w:type="dxa"/>
+            </w:tcMar>
+            <w:vAlign w:val="center"/>
+          </w:tcPr>
+          <w:p>
+            <w:pPr>
+              <w:pStyle w:val="Normal"/>
+              <w:jc w:val="right"/>
+              <w:pBdr>
+                <w:bottom w:val="none" w:sz="0" w:space="0" w:color="000000"/>
+                <w:top w:val="none" w:sz="0" w:space="0" w:color="000000"/>
+                <w:left w:val="none" w:sz="0" w:space="0" w:color="000000"/>
+                <w:right w:val="none" w:sz="0" w:space="0" w:color="000000"/>
+              </w:pBdr>
+              <w:spacing w:after="100" w:before="100" w:line="240"/>
+              <w:ind w:left="100" w:right="100" w:firstLine="0" w:firstLineChars="0"/>
+            </w:pPr>
+            <w:r xmlns:w="http://schemas.openxmlformats.org/wordprocessingml/2006/main" xmlns:wp="http://schemas.openxmlformats.org/drawingml/2006/wordprocessingDrawing" xmlns:r="http://schemas.openxmlformats.org/officeDocument/2006/relationships" xmlns:w14="http://schemas.microsoft.com/office/word/2010/wordml">
+              <w:rPr>
+                <w:rFonts w:ascii="Arial" w:hAnsi="Arial" w:eastAsia="Arial" w:cs="Arial"/>
+                <w:i w:val="false"/>
+                <w:b w:val="false"/>
+                <w:u w:val="none"/>
+                <w:sz w:val="22"/>
+                <w:szCs w:val="22"/>
+                <w:color w:val="000000"/>
+              </w:rPr>
+              <w:t xml:space="preserve">-0.1785</w:t>
+            </w:r>
+          </w:p>
+        </w:tc>
+        <w:tc>
+          <w:tcPr>
+            <w:tcBorders>
+              <w:bottom w:val="single" w:sz="12" w:space="0" w:color="666666"/>
+              <w:top w:val="none" w:sz="0" w:space="0" w:color="000000"/>
+              <w:left w:val="none" w:sz="0" w:space="0" w:color="000000"/>
+              <w:right w:val="none" w:sz="0" w:space="0" w:color="000000"/>
+            </w:tcBorders>
+            <w:shd w:val="clear" w:color="auto" w:fill="FFFFFF"/>
+            <w:tcMar>
+              <w:top w:w="0" w:type="dxa"/>
+              <w:bottom w:w="0" w:type="dxa"/>
+              <w:left w:w="0" w:type="dxa"/>
+              <w:right w:w="0" w:type="dxa"/>
+            </w:tcMar>
+            <w:vAlign w:val="center"/>
+          </w:tcPr>
+          <w:p>
+            <w:pPr>
+              <w:pStyle w:val="Normal"/>
+              <w:jc w:val="left"/>
+              <w:pBdr>
+                <w:bottom w:val="none" w:sz="0" w:space="0" w:color="000000"/>
+                <w:top w:val="none" w:sz="0" w:space="0" w:color="000000"/>
+                <w:left w:val="none" w:sz="0" w:space="0" w:color="000000"/>
+                <w:right w:val="none" w:sz="0" w:space="0" w:color="000000"/>
+              </w:pBdr>
+              <w:spacing w:after="100" w:before="100" w:line="240"/>
+              <w:ind w:left="100" w:right="100" w:firstLine="0" w:firstLineChars="0"/>
+            </w:pPr>
+            <w:r xmlns:w="http://schemas.openxmlformats.org/wordprocessingml/2006/main" xmlns:wp="http://schemas.openxmlformats.org/drawingml/2006/wordprocessingDrawing" xmlns:r="http://schemas.openxmlformats.org/officeDocument/2006/relationships" xmlns:w14="http://schemas.microsoft.com/office/word/2010/wordml">
+              <w:rPr>
+                <w:rFonts w:ascii="Arial" w:hAnsi="Arial" w:eastAsia="Arial" w:cs="Arial"/>
+                <w:i w:val="false"/>
+                <w:b w:val="false"/>
+                <w:u w:val="none"/>
+                <w:sz w:val="22"/>
+                <w:szCs w:val="22"/>
+                <w:color w:val="000000"/>
+              </w:rPr>
+              <w:t xml:space="preserve">Lower wet season baseflows (as eggs and hatchlings)</w:t>
             </w:r>
           </w:p>
         </w:tc>
@@ -4344,7 +4665,7 @@
         <w:rPr>
           <w:rStyle w:val="SectionNumber"/>
         </w:rPr>
-        <w:t xml:space="preserve">3.1.2</w:t>
+        <w:t xml:space="preserve">3.1.3</w:t>
       </w:r>
       <w:r>
         <w:tab/>
@@ -4401,7 +4722,7 @@
         <w:rPr>
           <w:rStyle w:val="SectionNumber"/>
         </w:rPr>
-        <w:t xml:space="preserve">3.1.3</w:t>
+        <w:t xml:space="preserve">3.1.4</w:t>
       </w:r>
       <w:r>
         <w:tab/>
@@ -4423,7 +4744,7 @@
         <w:pStyle w:val="Compact"/>
         <w:numPr>
           <w:ilvl w:val="0"/>
-          <w:numId w:val="1004"/>
+          <w:numId w:val="1003"/>
         </w:numPr>
       </w:pPr>
       <w:r>
@@ -4435,7 +4756,7 @@
         <w:pStyle w:val="Compact"/>
         <w:numPr>
           <w:ilvl w:val="0"/>
-          <w:numId w:val="1004"/>
+          <w:numId w:val="1003"/>
         </w:numPr>
       </w:pPr>
       <w:r>
@@ -4447,7 +4768,7 @@
         <w:pStyle w:val="Compact"/>
         <w:numPr>
           <w:ilvl w:val="0"/>
-          <w:numId w:val="1004"/>
+          <w:numId w:val="1003"/>
         </w:numPr>
       </w:pPr>
       <w:r>
@@ -4459,7 +4780,7 @@
         <w:pStyle w:val="Compact"/>
         <w:numPr>
           <w:ilvl w:val="0"/>
-          <w:numId w:val="1004"/>
+          <w:numId w:val="1003"/>
         </w:numPr>
       </w:pPr>
       <w:r>
@@ -4471,7 +4792,7 @@
         <w:pStyle w:val="Compact"/>
         <w:numPr>
           <w:ilvl w:val="0"/>
-          <w:numId w:val="1004"/>
+          <w:numId w:val="1003"/>
         </w:numPr>
       </w:pPr>
       <w:r>
@@ -5407,7 +5728,7 @@
     </w:p>
     <w:bookmarkEnd w:id="53"/>
     <w:bookmarkEnd w:id="54"/>
-    <w:bookmarkStart w:id="56" w:name="scenario-descriptions"/>
+    <w:bookmarkStart w:id="55" w:name="hydrologic-model-summary"/>
     <w:p>
       <w:pPr>
         <w:pStyle w:val="Heading2"/>
@@ -5422,7 +5743,7 @@
         <w:tab/>
       </w:r>
       <w:r>
-        <w:t xml:space="preserve">Scenario descriptions</w:t>
+        <w:t xml:space="preserve">Hydrologic model summary</w:t>
       </w:r>
     </w:p>
     <w:p>
@@ -5430,25 +5751,28 @@
         <w:pStyle w:val="FirstParagraph"/>
       </w:pPr>
       <w:r>
-        <w:t xml:space="preserve">For the Scott Valley GSP, this study simulated 64 management action scenarios, compared to between one and five scenarios modeled in most other California GSPs</w:t>
-      </w:r>
-      <w:r>
-        <w:t xml:space="preserve"> </w:t>
-      </w:r>
-      <w:r>
-        <w:t xml:space="preserve">(e.g., FCGMA 2019; YSGA 2022)</w:t>
-      </w:r>
-      <w:r>
-        <w:t xml:space="preserve">. This high number of scenarios was possible because the SVIHM had been under development for 8 years prior to the start of GSP work</w:t>
-      </w:r>
-      <w:r>
-        <w:t xml:space="preserve"> </w:t>
-      </w:r>
-      <w:r>
-        <w:t xml:space="preserve">(e.g., Foglia et al. 2013; Tolley, Foglia, and Harter 2019)</w:t>
-      </w:r>
-      <w:r>
-        <w:t xml:space="preserve">, and cost-effective technical support was provided by graduate students at the University of California, Davis. Of the 64 scenarios, only 40 are considered here. Several were ruled out as obviously unfeasible (e.g., construction of a 134 thousand acre-foot reservoir to ensure 100% flow reliability even during severe drought, in an area with topography that could not support such a large capacity), and some were excluded because they are largely redundant with some of the 40 considered here.</w:t>
+        <w:t xml:space="preserve">The Scott Valley Integrated Hydrologic Model (SVIHM)</w:t>
+      </w:r>
+      <w:r>
+        <w:t xml:space="preserve"> </w:t>
+      </w:r>
+      <w:r>
+        <w:t xml:space="preserve">(2019)</w:t>
+      </w:r>
+      <w:r>
+        <w:t xml:space="preserve"> </w:t>
+      </w:r>
+      <w:r>
+        <w:t xml:space="preserve">is a surface and groundwater model driven by tributary stream inflows, precipitation, and reference evapotranspiration (ET</w:t>
+      </w:r>
+      <w:r>
+        <w:rPr>
+          <w:vertAlign w:val="subscript"/>
+        </w:rPr>
+        <w:t xml:space="preserve">0</w:t>
+      </w:r>
+      <w:r>
+        <w:t xml:space="preserve">). Like all models, it does not perfectly reproduce historical observations, but it successfully captures key watershed-scale hydrologic phenomena that can be used to evaluate potential outcomes of specific management actions.</w:t>
       </w:r>
     </w:p>
     <w:p>
@@ -5456,6 +5780,129 @@
         <w:pStyle w:val="BodyText"/>
       </w:pPr>
       <w:r>
+        <w:t xml:space="preserve">The SVIHM is composed of three cascading sub-models. First,</w:t>
+      </w:r>
+      <w:r>
+        <w:t xml:space="preserve"> </w:t>
+      </w:r>
+      <w:r>
+        <w:rPr>
+          <w:b/>
+          <w:bCs/>
+        </w:rPr>
+        <w:t xml:space="preserve">complete daily records of tributary stream inflow are generated using a statistical streamflow regression model, in which the continuous Fort Jones record was used to predict missing values in the daily flow records of 12 major tributaries</w:t>
+      </w:r>
+      <w:r>
+        <w:t xml:space="preserve"> </w:t>
+      </w:r>
+      <w:r>
+        <w:t xml:space="preserve">(Foglia et al. 2013)</w:t>
+      </w:r>
+      <w:r>
+        <w:t xml:space="preserve">. Second, a custom-built soil water budget model simulated irrigation demand, irrigation applied (surface and groundwater), ET and percolation to aquifer calculated on a field-by-field, daily time step basis. This model simulates individual irrigation applications and assumes the farmer has perfect foresight of daily irrigation demand. Finally, the boundary conditions of stream inflow, aquifer recharge, and groundwater extraction are used to drive an integrated groundwater-surface water model using MODFLOW; stream-aquifer flux and surface flow routing was simulated using the MODFLOW SFR package</w:t>
+      </w:r>
+      <w:r>
+        <w:t xml:space="preserve"> </w:t>
+      </w:r>
+      <w:r>
+        <w:t xml:space="preserve">(Tolley, Foglia, and Harter 2019)</w:t>
+      </w:r>
+      <w:r>
+        <w:t xml:space="preserve">.</w:t>
+      </w:r>
+      <w:r>
+        <w:t xml:space="preserve"> </w:t>
+      </w:r>
+      <w:r>
+        <w:rPr>
+          <w:b/>
+          <w:bCs/>
+        </w:rPr>
+        <w:t xml:space="preserve">Add text re: Leland’s updates to SVIHM? Bah, should I rerun everything using the latest model version?</w:t>
+      </w:r>
+    </w:p>
+    <w:p>
+      <w:pPr>
+        <w:pStyle w:val="BodyText"/>
+      </w:pPr>
+      <w:r>
+        <w:t xml:space="preserve">For GSP development, SVIHM was used extensively to perform what-if scenarios using the historic climate and land use forcing period, covering 1991-2018. (For purposes of this study, the model period has been extended through Sept. 30, 2025.) Scenario simulations repeat the calibrated historical basecase simulation of SVIHM while varying specific changes in SVIHM boundary conditions (BCs). The set of changes in the BCs of a particular scenario represent specific changes in land use, irrigation management, climate, water management rules, etc. Scenario outcomes are compared against those of the basecase simulation. Key results of each SVIHM scenario, used in the objective functions described below, are:</w:t>
+      </w:r>
+    </w:p>
+    <w:p>
+      <w:pPr>
+        <w:pStyle w:val="Compact"/>
+        <w:numPr>
+          <w:ilvl w:val="0"/>
+          <w:numId w:val="1004"/>
+        </w:numPr>
+      </w:pPr>
+      <w:r>
+        <w:t xml:space="preserve">A prediction of Scott River daily average flow at the Fort Jones Gauge, which is co-located with the surface water outlet of the model domain; and</w:t>
+      </w:r>
+    </w:p>
+    <w:p>
+      <w:pPr>
+        <w:pStyle w:val="Compact"/>
+        <w:numPr>
+          <w:ilvl w:val="0"/>
+          <w:numId w:val="1004"/>
+        </w:numPr>
+      </w:pPr>
+      <w:r>
+        <w:t xml:space="preserve">Simulated total ET of crops and native vegetation within the model domain.</w:t>
+      </w:r>
+    </w:p>
+    <w:bookmarkEnd w:id="55"/>
+    <w:bookmarkStart w:id="57" w:name="management-scenario-descriptions"/>
+    <w:p>
+      <w:pPr>
+        <w:pStyle w:val="Heading2"/>
+      </w:pPr>
+      <w:r>
+        <w:rPr>
+          <w:rStyle w:val="SectionNumber"/>
+        </w:rPr>
+        <w:t xml:space="preserve">3.4</w:t>
+      </w:r>
+      <w:r>
+        <w:tab/>
+      </w:r>
+      <w:r>
+        <w:t xml:space="preserve">Management scenario descriptions</w:t>
+      </w:r>
+    </w:p>
+    <w:p>
+      <w:pPr>
+        <w:pStyle w:val="FirstParagraph"/>
+      </w:pPr>
+      <w:r>
+        <w:t xml:space="preserve">For the Scott Valley GSP, SVIHM was used to simulate 64 management action scenarios; in most other California GSPs, between one and five scenarios was more common</w:t>
+      </w:r>
+      <w:r>
+        <w:t xml:space="preserve"> </w:t>
+      </w:r>
+      <w:r>
+        <w:t xml:space="preserve">(e.g., FCGMA 2019; YSGA 2022)</w:t>
+      </w:r>
+      <w:r>
+        <w:t xml:space="preserve">. This high number of scenarios was possible because the SVIHM had been under development for 8 years prior to the start of GSP work</w:t>
+      </w:r>
+      <w:r>
+        <w:t xml:space="preserve"> </w:t>
+      </w:r>
+      <w:r>
+        <w:t xml:space="preserve">(e.g., Foglia et al. 2013; Tolley, Foglia, and Harter 2019)</w:t>
+      </w:r>
+      <w:r>
+        <w:t xml:space="preserve">, and cost-effective technical support was provided by graduate students at the University of California, Davis. Of the 64 scenarios, only 25 are considered here. Several were ruled out as obviously unfeasible (e.g., construction of a 134 thousand acre-foot reservoir to ensure 100% flow reliability even during severe drought, in an area with topography that could not support such a large capacity), and some were excluded because they are largely redundant with some of the 25 considered here.</w:t>
+      </w:r>
+    </w:p>
+    <w:p>
+      <w:pPr>
+        <w:pStyle w:val="BodyText"/>
+      </w:pPr>
+      <w:r>
         <w:t xml:space="preserve">The scenarios are grouped here by category (Table</w:t>
       </w:r>
       <w:r>
@@ -5488,8 +5935,8 @@
       <w:pPr>
         <w:pStyle w:val="TableCaption"/>
       </w:pPr>
-      <w:bookmarkStart w:id="55" w:name="tab:scenCategoryTab"/>
-      <w:bookmarkEnd w:id="55"/>
+      <w:bookmarkStart w:id="56" w:name="tab:scenCategoryTab"/>
+      <w:bookmarkEnd w:id="56"/>
       <w:r>
         <w:t xml:space="preserve">Table 4:</w:t>
       </w:r>
@@ -8001,9 +8448,9 @@
         </w:tc>
       </w:tr>
     </w:tbl>
-    <w:bookmarkEnd w:id="56"/>
     <w:bookmarkEnd w:id="57"/>
-    <w:bookmarkStart w:id="79" w:name="results"/>
+    <w:bookmarkEnd w:id="58"/>
+    <w:bookmarkStart w:id="80" w:name="results"/>
     <w:p>
       <w:pPr>
         <w:pStyle w:val="Heading1"/>
@@ -8026,7 +8473,20 @@
         <w:pStyle w:val="FirstParagraph"/>
       </w:pPr>
       <w:r>
-        <w:t xml:space="preserve">As described above, objective functions were used to quantitatively summarize the achievement of environmental and agricultural goals for the basecase and 27 management scenarios. A Hydrologic Benefit (HB) value (in units of predicted coho smolt production per spawning female, or coho spf-equivalent) and a total crop ET volume was calculated for each water year in the 28-year simulation period, for each scenario. Each scenario has also been given an infrastructure feasibility proxy (Table</w:t>
+        <w:t xml:space="preserve">As described above, objective functions were used to quantitatively summarize the achievement of environmental and agricultural goals for the basecase and 27 management scenarios. A Hydrologic Benefit (HB) value (in units of</w:t>
+      </w:r>
+      <w:r>
+        <w:t xml:space="preserve"> </w:t>
+      </w:r>
+      <w:r>
+        <w:rPr>
+          <w:b/>
+          <w:bCs/>
+        </w:rPr>
+        <w:t xml:space="preserve">predicted coho smolt production per spawning female, or coho spf-equivalent</w:t>
+      </w:r>
+      <w:r>
+        <w:t xml:space="preserve">) and a total crop ET volume was calculated for each water year in the 28-year simulation period, for each scenario. Each scenario has also been given an infrastructure feasibility proxy (Table</w:t>
       </w:r>
       <w:r>
         <w:t xml:space="preserve"> </w:t>
@@ -8038,7 +8498,7 @@
         <w:t xml:space="preserve">).</w:t>
       </w:r>
     </w:p>
-    <w:bookmarkStart w:id="67" w:name="X7919b09686293416b4bcb59483f48ae87a57064"/>
+    <w:bookmarkStart w:id="68" w:name="X7919b09686293416b4bcb59483f48ae87a57064"/>
     <w:p>
       <w:pPr>
         <w:pStyle w:val="Heading2"/>
@@ -8085,18 +8545,18 @@
           <wp:inline>
             <wp:extent cx="5334000" cy="5334000"/>
             <wp:effectExtent b="0" l="0" r="0" t="0"/>
-            <wp:docPr descr="Figure 5:  Comparison of annual performance in two objective functions (HB and ET, representing environmental and agricultural objectives, respectively), in the basecase (black circles) and management scenarios (diamond, cross or x symbols) for water years 1991-2018. Panels A and B show comparisons between basecase and one example scenario in each of three categories: Enhanced Recharge, Low Flow Diversion Limits, and Curtailment. Panels C and D show comparisons between basecase and different cutoff dates within the Alfalfa Irrigation category: July 10th, August 1st and August 15th. Dry-type water years (vertical bars) are 1991, ’92, ’94, 2001, ’09, ’13, ’14, and ’18." title="" id="59" name="Picture"/>
+            <wp:docPr descr="Figure 5:  Comparison of annual performance in two objective functions (HB and ET, representing environmental and agricultural objectives, respectively), in the basecase (black circles) and management scenarios (diamond, cross or x symbols) for water years 1991-2025. Panels A and B show comparisons between basecase and one example scenario in each of three categories: Enhanced Recharge, Low Flow Diversion Limits, and Curtailment. Panels A and B show comparisons between basecase and different cutoff dates within the Alfalfa Irrigation category: July 15th, July 31st and August 15th. Dry-type water years (vertical bars) are 1991, ’92, ’94, 2001, ’09, ’13, ’14, ’18, and ’20-’22." title="" id="60" name="Picture"/>
             <a:graphic>
               <a:graphicData uri="http://schemas.openxmlformats.org/drawingml/2006/picture">
                 <pic:pic>
                   <pic:nvPicPr>
-                    <pic:cNvPr descr="Graphics%20and%20Supplements/Figure%204.png" id="60" name="Picture"/>
+                    <pic:cNvPr descr="Graphics%20and%20Supplements/Figure%204.png" id="61" name="Picture"/>
                     <pic:cNvPicPr>
                       <a:picLocks noChangeArrowheads="1" noChangeAspect="1"/>
                     </pic:cNvPicPr>
                   </pic:nvPicPr>
                   <pic:blipFill>
-                    <a:blip r:embed="rId58"/>
+                    <a:blip r:embed="rId59"/>
                     <a:stretch>
                       <a:fillRect/>
                     </a:stretch>
@@ -8127,8 +8587,8 @@
       <w:pPr>
         <w:pStyle w:val="ImageCaption"/>
       </w:pPr>
-      <w:bookmarkStart w:id="61" w:name="fig:benefitByWY"/>
-      <w:bookmarkEnd w:id="61"/>
+      <w:bookmarkStart w:id="62" w:name="fig:benefitByWY"/>
+      <w:bookmarkEnd w:id="62"/>
       <w:r>
         <w:t xml:space="preserve">Figure 5:</w:t>
       </w:r>
@@ -8139,7 +8599,7 @@
         <w:t xml:space="preserve"> </w:t>
       </w:r>
       <w:r>
-        <w:t xml:space="preserve">Comparison of annual performance in two objective functions (HB and ET, representing environmental and agricultural objectives, respectively), in the basecase (black circles) and management scenarios (diamond, cross or x symbols) for water years 1991-2018. Panels A and B show comparisons between basecase and one example scenario in each of three categories: Enhanced Recharge, Low Flow Diversion Limits, and Curtailment. Panels C and D show comparisons between basecase and different cutoff dates within the Alfalfa Irrigation category: July 10th, August 1st and August 15th. Dry-type water years (vertical bars) are 1991, ’92, ’94, 2001, ’09, ’13, ’14, and ’18.</w:t>
+        <w:t xml:space="preserve">Comparison of annual performance in two objective functions (HB and ET, representing environmental and agricultural objectives, respectively), in the basecase (black circles) and management scenarios (diamond, cross or x symbols) for water years 1991-2025. Panels A and B show comparisons between basecase and one example scenario in each of three categories: Enhanced Recharge, Low Flow Diversion Limits, and Curtailment. Panels A and B show comparisons between basecase and different cutoff dates within the Alfalfa Irrigation category: July 15th, July 31st and August 15th. Dry-type water years (vertical bars) are 1991, ’92, ’94, 2001, ’09, ’13, ’14, ’18, and ’20-’22.</w:t>
       </w:r>
     </w:p>
     <w:p>
@@ -8171,18 +8631,18 @@
           <wp:inline>
             <wp:extent cx="5334000" cy="5334000"/>
             <wp:effectExtent b="0" l="0" r="0" t="0"/>
-            <wp:docPr descr="Figure 6:  Environmental and agricultural objective function performance (in terms of Hydrologic Benefit, or HB, value; and crop ET volume) for basecase (black circle in upper left) and 39 management scenarios. Symbol x and y coordinates are the average of 28 annual HB and ET values for each scenario over the full model period (water years 1991-2018). Whiskers show standard error of the 28 years of annual HB values; standard errors in the direction of the y-axis are smaller than the height covered by each symbol." title="" id="63" name="Picture"/>
+            <wp:docPr descr="Figure 6:  Environmental and agricultural objective function performance (in terms of Hydrologic Benefit, or HB, value; and crop ET volume) for basecase (black circle in upper left) and 39 management scenarios. Symbol x and y coordinates are the average of 28 annual HB and ET values for each scenario over the full model period (water years 1991-2018). Whiskers show standard error of the 28 years of annual HB values; standard errors in the direction of the y-axis are smaller than the height covered by each symbol." title="" id="64" name="Picture"/>
             <a:graphic>
               <a:graphicData uri="http://schemas.openxmlformats.org/drawingml/2006/picture">
                 <pic:pic>
                   <pic:nvPicPr>
-                    <pic:cNvPr descr="Graphics%20and%20Supplements/Figure%205.png" id="64" name="Picture"/>
+                    <pic:cNvPr descr="Graphics%20and%20Supplements/Figure%205.png" id="65" name="Picture"/>
                     <pic:cNvPicPr>
                       <a:picLocks noChangeArrowheads="1" noChangeAspect="1"/>
                     </pic:cNvPicPr>
                   </pic:nvPicPr>
                   <pic:blipFill>
-                    <a:blip r:embed="rId62"/>
+                    <a:blip r:embed="rId63"/>
                     <a:stretch>
                       <a:fillRect/>
                     </a:stretch>
@@ -8213,8 +8673,8 @@
       <w:pPr>
         <w:pStyle w:val="ImageCaption"/>
       </w:pPr>
-      <w:bookmarkStart w:id="65" w:name="fig:farmerFishTradeoffFigure"/>
-      <w:bookmarkEnd w:id="65"/>
+      <w:bookmarkStart w:id="66" w:name="fig:farmerFishTradeoffFigure"/>
+      <w:bookmarkEnd w:id="66"/>
       <w:r>
         <w:t xml:space="preserve">Figure 6:</w:t>
       </w:r>
@@ -8292,7 +8752,7 @@
         <w:t xml:space="preserve"> </w:t>
       </w:r>
       <w:r>
-        <w:t xml:space="preserve">of water, and the 28-year mean of annual HB values is 8913.9 coho spf-equivalent (Table</w:t>
+        <w:t xml:space="preserve">of water, and the 28-year mean of annual HB values is 49.4 coho spf-equivalent (Table</w:t>
       </w:r>
       <w:r>
         <w:t xml:space="preserve"> </w:t>
@@ -8322,7 +8782,7 @@
         <w:t xml:space="preserve"> </w:t>
       </w:r>
       <w:r>
-        <w:t xml:space="preserve">of water, while HB values ranged from 8834.4 to 9107.4 coho spf-equivalent.</w:t>
+        <w:t xml:space="preserve">of water, while HB values ranged from 49 to 52.5 coho spf-equivalent.</w:t>
       </w:r>
     </w:p>
     <w:p>
@@ -8348,7 +8808,7 @@
         <w:t xml:space="preserve">3</w:t>
       </w:r>
       <w:r>
-        <w:t xml:space="preserve">, or 0 percent less to 0.2 percent more than basecase. Their mean improvement in HB values over the basecase ranges from -80 to 89 coho spf-equivalent.</w:t>
+        <w:t xml:space="preserve">, or 0 percent less to 0.2 percent more than basecase. Their mean improvement in HB values over the basecase ranges from 0 to 1 coho spf-equivalent.</w:t>
       </w:r>
     </w:p>
     <w:p>
@@ -8430,7 +8890,7 @@
         <w:t xml:space="preserve">3</w:t>
       </w:r>
       <w:r>
-        <w:t xml:space="preserve">, or 13 to 1 percent less than basecase; HB gains over basecase are 45 to 184 coho spf-equivalent.</w:t>
+        <w:t xml:space="preserve">, or 13 to 1 percent less than basecase; HB gains over basecase are 0 to 1 coho spf-equivalent.</w:t>
       </w:r>
     </w:p>
     <w:p>
@@ -8468,7 +8928,7 @@
         <w:t xml:space="preserve"> </w:t>
       </w:r>
       <w:r>
-        <w:t xml:space="preserve">(~3%) less than basecase, while the mean HB value is 55 coho spf-equivalent greater than basecase.</w:t>
+        <w:t xml:space="preserve">(~3%) less than basecase, while the mean HB value is 0 coho spf-equivalent greater than basecase.</w:t>
       </w:r>
     </w:p>
     <w:p>
@@ -8617,8 +9077,8 @@
       <w:pPr>
         <w:pStyle w:val="TableCaption"/>
       </w:pPr>
-      <w:bookmarkStart w:id="66" w:name="tab:scenarioResultsTab"/>
-      <w:bookmarkEnd w:id="66"/>
+      <w:bookmarkStart w:id="67" w:name="tab:scenarioResultsTab"/>
+      <w:bookmarkEnd w:id="67"/>
       <w:r>
         <w:t xml:space="preserve">Table 5:</w:t>
       </w:r>
@@ -8626,7 +9086,7 @@
         <w:t xml:space="preserve"> </w:t>
       </w:r>
       <w:r>
-        <w:t xml:space="preserve">Scenario attributes for 40 scenarios. Units for Hydrologic Benefit (HB) value are coho smolt per female-equivalent; for ET are million cubic meters; both are averages of 35 annual values. Efficiency not calculated for scenarios with no average ET loss.</w:t>
+        <w:t xml:space="preserve">Scenario attributes for 25 scenarios. Units for Hydrologic Benefit (HB) value are coho smolt per female-equivalent; for ET are million cubic meters; both are averages of 35 annual values. Efficiency not calculated for scenarios with no average ET loss.</w:t>
       </w:r>
     </w:p>
     <w:tbl xmlns:w="http://schemas.openxmlformats.org/wordprocessingml/2006/main" xmlns:r="http://schemas.openxmlformats.org/officeDocument/2006/relationships" xmlns:w14="http://schemas.microsoft.com/office/word/2010/wordml" xmlns:wp="http://schemas.openxmlformats.org/drawingml/2006/wordprocessingDrawing" xmlns:a="http://schemas.openxmlformats.org/drawingml/2006/main" xmlns:pic="http://schemas.openxmlformats.org/drawingml/2006/picture">
@@ -9136,7 +9596,7 @@
                 <w:szCs w:val="20"/>
                 <w:color w:val="000000"/>
               </w:rPr>
-              <w:t xml:space="preserve">8.91</w:t>
+              <w:t xml:space="preserve">0.05</w:t>
             </w:r>
           </w:p>
         </w:tc>
@@ -9450,7 +9910,7 @@
                 <w:szCs w:val="20"/>
                 <w:color w:val="000000"/>
               </w:rPr>
-              <w:t xml:space="preserve">9.01</w:t>
+              <w:t xml:space="preserve">0.05</w:t>
             </w:r>
           </w:p>
         </w:tc>
@@ -9582,7 +10042,7 @@
                 <w:szCs w:val="20"/>
                 <w:color w:val="000000"/>
               </w:rPr>
-              <w:t xml:space="preserve">0.16</w:t>
+              <w:t xml:space="preserve">0.15</w:t>
             </w:r>
           </w:p>
         </w:tc>
@@ -9764,7 +10224,7 @@
                 <w:szCs w:val="20"/>
                 <w:color w:val="000000"/>
               </w:rPr>
-              <w:t xml:space="preserve">8.99</w:t>
+              <w:t xml:space="preserve">0.05</w:t>
             </w:r>
           </w:p>
         </w:tc>
@@ -9896,7 +10356,7 @@
                 <w:szCs w:val="20"/>
                 <w:color w:val="000000"/>
               </w:rPr>
-              <w:t xml:space="preserve">0.29</w:t>
+              <w:t xml:space="preserve">0.39</w:t>
             </w:r>
           </w:p>
         </w:tc>
@@ -10078,7 +10538,7 @@
                 <w:szCs w:val="20"/>
                 <w:color w:val="000000"/>
               </w:rPr>
-              <w:t xml:space="preserve">8.99</w:t>
+              <w:t xml:space="preserve">0.05</w:t>
             </w:r>
           </w:p>
         </w:tc>
@@ -10210,7 +10670,7 @@
                 <w:szCs w:val="20"/>
                 <w:color w:val="000000"/>
               </w:rPr>
-              <w:t xml:space="preserve">0.85</w:t>
+              <w:t xml:space="preserve">0.29</w:t>
             </w:r>
           </w:p>
         </w:tc>
@@ -10392,7 +10852,7 @@
                 <w:szCs w:val="20"/>
                 <w:color w:val="000000"/>
               </w:rPr>
-              <w:t xml:space="preserve">9.10</w:t>
+              <w:t xml:space="preserve">0.05</w:t>
             </w:r>
           </w:p>
         </w:tc>
@@ -10524,7 +10984,7 @@
                 <w:szCs w:val="20"/>
                 <w:color w:val="000000"/>
               </w:rPr>
-              <w:t xml:space="preserve">0.16</w:t>
+              <w:t xml:space="preserve">0.22</w:t>
             </w:r>
           </w:p>
         </w:tc>
@@ -10706,7 +11166,7 @@
                 <w:szCs w:val="20"/>
                 <w:color w:val="000000"/>
               </w:rPr>
-              <w:t xml:space="preserve">9.02</w:t>
+              <w:t xml:space="preserve">0.05</w:t>
             </w:r>
           </w:p>
         </w:tc>
@@ -10838,7 +11298,7 @@
                 <w:szCs w:val="20"/>
                 <w:color w:val="000000"/>
               </w:rPr>
-              <w:t xml:space="preserve">0.17</w:t>
+              <w:t xml:space="preserve">0.16</w:t>
             </w:r>
           </w:p>
         </w:tc>
@@ -11020,7 +11480,7 @@
                 <w:szCs w:val="20"/>
                 <w:color w:val="000000"/>
               </w:rPr>
-              <w:t xml:space="preserve">8.96</w:t>
+              <w:t xml:space="preserve">0.05</w:t>
             </w:r>
           </w:p>
         </w:tc>
@@ -11152,7 +11612,7 @@
                 <w:szCs w:val="20"/>
                 <w:color w:val="000000"/>
               </w:rPr>
-              <w:t xml:space="preserve">0.21</w:t>
+              <w:t xml:space="preserve">0.19</w:t>
             </w:r>
           </w:p>
         </w:tc>
@@ -11202,7 +11662,7 @@
                 <w:szCs w:val="20"/>
                 <w:color w:val="000000"/>
               </w:rPr>
-              <w:t xml:space="preserve">basecase_0_curtail</w:t>
+              <w:t xml:space="preserve">eflows25_div_lims</w:t>
             </w:r>
           </w:p>
         </w:tc>
@@ -11246,7 +11706,7 @@
                 <w:szCs w:val="20"/>
                 <w:color w:val="000000"/>
               </w:rPr>
-              <w:t xml:space="preserve">Attr</w:t>
+              <w:t xml:space="preserve">FlowLims</w:t>
             </w:r>
           </w:p>
         </w:tc>
@@ -11290,7 +11750,7 @@
                 <w:szCs w:val="20"/>
                 <w:color w:val="000000"/>
               </w:rPr>
-              <w:t xml:space="preserve"/>
+              <w:t xml:space="preserve">1</w:t>
             </w:r>
           </w:p>
         </w:tc>
@@ -11334,7 +11794,7 @@
                 <w:szCs w:val="20"/>
                 <w:color w:val="000000"/>
               </w:rPr>
-              <w:t xml:space="preserve">8.91</w:t>
+              <w:t xml:space="preserve">0.05</w:t>
             </w:r>
           </w:p>
         </w:tc>
@@ -11378,7 +11838,7 @@
                 <w:szCs w:val="20"/>
                 <w:color w:val="000000"/>
               </w:rPr>
-              <w:t xml:space="preserve">118.10</w:t>
+              <w:t xml:space="preserve">113.75</w:t>
             </w:r>
           </w:p>
         </w:tc>
@@ -11422,7 +11882,7 @@
                 <w:szCs w:val="20"/>
                 <w:color w:val="000000"/>
               </w:rPr>
-              <w:t xml:space="preserve">Yes</w:t>
+              <w:t xml:space="preserve">--</w:t>
             </w:r>
           </w:p>
         </w:tc>
@@ -11516,7 +11976,7 @@
                 <w:szCs w:val="20"/>
                 <w:color w:val="000000"/>
               </w:rPr>
-              <w:t xml:space="preserve">basecase_0_mar_0_curt</w:t>
+              <w:t xml:space="preserve">grain_12k</w:t>
             </w:r>
           </w:p>
         </w:tc>
@@ -11560,7 +12020,7 @@
                 <w:szCs w:val="20"/>
                 <w:color w:val="000000"/>
               </w:rPr>
-              <w:t xml:space="preserve">Attr</w:t>
+              <w:t xml:space="preserve">CropCh</w:t>
             </w:r>
           </w:p>
         </w:tc>
@@ -11604,7 +12064,7 @@
                 <w:szCs w:val="20"/>
                 <w:color w:val="000000"/>
               </w:rPr>
-              <w:t xml:space="preserve"/>
+              <w:t xml:space="preserve">2</w:t>
             </w:r>
           </w:p>
         </w:tc>
@@ -11648,7 +12108,7 @@
                 <w:szCs w:val="20"/>
                 <w:color w:val="000000"/>
               </w:rPr>
-              <w:t xml:space="preserve">8.91</w:t>
+              <w:t xml:space="preserve">0.05</w:t>
             </w:r>
           </w:p>
         </w:tc>
@@ -11692,7 +12152,7 @@
                 <w:szCs w:val="20"/>
                 <w:color w:val="000000"/>
               </w:rPr>
-              <w:t xml:space="preserve">118.10</w:t>
+              <w:t xml:space="preserve">98.75</w:t>
             </w:r>
           </w:p>
         </w:tc>
@@ -11736,7 +12196,7 @@
                 <w:szCs w:val="20"/>
                 <w:color w:val="000000"/>
               </w:rPr>
-              <w:t xml:space="preserve">Yes</w:t>
+              <w:t xml:space="preserve">--</w:t>
             </w:r>
           </w:p>
         </w:tc>
@@ -11780,7 +12240,7 @@
                 <w:szCs w:val="20"/>
                 <w:color w:val="000000"/>
               </w:rPr>
-              <w:t xml:space="preserve">--</w:t>
+              <w:t xml:space="preserve">0.04</w:t>
             </w:r>
           </w:p>
         </w:tc>
@@ -11830,7 +12290,7 @@
                 <w:szCs w:val="20"/>
                 <w:color w:val="000000"/>
               </w:rPr>
-              <w:t xml:space="preserve">basecase_0_mar</w:t>
+              <w:t xml:space="preserve">grain_14k</w:t>
             </w:r>
           </w:p>
         </w:tc>
@@ -11874,7 +12334,7 @@
                 <w:szCs w:val="20"/>
                 <w:color w:val="000000"/>
               </w:rPr>
-              <w:t xml:space="preserve">Attr</w:t>
+              <w:t xml:space="preserve">CropCh</w:t>
             </w:r>
           </w:p>
         </w:tc>
@@ -11918,7 +12378,7 @@
                 <w:szCs w:val="20"/>
                 <w:color w:val="000000"/>
               </w:rPr>
-              <w:t xml:space="preserve"/>
+              <w:t xml:space="preserve">2</w:t>
             </w:r>
           </w:p>
         </w:tc>
@@ -11962,7 +12422,7 @@
                 <w:szCs w:val="20"/>
                 <w:color w:val="000000"/>
               </w:rPr>
-              <w:t xml:space="preserve">8.91</w:t>
+              <w:t xml:space="preserve">0.05</w:t>
             </w:r>
           </w:p>
         </w:tc>
@@ -12006,7 +12466,7 @@
                 <w:szCs w:val="20"/>
                 <w:color w:val="000000"/>
               </w:rPr>
-              <w:t xml:space="preserve">117.76</w:t>
+              <w:t xml:space="preserve">93.16</w:t>
             </w:r>
           </w:p>
         </w:tc>
@@ -12050,7 +12510,7 @@
                 <w:szCs w:val="20"/>
                 <w:color w:val="000000"/>
               </w:rPr>
-              <w:t xml:space="preserve">Yes</w:t>
+              <w:t xml:space="preserve">--</w:t>
             </w:r>
           </w:p>
         </w:tc>
@@ -12094,7 +12554,7 @@
                 <w:szCs w:val="20"/>
                 <w:color w:val="000000"/>
               </w:rPr>
-              <w:t xml:space="preserve">--</w:t>
+              <w:t xml:space="preserve">0.07</w:t>
             </w:r>
           </w:p>
         </w:tc>
@@ -12144,7 +12604,7 @@
                 <w:szCs w:val="20"/>
                 <w:color w:val="000000"/>
               </w:rPr>
-              <w:t xml:space="preserve">eflows25_div_lims</w:t>
+              <w:t xml:space="preserve">grain_6k</w:t>
             </w:r>
           </w:p>
         </w:tc>
@@ -12188,7 +12648,7 @@
                 <w:szCs w:val="20"/>
                 <w:color w:val="000000"/>
               </w:rPr>
-              <w:t xml:space="preserve">FlowLims</w:t>
+              <w:t xml:space="preserve">CropCh</w:t>
             </w:r>
           </w:p>
         </w:tc>
@@ -12232,7 +12692,7 @@
                 <w:szCs w:val="20"/>
                 <w:color w:val="000000"/>
               </w:rPr>
-              <w:t xml:space="preserve">1</w:t>
+              <w:t xml:space="preserve">2</w:t>
             </w:r>
           </w:p>
         </w:tc>
@@ -12276,7 +12736,7 @@
                 <w:szCs w:val="20"/>
                 <w:color w:val="000000"/>
               </w:rPr>
-              <w:t xml:space="preserve">8.97</w:t>
+              <w:t xml:space="preserve">0.05</w:t>
             </w:r>
           </w:p>
         </w:tc>
@@ -12320,7 +12780,7 @@
                 <w:szCs w:val="20"/>
                 <w:color w:val="000000"/>
               </w:rPr>
-              <w:t xml:space="preserve">113.75</w:t>
+              <w:t xml:space="preserve">108.81</w:t>
             </w:r>
           </w:p>
         </w:tc>
@@ -12364,7 +12824,7 @@
                 <w:szCs w:val="20"/>
                 <w:color w:val="000000"/>
               </w:rPr>
-              <w:t xml:space="preserve">Yes</w:t>
+              <w:t xml:space="preserve">--</w:t>
             </w:r>
           </w:p>
         </w:tc>
@@ -12408,7 +12868,7 @@
                 <w:szCs w:val="20"/>
                 <w:color w:val="000000"/>
               </w:rPr>
-              <w:t xml:space="preserve">0.18</w:t>
+              <w:t xml:space="preserve">0.05</w:t>
             </w:r>
           </w:p>
         </w:tc>
@@ -12458,7 +12918,7 @@
                 <w:szCs w:val="20"/>
                 <w:color w:val="000000"/>
               </w:rPr>
-              <w:t xml:space="preserve">grain_12k</w:t>
+              <w:t xml:space="preserve">irr_eff_0.1</w:t>
             </w:r>
           </w:p>
         </w:tc>
@@ -12502,7 +12962,7 @@
                 <w:szCs w:val="20"/>
                 <w:color w:val="000000"/>
               </w:rPr>
-              <w:t xml:space="preserve">CropCh</w:t>
+              <w:t xml:space="preserve">IrrEff</w:t>
             </w:r>
           </w:p>
         </w:tc>
@@ -12590,7 +13050,7 @@
                 <w:szCs w:val="20"/>
                 <w:color w:val="000000"/>
               </w:rPr>
-              <w:t xml:space="preserve">8.99</w:t>
+              <w:t xml:space="preserve">0.05</w:t>
             </w:r>
           </w:p>
         </w:tc>
@@ -12634,7 +13094,7 @@
                 <w:szCs w:val="20"/>
                 <w:color w:val="000000"/>
               </w:rPr>
-              <w:t xml:space="preserve">98.75</w:t>
+              <w:t xml:space="preserve">116.74</w:t>
             </w:r>
           </w:p>
         </w:tc>
@@ -12678,7 +13138,7 @@
                 <w:szCs w:val="20"/>
                 <w:color w:val="000000"/>
               </w:rPr>
-              <w:t xml:space="preserve">--</w:t>
+              <w:t xml:space="preserve">Yes</w:t>
             </w:r>
           </w:p>
         </w:tc>
@@ -12722,7 +13182,7 @@
                 <w:szCs w:val="20"/>
                 <w:color w:val="000000"/>
               </w:rPr>
-              <w:t xml:space="preserve">0.05</w:t>
+              <w:t xml:space="preserve">0.18</w:t>
             </w:r>
           </w:p>
         </w:tc>
@@ -12772,7 +13232,7 @@
                 <w:szCs w:val="20"/>
                 <w:color w:val="000000"/>
               </w:rPr>
-              <w:t xml:space="preserve">grain_14k</w:t>
+              <w:t xml:space="preserve">irr_eff_0.2</w:t>
             </w:r>
           </w:p>
         </w:tc>
@@ -12816,7 +13276,7 @@
                 <w:szCs w:val="20"/>
                 <w:color w:val="000000"/>
               </w:rPr>
-              <w:t xml:space="preserve">CropCh</w:t>
+              <w:t xml:space="preserve">IrrEff</w:t>
             </w:r>
           </w:p>
         </w:tc>
@@ -12904,7 +13364,7 @@
                 <w:szCs w:val="20"/>
                 <w:color w:val="000000"/>
               </w:rPr>
-              <w:t xml:space="preserve">9.00</w:t>
+              <w:t xml:space="preserve">0.05</w:t>
             </w:r>
           </w:p>
         </w:tc>
@@ -12948,7 +13408,7 @@
                 <w:szCs w:val="20"/>
                 <w:color w:val="000000"/>
               </w:rPr>
-              <w:t xml:space="preserve">93.16</w:t>
+              <w:t xml:space="preserve">114.98</w:t>
             </w:r>
           </w:p>
         </w:tc>
@@ -12992,7 +13452,7 @@
                 <w:szCs w:val="20"/>
                 <w:color w:val="000000"/>
               </w:rPr>
-              <w:t xml:space="preserve">--</w:t>
+              <w:t xml:space="preserve">Yes</w:t>
             </w:r>
           </w:p>
         </w:tc>
@@ -13036,7 +13496,7 @@
                 <w:szCs w:val="20"/>
                 <w:color w:val="000000"/>
               </w:rPr>
-              <w:t xml:space="preserve">0.04</w:t>
+              <w:t xml:space="preserve">0.15</w:t>
             </w:r>
           </w:p>
         </w:tc>
@@ -13086,7 +13546,7 @@
                 <w:szCs w:val="20"/>
                 <w:color w:val="000000"/>
               </w:rPr>
-              <w:t xml:space="preserve">grain_6k</w:t>
+              <w:t xml:space="preserve">maxMAR_fields2024</w:t>
             </w:r>
           </w:p>
         </w:tc>
@@ -13130,7 +13590,7 @@
                 <w:szCs w:val="20"/>
                 <w:color w:val="000000"/>
               </w:rPr>
-              <w:t xml:space="preserve">CropCh</w:t>
+              <w:t xml:space="preserve">EnhRch</w:t>
             </w:r>
           </w:p>
         </w:tc>
@@ -13174,7 +13634,7 @@
                 <w:szCs w:val="20"/>
                 <w:color w:val="000000"/>
               </w:rPr>
-              <w:t xml:space="preserve">2</w:t>
+              <w:t xml:space="preserve">3</w:t>
             </w:r>
           </w:p>
         </w:tc>
@@ -13218,7 +13678,7 @@
                 <w:szCs w:val="20"/>
                 <w:color w:val="000000"/>
               </w:rPr>
-              <w:t xml:space="preserve">8.94</w:t>
+              <w:t xml:space="preserve">0.05</w:t>
             </w:r>
           </w:p>
         </w:tc>
@@ -13262,7 +13722,7 @@
                 <w:szCs w:val="20"/>
                 <w:color w:val="000000"/>
               </w:rPr>
-              <w:t xml:space="preserve">108.81</w:t>
+              <w:t xml:space="preserve">117.75</w:t>
             </w:r>
           </w:p>
         </w:tc>
@@ -13350,7 +13810,7 @@
                 <w:szCs w:val="20"/>
                 <w:color w:val="000000"/>
               </w:rPr>
-              <w:t xml:space="preserve">0.03</w:t>
+              <w:t xml:space="preserve">--</w:t>
             </w:r>
           </w:p>
         </w:tc>
@@ -13400,7 +13860,7 @@
                 <w:szCs w:val="20"/>
                 <w:color w:val="000000"/>
               </w:rPr>
-              <w:t xml:space="preserve">irr_eff_0.1</w:t>
+              <w:t xml:space="preserve">natveg_high_12k</w:t>
             </w:r>
           </w:p>
         </w:tc>
@@ -13444,7 +13904,7 @@
                 <w:szCs w:val="20"/>
                 <w:color w:val="000000"/>
               </w:rPr>
-              <w:t xml:space="preserve">IrrEff</w:t>
+              <w:t xml:space="preserve">NatVegH</w:t>
             </w:r>
           </w:p>
         </w:tc>
@@ -13532,7 +13992,7 @@
                 <w:szCs w:val="20"/>
                 <w:color w:val="000000"/>
               </w:rPr>
-              <w:t xml:space="preserve">8.98</w:t>
+              <w:t xml:space="preserve">0.05</w:t>
             </w:r>
           </w:p>
         </w:tc>
@@ -13576,7 +14036,7 @@
                 <w:szCs w:val="20"/>
                 <w:color w:val="000000"/>
               </w:rPr>
-              <w:t xml:space="preserve">116.74</w:t>
+              <w:t xml:space="preserve">78.66</w:t>
             </w:r>
           </w:p>
         </w:tc>
@@ -13620,7 +14080,7 @@
                 <w:szCs w:val="20"/>
                 <w:color w:val="000000"/>
               </w:rPr>
-              <w:t xml:space="preserve">Yes</w:t>
+              <w:t xml:space="preserve">--</w:t>
             </w:r>
           </w:p>
         </w:tc>
@@ -13664,7 +14124,7 @@
                 <w:szCs w:val="20"/>
                 <w:color w:val="000000"/>
               </w:rPr>
-              <w:t xml:space="preserve">0.87</w:t>
+              <w:t xml:space="preserve">0.05</w:t>
             </w:r>
           </w:p>
         </w:tc>
@@ -13714,7 +14174,7 @@
                 <w:szCs w:val="20"/>
                 <w:color w:val="000000"/>
               </w:rPr>
-              <w:t xml:space="preserve">irr_eff_0.2</w:t>
+              <w:t xml:space="preserve">natveg_high_4k</w:t>
             </w:r>
           </w:p>
         </w:tc>
@@ -13758,7 +14218,7 @@
                 <w:szCs w:val="20"/>
                 <w:color w:val="000000"/>
               </w:rPr>
-              <w:t xml:space="preserve">IrrEff</w:t>
+              <w:t xml:space="preserve">NatVegH</w:t>
             </w:r>
           </w:p>
         </w:tc>
@@ -13846,7 +14306,7 @@
                 <w:szCs w:val="20"/>
                 <w:color w:val="000000"/>
               </w:rPr>
-              <w:t xml:space="preserve">8.92</w:t>
+              <w:t xml:space="preserve">0.05</w:t>
             </w:r>
           </w:p>
         </w:tc>
@@ -13890,7 +14350,7 @@
                 <w:szCs w:val="20"/>
                 <w:color w:val="000000"/>
               </w:rPr>
-              <w:t xml:space="preserve">114.98</w:t>
+              <w:t xml:space="preserve">107.70</w:t>
             </w:r>
           </w:p>
         </w:tc>
@@ -13978,7 +14438,7 @@
                 <w:szCs w:val="20"/>
                 <w:color w:val="000000"/>
               </w:rPr>
-              <w:t xml:space="preserve">0.02</w:t>
+              <w:t xml:space="preserve">--</w:t>
             </w:r>
           </w:p>
         </w:tc>
@@ -14028,7 +14488,7 @@
                 <w:szCs w:val="20"/>
                 <w:color w:val="000000"/>
               </w:rPr>
-              <w:t xml:space="preserve">maxMAR_fields2024</w:t>
+              <w:t xml:space="preserve">natveg_high_8k</w:t>
             </w:r>
           </w:p>
         </w:tc>
@@ -14072,7 +14532,7 @@
                 <w:szCs w:val="20"/>
                 <w:color w:val="000000"/>
               </w:rPr>
-              <w:t xml:space="preserve">EnhRch</w:t>
+              <w:t xml:space="preserve">NatVegH</w:t>
             </w:r>
           </w:p>
         </w:tc>
@@ -14116,7 +14576,7 @@
                 <w:szCs w:val="20"/>
                 <w:color w:val="000000"/>
               </w:rPr>
-              <w:t xml:space="preserve">3</w:t>
+              <w:t xml:space="preserve">2</w:t>
             </w:r>
           </w:p>
         </w:tc>
@@ -14160,7 +14620,7 @@
                 <w:szCs w:val="20"/>
                 <w:color w:val="000000"/>
               </w:rPr>
-              <w:t xml:space="preserve">8.91</w:t>
+              <w:t xml:space="preserve">0.05</w:t>
             </w:r>
           </w:p>
         </w:tc>
@@ -14204,7 +14664,7 @@
                 <w:szCs w:val="20"/>
                 <w:color w:val="000000"/>
               </w:rPr>
-              <w:t xml:space="preserve">117.75</w:t>
+              <w:t xml:space="preserve">94.02</w:t>
             </w:r>
           </w:p>
         </w:tc>
@@ -14292,7 +14752,7 @@
                 <w:szCs w:val="20"/>
                 <w:color w:val="000000"/>
               </w:rPr>
-              <w:t xml:space="preserve">--</w:t>
+              <w:t xml:space="preserve">0.02</w:t>
             </w:r>
           </w:p>
         </w:tc>
@@ -14342,7 +14802,7 @@
                 <w:szCs w:val="20"/>
                 <w:color w:val="000000"/>
               </w:rPr>
-              <w:t xml:space="preserve">natveg_high_12k</w:t>
+              <w:t xml:space="preserve">natveg_high_all</w:t>
             </w:r>
           </w:p>
         </w:tc>
@@ -14474,7 +14934,7 @@
                 <w:szCs w:val="20"/>
                 <w:color w:val="000000"/>
               </w:rPr>
-              <w:t xml:space="preserve">8.96</w:t>
+              <w:t xml:space="preserve">0.05</w:t>
             </w:r>
           </w:p>
         </w:tc>
@@ -14518,7 +14978,7 @@
                 <w:szCs w:val="20"/>
                 <w:color w:val="000000"/>
               </w:rPr>
-              <w:t xml:space="preserve">78.66</w:t>
+              <w:t xml:space="preserve">0.00</w:t>
             </w:r>
           </w:p>
         </w:tc>
@@ -14562,7 +15022,7 @@
                 <w:szCs w:val="20"/>
                 <w:color w:val="000000"/>
               </w:rPr>
-              <w:t xml:space="preserve">--</w:t>
+              <w:t xml:space="preserve">Yes</w:t>
             </w:r>
           </w:p>
         </w:tc>
@@ -14606,7 +15066,7 @@
                 <w:szCs w:val="20"/>
                 <w:color w:val="000000"/>
               </w:rPr>
-              <w:t xml:space="preserve">0.02</w:t>
+              <w:t xml:space="preserve">0.06</w:t>
             </w:r>
           </w:p>
         </w:tc>
@@ -14656,7 +15116,7 @@
                 <w:szCs w:val="20"/>
                 <w:color w:val="000000"/>
               </w:rPr>
-              <w:t xml:space="preserve">natveg_high_4k</w:t>
+              <w:t xml:space="preserve">natveg_low_12k</w:t>
             </w:r>
           </w:p>
         </w:tc>
@@ -14700,7 +15160,7 @@
                 <w:szCs w:val="20"/>
                 <w:color w:val="000000"/>
               </w:rPr>
-              <w:t xml:space="preserve">NatVegH</w:t>
+              <w:t xml:space="preserve">NatVegL</w:t>
             </w:r>
           </w:p>
         </w:tc>
@@ -14788,7 +15248,7 @@
                 <w:szCs w:val="20"/>
                 <w:color w:val="000000"/>
               </w:rPr>
-              <w:t xml:space="preserve">8.94</w:t>
+              <w:t xml:space="preserve">0.05</w:t>
             </w:r>
           </w:p>
         </w:tc>
@@ -14832,7 +15292,7 @@
                 <w:szCs w:val="20"/>
                 <w:color w:val="000000"/>
               </w:rPr>
-              <w:t xml:space="preserve">107.70</w:t>
+              <w:t xml:space="preserve">78.66</w:t>
             </w:r>
           </w:p>
         </w:tc>
@@ -14920,7 +15380,7 @@
                 <w:szCs w:val="20"/>
                 <w:color w:val="000000"/>
               </w:rPr>
-              <w:t xml:space="preserve">0.04</w:t>
+              <w:t xml:space="preserve">0.08</w:t>
             </w:r>
           </w:p>
         </w:tc>
@@ -14970,7 +15430,7 @@
                 <w:szCs w:val="20"/>
                 <w:color w:val="000000"/>
               </w:rPr>
-              <w:t xml:space="preserve">natveg_high_8k</w:t>
+              <w:t xml:space="preserve">natveg_low_4k</w:t>
             </w:r>
           </w:p>
         </w:tc>
@@ -15014,7 +15474,7 @@
                 <w:szCs w:val="20"/>
                 <w:color w:val="000000"/>
               </w:rPr>
-              <w:t xml:space="preserve">NatVegH</w:t>
+              <w:t xml:space="preserve">NatVegL</w:t>
             </w:r>
           </w:p>
         </w:tc>
@@ -15102,7 +15562,7 @@
                 <w:szCs w:val="20"/>
                 <w:color w:val="000000"/>
               </w:rPr>
-              <w:t xml:space="preserve">8.93</w:t>
+              <w:t xml:space="preserve">0.05</w:t>
             </w:r>
           </w:p>
         </w:tc>
@@ -15146,7 +15606,7 @@
                 <w:szCs w:val="20"/>
                 <w:color w:val="000000"/>
               </w:rPr>
-              <w:t xml:space="preserve">94.02</w:t>
+              <w:t xml:space="preserve">107.70</w:t>
             </w:r>
           </w:p>
         </w:tc>
@@ -15234,7 +15694,7 @@
                 <w:szCs w:val="20"/>
                 <w:color w:val="000000"/>
               </w:rPr>
-              <w:t xml:space="preserve">0.01</w:t>
+              <w:t xml:space="preserve">0.07</w:t>
             </w:r>
           </w:p>
         </w:tc>
@@ -15284,7 +15744,7 @@
                 <w:szCs w:val="20"/>
                 <w:color w:val="000000"/>
               </w:rPr>
-              <w:t xml:space="preserve">natveg_high_all</w:t>
+              <w:t xml:space="preserve">natveg_low_8k</w:t>
             </w:r>
           </w:p>
         </w:tc>
@@ -15328,7 +15788,7 @@
                 <w:szCs w:val="20"/>
                 <w:color w:val="000000"/>
               </w:rPr>
-              <w:t xml:space="preserve">NatVegH</w:t>
+              <w:t xml:space="preserve">NatVegL</w:t>
             </w:r>
           </w:p>
         </w:tc>
@@ -15416,7 +15876,7 @@
                 <w:szCs w:val="20"/>
                 <w:color w:val="000000"/>
               </w:rPr>
-              <w:t xml:space="preserve">9.03</w:t>
+              <w:t xml:space="preserve">0.05</w:t>
             </w:r>
           </w:p>
         </w:tc>
@@ -15460,7 +15920,7 @@
                 <w:szCs w:val="20"/>
                 <w:color w:val="000000"/>
               </w:rPr>
-              <w:t xml:space="preserve">0.00</w:t>
+              <w:t xml:space="preserve">94.02</w:t>
             </w:r>
           </w:p>
         </w:tc>
@@ -15548,7 +16008,7 @@
                 <w:szCs w:val="20"/>
                 <w:color w:val="000000"/>
               </w:rPr>
-              <w:t xml:space="preserve">0.01</w:t>
+              <w:t xml:space="preserve">0.08</w:t>
             </w:r>
           </w:p>
         </w:tc>
@@ -15598,7 +16058,7 @@
                 <w:szCs w:val="20"/>
                 <w:color w:val="000000"/>
               </w:rPr>
-              <w:t xml:space="preserve">natveg_low_12k</w:t>
+              <w:t xml:space="preserve">natveg_low_all</w:t>
             </w:r>
           </w:p>
         </w:tc>
@@ -15730,7 +16190,7 @@
                 <w:szCs w:val="20"/>
                 <w:color w:val="000000"/>
               </w:rPr>
-              <w:t xml:space="preserve">8.97</w:t>
+              <w:t xml:space="preserve">0.05</w:t>
             </w:r>
           </w:p>
         </w:tc>
@@ -15774,7 +16234,7 @@
                 <w:szCs w:val="20"/>
                 <w:color w:val="000000"/>
               </w:rPr>
-              <w:t xml:space="preserve">78.66</w:t>
+              <w:t xml:space="preserve">0.00</w:t>
             </w:r>
           </w:p>
         </w:tc>
@@ -15818,7 +16278,7 @@
                 <w:szCs w:val="20"/>
                 <w:color w:val="000000"/>
               </w:rPr>
-              <w:t xml:space="preserve">--</w:t>
+              <w:t xml:space="preserve">Yes</w:t>
             </w:r>
           </w:p>
         </w:tc>
@@ -15862,7 +16322,7 @@
                 <w:szCs w:val="20"/>
                 <w:color w:val="000000"/>
               </w:rPr>
-              <w:t xml:space="preserve">0.02</w:t>
+              <w:t xml:space="preserve">0.06</w:t>
             </w:r>
           </w:p>
         </w:tc>
@@ -15912,7 +16372,7 @@
                 <w:szCs w:val="20"/>
                 <w:color w:val="000000"/>
               </w:rPr>
-              <w:t xml:space="preserve">natveg_low_4k</w:t>
+              <w:t xml:space="preserve">reservoir_etna</w:t>
             </w:r>
           </w:p>
         </w:tc>
@@ -15956,7 +16416,7 @@
                 <w:szCs w:val="20"/>
                 <w:color w:val="000000"/>
               </w:rPr>
-              <w:t xml:space="preserve">NatVegL</w:t>
+              <w:t xml:space="preserve">Res</w:t>
             </w:r>
           </w:p>
         </w:tc>
@@ -16000,7 +16460,7 @@
                 <w:szCs w:val="20"/>
                 <w:color w:val="000000"/>
               </w:rPr>
-              <w:t xml:space="preserve">2</w:t>
+              <w:t xml:space="preserve">4</w:t>
             </w:r>
           </w:p>
         </w:tc>
@@ -16044,7 +16504,7 @@
                 <w:szCs w:val="20"/>
                 <w:color w:val="000000"/>
               </w:rPr>
-              <w:t xml:space="preserve">8.97</w:t>
+              <w:t xml:space="preserve">0.05</w:t>
             </w:r>
           </w:p>
         </w:tc>
@@ -16088,7 +16548,7 @@
                 <w:szCs w:val="20"/>
                 <w:color w:val="000000"/>
               </w:rPr>
-              <w:t xml:space="preserve">107.70</w:t>
+              <w:t xml:space="preserve">117.87</w:t>
             </w:r>
           </w:p>
         </w:tc>
@@ -16132,7 +16592,7 @@
                 <w:szCs w:val="20"/>
                 <w:color w:val="000000"/>
               </w:rPr>
-              <w:t xml:space="preserve">--</w:t>
+              <w:t xml:space="preserve">Yes</w:t>
             </w:r>
           </w:p>
         </w:tc>
@@ -16176,7 +16636,7 @@
                 <w:szCs w:val="20"/>
                 <w:color w:val="000000"/>
               </w:rPr>
-              <w:t xml:space="preserve">0.07</w:t>
+              <w:t xml:space="preserve">--</w:t>
             </w:r>
           </w:p>
         </w:tc>
@@ -16226,7 +16686,7 @@
                 <w:szCs w:val="20"/>
                 <w:color w:val="000000"/>
               </w:rPr>
-              <w:t xml:space="preserve">natveg_low_8k</w:t>
+              <w:t xml:space="preserve">reservoir_french</w:t>
             </w:r>
           </w:p>
         </w:tc>
@@ -16270,7 +16730,7 @@
                 <w:szCs w:val="20"/>
                 <w:color w:val="000000"/>
               </w:rPr>
-              <w:t xml:space="preserve">NatVegL</w:t>
+              <w:t xml:space="preserve">Res</w:t>
             </w:r>
           </w:p>
         </w:tc>
@@ -16314,7 +16774,7 @@
                 <w:szCs w:val="20"/>
                 <w:color w:val="000000"/>
               </w:rPr>
-              <w:t xml:space="preserve">2</w:t>
+              <w:t xml:space="preserve">4</w:t>
             </w:r>
           </w:p>
         </w:tc>
@@ -16358,7 +16818,7 @@
                 <w:szCs w:val="20"/>
                 <w:color w:val="000000"/>
               </w:rPr>
-              <w:t xml:space="preserve">8.97</w:t>
+              <w:t xml:space="preserve">0.05</w:t>
             </w:r>
           </w:p>
         </w:tc>
@@ -16402,7 +16862,7 @@
                 <w:szCs w:val="20"/>
                 <w:color w:val="000000"/>
               </w:rPr>
-              <w:t xml:space="preserve">94.02</w:t>
+              <w:t xml:space="preserve">117.84</w:t>
             </w:r>
           </w:p>
         </w:tc>
@@ -16446,7 +16906,7 @@
                 <w:szCs w:val="20"/>
                 <w:color w:val="000000"/>
               </w:rPr>
-              <w:t xml:space="preserve">--</w:t>
+              <w:t xml:space="preserve">Yes</w:t>
             </w:r>
           </w:p>
         </w:tc>
@@ -16490,7 +16950,7 @@
                 <w:szCs w:val="20"/>
                 <w:color w:val="000000"/>
               </w:rPr>
-              <w:t xml:space="preserve">0.03</w:t>
+              <w:t xml:space="preserve">--</w:t>
             </w:r>
           </w:p>
         </w:tc>
@@ -16503,7 +16963,7 @@
         <w:tc>
           <w:tcPr>
             <w:tcBorders>
-              <w:bottom w:val="none" w:sz="0" w:space="0" w:color="000000"/>
+              <w:bottom w:val="single" w:sz="12" w:space="0" w:color="666666"/>
               <w:top w:val="none" w:sz="0" w:space="0" w:color="000000"/>
               <w:left w:val="none" w:sz="0" w:space="0" w:color="000000"/>
               <w:right w:val="none" w:sz="0" w:space="0" w:color="000000"/>
@@ -16540,14 +17000,14 @@
                 <w:szCs w:val="20"/>
                 <w:color w:val="000000"/>
               </w:rPr>
-              <w:t xml:space="preserve">natveg_low_all</w:t>
-            </w:r>
-          </w:p>
-        </w:tc>
-        <w:tc>
-          <w:tcPr>
-            <w:tcBorders>
-              <w:bottom w:val="none" w:sz="0" w:space="0" w:color="000000"/>
+              <w:t xml:space="preserve">reservoir_shackleford</w:t>
+            </w:r>
+          </w:p>
+        </w:tc>
+        <w:tc>
+          <w:tcPr>
+            <w:tcBorders>
+              <w:bottom w:val="single" w:sz="12" w:space="0" w:color="666666"/>
               <w:top w:val="none" w:sz="0" w:space="0" w:color="000000"/>
               <w:left w:val="none" w:sz="0" w:space="0" w:color="000000"/>
               <w:right w:val="none" w:sz="0" w:space="0" w:color="000000"/>
@@ -16584,14 +17044,14 @@
                 <w:szCs w:val="20"/>
                 <w:color w:val="000000"/>
               </w:rPr>
-              <w:t xml:space="preserve">NatVegL</w:t>
-            </w:r>
-          </w:p>
-        </w:tc>
-        <w:tc>
-          <w:tcPr>
-            <w:tcBorders>
-              <w:bottom w:val="none" w:sz="0" w:space="0" w:color="000000"/>
+              <w:t xml:space="preserve">Res</w:t>
+            </w:r>
+          </w:p>
+        </w:tc>
+        <w:tc>
+          <w:tcPr>
+            <w:tcBorders>
+              <w:bottom w:val="single" w:sz="12" w:space="0" w:color="666666"/>
               <w:top w:val="none" w:sz="0" w:space="0" w:color="000000"/>
               <w:left w:val="none" w:sz="0" w:space="0" w:color="000000"/>
               <w:right w:val="none" w:sz="0" w:space="0" w:color="000000"/>
@@ -16628,14 +17088,14 @@
                 <w:szCs w:val="20"/>
                 <w:color w:val="000000"/>
               </w:rPr>
-              <w:t xml:space="preserve">2</w:t>
-            </w:r>
-          </w:p>
-        </w:tc>
-        <w:tc>
-          <w:tcPr>
-            <w:tcBorders>
-              <w:bottom w:val="none" w:sz="0" w:space="0" w:color="000000"/>
+              <w:t xml:space="preserve">4</w:t>
+            </w:r>
+          </w:p>
+        </w:tc>
+        <w:tc>
+          <w:tcPr>
+            <w:tcBorders>
+              <w:bottom w:val="single" w:sz="12" w:space="0" w:color="666666"/>
               <w:top w:val="none" w:sz="0" w:space="0" w:color="000000"/>
               <w:left w:val="none" w:sz="0" w:space="0" w:color="000000"/>
               <w:right w:val="none" w:sz="0" w:space="0" w:color="000000"/>
@@ -16672,14 +17132,14 @@
                 <w:szCs w:val="20"/>
                 <w:color w:val="000000"/>
               </w:rPr>
-              <w:t xml:space="preserve">9.11</w:t>
-            </w:r>
-          </w:p>
-        </w:tc>
-        <w:tc>
-          <w:tcPr>
-            <w:tcBorders>
-              <w:bottom w:val="none" w:sz="0" w:space="0" w:color="000000"/>
+              <w:t xml:space="preserve">0.05</w:t>
+            </w:r>
+          </w:p>
+        </w:tc>
+        <w:tc>
+          <w:tcPr>
+            <w:tcBorders>
+              <w:bottom w:val="single" w:sz="12" w:space="0" w:color="666666"/>
               <w:top w:val="none" w:sz="0" w:space="0" w:color="000000"/>
               <w:left w:val="none" w:sz="0" w:space="0" w:color="000000"/>
               <w:right w:val="none" w:sz="0" w:space="0" w:color="000000"/>
@@ -16716,14 +17176,14 @@
                 <w:szCs w:val="20"/>
                 <w:color w:val="000000"/>
               </w:rPr>
-              <w:t xml:space="preserve">0.00</w:t>
-            </w:r>
-          </w:p>
-        </w:tc>
-        <w:tc>
-          <w:tcPr>
-            <w:tcBorders>
-              <w:bottom w:val="none" w:sz="0" w:space="0" w:color="000000"/>
+              <w:t xml:space="preserve">117.98</w:t>
+            </w:r>
+          </w:p>
+        </w:tc>
+        <w:tc>
+          <w:tcPr>
+            <w:tcBorders>
+              <w:bottom w:val="single" w:sz="12" w:space="0" w:color="666666"/>
               <w:top w:val="none" w:sz="0" w:space="0" w:color="000000"/>
               <w:left w:val="none" w:sz="0" w:space="0" w:color="000000"/>
               <w:right w:val="none" w:sz="0" w:space="0" w:color="000000"/>
@@ -16767,7 +17227,7 @@
         <w:tc>
           <w:tcPr>
             <w:tcBorders>
-              <w:bottom w:val="none" w:sz="0" w:space="0" w:color="000000"/>
+              <w:bottom w:val="single" w:sz="12" w:space="0" w:color="666666"/>
               <w:top w:val="none" w:sz="0" w:space="0" w:color="000000"/>
               <w:left w:val="none" w:sz="0" w:space="0" w:color="000000"/>
               <w:right w:val="none" w:sz="0" w:space="0" w:color="000000"/>
@@ -16804,956 +17264,14 @@
                 <w:szCs w:val="20"/>
                 <w:color w:val="000000"/>
               </w:rPr>
-              <w:t xml:space="preserve">0.02</w:t>
-            </w:r>
-          </w:p>
-        </w:tc>
-      </w:tr>
-      <w:tr>
-        <w:trPr>
-          <w:trHeight w:val="360" w:hRule="auto"/>
-        </w:trPr>
-        body26
-        <w:tc>
-          <w:tcPr>
-            <w:tcBorders>
-              <w:bottom w:val="none" w:sz="0" w:space="0" w:color="000000"/>
-              <w:top w:val="none" w:sz="0" w:space="0" w:color="000000"/>
-              <w:left w:val="none" w:sz="0" w:space="0" w:color="000000"/>
-              <w:right w:val="none" w:sz="0" w:space="0" w:color="000000"/>
-            </w:tcBorders>
-            <w:shd w:val="clear" w:color="auto" w:fill="FFFFFF"/>
-            <w:tcMar>
-              <w:top w:w="0" w:type="dxa"/>
-              <w:bottom w:w="0" w:type="dxa"/>
-              <w:left w:w="0" w:type="dxa"/>
-              <w:right w:w="0" w:type="dxa"/>
-            </w:tcMar>
-            <w:vAlign w:val="center"/>
-          </w:tcPr>
-          <w:p>
-            <w:pPr>
-              <w:pStyle w:val="Normal"/>
-              <w:jc w:val="left"/>
-              <w:pBdr>
-                <w:bottom w:val="none" w:sz="0" w:space="0" w:color="000000"/>
-                <w:top w:val="none" w:sz="0" w:space="0" w:color="000000"/>
-                <w:left w:val="none" w:sz="0" w:space="0" w:color="000000"/>
-                <w:right w:val="none" w:sz="0" w:space="0" w:color="000000"/>
-              </w:pBdr>
-              <w:spacing w:after="100" w:before="100" w:line="240"/>
-              <w:ind w:left="100" w:right="100" w:firstLine="0" w:firstLineChars="0"/>
-            </w:pPr>
-            <w:r xmlns:w="http://schemas.openxmlformats.org/wordprocessingml/2006/main" xmlns:wp="http://schemas.openxmlformats.org/drawingml/2006/wordprocessingDrawing" xmlns:r="http://schemas.openxmlformats.org/officeDocument/2006/relationships" xmlns:w14="http://schemas.microsoft.com/office/word/2010/wordml">
-              <w:rPr>
-                <w:rFonts w:ascii="Arial" w:hAnsi="Arial" w:eastAsia="Arial" w:cs="Arial"/>
-                <w:i w:val="false"/>
-                <w:b w:val="false"/>
-                <w:u w:val="none"/>
-                <w:sz w:val="20"/>
-                <w:szCs w:val="20"/>
-                <w:color w:val="000000"/>
-              </w:rPr>
-              <w:t xml:space="preserve">reservoir_etna</w:t>
-            </w:r>
-          </w:p>
-        </w:tc>
-        <w:tc>
-          <w:tcPr>
-            <w:tcBorders>
-              <w:bottom w:val="none" w:sz="0" w:space="0" w:color="000000"/>
-              <w:top w:val="none" w:sz="0" w:space="0" w:color="000000"/>
-              <w:left w:val="none" w:sz="0" w:space="0" w:color="000000"/>
-              <w:right w:val="none" w:sz="0" w:space="0" w:color="000000"/>
-            </w:tcBorders>
-            <w:shd w:val="clear" w:color="auto" w:fill="FFFFFF"/>
-            <w:tcMar>
-              <w:top w:w="0" w:type="dxa"/>
-              <w:bottom w:w="0" w:type="dxa"/>
-              <w:left w:w="0" w:type="dxa"/>
-              <w:right w:w="0" w:type="dxa"/>
-            </w:tcMar>
-            <w:vAlign w:val="center"/>
-          </w:tcPr>
-          <w:p>
-            <w:pPr>
-              <w:pStyle w:val="Normal"/>
-              <w:jc w:val="left"/>
-              <w:pBdr>
-                <w:bottom w:val="none" w:sz="0" w:space="0" w:color="000000"/>
-                <w:top w:val="none" w:sz="0" w:space="0" w:color="000000"/>
-                <w:left w:val="none" w:sz="0" w:space="0" w:color="000000"/>
-                <w:right w:val="none" w:sz="0" w:space="0" w:color="000000"/>
-              </w:pBdr>
-              <w:spacing w:after="100" w:before="100" w:line="240"/>
-              <w:ind w:left="100" w:right="100" w:firstLine="0" w:firstLineChars="0"/>
-            </w:pPr>
-            <w:r xmlns:w="http://schemas.openxmlformats.org/wordprocessingml/2006/main" xmlns:wp="http://schemas.openxmlformats.org/drawingml/2006/wordprocessingDrawing" xmlns:r="http://schemas.openxmlformats.org/officeDocument/2006/relationships" xmlns:w14="http://schemas.microsoft.com/office/word/2010/wordml">
-              <w:rPr>
-                <w:rFonts w:ascii="Arial" w:hAnsi="Arial" w:eastAsia="Arial" w:cs="Arial"/>
-                <w:i w:val="false"/>
-                <w:b w:val="false"/>
-                <w:u w:val="none"/>
-                <w:sz w:val="20"/>
-                <w:szCs w:val="20"/>
-                <w:color w:val="000000"/>
-              </w:rPr>
-              <w:t xml:space="preserve">Res</w:t>
-            </w:r>
-          </w:p>
-        </w:tc>
-        <w:tc>
-          <w:tcPr>
-            <w:tcBorders>
-              <w:bottom w:val="none" w:sz="0" w:space="0" w:color="000000"/>
-              <w:top w:val="none" w:sz="0" w:space="0" w:color="000000"/>
-              <w:left w:val="none" w:sz="0" w:space="0" w:color="000000"/>
-              <w:right w:val="none" w:sz="0" w:space="0" w:color="000000"/>
-            </w:tcBorders>
-            <w:shd w:val="clear" w:color="auto" w:fill="FFFFFF"/>
-            <w:tcMar>
-              <w:top w:w="0" w:type="dxa"/>
-              <w:bottom w:w="0" w:type="dxa"/>
-              <w:left w:w="0" w:type="dxa"/>
-              <w:right w:w="0" w:type="dxa"/>
-            </w:tcMar>
-            <w:vAlign w:val="center"/>
-          </w:tcPr>
-          <w:p>
-            <w:pPr>
-              <w:pStyle w:val="Normal"/>
-              <w:jc w:val="right"/>
-              <w:pBdr>
-                <w:bottom w:val="none" w:sz="0" w:space="0" w:color="000000"/>
-                <w:top w:val="none" w:sz="0" w:space="0" w:color="000000"/>
-                <w:left w:val="none" w:sz="0" w:space="0" w:color="000000"/>
-                <w:right w:val="none" w:sz="0" w:space="0" w:color="000000"/>
-              </w:pBdr>
-              <w:spacing w:after="100" w:before="100" w:line="240"/>
-              <w:ind w:left="100" w:right="100" w:firstLine="0" w:firstLineChars="0"/>
-            </w:pPr>
-            <w:r xmlns:w="http://schemas.openxmlformats.org/wordprocessingml/2006/main" xmlns:wp="http://schemas.openxmlformats.org/drawingml/2006/wordprocessingDrawing" xmlns:r="http://schemas.openxmlformats.org/officeDocument/2006/relationships" xmlns:w14="http://schemas.microsoft.com/office/word/2010/wordml">
-              <w:rPr>
-                <w:rFonts w:ascii="Arial" w:hAnsi="Arial" w:eastAsia="Arial" w:cs="Arial"/>
-                <w:i w:val="false"/>
-                <w:b w:val="false"/>
-                <w:u w:val="none"/>
-                <w:sz w:val="20"/>
-                <w:szCs w:val="20"/>
-                <w:color w:val="000000"/>
-              </w:rPr>
-              <w:t xml:space="preserve">4</w:t>
-            </w:r>
-          </w:p>
-        </w:tc>
-        <w:tc>
-          <w:tcPr>
-            <w:tcBorders>
-              <w:bottom w:val="none" w:sz="0" w:space="0" w:color="000000"/>
-              <w:top w:val="none" w:sz="0" w:space="0" w:color="000000"/>
-              <w:left w:val="none" w:sz="0" w:space="0" w:color="000000"/>
-              <w:right w:val="none" w:sz="0" w:space="0" w:color="000000"/>
-            </w:tcBorders>
-            <w:shd w:val="clear" w:color="auto" w:fill="FFFFFF"/>
-            <w:tcMar>
-              <w:top w:w="0" w:type="dxa"/>
-              <w:bottom w:w="0" w:type="dxa"/>
-              <w:left w:w="0" w:type="dxa"/>
-              <w:right w:w="0" w:type="dxa"/>
-            </w:tcMar>
-            <w:vAlign w:val="center"/>
-          </w:tcPr>
-          <w:p>
-            <w:pPr>
-              <w:pStyle w:val="Normal"/>
-              <w:jc w:val="right"/>
-              <w:pBdr>
-                <w:bottom w:val="none" w:sz="0" w:space="0" w:color="000000"/>
-                <w:top w:val="none" w:sz="0" w:space="0" w:color="000000"/>
-                <w:left w:val="none" w:sz="0" w:space="0" w:color="000000"/>
-                <w:right w:val="none" w:sz="0" w:space="0" w:color="000000"/>
-              </w:pBdr>
-              <w:spacing w:after="100" w:before="100" w:line="240"/>
-              <w:ind w:left="100" w:right="100" w:firstLine="0" w:firstLineChars="0"/>
-            </w:pPr>
-            <w:r xmlns:w="http://schemas.openxmlformats.org/wordprocessingml/2006/main" xmlns:wp="http://schemas.openxmlformats.org/drawingml/2006/wordprocessingDrawing" xmlns:r="http://schemas.openxmlformats.org/officeDocument/2006/relationships" xmlns:w14="http://schemas.microsoft.com/office/word/2010/wordml">
-              <w:rPr>
-                <w:rFonts w:ascii="Arial" w:hAnsi="Arial" w:eastAsia="Arial" w:cs="Arial"/>
-                <w:i w:val="false"/>
-                <w:b w:val="false"/>
-                <w:u w:val="none"/>
-                <w:sz w:val="20"/>
-                <w:szCs w:val="20"/>
-                <w:color w:val="000000"/>
-              </w:rPr>
-              <w:t xml:space="preserve">9.00</w:t>
-            </w:r>
-          </w:p>
-        </w:tc>
-        <w:tc>
-          <w:tcPr>
-            <w:tcBorders>
-              <w:bottom w:val="none" w:sz="0" w:space="0" w:color="000000"/>
-              <w:top w:val="none" w:sz="0" w:space="0" w:color="000000"/>
-              <w:left w:val="none" w:sz="0" w:space="0" w:color="000000"/>
-              <w:right w:val="none" w:sz="0" w:space="0" w:color="000000"/>
-            </w:tcBorders>
-            <w:shd w:val="clear" w:color="auto" w:fill="FFFFFF"/>
-            <w:tcMar>
-              <w:top w:w="0" w:type="dxa"/>
-              <w:bottom w:w="0" w:type="dxa"/>
-              <w:left w:w="0" w:type="dxa"/>
-              <w:right w:w="0" w:type="dxa"/>
-            </w:tcMar>
-            <w:vAlign w:val="center"/>
-          </w:tcPr>
-          <w:p>
-            <w:pPr>
-              <w:pStyle w:val="Normal"/>
-              <w:jc w:val="right"/>
-              <w:pBdr>
-                <w:bottom w:val="none" w:sz="0" w:space="0" w:color="000000"/>
-                <w:top w:val="none" w:sz="0" w:space="0" w:color="000000"/>
-                <w:left w:val="none" w:sz="0" w:space="0" w:color="000000"/>
-                <w:right w:val="none" w:sz="0" w:space="0" w:color="000000"/>
-              </w:pBdr>
-              <w:spacing w:after="100" w:before="100" w:line="240"/>
-              <w:ind w:left="100" w:right="100" w:firstLine="0" w:firstLineChars="0"/>
-            </w:pPr>
-            <w:r xmlns:w="http://schemas.openxmlformats.org/wordprocessingml/2006/main" xmlns:wp="http://schemas.openxmlformats.org/drawingml/2006/wordprocessingDrawing" xmlns:r="http://schemas.openxmlformats.org/officeDocument/2006/relationships" xmlns:w14="http://schemas.microsoft.com/office/word/2010/wordml">
-              <w:rPr>
-                <w:rFonts w:ascii="Arial" w:hAnsi="Arial" w:eastAsia="Arial" w:cs="Arial"/>
-                <w:i w:val="false"/>
-                <w:b w:val="false"/>
-                <w:u w:val="none"/>
-                <w:sz w:val="20"/>
-                <w:szCs w:val="20"/>
-                <w:color w:val="000000"/>
-              </w:rPr>
-              <w:t xml:space="preserve">117.87</w:t>
-            </w:r>
-          </w:p>
-        </w:tc>
-        <w:tc>
-          <w:tcPr>
-            <w:tcBorders>
-              <w:bottom w:val="none" w:sz="0" w:space="0" w:color="000000"/>
-              <w:top w:val="none" w:sz="0" w:space="0" w:color="000000"/>
-              <w:left w:val="none" w:sz="0" w:space="0" w:color="000000"/>
-              <w:right w:val="none" w:sz="0" w:space="0" w:color="000000"/>
-            </w:tcBorders>
-            <w:shd w:val="clear" w:color="auto" w:fill="FFFFFF"/>
-            <w:tcMar>
-              <w:top w:w="0" w:type="dxa"/>
-              <w:bottom w:w="0" w:type="dxa"/>
-              <w:left w:w="0" w:type="dxa"/>
-              <w:right w:w="0" w:type="dxa"/>
-            </w:tcMar>
-            <w:vAlign w:val="center"/>
-          </w:tcPr>
-          <w:p>
-            <w:pPr>
-              <w:pStyle w:val="Normal"/>
-              <w:jc w:val="left"/>
-              <w:pBdr>
-                <w:bottom w:val="none" w:sz="0" w:space="0" w:color="000000"/>
-                <w:top w:val="none" w:sz="0" w:space="0" w:color="000000"/>
-                <w:left w:val="none" w:sz="0" w:space="0" w:color="000000"/>
-                <w:right w:val="none" w:sz="0" w:space="0" w:color="000000"/>
-              </w:pBdr>
-              <w:spacing w:after="100" w:before="100" w:line="240"/>
-              <w:ind w:left="100" w:right="100" w:firstLine="0" w:firstLineChars="0"/>
-            </w:pPr>
-            <w:r xmlns:w="http://schemas.openxmlformats.org/wordprocessingml/2006/main" xmlns:wp="http://schemas.openxmlformats.org/drawingml/2006/wordprocessingDrawing" xmlns:r="http://schemas.openxmlformats.org/officeDocument/2006/relationships" xmlns:w14="http://schemas.microsoft.com/office/word/2010/wordml">
-              <w:rPr>
-                <w:rFonts w:ascii="Arial" w:hAnsi="Arial" w:eastAsia="Arial" w:cs="Arial"/>
-                <w:i w:val="false"/>
-                <w:b w:val="false"/>
-                <w:u w:val="none"/>
-                <w:sz w:val="20"/>
-                <w:szCs w:val="20"/>
-                <w:color w:val="000000"/>
-              </w:rPr>
-              <w:t xml:space="preserve">Yes</w:t>
-            </w:r>
-          </w:p>
-        </w:tc>
-        <w:tc>
-          <w:tcPr>
-            <w:tcBorders>
-              <w:bottom w:val="none" w:sz="0" w:space="0" w:color="000000"/>
-              <w:top w:val="none" w:sz="0" w:space="0" w:color="000000"/>
-              <w:left w:val="none" w:sz="0" w:space="0" w:color="000000"/>
-              <w:right w:val="none" w:sz="0" w:space="0" w:color="000000"/>
-            </w:tcBorders>
-            <w:shd w:val="clear" w:color="auto" w:fill="FFFFFF"/>
-            <w:tcMar>
-              <w:top w:w="0" w:type="dxa"/>
-              <w:bottom w:w="0" w:type="dxa"/>
-              <w:left w:w="0" w:type="dxa"/>
-              <w:right w:w="0" w:type="dxa"/>
-            </w:tcMar>
-            <w:vAlign w:val="center"/>
-          </w:tcPr>
-          <w:p>
-            <w:pPr>
-              <w:pStyle w:val="Normal"/>
-              <w:jc w:val="left"/>
-              <w:pBdr>
-                <w:bottom w:val="none" w:sz="0" w:space="0" w:color="000000"/>
-                <w:top w:val="none" w:sz="0" w:space="0" w:color="000000"/>
-                <w:left w:val="none" w:sz="0" w:space="0" w:color="000000"/>
-                <w:right w:val="none" w:sz="0" w:space="0" w:color="000000"/>
-              </w:pBdr>
-              <w:spacing w:after="100" w:before="100" w:line="240"/>
-              <w:ind w:left="100" w:right="100" w:firstLine="0" w:firstLineChars="0"/>
-            </w:pPr>
-            <w:r xmlns:w="http://schemas.openxmlformats.org/wordprocessingml/2006/main" xmlns:wp="http://schemas.openxmlformats.org/drawingml/2006/wordprocessingDrawing" xmlns:r="http://schemas.openxmlformats.org/officeDocument/2006/relationships" xmlns:w14="http://schemas.microsoft.com/office/word/2010/wordml">
-              <w:rPr>
-                <w:rFonts w:ascii="Arial" w:hAnsi="Arial" w:eastAsia="Arial" w:cs="Arial"/>
-                <w:i w:val="false"/>
-                <w:b w:val="false"/>
-                <w:u w:val="none"/>
-                <w:sz w:val="20"/>
-                <w:szCs w:val="20"/>
-                <w:color w:val="000000"/>
-              </w:rPr>
-              <w:t xml:space="preserve">--</w:t>
-            </w:r>
-          </w:p>
-        </w:tc>
-      </w:tr>
-      <w:tr>
-        <w:trPr>
-          <w:trHeight w:val="360" w:hRule="auto"/>
-        </w:trPr>
-        body27
-        <w:tc>
-          <w:tcPr>
-            <w:tcBorders>
-              <w:bottom w:val="none" w:sz="0" w:space="0" w:color="000000"/>
-              <w:top w:val="none" w:sz="0" w:space="0" w:color="000000"/>
-              <w:left w:val="none" w:sz="0" w:space="0" w:color="000000"/>
-              <w:right w:val="none" w:sz="0" w:space="0" w:color="000000"/>
-            </w:tcBorders>
-            <w:shd w:val="clear" w:color="auto" w:fill="FFFFFF"/>
-            <w:tcMar>
-              <w:top w:w="0" w:type="dxa"/>
-              <w:bottom w:w="0" w:type="dxa"/>
-              <w:left w:w="0" w:type="dxa"/>
-              <w:right w:w="0" w:type="dxa"/>
-            </w:tcMar>
-            <w:vAlign w:val="center"/>
-          </w:tcPr>
-          <w:p>
-            <w:pPr>
-              <w:pStyle w:val="Normal"/>
-              <w:jc w:val="left"/>
-              <w:pBdr>
-                <w:bottom w:val="none" w:sz="0" w:space="0" w:color="000000"/>
-                <w:top w:val="none" w:sz="0" w:space="0" w:color="000000"/>
-                <w:left w:val="none" w:sz="0" w:space="0" w:color="000000"/>
-                <w:right w:val="none" w:sz="0" w:space="0" w:color="000000"/>
-              </w:pBdr>
-              <w:spacing w:after="100" w:before="100" w:line="240"/>
-              <w:ind w:left="100" w:right="100" w:firstLine="0" w:firstLineChars="0"/>
-            </w:pPr>
-            <w:r xmlns:w="http://schemas.openxmlformats.org/wordprocessingml/2006/main" xmlns:wp="http://schemas.openxmlformats.org/drawingml/2006/wordprocessingDrawing" xmlns:r="http://schemas.openxmlformats.org/officeDocument/2006/relationships" xmlns:w14="http://schemas.microsoft.com/office/word/2010/wordml">
-              <w:rPr>
-                <w:rFonts w:ascii="Arial" w:hAnsi="Arial" w:eastAsia="Arial" w:cs="Arial"/>
-                <w:i w:val="false"/>
-                <w:b w:val="false"/>
-                <w:u w:val="none"/>
-                <w:sz w:val="20"/>
-                <w:szCs w:val="20"/>
-                <w:color w:val="000000"/>
-              </w:rPr>
-              <w:t xml:space="preserve">reservoir_french</w:t>
-            </w:r>
-          </w:p>
-        </w:tc>
-        <w:tc>
-          <w:tcPr>
-            <w:tcBorders>
-              <w:bottom w:val="none" w:sz="0" w:space="0" w:color="000000"/>
-              <w:top w:val="none" w:sz="0" w:space="0" w:color="000000"/>
-              <w:left w:val="none" w:sz="0" w:space="0" w:color="000000"/>
-              <w:right w:val="none" w:sz="0" w:space="0" w:color="000000"/>
-            </w:tcBorders>
-            <w:shd w:val="clear" w:color="auto" w:fill="FFFFFF"/>
-            <w:tcMar>
-              <w:top w:w="0" w:type="dxa"/>
-              <w:bottom w:w="0" w:type="dxa"/>
-              <w:left w:w="0" w:type="dxa"/>
-              <w:right w:w="0" w:type="dxa"/>
-            </w:tcMar>
-            <w:vAlign w:val="center"/>
-          </w:tcPr>
-          <w:p>
-            <w:pPr>
-              <w:pStyle w:val="Normal"/>
-              <w:jc w:val="left"/>
-              <w:pBdr>
-                <w:bottom w:val="none" w:sz="0" w:space="0" w:color="000000"/>
-                <w:top w:val="none" w:sz="0" w:space="0" w:color="000000"/>
-                <w:left w:val="none" w:sz="0" w:space="0" w:color="000000"/>
-                <w:right w:val="none" w:sz="0" w:space="0" w:color="000000"/>
-              </w:pBdr>
-              <w:spacing w:after="100" w:before="100" w:line="240"/>
-              <w:ind w:left="100" w:right="100" w:firstLine="0" w:firstLineChars="0"/>
-            </w:pPr>
-            <w:r xmlns:w="http://schemas.openxmlformats.org/wordprocessingml/2006/main" xmlns:wp="http://schemas.openxmlformats.org/drawingml/2006/wordprocessingDrawing" xmlns:r="http://schemas.openxmlformats.org/officeDocument/2006/relationships" xmlns:w14="http://schemas.microsoft.com/office/word/2010/wordml">
-              <w:rPr>
-                <w:rFonts w:ascii="Arial" w:hAnsi="Arial" w:eastAsia="Arial" w:cs="Arial"/>
-                <w:i w:val="false"/>
-                <w:b w:val="false"/>
-                <w:u w:val="none"/>
-                <w:sz w:val="20"/>
-                <w:szCs w:val="20"/>
-                <w:color w:val="000000"/>
-              </w:rPr>
-              <w:t xml:space="preserve">Res</w:t>
-            </w:r>
-          </w:p>
-        </w:tc>
-        <w:tc>
-          <w:tcPr>
-            <w:tcBorders>
-              <w:bottom w:val="none" w:sz="0" w:space="0" w:color="000000"/>
-              <w:top w:val="none" w:sz="0" w:space="0" w:color="000000"/>
-              <w:left w:val="none" w:sz="0" w:space="0" w:color="000000"/>
-              <w:right w:val="none" w:sz="0" w:space="0" w:color="000000"/>
-            </w:tcBorders>
-            <w:shd w:val="clear" w:color="auto" w:fill="FFFFFF"/>
-            <w:tcMar>
-              <w:top w:w="0" w:type="dxa"/>
-              <w:bottom w:w="0" w:type="dxa"/>
-              <w:left w:w="0" w:type="dxa"/>
-              <w:right w:w="0" w:type="dxa"/>
-            </w:tcMar>
-            <w:vAlign w:val="center"/>
-          </w:tcPr>
-          <w:p>
-            <w:pPr>
-              <w:pStyle w:val="Normal"/>
-              <w:jc w:val="right"/>
-              <w:pBdr>
-                <w:bottom w:val="none" w:sz="0" w:space="0" w:color="000000"/>
-                <w:top w:val="none" w:sz="0" w:space="0" w:color="000000"/>
-                <w:left w:val="none" w:sz="0" w:space="0" w:color="000000"/>
-                <w:right w:val="none" w:sz="0" w:space="0" w:color="000000"/>
-              </w:pBdr>
-              <w:spacing w:after="100" w:before="100" w:line="240"/>
-              <w:ind w:left="100" w:right="100" w:firstLine="0" w:firstLineChars="0"/>
-            </w:pPr>
-            <w:r xmlns:w="http://schemas.openxmlformats.org/wordprocessingml/2006/main" xmlns:wp="http://schemas.openxmlformats.org/drawingml/2006/wordprocessingDrawing" xmlns:r="http://schemas.openxmlformats.org/officeDocument/2006/relationships" xmlns:w14="http://schemas.microsoft.com/office/word/2010/wordml">
-              <w:rPr>
-                <w:rFonts w:ascii="Arial" w:hAnsi="Arial" w:eastAsia="Arial" w:cs="Arial"/>
-                <w:i w:val="false"/>
-                <w:b w:val="false"/>
-                <w:u w:val="none"/>
-                <w:sz w:val="20"/>
-                <w:szCs w:val="20"/>
-                <w:color w:val="000000"/>
-              </w:rPr>
-              <w:t xml:space="preserve">4</w:t>
-            </w:r>
-          </w:p>
-        </w:tc>
-        <w:tc>
-          <w:tcPr>
-            <w:tcBorders>
-              <w:bottom w:val="none" w:sz="0" w:space="0" w:color="000000"/>
-              <w:top w:val="none" w:sz="0" w:space="0" w:color="000000"/>
-              <w:left w:val="none" w:sz="0" w:space="0" w:color="000000"/>
-              <w:right w:val="none" w:sz="0" w:space="0" w:color="000000"/>
-            </w:tcBorders>
-            <w:shd w:val="clear" w:color="auto" w:fill="FFFFFF"/>
-            <w:tcMar>
-              <w:top w:w="0" w:type="dxa"/>
-              <w:bottom w:w="0" w:type="dxa"/>
-              <w:left w:w="0" w:type="dxa"/>
-              <w:right w:w="0" w:type="dxa"/>
-            </w:tcMar>
-            <w:vAlign w:val="center"/>
-          </w:tcPr>
-          <w:p>
-            <w:pPr>
-              <w:pStyle w:val="Normal"/>
-              <w:jc w:val="right"/>
-              <w:pBdr>
-                <w:bottom w:val="none" w:sz="0" w:space="0" w:color="000000"/>
-                <w:top w:val="none" w:sz="0" w:space="0" w:color="000000"/>
-                <w:left w:val="none" w:sz="0" w:space="0" w:color="000000"/>
-                <w:right w:val="none" w:sz="0" w:space="0" w:color="000000"/>
-              </w:pBdr>
-              <w:spacing w:after="100" w:before="100" w:line="240"/>
-              <w:ind w:left="100" w:right="100" w:firstLine="0" w:firstLineChars="0"/>
-            </w:pPr>
-            <w:r xmlns:w="http://schemas.openxmlformats.org/wordprocessingml/2006/main" xmlns:wp="http://schemas.openxmlformats.org/drawingml/2006/wordprocessingDrawing" xmlns:r="http://schemas.openxmlformats.org/officeDocument/2006/relationships" xmlns:w14="http://schemas.microsoft.com/office/word/2010/wordml">
-              <w:rPr>
-                <w:rFonts w:ascii="Arial" w:hAnsi="Arial" w:eastAsia="Arial" w:cs="Arial"/>
-                <w:i w:val="false"/>
-                <w:b w:val="false"/>
-                <w:u w:val="none"/>
-                <w:sz w:val="20"/>
-                <w:szCs w:val="20"/>
-                <w:color w:val="000000"/>
-              </w:rPr>
-              <w:t xml:space="preserve">8.94</w:t>
-            </w:r>
-          </w:p>
-        </w:tc>
-        <w:tc>
-          <w:tcPr>
-            <w:tcBorders>
-              <w:bottom w:val="none" w:sz="0" w:space="0" w:color="000000"/>
-              <w:top w:val="none" w:sz="0" w:space="0" w:color="000000"/>
-              <w:left w:val="none" w:sz="0" w:space="0" w:color="000000"/>
-              <w:right w:val="none" w:sz="0" w:space="0" w:color="000000"/>
-            </w:tcBorders>
-            <w:shd w:val="clear" w:color="auto" w:fill="FFFFFF"/>
-            <w:tcMar>
-              <w:top w:w="0" w:type="dxa"/>
-              <w:bottom w:w="0" w:type="dxa"/>
-              <w:left w:w="0" w:type="dxa"/>
-              <w:right w:w="0" w:type="dxa"/>
-            </w:tcMar>
-            <w:vAlign w:val="center"/>
-          </w:tcPr>
-          <w:p>
-            <w:pPr>
-              <w:pStyle w:val="Normal"/>
-              <w:jc w:val="right"/>
-              <w:pBdr>
-                <w:bottom w:val="none" w:sz="0" w:space="0" w:color="000000"/>
-                <w:top w:val="none" w:sz="0" w:space="0" w:color="000000"/>
-                <w:left w:val="none" w:sz="0" w:space="0" w:color="000000"/>
-                <w:right w:val="none" w:sz="0" w:space="0" w:color="000000"/>
-              </w:pBdr>
-              <w:spacing w:after="100" w:before="100" w:line="240"/>
-              <w:ind w:left="100" w:right="100" w:firstLine="0" w:firstLineChars="0"/>
-            </w:pPr>
-            <w:r xmlns:w="http://schemas.openxmlformats.org/wordprocessingml/2006/main" xmlns:wp="http://schemas.openxmlformats.org/drawingml/2006/wordprocessingDrawing" xmlns:r="http://schemas.openxmlformats.org/officeDocument/2006/relationships" xmlns:w14="http://schemas.microsoft.com/office/word/2010/wordml">
-              <w:rPr>
-                <w:rFonts w:ascii="Arial" w:hAnsi="Arial" w:eastAsia="Arial" w:cs="Arial"/>
-                <w:i w:val="false"/>
-                <w:b w:val="false"/>
-                <w:u w:val="none"/>
-                <w:sz w:val="20"/>
-                <w:szCs w:val="20"/>
-                <w:color w:val="000000"/>
-              </w:rPr>
-              <w:t xml:space="preserve">117.84</w:t>
-            </w:r>
-          </w:p>
-        </w:tc>
-        <w:tc>
-          <w:tcPr>
-            <w:tcBorders>
-              <w:bottom w:val="none" w:sz="0" w:space="0" w:color="000000"/>
-              <w:top w:val="none" w:sz="0" w:space="0" w:color="000000"/>
-              <w:left w:val="none" w:sz="0" w:space="0" w:color="000000"/>
-              <w:right w:val="none" w:sz="0" w:space="0" w:color="000000"/>
-            </w:tcBorders>
-            <w:shd w:val="clear" w:color="auto" w:fill="FFFFFF"/>
-            <w:tcMar>
-              <w:top w:w="0" w:type="dxa"/>
-              <w:bottom w:w="0" w:type="dxa"/>
-              <w:left w:w="0" w:type="dxa"/>
-              <w:right w:w="0" w:type="dxa"/>
-            </w:tcMar>
-            <w:vAlign w:val="center"/>
-          </w:tcPr>
-          <w:p>
-            <w:pPr>
-              <w:pStyle w:val="Normal"/>
-              <w:jc w:val="left"/>
-              <w:pBdr>
-                <w:bottom w:val="none" w:sz="0" w:space="0" w:color="000000"/>
-                <w:top w:val="none" w:sz="0" w:space="0" w:color="000000"/>
-                <w:left w:val="none" w:sz="0" w:space="0" w:color="000000"/>
-                <w:right w:val="none" w:sz="0" w:space="0" w:color="000000"/>
-              </w:pBdr>
-              <w:spacing w:after="100" w:before="100" w:line="240"/>
-              <w:ind w:left="100" w:right="100" w:firstLine="0" w:firstLineChars="0"/>
-            </w:pPr>
-            <w:r xmlns:w="http://schemas.openxmlformats.org/wordprocessingml/2006/main" xmlns:wp="http://schemas.openxmlformats.org/drawingml/2006/wordprocessingDrawing" xmlns:r="http://schemas.openxmlformats.org/officeDocument/2006/relationships" xmlns:w14="http://schemas.microsoft.com/office/word/2010/wordml">
-              <w:rPr>
-                <w:rFonts w:ascii="Arial" w:hAnsi="Arial" w:eastAsia="Arial" w:cs="Arial"/>
-                <w:i w:val="false"/>
-                <w:b w:val="false"/>
-                <w:u w:val="none"/>
-                <w:sz w:val="20"/>
-                <w:szCs w:val="20"/>
-                <w:color w:val="000000"/>
-              </w:rPr>
-              <w:t xml:space="preserve">Yes</w:t>
-            </w:r>
-          </w:p>
-        </w:tc>
-        <w:tc>
-          <w:tcPr>
-            <w:tcBorders>
-              <w:bottom w:val="none" w:sz="0" w:space="0" w:color="000000"/>
-              <w:top w:val="none" w:sz="0" w:space="0" w:color="000000"/>
-              <w:left w:val="none" w:sz="0" w:space="0" w:color="000000"/>
-              <w:right w:val="none" w:sz="0" w:space="0" w:color="000000"/>
-            </w:tcBorders>
-            <w:shd w:val="clear" w:color="auto" w:fill="FFFFFF"/>
-            <w:tcMar>
-              <w:top w:w="0" w:type="dxa"/>
-              <w:bottom w:w="0" w:type="dxa"/>
-              <w:left w:w="0" w:type="dxa"/>
-              <w:right w:w="0" w:type="dxa"/>
-            </w:tcMar>
-            <w:vAlign w:val="center"/>
-          </w:tcPr>
-          <w:p>
-            <w:pPr>
-              <w:pStyle w:val="Normal"/>
-              <w:jc w:val="left"/>
-              <w:pBdr>
-                <w:bottom w:val="none" w:sz="0" w:space="0" w:color="000000"/>
-                <w:top w:val="none" w:sz="0" w:space="0" w:color="000000"/>
-                <w:left w:val="none" w:sz="0" w:space="0" w:color="000000"/>
-                <w:right w:val="none" w:sz="0" w:space="0" w:color="000000"/>
-              </w:pBdr>
-              <w:spacing w:after="100" w:before="100" w:line="240"/>
-              <w:ind w:left="100" w:right="100" w:firstLine="0" w:firstLineChars="0"/>
-            </w:pPr>
-            <w:r xmlns:w="http://schemas.openxmlformats.org/wordprocessingml/2006/main" xmlns:wp="http://schemas.openxmlformats.org/drawingml/2006/wordprocessingDrawing" xmlns:r="http://schemas.openxmlformats.org/officeDocument/2006/relationships" xmlns:w14="http://schemas.microsoft.com/office/word/2010/wordml">
-              <w:rPr>
-                <w:rFonts w:ascii="Arial" w:hAnsi="Arial" w:eastAsia="Arial" w:cs="Arial"/>
-                <w:i w:val="false"/>
-                <w:b w:val="false"/>
-                <w:u w:val="none"/>
-                <w:sz w:val="20"/>
-                <w:szCs w:val="20"/>
-                <w:color w:val="000000"/>
-              </w:rPr>
-              <w:t xml:space="preserve">--</w:t>
-            </w:r>
-          </w:p>
-        </w:tc>
-      </w:tr>
-      <w:tr>
-        <w:trPr>
-          <w:trHeight w:val="360" w:hRule="auto"/>
-        </w:trPr>
-        body28
-        <w:tc>
-          <w:tcPr>
-            <w:tcBorders>
-              <w:bottom w:val="single" w:sz="12" w:space="0" w:color="666666"/>
-              <w:top w:val="none" w:sz="0" w:space="0" w:color="000000"/>
-              <w:left w:val="none" w:sz="0" w:space="0" w:color="000000"/>
-              <w:right w:val="none" w:sz="0" w:space="0" w:color="000000"/>
-            </w:tcBorders>
-            <w:shd w:val="clear" w:color="auto" w:fill="FFFFFF"/>
-            <w:tcMar>
-              <w:top w:w="0" w:type="dxa"/>
-              <w:bottom w:w="0" w:type="dxa"/>
-              <w:left w:w="0" w:type="dxa"/>
-              <w:right w:w="0" w:type="dxa"/>
-            </w:tcMar>
-            <w:vAlign w:val="center"/>
-          </w:tcPr>
-          <w:p>
-            <w:pPr>
-              <w:pStyle w:val="Normal"/>
-              <w:jc w:val="left"/>
-              <w:pBdr>
-                <w:bottom w:val="none" w:sz="0" w:space="0" w:color="000000"/>
-                <w:top w:val="none" w:sz="0" w:space="0" w:color="000000"/>
-                <w:left w:val="none" w:sz="0" w:space="0" w:color="000000"/>
-                <w:right w:val="none" w:sz="0" w:space="0" w:color="000000"/>
-              </w:pBdr>
-              <w:spacing w:after="100" w:before="100" w:line="240"/>
-              <w:ind w:left="100" w:right="100" w:firstLine="0" w:firstLineChars="0"/>
-            </w:pPr>
-            <w:r xmlns:w="http://schemas.openxmlformats.org/wordprocessingml/2006/main" xmlns:wp="http://schemas.openxmlformats.org/drawingml/2006/wordprocessingDrawing" xmlns:r="http://schemas.openxmlformats.org/officeDocument/2006/relationships" xmlns:w14="http://schemas.microsoft.com/office/word/2010/wordml">
-              <w:rPr>
-                <w:rFonts w:ascii="Arial" w:hAnsi="Arial" w:eastAsia="Arial" w:cs="Arial"/>
-                <w:i w:val="false"/>
-                <w:b w:val="false"/>
-                <w:u w:val="none"/>
-                <w:sz w:val="20"/>
-                <w:szCs w:val="20"/>
-                <w:color w:val="000000"/>
-              </w:rPr>
-              <w:t xml:space="preserve">reservoir_shackleford</w:t>
-            </w:r>
-          </w:p>
-        </w:tc>
-        <w:tc>
-          <w:tcPr>
-            <w:tcBorders>
-              <w:bottom w:val="single" w:sz="12" w:space="0" w:color="666666"/>
-              <w:top w:val="none" w:sz="0" w:space="0" w:color="000000"/>
-              <w:left w:val="none" w:sz="0" w:space="0" w:color="000000"/>
-              <w:right w:val="none" w:sz="0" w:space="0" w:color="000000"/>
-            </w:tcBorders>
-            <w:shd w:val="clear" w:color="auto" w:fill="FFFFFF"/>
-            <w:tcMar>
-              <w:top w:w="0" w:type="dxa"/>
-              <w:bottom w:w="0" w:type="dxa"/>
-              <w:left w:w="0" w:type="dxa"/>
-              <w:right w:w="0" w:type="dxa"/>
-            </w:tcMar>
-            <w:vAlign w:val="center"/>
-          </w:tcPr>
-          <w:p>
-            <w:pPr>
-              <w:pStyle w:val="Normal"/>
-              <w:jc w:val="left"/>
-              <w:pBdr>
-                <w:bottom w:val="none" w:sz="0" w:space="0" w:color="000000"/>
-                <w:top w:val="none" w:sz="0" w:space="0" w:color="000000"/>
-                <w:left w:val="none" w:sz="0" w:space="0" w:color="000000"/>
-                <w:right w:val="none" w:sz="0" w:space="0" w:color="000000"/>
-              </w:pBdr>
-              <w:spacing w:after="100" w:before="100" w:line="240"/>
-              <w:ind w:left="100" w:right="100" w:firstLine="0" w:firstLineChars="0"/>
-            </w:pPr>
-            <w:r xmlns:w="http://schemas.openxmlformats.org/wordprocessingml/2006/main" xmlns:wp="http://schemas.openxmlformats.org/drawingml/2006/wordprocessingDrawing" xmlns:r="http://schemas.openxmlformats.org/officeDocument/2006/relationships" xmlns:w14="http://schemas.microsoft.com/office/word/2010/wordml">
-              <w:rPr>
-                <w:rFonts w:ascii="Arial" w:hAnsi="Arial" w:eastAsia="Arial" w:cs="Arial"/>
-                <w:i w:val="false"/>
-                <w:b w:val="false"/>
-                <w:u w:val="none"/>
-                <w:sz w:val="20"/>
-                <w:szCs w:val="20"/>
-                <w:color w:val="000000"/>
-              </w:rPr>
-              <w:t xml:space="preserve">Res</w:t>
-            </w:r>
-          </w:p>
-        </w:tc>
-        <w:tc>
-          <w:tcPr>
-            <w:tcBorders>
-              <w:bottom w:val="single" w:sz="12" w:space="0" w:color="666666"/>
-              <w:top w:val="none" w:sz="0" w:space="0" w:color="000000"/>
-              <w:left w:val="none" w:sz="0" w:space="0" w:color="000000"/>
-              <w:right w:val="none" w:sz="0" w:space="0" w:color="000000"/>
-            </w:tcBorders>
-            <w:shd w:val="clear" w:color="auto" w:fill="FFFFFF"/>
-            <w:tcMar>
-              <w:top w:w="0" w:type="dxa"/>
-              <w:bottom w:w="0" w:type="dxa"/>
-              <w:left w:w="0" w:type="dxa"/>
-              <w:right w:w="0" w:type="dxa"/>
-            </w:tcMar>
-            <w:vAlign w:val="center"/>
-          </w:tcPr>
-          <w:p>
-            <w:pPr>
-              <w:pStyle w:val="Normal"/>
-              <w:jc w:val="right"/>
-              <w:pBdr>
-                <w:bottom w:val="none" w:sz="0" w:space="0" w:color="000000"/>
-                <w:top w:val="none" w:sz="0" w:space="0" w:color="000000"/>
-                <w:left w:val="none" w:sz="0" w:space="0" w:color="000000"/>
-                <w:right w:val="none" w:sz="0" w:space="0" w:color="000000"/>
-              </w:pBdr>
-              <w:spacing w:after="100" w:before="100" w:line="240"/>
-              <w:ind w:left="100" w:right="100" w:firstLine="0" w:firstLineChars="0"/>
-            </w:pPr>
-            <w:r xmlns:w="http://schemas.openxmlformats.org/wordprocessingml/2006/main" xmlns:wp="http://schemas.openxmlformats.org/drawingml/2006/wordprocessingDrawing" xmlns:r="http://schemas.openxmlformats.org/officeDocument/2006/relationships" xmlns:w14="http://schemas.microsoft.com/office/word/2010/wordml">
-              <w:rPr>
-                <w:rFonts w:ascii="Arial" w:hAnsi="Arial" w:eastAsia="Arial" w:cs="Arial"/>
-                <w:i w:val="false"/>
-                <w:b w:val="false"/>
-                <w:u w:val="none"/>
-                <w:sz w:val="20"/>
-                <w:szCs w:val="20"/>
-                <w:color w:val="000000"/>
-              </w:rPr>
-              <w:t xml:space="preserve">4</w:t>
-            </w:r>
-          </w:p>
-        </w:tc>
-        <w:tc>
-          <w:tcPr>
-            <w:tcBorders>
-              <w:bottom w:val="single" w:sz="12" w:space="0" w:color="666666"/>
-              <w:top w:val="none" w:sz="0" w:space="0" w:color="000000"/>
-              <w:left w:val="none" w:sz="0" w:space="0" w:color="000000"/>
-              <w:right w:val="none" w:sz="0" w:space="0" w:color="000000"/>
-            </w:tcBorders>
-            <w:shd w:val="clear" w:color="auto" w:fill="FFFFFF"/>
-            <w:tcMar>
-              <w:top w:w="0" w:type="dxa"/>
-              <w:bottom w:w="0" w:type="dxa"/>
-              <w:left w:w="0" w:type="dxa"/>
-              <w:right w:w="0" w:type="dxa"/>
-            </w:tcMar>
-            <w:vAlign w:val="center"/>
-          </w:tcPr>
-          <w:p>
-            <w:pPr>
-              <w:pStyle w:val="Normal"/>
-              <w:jc w:val="right"/>
-              <w:pBdr>
-                <w:bottom w:val="none" w:sz="0" w:space="0" w:color="000000"/>
-                <w:top w:val="none" w:sz="0" w:space="0" w:color="000000"/>
-                <w:left w:val="none" w:sz="0" w:space="0" w:color="000000"/>
-                <w:right w:val="none" w:sz="0" w:space="0" w:color="000000"/>
-              </w:pBdr>
-              <w:spacing w:after="100" w:before="100" w:line="240"/>
-              <w:ind w:left="100" w:right="100" w:firstLine="0" w:firstLineChars="0"/>
-            </w:pPr>
-            <w:r xmlns:w="http://schemas.openxmlformats.org/wordprocessingml/2006/main" xmlns:wp="http://schemas.openxmlformats.org/drawingml/2006/wordprocessingDrawing" xmlns:r="http://schemas.openxmlformats.org/officeDocument/2006/relationships" xmlns:w14="http://schemas.microsoft.com/office/word/2010/wordml">
-              <w:rPr>
-                <w:rFonts w:ascii="Arial" w:hAnsi="Arial" w:eastAsia="Arial" w:cs="Arial"/>
-                <w:i w:val="false"/>
-                <w:b w:val="false"/>
-                <w:u w:val="none"/>
-                <w:sz w:val="20"/>
-                <w:szCs w:val="20"/>
-                <w:color w:val="000000"/>
-              </w:rPr>
-              <w:t xml:space="preserve">8.83</w:t>
-            </w:r>
-          </w:p>
-        </w:tc>
-        <w:tc>
-          <w:tcPr>
-            <w:tcBorders>
-              <w:bottom w:val="single" w:sz="12" w:space="0" w:color="666666"/>
-              <w:top w:val="none" w:sz="0" w:space="0" w:color="000000"/>
-              <w:left w:val="none" w:sz="0" w:space="0" w:color="000000"/>
-              <w:right w:val="none" w:sz="0" w:space="0" w:color="000000"/>
-            </w:tcBorders>
-            <w:shd w:val="clear" w:color="auto" w:fill="FFFFFF"/>
-            <w:tcMar>
-              <w:top w:w="0" w:type="dxa"/>
-              <w:bottom w:w="0" w:type="dxa"/>
-              <w:left w:w="0" w:type="dxa"/>
-              <w:right w:w="0" w:type="dxa"/>
-            </w:tcMar>
-            <w:vAlign w:val="center"/>
-          </w:tcPr>
-          <w:p>
-            <w:pPr>
-              <w:pStyle w:val="Normal"/>
-              <w:jc w:val="right"/>
-              <w:pBdr>
-                <w:bottom w:val="none" w:sz="0" w:space="0" w:color="000000"/>
-                <w:top w:val="none" w:sz="0" w:space="0" w:color="000000"/>
-                <w:left w:val="none" w:sz="0" w:space="0" w:color="000000"/>
-                <w:right w:val="none" w:sz="0" w:space="0" w:color="000000"/>
-              </w:pBdr>
-              <w:spacing w:after="100" w:before="100" w:line="240"/>
-              <w:ind w:left="100" w:right="100" w:firstLine="0" w:firstLineChars="0"/>
-            </w:pPr>
-            <w:r xmlns:w="http://schemas.openxmlformats.org/wordprocessingml/2006/main" xmlns:wp="http://schemas.openxmlformats.org/drawingml/2006/wordprocessingDrawing" xmlns:r="http://schemas.openxmlformats.org/officeDocument/2006/relationships" xmlns:w14="http://schemas.microsoft.com/office/word/2010/wordml">
-              <w:rPr>
-                <w:rFonts w:ascii="Arial" w:hAnsi="Arial" w:eastAsia="Arial" w:cs="Arial"/>
-                <w:i w:val="false"/>
-                <w:b w:val="false"/>
-                <w:u w:val="none"/>
-                <w:sz w:val="20"/>
-                <w:szCs w:val="20"/>
-                <w:color w:val="000000"/>
-              </w:rPr>
-              <w:t xml:space="preserve">117.98</w:t>
-            </w:r>
-          </w:p>
-        </w:tc>
-        <w:tc>
-          <w:tcPr>
-            <w:tcBorders>
-              <w:bottom w:val="single" w:sz="12" w:space="0" w:color="666666"/>
-              <w:top w:val="none" w:sz="0" w:space="0" w:color="000000"/>
-              <w:left w:val="none" w:sz="0" w:space="0" w:color="000000"/>
-              <w:right w:val="none" w:sz="0" w:space="0" w:color="000000"/>
-            </w:tcBorders>
-            <w:shd w:val="clear" w:color="auto" w:fill="FFFFFF"/>
-            <w:tcMar>
-              <w:top w:w="0" w:type="dxa"/>
-              <w:bottom w:w="0" w:type="dxa"/>
-              <w:left w:w="0" w:type="dxa"/>
-              <w:right w:w="0" w:type="dxa"/>
-            </w:tcMar>
-            <w:vAlign w:val="center"/>
-          </w:tcPr>
-          <w:p>
-            <w:pPr>
-              <w:pStyle w:val="Normal"/>
-              <w:jc w:val="left"/>
-              <w:pBdr>
-                <w:bottom w:val="none" w:sz="0" w:space="0" w:color="000000"/>
-                <w:top w:val="none" w:sz="0" w:space="0" w:color="000000"/>
-                <w:left w:val="none" w:sz="0" w:space="0" w:color="000000"/>
-                <w:right w:val="none" w:sz="0" w:space="0" w:color="000000"/>
-              </w:pBdr>
-              <w:spacing w:after="100" w:before="100" w:line="240"/>
-              <w:ind w:left="100" w:right="100" w:firstLine="0" w:firstLineChars="0"/>
-            </w:pPr>
-            <w:r xmlns:w="http://schemas.openxmlformats.org/wordprocessingml/2006/main" xmlns:wp="http://schemas.openxmlformats.org/drawingml/2006/wordprocessingDrawing" xmlns:r="http://schemas.openxmlformats.org/officeDocument/2006/relationships" xmlns:w14="http://schemas.microsoft.com/office/word/2010/wordml">
-              <w:rPr>
-                <w:rFonts w:ascii="Arial" w:hAnsi="Arial" w:eastAsia="Arial" w:cs="Arial"/>
-                <w:i w:val="false"/>
-                <w:b w:val="false"/>
-                <w:u w:val="none"/>
-                <w:sz w:val="20"/>
-                <w:szCs w:val="20"/>
-                <w:color w:val="000000"/>
-              </w:rPr>
-              <w:t xml:space="preserve">Yes</w:t>
-            </w:r>
-          </w:p>
-        </w:tc>
-        <w:tc>
-          <w:tcPr>
-            <w:tcBorders>
-              <w:bottom w:val="single" w:sz="12" w:space="0" w:color="666666"/>
-              <w:top w:val="none" w:sz="0" w:space="0" w:color="000000"/>
-              <w:left w:val="none" w:sz="0" w:space="0" w:color="000000"/>
-              <w:right w:val="none" w:sz="0" w:space="0" w:color="000000"/>
-            </w:tcBorders>
-            <w:shd w:val="clear" w:color="auto" w:fill="FFFFFF"/>
-            <w:tcMar>
-              <w:top w:w="0" w:type="dxa"/>
-              <w:bottom w:w="0" w:type="dxa"/>
-              <w:left w:w="0" w:type="dxa"/>
-              <w:right w:w="0" w:type="dxa"/>
-            </w:tcMar>
-            <w:vAlign w:val="center"/>
-          </w:tcPr>
-          <w:p>
-            <w:pPr>
-              <w:pStyle w:val="Normal"/>
-              <w:jc w:val="left"/>
-              <w:pBdr>
-                <w:bottom w:val="none" w:sz="0" w:space="0" w:color="000000"/>
-                <w:top w:val="none" w:sz="0" w:space="0" w:color="000000"/>
-                <w:left w:val="none" w:sz="0" w:space="0" w:color="000000"/>
-                <w:right w:val="none" w:sz="0" w:space="0" w:color="000000"/>
-              </w:pBdr>
-              <w:spacing w:after="100" w:before="100" w:line="240"/>
-              <w:ind w:left="100" w:right="100" w:firstLine="0" w:firstLineChars="0"/>
-            </w:pPr>
-            <w:r xmlns:w="http://schemas.openxmlformats.org/wordprocessingml/2006/main" xmlns:wp="http://schemas.openxmlformats.org/drawingml/2006/wordprocessingDrawing" xmlns:r="http://schemas.openxmlformats.org/officeDocument/2006/relationships" xmlns:w14="http://schemas.microsoft.com/office/word/2010/wordml">
-              <w:rPr>
-                <w:rFonts w:ascii="Arial" w:hAnsi="Arial" w:eastAsia="Arial" w:cs="Arial"/>
-                <w:i w:val="false"/>
-                <w:b w:val="false"/>
-                <w:u w:val="none"/>
-                <w:sz w:val="20"/>
-                <w:szCs w:val="20"/>
-                <w:color w:val="000000"/>
-              </w:rPr>
               <w:t xml:space="preserve">--</w:t>
             </w:r>
           </w:p>
         </w:tc>
       </w:tr>
     </w:tbl>
-    <w:bookmarkEnd w:id="67"/>
-    <w:bookmarkStart w:id="72" w:name="X5717be130d28923be971a1bdea556d769a5487a"/>
+    <w:bookmarkEnd w:id="68"/>
+    <w:bookmarkStart w:id="73" w:name="X5717be130d28923be971a1bdea556d769a5487a"/>
     <w:p>
       <w:pPr>
         <w:pStyle w:val="Heading2"/>
@@ -17805,7 +17323,7 @@
         <w:pStyle w:val="BodyText"/>
       </w:pPr>
       <w:r>
-        <w:t xml:space="preserve">For all other scenarios, trade-off efficiencies ranged from -0.42 to 0.9 when averaged over all years(Table</w:t>
+        <w:t xml:space="preserve">For all other scenarios, trade-off efficiencies ranged from -20.85 to 0.4 when averaged over all years(Table</w:t>
       </w:r>
       <w:r>
         <w:t xml:space="preserve"> </w:t>
@@ -17814,7 +17332,7 @@
         <w:t xml:space="preserve">5</w:t>
       </w:r>
       <w:r>
-        <w:t xml:space="preserve">). The range covers two orders of magnitude because the denominator of the ratio, lost ET, ranges from 0% to 100%, while the HB gains fall more narrowly between 0% to 2.2%. Efficiencies greater than 1 indicate that a scenario produces more than a 1% increase in HB value per 1% loss in ET value. However, because the HB and ET units are non-commensurable, the absolute value of the trade-off efficiency is not of great significance; the trade-off efficiency metric is most useful for scenario comparisons.</w:t>
+        <w:t xml:space="preserve">). The range covers two orders of magnitude because the denominator of the ratio, lost ET, ranges from 0% to 100%, while the HB gains fall more narrowly between -0.7% to 6.3%. Efficiencies greater than 1 indicate that a scenario produces more than a 1% increase in HB value per 1% loss in ET value. However, because the HB and ET units are non-commensurable, the absolute value of the trade-off efficiency is not of great significance; the trade-off efficiency metric is most useful for scenario comparisons.</w:t>
       </w:r>
     </w:p>
     <w:p>
@@ -17843,7 +17361,7 @@
         <w:t xml:space="preserve">7</w:t>
       </w:r>
       <w:r>
-        <w:t xml:space="preserve">). These scenarios can produce substantial HB gains (ranging from 5 to 193) coho spf-equiv., but result in severe agricultural productivity reductions (0.9% to 100%). The</w:t>
+        <w:t xml:space="preserve">). These scenarios can produce substantial HB gains (ranging from 0 to 3) coho spf-equiv., but result in severe agricultural productivity reductions (-0.3% to 100%). The</w:t>
       </w:r>
       <w:r>
         <w:t xml:space="preserve"> </w:t>
@@ -17855,7 +17373,7 @@
         <w:t xml:space="preserve"> </w:t>
       </w:r>
       <w:r>
-        <w:t xml:space="preserve">scenarios, which have an all-years trade-off efficiency greater than 1 (the Enhanced Recharge, Low Flow Diversion Limits, Irrigation Efficiency and Alfalfa Irrigation scenarios), tend to be associated with a small ET cost relative to basecase (-0.2 to -0.2 million m</w:t>
+        <w:t xml:space="preserve">scenarios, which have an all-years trade-off efficiency greater than 1 (the Enhanced Recharge, Low Flow Diversion Limits, Irrigation Efficiency and Alfalfa Irrigation scenarios), tend to be associated with a small ET cost relative to basecase (-0.1 to -0.1 million m</w:t>
       </w:r>
       <w:r>
         <w:rPr>
@@ -17864,7 +17382,7 @@
         <w:t xml:space="preserve">3</w:t>
       </w:r>
       <w:r>
-        <w:t xml:space="preserve">, or -0.2 to -0.2 percent of basecase crop ET).</w:t>
+        <w:t xml:space="preserve">, or -0.1 to -0.1 percent of basecase crop ET).</w:t>
       </w:r>
     </w:p>
     <w:p>
@@ -17896,18 +17414,18 @@
           <wp:inline>
             <wp:extent cx="5334000" cy="4000499"/>
             <wp:effectExtent b="0" l="0" r="0" t="0"/>
-            <wp:docPr descr="Figure 7:  Scenario trade-off efficiencies, or average HB value (a proxy for environmental benefit) gained per crop ET value lost (a proxy for farmer cost) (normalized to average basecase HB and ET values, respectively), in all 35 years. Basecase, Reservoir scenarios and Enhanced Recharge scenarios are not included as they have on average no or negative ET loss, producing infinite or negative efficiency values." title="" id="69" name="Picture"/>
+            <wp:docPr descr="Figure 7:  Scenario trade-off efficiencies, or average HB value (a proxy for environmental benefit) gained per crop ET value lost (a proxy for farmer cost) (normalized to average basecase HB and ET values, respectively), in all 35 years. Basecase, Reservoir scenarios and Enhanced Recharge scenarios are not included as they have on average no or negative ET loss, producing infinite or negative efficiency values." title="" id="70" name="Picture"/>
             <a:graphic>
               <a:graphicData uri="http://schemas.openxmlformats.org/drawingml/2006/picture">
                 <pic:pic>
                   <pic:nvPicPr>
-                    <pic:cNvPr descr="Graphics%20and%20Supplements/Figure%207.png" id="70" name="Picture"/>
+                    <pic:cNvPr descr="Graphics%20and%20Supplements/Figure%207.png" id="71" name="Picture"/>
                     <pic:cNvPicPr>
                       <a:picLocks noChangeArrowheads="1" noChangeAspect="1"/>
                     </pic:cNvPicPr>
                   </pic:nvPicPr>
                   <pic:blipFill>
-                    <a:blip r:embed="rId68"/>
+                    <a:blip r:embed="rId69"/>
                     <a:stretch>
                       <a:fillRect/>
                     </a:stretch>
@@ -17938,8 +17456,8 @@
       <w:pPr>
         <w:pStyle w:val="ImageCaption"/>
       </w:pPr>
-      <w:bookmarkStart w:id="71" w:name="fig:efficiency"/>
-      <w:bookmarkEnd w:id="71"/>
+      <w:bookmarkStart w:id="72" w:name="fig:efficiency"/>
+      <w:bookmarkEnd w:id="72"/>
       <w:r>
         <w:t xml:space="preserve">Figure 7:</w:t>
       </w:r>
@@ -17953,8 +17471,8 @@
         <w:t xml:space="preserve">Scenario trade-off efficiencies, or average HB value (a proxy for environmental benefit) gained per crop ET value lost (a proxy for farmer cost) (normalized to average basecase HB and ET values, respectively), in all 35 years. Basecase, Reservoir scenarios and Enhanced Recharge scenarios are not included as they have on average no or negative ET loss, producing infinite or negative efficiency values.</w:t>
       </w:r>
     </w:p>
-    <w:bookmarkEnd w:id="72"/>
-    <w:bookmarkStart w:id="78" w:name="Xfbc83626841bb94e70b2ed42e58f7fe62bf81a6"/>
+    <w:bookmarkEnd w:id="73"/>
+    <w:bookmarkStart w:id="79" w:name="Xfbc83626841bb94e70b2ed42e58f7fe62bf81a6"/>
     <w:p>
       <w:pPr>
         <w:pStyle w:val="Heading2"/>
@@ -18046,7 +17564,7 @@
         <w:t xml:space="preserve">(Siskiyou County 2021)</w:t>
       </w:r>
       <w:r>
-        <w:t xml:space="preserve">. Management actions considered in the GSP have some analogs in the set of 40 simulated scenarios.</w:t>
+        <w:t xml:space="preserve">. Management actions considered in the GSP have some analogs in the set of 25 simulated scenarios.</w:t>
       </w:r>
     </w:p>
     <w:p>
@@ -18109,18 +17627,18 @@
           <wp:inline>
             <wp:extent cx="4038600" cy="4019550"/>
             <wp:effectExtent b="0" l="0" r="0" t="0"/>
-            <wp:docPr descr="Figure 8:  A three-dimensional scatter plot of the objective function values for basecase and 39 management scenarios, averaged over 28 water years (1991-2018). Larger spheres are shown for the Pareto-optimal set of scenarios. Scenario colors correspond to legend in Figures 6 and 7." title="" id="74" name="Picture"/>
+            <wp:docPr descr="Figure 8:  A three-dimensional scatter plot of the objective function values for basecase and 39 management scenarios, averaged over 28 water years (1991-2018). Larger spheres are shown for the Pareto-optimal set of scenarios. Scenario colors correspond to legend in Figures 6 and 7." title="" id="75" name="Picture"/>
             <a:graphic>
               <a:graphicData uri="http://schemas.openxmlformats.org/drawingml/2006/picture">
                 <pic:pic>
                   <pic:nvPicPr>
-                    <pic:cNvPr descr="Graphics%20and%20Supplements/hbf%20et%20infra%20plot3d_2025.11.04.jpg" id="75" name="Picture"/>
+                    <pic:cNvPr descr="Graphics%20and%20Supplements/hbf%20et%20infra%20plot3d_2025.11.04.jpg" id="76" name="Picture"/>
                     <pic:cNvPicPr>
                       <a:picLocks noChangeArrowheads="1" noChangeAspect="1"/>
                     </pic:cNvPicPr>
                   </pic:nvPicPr>
                   <pic:blipFill>
-                    <a:blip r:embed="rId73"/>
+                    <a:blip r:embed="rId74"/>
                     <a:stretch>
                       <a:fillRect/>
                     </a:stretch>
@@ -18151,8 +17669,8 @@
       <w:pPr>
         <w:pStyle w:val="ImageCaption"/>
       </w:pPr>
-      <w:bookmarkStart w:id="76" w:name="fig:farmerFishInfraFigure3D"/>
-      <w:bookmarkEnd w:id="76"/>
+      <w:bookmarkStart w:id="77" w:name="fig:farmerFishInfraFigure3D"/>
+      <w:bookmarkEnd w:id="77"/>
       <w:r>
         <w:t xml:space="preserve">Figure 8:</w:t>
       </w:r>
@@ -18170,8 +17688,8 @@
       <w:pPr>
         <w:pStyle w:val="TableCaption"/>
       </w:pPr>
-      <w:bookmarkStart w:id="77" w:name="tab:gspMgmtList"/>
-      <w:bookmarkEnd w:id="77"/>
+      <w:bookmarkStart w:id="78" w:name="tab:gspMgmtList"/>
+      <w:bookmarkEnd w:id="78"/>
       <w:r>
         <w:t xml:space="preserve">Table 6:</w:t>
       </w:r>
@@ -18179,7 +17697,7 @@
         <w:t xml:space="preserve"> </w:t>
       </w:r>
       <w:r>
-        <w:t xml:space="preserve">List of management actions in Chapter 4 of the GSP and analogues in the set of 40 simulated scenarios. The Tier indicate the priority given to each management action, though the Tier also incorporates information about difficulty of implementation (hence Reservoirs being placed in Tier 3).</w:t>
+        <w:t xml:space="preserve">List of management actions in Chapter 4 of the GSP and analogues in the set of 25 simulated scenarios. The Tier indicate the priority given to each management action, though the Tier also incorporates information about difficulty of implementation (hence Reservoirs being placed in Tier 3).</w:t>
       </w:r>
     </w:p>
     <w:tbl xmlns:w="http://schemas.openxmlformats.org/wordprocessingml/2006/main" xmlns:r="http://schemas.openxmlformats.org/officeDocument/2006/relationships" xmlns:w14="http://schemas.microsoft.com/office/word/2010/wordml" xmlns:wp="http://schemas.openxmlformats.org/drawingml/2006/wordprocessingDrawing" xmlns:a="http://schemas.openxmlformats.org/drawingml/2006/main" xmlns:pic="http://schemas.openxmlformats.org/drawingml/2006/picture">
@@ -18599,7 +18117,7 @@
                 <w:szCs w:val="22"/>
                 <w:color w:val="000000"/>
               </w:rPr>
-              <w:t xml:space="preserve">8969.3</w:t>
+              <w:t xml:space="preserve">49.05</w:t>
             </w:r>
           </w:p>
         </w:tc>
@@ -18825,7 +18343,7 @@
                 <w:szCs w:val="22"/>
                 <w:color w:val="000000"/>
               </w:rPr>
-              <w:t xml:space="preserve">8969.3</w:t>
+              <w:t xml:space="preserve">49.05</w:t>
             </w:r>
           </w:p>
         </w:tc>
@@ -19051,7 +18569,7 @@
                 <w:szCs w:val="22"/>
                 <w:color w:val="000000"/>
               </w:rPr>
-              <w:t xml:space="preserve">8918.99-8980.85</w:t>
+              <w:t xml:space="preserve">49.45-49.56</w:t>
             </w:r>
           </w:p>
         </w:tc>
@@ -19277,7 +18795,7 @@
                 <w:szCs w:val="22"/>
                 <w:color w:val="000000"/>
               </w:rPr>
-              <w:t xml:space="preserve">8918.99-8980.85</w:t>
+              <w:t xml:space="preserve">49.45-49.56</w:t>
             </w:r>
           </w:p>
         </w:tc>
@@ -19527,7 +19045,7 @@
                 <w:szCs w:val="22"/>
                 <w:color w:val="000000"/>
               </w:rPr>
-              <w:t xml:space="preserve">8913.94</w:t>
+              <w:t xml:space="preserve">49.34</w:t>
             </w:r>
           </w:p>
         </w:tc>
@@ -19753,7 +19271,7 @@
                 <w:szCs w:val="22"/>
                 <w:color w:val="000000"/>
               </w:rPr>
-              <w:t xml:space="preserve">8913.94</w:t>
+              <w:t xml:space="preserve">49.34</w:t>
             </w:r>
           </w:p>
         </w:tc>
@@ -19979,7 +19497,7 @@
                 <w:szCs w:val="22"/>
                 <w:color w:val="000000"/>
               </w:rPr>
-              <w:t xml:space="preserve">8927.44-9107.38</w:t>
+              <w:t xml:space="preserve">49.33-52.47</w:t>
             </w:r>
           </w:p>
         </w:tc>
@@ -20205,7 +19723,7 @@
                 <w:szCs w:val="22"/>
                 <w:color w:val="000000"/>
               </w:rPr>
-              <w:t xml:space="preserve">8936.9-8997.56</w:t>
+              <w:t xml:space="preserve">49.57-50.06</w:t>
             </w:r>
           </w:p>
         </w:tc>
@@ -20431,7 +19949,7 @@
                 <w:szCs w:val="22"/>
                 <w:color w:val="000000"/>
               </w:rPr>
-              <w:t xml:space="preserve">8913.94</w:t>
+              <w:t xml:space="preserve">49.34</w:t>
             </w:r>
           </w:p>
         </w:tc>
@@ -20657,7 +20175,7 @@
                 <w:szCs w:val="22"/>
                 <w:color w:val="000000"/>
               </w:rPr>
-              <w:t xml:space="preserve">8834.44-9002.95</w:t>
+              <w:t xml:space="preserve">49.18-50.22</w:t>
             </w:r>
           </w:p>
         </w:tc>
@@ -20883,7 +20401,7 @@
                 <w:szCs w:val="22"/>
                 <w:color w:val="000000"/>
               </w:rPr>
-              <w:t xml:space="preserve">8958.62-9097.57</w:t>
+              <w:t xml:space="preserve">49.52-50.79</w:t>
             </w:r>
           </w:p>
         </w:tc>
@@ -21109,7 +20627,7 @@
                 <w:szCs w:val="22"/>
                 <w:color w:val="000000"/>
               </w:rPr>
-              <w:t xml:space="preserve">8969.3</w:t>
+              <w:t xml:space="preserve">49.05</w:t>
             </w:r>
           </w:p>
         </w:tc>
@@ -21164,9 +20682,9 @@
         <w:br w:type="page"/>
       </w:r>
     </w:p>
-    <w:bookmarkEnd w:id="78"/>
     <w:bookmarkEnd w:id="79"/>
-    <w:bookmarkStart w:id="85" w:name="discussion"/>
+    <w:bookmarkEnd w:id="80"/>
+    <w:bookmarkStart w:id="86" w:name="discussion"/>
     <w:p>
       <w:pPr>
         <w:pStyle w:val="Heading1"/>
@@ -21213,7 +20731,7 @@
         <w:t xml:space="preserve">]. Though the ultimate future effect of these management actions would depend on climate variability and implementation details that have not been explicitly simulated (e.g., the precise location of pumps needed to divert surface water for the expanded enhanced recharge scenarios), it is possible to use objective functions and historical climate records to draw some high-level findings regarding their relative merits.</w:t>
       </w:r>
     </w:p>
-    <w:bookmarkStart w:id="80" w:name="Xa151cb59b4ad5c02348e31b83bab4d8169de230"/>
+    <w:bookmarkStart w:id="81" w:name="Xa151cb59b4ad5c02348e31b83bab4d8169de230"/>
     <w:p>
       <w:pPr>
         <w:pStyle w:val="Heading2"/>
@@ -21290,8 +20808,8 @@
         <w:t xml:space="preserve">These predicted on-the-ground consequences can facilitate interpretation of scenario results.</w:t>
       </w:r>
     </w:p>
-    <w:bookmarkEnd w:id="80"/>
-    <w:bookmarkStart w:id="81" w:name="Xeb4407dfc59ea709d91a13199c8e469abf09cea"/>
+    <w:bookmarkEnd w:id="81"/>
+    <w:bookmarkStart w:id="82" w:name="Xeb4407dfc59ea709d91a13199c8e469abf09cea"/>
     <w:p>
       <w:pPr>
         <w:pStyle w:val="Heading2"/>
@@ -21387,8 +20905,8 @@
         <w:t xml:space="preserve">), the low-coho year HB performance of various model scenarios is a key scenario differentiator.</w:t>
       </w:r>
     </w:p>
-    <w:bookmarkEnd w:id="81"/>
-    <w:bookmarkStart w:id="82" w:name="environmental-agricultural-trade-offs"/>
+    <w:bookmarkEnd w:id="82"/>
+    <w:bookmarkStart w:id="83" w:name="environmental-agricultural-trade-offs"/>
     <w:p>
       <w:pPr>
         <w:pStyle w:val="Heading2"/>
@@ -21664,8 +21182,8 @@
         <w:t xml:space="preserve">).</w:t>
       </w:r>
     </w:p>
-    <w:bookmarkEnd w:id="82"/>
-    <w:bookmarkStart w:id="83" w:name="Xb48c0b1c357814727cacf50afe35e98b0bf92dd"/>
+    <w:bookmarkEnd w:id="83"/>
+    <w:bookmarkStart w:id="84" w:name="Xb48c0b1c357814727cacf50afe35e98b0bf92dd"/>
     <w:p>
       <w:pPr>
         <w:pStyle w:val="Heading2"/>
@@ -21688,7 +21206,20 @@
         <w:pStyle w:val="FirstParagraph"/>
       </w:pPr>
       <w:r>
-        <w:t xml:space="preserve">Within the proposed suite of management actions, more than half (25 of 40, including the basecase) fall within the Pareto-optimal set based on the infrastructure category and the 28-year average values of objective functions. This same set remains Pareto-optimal when the objective functions are averaged only over the six low-coho water years, with one exception (the French Creek reservoir scenario is Pareto-optimal when averaged in all years, but not in low-coho years).</w:t>
+        <w:t xml:space="preserve">Within the proposed suite of management actions, more than half (</w:t>
+      </w:r>
+      <w:r>
+        <w:rPr>
+          <w:b/>
+          <w:bCs/>
+        </w:rPr>
+        <w:t xml:space="preserve">25</w:t>
+      </w:r>
+      <w:r>
+        <w:t xml:space="preserve"> </w:t>
+      </w:r>
+      <w:r>
+        <w:t xml:space="preserve">of 25, including the basecase) fall within the Pareto-optimal set based on the infrastructure category and the 28-year average values of objective functions. This same set remains Pareto-optimal when the objective functions are averaged only over the six low-coho water years, with one exception (the French Creek reservoir scenario is Pareto-optimal when averaged in all years, but not in low-coho years).</w:t>
       </w:r>
     </w:p>
     <w:p>
@@ -21760,8 +21291,8 @@
         <w:t xml:space="preserve">). Although the GSP management priorities emphasized infrastructure, in a strict application of these objective functions, both infrastructure-based and regulatory approaches fell within the Pareto-optimal set of management options.</w:t>
       </w:r>
     </w:p>
-    <w:bookmarkEnd w:id="83"/>
-    <w:bookmarkStart w:id="84" w:name="policy-implications"/>
+    <w:bookmarkEnd w:id="84"/>
+    <w:bookmarkStart w:id="85" w:name="policy-implications"/>
     <w:p>
       <w:pPr>
         <w:pStyle w:val="Heading2"/>
@@ -21879,9 +21410,9 @@
         <w:t xml:space="preserve">).</w:t>
       </w:r>
     </w:p>
-    <w:bookmarkEnd w:id="84"/>
     <w:bookmarkEnd w:id="85"/>
-    <w:bookmarkStart w:id="86" w:name="conclusion"/>
+    <w:bookmarkEnd w:id="86"/>
+    <w:bookmarkStart w:id="87" w:name="conclusion"/>
     <w:p>
       <w:pPr>
         <w:pStyle w:val="Heading1"/>
@@ -21904,7 +21435,7 @@
         <w:pStyle w:val="FirstParagraph"/>
       </w:pPr>
       <w:r>
-        <w:t xml:space="preserve">In this study, functions quantifying the achievement of the two management objectives (environmental and agricultural) were applied to 40 simulated management scenarios (including a historical basecase). In addition, scenarios were assigned a categorical proxy for new infrastructure costs. We used these numerical values to quantitatively explore trade-offs in environmental and agricultural benefit among the suite of proposed actions.</w:t>
+        <w:t xml:space="preserve">In this study, functions quantifying the achievement of the two management objectives (environmental and agricultural) were applied to 25 simulated management scenarios (including a historical basecase). In addition, scenarios were assigned a categorical proxy for new infrastructure costs. We used these numerical values to quantitatively explore trade-offs in environmental and agricultural benefit among the suite of proposed actions.</w:t>
       </w:r>
     </w:p>
     <w:p>
@@ -21945,8 +21476,8 @@
         <w:br w:type="page"/>
       </w:r>
     </w:p>
-    <w:bookmarkEnd w:id="86"/>
-    <w:bookmarkStart w:id="87" w:name="acknowledgments"/>
+    <w:bookmarkEnd w:id="87"/>
+    <w:bookmarkStart w:id="88" w:name="acknowledgments"/>
     <w:p>
       <w:pPr>
         <w:pStyle w:val="Heading1"/>
@@ -21955,8 +21486,8 @@
         <w:t xml:space="preserve">Acknowledgments</w:t>
       </w:r>
     </w:p>
-    <w:bookmarkEnd w:id="87"/>
-    <w:bookmarkStart w:id="137" w:name="references"/>
+    <w:bookmarkEnd w:id="88"/>
+    <w:bookmarkStart w:id="143" w:name="references"/>
     <w:p>
       <w:pPr>
         <w:pStyle w:val="Heading1"/>
@@ -21974,8 +21505,8 @@
         <w:t xml:space="preserve">References</w:t>
       </w:r>
     </w:p>
-    <w:bookmarkStart w:id="136" w:name="refs"/>
-    <w:bookmarkStart w:id="89" w:name="ref-BorkHirokawaTrends2021"/>
+    <w:bookmarkStart w:id="142" w:name="refs"/>
+    <w:bookmarkStart w:id="90" w:name="ref-BorkHirokawaTrends2021"/>
     <w:p>
       <w:pPr>
         <w:pStyle w:val="Bibliography"/>
@@ -22017,7 +21548,7 @@
       <w:r>
         <w:t xml:space="preserve"> </w:t>
       </w:r>
-      <w:hyperlink r:id="rId88">
+      <w:hyperlink r:id="rId89">
         <w:r>
           <w:rPr>
             <w:rStyle w:val="Hyperlink"/>
@@ -22029,8 +21560,8 @@
         <w:t xml:space="preserve">.</w:t>
       </w:r>
     </w:p>
-    <w:bookmarkEnd w:id="89"/>
-    <w:bookmarkStart w:id="91" w:name="ref-BrownEtAlHistorical1994"/>
+    <w:bookmarkEnd w:id="90"/>
+    <w:bookmarkStart w:id="92" w:name="ref-BrownEtAlHistorical1994"/>
     <w:p>
       <w:pPr>
         <w:pStyle w:val="Bibliography"/>
@@ -22108,7 +21639,7 @@
       <w:r>
         <w:t xml:space="preserve"> </w:t>
       </w:r>
-      <w:hyperlink r:id="rId90">
+      <w:hyperlink r:id="rId91">
         <w:r>
           <w:rPr>
             <w:rStyle w:val="Hyperlink"/>
@@ -22120,8 +21651,8 @@
         <w:t xml:space="preserve">.</w:t>
       </w:r>
     </w:p>
-    <w:bookmarkEnd w:id="91"/>
-    <w:bookmarkStart w:id="92" w:name="X534406a913d453049af97ddf853e5acf00f7d45"/>
+    <w:bookmarkEnd w:id="92"/>
+    <w:bookmarkStart w:id="93" w:name="X534406a913d453049af97ddf853e5acf00f7d45"/>
     <w:p>
       <w:pPr>
         <w:pStyle w:val="Bibliography"/>
@@ -22151,8 +21682,8 @@
         <w:t xml:space="preserve">.”</w:t>
       </w:r>
     </w:p>
-    <w:bookmarkEnd w:id="92"/>
-    <w:bookmarkStart w:id="93" w:name="Xc89eae4adec15389bd12509e9457a9dc8c09d75"/>
+    <w:bookmarkEnd w:id="93"/>
+    <w:bookmarkStart w:id="94" w:name="Xc89eae4adec15389bd12509e9457a9dc8c09d75"/>
     <w:p>
       <w:pPr>
         <w:pStyle w:val="Bibliography"/>
@@ -22197,8 +21728,8 @@
         <w:t xml:space="preserve">.”</w:t>
       </w:r>
     </w:p>
-    <w:bookmarkEnd w:id="93"/>
-    <w:bookmarkStart w:id="94" w:name="X7c5765d4bf46367820355fe718939efb3be661f"/>
+    <w:bookmarkEnd w:id="94"/>
+    <w:bookmarkStart w:id="95" w:name="X7c5765d4bf46367820355fe718939efb3be661f"/>
     <w:p>
       <w:pPr>
         <w:pStyle w:val="Bibliography"/>
@@ -22259,8 +21790,8 @@
         <w:t xml:space="preserve">. https://data.cnra.ca.gov/dataset/statewide-crop-mapping/resource/3b57898b-f013-487a-b472-17f54311edb5.</w:t>
       </w:r>
     </w:p>
-    <w:bookmarkEnd w:id="94"/>
-    <w:bookmarkStart w:id="95" w:name="Xe7b7ad2022eadb255e299639b3100f5357e120c"/>
+    <w:bookmarkEnd w:id="95"/>
+    <w:bookmarkStart w:id="96" w:name="Xe7b7ad2022eadb255e299639b3100f5357e120c"/>
     <w:p>
       <w:pPr>
         <w:pStyle w:val="Bibliography"/>
@@ -22320,8 +21851,8 @@
         <w:t xml:space="preserve">Superior Court of Siskiyou County.</w:t>
       </w:r>
     </w:p>
-    <w:bookmarkEnd w:id="95"/>
-    <w:bookmarkStart w:id="96" w:name="X6ef878f889213098c200c5acad35595649e9db2"/>
+    <w:bookmarkEnd w:id="96"/>
+    <w:bookmarkStart w:id="97" w:name="X6ef878f889213098c200c5acad35595649e9db2"/>
     <w:p>
       <w:pPr>
         <w:pStyle w:val="Bibliography"/>
@@ -22363,8 +21894,63 @@
         <w:t xml:space="preserve">.”</w:t>
       </w:r>
     </w:p>
-    <w:bookmarkEnd w:id="96"/>
-    <w:bookmarkStart w:id="98" w:name="ref-CarterSheafferAlfalfa1983"/>
+    <w:bookmarkEnd w:id="97"/>
+    <w:bookmarkStart w:id="98" w:name="ref-CarpenterAccurately2024"/>
+    <w:p>
+      <w:pPr>
+        <w:pStyle w:val="Bibliography"/>
+      </w:pPr>
+      <w:r>
+        <w:t xml:space="preserve">Carpenter, Cameron. 2024.</w:t>
+      </w:r>
+      <w:r>
+        <w:t xml:space="preserve"> </w:t>
+      </w:r>
+      <w:r>
+        <w:t xml:space="preserve">“Accurately</w:t>
+      </w:r>
+      <w:r>
+        <w:t xml:space="preserve"> </w:t>
+      </w:r>
+      <w:r>
+        <w:t xml:space="preserve">Identifying Functional Flow Metrics</w:t>
+      </w:r>
+      <w:r>
+        <w:t xml:space="preserve"> </w:t>
+      </w:r>
+      <w:r>
+        <w:t xml:space="preserve">in</w:t>
+      </w:r>
+      <w:r>
+        <w:t xml:space="preserve"> </w:t>
+      </w:r>
+      <w:r>
+        <w:t xml:space="preserve">Flashy</w:t>
+      </w:r>
+      <w:r>
+        <w:t xml:space="preserve"> </w:t>
+      </w:r>
+      <w:r>
+        <w:t xml:space="preserve">and</w:t>
+      </w:r>
+      <w:r>
+        <w:t xml:space="preserve"> </w:t>
+      </w:r>
+      <w:r>
+        <w:t xml:space="preserve">Highly Altered Stream Systems</w:t>
+      </w:r>
+      <w:r>
+        <w:t xml:space="preserve">.”</w:t>
+      </w:r>
+      <w:r>
+        <w:t xml:space="preserve"> </w:t>
+      </w:r>
+      <w:r>
+        <w:t xml:space="preserve">Master’s thesis, University of California, Davis.</w:t>
+      </w:r>
+    </w:p>
+    <w:bookmarkEnd w:id="98"/>
+    <w:bookmarkStart w:id="100" w:name="ref-CarterSheafferAlfalfa1983"/>
     <w:p>
       <w:pPr>
         <w:pStyle w:val="Bibliography"/>
@@ -22484,7 +22070,7 @@
       <w:r>
         <w:t xml:space="preserve"> </w:t>
       </w:r>
-      <w:hyperlink r:id="rId97">
+      <w:hyperlink r:id="rId99">
         <w:r>
           <w:rPr>
             <w:rStyle w:val="Hyperlink"/>
@@ -22496,8 +22082,8 @@
         <w:t xml:space="preserve">.</w:t>
       </w:r>
     </w:p>
-    <w:bookmarkEnd w:id="98"/>
-    <w:bookmarkStart w:id="100" w:name="ref-CohonMarksMultiobjective1973"/>
+    <w:bookmarkEnd w:id="100"/>
+    <w:bookmarkStart w:id="102" w:name="ref-CohonMarksMultiobjective1973"/>
     <w:p>
       <w:pPr>
         <w:pStyle w:val="Bibliography"/>
@@ -22530,7 +22116,7 @@
       <w:r>
         <w:t xml:space="preserve"> </w:t>
       </w:r>
-      <w:hyperlink r:id="rId99">
+      <w:hyperlink r:id="rId101">
         <w:r>
           <w:rPr>
             <w:rStyle w:val="Hyperlink"/>
@@ -22542,8 +22128,8 @@
         <w:t xml:space="preserve">.</w:t>
       </w:r>
     </w:p>
-    <w:bookmarkEnd w:id="100"/>
-    <w:bookmarkStart w:id="101" w:name="X57acf74f4e6bbb2dbfb24b295bee561f3691de6"/>
+    <w:bookmarkEnd w:id="102"/>
+    <w:bookmarkStart w:id="103" w:name="X57acf74f4e6bbb2dbfb24b295bee561f3691de6"/>
     <w:p>
       <w:pPr>
         <w:pStyle w:val="Bibliography"/>
@@ -22597,8 +22183,8 @@
         <w:t xml:space="preserve">2021. {{NOTICE OF APPROVAL OF EMERGENCY REGULATORY ACTION}}.</w:t>
       </w:r>
     </w:p>
-    <w:bookmarkEnd w:id="101"/>
-    <w:bookmarkStart w:id="102" w:name="X6facecaac3164717d4e5933b1aebd85f9388655"/>
+    <w:bookmarkEnd w:id="103"/>
+    <w:bookmarkStart w:id="104" w:name="X6facecaac3164717d4e5933b1aebd85f9388655"/>
     <w:p>
       <w:pPr>
         <w:pStyle w:val="Bibliography"/>
@@ -22664,8 +22250,8 @@
         <w:t xml:space="preserve">2024. {{NOTICE OF APPROVAL OF EMERGENCY REGULATORY ACTION}}.</w:t>
       </w:r>
     </w:p>
-    <w:bookmarkEnd w:id="102"/>
-    <w:bookmarkStart w:id="103" w:name="ref-FogliaEtAlScott2013"/>
+    <w:bookmarkEnd w:id="104"/>
+    <w:bookmarkStart w:id="105" w:name="ref-FogliaEtAlScott2013"/>
     <w:p>
       <w:pPr>
         <w:pStyle w:val="Bibliography"/>
@@ -22722,8 +22308,8 @@
         <w:t xml:space="preserve">Davis, CA: North Coast Regional Water Quality Control Board.</w:t>
       </w:r>
     </w:p>
-    <w:bookmarkEnd w:id="103"/>
-    <w:bookmarkStart w:id="104" w:name="Xff198d1a9510a26c6b6a97c9924d7fdc8be1418"/>
+    <w:bookmarkEnd w:id="105"/>
+    <w:bookmarkStart w:id="106" w:name="Xff198d1a9510a26c6b6a97c9924d7fdc8be1418"/>
     <w:p>
       <w:pPr>
         <w:pStyle w:val="Bibliography"/>
@@ -22765,8 +22351,8 @@
         <w:t xml:space="preserve">Ventura, CA: Fox Canyon Groundwater Manegement Agency.</w:t>
       </w:r>
     </w:p>
-    <w:bookmarkEnd w:id="104"/>
-    <w:bookmarkStart w:id="106" w:name="ref-FreemanWICKED2000"/>
+    <w:bookmarkEnd w:id="106"/>
+    <w:bookmarkStart w:id="108" w:name="ref-FreemanWICKED2000"/>
     <w:p>
       <w:pPr>
         <w:pStyle w:val="Bibliography"/>
@@ -22814,7 +22400,7 @@
       <w:r>
         <w:t xml:space="preserve"> </w:t>
       </w:r>
-      <w:hyperlink r:id="rId105">
+      <w:hyperlink r:id="rId107">
         <w:r>
           <w:rPr>
             <w:rStyle w:val="Hyperlink"/>
@@ -22826,8 +22412,8 @@
         <w:t xml:space="preserve">.</w:t>
       </w:r>
     </w:p>
-    <w:bookmarkEnd w:id="106"/>
-    <w:bookmarkStart w:id="107" w:name="ref-HarterHinesSCOTT2008"/>
+    <w:bookmarkEnd w:id="108"/>
+    <w:bookmarkStart w:id="109" w:name="ref-HarterHinesSCOTT2008"/>
     <w:p>
       <w:pPr>
         <w:pStyle w:val="Bibliography"/>
@@ -22854,8 +22440,8 @@
         <w:t xml:space="preserve">University of California, Davis.</w:t>
       </w:r>
     </w:p>
-    <w:bookmarkEnd w:id="107"/>
-    <w:bookmarkStart w:id="109" w:name="ref-KapelanEtAlMultiobjective2005"/>
+    <w:bookmarkEnd w:id="109"/>
+    <w:bookmarkStart w:id="111" w:name="ref-KapelanEtAlMultiobjective2005"/>
     <w:p>
       <w:pPr>
         <w:pStyle w:val="Bibliography"/>
@@ -22888,7 +22474,7 @@
       <w:r>
         <w:t xml:space="preserve"> </w:t>
       </w:r>
-      <w:hyperlink r:id="rId108">
+      <w:hyperlink r:id="rId110">
         <w:r>
           <w:rPr>
             <w:rStyle w:val="Hyperlink"/>
@@ -22900,8 +22486,8 @@
         <w:t xml:space="preserve">.</w:t>
       </w:r>
     </w:p>
-    <w:bookmarkEnd w:id="109"/>
-    <w:bookmarkStart w:id="111" w:name="ref-KoubaEtAlWatershedSpecific2025"/>
+    <w:bookmarkEnd w:id="111"/>
+    <w:bookmarkStart w:id="113" w:name="ref-KoubaEtAlWatershedSpecific2025"/>
     <w:p>
       <w:pPr>
         <w:pStyle w:val="Bibliography"/>
@@ -22955,7 +22541,7 @@
       <w:r>
         <w:t xml:space="preserve"> </w:t>
       </w:r>
-      <w:hyperlink r:id="rId110">
+      <w:hyperlink r:id="rId112">
         <w:r>
           <w:rPr>
             <w:rStyle w:val="Hyperlink"/>
@@ -22967,8 +22553,8 @@
         <w:t xml:space="preserve">.</w:t>
       </w:r>
     </w:p>
-    <w:bookmarkEnd w:id="111"/>
-    <w:bookmarkStart w:id="113" w:name="ref-MackGeology1958"/>
+    <w:bookmarkEnd w:id="113"/>
+    <w:bookmarkStart w:id="115" w:name="ref-MackGeology1958"/>
     <w:p>
       <w:pPr>
         <w:pStyle w:val="Bibliography"/>
@@ -23018,7 +22604,7 @@
       <w:r>
         <w:t xml:space="preserve"> </w:t>
       </w:r>
-      <w:hyperlink r:id="rId112">
+      <w:hyperlink r:id="rId114">
         <w:r>
           <w:rPr>
             <w:rStyle w:val="Hyperlink"/>
@@ -23030,8 +22616,8 @@
         <w:t xml:space="preserve">.</w:t>
       </w:r>
     </w:p>
-    <w:bookmarkEnd w:id="113"/>
-    <w:bookmarkStart w:id="115" w:name="ref-MahoneyRoodStreamflow1998"/>
+    <w:bookmarkEnd w:id="115"/>
+    <w:bookmarkStart w:id="117" w:name="ref-MahoneyRoodStreamflow1998"/>
     <w:p>
       <w:pPr>
         <w:pStyle w:val="Bibliography"/>
@@ -23073,7 +22659,7 @@
       <w:r>
         <w:t xml:space="preserve"> </w:t>
       </w:r>
-      <w:hyperlink r:id="rId114">
+      <w:hyperlink r:id="rId116">
         <w:r>
           <w:rPr>
             <w:rStyle w:val="Hyperlink"/>
@@ -23085,8 +22671,8 @@
         <w:t xml:space="preserve">.</w:t>
       </w:r>
     </w:p>
-    <w:bookmarkEnd w:id="115"/>
-    <w:bookmarkStart w:id="117" w:name="ref-MonarchiEtAlInteractive1973"/>
+    <w:bookmarkEnd w:id="117"/>
+    <w:bookmarkStart w:id="119" w:name="ref-MonarchiEtAlInteractive1973"/>
     <w:p>
       <w:pPr>
         <w:pStyle w:val="Bibliography"/>
@@ -23131,7 +22717,7 @@
       <w:r>
         <w:t xml:space="preserve"> </w:t>
       </w:r>
-      <w:hyperlink r:id="rId116">
+      <w:hyperlink r:id="rId118">
         <w:r>
           <w:rPr>
             <w:rStyle w:val="Hyperlink"/>
@@ -23143,8 +22729,8 @@
         <w:t xml:space="preserve">.</w:t>
       </w:r>
     </w:p>
-    <w:bookmarkEnd w:id="117"/>
-    <w:bookmarkStart w:id="119" w:name="ref-NordgrenEtAlSupporting2016"/>
+    <w:bookmarkEnd w:id="119"/>
+    <w:bookmarkStart w:id="121" w:name="ref-NordgrenEtAlSupporting2016"/>
     <w:p>
       <w:pPr>
         <w:pStyle w:val="Bibliography"/>
@@ -23189,7 +22775,7 @@
       <w:r>
         <w:t xml:space="preserve"> </w:t>
       </w:r>
-      <w:hyperlink r:id="rId118">
+      <w:hyperlink r:id="rId120">
         <w:r>
           <w:rPr>
             <w:rStyle w:val="Hyperlink"/>
@@ -23201,8 +22787,8 @@
         <w:t xml:space="preserve">.</w:t>
       </w:r>
     </w:p>
-    <w:bookmarkEnd w:id="119"/>
-    <w:bookmarkStart w:id="121" w:name="ref-OhlbergerEtAlEffects2018"/>
+    <w:bookmarkEnd w:id="121"/>
+    <w:bookmarkStart w:id="123" w:name="ref-OhlbergerEtAlEffects2018"/>
     <w:p>
       <w:pPr>
         <w:pStyle w:val="Bibliography"/>
@@ -23235,7 +22821,7 @@
       <w:r>
         <w:t xml:space="preserve"> </w:t>
       </w:r>
-      <w:hyperlink r:id="rId120">
+      <w:hyperlink r:id="rId122">
         <w:r>
           <w:rPr>
             <w:rStyle w:val="Hyperlink"/>
@@ -23247,94 +22833,109 @@
         <w:t xml:space="preserve">.</w:t>
       </w:r>
     </w:p>
-    <w:bookmarkEnd w:id="121"/>
-    <w:bookmarkStart w:id="122" w:name="X35601437fc25b0fdd92b478f2f9ddeaed3398df"/>
+    <w:bookmarkEnd w:id="123"/>
+    <w:bookmarkStart w:id="125" w:name="ref-PattersonEtAlHydrologic2020"/>
     <w:p>
       <w:pPr>
         <w:pStyle w:val="Bibliography"/>
       </w:pPr>
       <w:r>
-        <w:t xml:space="preserve">Scott River Watershed Council. 2018.</w:t>
-      </w:r>
-      <w:r>
-        <w:t xml:space="preserve"> </w:t>
-      </w:r>
-      <w:r>
-        <w:t xml:space="preserve">“Restoring</w:t>
-      </w:r>
-      <w:r>
-        <w:t xml:space="preserve"> </w:t>
-      </w:r>
-      <w:r>
-        <w:t xml:space="preserve">Priority Coho Habitat</w:t>
-      </w:r>
-      <w:r>
-        <w:t xml:space="preserve"> </w:t>
-      </w:r>
-      <w:r>
-        <w:t xml:space="preserve">in the</w:t>
-      </w:r>
-      <w:r>
-        <w:t xml:space="preserve"> </w:t>
-      </w:r>
-      <w:r>
-        <w:t xml:space="preserve">Scott River Watershed Modeling</w:t>
-      </w:r>
-      <w:r>
-        <w:t xml:space="preserve"> </w:t>
-      </w:r>
-      <w:r>
-        <w:t xml:space="preserve">and</w:t>
-      </w:r>
-      <w:r>
-        <w:t xml:space="preserve"> </w:t>
-      </w:r>
-      <w:r>
-        <w:t xml:space="preserve">Planning Report</w:t>
-      </w:r>
-      <w:r>
-        <w:t xml:space="preserve">.”</w:t>
+        <w:t xml:space="preserve">Patterson, Noelle K., Belize A. Lane, Samuel Sandoval-Solis, Gregory B. Pasternack, Sarah M. Yarnell, and Yexuan Qiu. 2020.</w:t>
+      </w:r>
+      <w:r>
+        <w:t xml:space="preserve"> </w:t>
+      </w:r>
+      <w:r>
+        <w:t xml:space="preserve">“A Hydrologic Feature Detection Algorithm to Quantify Seasonal Components of Flow Regimes.”</w:t>
+      </w:r>
+      <w:r>
+        <w:t xml:space="preserve"> </w:t>
+      </w:r>
+      <w:r>
+        <w:rPr>
+          <w:i/>
+          <w:iCs/>
+        </w:rPr>
+        <w:t xml:space="preserve">Journal of Hydrology</w:t>
+      </w:r>
+      <w:r>
+        <w:t xml:space="preserve"> </w:t>
+      </w:r>
+      <w:r>
+        <w:t xml:space="preserve">585 (June): 124787.</w:t>
+      </w:r>
+      <w:r>
+        <w:t xml:space="preserve"> </w:t>
+      </w:r>
+      <w:hyperlink r:id="rId124">
+        <w:r>
+          <w:rPr>
+            <w:rStyle w:val="Hyperlink"/>
+          </w:rPr>
+          <w:t xml:space="preserve">https://doi.org/10.1016/j.jhydrol.2020.124787</w:t>
+        </w:r>
+      </w:hyperlink>
+      <w:r>
+        <w:t xml:space="preserve">.</w:t>
       </w:r>
     </w:p>
-    <w:bookmarkEnd w:id="122"/>
-    <w:bookmarkStart w:id="123" w:name="X334218043bd9d5b07a848a610917fcfef0168db"/>
+    <w:bookmarkEnd w:id="125"/>
+    <w:bookmarkStart w:id="126" w:name="X35601437fc25b0fdd92b478f2f9ddeaed3398df"/>
     <w:p>
       <w:pPr>
         <w:pStyle w:val="Bibliography"/>
       </w:pPr>
       <w:r>
-        <w:t xml:space="preserve">Scott Valley Area Plan Committee. 1980.</w:t>
-      </w:r>
-      <w:r>
-        <w:t xml:space="preserve"> </w:t>
-      </w:r>
-      <w:r>
-        <w:t xml:space="preserve">“Scott</w:t>
-      </w:r>
-      <w:r>
-        <w:t xml:space="preserve"> </w:t>
-      </w:r>
-      <w:r>
-        <w:t xml:space="preserve">Valley Area Plan</w:t>
+        <w:t xml:space="preserve">Scott River Watershed Council. 2018.</w:t>
+      </w:r>
+      <w:r>
+        <w:t xml:space="preserve"> </w:t>
+      </w:r>
+      <w:r>
+        <w:t xml:space="preserve">“Restoring</w:t>
+      </w:r>
+      <w:r>
+        <w:t xml:space="preserve"> </w:t>
+      </w:r>
+      <w:r>
+        <w:t xml:space="preserve">Priority Coho Habitat</w:t>
+      </w:r>
+      <w:r>
+        <w:t xml:space="preserve"> </w:t>
+      </w:r>
+      <w:r>
+        <w:t xml:space="preserve">in the</w:t>
+      </w:r>
+      <w:r>
+        <w:t xml:space="preserve"> </w:t>
+      </w:r>
+      <w:r>
+        <w:t xml:space="preserve">Scott River Watershed Modeling</w:t>
+      </w:r>
+      <w:r>
+        <w:t xml:space="preserve"> </w:t>
+      </w:r>
+      <w:r>
+        <w:t xml:space="preserve">and</w:t>
+      </w:r>
+      <w:r>
+        <w:t xml:space="preserve"> </w:t>
+      </w:r>
+      <w:r>
+        <w:t xml:space="preserve">Planning Report</w:t>
       </w:r>
       <w:r>
         <w:t xml:space="preserve">.”</w:t>
       </w:r>
-      <w:r>
-        <w:t xml:space="preserve"> </w:t>
-      </w:r>
-      <w:r>
-        <w:t xml:space="preserve">Siskiyou County.</w:t>
-      </w:r>
     </w:p>
-    <w:bookmarkEnd w:id="123"/>
-    <w:bookmarkStart w:id="124" w:name="ref-SiskiyouCountyScott2021"/>
+    <w:bookmarkEnd w:id="126"/>
+    <w:bookmarkStart w:id="127" w:name="X334218043bd9d5b07a848a610917fcfef0168db"/>
     <w:p>
       <w:pPr>
         <w:pStyle w:val="Bibliography"/>
       </w:pPr>
       <w:r>
-        <w:t xml:space="preserve">Siskiyou County. 2021.</w:t>
+        <w:t xml:space="preserve">Scott Valley Area Plan Committee. 1980.</w:t>
       </w:r>
       <w:r>
         <w:t xml:space="preserve"> </w:t>
@@ -23346,59 +22947,90 @@
         <w:t xml:space="preserve"> </w:t>
       </w:r>
       <w:r>
-        <w:t xml:space="preserve">Valley Groundwater Sustainability Plan</w:t>
+        <w:t xml:space="preserve">Valley Area Plan</w:t>
       </w:r>
       <w:r>
         <w:t xml:space="preserve">.”</w:t>
       </w:r>
+      <w:r>
+        <w:t xml:space="preserve"> </w:t>
+      </w:r>
+      <w:r>
+        <w:t xml:space="preserve">Siskiyou County.</w:t>
+      </w:r>
     </w:p>
-    <w:bookmarkEnd w:id="124"/>
-    <w:bookmarkStart w:id="125" w:name="X15105b7917297e4641cb2d2cfd1651756f7bcb0"/>
+    <w:bookmarkEnd w:id="127"/>
+    <w:bookmarkStart w:id="128" w:name="ref-SiskiyouCountyScott2021"/>
     <w:p>
       <w:pPr>
         <w:pStyle w:val="Bibliography"/>
       </w:pPr>
       <w:r>
-        <w:t xml:space="preserve">Siskiyou County GSA - Scott Valley Groundwater Advisory Committee. 2021.</w:t>
-      </w:r>
-      <w:r>
-        <w:t xml:space="preserve"> </w:t>
-      </w:r>
-      <w:r>
-        <w:t xml:space="preserve">“Siskiyou</w:t>
-      </w:r>
-      <w:r>
-        <w:t xml:space="preserve"> </w:t>
-      </w:r>
-      <w:r>
-        <w:t xml:space="preserve">County Groundwater Sustainability Agency</w:t>
-      </w:r>
-      <w:r>
-        <w:t xml:space="preserve">:</w:t>
-      </w:r>
-      <w:r>
-        <w:t xml:space="preserve"> </w:t>
-      </w:r>
-      <w:r>
-        <w:t xml:space="preserve">Scott Valley Advisory Committee Meeting</w:t>
+        <w:t xml:space="preserve">Siskiyou County. 2021.</w:t>
+      </w:r>
+      <w:r>
+        <w:t xml:space="preserve"> </w:t>
+      </w:r>
+      <w:r>
+        <w:t xml:space="preserve">“Scott</w:t>
+      </w:r>
+      <w:r>
+        <w:t xml:space="preserve"> </w:t>
+      </w:r>
+      <w:r>
+        <w:t xml:space="preserve">Valley Groundwater Sustainability Plan</w:t>
       </w:r>
       <w:r>
         <w:t xml:space="preserve">.”</w:t>
       </w:r>
-      <w:r>
-        <w:t xml:space="preserve"> </w:t>
-      </w:r>
-      <w:r>
-        <w:t xml:space="preserve">Fort Jones, CA: Siskiyou County.</w:t>
-      </w:r>
     </w:p>
-    <w:bookmarkEnd w:id="125"/>
-    <w:bookmarkStart w:id="126" w:name="Xa7b10fbb32571a990cee2341e679d296b855974"/>
+    <w:bookmarkEnd w:id="128"/>
+    <w:bookmarkStart w:id="129" w:name="X15105b7917297e4641cb2d2cfd1651756f7bcb0"/>
     <w:p>
       <w:pPr>
         <w:pStyle w:val="Bibliography"/>
       </w:pPr>
       <w:r>
+        <w:t xml:space="preserve">Siskiyou County GSA - Scott Valley Groundwater Advisory Committee. 2021.</w:t>
+      </w:r>
+      <w:r>
+        <w:t xml:space="preserve"> </w:t>
+      </w:r>
+      <w:r>
+        <w:t xml:space="preserve">“Siskiyou</w:t>
+      </w:r>
+      <w:r>
+        <w:t xml:space="preserve"> </w:t>
+      </w:r>
+      <w:r>
+        <w:t xml:space="preserve">County Groundwater Sustainability Agency</w:t>
+      </w:r>
+      <w:r>
+        <w:t xml:space="preserve">:</w:t>
+      </w:r>
+      <w:r>
+        <w:t xml:space="preserve"> </w:t>
+      </w:r>
+      <w:r>
+        <w:t xml:space="preserve">Scott Valley Advisory Committee Meeting</w:t>
+      </w:r>
+      <w:r>
+        <w:t xml:space="preserve">.”</w:t>
+      </w:r>
+      <w:r>
+        <w:t xml:space="preserve"> </w:t>
+      </w:r>
+      <w:r>
+        <w:t xml:space="preserve">Fort Jones, CA: Siskiyou County.</w:t>
+      </w:r>
+    </w:p>
+    <w:bookmarkEnd w:id="129"/>
+    <w:bookmarkStart w:id="130" w:name="Xa7b10fbb32571a990cee2341e679d296b855974"/>
+    <w:p>
+      <w:pPr>
+        <w:pStyle w:val="Bibliography"/>
+      </w:pPr>
+      <w:r>
         <w:t xml:space="preserve">STATE WATER RESOURCES CONTROL BOARD. 2024.</w:t>
       </w:r>
       <w:r>
@@ -23429,8 +23061,8 @@
         <w:t xml:space="preserve">2024-0036.</w:t>
       </w:r>
     </w:p>
-    <w:bookmarkEnd w:id="126"/>
-    <w:bookmarkStart w:id="128" w:name="ref-SundingMeasuring1996"/>
+    <w:bookmarkEnd w:id="130"/>
+    <w:bookmarkStart w:id="132" w:name="ref-SundingMeasuring1996"/>
     <w:p>
       <w:pPr>
         <w:pStyle w:val="Bibliography"/>
@@ -23484,7 +23116,7 @@
       <w:r>
         <w:t xml:space="preserve"> </w:t>
       </w:r>
-      <w:hyperlink r:id="rId127">
+      <w:hyperlink r:id="rId131">
         <w:r>
           <w:rPr>
             <w:rStyle w:val="Hyperlink"/>
@@ -23496,8 +23128,8 @@
         <w:t xml:space="preserve">.</w:t>
       </w:r>
     </w:p>
-    <w:bookmarkEnd w:id="128"/>
-    <w:bookmarkStart w:id="130" w:name="ref-TolleyEtAlSensitivity2019"/>
+    <w:bookmarkEnd w:id="132"/>
+    <w:bookmarkStart w:id="134" w:name="ref-TolleyEtAlSensitivity2019"/>
     <w:p>
       <w:pPr>
         <w:pStyle w:val="Bibliography"/>
@@ -23587,7 +23219,7 @@
       <w:r>
         <w:t xml:space="preserve"> </w:t>
       </w:r>
-      <w:hyperlink r:id="rId129">
+      <w:hyperlink r:id="rId133">
         <w:r>
           <w:rPr>
             <w:rStyle w:val="Hyperlink"/>
@@ -23599,8 +23231,8 @@
         <w:t xml:space="preserve">.</w:t>
       </w:r>
     </w:p>
-    <w:bookmarkEnd w:id="130"/>
-    <w:bookmarkStart w:id="132" w:name="ref-VanSteenbergenPromoting2006"/>
+    <w:bookmarkEnd w:id="134"/>
+    <w:bookmarkStart w:id="136" w:name="ref-VanSteenbergenPromoting2006"/>
     <w:p>
       <w:pPr>
         <w:pStyle w:val="Bibliography"/>
@@ -23633,7 +23265,7 @@
       <w:r>
         <w:t xml:space="preserve"> </w:t>
       </w:r>
-      <w:hyperlink r:id="rId131">
+      <w:hyperlink r:id="rId135">
         <w:r>
           <w:rPr>
             <w:rStyle w:val="Hyperlink"/>
@@ -23645,8 +23277,105 @@
         <w:t xml:space="preserve">.</w:t>
       </w:r>
     </w:p>
-    <w:bookmarkEnd w:id="132"/>
-    <w:bookmarkStart w:id="134" w:name="ref-YehBeckerMultiobjective1982"/>
+    <w:bookmarkEnd w:id="136"/>
+    <w:bookmarkStart w:id="138" w:name="ref-YarnellEtAlFunctional2015"/>
+    <w:p>
+      <w:pPr>
+        <w:pStyle w:val="Bibliography"/>
+      </w:pPr>
+      <w:r>
+        <w:t xml:space="preserve">Yarnell, Sarah M., Geoffrey E. Petts, John C. Schmidt, Alison A. Whipple, Erin E. Beller, Clifford N. Dahm, Peter Goodwin, and Joshua H. Viers. 2015.</w:t>
+      </w:r>
+      <w:r>
+        <w:t xml:space="preserve"> </w:t>
+      </w:r>
+      <w:r>
+        <w:t xml:space="preserve">“Functional</w:t>
+      </w:r>
+      <w:r>
+        <w:t xml:space="preserve"> </w:t>
+      </w:r>
+      <w:r>
+        <w:t xml:space="preserve">Flows</w:t>
+      </w:r>
+      <w:r>
+        <w:t xml:space="preserve"> </w:t>
+      </w:r>
+      <w:r>
+        <w:t xml:space="preserve">in</w:t>
+      </w:r>
+      <w:r>
+        <w:t xml:space="preserve"> </w:t>
+      </w:r>
+      <w:r>
+        <w:t xml:space="preserve">Modified Riverscapes</w:t>
+      </w:r>
+      <w:r>
+        <w:t xml:space="preserve">:</w:t>
+      </w:r>
+      <w:r>
+        <w:t xml:space="preserve"> </w:t>
+      </w:r>
+      <w:r>
+        <w:t xml:space="preserve">Hydrographs</w:t>
+      </w:r>
+      <w:r>
+        <w:t xml:space="preserve">,</w:t>
+      </w:r>
+      <w:r>
+        <w:t xml:space="preserve"> </w:t>
+      </w:r>
+      <w:r>
+        <w:t xml:space="preserve">Habitats</w:t>
+      </w:r>
+      <w:r>
+        <w:t xml:space="preserve"> </w:t>
+      </w:r>
+      <w:r>
+        <w:t xml:space="preserve">and</w:t>
+      </w:r>
+      <w:r>
+        <w:t xml:space="preserve"> </w:t>
+      </w:r>
+      <w:r>
+        <w:t xml:space="preserve">Opportunities</w:t>
+      </w:r>
+      <w:r>
+        <w:t xml:space="preserve">.”</w:t>
+      </w:r>
+      <w:r>
+        <w:t xml:space="preserve"> </w:t>
+      </w:r>
+      <w:r>
+        <w:rPr>
+          <w:i/>
+          <w:iCs/>
+        </w:rPr>
+        <w:t xml:space="preserve">BioScience</w:t>
+      </w:r>
+      <w:r>
+        <w:t xml:space="preserve"> </w:t>
+      </w:r>
+      <w:r>
+        <w:t xml:space="preserve">65 (10): 963–72.</w:t>
+      </w:r>
+      <w:r>
+        <w:t xml:space="preserve"> </w:t>
+      </w:r>
+      <w:hyperlink r:id="rId137">
+        <w:r>
+          <w:rPr>
+            <w:rStyle w:val="Hyperlink"/>
+          </w:rPr>
+          <w:t xml:space="preserve">https://doi.org/10.1093/biosci/biv102</w:t>
+        </w:r>
+      </w:hyperlink>
+      <w:r>
+        <w:t xml:space="preserve">.</w:t>
+      </w:r>
+    </w:p>
+    <w:bookmarkEnd w:id="138"/>
+    <w:bookmarkStart w:id="140" w:name="ref-YehBeckerMultiobjective1982"/>
     <w:p>
       <w:pPr>
         <w:pStyle w:val="Bibliography"/>
@@ -23679,7 +23408,7 @@
       <w:r>
         <w:t xml:space="preserve"> </w:t>
       </w:r>
-      <w:hyperlink r:id="rId133">
+      <w:hyperlink r:id="rId139">
         <w:r>
           <w:rPr>
             <w:rStyle w:val="Hyperlink"/>
@@ -23691,8 +23420,8 @@
         <w:t xml:space="preserve">.</w:t>
       </w:r>
     </w:p>
-    <w:bookmarkEnd w:id="134"/>
-    <w:bookmarkStart w:id="135" w:name="X8bf5592004e543b04dfcfc3edb39663c8006d78"/>
+    <w:bookmarkEnd w:id="140"/>
+    <w:bookmarkStart w:id="141" w:name="X8bf5592004e543b04dfcfc3edb39663c8006d78"/>
     <w:p>
       <w:pPr>
         <w:pStyle w:val="Bibliography"/>
@@ -23722,14 +23451,14 @@
         <w:t xml:space="preserve">Woodland, CA.</w:t>
       </w:r>
     </w:p>
-    <w:bookmarkEnd w:id="135"/>
-    <w:bookmarkEnd w:id="136"/>
+    <w:bookmarkEnd w:id="141"/>
+    <w:bookmarkEnd w:id="142"/>
     <w:p>
       <w:r>
         <w:br w:type="page"/>
       </w:r>
     </w:p>
-    <w:bookmarkEnd w:id="137"/>
+    <w:bookmarkEnd w:id="143"/>
     <w:sectPr>
       <w:footnotePr>
         <w:numRestart w:val="eachSect"/>
@@ -23943,91 +23672,6 @@
       </w:rPr>
     </w:lvl>
   </w:abstractNum>
-  <w:abstractNum w:abstractNumId="99411">
-    <w:nsid w:val="00A99411"/>
-    <w:multiLevelType w:val="multilevel"/>
-    <w:lvl w:ilvl="0">
-      <w:start w:val="1"/>
-      <w:numFmt w:val="decimal"/>
-      <w:lvlText w:val="%1."/>
-      <w:lvlJc w:val="left"/>
-      <w:pPr>
-        <w:ind w:left="720" w:hanging="360"/>
-      </w:pPr>
-    </w:lvl>
-    <w:lvl w:ilvl="1">
-      <w:start w:val="1"/>
-      <w:numFmt w:val="decimal"/>
-      <w:lvlText w:val="%2."/>
-      <w:lvlJc w:val="left"/>
-      <w:pPr>
-        <w:ind w:left="1440" w:hanging="360"/>
-      </w:pPr>
-    </w:lvl>
-    <w:lvl w:ilvl="2">
-      <w:start w:val="1"/>
-      <w:numFmt w:val="decimal"/>
-      <w:lvlText w:val="%3."/>
-      <w:lvlJc w:val="left"/>
-      <w:pPr>
-        <w:ind w:left="2160" w:hanging="360"/>
-      </w:pPr>
-    </w:lvl>
-    <w:lvl w:ilvl="3">
-      <w:start w:val="1"/>
-      <w:numFmt w:val="decimal"/>
-      <w:lvlText w:val="%4."/>
-      <w:lvlJc w:val="left"/>
-      <w:pPr>
-        <w:ind w:left="2880" w:hanging="360"/>
-      </w:pPr>
-    </w:lvl>
-    <w:lvl w:ilvl="4">
-      <w:start w:val="1"/>
-      <w:numFmt w:val="decimal"/>
-      <w:lvlText w:val="%5."/>
-      <w:lvlJc w:val="left"/>
-      <w:pPr>
-        <w:ind w:left="3600" w:hanging="360"/>
-      </w:pPr>
-    </w:lvl>
-    <w:lvl w:ilvl="5">
-      <w:start w:val="1"/>
-      <w:numFmt w:val="decimal"/>
-      <w:lvlText w:val="%6."/>
-      <w:lvlJc w:val="left"/>
-      <w:pPr>
-        <w:ind w:left="4320" w:hanging="360"/>
-      </w:pPr>
-    </w:lvl>
-    <w:lvl w:ilvl="6">
-      <w:start w:val="1"/>
-      <w:numFmt w:val="decimal"/>
-      <w:lvlText w:val="%7."/>
-      <w:lvlJc w:val="left"/>
-      <w:pPr>
-        <w:ind w:left="5040" w:hanging="360"/>
-      </w:pPr>
-    </w:lvl>
-    <w:lvl w:ilvl="7">
-      <w:start w:val="1"/>
-      <w:numFmt w:val="decimal"/>
-      <w:lvlText w:val="%8."/>
-      <w:lvlJc w:val="left"/>
-      <w:pPr>
-        <w:ind w:left="5760" w:hanging="360"/>
-      </w:pPr>
-    </w:lvl>
-    <w:lvl w:ilvl="8">
-      <w:start w:val="1"/>
-      <w:numFmt w:val="decimal"/>
-      <w:lvlText w:val="%9."/>
-      <w:lvlJc w:val="left"/>
-      <w:pPr>
-        <w:ind w:left="6480" w:hanging="360"/>
-      </w:pPr>
-    </w:lvl>
-  </w:abstractNum>
   <w:abstractNum w:abstractNumId="99421">
     <w:nsid w:val="00A99421"/>
     <w:multiLevelType w:val="multilevel"/>
@@ -24198,6 +23842,91 @@
       </w:pPr>
     </w:lvl>
   </w:abstractNum>
+  <w:abstractNum w:abstractNumId="99411">
+    <w:nsid w:val="00A99411"/>
+    <w:multiLevelType w:val="multilevel"/>
+    <w:lvl w:ilvl="0">
+      <w:start w:val="1"/>
+      <w:numFmt w:val="decimal"/>
+      <w:lvlText w:val="%1."/>
+      <w:lvlJc w:val="left"/>
+      <w:pPr>
+        <w:ind w:left="720" w:hanging="360"/>
+      </w:pPr>
+    </w:lvl>
+    <w:lvl w:ilvl="1">
+      <w:start w:val="1"/>
+      <w:numFmt w:val="decimal"/>
+      <w:lvlText w:val="%2."/>
+      <w:lvlJc w:val="left"/>
+      <w:pPr>
+        <w:ind w:left="1440" w:hanging="360"/>
+      </w:pPr>
+    </w:lvl>
+    <w:lvl w:ilvl="2">
+      <w:start w:val="1"/>
+      <w:numFmt w:val="decimal"/>
+      <w:lvlText w:val="%3."/>
+      <w:lvlJc w:val="left"/>
+      <w:pPr>
+        <w:ind w:left="2160" w:hanging="360"/>
+      </w:pPr>
+    </w:lvl>
+    <w:lvl w:ilvl="3">
+      <w:start w:val="1"/>
+      <w:numFmt w:val="decimal"/>
+      <w:lvlText w:val="%4."/>
+      <w:lvlJc w:val="left"/>
+      <w:pPr>
+        <w:ind w:left="2880" w:hanging="360"/>
+      </w:pPr>
+    </w:lvl>
+    <w:lvl w:ilvl="4">
+      <w:start w:val="1"/>
+      <w:numFmt w:val="decimal"/>
+      <w:lvlText w:val="%5."/>
+      <w:lvlJc w:val="left"/>
+      <w:pPr>
+        <w:ind w:left="3600" w:hanging="360"/>
+      </w:pPr>
+    </w:lvl>
+    <w:lvl w:ilvl="5">
+      <w:start w:val="1"/>
+      <w:numFmt w:val="decimal"/>
+      <w:lvlText w:val="%6."/>
+      <w:lvlJc w:val="left"/>
+      <w:pPr>
+        <w:ind w:left="4320" w:hanging="360"/>
+      </w:pPr>
+    </w:lvl>
+    <w:lvl w:ilvl="6">
+      <w:start w:val="1"/>
+      <w:numFmt w:val="decimal"/>
+      <w:lvlText w:val="%7."/>
+      <w:lvlJc w:val="left"/>
+      <w:pPr>
+        <w:ind w:left="5040" w:hanging="360"/>
+      </w:pPr>
+    </w:lvl>
+    <w:lvl w:ilvl="7">
+      <w:start w:val="1"/>
+      <w:numFmt w:val="decimal"/>
+      <w:lvlText w:val="%8."/>
+      <w:lvlJc w:val="left"/>
+      <w:pPr>
+        <w:ind w:left="5760" w:hanging="360"/>
+      </w:pPr>
+    </w:lvl>
+    <w:lvl w:ilvl="8">
+      <w:start w:val="1"/>
+      <w:numFmt w:val="decimal"/>
+      <w:lvlText w:val="%9."/>
+      <w:lvlJc w:val="left"/>
+      <w:pPr>
+        <w:ind w:left="6480" w:hanging="360"/>
+      </w:pPr>
+    </w:lvl>
+  </w:abstractNum>
   <w:num w:numId="1000">
     <w:abstractNumId w:val="990"/>
   </w:num>
@@ -24205,7 +23934,7 @@
     <w:abstractNumId w:val="991"/>
   </w:num>
   <w:num w:numId="1002">
-    <w:abstractNumId w:val="99411"/>
+    <w:abstractNumId w:val="99421"/>
     <w:lvlOverride w:ilvl="0">
       <w:startOverride w:val="1"/>
     </w:lvlOverride>
@@ -24235,36 +23964,6 @@
     </w:lvlOverride>
   </w:num>
   <w:num w:numId="1003">
-    <w:abstractNumId w:val="99421"/>
-    <w:lvlOverride w:ilvl="0">
-      <w:startOverride w:val="1"/>
-    </w:lvlOverride>
-    <w:lvlOverride w:ilvl="1">
-      <w:startOverride w:val="1"/>
-    </w:lvlOverride>
-    <w:lvlOverride w:ilvl="2">
-      <w:startOverride w:val="1"/>
-    </w:lvlOverride>
-    <w:lvlOverride w:ilvl="3">
-      <w:startOverride w:val="1"/>
-    </w:lvlOverride>
-    <w:lvlOverride w:ilvl="4">
-      <w:startOverride w:val="1"/>
-    </w:lvlOverride>
-    <w:lvlOverride w:ilvl="5">
-      <w:startOverride w:val="1"/>
-    </w:lvlOverride>
-    <w:lvlOverride w:ilvl="6">
-      <w:startOverride w:val="1"/>
-    </w:lvlOverride>
-    <w:lvlOverride w:ilvl="7">
-      <w:startOverride w:val="1"/>
-    </w:lvlOverride>
-    <w:lvlOverride w:ilvl="8">
-      <w:startOverride w:val="1"/>
-    </w:lvlOverride>
-  </w:num>
-  <w:num w:numId="1004">
     <w:abstractNumId w:val="99410"/>
     <w:lvlOverride w:ilvl="0">
       <w:startOverride w:val="0"/>
@@ -24292,6 +23991,36 @@
     </w:lvlOverride>
     <w:lvlOverride w:ilvl="8">
       <w:startOverride w:val="0"/>
+    </w:lvlOverride>
+  </w:num>
+  <w:num w:numId="1004">
+    <w:abstractNumId w:val="99411"/>
+    <w:lvlOverride w:ilvl="0">
+      <w:startOverride w:val="1"/>
+    </w:lvlOverride>
+    <w:lvlOverride w:ilvl="1">
+      <w:startOverride w:val="1"/>
+    </w:lvlOverride>
+    <w:lvlOverride w:ilvl="2">
+      <w:startOverride w:val="1"/>
+    </w:lvlOverride>
+    <w:lvlOverride w:ilvl="3">
+      <w:startOverride w:val="1"/>
+    </w:lvlOverride>
+    <w:lvlOverride w:ilvl="4">
+      <w:startOverride w:val="1"/>
+    </w:lvlOverride>
+    <w:lvlOverride w:ilvl="5">
+      <w:startOverride w:val="1"/>
+    </w:lvlOverride>
+    <w:lvlOverride w:ilvl="6">
+      <w:startOverride w:val="1"/>
+    </w:lvlOverride>
+    <w:lvlOverride w:ilvl="7">
+      <w:startOverride w:val="1"/>
+    </w:lvlOverride>
+    <w:lvlOverride w:ilvl="8">
+      <w:startOverride w:val="1"/>
     </w:lvlOverride>
   </w:num>
   <w:num w:numId="1005">

</xml_diff>

<commit_message>
add figure. finalize supplement format
</commit_message>
<xml_diff>
--- a/Kouba_Fish_and_Ag_Benefit_MS.docx
+++ b/Kouba_Fish_and_Ag_Benefit_MS.docx
@@ -23117,7 +23117,7 @@
       </w:r>
     </w:p>
     <w:bookmarkEnd w:id="143"/>
-    <w:bookmarkStart w:id="146" w:name="X6c1a78753bbdca554aba589b0aa85ab8ac746bf"/>
+    <w:bookmarkStart w:id="144" w:name="X6c1a78753bbdca554aba589b0aa85ab8ac746bf"/>
     <w:p>
       <w:pPr>
         <w:pStyle w:val="Heading1"/>
@@ -23316,45 +23316,7 @@
         <w:t xml:space="preserve">Consequently, only LASSO models dependent on hydrologic variables were evaluated as potential tools to forecast the outcomes of flow change on fish reproduction.</w:t>
       </w:r>
     </w:p>
-    <w:bookmarkStart w:id="144" w:name="coho-juvenile-abundance"/>
-    <w:p>
-      <w:pPr>
-        <w:pStyle w:val="Heading2"/>
-      </w:pPr>
-      <w:r>
-        <w:rPr>
-          <w:rStyle w:val="SectionNumber"/>
-        </w:rPr>
-        <w:t xml:space="preserve">8.1</w:t>
-      </w:r>
-      <w:r>
-        <w:tab/>
-      </w:r>
-      <w:r>
-        <w:t xml:space="preserve">Coho, juvenile abundance</w:t>
-      </w:r>
-    </w:p>
     <w:bookmarkEnd w:id="144"/>
-    <w:bookmarkStart w:id="145" w:name="coho-juveniles-per-spawner"/>
-    <w:p>
-      <w:pPr>
-        <w:pStyle w:val="Heading2"/>
-      </w:pPr>
-      <w:r>
-        <w:rPr>
-          <w:rStyle w:val="SectionNumber"/>
-        </w:rPr>
-        <w:t xml:space="preserve">8.2</w:t>
-      </w:r>
-      <w:r>
-        <w:tab/>
-      </w:r>
-      <w:r>
-        <w:t xml:space="preserve">Coho, juveniles per spawner</w:t>
-      </w:r>
-    </w:p>
-    <w:bookmarkEnd w:id="145"/>
-    <w:bookmarkEnd w:id="146"/>
     <w:sectPr>
       <w:footnotePr>
         <w:numRestart w:val="eachSect"/>

</xml_diff>

<commit_message>
rewriting progress. start rewriting results
</commit_message>
<xml_diff>
--- a/Kouba_Fish_and_Ag_Benefit_MS.docx
+++ b/Kouba_Fish_and_Ag_Benefit_MS.docx
@@ -604,76 +604,13 @@
         <w:t xml:space="preserve">(Scott Valley Area Plan Committee 1980)</w:t>
       </w:r>
       <w:r>
-        <w:t xml:space="preserve">. However, during recent declarations of emergency drought conditions, water use has been temporarily curtailed to preserve flows for aquatic species</w:t>
-      </w:r>
-      <w:r>
-        <w:t xml:space="preserve"> </w:t>
-      </w:r>
-      <w:r>
-        <w:t xml:space="preserve">(SWRCB 2021;</w:t>
-      </w:r>
-      <w:r>
-        <w:t xml:space="preserve"> </w:t>
-      </w:r>
-      <w:r>
-        <w:t xml:space="preserve">“Establishment of</w:t>
-      </w:r>
-      <w:r>
-        <w:t xml:space="preserve"> </w:t>
-      </w:r>
-      <w:r>
-        <w:t xml:space="preserve">Minimum Instream Flow Requirements</w:t>
-      </w:r>
-      <w:r>
-        <w:t xml:space="preserve">,</w:t>
-      </w:r>
-      <w:r>
-        <w:t xml:space="preserve"> </w:t>
-      </w:r>
-      <w:r>
-        <w:t xml:space="preserve">Curtailment Authority</w:t>
-      </w:r>
-      <w:r>
-        <w:t xml:space="preserve">, and</w:t>
-      </w:r>
-      <w:r>
-        <w:t xml:space="preserve"> </w:t>
-      </w:r>
-      <w:r>
-        <w:t xml:space="preserve">Information Order Authority</w:t>
-      </w:r>
-      <w:r>
-        <w:t xml:space="preserve"> </w:t>
-      </w:r>
-      <w:r>
-        <w:t xml:space="preserve">in the</w:t>
-      </w:r>
-      <w:r>
-        <w:t xml:space="preserve"> </w:t>
-      </w:r>
-      <w:r>
-        <w:t xml:space="preserve">Scott River</w:t>
-      </w:r>
-      <w:r>
-        <w:t xml:space="preserve"> </w:t>
-      </w:r>
-      <w:r>
-        <w:t xml:space="preserve">and</w:t>
-      </w:r>
-      <w:r>
-        <w:t xml:space="preserve"> </w:t>
-      </w:r>
-      <w:r>
-        <w:t xml:space="preserve">Shasta River Watersheds</w:t>
-      </w:r>
-      <w:r>
-        <w:t xml:space="preserve">”</w:t>
-      </w:r>
-      <w:r>
-        <w:t xml:space="preserve"> </w:t>
-      </w:r>
-      <w:r>
-        <w:t xml:space="preserve">2024; STATE WATER RESOURCES CONTROL BOARD 2024)</w:t>
+        <w:t xml:space="preserve">. However, during recent declarations of emergency drought conditions, water use has been periodically curtailed to preserve flows for aquatic species</w:t>
+      </w:r>
+      <w:r>
+        <w:t xml:space="preserve"> </w:t>
+      </w:r>
+      <w:r>
+        <w:t xml:space="preserve">(SWRCB 2021, 2024a, 2024b)</w:t>
       </w:r>
       <w:r>
         <w:t xml:space="preserve">.</w:t>
@@ -2168,7 +2105,7 @@
         </w:numPr>
       </w:pPr>
       <w:r>
-        <w:t xml:space="preserve">Fall flows, increasing after the dry season in response to early wet season storms, that occur early enough to provide adult fall-run spawners access to preferred spawning reaches;</w:t>
+        <w:t xml:space="preserve">Fall flows, increasing after the dry season in response to early wet season storms, that are sufficient to provide coho spawners access to preferred spawning reaches within the fall-run time window;</w:t>
       </w:r>
     </w:p>
     <w:p>
@@ -2200,16 +2137,87 @@
         <w:pStyle w:val="FirstParagraph"/>
       </w:pPr>
       <w:r>
-        <w:t xml:space="preserve">Different functional flows are needed by other fish, such as Chinook</w:t>
-      </w:r>
-      <w:r>
-        <w:t xml:space="preserve"> </w:t>
-      </w:r>
-      <w:r>
-        <w:t xml:space="preserve">(Kouba et al. 2025)</w:t>
-      </w:r>
-      <w:r>
-        <w:t xml:space="preserve">; as well other species, such as cottonwood trees, which require flood-stage flows to disperse their seeds</w:t>
+        <w:t xml:space="preserve">While Chinook also require fall flows for spawning, their specific flow requirements are somewhat distinct from coho due to their different life histories:</w:t>
+      </w:r>
+    </w:p>
+    <w:p>
+      <w:pPr>
+        <w:pStyle w:val="Compact"/>
+        <w:numPr>
+          <w:ilvl w:val="0"/>
+          <w:numId w:val="1002"/>
+        </w:numPr>
+      </w:pPr>
+      <w:r>
+        <w:t xml:space="preserve">Chinook juveniles spend less than one year in the freshwater environment</w:t>
+      </w:r>
+      <w:r>
+        <w:t xml:space="preserve"> </w:t>
+      </w:r>
+      <w:r>
+        <w:t xml:space="preserve">(Agrawal et al. 2005)</w:t>
+      </w:r>
+      <w:r>
+        <w:t xml:space="preserve">, while coho overwinter and typically migrate to the ocean at 1+ years old</w:t>
+      </w:r>
+      <w:r>
+        <w:t xml:space="preserve"> </w:t>
+      </w:r>
+      <w:r>
+        <w:t xml:space="preserve">(Moyle 2002; McMahon 1983)</w:t>
+      </w:r>
+      <w:r>
+        <w:t xml:space="preserve">;</w:t>
+      </w:r>
+    </w:p>
+    <w:p>
+      <w:pPr>
+        <w:pStyle w:val="Compact"/>
+        <w:numPr>
+          <w:ilvl w:val="0"/>
+          <w:numId w:val="1002"/>
+        </w:numPr>
+      </w:pPr>
+      <w:r>
+        <w:t xml:space="preserve">Chinook tend to spawn earlier in the fall than coho</w:t>
+      </w:r>
+      <w:r>
+        <w:t xml:space="preserve"> </w:t>
+      </w:r>
+      <w:r>
+        <w:t xml:space="preserve">(Knechtle and Giudice 2020; Magranet 2015, 2017)</w:t>
+      </w:r>
+      <w:r>
+        <w:t xml:space="preserve">;</w:t>
+      </w:r>
+    </w:p>
+    <w:p>
+      <w:pPr>
+        <w:pStyle w:val="Compact"/>
+        <w:numPr>
+          <w:ilvl w:val="0"/>
+          <w:numId w:val="1002"/>
+        </w:numPr>
+      </w:pPr>
+      <w:r>
+        <w:t xml:space="preserve">Chinook prefer to spawn in the main stem of the Scott River, while coho prefer to spawn in tributaries</w:t>
+      </w:r>
+      <w:r>
+        <w:t xml:space="preserve"> </w:t>
+      </w:r>
+      <w:r>
+        <w:t xml:space="preserve">(e.g., Magranet 2018; Magranet and Yokel 2017)</w:t>
+      </w:r>
+      <w:r>
+        <w:t xml:space="preserve">, making juvenile Chinook salmon more vulnerable than coho to egg burial or bed scour during high-flow storm conditions.</w:t>
+      </w:r>
+    </w:p>
+    <w:p>
+      <w:pPr>
+        <w:pStyle w:val="FirstParagraph"/>
+      </w:pPr>
+      <w:r>
+        <w:t xml:space="preserve">Different functional flows are needed by other species, such as cottonwood trees, which require flood-stage flows to disperse their seeds</w:t>
       </w:r>
       <w:r>
         <w:t xml:space="preserve"> </w:t>
@@ -2218,7 +2226,7 @@
         <w:t xml:space="preserve">(Mahoney and Rood 1998)</w:t>
       </w:r>
       <w:r>
-        <w:t xml:space="preserve">; but in this work we focus on coho salmon as a straightforward example in developing an environmental objective function. Alternative objective function formulations are discussed in later sections.</w:t>
+        <w:t xml:space="preserve">; but in this work we focus on coho and Chinook salmon as two examples in developing a single-species environmental objective function. Alternative objective function formulations are discussed in later sections.</w:t>
       </w:r>
     </w:p>
     <w:bookmarkEnd w:id="32"/>
@@ -2245,7 +2253,33 @@
         <w:pStyle w:val="FirstParagraph"/>
       </w:pPr>
       <w:r>
-        <w:t xml:space="preserve">Agricultural water demand in Scott Valley has been simulated for a historical model period of Oct. 1, 1990 to Sept. 30, 2025, using the calibrated Scott Valley Integrated Hydrologic Model (SVIHM)</w:t>
+        <w:t xml:space="preserve">Agricultural water demand in Scott Valley has been</w:t>
+      </w:r>
+      <w:r>
+        <w:t xml:space="preserve"> </w:t>
+      </w:r>
+      <w:r>
+        <w:rPr>
+          <w:b/>
+          <w:bCs/>
+        </w:rPr>
+        <w:t xml:space="preserve">investigated?</w:t>
+      </w:r>
+      <w:r>
+        <w:t xml:space="preserve"> </w:t>
+      </w:r>
+      <w:r>
+        <w:rPr>
+          <w:b/>
+          <w:bCs/>
+        </w:rPr>
+        <w:t xml:space="preserve">Cite Orloff/Snyder work?</w:t>
+      </w:r>
+      <w:r>
+        <w:t xml:space="preserve"> </w:t>
+      </w:r>
+      <w:r>
+        <w:t xml:space="preserve">simulated for a historical model period of Oct. 1, 1990 to Sept. 30, 2025, using the calibrated Scott Valley Integrated Hydrologic Model (SVIHM)</w:t>
       </w:r>
       <w:r>
         <w:t xml:space="preserve"> </w:t>
@@ -2546,7 +2580,7 @@
     </w:p>
     <w:bookmarkEnd w:id="43"/>
     <w:bookmarkEnd w:id="44"/>
-    <w:bookmarkStart w:id="58" w:name="methods"/>
+    <w:bookmarkStart w:id="57" w:name="methods"/>
     <w:p>
       <w:pPr>
         <w:pStyle w:val="Heading1"/>
@@ -2569,7 +2603,15 @@
         <w:pStyle w:val="FirstParagraph"/>
       </w:pPr>
       <w:r>
-        <w:t xml:space="preserve">We developed two objective functions and one categorical objective proxy to evaluate the management scenarios developed for the GSP. The three objectives were:</w:t>
+        <w:t xml:space="preserve">After 2021, we expanded on this public planning effort with a research study, based on the suite of management scenarios designed for the GSP, in the hopes that it could inform water management decisions during 5-year GSP updates over the coming decades.</w:t>
+      </w:r>
+    </w:p>
+    <w:p>
+      <w:pPr>
+        <w:pStyle w:val="BodyText"/>
+      </w:pPr>
+      <w:r>
+        <w:t xml:space="preserve">In particular, we developed two quantitative objective functions and one categorical objective proxy to evaluate the management scenarios developed for the GSP. The three objectives were:</w:t>
       </w:r>
     </w:p>
     <w:p>
@@ -2577,7 +2619,7 @@
         <w:pStyle w:val="Compact"/>
         <w:numPr>
           <w:ilvl w:val="0"/>
-          <w:numId w:val="1002"/>
+          <w:numId w:val="1003"/>
         </w:numPr>
       </w:pPr>
       <w:r>
@@ -2589,7 +2631,7 @@
         <w:pStyle w:val="Compact"/>
         <w:numPr>
           <w:ilvl w:val="0"/>
-          <w:numId w:val="1002"/>
+          <w:numId w:val="1003"/>
         </w:numPr>
       </w:pPr>
       <w:r>
@@ -2601,7 +2643,7 @@
         <w:pStyle w:val="Compact"/>
         <w:numPr>
           <w:ilvl w:val="0"/>
-          <w:numId w:val="1002"/>
+          <w:numId w:val="1003"/>
         </w:numPr>
       </w:pPr>
       <w:r>
@@ -3038,7 +3080,7 @@
         </w:tc>
       </w:tr>
     </w:tbl>
-    <w:bookmarkStart w:id="51" w:name="objective-functions"/>
+    <w:bookmarkStart w:id="50" w:name="objective-functions"/>
     <w:p>
       <w:pPr>
         <w:pStyle w:val="Heading2"/>
@@ -3056,7 +3098,7 @@
         <w:t xml:space="preserve">Objective functions</w:t>
       </w:r>
     </w:p>
-    <w:bookmarkStart w:id="46" w:name="hydrologic-benefit-function"/>
+    <w:bookmarkStart w:id="47" w:name="hydrologic-benefit-function"/>
     <w:p>
       <w:pPr>
         <w:pStyle w:val="Heading3"/>
@@ -3079,7 +3121,15 @@
         <w:pStyle w:val="FirstParagraph"/>
       </w:pPr>
       <w:r>
-        <w:t xml:space="preserve">In previous work</w:t>
+        <w:t xml:space="preserve">Conceptually, the Hydrologic Benefit (HB) function aims to answer the question: to what degree does this water year provide enough flow, at the right time, for this species?</w:t>
+      </w:r>
+    </w:p>
+    <w:p>
+      <w:pPr>
+        <w:pStyle w:val="BodyText"/>
+      </w:pPr>
+      <w:r>
+        <w:t xml:space="preserve">In a previous study, we empirically identified hydrograph features of high importance to Scott River coho and Chinook, based on correlations between hydrology and ecological observations such as outmigrating juvenile abundance</w:t>
       </w:r>
       <w:r>
         <w:t xml:space="preserve"> </w:t>
@@ -3088,7 +3138,15 @@
         <w:t xml:space="preserve">(Kouba et al. 2025)</w:t>
       </w:r>
       <w:r>
-        <w:t xml:space="preserve">, we showed that the relative degree to which a given water year provided ecological services needed by coho salmon can be empirically estimated using a Hydrologic Benefit (HB) function, which is represented as a linear combination of annual functional flow values. Functional flows are set of streamflow metrics related to the timing, amplitude, and duration of flow phenomena</w:t>
+        <w:t xml:space="preserve">. The HB function is represented as a linear combination of these high-importance annual functional flow values.</w:t>
+      </w:r>
+    </w:p>
+    <w:p>
+      <w:pPr>
+        <w:pStyle w:val="BodyText"/>
+      </w:pPr>
+      <w:r>
+        <w:t xml:space="preserve">Functional flows are set of streamflow metrics related to the timing, amplitude, and duration of flow phenomena</w:t>
       </w:r>
       <w:r>
         <w:t xml:space="preserve"> </w:t>
@@ -3097,10 +3155,7 @@
         <w:t xml:space="preserve">(Yarnell et al. 2015; Patterson et al. 2020; Carpenter 2024)</w:t>
       </w:r>
       <w:r>
-        <w:t xml:space="preserve"> </w:t>
-      </w:r>
-      <w:r>
-        <w:t xml:space="preserve">were weighted according to their power to predict coho outcomes, such as smolt production or smolt production normalized per female spawner. The combination of these weighted metrics can be interpreted as a prediction of coho salmon reproduction</w:t>
+        <w:t xml:space="preserve">. In the HB function, these were weighted according to their power to predict coho and Chinook outcomes, such as smolt production or smolt production normalized per female spawner. The combination of these weighted metrics can be interpreted as a prediction of coho salmon reproduction</w:t>
       </w:r>
       <w:r>
         <w:t xml:space="preserve"> </w:t>
@@ -3110,7 +3165,7 @@
           <w:i/>
           <w:iCs/>
         </w:rPr>
-        <w:t xml:space="preserve">due to hydrologic factors</w:t>
+        <w:t xml:space="preserve">supported by hydrologic factors</w:t>
       </w:r>
       <w:r>
         <w:t xml:space="preserve">. Importantly, the HB function selected for this exercise only explains about</w:t>
@@ -3120,16 +3175,25 @@
       </w:r>
       <w:r>
         <w:rPr>
-          <w:b/>
-          <w:bCs/>
+          <w:i/>
+          <w:iCs/>
         </w:rPr>
-        <w:t xml:space="preserve">60%</w:t>
-      </w:r>
-      <w:r>
-        <w:t xml:space="preserve"> </w:t>
-      </w:r>
-      <w:r>
-        <w:t xml:space="preserve">of variation in observed smolt abundance, and the remaining 40% of variation is assumed related to other life conditions, e.g., number of returning spawners, water quality, food resources, and internal fishery population dynamics.</w:t>
+        <w:t xml:space="preserve">40% to 60%</w:t>
+      </w:r>
+      <w:r>
+        <w:t xml:space="preserve"> </w:t>
+      </w:r>
+      <w:r>
+        <w:t xml:space="preserve">of variation in observed smolt abundance, and the remaining 60%-40% of variation is assumed related to other life conditions, e.g., number of returning spawners, water quality, food resources, and internal fishery population dynamics</w:t>
+      </w:r>
+      <w:r>
+        <w:t xml:space="preserve"> </w:t>
+      </w:r>
+      <w:r>
+        <w:t xml:space="preserve">(Kouba et al. 2025)</w:t>
+      </w:r>
+      <w:r>
+        <w:t xml:space="preserve">.</w:t>
       </w:r>
     </w:p>
     <w:p>
@@ -3137,16 +3201,7 @@
         <w:pStyle w:val="BodyText"/>
       </w:pPr>
       <w:r>
-        <w:t xml:space="preserve">Specifically, the HB function predicts a higher number of coho smolt produced (coho smolt-equivalent) is related to higher fall flows during a cohort’s parents’ spawning, lower fall flows during a cohort’s time as overwintering yearlings, and a slower spring recession (see intercept and coefficient values in Table</w:t>
-      </w:r>
-      <w:r>
-        <w:t xml:space="preserve"> </w:t>
-      </w:r>
-      <w:r>
-        <w:t xml:space="preserve">??</w:t>
-      </w:r>
-      <w:r>
-        <w:t xml:space="preserve">).</w:t>
+        <w:t xml:space="preserve">There are many different possible HB function formulations; one example HB function is included below and three additional formulations are explored in Supplemental Material. These four HB functions correspond to the two species (coho and Chinook) as measured using two different units of annual salmon reproduction (outmigrating smolt abundance and normalized smolt-per-adult-spawner in the relevant brood year). See Supplemental Material for more HB function design information.</w:t>
       </w:r>
     </w:p>
     <w:p>
@@ -3154,46 +3209,24 @@
         <w:pStyle w:val="BodyText"/>
       </w:pPr>
       <w:r>
-        <w:rPr>
-          <w:b/>
-          <w:bCs/>
-        </w:rPr>
-        <w:t xml:space="preserve">language on selecting smolt based on hydro only predictors, and only for coho</w:t>
-      </w:r>
-    </w:p>
-    <w:bookmarkEnd w:id="46"/>
-    <w:bookmarkStart w:id="48" w:name="ensemble-hb-function"/>
-    <w:p>
-      <w:pPr>
-        <w:pStyle w:val="Heading3"/>
-      </w:pPr>
-      <w:r>
-        <w:rPr>
-          <w:rStyle w:val="SectionNumber"/>
-        </w:rPr>
-        <w:t xml:space="preserve">3.1.2</w:t>
-      </w:r>
-      <w:r>
-        <w:tab/>
-      </w:r>
-      <w:r>
-        <w:t xml:space="preserve">Ensemble HB function</w:t>
+        <w:t xml:space="preserve">The example HB function highlighted here is based on coho juvenile outmigrant abundance. It predicts that a higher number of coho smolt produced (coho smolt-equivalent) is related to higher fall flows during a cohort’s parents’ spawning, lower fall flows during a cohort’s time as overwintering yearlings, and a slower spring recession (see coefficient values in Table</w:t>
+      </w:r>
+      <w:r>
+        <w:t xml:space="preserve"> </w:t>
+      </w:r>
+      <w:r>
+        <w:t xml:space="preserve">??</w:t>
+      </w:r>
+      <w:r>
+        <w:t xml:space="preserve">).</w:t>
       </w:r>
     </w:p>
     <w:p>
       <w:pPr>
-        <w:pStyle w:val="FirstParagraph"/>
-      </w:pPr>
-      <w:r>
-        <w:t xml:space="preserve">For each species, across all statistical methods, the coefficients for any single predictor were consistently negative or positive; e.g.,</w:t>
-      </w:r>
-    </w:p>
-    <w:p>
-      <w:pPr>
         <w:pStyle w:val="TableCaption"/>
       </w:pPr>
-      <w:bookmarkStart w:id="47" w:name="tab:coefTabMainText"/>
-      <w:bookmarkEnd w:id="47"/>
+      <w:bookmarkStart w:id="46" w:name="tab:coefTabMainText"/>
+      <w:bookmarkEnd w:id="46"/>
       <w:r>
         <w:t xml:space="preserve">Table 3:</w:t>
       </w:r>
@@ -3912,7 +3945,7 @@
         <w:pStyle w:val="BodyText"/>
       </w:pPr>
       <w:r>
-        <w:t xml:space="preserve">The HB function was formulated based on functional flow metrics of the observed daily average flow record of the FJ gauge (</w:t>
+        <w:t xml:space="preserve">Functional flow metrics informing the HB function were calculated from the observed daily average flow record of the FJ gauge (</w:t>
       </w:r>
       <m:oMath>
         <m:r>
@@ -3938,7 +3971,32 @@
         </m:sSub>
       </m:oMath>
       <w:r>
-        <w:t xml:space="preserve">). One key result of the historical basecase scenario is a simulated estimate of the historical FJ gauge record (</w:t>
+        <w:t xml:space="preserve">), using signal processing algorithms developed by the California Environmental Flows Framework</w:t>
+      </w:r>
+      <w:r>
+        <w:t xml:space="preserve"> </w:t>
+      </w:r>
+      <w:r>
+        <w:t xml:space="preserve">(Yarnell et al. 2015; Patterson et al. 2020; Carpenter 2024)</w:t>
+      </w:r>
+      <w:r>
+        <w:t xml:space="preserve">. One key model result of the historical basecase scenario in SVIHM is a</w:t>
+      </w:r>
+      <w:r>
+        <w:t xml:space="preserve"> </w:t>
+      </w:r>
+      <w:r>
+        <w:rPr>
+          <w:i/>
+          <w:iCs/>
+        </w:rPr>
+        <w:t xml:space="preserve">simulated</w:t>
+      </w:r>
+      <w:r>
+        <w:t xml:space="preserve"> </w:t>
+      </w:r>
+      <w:r>
+        <w:t xml:space="preserve">estimate of the historical FJ gauge record (</w:t>
       </w:r>
       <m:oMath>
         <m:r>
@@ -3997,7 +4055,7 @@
         </m:sSub>
       </m:oMath>
       <w:r>
-        <w:t xml:space="preserve">); however, although SVIHM was extensively calibrated</w:t>
+        <w:t xml:space="preserve">). However, although SVIHM was extensively calibrated</w:t>
       </w:r>
       <w:r>
         <w:t xml:space="preserve"> </w:t>
@@ -4100,7 +4158,7 @@
         </m:sSub>
       </m:oMath>
       <w:r>
-        <w:t xml:space="preserve">. As a result of these differences, HB values calculated from flow metrics of</w:t>
+        <w:t xml:space="preserve">. To control for this, all basecase HB values used in this study are derived from</w:t>
       </w:r>
       <w:r>
         <w:t xml:space="preserve"> </w:t>
@@ -4162,132 +4220,85 @@
         </m:sSub>
       </m:oMath>
       <w:r>
-        <w:t xml:space="preserve"> </w:t>
-      </w:r>
-      <w:r>
-        <w:t xml:space="preserve">tend to be higher than HB values derived from</w:t>
-      </w:r>
-      <w:r>
-        <w:t xml:space="preserve"> </w:t>
-      </w:r>
-      <m:oMath>
-        <m:r>
-          <m:t>F</m:t>
-        </m:r>
-        <m:sSub>
-          <m:e>
-            <m:r>
-              <m:t>J</m:t>
-            </m:r>
-          </m:e>
-          <m:sub>
-            <m:r>
-              <m:t>o</m:t>
-            </m:r>
-            <m:r>
-              <m:t>b</m:t>
-            </m:r>
-            <m:r>
-              <m:t>s</m:t>
-            </m:r>
-          </m:sub>
-        </m:sSub>
-      </m:oMath>
-      <w:r>
-        <w:t xml:space="preserve"> </w:t>
-      </w:r>
-      <w:r>
-        <w:t xml:space="preserve">by a mean of</w:t>
-      </w:r>
-      <w:r>
-        <w:t xml:space="preserve"> </w:t>
+        <w:t xml:space="preserve">, making them directly comparable to HB values derived from the simulated FJ flow records in the hypothetical management scenarios.</w:t>
+      </w:r>
+      <w:r>
+        <w:t xml:space="preserve"> </w:t>
+      </w:r>
+    </w:p>
+    <w:bookmarkEnd w:id="47"/>
+    <w:bookmarkStart w:id="48" w:name="Xb6ca5dd654202e76d1db9f1bc12c98cced9d6aa"/>
+    <w:p>
+      <w:pPr>
+        <w:pStyle w:val="Heading3"/>
+      </w:pPr>
+      <w:r>
+        <w:rPr>
+          <w:rStyle w:val="SectionNumber"/>
+        </w:rPr>
+        <w:t xml:space="preserve">3.1.2</w:t>
+      </w:r>
+      <w:r>
+        <w:tab/>
+      </w:r>
+      <w:r>
+        <w:t xml:space="preserve">ET volume function (agricultural benefit proxy)</w:t>
+      </w:r>
+    </w:p>
+    <w:p>
+      <w:pPr>
+        <w:pStyle w:val="FirstParagraph"/>
+      </w:pPr>
+      <w:r>
+        <w:t xml:space="preserve">The annual crop ET volume, which is explicitly simulated in the hydrologic model, is used here as a proxy for agricultural productivity. Other options for framing the agricultural water use objective function include crop yields and total revenue, which may be of greater concern to stakeholders; however, annual crop ET was selected because the impacts of reduced water availability on yield or revenue will likely vary by grower and over time.</w:t>
+      </w:r>
+    </w:p>
+    <w:p>
+      <w:pPr>
+        <w:pStyle w:val="BodyText"/>
+      </w:pPr>
+      <w:r>
+        <w:t xml:space="preserve">Additionally, for alfalfa and pasture, which continue growing as long as water is available, a strong relationship between crop ET and yield is assumed</w:t>
+      </w:r>
+      <w:r>
+        <w:t xml:space="preserve"> </w:t>
+      </w:r>
+      <w:r>
+        <w:t xml:space="preserve">(Carter and Sheaffer 1983)</w:t>
+      </w:r>
+      <w:r>
+        <w:t xml:space="preserve">. The assumption that crop ET is consistently related to yield or revenue breaks down for a management scenario that includes changing crops; this is explored further in the Discussion section. But on the merits of these options, annual crop ET was selected to represent agricultural benefit.</w:t>
+      </w:r>
+    </w:p>
+    <w:p>
+      <w:pPr>
+        <w:pStyle w:val="BodyText"/>
+      </w:pPr>
+      <w:r>
+        <w:t xml:space="preserve">We assume that grain, another important local crop, has a different relationship than alfalfa between ET and revenue, as grain is harvested once per year in mid-to-late summer and alfalfa is harvested three to four times per year in this region</w:t>
+      </w:r>
+      <w:r>
+        <w:t xml:space="preserve"> </w:t>
+      </w:r>
+      <w:r>
+        <w:t xml:space="preserve">(</w:t>
       </w:r>
       <w:r>
         <w:rPr>
           <w:b/>
           <w:bCs/>
         </w:rPr>
-        <w:t xml:space="preserve">4.5</w:t>
-      </w:r>
-      <w:r>
-        <w:t xml:space="preserve"> </w:t>
-      </w:r>
-      <w:r>
-        <w:t xml:space="preserve">coho spf-equiv.</w:t>
-      </w:r>
-    </w:p>
-    <w:p>
-      <w:pPr>
-        <w:pStyle w:val="BodyText"/>
-      </w:pPr>
-      <w:r>
-        <w:t xml:space="preserve">To control for this, all basecase HB values used in this study are derived from</w:t>
-      </w:r>
-      <w:r>
-        <w:t xml:space="preserve"> </w:t>
-      </w:r>
-      <m:oMath>
-        <m:r>
-          <m:t>F</m:t>
-        </m:r>
-        <m:sSub>
-          <m:e>
-            <m:r>
-              <m:t>J</m:t>
-            </m:r>
-          </m:e>
-          <m:sub>
-            <m:r>
-              <m:t>s</m:t>
-            </m:r>
-            <m:r>
-              <m:t>i</m:t>
-            </m:r>
-            <m:r>
-              <m:t>m</m:t>
-            </m:r>
-            <m:r>
-              <m:rPr>
-                <m:sty m:val="p"/>
-              </m:rPr>
-              <m:t>,</m:t>
-            </m:r>
-            <m:r>
-              <m:t> </m:t>
-            </m:r>
-            <m:r>
-              <m:t>b</m:t>
-            </m:r>
-            <m:r>
-              <m:t>a</m:t>
-            </m:r>
-            <m:r>
-              <m:t>s</m:t>
-            </m:r>
-            <m:r>
-              <m:t>e</m:t>
-            </m:r>
-            <m:r>
-              <m:t>c</m:t>
-            </m:r>
-            <m:r>
-              <m:t>a</m:t>
-            </m:r>
-            <m:r>
-              <m:t>s</m:t>
-            </m:r>
-            <m:r>
-              <m:t>e</m:t>
-            </m:r>
-          </m:sub>
-        </m:sSub>
-      </m:oMath>
-      <w:r>
-        <w:t xml:space="preserve">, making them directly comparable to HB values derived from the simulated FJ flow records in the hypothetical management scenarios.</w:t>
+        <w:t xml:space="preserve">HarterHines2008?</w:t>
+      </w:r>
+      <w:r>
+        <w:t xml:space="preserve">)</w:t>
+      </w:r>
+      <w:r>
+        <w:t xml:space="preserve">. This makes interpretation of the agricultural objective functions more complicated for three crop change scenarios in which alfalfa is converted to grain; see additional discussion in Section 5.</w:t>
       </w:r>
     </w:p>
     <w:bookmarkEnd w:id="48"/>
-    <w:bookmarkStart w:id="49" w:name="Xb6ca5dd654202e76d1db9f1bc12c98cced9d6aa"/>
+    <w:bookmarkStart w:id="49" w:name="Xfd5664932b25b1108017cbc6e0e75c8014ecd36"/>
     <w:p>
       <w:pPr>
         <w:pStyle w:val="Heading3"/>
@@ -4302,63 +4313,6 @@
         <w:tab/>
       </w:r>
       <w:r>
-        <w:t xml:space="preserve">ET volume function (agricultural benefit proxy)</w:t>
-      </w:r>
-    </w:p>
-    <w:p>
-      <w:pPr>
-        <w:pStyle w:val="FirstParagraph"/>
-      </w:pPr>
-      <w:r>
-        <w:t xml:space="preserve">The annual crop ET volume, which is explicitly simulated in the hydrologic model, is used here as a proxy for agricultural productivity. Other options for framing the agricultural water use objective function include crop yields and total revenue, which may be of greater concern to stakeholders; however, annual crop ET was selected because the impacts of reduced water availability on yield or revenue will likely vary by grower and over time.</w:t>
-      </w:r>
-    </w:p>
-    <w:p>
-      <w:pPr>
-        <w:pStyle w:val="BodyText"/>
-      </w:pPr>
-      <w:r>
-        <w:t xml:space="preserve">Additionally, for alfalfa and pasture</w:t>
-      </w:r>
-      <w:r>
-        <w:t xml:space="preserve"> </w:t>
-      </w:r>
-      <w:r>
-        <w:rPr>
-          <w:b/>
-          <w:bCs/>
-        </w:rPr>
-        <w:t xml:space="preserve">and grain?</w:t>
-      </w:r>
-      <w:r>
-        <w:t xml:space="preserve">, which continue growing as long as water is available, a strong relationship between crop ET and yield is assumed</w:t>
-      </w:r>
-      <w:r>
-        <w:t xml:space="preserve"> </w:t>
-      </w:r>
-      <w:r>
-        <w:t xml:space="preserve">(Carter and Sheaffer 1983)</w:t>
-      </w:r>
-      <w:r>
-        <w:t xml:space="preserve">. The assumption that crop ET is consistently related to yield or revenue breaks down for a management scenario that includes changing crops; this is explored further in the Discussion section. But on the merits of these options, annual crop ET was selected to represent agricultural benefit.</w:t>
-      </w:r>
-    </w:p>
-    <w:bookmarkEnd w:id="49"/>
-    <w:bookmarkStart w:id="50" w:name="Xfd5664932b25b1108017cbc6e0e75c8014ecd36"/>
-    <w:p>
-      <w:pPr>
-        <w:pStyle w:val="Heading3"/>
-      </w:pPr>
-      <w:r>
-        <w:rPr>
-          <w:rStyle w:val="SectionNumber"/>
-        </w:rPr>
-        <w:t xml:space="preserve">3.1.4</w:t>
-      </w:r>
-      <w:r>
-        <w:tab/>
-      </w:r>
-      <w:r>
         <w:t xml:space="preserve">Proxy for scenario infrastructure investment</w:t>
       </w:r>
     </w:p>
@@ -4375,7 +4329,7 @@
         <w:pStyle w:val="Compact"/>
         <w:numPr>
           <w:ilvl w:val="0"/>
-          <w:numId w:val="1003"/>
+          <w:numId w:val="1004"/>
         </w:numPr>
       </w:pPr>
       <w:r>
@@ -4387,7 +4341,7 @@
         <w:pStyle w:val="Compact"/>
         <w:numPr>
           <w:ilvl w:val="0"/>
-          <w:numId w:val="1003"/>
+          <w:numId w:val="1004"/>
         </w:numPr>
       </w:pPr>
       <w:r>
@@ -4399,7 +4353,7 @@
         <w:pStyle w:val="Compact"/>
         <w:numPr>
           <w:ilvl w:val="0"/>
-          <w:numId w:val="1003"/>
+          <w:numId w:val="1004"/>
         </w:numPr>
       </w:pPr>
       <w:r>
@@ -4411,7 +4365,7 @@
         <w:pStyle w:val="Compact"/>
         <w:numPr>
           <w:ilvl w:val="0"/>
-          <w:numId w:val="1003"/>
+          <w:numId w:val="1004"/>
         </w:numPr>
       </w:pPr>
       <w:r>
@@ -4423,7 +4377,7 @@
         <w:pStyle w:val="Compact"/>
         <w:numPr>
           <w:ilvl w:val="0"/>
-          <w:numId w:val="1003"/>
+          <w:numId w:val="1004"/>
         </w:numPr>
       </w:pPr>
       <w:r>
@@ -4435,13 +4389,13 @@
         <w:pStyle w:val="FirstParagraph"/>
       </w:pPr>
       <w:r>
-        <w:t xml:space="preserve">This reflects the first-order understanding that, for example, building a reservoir (assigned to category 4) will take more effort and resources in terms of permitting and construction than widespread installation of highly efficient irrigation systems (assigned to category 2). See Table</w:t>
-      </w:r>
-      <w:r>
-        <w:t xml:space="preserve"> </w:t>
-      </w:r>
-      <w:r>
-        <w:t xml:space="preserve">??</w:t>
+        <w:t xml:space="preserve">This reflects the first-order understanding that, for example, building a reservoir (assigned to category 4) will take more effort and resources in terms of permitting and construction than widespread installation of higher-efficiency irrigation technology (assigned to category 2). See Table</w:t>
+      </w:r>
+      <w:r>
+        <w:t xml:space="preserve"> </w:t>
+      </w:r>
+      <w:r>
+        <w:t xml:space="preserve">5</w:t>
       </w:r>
       <w:r>
         <w:t xml:space="preserve"> </w:t>
@@ -4450,9 +4404,9 @@
         <w:t xml:space="preserve">for full list of assigned categories.</w:t>
       </w:r>
     </w:p>
+    <w:bookmarkEnd w:id="49"/>
     <w:bookmarkEnd w:id="50"/>
-    <w:bookmarkEnd w:id="51"/>
-    <w:bookmarkStart w:id="54" w:name="analyses-of-objective-function-values"/>
+    <w:bookmarkStart w:id="53" w:name="analyses-of-objective-function-values"/>
     <w:p>
       <w:pPr>
         <w:pStyle w:val="Heading2"/>
@@ -4470,7 +4424,7 @@
         <w:t xml:space="preserve">Analyses of objective function values</w:t>
       </w:r>
     </w:p>
-    <w:bookmarkStart w:id="52" w:name="trade-off-efficiency"/>
+    <w:bookmarkStart w:id="51" w:name="trade-off-efficiency"/>
     <w:p>
       <w:pPr>
         <w:pStyle w:val="Heading3"/>
@@ -5311,8 +5265,8 @@
         </m:oMath>
       </m:oMathPara>
     </w:p>
-    <w:bookmarkEnd w:id="52"/>
-    <w:bookmarkStart w:id="53" w:name="pareto-optimal-set-of-management-actions"/>
+    <w:bookmarkEnd w:id="51"/>
+    <w:bookmarkStart w:id="52" w:name="pareto-optimal-set-of-management-actions"/>
     <w:p>
       <w:pPr>
         <w:pStyle w:val="Heading3"/>
@@ -5341,25 +5295,15 @@
         <w:t xml:space="preserve"> </w:t>
       </w:r>
       <w:r>
-        <w:t xml:space="preserve">(</w:t>
-      </w:r>
-      <w:r>
-        <w:rPr>
-          <w:b/>
-          <w:bCs/>
-        </w:rPr>
-        <w:t xml:space="preserve">ParetoVilfredoCours1896?</w:t>
-      </w:r>
-      <w:r>
-        <w:t xml:space="preserve">)</w:t>
+        <w:t xml:space="preserve">(Pareto 1896)</w:t>
       </w:r>
       <w:r>
         <w:t xml:space="preserve">. A scenario was identified as Pareto-optimal if there were no other scenarios that performed better in two or more objectives. In other words, the Pareto-optimal set is the collection of scenarios in which it is not possible to improve on one objective without reducing performance in another objective. By definition, this set cannot identify a single best scenario or evaluate trade-offs between objectives; we use it here to identify obviously suboptimal scenarios.</w:t>
       </w:r>
     </w:p>
+    <w:bookmarkEnd w:id="52"/>
     <w:bookmarkEnd w:id="53"/>
-    <w:bookmarkEnd w:id="54"/>
-    <w:bookmarkStart w:id="55" w:name="hydrologic-model-summary"/>
+    <w:bookmarkStart w:id="54" w:name="hydrologic-model-summary"/>
     <w:p>
       <w:pPr>
         <w:pStyle w:val="Heading2"/>
@@ -5411,17 +5355,7 @@
         <w:pStyle w:val="BodyText"/>
       </w:pPr>
       <w:r>
-        <w:t xml:space="preserve">The SVIHM is composed of three cascading sub-models. First,</w:t>
-      </w:r>
-      <w:r>
-        <w:t xml:space="preserve"> </w:t>
-      </w:r>
-      <w:r>
-        <w:rPr>
-          <w:b/>
-          <w:bCs/>
-        </w:rPr>
-        <w:t xml:space="preserve">complete daily records of tributary stream inflow are generated using a statistical streamflow regression model, in which the continuous Fort Jones record was used to predict missing values in the daily flow records of 12 major tributaries</w:t>
+        <w:t xml:space="preserve">The SVIHM is composed of three cascading sub-models. First, complete daily records of tributary stream inflow are generated using a statistical streamflow regression model, in which the continuous Fort Jones record was used to predict missing values in the daily flow records of 12 major tributaries</w:t>
       </w:r>
       <w:r>
         <w:t xml:space="preserve"> </w:t>
@@ -5440,16 +5374,6 @@
       </w:r>
       <w:r>
         <w:t xml:space="preserve">.</w:t>
-      </w:r>
-      <w:r>
-        <w:t xml:space="preserve"> </w:t>
-      </w:r>
-      <w:r>
-        <w:rPr>
-          <w:b/>
-          <w:bCs/>
-        </w:rPr>
-        <w:t xml:space="preserve">Add text re: Leland’s updates to SVIHM? Bah, should I rerun everything using the latest model version?</w:t>
       </w:r>
     </w:p>
     <w:p>
@@ -5465,7 +5389,7 @@
         <w:pStyle w:val="Compact"/>
         <w:numPr>
           <w:ilvl w:val="0"/>
-          <w:numId w:val="1004"/>
+          <w:numId w:val="1005"/>
         </w:numPr>
       </w:pPr>
       <w:r>
@@ -5477,15 +5401,15 @@
         <w:pStyle w:val="Compact"/>
         <w:numPr>
           <w:ilvl w:val="0"/>
-          <w:numId w:val="1004"/>
+          <w:numId w:val="1005"/>
         </w:numPr>
       </w:pPr>
       <w:r>
         <w:t xml:space="preserve">Simulated total ET of crops and native vegetation within the model domain.</w:t>
       </w:r>
     </w:p>
-    <w:bookmarkEnd w:id="55"/>
-    <w:bookmarkStart w:id="57" w:name="management-scenario-descriptions"/>
+    <w:bookmarkEnd w:id="54"/>
+    <w:bookmarkStart w:id="56" w:name="management-scenario-descriptions"/>
     <w:p>
       <w:pPr>
         <w:pStyle w:val="Heading2"/>
@@ -5543,31 +5467,15 @@
         <w:t xml:space="preserve">4</w:t>
       </w:r>
       <w:r>
-        <w:t xml:space="preserve">). Within each category various details were altered (e.g., an alfalfa irrigation cessation date of July 10 versus August 15, or an assumed crop water consumption of 80% versus 90% of historical). See</w:t>
-      </w:r>
-      <w:r>
-        <w:t xml:space="preserve"> </w:t>
-      </w:r>
-      <w:r>
-        <w:rPr>
-          <w:i/>
-          <w:iCs/>
-        </w:rPr>
-        <w:t xml:space="preserve">Chapter 2 Supplement</w:t>
-      </w:r>
-      <w:r>
-        <w:t xml:space="preserve"> </w:t>
-      </w:r>
-      <w:r>
-        <w:t xml:space="preserve">for more detailed scenario descriptions.</w:t>
+        <w:t xml:space="preserve">). Within each category various details were altered (e.g., an alfalfa irrigation cessation date of July 10 versus August 15). See Supplemental Material for more detailed scenario descriptions.</w:t>
       </w:r>
     </w:p>
     <w:p>
       <w:pPr>
         <w:pStyle w:val="TableCaption"/>
       </w:pPr>
-      <w:bookmarkStart w:id="56" w:name="tab:scenCategoryTab"/>
-      <w:bookmarkEnd w:id="56"/>
+      <w:bookmarkStart w:id="55" w:name="tab:scenCategoryTab"/>
+      <w:bookmarkEnd w:id="55"/>
       <w:r>
         <w:t xml:space="preserve">Table 4:</w:t>
       </w:r>
@@ -8079,9 +7987,9 @@
         </w:tc>
       </w:tr>
     </w:tbl>
+    <w:bookmarkEnd w:id="56"/>
     <w:bookmarkEnd w:id="57"/>
-    <w:bookmarkEnd w:id="58"/>
-    <w:bookmarkStart w:id="80" w:name="results"/>
+    <w:bookmarkStart w:id="79" w:name="results"/>
     <w:p>
       <w:pPr>
         <w:pStyle w:val="Heading1"/>
@@ -8104,32 +8012,19 @@
         <w:pStyle w:val="FirstParagraph"/>
       </w:pPr>
       <w:r>
-        <w:t xml:space="preserve">As described above, objective functions were used to quantitatively summarize the achievement of environmental and agricultural goals for the basecase and 24 management scenarios. A Hydrologic Benefit (HB) value (in units of</w:t>
-      </w:r>
-      <w:r>
-        <w:t xml:space="preserve"> </w:t>
-      </w:r>
-      <w:r>
-        <w:rPr>
-          <w:b/>
-          <w:bCs/>
-        </w:rPr>
-        <w:t xml:space="preserve">predicted coho smolt production per spawning female, or coho spf-equivalent</w:t>
-      </w:r>
-      <w:r>
-        <w:t xml:space="preserve">) and a total crop ET volume was calculated for each water year in the 28-year simulation period, for each scenario. Each scenario has also been given an infrastructure feasibility proxy (Table</w:t>
-      </w:r>
-      <w:r>
-        <w:t xml:space="preserve"> </w:t>
-      </w:r>
-      <w:r>
-        <w:t xml:space="preserve">??</w:t>
+        <w:t xml:space="preserve">As described above, objective functions were used to quantitatively summarize the achievement of environmental and agricultural goals for the basecase and 24 management scenarios. A Hydrologic Benefit (HB) value in units of predicted smolt abundance for coho (see below) or Chinook (see Supplemental Material), or in units of normalized smolt production per spawning female (see Supplemental material), and a total crop ET volume was calculated for each water year in the 28-year simulation period, for each scenario. Each scenario has also been given an infrastructure feasibility proxy (Table</w:t>
+      </w:r>
+      <w:r>
+        <w:t xml:space="preserve"> </w:t>
+      </w:r>
+      <w:r>
+        <w:t xml:space="preserve">5</w:t>
       </w:r>
       <w:r>
         <w:t xml:space="preserve">).</w:t>
       </w:r>
     </w:p>
-    <w:bookmarkStart w:id="68" w:name="X7919b09686293416b4bcb59483f48ae87a57064"/>
+    <w:bookmarkStart w:id="67" w:name="X7919b09686293416b4bcb59483f48ae87a57064"/>
     <w:p>
       <w:pPr>
         <w:pStyle w:val="Heading2"/>
@@ -8176,18 +8071,18 @@
           <wp:inline>
             <wp:extent cx="5334000" cy="5000625"/>
             <wp:effectExtent b="0" l="0" r="0" t="0"/>
-            <wp:docPr descr="Figure 5:  Comparison of annual performance in two objective functions (Hydrologic Benefit and ET, representing environmental and agricultural objectives, respectively) for brood years 1991-2025. The scenarios pictured are basecase (black circles) and a scenario from each of three categories: Enhanced Recharge, Crop Change, and Native Vegetation (Low ET). Dry-type water years (vertical bars) are 1991, ’92, ’94, 2001, ’09, ’13, ’14, ’18, and ’20-’22." title="" id="60" name="Picture"/>
+            <wp:docPr descr="Figure 5:  Comparison of annual performance in two objective functions (Hydrologic Benefit and ET, representing environmental and agricultural objectives, respectively) for brood years 1991-2025. The scenarios pictured are basecase (black circles) and a scenario from each of three categories: Enhanced Recharge, Crop Change, and Native Vegetation (Low ET). Dry-type water years (vertical bars) are 1991, ’92, ’94, 2001, ’09, ’13, ’14, ’18, and ’20-’22." title="" id="59" name="Picture"/>
             <a:graphic>
               <a:graphicData uri="http://schemas.openxmlformats.org/drawingml/2006/picture">
                 <pic:pic>
                   <pic:nvPicPr>
-                    <pic:cNvPr descr="Graphics%20and%20Supplements/Figure%204.png" id="61" name="Picture"/>
+                    <pic:cNvPr descr="Graphics%20and%20Supplements/Figure%204.png" id="60" name="Picture"/>
                     <pic:cNvPicPr>
                       <a:picLocks noChangeArrowheads="1" noChangeAspect="1"/>
                     </pic:cNvPicPr>
                   </pic:nvPicPr>
                   <pic:blipFill>
-                    <a:blip r:embed="rId59"/>
+                    <a:blip r:embed="rId58"/>
                     <a:stretch>
                       <a:fillRect/>
                     </a:stretch>
@@ -8218,8 +8113,8 @@
       <w:pPr>
         <w:pStyle w:val="ImageCaption"/>
       </w:pPr>
-      <w:bookmarkStart w:id="62" w:name="fig:benefitByWYMainText"/>
-      <w:bookmarkEnd w:id="62"/>
+      <w:bookmarkStart w:id="61" w:name="fig:benefitByWYMainText"/>
+      <w:bookmarkEnd w:id="61"/>
       <w:r>
         <w:t xml:space="preserve">Figure 5:</w:t>
       </w:r>
@@ -8262,18 +8157,18 @@
           <wp:inline>
             <wp:extent cx="5334000" cy="5334000"/>
             <wp:effectExtent b="0" l="0" r="0" t="0"/>
-            <wp:docPr descr="Figure 6:  Environmental and agricultural objective function performance (in terms of Hydrologic Benefit, or HB, value; and crop ET volume) for basecase (black circle in upper left) and 25 management scenarios. Symbol x and y coordinates are the average of 35 annual HB and ET values for each scenario over the full model period (water years 1991-2025); for exampe time series of annual values, see previous figure." title="" id="64" name="Picture"/>
+            <wp:docPr descr="Figure 6:  Environmental and agricultural objective function performance (in terms of Hydrologic Benefit, or HB, value; and crop ET volume) for basecase (black circle in upper left) and 25 management scenarios. Symbol x and y coordinates are the average of 35 annual HB and ET values for each scenario over the full model period (water years 1991-2025); for exampe time series of annual values, see previous figure." title="" id="63" name="Picture"/>
             <a:graphic>
               <a:graphicData uri="http://schemas.openxmlformats.org/drawingml/2006/picture">
                 <pic:pic>
                   <pic:nvPicPr>
-                    <pic:cNvPr descr="Graphics%20and%20Supplements/Figure%205.png" id="65" name="Picture"/>
+                    <pic:cNvPr descr="Graphics%20and%20Supplements/Figure%205.png" id="64" name="Picture"/>
                     <pic:cNvPicPr>
                       <a:picLocks noChangeArrowheads="1" noChangeAspect="1"/>
                     </pic:cNvPicPr>
                   </pic:nvPicPr>
                   <pic:blipFill>
-                    <a:blip r:embed="rId63"/>
+                    <a:blip r:embed="rId62"/>
                     <a:stretch>
                       <a:fillRect/>
                     </a:stretch>
@@ -8304,8 +8199,8 @@
       <w:pPr>
         <w:pStyle w:val="ImageCaption"/>
       </w:pPr>
-      <w:bookmarkStart w:id="66" w:name="fig:farmerFishTradeoffFigureMainText"/>
-      <w:bookmarkEnd w:id="66"/>
+      <w:bookmarkStart w:id="65" w:name="fig:farmerFishTradeoffFigureMainText"/>
+      <w:bookmarkEnd w:id="65"/>
       <w:r>
         <w:t xml:space="preserve">Figure 6:</w:t>
       </w:r>
@@ -8368,7 +8263,7 @@
         <w:t xml:space="preserve"> </w:t>
       </w:r>
       <w:r>
-        <w:t xml:space="preserve">??</w:t>
+        <w:t xml:space="preserve">5</w:t>
       </w:r>
       <w:r>
         <w:t xml:space="preserve">). In the basecase scenario, the 28-year mean annual ET volume is 118 million m</w:t>
@@ -8389,7 +8284,7 @@
         <w:t xml:space="preserve"> </w:t>
       </w:r>
       <w:r>
-        <w:t xml:space="preserve">??</w:t>
+        <w:t xml:space="preserve">5</w:t>
       </w:r>
       <w:r>
         <w:t xml:space="preserve">). Annual ET volume is relatively stable over the model period of water years 1991-2018, while annual HB values are much more variable (Figure</w:t>
@@ -8708,8 +8603,8 @@
       <w:pPr>
         <w:pStyle w:val="TableCaption"/>
       </w:pPr>
-      <w:bookmarkStart w:id="67" w:name="tab:scenarioResultsTabMainText"/>
-      <w:bookmarkEnd w:id="67"/>
+      <w:bookmarkStart w:id="66" w:name="tab:scenarioResultsTabMainText"/>
+      <w:bookmarkEnd w:id="66"/>
       <w:r>
         <w:t xml:space="preserve">Table 5:</w:t>
       </w:r>
@@ -16901,8 +16796,8 @@
         </w:tc>
       </w:tr>
     </w:tbl>
-    <w:bookmarkEnd w:id="68"/>
-    <w:bookmarkStart w:id="73" w:name="X5717be130d28923be971a1bdea556d769a5487a"/>
+    <w:bookmarkEnd w:id="67"/>
+    <w:bookmarkStart w:id="72" w:name="X5717be130d28923be971a1bdea556d769a5487a"/>
     <w:p>
       <w:pPr>
         <w:pStyle w:val="Heading2"/>
@@ -16960,7 +16855,7 @@
         <w:t xml:space="preserve"> </w:t>
       </w:r>
       <w:r>
-        <w:t xml:space="preserve">??</w:t>
+        <w:t xml:space="preserve">5</w:t>
       </w:r>
       <w:r>
         <w:t xml:space="preserve">). The range covers two orders of magnitude because the denominator of the ratio, lost ET, ranges from 0% to 100%, while the HB gains fall more narrowly between -1.5% to 8.1%. Efficiencies greater than 1 indicate that a scenario produces more than a 1% increase in HB value per 1% loss in ET value. However, because the HB and ET units are non-commensurable, the absolute value of the trade-off efficiency is not of great significance; the trade-off efficiency metric is most useful for scenario comparisons.</w:t>
@@ -17072,18 +16967,18 @@
           <wp:inline>
             <wp:extent cx="5334000" cy="4000499"/>
             <wp:effectExtent b="0" l="0" r="0" t="0"/>
-            <wp:docPr descr="Figure 7:  Scenario trade-off efficiencies, or average Hydrologic Benefit value (a proxy for environmental benefit) gained per crop ET value lost (a proxy for farmer cost) (normalized to average basecase HB and ET values, respectively), in all 35 years. Some scenarios are excluded if they have no or negative ET loss, producing infinite or negative efficiency values." title="" id="70" name="Picture"/>
+            <wp:docPr descr="Figure 7:  Scenario trade-off efficiencies, or average Hydrologic Benefit value (a proxy for environmental benefit) gained per crop ET value lost (a proxy for farmer cost) (normalized to average basecase HB and ET values, respectively), in all 35 years. Some scenarios are excluded if they have no or negative ET loss, producing infinite or negative efficiency values." title="" id="69" name="Picture"/>
             <a:graphic>
               <a:graphicData uri="http://schemas.openxmlformats.org/drawingml/2006/picture">
                 <pic:pic>
                   <pic:nvPicPr>
-                    <pic:cNvPr descr="Graphics%20and%20Supplements/Figure%207.png" id="71" name="Picture"/>
+                    <pic:cNvPr descr="Graphics%20and%20Supplements/Figure%207.png" id="70" name="Picture"/>
                     <pic:cNvPicPr>
                       <a:picLocks noChangeArrowheads="1" noChangeAspect="1"/>
                     </pic:cNvPicPr>
                   </pic:nvPicPr>
                   <pic:blipFill>
-                    <a:blip r:embed="rId69"/>
+                    <a:blip r:embed="rId68"/>
                     <a:stretch>
                       <a:fillRect/>
                     </a:stretch>
@@ -17114,8 +17009,8 @@
       <w:pPr>
         <w:pStyle w:val="ImageCaption"/>
       </w:pPr>
-      <w:bookmarkStart w:id="72" w:name="fig:efficiencyMainText"/>
-      <w:bookmarkEnd w:id="72"/>
+      <w:bookmarkStart w:id="71" w:name="fig:efficiencyMainText"/>
+      <w:bookmarkEnd w:id="71"/>
       <w:r>
         <w:t xml:space="preserve">Figure 7:</w:t>
       </w:r>
@@ -17129,8 +17024,8 @@
         <w:t xml:space="preserve">Scenario trade-off efficiencies, or average Hydrologic Benefit value (a proxy for environmental benefit) gained per crop ET value lost (a proxy for farmer cost) (normalized to average basecase HB and ET values, respectively), in all 35 years. Some scenarios are excluded if they have no or negative ET loss, producing infinite or negative efficiency values.</w:t>
       </w:r>
     </w:p>
-    <w:bookmarkEnd w:id="73"/>
-    <w:bookmarkStart w:id="79" w:name="Xfbc83626841bb94e70b2ed42e58f7fe62bf81a6"/>
+    <w:bookmarkEnd w:id="72"/>
+    <w:bookmarkStart w:id="78" w:name="Xfbc83626841bb94e70b2ed42e58f7fe62bf81a6"/>
     <w:p>
       <w:pPr>
         <w:pStyle w:val="Heading2"/>
@@ -17176,7 +17071,7 @@
         <w:t xml:space="preserve"> </w:t>
       </w:r>
       <w:r>
-        <w:t xml:space="preserve">??</w:t>
+        <w:t xml:space="preserve">5</w:t>
       </w:r>
       <w:r>
         <w:t xml:space="preserve">; Figure</w:t>
@@ -17285,18 +17180,18 @@
           <wp:inline>
             <wp:extent cx="4038600" cy="4019550"/>
             <wp:effectExtent b="0" l="0" r="0" t="0"/>
-            <wp:docPr descr="Figure 8:  A three-dimensional scatter plot of the objective function values for basecase and 39 management scenarios, averaged over 28 water years (1991-2018). Larger spheres are shown for the Pareto-optimal set of scenarios. Scenario colors correspond to legend in Figures 6 and 7." title="" id="75" name="Picture"/>
+            <wp:docPr descr="Figure 8:  A three-dimensional scatter plot of the objective function values for basecase and 39 management scenarios, averaged over 28 water years (1991-2018). Larger spheres are shown for the Pareto-optimal set of scenarios. Scenario colors correspond to legend in Figures 6 and 7." title="" id="74" name="Picture"/>
             <a:graphic>
               <a:graphicData uri="http://schemas.openxmlformats.org/drawingml/2006/picture">
                 <pic:pic>
                   <pic:nvPicPr>
-                    <pic:cNvPr descr="Graphics%20and%20Supplements/hbf%20et%20infra%20plot3d_2025.11.04.jpg" id="76" name="Picture"/>
+                    <pic:cNvPr descr="Graphics%20and%20Supplements/hbf%20et%20infra%20plot3d_2025.11.04.jpg" id="75" name="Picture"/>
                     <pic:cNvPicPr>
                       <a:picLocks noChangeArrowheads="1" noChangeAspect="1"/>
                     </pic:cNvPicPr>
                   </pic:nvPicPr>
                   <pic:blipFill>
-                    <a:blip r:embed="rId74"/>
+                    <a:blip r:embed="rId73"/>
                     <a:stretch>
                       <a:fillRect/>
                     </a:stretch>
@@ -17327,8 +17222,8 @@
       <w:pPr>
         <w:pStyle w:val="ImageCaption"/>
       </w:pPr>
-      <w:bookmarkStart w:id="77" w:name="fig:farmerFishInfraFigure3D"/>
-      <w:bookmarkEnd w:id="77"/>
+      <w:bookmarkStart w:id="76" w:name="fig:farmerFishInfraFigure3D"/>
+      <w:bookmarkEnd w:id="76"/>
       <w:r>
         <w:t xml:space="preserve">Figure 8:</w:t>
       </w:r>
@@ -17346,8 +17241,8 @@
       <w:pPr>
         <w:pStyle w:val="TableCaption"/>
       </w:pPr>
-      <w:bookmarkStart w:id="78" w:name="tab:gspMgmtList"/>
-      <w:bookmarkEnd w:id="78"/>
+      <w:bookmarkStart w:id="77" w:name="tab:gspMgmtList"/>
+      <w:bookmarkEnd w:id="77"/>
       <w:r>
         <w:t xml:space="preserve">Table 6:</w:t>
       </w:r>
@@ -20340,9 +20235,9 @@
         <w:br w:type="page"/>
       </w:r>
     </w:p>
+    <w:bookmarkEnd w:id="78"/>
     <w:bookmarkEnd w:id="79"/>
-    <w:bookmarkEnd w:id="80"/>
-    <w:bookmarkStart w:id="86" w:name="discussion"/>
+    <w:bookmarkStart w:id="85" w:name="discussion"/>
     <w:p>
       <w:pPr>
         <w:pStyle w:val="Heading1"/>
@@ -20369,7 +20264,7 @@
           <w:b/>
           <w:bCs/>
         </w:rPr>
-        <w:t xml:space="preserve">add discussion of alternative env obj functions: Chinook salmon, indices of alteration</w:t>
+        <w:t xml:space="preserve">add discussion of alternative env obj functions: steelhead, other aquatic species, GDEs, indices of alteration</w:t>
       </w:r>
     </w:p>
     <w:p>
@@ -20377,6 +20272,18 @@
         <w:pStyle w:val="BodyText"/>
       </w:pPr>
       <w:r>
+        <w:rPr>
+          <w:b/>
+          <w:bCs/>
+        </w:rPr>
+        <w:t xml:space="preserve">add discussion of how to interpret grain ET results. might need to check with TH</w:t>
+      </w:r>
+    </w:p>
+    <w:p>
+      <w:pPr>
+        <w:pStyle w:val="BodyText"/>
+      </w:pPr>
+      <w:r>
         <w:t xml:space="preserve">The portfolio of scenarios proposed by stakeholders and simulated for this study included a range of infrastructure investments, regulatory actions and major land use changes. The number and diversity of simulated scenarios was made possible by a surface- and groundwater model designed to approximate existing land use and agricultural water use behavior in the local context [SVIHM;</w:t>
       </w:r>
       <w:r>
@@ -20389,7 +20296,7 @@
         <w:t xml:space="preserve">]. Though the ultimate future effect of these management actions would depend on climate variability and implementation details that have not been explicitly simulated (e.g., the precise location of pumps needed to divert surface water for the expanded enhanced recharge scenarios), it is possible to use objective functions and historical climate records to draw some high-level findings regarding their relative merits.</w:t>
       </w:r>
     </w:p>
-    <w:bookmarkStart w:id="81" w:name="Xa151cb59b4ad5c02348e31b83bab4d8169de230"/>
+    <w:bookmarkStart w:id="80" w:name="Xa151cb59b4ad5c02348e31b83bab4d8169de230"/>
     <w:p>
       <w:pPr>
         <w:pStyle w:val="Heading2"/>
@@ -20466,8 +20373,8 @@
         <w:t xml:space="preserve">These predicted on-the-ground consequences can facilitate interpretation of scenario results.</w:t>
       </w:r>
     </w:p>
-    <w:bookmarkEnd w:id="81"/>
-    <w:bookmarkStart w:id="82" w:name="Xeb4407dfc59ea709d91a13199c8e469abf09cea"/>
+    <w:bookmarkEnd w:id="80"/>
+    <w:bookmarkStart w:id="81" w:name="Xeb4407dfc59ea709d91a13199c8e469abf09cea"/>
     <w:p>
       <w:pPr>
         <w:pStyle w:val="Heading2"/>
@@ -20563,8 +20470,8 @@
         <w:t xml:space="preserve">), the low-coho year HB performance of various model scenarios is a key scenario differentiator.</w:t>
       </w:r>
     </w:p>
-    <w:bookmarkEnd w:id="82"/>
-    <w:bookmarkStart w:id="83" w:name="environmental-agricultural-trade-offs"/>
+    <w:bookmarkEnd w:id="81"/>
+    <w:bookmarkStart w:id="82" w:name="environmental-agricultural-trade-offs"/>
     <w:p>
       <w:pPr>
         <w:pStyle w:val="Heading2"/>
@@ -20748,7 +20655,7 @@
         <w:t xml:space="preserve"> </w:t>
       </w:r>
       <w:r>
-        <w:t xml:space="preserve">??</w:t>
+        <w:t xml:space="preserve">5</w:t>
       </w:r>
       <w:r>
         <w:t xml:space="preserve"> </w:t>
@@ -20834,14 +20741,14 @@
         <w:t xml:space="preserve"> </w:t>
       </w:r>
       <w:r>
-        <w:t xml:space="preserve">??</w:t>
+        <w:t xml:space="preserve">5</w:t>
       </w:r>
       <w:r>
         <w:t xml:space="preserve">).</w:t>
       </w:r>
     </w:p>
-    <w:bookmarkEnd w:id="83"/>
-    <w:bookmarkStart w:id="84" w:name="Xb48c0b1c357814727cacf50afe35e98b0bf92dd"/>
+    <w:bookmarkEnd w:id="82"/>
+    <w:bookmarkStart w:id="83" w:name="Xb48c0b1c357814727cacf50afe35e98b0bf92dd"/>
     <w:p>
       <w:pPr>
         <w:pStyle w:val="Heading2"/>
@@ -20891,25 +20798,25 @@
         <w:t xml:space="preserve"> </w:t>
       </w:r>
       <w:r>
+        <w:t xml:space="preserve">5</w:t>
+      </w:r>
+      <w:r>
+        <w:t xml:space="preserve">). Native Vegetation scenarios, under two different assumptions about vegetation type/ET demand of the vegetation replacing cultivated agriculture, can produce significant HB improvements, but at a relatively high cost in regional agricultural productivity; these two scenario categories have the lowest trade-off efficiency (Figure</w:t>
+      </w:r>
+      <w:r>
+        <w:t xml:space="preserve"> </w:t>
+      </w:r>
+      <w:r>
         <w:t xml:space="preserve">??</w:t>
       </w:r>
       <w:r>
-        <w:t xml:space="preserve">). Native Vegetation scenarios, under two different assumptions about vegetation type/ET demand of the vegetation replacing cultivated agriculture, can produce significant HB improvements, but at a relatively high cost in regional agricultural productivity; these two scenario categories have the lowest trade-off efficiency (Figure</w:t>
-      </w:r>
-      <w:r>
-        <w:t xml:space="preserve"> </w:t>
-      </w:r>
-      <w:r>
-        <w:t xml:space="preserve">??</w:t>
-      </w:r>
-      <w:r>
         <w:t xml:space="preserve">; Table</w:t>
       </w:r>
       <w:r>
         <w:t xml:space="preserve"> </w:t>
       </w:r>
       <w:r>
-        <w:t xml:space="preserve">??</w:t>
+        <w:t xml:space="preserve">5</w:t>
       </w:r>
       <w:r>
         <w:t xml:space="preserve">).</w:t>
@@ -20949,8 +20856,8 @@
         <w:t xml:space="preserve">). Although the GSP management priorities emphasized infrastructure, in a strict application of these objective functions, both infrastructure-based and regulatory approaches fell within the Pareto-optimal set of management options.</w:t>
       </w:r>
     </w:p>
-    <w:bookmarkEnd w:id="84"/>
-    <w:bookmarkStart w:id="85" w:name="policy-implications"/>
+    <w:bookmarkEnd w:id="83"/>
+    <w:bookmarkStart w:id="84" w:name="policy-implications"/>
     <w:p>
       <w:pPr>
         <w:pStyle w:val="Heading2"/>
@@ -20989,7 +20896,7 @@
         <w:pStyle w:val="Compact"/>
         <w:numPr>
           <w:ilvl w:val="0"/>
-          <w:numId w:val="1005"/>
+          <w:numId w:val="1006"/>
         </w:numPr>
       </w:pPr>
       <w:r>
@@ -20999,7 +20906,7 @@
         <w:t xml:space="preserve"> </w:t>
       </w:r>
       <w:r>
-        <w:t xml:space="preserve">??</w:t>
+        <w:t xml:space="preserve">5</w:t>
       </w:r>
       <w:r>
         <w:t xml:space="preserve">).</w:t>
@@ -21010,7 +20917,7 @@
         <w:pStyle w:val="Compact"/>
         <w:numPr>
           <w:ilvl w:val="0"/>
-          <w:numId w:val="1005"/>
+          <w:numId w:val="1006"/>
         </w:numPr>
       </w:pPr>
       <w:r>
@@ -21022,7 +20929,7 @@
         <w:pStyle w:val="Compact"/>
         <w:numPr>
           <w:ilvl w:val="0"/>
-          <w:numId w:val="1005"/>
+          <w:numId w:val="1006"/>
         </w:numPr>
       </w:pPr>
       <w:r>
@@ -21043,7 +20950,7 @@
         <w:pStyle w:val="Compact"/>
         <w:numPr>
           <w:ilvl w:val="0"/>
-          <w:numId w:val="1005"/>
+          <w:numId w:val="1006"/>
         </w:numPr>
       </w:pPr>
       <w:r>
@@ -21053,7 +20960,7 @@
         <w:t xml:space="preserve"> </w:t>
       </w:r>
       <w:r>
-        <w:t xml:space="preserve">(SWRCB 2021)</w:t>
+        <w:t xml:space="preserve">(SWRCB 2021, 2024a, 2024b)</w:t>
       </w:r>
       <w:r>
         <w:t xml:space="preserve">. The objective function summary of existing model results could help stakeholders and regulators weigh the trade-offs of various actions and potential irrigation cutoff dates in the context of the consequences of other proposed management scenarios. The modeling results suggest that if a decision is made to regulate water use, some later intervention dates may produce minimal gains in environmental flows in some water years (e.g., an alfalfa irrigation cutoff date of August 15 in water years 1995 or 2002 in panel A of Figure</w:t>
@@ -21068,9 +20975,9 @@
         <w:t xml:space="preserve">).</w:t>
       </w:r>
     </w:p>
+    <w:bookmarkEnd w:id="84"/>
     <w:bookmarkEnd w:id="85"/>
-    <w:bookmarkEnd w:id="86"/>
-    <w:bookmarkStart w:id="87" w:name="conclusion"/>
+    <w:bookmarkStart w:id="86" w:name="conclusion"/>
     <w:p>
       <w:pPr>
         <w:pStyle w:val="Heading1"/>
@@ -21134,18 +21041,18 @@
         <w:br w:type="page"/>
       </w:r>
     </w:p>
+    <w:bookmarkEnd w:id="86"/>
+    <w:bookmarkStart w:id="87" w:name="acknowledgments"/>
+    <w:p>
+      <w:pPr>
+        <w:pStyle w:val="Heading1"/>
+      </w:pPr>
+      <w:r>
+        <w:t xml:space="preserve">Acknowledgments</w:t>
+      </w:r>
+    </w:p>
     <w:bookmarkEnd w:id="87"/>
-    <w:bookmarkStart w:id="88" w:name="acknowledgments"/>
-    <w:p>
-      <w:pPr>
-        <w:pStyle w:val="Heading1"/>
-      </w:pPr>
-      <w:r>
-        <w:t xml:space="preserve">Acknowledgments</w:t>
-      </w:r>
-    </w:p>
-    <w:bookmarkEnd w:id="88"/>
-    <w:bookmarkStart w:id="143" w:name="references"/>
+    <w:bookmarkStart w:id="151" w:name="references"/>
     <w:p>
       <w:pPr>
         <w:pStyle w:val="Heading1"/>
@@ -21163,7 +21070,44 @@
         <w:t xml:space="preserve">References</w:t>
       </w:r>
     </w:p>
-    <w:bookmarkStart w:id="142" w:name="refs"/>
+    <w:bookmarkStart w:id="150" w:name="refs"/>
+    <w:bookmarkStart w:id="88" w:name="ref-AgrawalEtAlPREDICTING2005"/>
+    <w:p>
+      <w:pPr>
+        <w:pStyle w:val="Bibliography"/>
+      </w:pPr>
+      <w:r>
+        <w:t xml:space="preserve">Agrawal, A, R S Schick, E P Bjorkstedt, R G Szerlong, M N Goslin, B C Spence, T H Williams, and K M Burnett. 2005.</w:t>
+      </w:r>
+      <w:r>
+        <w:t xml:space="preserve"> </w:t>
+      </w:r>
+      <w:r>
+        <w:t xml:space="preserve">“</w:t>
+      </w:r>
+      <w:r>
+        <w:t xml:space="preserve">PREDICTING THE POTENTIAL FOR HISTORICAL COHO</w:t>
+      </w:r>
+      <w:r>
+        <w:t xml:space="preserve">,</w:t>
+      </w:r>
+      <w:r>
+        <w:t xml:space="preserve"> </w:t>
+      </w:r>
+      <w:r>
+        <w:t xml:space="preserve">CHINOOK AND STEELHEAD HABITAT IN NORTHERN CALIFORNIA</w:t>
+      </w:r>
+      <w:r>
+        <w:t xml:space="preserve">.”</w:t>
+      </w:r>
+      <w:r>
+        <w:t xml:space="preserve"> </w:t>
+      </w:r>
+      <w:r>
+        <w:t xml:space="preserve">National Marine Fisheries Service.</w:t>
+      </w:r>
+    </w:p>
+    <w:bookmarkEnd w:id="88"/>
     <w:bookmarkStart w:id="90" w:name="ref-BorkHirokawaTrends2021"/>
     <w:p>
       <w:pPr>
@@ -21787,19 +21731,34 @@
       </w:r>
     </w:p>
     <w:bookmarkEnd w:id="102"/>
-    <w:bookmarkStart w:id="103" w:name="X57acf74f4e6bbb2dbfb24b295bee561f3691de6"/>
+    <w:bookmarkStart w:id="103" w:name="ref-FogliaEtAlScott2013"/>
     <w:p>
       <w:pPr>
         <w:pStyle w:val="Bibliography"/>
       </w:pPr>
       <w:r>
-        <w:t xml:space="preserve">“Establishment of</w:t>
-      </w:r>
-      <w:r>
-        <w:t xml:space="preserve"> </w:t>
-      </w:r>
-      <w:r>
-        <w:t xml:space="preserve">Minimum Instream Flow Requirements</w:t>
+        <w:t xml:space="preserve">Foglia, Laura, Alison McNally, Courtney Hall, Lauren Ledesma, Ryan Hines, and Thomas Harter. 2013.</w:t>
+      </w:r>
+      <w:r>
+        <w:t xml:space="preserve"> </w:t>
+      </w:r>
+      <w:r>
+        <w:t xml:space="preserve">“Scott</w:t>
+      </w:r>
+      <w:r>
+        <w:t xml:space="preserve"> </w:t>
+      </w:r>
+      <w:r>
+        <w:t xml:space="preserve">Valley Integrated Hydrologic Model</w:t>
+      </w:r>
+      <w:r>
+        <w:t xml:space="preserve">:</w:t>
+      </w:r>
+      <w:r>
+        <w:t xml:space="preserve"> </w:t>
+      </w:r>
+      <w:r>
+        <w:t xml:space="preserve">Data Collection</w:t>
       </w:r>
       <w:r>
         <w:t xml:space="preserve">,</w:t>
@@ -21808,7 +21767,7 @@
         <w:t xml:space="preserve"> </w:t>
       </w:r>
       <w:r>
-        <w:t xml:space="preserve">Curtailment Authority</w:t>
+        <w:t xml:space="preserve">Analysis</w:t>
       </w:r>
       <w:r>
         <w:t xml:space="preserve">, and</w:t>
@@ -21817,19 +21776,7 @@
         <w:t xml:space="preserve"> </w:t>
       </w:r>
       <w:r>
-        <w:t xml:space="preserve">Information Order Authority</w:t>
-      </w:r>
-      <w:r>
-        <w:t xml:space="preserve"> </w:t>
-      </w:r>
-      <w:r>
-        <w:t xml:space="preserve">in the</w:t>
-      </w:r>
-      <w:r>
-        <w:t xml:space="preserve"> </w:t>
-      </w:r>
-      <w:r>
-        <w:t xml:space="preserve">Klamath Watershed</w:t>
+        <w:t xml:space="preserve">Water Budget</w:t>
       </w:r>
       <w:r>
         <w:t xml:space="preserve">.”</w:t>
@@ -21838,65 +21785,41 @@
         <w:t xml:space="preserve"> </w:t>
       </w:r>
       <w:r>
-        <w:t xml:space="preserve">2021. {{NOTICE OF APPROVAL OF EMERGENCY REGULATORY ACTION}}.</w:t>
+        <w:t xml:space="preserve">Davis, CA: North Coast Regional Water Quality Control Board.</w:t>
       </w:r>
     </w:p>
     <w:bookmarkEnd w:id="103"/>
-    <w:bookmarkStart w:id="104" w:name="X6facecaac3164717d4e5933b1aebd85f9388655"/>
+    <w:bookmarkStart w:id="104" w:name="Xff198d1a9510a26c6b6a97c9924d7fdc8be1418"/>
     <w:p>
       <w:pPr>
         <w:pStyle w:val="Bibliography"/>
       </w:pPr>
       <w:r>
-        <w:t xml:space="preserve">“Establishment of</w:t>
-      </w:r>
-      <w:r>
-        <w:t xml:space="preserve"> </w:t>
-      </w:r>
-      <w:r>
-        <w:t xml:space="preserve">Minimum Instream Flow Requirements</w:t>
-      </w:r>
-      <w:r>
-        <w:t xml:space="preserve">,</w:t>
-      </w:r>
-      <w:r>
-        <w:t xml:space="preserve"> </w:t>
-      </w:r>
-      <w:r>
-        <w:t xml:space="preserve">Curtailment Authority</w:t>
-      </w:r>
-      <w:r>
-        <w:t xml:space="preserve">, and</w:t>
-      </w:r>
-      <w:r>
-        <w:t xml:space="preserve"> </w:t>
-      </w:r>
-      <w:r>
-        <w:t xml:space="preserve">Information Order Authority</w:t>
-      </w:r>
-      <w:r>
-        <w:t xml:space="preserve"> </w:t>
-      </w:r>
-      <w:r>
-        <w:t xml:space="preserve">in the</w:t>
-      </w:r>
-      <w:r>
-        <w:t xml:space="preserve"> </w:t>
-      </w:r>
-      <w:r>
-        <w:t xml:space="preserve">Scott River</w:t>
-      </w:r>
-      <w:r>
-        <w:t xml:space="preserve"> </w:t>
-      </w:r>
-      <w:r>
-        <w:t xml:space="preserve">and</w:t>
-      </w:r>
-      <w:r>
-        <w:t xml:space="preserve"> </w:t>
-      </w:r>
-      <w:r>
-        <w:t xml:space="preserve">Shasta River Watersheds</w:t>
+        <w:t xml:space="preserve">Fox Canyon Groundwater Management Agency. 2019.</w:t>
+      </w:r>
+      <w:r>
+        <w:t xml:space="preserve"> </w:t>
+      </w:r>
+      <w:r>
+        <w:t xml:space="preserve">“Groundwater</w:t>
+      </w:r>
+      <w:r>
+        <w:t xml:space="preserve"> </w:t>
+      </w:r>
+      <w:r>
+        <w:t xml:space="preserve">Sustainability Plan</w:t>
+      </w:r>
+      <w:r>
+        <w:t xml:space="preserve"> </w:t>
+      </w:r>
+      <w:r>
+        <w:t xml:space="preserve">for the</w:t>
+      </w:r>
+      <w:r>
+        <w:t xml:space="preserve"> </w:t>
+      </w:r>
+      <w:r>
+        <w:t xml:space="preserve">Oxnard Subbasin</w:t>
       </w:r>
       <w:r>
         <w:t xml:space="preserve">.”</w:t>
@@ -21905,112 +21828,11 @@
         <w:t xml:space="preserve"> </w:t>
       </w:r>
       <w:r>
-        <w:t xml:space="preserve">2024. {{NOTICE OF APPROVAL OF EMERGENCY REGULATORY ACTION}}.</w:t>
+        <w:t xml:space="preserve">Ventura, CA: Fox Canyon Groundwater Manegement Agency.</w:t>
       </w:r>
     </w:p>
     <w:bookmarkEnd w:id="104"/>
-    <w:bookmarkStart w:id="105" w:name="ref-FogliaEtAlScott2013"/>
-    <w:p>
-      <w:pPr>
-        <w:pStyle w:val="Bibliography"/>
-      </w:pPr>
-      <w:r>
-        <w:t xml:space="preserve">Foglia, Laura, Alison McNally, Courtney Hall, Lauren Ledesma, Ryan Hines, and Thomas Harter. 2013.</w:t>
-      </w:r>
-      <w:r>
-        <w:t xml:space="preserve"> </w:t>
-      </w:r>
-      <w:r>
-        <w:t xml:space="preserve">“Scott</w:t>
-      </w:r>
-      <w:r>
-        <w:t xml:space="preserve"> </w:t>
-      </w:r>
-      <w:r>
-        <w:t xml:space="preserve">Valley Integrated Hydrologic Model</w:t>
-      </w:r>
-      <w:r>
-        <w:t xml:space="preserve">:</w:t>
-      </w:r>
-      <w:r>
-        <w:t xml:space="preserve"> </w:t>
-      </w:r>
-      <w:r>
-        <w:t xml:space="preserve">Data Collection</w:t>
-      </w:r>
-      <w:r>
-        <w:t xml:space="preserve">,</w:t>
-      </w:r>
-      <w:r>
-        <w:t xml:space="preserve"> </w:t>
-      </w:r>
-      <w:r>
-        <w:t xml:space="preserve">Analysis</w:t>
-      </w:r>
-      <w:r>
-        <w:t xml:space="preserve">, and</w:t>
-      </w:r>
-      <w:r>
-        <w:t xml:space="preserve"> </w:t>
-      </w:r>
-      <w:r>
-        <w:t xml:space="preserve">Water Budget</w:t>
-      </w:r>
-      <w:r>
-        <w:t xml:space="preserve">.”</w:t>
-      </w:r>
-      <w:r>
-        <w:t xml:space="preserve"> </w:t>
-      </w:r>
-      <w:r>
-        <w:t xml:space="preserve">Davis, CA: North Coast Regional Water Quality Control Board.</w:t>
-      </w:r>
-    </w:p>
-    <w:bookmarkEnd w:id="105"/>
-    <w:bookmarkStart w:id="106" w:name="Xff198d1a9510a26c6b6a97c9924d7fdc8be1418"/>
-    <w:p>
-      <w:pPr>
-        <w:pStyle w:val="Bibliography"/>
-      </w:pPr>
-      <w:r>
-        <w:t xml:space="preserve">Fox Canyon Groundwater Management Agency. 2019.</w:t>
-      </w:r>
-      <w:r>
-        <w:t xml:space="preserve"> </w:t>
-      </w:r>
-      <w:r>
-        <w:t xml:space="preserve">“Groundwater</w:t>
-      </w:r>
-      <w:r>
-        <w:t xml:space="preserve"> </w:t>
-      </w:r>
-      <w:r>
-        <w:t xml:space="preserve">Sustainability Plan</w:t>
-      </w:r>
-      <w:r>
-        <w:t xml:space="preserve"> </w:t>
-      </w:r>
-      <w:r>
-        <w:t xml:space="preserve">for the</w:t>
-      </w:r>
-      <w:r>
-        <w:t xml:space="preserve"> </w:t>
-      </w:r>
-      <w:r>
-        <w:t xml:space="preserve">Oxnard Subbasin</w:t>
-      </w:r>
-      <w:r>
-        <w:t xml:space="preserve">.”</w:t>
-      </w:r>
-      <w:r>
-        <w:t xml:space="preserve"> </w:t>
-      </w:r>
-      <w:r>
-        <w:t xml:space="preserve">Ventura, CA: Fox Canyon Groundwater Manegement Agency.</w:t>
-      </w:r>
-    </w:p>
-    <w:bookmarkEnd w:id="106"/>
-    <w:bookmarkStart w:id="108" w:name="ref-FreemanWICKED2000"/>
+    <w:bookmarkStart w:id="106" w:name="ref-FreemanWICKED2000"/>
     <w:p>
       <w:pPr>
         <w:pStyle w:val="Bibliography"/>
@@ -22058,7 +21880,7 @@
       <w:r>
         <w:t xml:space="preserve"> </w:t>
       </w:r>
-      <w:hyperlink r:id="rId107">
+      <w:hyperlink r:id="rId105">
         <w:r>
           <w:rPr>
             <w:rStyle w:val="Hyperlink"/>
@@ -22070,8 +21892,8 @@
         <w:t xml:space="preserve">.</w:t>
       </w:r>
     </w:p>
-    <w:bookmarkEnd w:id="108"/>
-    <w:bookmarkStart w:id="109" w:name="ref-HarterHinesSCOTT2008"/>
+    <w:bookmarkEnd w:id="106"/>
+    <w:bookmarkStart w:id="107" w:name="ref-HarterHinesSCOTT2008"/>
     <w:p>
       <w:pPr>
         <w:pStyle w:val="Bibliography"/>
@@ -22098,8 +21920,8 @@
         <w:t xml:space="preserve">University of California, Davis.</w:t>
       </w:r>
     </w:p>
-    <w:bookmarkEnd w:id="109"/>
-    <w:bookmarkStart w:id="111" w:name="ref-KapelanEtAlMultiobjective2005"/>
+    <w:bookmarkEnd w:id="107"/>
+    <w:bookmarkStart w:id="109" w:name="ref-KapelanEtAlMultiobjective2005"/>
     <w:p>
       <w:pPr>
         <w:pStyle w:val="Bibliography"/>
@@ -22132,7 +21954,7 @@
       <w:r>
         <w:t xml:space="preserve"> </w:t>
       </w:r>
-      <w:hyperlink r:id="rId110">
+      <w:hyperlink r:id="rId108">
         <w:r>
           <w:rPr>
             <w:rStyle w:val="Hyperlink"/>
@@ -22144,8 +21966,42 @@
         <w:t xml:space="preserve">.</w:t>
       </w:r>
     </w:p>
-    <w:bookmarkEnd w:id="111"/>
-    <w:bookmarkStart w:id="113" w:name="ref-KoubaEtAlWatershedSpecific2025"/>
+    <w:bookmarkEnd w:id="109"/>
+    <w:bookmarkStart w:id="110" w:name="ref-KnechtleGiudice20192020"/>
+    <w:p>
+      <w:pPr>
+        <w:pStyle w:val="Bibliography"/>
+      </w:pPr>
+      <w:r>
+        <w:t xml:space="preserve">Knechtle, Morgan, and Domenic Giudice. 2020.</w:t>
+      </w:r>
+      <w:r>
+        <w:t xml:space="preserve"> </w:t>
+      </w:r>
+      <w:r>
+        <w:t xml:space="preserve">“2019</w:t>
+      </w:r>
+      <w:r>
+        <w:t xml:space="preserve"> </w:t>
+      </w:r>
+      <w:r>
+        <w:t xml:space="preserve">SCOTT RIVER SALMON STUDIES FINAL REPORT</w:t>
+      </w:r>
+      <w:r>
+        <w:t xml:space="preserve">.”</w:t>
+      </w:r>
+      <w:r>
+        <w:t xml:space="preserve"> </w:t>
+      </w:r>
+      <w:r>
+        <w:t xml:space="preserve">California Department of Fish and Wildlife</w:t>
+      </w:r>
+      <w:r>
+        <w:t xml:space="preserve">.</w:t>
+      </w:r>
+    </w:p>
+    <w:bookmarkEnd w:id="110"/>
+    <w:bookmarkStart w:id="112" w:name="ref-KoubaEtAlWatershedSpecific2025"/>
     <w:p>
       <w:pPr>
         <w:pStyle w:val="Bibliography"/>
@@ -22199,7 +22055,7 @@
       <w:r>
         <w:t xml:space="preserve"> </w:t>
       </w:r>
-      <w:hyperlink r:id="rId112">
+      <w:hyperlink r:id="rId111">
         <w:r>
           <w:rPr>
             <w:rStyle w:val="Hyperlink"/>
@@ -22211,8 +22067,8 @@
         <w:t xml:space="preserve">.</w:t>
       </w:r>
     </w:p>
-    <w:bookmarkEnd w:id="113"/>
-    <w:bookmarkStart w:id="115" w:name="ref-MackGeology1958"/>
+    <w:bookmarkEnd w:id="112"/>
+    <w:bookmarkStart w:id="114" w:name="ref-MackGeology1958"/>
     <w:p>
       <w:pPr>
         <w:pStyle w:val="Bibliography"/>
@@ -22262,7 +22118,7 @@
       <w:r>
         <w:t xml:space="preserve"> </w:t>
       </w:r>
-      <w:hyperlink r:id="rId114">
+      <w:hyperlink r:id="rId113">
         <w:r>
           <w:rPr>
             <w:rStyle w:val="Hyperlink"/>
@@ -22274,8 +22130,156 @@
         <w:t xml:space="preserve">.</w:t>
       </w:r>
     </w:p>
+    <w:bookmarkEnd w:id="114"/>
+    <w:bookmarkStart w:id="115" w:name="ref-MagranetScott2015a"/>
+    <w:p>
+      <w:pPr>
+        <w:pStyle w:val="Bibliography"/>
+      </w:pPr>
+      <w:r>
+        <w:t xml:space="preserve">Magranet, Lindsay. 2015.</w:t>
+      </w:r>
+      <w:r>
+        <w:t xml:space="preserve"> </w:t>
+      </w:r>
+      <w:r>
+        <w:t xml:space="preserve">“Scott</w:t>
+      </w:r>
+      <w:r>
+        <w:t xml:space="preserve"> </w:t>
+      </w:r>
+      <w:r>
+        <w:t xml:space="preserve">River Fall Chinook Spawning Ground Surveys</w:t>
+      </w:r>
+      <w:r>
+        <w:t xml:space="preserve">.”</w:t>
+      </w:r>
+      <w:r>
+        <w:t xml:space="preserve"> </w:t>
+      </w:r>
+      <w:r>
+        <w:t xml:space="preserve">Etna, CA: Siskiyou Resource Conservation District.</w:t>
+      </w:r>
+    </w:p>
     <w:bookmarkEnd w:id="115"/>
-    <w:bookmarkStart w:id="117" w:name="ref-MahoneyRoodStreamflow1998"/>
+    <w:bookmarkStart w:id="116" w:name="ref-MagranetScott2017"/>
+    <w:p>
+      <w:pPr>
+        <w:pStyle w:val="Bibliography"/>
+      </w:pPr>
+      <w:r>
+        <w:t xml:space="preserve">———. 2017.</w:t>
+      </w:r>
+      <w:r>
+        <w:t xml:space="preserve"> </w:t>
+      </w:r>
+      <w:r>
+        <w:t xml:space="preserve">“Scott</w:t>
+      </w:r>
+      <w:r>
+        <w:t xml:space="preserve"> </w:t>
+      </w:r>
+      <w:r>
+        <w:t xml:space="preserve">River Fall Chinook Spawning Ground Surveys</w:t>
+      </w:r>
+      <w:r>
+        <w:t xml:space="preserve">.”</w:t>
+      </w:r>
+      <w:r>
+        <w:t xml:space="preserve"> </w:t>
+      </w:r>
+      <w:r>
+        <w:t xml:space="preserve">Etna, CA: Siskiyou Resource Conservation District.</w:t>
+      </w:r>
+    </w:p>
+    <w:bookmarkEnd w:id="116"/>
+    <w:bookmarkStart w:id="117" w:name="ref-MagranetScott2018"/>
+    <w:p>
+      <w:pPr>
+        <w:pStyle w:val="Bibliography"/>
+      </w:pPr>
+      <w:r>
+        <w:t xml:space="preserve">———. 2018.</w:t>
+      </w:r>
+      <w:r>
+        <w:t xml:space="preserve"> </w:t>
+      </w:r>
+      <w:r>
+        <w:t xml:space="preserve">“Scott</w:t>
+      </w:r>
+      <w:r>
+        <w:t xml:space="preserve"> </w:t>
+      </w:r>
+      <w:r>
+        <w:t xml:space="preserve">River Fall Chinook Spawning Ground Surveys</w:t>
+      </w:r>
+      <w:r>
+        <w:t xml:space="preserve"> </w:t>
+      </w:r>
+      <w:r>
+        <w:t xml:space="preserve">2017</w:t>
+      </w:r>
+      <w:r>
+        <w:t xml:space="preserve"> </w:t>
+      </w:r>
+      <w:r>
+        <w:t xml:space="preserve">Season</w:t>
+      </w:r>
+      <w:r>
+        <w:t xml:space="preserve">.”</w:t>
+      </w:r>
+      <w:r>
+        <w:t xml:space="preserve"> </w:t>
+      </w:r>
+      <w:r>
+        <w:t xml:space="preserve">Etna, CA: Siskiyou Resource Conservation District.</w:t>
+      </w:r>
+    </w:p>
+    <w:bookmarkEnd w:id="117"/>
+    <w:bookmarkStart w:id="118" w:name="ref-MagranetYokelScott2017"/>
+    <w:p>
+      <w:pPr>
+        <w:pStyle w:val="Bibliography"/>
+      </w:pPr>
+      <w:r>
+        <w:t xml:space="preserve">Magranet, Lindsay, and Erich Yokel. 2017.</w:t>
+      </w:r>
+      <w:r>
+        <w:t xml:space="preserve"> </w:t>
+      </w:r>
+      <w:r>
+        <w:t xml:space="preserve">“Scott</w:t>
+      </w:r>
+      <w:r>
+        <w:t xml:space="preserve"> </w:t>
+      </w:r>
+      <w:r>
+        <w:t xml:space="preserve">River Adult Coho Spawning Ground Surveys</w:t>
+      </w:r>
+      <w:r>
+        <w:t xml:space="preserve"> </w:t>
+      </w:r>
+      <w:r>
+        <w:t xml:space="preserve">2016-2017</w:t>
+      </w:r>
+      <w:r>
+        <w:t xml:space="preserve"> </w:t>
+      </w:r>
+      <w:r>
+        <w:t xml:space="preserve">Season</w:t>
+      </w:r>
+      <w:r>
+        <w:t xml:space="preserve">.”</w:t>
+      </w:r>
+      <w:r>
+        <w:t xml:space="preserve"> </w:t>
+      </w:r>
+      <w:r>
+        <w:t xml:space="preserve">Etna, CA: Siskiyou Resource Conservation District.</w:t>
+      </w:r>
+    </w:p>
+    <w:bookmarkEnd w:id="118"/>
+    <w:bookmarkStart w:id="120" w:name="ref-MahoneyRoodStreamflow1998"/>
     <w:p>
       <w:pPr>
         <w:pStyle w:val="Bibliography"/>
@@ -22317,7 +22321,7 @@
       <w:r>
         <w:t xml:space="preserve"> </w:t>
       </w:r>
-      <w:hyperlink r:id="rId116">
+      <w:hyperlink r:id="rId119">
         <w:r>
           <w:rPr>
             <w:rStyle w:val="Hyperlink"/>
@@ -22329,8 +22333,57 @@
         <w:t xml:space="preserve">.</w:t>
       </w:r>
     </w:p>
-    <w:bookmarkEnd w:id="117"/>
-    <w:bookmarkStart w:id="119" w:name="ref-MonarchiEtAlInteractive1973"/>
+    <w:bookmarkEnd w:id="120"/>
+    <w:bookmarkStart w:id="121" w:name="ref-McMahonHabitat1983"/>
+    <w:p>
+      <w:pPr>
+        <w:pStyle w:val="Bibliography"/>
+      </w:pPr>
+      <w:r>
+        <w:t xml:space="preserve">McMahon, Thomas E. 1983.</w:t>
+      </w:r>
+      <w:r>
+        <w:t xml:space="preserve"> </w:t>
+      </w:r>
+      <w:r>
+        <w:t xml:space="preserve">“Habitat</w:t>
+      </w:r>
+      <w:r>
+        <w:t xml:space="preserve"> </w:t>
+      </w:r>
+      <w:r>
+        <w:t xml:space="preserve">Suitability Index Models</w:t>
+      </w:r>
+      <w:r>
+        <w:t xml:space="preserve">:</w:t>
+      </w:r>
+      <w:r>
+        <w:t xml:space="preserve"> </w:t>
+      </w:r>
+      <w:r>
+        <w:t xml:space="preserve">Coho Salmon</w:t>
+      </w:r>
+      <w:r>
+        <w:t xml:space="preserve">.”</w:t>
+      </w:r>
+      <w:r>
+        <w:t xml:space="preserve"> </w:t>
+      </w:r>
+      <w:r>
+        <w:t xml:space="preserve">FWS/OBS-82/10.49.</w:t>
+      </w:r>
+      <w:r>
+        <w:t xml:space="preserve"> </w:t>
+      </w:r>
+      <w:r>
+        <w:t xml:space="preserve">U.S. Fish and Wildlife Service</w:t>
+      </w:r>
+      <w:r>
+        <w:t xml:space="preserve">.</w:t>
+      </w:r>
+    </w:p>
+    <w:bookmarkEnd w:id="121"/>
+    <w:bookmarkStart w:id="123" w:name="ref-MonarchiEtAlInteractive1973"/>
     <w:p>
       <w:pPr>
         <w:pStyle w:val="Bibliography"/>
@@ -22375,7 +22428,7 @@
       <w:r>
         <w:t xml:space="preserve"> </w:t>
       </w:r>
-      <w:hyperlink r:id="rId118">
+      <w:hyperlink r:id="rId122">
         <w:r>
           <w:rPr>
             <w:rStyle w:val="Hyperlink"/>
@@ -22387,8 +22440,112 @@
         <w:t xml:space="preserve">.</w:t>
       </w:r>
     </w:p>
-    <w:bookmarkEnd w:id="119"/>
-    <w:bookmarkStart w:id="121" w:name="ref-NordgrenEtAlSupporting2016"/>
+    <w:bookmarkEnd w:id="123"/>
+    <w:bookmarkStart w:id="124" w:name="ref-MoyleCoho2002"/>
+    <w:p>
+      <w:pPr>
+        <w:pStyle w:val="Bibliography"/>
+      </w:pPr>
+      <w:r>
+        <w:t xml:space="preserve">Moyle, Peter B. 2002.</w:t>
+      </w:r>
+      <w:r>
+        <w:t xml:space="preserve"> </w:t>
+      </w:r>
+      <w:r>
+        <w:t xml:space="preserve">“Coho</w:t>
+      </w:r>
+      <w:r>
+        <w:t xml:space="preserve"> </w:t>
+      </w:r>
+      <w:r>
+        <w:t xml:space="preserve">Salmon</w:t>
+      </w:r>
+      <w:r>
+        <w:t xml:space="preserve">,</w:t>
+      </w:r>
+      <w:r>
+        <w:t xml:space="preserve"> </w:t>
+      </w:r>
+      <w:r>
+        <w:t xml:space="preserve">Oncorhynchus</w:t>
+      </w:r>
+      <w:r>
+        <w:t xml:space="preserve"> </w:t>
+      </w:r>
+      <w:r>
+        <w:t xml:space="preserve">Kisutch (</w:t>
+      </w:r>
+      <w:r>
+        <w:t xml:space="preserve">Walbaum</w:t>
+      </w:r>
+      <w:r>
+        <w:t xml:space="preserve">).”</w:t>
+      </w:r>
+      <w:r>
+        <w:t xml:space="preserve"> </w:t>
+      </w:r>
+      <w:r>
+        <w:t xml:space="preserve">In</w:t>
+      </w:r>
+      <w:r>
+        <w:t xml:space="preserve"> </w:t>
+      </w:r>
+      <w:r>
+        <w:rPr>
+          <w:i/>
+          <w:iCs/>
+        </w:rPr>
+        <w:t xml:space="preserve">Inland</w:t>
+      </w:r>
+      <w:r>
+        <w:rPr>
+          <w:i/>
+          <w:iCs/>
+        </w:rPr>
+        <w:t xml:space="preserve"> </w:t>
+      </w:r>
+      <w:r>
+        <w:rPr>
+          <w:i/>
+          <w:iCs/>
+        </w:rPr>
+        <w:t xml:space="preserve">Fishes</w:t>
+      </w:r>
+      <w:r>
+        <w:rPr>
+          <w:i/>
+          <w:iCs/>
+        </w:rPr>
+        <w:t xml:space="preserve"> </w:t>
+      </w:r>
+      <w:r>
+        <w:rPr>
+          <w:i/>
+          <w:iCs/>
+        </w:rPr>
+        <w:t xml:space="preserve">of</w:t>
+      </w:r>
+      <w:r>
+        <w:rPr>
+          <w:i/>
+          <w:iCs/>
+        </w:rPr>
+        <w:t xml:space="preserve"> </w:t>
+      </w:r>
+      <w:r>
+        <w:rPr>
+          <w:i/>
+          <w:iCs/>
+        </w:rPr>
+        <w:t xml:space="preserve">California</w:t>
+      </w:r>
+      <w:r>
+        <w:t xml:space="preserve">, 245–51. University of California Press.</w:t>
+      </w:r>
+    </w:p>
+    <w:bookmarkEnd w:id="124"/>
+    <w:bookmarkStart w:id="126" w:name="ref-NordgrenEtAlSupporting2016"/>
     <w:p>
       <w:pPr>
         <w:pStyle w:val="Bibliography"/>
@@ -22433,7 +22590,7 @@
       <w:r>
         <w:t xml:space="preserve"> </w:t>
       </w:r>
-      <w:hyperlink r:id="rId120">
+      <w:hyperlink r:id="rId125">
         <w:r>
           <w:rPr>
             <w:rStyle w:val="Hyperlink"/>
@@ -22445,8 +22602,8 @@
         <w:t xml:space="preserve">.</w:t>
       </w:r>
     </w:p>
-    <w:bookmarkEnd w:id="121"/>
-    <w:bookmarkStart w:id="123" w:name="ref-OhlbergerEtAlEffects2018"/>
+    <w:bookmarkEnd w:id="126"/>
+    <w:bookmarkStart w:id="128" w:name="ref-OhlbergerEtAlEffects2018"/>
     <w:p>
       <w:pPr>
         <w:pStyle w:val="Bibliography"/>
@@ -22479,7 +22636,7 @@
       <w:r>
         <w:t xml:space="preserve"> </w:t>
       </w:r>
-      <w:hyperlink r:id="rId122">
+      <w:hyperlink r:id="rId127">
         <w:r>
           <w:rPr>
             <w:rStyle w:val="Hyperlink"/>
@@ -22491,8 +22648,59 @@
         <w:t xml:space="preserve">.</w:t>
       </w:r>
     </w:p>
-    <w:bookmarkEnd w:id="123"/>
-    <w:bookmarkStart w:id="125" w:name="ref-PattersonEtAlHydrologic2020"/>
+    <w:bookmarkEnd w:id="128"/>
+    <w:bookmarkStart w:id="129" w:name="ref-ParetoCours1896"/>
+    <w:p>
+      <w:pPr>
+        <w:pStyle w:val="Bibliography"/>
+      </w:pPr>
+      <w:r>
+        <w:t xml:space="preserve">Pareto, Vilfredo. 1896.</w:t>
+      </w:r>
+      <w:r>
+        <w:t xml:space="preserve"> </w:t>
+      </w:r>
+      <w:r>
+        <w:rPr>
+          <w:i/>
+          <w:iCs/>
+        </w:rPr>
+        <w:t xml:space="preserve">Cours</w:t>
+      </w:r>
+      <w:r>
+        <w:rPr>
+          <w:i/>
+          <w:iCs/>
+        </w:rPr>
+        <w:t xml:space="preserve"> </w:t>
+      </w:r>
+      <w:r>
+        <w:rPr>
+          <w:i/>
+          <w:iCs/>
+        </w:rPr>
+        <w:t xml:space="preserve">D</w:t>
+      </w:r>
+      <w:r>
+        <w:rPr>
+          <w:i/>
+          <w:iCs/>
+        </w:rPr>
+        <w:t xml:space="preserve">’</w:t>
+      </w:r>
+      <w:r>
+        <w:rPr>
+          <w:i/>
+          <w:iCs/>
+        </w:rPr>
+        <w:t xml:space="preserve">Economie Politique</w:t>
+      </w:r>
+      <w:r>
+        <w:t xml:space="preserve">. Lausanne.</w:t>
+      </w:r>
+    </w:p>
+    <w:bookmarkEnd w:id="129"/>
+    <w:bookmarkStart w:id="131" w:name="ref-PattersonEtAlHydrologic2020"/>
     <w:p>
       <w:pPr>
         <w:pStyle w:val="Bibliography"/>
@@ -22525,7 +22733,7 @@
       <w:r>
         <w:t xml:space="preserve"> </w:t>
       </w:r>
-      <w:hyperlink r:id="rId124">
+      <w:hyperlink r:id="rId130">
         <w:r>
           <w:rPr>
             <w:rStyle w:val="Hyperlink"/>
@@ -22537,8 +22745,8 @@
         <w:t xml:space="preserve">.</w:t>
       </w:r>
     </w:p>
-    <w:bookmarkEnd w:id="125"/>
-    <w:bookmarkStart w:id="126" w:name="X35601437fc25b0fdd92b478f2f9ddeaed3398df"/>
+    <w:bookmarkEnd w:id="131"/>
+    <w:bookmarkStart w:id="132" w:name="X35601437fc25b0fdd92b478f2f9ddeaed3398df"/>
     <w:p>
       <w:pPr>
         <w:pStyle w:val="Bibliography"/>
@@ -22586,8 +22794,8 @@
         <w:t xml:space="preserve">.”</w:t>
       </w:r>
     </w:p>
-    <w:bookmarkEnd w:id="126"/>
-    <w:bookmarkStart w:id="127" w:name="X334218043bd9d5b07a848a610917fcfef0168db"/>
+    <w:bookmarkEnd w:id="132"/>
+    <w:bookmarkStart w:id="133" w:name="X334218043bd9d5b07a848a610917fcfef0168db"/>
     <w:p>
       <w:pPr>
         <w:pStyle w:val="Bibliography"/>
@@ -22617,8 +22825,8 @@
         <w:t xml:space="preserve">Siskiyou County.</w:t>
       </w:r>
     </w:p>
-    <w:bookmarkEnd w:id="127"/>
-    <w:bookmarkStart w:id="128" w:name="ref-SiskiyouCountyScott2021"/>
+    <w:bookmarkEnd w:id="133"/>
+    <w:bookmarkStart w:id="134" w:name="ref-SiskiyouCountyScott2021"/>
     <w:p>
       <w:pPr>
         <w:pStyle w:val="Bibliography"/>
@@ -22642,8 +22850,8 @@
         <w:t xml:space="preserve">.”</w:t>
       </w:r>
     </w:p>
-    <w:bookmarkEnd w:id="128"/>
-    <w:bookmarkStart w:id="129" w:name="X15105b7917297e4641cb2d2cfd1651756f7bcb0"/>
+    <w:bookmarkEnd w:id="134"/>
+    <w:bookmarkStart w:id="135" w:name="X15105b7917297e4641cb2d2cfd1651756f7bcb0"/>
     <w:p>
       <w:pPr>
         <w:pStyle w:val="Bibliography"/>
@@ -22682,14 +22890,148 @@
         <w:t xml:space="preserve">Fort Jones, CA: Siskiyou County.</w:t>
       </w:r>
     </w:p>
-    <w:bookmarkEnd w:id="129"/>
-    <w:bookmarkStart w:id="130" w:name="Xa7b10fbb32571a990cee2341e679d296b855974"/>
+    <w:bookmarkEnd w:id="135"/>
+    <w:bookmarkStart w:id="136" w:name="X2560a5ce8c29a4d10823717cd7284f11df015d4"/>
     <w:p>
       <w:pPr>
         <w:pStyle w:val="Bibliography"/>
       </w:pPr>
       <w:r>
-        <w:t xml:space="preserve">STATE WATER RESOURCES CONTROL BOARD. 2024.</w:t>
+        <w:t xml:space="preserve">State Water Resources Control Board. 2021.</w:t>
+      </w:r>
+      <w:r>
+        <w:t xml:space="preserve"> </w:t>
+      </w:r>
+      <w:r>
+        <w:t xml:space="preserve">“Establishment of</w:t>
+      </w:r>
+      <w:r>
+        <w:t xml:space="preserve"> </w:t>
+      </w:r>
+      <w:r>
+        <w:t xml:space="preserve">Minimum Instream Flow Requirements</w:t>
+      </w:r>
+      <w:r>
+        <w:t xml:space="preserve">,</w:t>
+      </w:r>
+      <w:r>
+        <w:t xml:space="preserve"> </w:t>
+      </w:r>
+      <w:r>
+        <w:t xml:space="preserve">Curtialment Authority</w:t>
+      </w:r>
+      <w:r>
+        <w:t xml:space="preserve">, and</w:t>
+      </w:r>
+      <w:r>
+        <w:t xml:space="preserve"> </w:t>
+      </w:r>
+      <w:r>
+        <w:t xml:space="preserve">Information Order</w:t>
+      </w:r>
+      <w:r>
+        <w:t xml:space="preserve"> </w:t>
+      </w:r>
+      <w:r>
+        <w:t xml:space="preserve">in the</w:t>
+      </w:r>
+      <w:r>
+        <w:t xml:space="preserve"> </w:t>
+      </w:r>
+      <w:r>
+        <w:t xml:space="preserve">Klamath Watershed</w:t>
+      </w:r>
+      <w:r>
+        <w:t xml:space="preserve">.”</w:t>
+      </w:r>
+      <w:r>
+        <w:t xml:space="preserve"> </w:t>
+      </w:r>
+      <w:r>
+        <w:t xml:space="preserve">{{NOTICE OF APPROVAL OF EMERGENCY REGULATORY ACTION}} OAL 2021-0820-05.</w:t>
+      </w:r>
+    </w:p>
+    <w:bookmarkEnd w:id="136"/>
+    <w:bookmarkStart w:id="137" w:name="Xc65d78564b05799285cd4578f858a1851ca0d64"/>
+    <w:p>
+      <w:pPr>
+        <w:pStyle w:val="Bibliography"/>
+      </w:pPr>
+      <w:r>
+        <w:t xml:space="preserve">———. 2024a.</w:t>
+      </w:r>
+      <w:r>
+        <w:t xml:space="preserve"> </w:t>
+      </w:r>
+      <w:r>
+        <w:t xml:space="preserve">“Establishment of</w:t>
+      </w:r>
+      <w:r>
+        <w:t xml:space="preserve"> </w:t>
+      </w:r>
+      <w:r>
+        <w:t xml:space="preserve">Minimum Instream Flow Requirements</w:t>
+      </w:r>
+      <w:r>
+        <w:t xml:space="preserve">,</w:t>
+      </w:r>
+      <w:r>
+        <w:t xml:space="preserve"> </w:t>
+      </w:r>
+      <w:r>
+        <w:t xml:space="preserve">Curtialment Authority</w:t>
+      </w:r>
+      <w:r>
+        <w:t xml:space="preserve">, and</w:t>
+      </w:r>
+      <w:r>
+        <w:t xml:space="preserve"> </w:t>
+      </w:r>
+      <w:r>
+        <w:t xml:space="preserve">Information Order</w:t>
+      </w:r>
+      <w:r>
+        <w:t xml:space="preserve"> </w:t>
+      </w:r>
+      <w:r>
+        <w:t xml:space="preserve">in the</w:t>
+      </w:r>
+      <w:r>
+        <w:t xml:space="preserve"> </w:t>
+      </w:r>
+      <w:r>
+        <w:t xml:space="preserve">Scott River</w:t>
+      </w:r>
+      <w:r>
+        <w:t xml:space="preserve"> </w:t>
+      </w:r>
+      <w:r>
+        <w:t xml:space="preserve">and</w:t>
+      </w:r>
+      <w:r>
+        <w:t xml:space="preserve"> </w:t>
+      </w:r>
+      <w:r>
+        <w:t xml:space="preserve">Shasta River Watersheds</w:t>
+      </w:r>
+      <w:r>
+        <w:t xml:space="preserve">.”</w:t>
+      </w:r>
+      <w:r>
+        <w:t xml:space="preserve"> </w:t>
+      </w:r>
+      <w:r>
+        <w:t xml:space="preserve">{{NOTICE OF APPROVAL OF EMERGENCY REGULATORY ACTION}} OAL 2024-0123-03.</w:t>
+      </w:r>
+    </w:p>
+    <w:bookmarkEnd w:id="137"/>
+    <w:bookmarkStart w:id="138" w:name="Xa7b10fbb32571a990cee2341e679d296b855974"/>
+    <w:p>
+      <w:pPr>
+        <w:pStyle w:val="Bibliography"/>
+      </w:pPr>
+      <w:r>
+        <w:t xml:space="preserve">———. 2024b.</w:t>
       </w:r>
       <w:r>
         <w:t xml:space="preserve"> </w:t>
@@ -22719,8 +23061,8 @@
         <w:t xml:space="preserve">2024-0036.</w:t>
       </w:r>
     </w:p>
-    <w:bookmarkEnd w:id="130"/>
-    <w:bookmarkStart w:id="132" w:name="ref-SundingMeasuring1996"/>
+    <w:bookmarkEnd w:id="138"/>
+    <w:bookmarkStart w:id="140" w:name="ref-SundingMeasuring1996"/>
     <w:p>
       <w:pPr>
         <w:pStyle w:val="Bibliography"/>
@@ -22774,7 +23116,7 @@
       <w:r>
         <w:t xml:space="preserve"> </w:t>
       </w:r>
-      <w:hyperlink r:id="rId131">
+      <w:hyperlink r:id="rId139">
         <w:r>
           <w:rPr>
             <w:rStyle w:val="Hyperlink"/>
@@ -22786,8 +23128,8 @@
         <w:t xml:space="preserve">.</w:t>
       </w:r>
     </w:p>
-    <w:bookmarkEnd w:id="132"/>
-    <w:bookmarkStart w:id="134" w:name="ref-TolleyEtAlSensitivity2019"/>
+    <w:bookmarkEnd w:id="140"/>
+    <w:bookmarkStart w:id="142" w:name="ref-TolleyEtAlSensitivity2019"/>
     <w:p>
       <w:pPr>
         <w:pStyle w:val="Bibliography"/>
@@ -22877,7 +23219,7 @@
       <w:r>
         <w:t xml:space="preserve"> </w:t>
       </w:r>
-      <w:hyperlink r:id="rId133">
+      <w:hyperlink r:id="rId141">
         <w:r>
           <w:rPr>
             <w:rStyle w:val="Hyperlink"/>
@@ -22889,8 +23231,8 @@
         <w:t xml:space="preserve">.</w:t>
       </w:r>
     </w:p>
-    <w:bookmarkEnd w:id="134"/>
-    <w:bookmarkStart w:id="136" w:name="ref-VanSteenbergenPromoting2006"/>
+    <w:bookmarkEnd w:id="142"/>
+    <w:bookmarkStart w:id="144" w:name="ref-VanSteenbergenPromoting2006"/>
     <w:p>
       <w:pPr>
         <w:pStyle w:val="Bibliography"/>
@@ -22923,7 +23265,7 @@
       <w:r>
         <w:t xml:space="preserve"> </w:t>
       </w:r>
-      <w:hyperlink r:id="rId135">
+      <w:hyperlink r:id="rId143">
         <w:r>
           <w:rPr>
             <w:rStyle w:val="Hyperlink"/>
@@ -22935,8 +23277,8 @@
         <w:t xml:space="preserve">.</w:t>
       </w:r>
     </w:p>
-    <w:bookmarkEnd w:id="136"/>
-    <w:bookmarkStart w:id="138" w:name="ref-YarnellEtAlFunctional2015"/>
+    <w:bookmarkEnd w:id="144"/>
+    <w:bookmarkStart w:id="146" w:name="ref-YarnellEtAlFunctional2015"/>
     <w:p>
       <w:pPr>
         <w:pStyle w:val="Bibliography"/>
@@ -23020,7 +23362,7 @@
       <w:r>
         <w:t xml:space="preserve"> </w:t>
       </w:r>
-      <w:hyperlink r:id="rId137">
+      <w:hyperlink r:id="rId145">
         <w:r>
           <w:rPr>
             <w:rStyle w:val="Hyperlink"/>
@@ -23032,8 +23374,8 @@
         <w:t xml:space="preserve">.</w:t>
       </w:r>
     </w:p>
-    <w:bookmarkEnd w:id="138"/>
-    <w:bookmarkStart w:id="140" w:name="ref-YehBeckerMultiobjective1982"/>
+    <w:bookmarkEnd w:id="146"/>
+    <w:bookmarkStart w:id="148" w:name="ref-YehBeckerMultiobjective1982"/>
     <w:p>
       <w:pPr>
         <w:pStyle w:val="Bibliography"/>
@@ -23066,7 +23408,7 @@
       <w:r>
         <w:t xml:space="preserve"> </w:t>
       </w:r>
-      <w:hyperlink r:id="rId139">
+      <w:hyperlink r:id="rId147">
         <w:r>
           <w:rPr>
             <w:rStyle w:val="Hyperlink"/>
@@ -23078,8 +23420,8 @@
         <w:t xml:space="preserve">.</w:t>
       </w:r>
     </w:p>
-    <w:bookmarkEnd w:id="140"/>
-    <w:bookmarkStart w:id="141" w:name="X8bf5592004e543b04dfcfc3edb39663c8006d78"/>
+    <w:bookmarkEnd w:id="148"/>
+    <w:bookmarkStart w:id="149" w:name="X8bf5592004e543b04dfcfc3edb39663c8006d78"/>
     <w:p>
       <w:pPr>
         <w:pStyle w:val="Bibliography"/>
@@ -23109,15 +23451,15 @@
         <w:t xml:space="preserve">Woodland, CA.</w:t>
       </w:r>
     </w:p>
-    <w:bookmarkEnd w:id="141"/>
-    <w:bookmarkEnd w:id="142"/>
+    <w:bookmarkEnd w:id="149"/>
+    <w:bookmarkEnd w:id="150"/>
     <w:p>
       <w:r>
         <w:br w:type="page"/>
       </w:r>
     </w:p>
-    <w:bookmarkEnd w:id="143"/>
-    <w:bookmarkStart w:id="144" w:name="X6c1a78753bbdca554aba589b0aa85ab8ac746bf"/>
+    <w:bookmarkEnd w:id="151"/>
+    <w:bookmarkStart w:id="152" w:name="X6c1a78753bbdca554aba589b0aa85ab8ac746bf"/>
     <w:p>
       <w:pPr>
         <w:pStyle w:val="Heading1"/>
@@ -23138,6 +23480,14 @@
     <w:p>
       <w:pPr>
         <w:pStyle w:val="FirstParagraph"/>
+      </w:pPr>
+      <w:r>
+        <w:t xml:space="preserve">For each species, across all statistical methods, the coefficients for any single predictor were consistently negative or positive; e.g.,</w:t>
+      </w:r>
+    </w:p>
+    <w:p>
+      <w:pPr>
+        <w:pStyle w:val="BodyText"/>
       </w:pPr>
       <w:r>
         <w:t xml:space="preserve">The Hydrologic Benefit (HB) function is intended to estimate the ecological value (in units of fish production) provided to fish by specific flow values (e.g., timing of fall flow increase; magnitude of dry season flow). This is expressed in conceptual mathematical terms as</w:t>
@@ -23316,7 +23666,7 @@
         <w:t xml:space="preserve">Consequently, only LASSO models dependent on hydrologic variables were evaluated as potential tools to forecast the outcomes of flow change on fish reproduction.</w:t>
       </w:r>
     </w:p>
-    <w:bookmarkEnd w:id="144"/>
+    <w:bookmarkEnd w:id="152"/>
     <w:sectPr>
       <w:footnotePr>
         <w:numRestart w:val="eachSect"/>
@@ -23792,6 +24142,9 @@
     <w:abstractNumId w:val="991"/>
   </w:num>
   <w:num w:numId="1002">
+    <w:abstractNumId w:val="991"/>
+  </w:num>
+  <w:num w:numId="1003">
     <w:abstractNumId w:val="99421"/>
     <w:lvlOverride w:ilvl="0">
       <w:startOverride w:val="1"/>
@@ -23821,7 +24174,7 @@
       <w:startOverride w:val="1"/>
     </w:lvlOverride>
   </w:num>
-  <w:num w:numId="1003">
+  <w:num w:numId="1004">
     <w:abstractNumId w:val="99410"/>
     <w:lvlOverride w:ilvl="0">
       <w:startOverride w:val="0"/>
@@ -23851,7 +24204,7 @@
       <w:startOverride w:val="0"/>
     </w:lvlOverride>
   </w:num>
-  <w:num w:numId="1004">
+  <w:num w:numId="1005">
     <w:abstractNumId w:val="99411"/>
     <w:lvlOverride w:ilvl="0">
       <w:startOverride w:val="1"/>
@@ -23881,7 +24234,7 @@
       <w:startOverride w:val="1"/>
     </w:lvlOverride>
   </w:num>
-  <w:num w:numId="1005">
+  <w:num w:numId="1006">
     <w:abstractNumId w:val="991"/>
   </w:num>
 </w:numbering>

</xml_diff>

<commit_message>
Results rewrite nearly done
</commit_message>
<xml_diff>
--- a/Kouba_Fish_and_Ag_Benefit_MS.docx
+++ b/Kouba_Fish_and_Ag_Benefit_MS.docx
@@ -4385,7 +4385,7 @@
         <w:t xml:space="preserve"> </w:t>
       </w:r>
       <w:r>
-        <w:t xml:space="preserve">5</w:t>
+        <w:t xml:space="preserve">6</w:t>
       </w:r>
       <w:r>
         <w:t xml:space="preserve"> </w:t>
@@ -5459,6 +5459,16 @@
       <w:r>
         <w:t xml:space="preserve">). Within each category various details were altered (e.g., an alfalfa irrigation cessation date of July 10 versus August 15). See Supplemental Material for more detailed scenario descriptions.</w:t>
       </w:r>
+      <w:r>
+        <w:t xml:space="preserve"> </w:t>
+      </w:r>
+      <w:r>
+        <w:rPr>
+          <w:b/>
+          <w:bCs/>
+        </w:rPr>
+        <w:t xml:space="preserve">how much additional detail?</w:t>
+      </w:r>
     </w:p>
     <w:p>
       <w:pPr>
@@ -7979,7 +7989,7 @@
     </w:tbl>
     <w:bookmarkEnd w:id="56"/>
     <w:bookmarkEnd w:id="57"/>
-    <w:bookmarkStart w:id="79" w:name="results"/>
+    <w:bookmarkStart w:id="83" w:name="results"/>
     <w:p>
       <w:pPr>
         <w:pStyle w:val="Heading1"/>
@@ -8002,7 +8012,16 @@
         <w:pStyle w:val="FirstParagraph"/>
       </w:pPr>
       <w:r>
-        <w:t xml:space="preserve">As described above, objective functions were used to quantitatively summarize the achievement of environmental and agricultural goals for the basecase and 24 management scenarios. A Hydrologic Benefit (HB) value in units of predicted smolt abundance for coho and a total crop ET volume was calculated for each water year in the 35-year simulation period, for each scenario. (See Supplemental Material for these results calculated for an HB function with the other three units: coho smolt per adult spawner, Chinook smolt abundance, or Chinook smolt per adult.) In addition to the two objective functions, each scenario has been assigned an infrastructure feasibility category (Table</w:t>
+        <w:t xml:space="preserve">As described above, objective functions were used to quantitatively summarize the achievement of environmental and agricultural goals for the basecase and 24 management scenarios. For the agricultural objective (total crop ET volume) and for the environmental objective (a Hydrologic Benefit [HB] value in units of predicted smolt abundance for coho) were calculated for each water year in the 35-year simulation period, for each scenario (Table</w:t>
+      </w:r>
+      <w:r>
+        <w:t xml:space="preserve"> </w:t>
+      </w:r>
+      <w:r>
+        <w:t xml:space="preserve">6</w:t>
+      </w:r>
+      <w:r>
+        <w:t xml:space="preserve">). (See Supplemental Material for these results calculated for an HB function with three different units: coho smolt per adult spawner, Chinook smolt abundance, or Chinook smolt per adult; Table</w:t>
       </w:r>
       <w:r>
         <w:t xml:space="preserve"> </w:t>
@@ -8011,25 +8030,521 @@
         <w:t xml:space="preserve">5</w:t>
       </w:r>
       <w:r>
+        <w:t xml:space="preserve">.) In addition to the two objective functions, each scenario has been assigned an infrastructure feasibility category (Tables</w:t>
+      </w:r>
+      <w:r>
+        <w:t xml:space="preserve"> </w:t>
+      </w:r>
+      <w:r>
+        <w:t xml:space="preserve">4</w:t>
+      </w:r>
+      <w:r>
+        <w:t xml:space="preserve"> </w:t>
+      </w:r>
+      <w:r>
+        <w:t xml:space="preserve">and</w:t>
+      </w:r>
+      <w:r>
+        <w:t xml:space="preserve"> </w:t>
+      </w:r>
+      <w:r>
+        <w:t xml:space="preserve">6</w:t>
+      </w:r>
+      <w:r>
         <w:t xml:space="preserve">).</w:t>
       </w:r>
     </w:p>
-    <w:bookmarkStart w:id="67" w:name="X7919b09686293416b4bcb59483f48ae87a57064"/>
     <w:p>
       <w:pPr>
-        <w:pStyle w:val="Heading2"/>
-      </w:pPr>
+        <w:pStyle w:val="TableCaption"/>
+      </w:pPr>
+      <w:bookmarkStart w:id="58" w:name="tab:HBUnitsLocationTab"/>
+      <w:bookmarkEnd w:id="58"/>
+      <w:r>
+        <w:t xml:space="preserve">Table 5:</w:t>
+      </w:r>
+      <w:r>
+        <w:t xml:space="preserve"> </w:t>
+      </w:r>
+      <w:r>
+        <w:t xml:space="preserve">Units of Hydrologic Benefit (HB) function and location in document.</w:t>
+      </w:r>
+    </w:p>
+    <w:tbl xmlns:w="http://schemas.openxmlformats.org/wordprocessingml/2006/main" xmlns:r="http://schemas.openxmlformats.org/officeDocument/2006/relationships" xmlns:w14="http://schemas.microsoft.com/office/word/2010/wordml" xmlns:wp="http://schemas.openxmlformats.org/drawingml/2006/wordprocessingDrawing" xmlns:a="http://schemas.openxmlformats.org/drawingml/2006/main" xmlns:pic="http://schemas.openxmlformats.org/drawingml/2006/picture">
+      <w:tblPr>
+        <w:tblLayout w:type="fixed"/>
+        <w:jc w:val="center"/>
+        <w:tblLook w:firstRow="1" w:lastRow="0" w:firstColumn="0" w:lastColumn="0" w:noHBand="0" w:noVBand="1"/>
+      </w:tblPr>
+      <w:tblGrid>
+        <w:gridCol w:w="1728"/>
+        <w:gridCol w:w="3600"/>
+        <w:gridCol w:w="2880"/>
+      </w:tblGrid>
+      <w:tr>
+        <w:trPr>
+          <w:trHeight w:val="360" w:hRule="auto"/>
+          <w:tblHeader/>
+        </w:trPr>
+        header1
+        <w:tc>
+          <w:tcPr>
+            <w:tcBorders>
+              <w:bottom w:val="single" w:sz="12" w:space="0" w:color="666666"/>
+              <w:top w:val="single" w:sz="12" w:space="0" w:color="666666"/>
+              <w:left w:val="none" w:sz="0" w:space="0" w:color="000000"/>
+              <w:right w:val="none" w:sz="0" w:space="0" w:color="000000"/>
+            </w:tcBorders>
+            <w:shd w:val="clear" w:color="auto" w:fill="FFFFFF"/>
+            <w:tcMar>
+              <w:top w:w="0" w:type="dxa"/>
+              <w:bottom w:w="0" w:type="dxa"/>
+              <w:left w:w="0" w:type="dxa"/>
+              <w:right w:w="0" w:type="dxa"/>
+            </w:tcMar>
+            <w:vAlign w:val="center"/>
+          </w:tcPr>
+          <w:p>
+            <w:pPr>
+              <w:pStyle w:val="Normal"/>
+              <w:jc w:val="left"/>
+              <w:pBdr>
+                <w:bottom w:val="none" w:sz="0" w:space="0" w:color="000000"/>
+                <w:top w:val="none" w:sz="0" w:space="0" w:color="000000"/>
+                <w:left w:val="none" w:sz="0" w:space="0" w:color="000000"/>
+                <w:right w:val="none" w:sz="0" w:space="0" w:color="000000"/>
+              </w:pBdr>
+              <w:spacing w:after="100" w:before="100" w:line="240"/>
+              <w:ind w:left="100" w:right="100" w:firstLine="0" w:firstLineChars="0"/>
+            </w:pPr>
+            <w:r xmlns:w="http://schemas.openxmlformats.org/wordprocessingml/2006/main" xmlns:wp="http://schemas.openxmlformats.org/drawingml/2006/wordprocessingDrawing" xmlns:r="http://schemas.openxmlformats.org/officeDocument/2006/relationships" xmlns:w14="http://schemas.microsoft.com/office/word/2010/wordml">
+              <w:rPr>
+                <w:rFonts w:ascii="Arial" w:hAnsi="Arial" w:eastAsia="Arial" w:cs="Arial"/>
+                <w:i w:val="false"/>
+                <w:b w:val="false"/>
+                <w:u w:val="none"/>
+                <w:sz w:val="22"/>
+                <w:szCs w:val="22"/>
+                <w:color w:val="000000"/>
+              </w:rPr>
+              <w:t xml:space="preserve">units</w:t>
+            </w:r>
+          </w:p>
+        </w:tc>
+        <w:tc>
+          <w:tcPr>
+            <w:tcBorders>
+              <w:bottom w:val="single" w:sz="12" w:space="0" w:color="666666"/>
+              <w:top w:val="single" w:sz="12" w:space="0" w:color="666666"/>
+              <w:left w:val="none" w:sz="0" w:space="0" w:color="000000"/>
+              <w:right w:val="none" w:sz="0" w:space="0" w:color="000000"/>
+            </w:tcBorders>
+            <w:shd w:val="clear" w:color="auto" w:fill="FFFFFF"/>
+            <w:tcMar>
+              <w:top w:w="0" w:type="dxa"/>
+              <w:bottom w:w="0" w:type="dxa"/>
+              <w:left w:w="0" w:type="dxa"/>
+              <w:right w:w="0" w:type="dxa"/>
+            </w:tcMar>
+            <w:vAlign w:val="center"/>
+          </w:tcPr>
+          <w:p>
+            <w:pPr>
+              <w:pStyle w:val="Normal"/>
+              <w:jc w:val="left"/>
+              <w:pBdr>
+                <w:bottom w:val="none" w:sz="0" w:space="0" w:color="000000"/>
+                <w:top w:val="none" w:sz="0" w:space="0" w:color="000000"/>
+                <w:left w:val="none" w:sz="0" w:space="0" w:color="000000"/>
+                <w:right w:val="none" w:sz="0" w:space="0" w:color="000000"/>
+              </w:pBdr>
+              <w:spacing w:after="100" w:before="100" w:line="240"/>
+              <w:ind w:left="100" w:right="100" w:firstLine="0" w:firstLineChars="0"/>
+            </w:pPr>
+            <w:r xmlns:w="http://schemas.openxmlformats.org/wordprocessingml/2006/main" xmlns:wp="http://schemas.openxmlformats.org/drawingml/2006/wordprocessingDrawing" xmlns:r="http://schemas.openxmlformats.org/officeDocument/2006/relationships" xmlns:w14="http://schemas.microsoft.com/office/word/2010/wordml">
+              <w:rPr>
+                <w:rFonts w:ascii="Arial" w:hAnsi="Arial" w:eastAsia="Arial" w:cs="Arial"/>
+                <w:i w:val="false"/>
+                <w:b w:val="false"/>
+                <w:u w:val="none"/>
+                <w:sz w:val="22"/>
+                <w:szCs w:val="22"/>
+                <w:color w:val="000000"/>
+              </w:rPr>
+              <w:t xml:space="preserve">coho</w:t>
+            </w:r>
+          </w:p>
+        </w:tc>
+        <w:tc>
+          <w:tcPr>
+            <w:tcBorders>
+              <w:bottom w:val="single" w:sz="12" w:space="0" w:color="666666"/>
+              <w:top w:val="single" w:sz="12" w:space="0" w:color="666666"/>
+              <w:left w:val="none" w:sz="0" w:space="0" w:color="000000"/>
+              <w:right w:val="none" w:sz="0" w:space="0" w:color="000000"/>
+            </w:tcBorders>
+            <w:shd w:val="clear" w:color="auto" w:fill="FFFFFF"/>
+            <w:tcMar>
+              <w:top w:w="0" w:type="dxa"/>
+              <w:bottom w:w="0" w:type="dxa"/>
+              <w:left w:w="0" w:type="dxa"/>
+              <w:right w:w="0" w:type="dxa"/>
+            </w:tcMar>
+            <w:vAlign w:val="center"/>
+          </w:tcPr>
+          <w:p>
+            <w:pPr>
+              <w:pStyle w:val="Normal"/>
+              <w:jc w:val="left"/>
+              <w:pBdr>
+                <w:bottom w:val="none" w:sz="0" w:space="0" w:color="000000"/>
+                <w:top w:val="none" w:sz="0" w:space="0" w:color="000000"/>
+                <w:left w:val="none" w:sz="0" w:space="0" w:color="000000"/>
+                <w:right w:val="none" w:sz="0" w:space="0" w:color="000000"/>
+              </w:pBdr>
+              <w:spacing w:after="100" w:before="100" w:line="240"/>
+              <w:ind w:left="100" w:right="100" w:firstLine="0" w:firstLineChars="0"/>
+            </w:pPr>
+            <w:r xmlns:w="http://schemas.openxmlformats.org/wordprocessingml/2006/main" xmlns:wp="http://schemas.openxmlformats.org/drawingml/2006/wordprocessingDrawing" xmlns:r="http://schemas.openxmlformats.org/officeDocument/2006/relationships" xmlns:w14="http://schemas.microsoft.com/office/word/2010/wordml">
+              <w:rPr>
+                <w:rFonts w:ascii="Arial" w:hAnsi="Arial" w:eastAsia="Arial" w:cs="Arial"/>
+                <w:i w:val="false"/>
+                <w:b w:val="false"/>
+                <w:u w:val="none"/>
+                <w:sz w:val="22"/>
+                <w:szCs w:val="22"/>
+                <w:color w:val="000000"/>
+              </w:rPr>
+              <w:t xml:space="preserve">Chinook</w:t>
+            </w:r>
+          </w:p>
+        </w:tc>
+      </w:tr>
+      <w:tr>
+        <w:trPr>
+          <w:trHeight w:val="360" w:hRule="auto"/>
+        </w:trPr>
+        body1
+        <w:tc>
+          <w:tcPr>
+            <w:tcBorders>
+              <w:bottom w:val="none" w:sz="0" w:space="0" w:color="000000"/>
+              <w:top w:val="single" w:sz="12" w:space="0" w:color="666666"/>
+              <w:left w:val="none" w:sz="0" w:space="0" w:color="000000"/>
+              <w:right w:val="none" w:sz="0" w:space="0" w:color="000000"/>
+            </w:tcBorders>
+            <w:shd w:val="clear" w:color="auto" w:fill="FFFFFF"/>
+            <w:tcMar>
+              <w:top w:w="0" w:type="dxa"/>
+              <w:bottom w:w="0" w:type="dxa"/>
+              <w:left w:w="0" w:type="dxa"/>
+              <w:right w:w="0" w:type="dxa"/>
+            </w:tcMar>
+            <w:vAlign w:val="center"/>
+          </w:tcPr>
+          <w:p>
+            <w:pPr>
+              <w:pStyle w:val="Normal"/>
+              <w:jc w:val="left"/>
+              <w:pBdr>
+                <w:bottom w:val="none" w:sz="0" w:space="0" w:color="000000"/>
+                <w:top w:val="none" w:sz="0" w:space="0" w:color="000000"/>
+                <w:left w:val="none" w:sz="0" w:space="0" w:color="000000"/>
+                <w:right w:val="none" w:sz="0" w:space="0" w:color="000000"/>
+              </w:pBdr>
+              <w:spacing w:after="100" w:before="100" w:line="240"/>
+              <w:ind w:left="100" w:right="100" w:firstLine="0" w:firstLineChars="0"/>
+            </w:pPr>
+            <w:r xmlns:w="http://schemas.openxmlformats.org/wordprocessingml/2006/main" xmlns:wp="http://schemas.openxmlformats.org/drawingml/2006/wordprocessingDrawing" xmlns:r="http://schemas.openxmlformats.org/officeDocument/2006/relationships" xmlns:w14="http://schemas.microsoft.com/office/word/2010/wordml">
+              <w:rPr>
+                <w:rFonts w:ascii="Arial" w:hAnsi="Arial" w:eastAsia="Arial" w:cs="Arial"/>
+                <w:i w:val="false"/>
+                <w:b w:val="false"/>
+                <w:u w:val="none"/>
+                <w:sz w:val="22"/>
+                <w:szCs w:val="22"/>
+                <w:color w:val="000000"/>
+              </w:rPr>
+              <w:t xml:space="preserve">juvenile abundance</w:t>
+            </w:r>
+          </w:p>
+        </w:tc>
+        <w:tc>
+          <w:tcPr>
+            <w:tcBorders>
+              <w:bottom w:val="none" w:sz="0" w:space="0" w:color="000000"/>
+              <w:top w:val="single" w:sz="12" w:space="0" w:color="666666"/>
+              <w:left w:val="none" w:sz="0" w:space="0" w:color="000000"/>
+              <w:right w:val="none" w:sz="0" w:space="0" w:color="000000"/>
+            </w:tcBorders>
+            <w:shd w:val="clear" w:color="auto" w:fill="FFFFFF"/>
+            <w:tcMar>
+              <w:top w:w="0" w:type="dxa"/>
+              <w:bottom w:w="0" w:type="dxa"/>
+              <w:left w:w="0" w:type="dxa"/>
+              <w:right w:w="0" w:type="dxa"/>
+            </w:tcMar>
+            <w:vAlign w:val="center"/>
+          </w:tcPr>
+          <w:p>
+            <w:pPr>
+              <w:pStyle w:val="Normal"/>
+              <w:jc w:val="left"/>
+              <w:pBdr>
+                <w:bottom w:val="none" w:sz="0" w:space="0" w:color="000000"/>
+                <w:top w:val="none" w:sz="0" w:space="0" w:color="000000"/>
+                <w:left w:val="none" w:sz="0" w:space="0" w:color="000000"/>
+                <w:right w:val="none" w:sz="0" w:space="0" w:color="000000"/>
+              </w:pBdr>
+              <w:spacing w:after="100" w:before="100" w:line="240"/>
+              <w:ind w:left="100" w:right="100" w:firstLine="0" w:firstLineChars="0"/>
+            </w:pPr>
+            <w:r xmlns:w="http://schemas.openxmlformats.org/wordprocessingml/2006/main" xmlns:wp="http://schemas.openxmlformats.org/drawingml/2006/wordprocessingDrawing" xmlns:r="http://schemas.openxmlformats.org/officeDocument/2006/relationships" xmlns:w14="http://schemas.microsoft.com/office/word/2010/wordml">
+              <w:rPr>
+                <w:rFonts w:ascii="Arial" w:hAnsi="Arial" w:eastAsia="Arial" w:cs="Arial"/>
+                <w:i w:val="false"/>
+                <w:b w:val="false"/>
+                <w:u w:val="none"/>
+                <w:sz w:val="22"/>
+                <w:szCs w:val="22"/>
+                <w:color w:val="000000"/>
+              </w:rPr>
+              <w:t xml:space="preserve">Highlighted in text and Supp. A</w:t>
+            </w:r>
+          </w:p>
+        </w:tc>
+        <w:tc>
+          <w:tcPr>
+            <w:tcBorders>
+              <w:bottom w:val="none" w:sz="0" w:space="0" w:color="000000"/>
+              <w:top w:val="single" w:sz="12" w:space="0" w:color="666666"/>
+              <w:left w:val="none" w:sz="0" w:space="0" w:color="000000"/>
+              <w:right w:val="none" w:sz="0" w:space="0" w:color="000000"/>
+            </w:tcBorders>
+            <w:shd w:val="clear" w:color="auto" w:fill="FFFFFF"/>
+            <w:tcMar>
+              <w:top w:w="0" w:type="dxa"/>
+              <w:bottom w:w="0" w:type="dxa"/>
+              <w:left w:w="0" w:type="dxa"/>
+              <w:right w:w="0" w:type="dxa"/>
+            </w:tcMar>
+            <w:vAlign w:val="center"/>
+          </w:tcPr>
+          <w:p>
+            <w:pPr>
+              <w:pStyle w:val="Normal"/>
+              <w:jc w:val="left"/>
+              <w:pBdr>
+                <w:bottom w:val="none" w:sz="0" w:space="0" w:color="000000"/>
+                <w:top w:val="none" w:sz="0" w:space="0" w:color="000000"/>
+                <w:left w:val="none" w:sz="0" w:space="0" w:color="000000"/>
+                <w:right w:val="none" w:sz="0" w:space="0" w:color="000000"/>
+              </w:pBdr>
+              <w:spacing w:after="100" w:before="100" w:line="240"/>
+              <w:ind w:left="100" w:right="100" w:firstLine="0" w:firstLineChars="0"/>
+            </w:pPr>
+            <w:r xmlns:w="http://schemas.openxmlformats.org/wordprocessingml/2006/main" xmlns:wp="http://schemas.openxmlformats.org/drawingml/2006/wordprocessingDrawing" xmlns:r="http://schemas.openxmlformats.org/officeDocument/2006/relationships" xmlns:w14="http://schemas.microsoft.com/office/word/2010/wordml">
+              <w:rPr>
+                <w:rFonts w:ascii="Arial" w:hAnsi="Arial" w:eastAsia="Arial" w:cs="Arial"/>
+                <w:i w:val="false"/>
+                <w:b w:val="false"/>
+                <w:u w:val="none"/>
+                <w:sz w:val="22"/>
+                <w:szCs w:val="22"/>
+                <w:color w:val="000000"/>
+              </w:rPr>
+              <w:t xml:space="preserve">Supplement C</w:t>
+            </w:r>
+          </w:p>
+        </w:tc>
+      </w:tr>
+      <w:tr>
+        <w:trPr>
+          <w:trHeight w:val="360" w:hRule="auto"/>
+        </w:trPr>
+        body2
+        <w:tc>
+          <w:tcPr>
+            <w:tcBorders>
+              <w:bottom w:val="single" w:sz="12" w:space="0" w:color="666666"/>
+              <w:top w:val="none" w:sz="0" w:space="0" w:color="000000"/>
+              <w:left w:val="none" w:sz="0" w:space="0" w:color="000000"/>
+              <w:right w:val="none" w:sz="0" w:space="0" w:color="000000"/>
+            </w:tcBorders>
+            <w:shd w:val="clear" w:color="auto" w:fill="FFFFFF"/>
+            <w:tcMar>
+              <w:top w:w="0" w:type="dxa"/>
+              <w:bottom w:w="0" w:type="dxa"/>
+              <w:left w:w="0" w:type="dxa"/>
+              <w:right w:w="0" w:type="dxa"/>
+            </w:tcMar>
+            <w:vAlign w:val="center"/>
+          </w:tcPr>
+          <w:p>
+            <w:pPr>
+              <w:pStyle w:val="Normal"/>
+              <w:jc w:val="left"/>
+              <w:pBdr>
+                <w:bottom w:val="none" w:sz="0" w:space="0" w:color="000000"/>
+                <w:top w:val="none" w:sz="0" w:space="0" w:color="000000"/>
+                <w:left w:val="none" w:sz="0" w:space="0" w:color="000000"/>
+                <w:right w:val="none" w:sz="0" w:space="0" w:color="000000"/>
+              </w:pBdr>
+              <w:spacing w:after="100" w:before="100" w:line="240"/>
+              <w:ind w:left="100" w:right="100" w:firstLine="0" w:firstLineChars="0"/>
+            </w:pPr>
+            <w:r xmlns:w="http://schemas.openxmlformats.org/wordprocessingml/2006/main" xmlns:wp="http://schemas.openxmlformats.org/drawingml/2006/wordprocessingDrawing" xmlns:r="http://schemas.openxmlformats.org/officeDocument/2006/relationships" xmlns:w14="http://schemas.microsoft.com/office/word/2010/wordml">
+              <w:rPr>
+                <w:rFonts w:ascii="Arial" w:hAnsi="Arial" w:eastAsia="Arial" w:cs="Arial"/>
+                <w:i w:val="false"/>
+                <w:b w:val="false"/>
+                <w:u w:val="none"/>
+                <w:sz w:val="22"/>
+                <w:szCs w:val="22"/>
+                <w:color w:val="000000"/>
+              </w:rPr>
+              <w:t xml:space="preserve">juveniles per adult</w:t>
+            </w:r>
+          </w:p>
+        </w:tc>
+        <w:tc>
+          <w:tcPr>
+            <w:tcBorders>
+              <w:bottom w:val="single" w:sz="12" w:space="0" w:color="666666"/>
+              <w:top w:val="none" w:sz="0" w:space="0" w:color="000000"/>
+              <w:left w:val="none" w:sz="0" w:space="0" w:color="000000"/>
+              <w:right w:val="none" w:sz="0" w:space="0" w:color="000000"/>
+            </w:tcBorders>
+            <w:shd w:val="clear" w:color="auto" w:fill="FFFFFF"/>
+            <w:tcMar>
+              <w:top w:w="0" w:type="dxa"/>
+              <w:bottom w:w="0" w:type="dxa"/>
+              <w:left w:w="0" w:type="dxa"/>
+              <w:right w:w="0" w:type="dxa"/>
+            </w:tcMar>
+            <w:vAlign w:val="center"/>
+          </w:tcPr>
+          <w:p>
+            <w:pPr>
+              <w:pStyle w:val="Normal"/>
+              <w:jc w:val="left"/>
+              <w:pBdr>
+                <w:bottom w:val="none" w:sz="0" w:space="0" w:color="000000"/>
+                <w:top w:val="none" w:sz="0" w:space="0" w:color="000000"/>
+                <w:left w:val="none" w:sz="0" w:space="0" w:color="000000"/>
+                <w:right w:val="none" w:sz="0" w:space="0" w:color="000000"/>
+              </w:pBdr>
+              <w:spacing w:after="100" w:before="100" w:line="240"/>
+              <w:ind w:left="100" w:right="100" w:firstLine="0" w:firstLineChars="0"/>
+            </w:pPr>
+            <w:r xmlns:w="http://schemas.openxmlformats.org/wordprocessingml/2006/main" xmlns:wp="http://schemas.openxmlformats.org/drawingml/2006/wordprocessingDrawing" xmlns:r="http://schemas.openxmlformats.org/officeDocument/2006/relationships" xmlns:w14="http://schemas.microsoft.com/office/word/2010/wordml">
+              <w:rPr>
+                <w:rFonts w:ascii="Arial" w:hAnsi="Arial" w:eastAsia="Arial" w:cs="Arial"/>
+                <w:i w:val="false"/>
+                <w:b w:val="false"/>
+                <w:u w:val="none"/>
+                <w:sz w:val="22"/>
+                <w:szCs w:val="22"/>
+                <w:color w:val="000000"/>
+              </w:rPr>
+              <w:t xml:space="preserve">Supplement B</w:t>
+            </w:r>
+          </w:p>
+        </w:tc>
+        <w:tc>
+          <w:tcPr>
+            <w:tcBorders>
+              <w:bottom w:val="single" w:sz="12" w:space="0" w:color="666666"/>
+              <w:top w:val="none" w:sz="0" w:space="0" w:color="000000"/>
+              <w:left w:val="none" w:sz="0" w:space="0" w:color="000000"/>
+              <w:right w:val="none" w:sz="0" w:space="0" w:color="000000"/>
+            </w:tcBorders>
+            <w:shd w:val="clear" w:color="auto" w:fill="FFFFFF"/>
+            <w:tcMar>
+              <w:top w:w="0" w:type="dxa"/>
+              <w:bottom w:w="0" w:type="dxa"/>
+              <w:left w:w="0" w:type="dxa"/>
+              <w:right w:w="0" w:type="dxa"/>
+            </w:tcMar>
+            <w:vAlign w:val="center"/>
+          </w:tcPr>
+          <w:p>
+            <w:pPr>
+              <w:pStyle w:val="Normal"/>
+              <w:jc w:val="left"/>
+              <w:pBdr>
+                <w:bottom w:val="none" w:sz="0" w:space="0" w:color="000000"/>
+                <w:top w:val="none" w:sz="0" w:space="0" w:color="000000"/>
+                <w:left w:val="none" w:sz="0" w:space="0" w:color="000000"/>
+                <w:right w:val="none" w:sz="0" w:space="0" w:color="000000"/>
+              </w:pBdr>
+              <w:spacing w:after="100" w:before="100" w:line="240"/>
+              <w:ind w:left="100" w:right="100" w:firstLine="0" w:firstLineChars="0"/>
+            </w:pPr>
+            <w:r xmlns:w="http://schemas.openxmlformats.org/wordprocessingml/2006/main" xmlns:wp="http://schemas.openxmlformats.org/drawingml/2006/wordprocessingDrawing" xmlns:r="http://schemas.openxmlformats.org/officeDocument/2006/relationships" xmlns:w14="http://schemas.microsoft.com/office/word/2010/wordml">
+              <w:rPr>
+                <w:rFonts w:ascii="Arial" w:hAnsi="Arial" w:eastAsia="Arial" w:cs="Arial"/>
+                <w:i w:val="false"/>
+                <w:b w:val="false"/>
+                <w:u w:val="none"/>
+                <w:sz w:val="22"/>
+                <w:szCs w:val="22"/>
+                <w:color w:val="000000"/>
+              </w:rPr>
+              <w:t xml:space="preserve">Supplement D</w:t>
+            </w:r>
+          </w:p>
+        </w:tc>
+      </w:tr>
+    </w:tbl>
+    <w:p>
+      <w:pPr>
+        <w:pStyle w:val="BodyText"/>
+      </w:pPr>
+      <w:r>
+        <w:t xml:space="preserve">In the basecase scenario, the 35-year mean annual ET volume is 118 million m</w:t>
+      </w:r>
       <w:r>
         <w:rPr>
-          <w:rStyle w:val="SectionNumber"/>
+          <w:vertAlign w:val="superscript"/>
         </w:rPr>
-        <w:t xml:space="preserve">4.1</w:t>
-      </w:r>
-      <w:r>
-        <w:tab/>
-      </w:r>
-      <w:r>
-        <w:t xml:space="preserve">Environmental and agricultural objective function values</w:t>
+        <w:t xml:space="preserve">3</w:t>
+      </w:r>
+      <w:r>
+        <w:t xml:space="preserve"> </w:t>
+      </w:r>
+      <w:r>
+        <w:t xml:space="preserve">of water, and the 35-year mean of annual HB values is 7812 coho spf-equivalent (Table</w:t>
+      </w:r>
+      <w:r>
+        <w:t xml:space="preserve"> </w:t>
+      </w:r>
+      <w:r>
+        <w:t xml:space="preserve">6</w:t>
+      </w:r>
+      <w:r>
+        <w:t xml:space="preserve">). Annual ET volume is relatively stable over the model period of water years 1991-2025, while annual HB values are much more variable (Figure</w:t>
+      </w:r>
+      <w:r>
+        <w:t xml:space="preserve"> </w:t>
+      </w:r>
+      <w:r>
+        <w:t xml:space="preserve">5</w:t>
+      </w:r>
+      <w:r>
+        <w:t xml:space="preserve">). Among the 24 management scenarios, mean ET values ranged from 0 (for a no-irrigated-agriculture scenario) to 118 million m</w:t>
+      </w:r>
+      <w:r>
+        <w:rPr>
+          <w:vertAlign w:val="superscript"/>
+        </w:rPr>
+        <w:t xml:space="preserve">3</w:t>
+      </w:r>
+      <w:r>
+        <w:t xml:space="preserve"> </w:t>
+      </w:r>
+      <w:r>
+        <w:t xml:space="preserve">of water, while HB values ranged from 7696 to 8446 coho smolt-equivalent.</w:t>
       </w:r>
     </w:p>
     <w:p>
@@ -8061,18 +8576,18 @@
           <wp:inline>
             <wp:extent cx="5334000" cy="5000625"/>
             <wp:effectExtent b="0" l="0" r="0" t="0"/>
-            <wp:docPr descr="Figure 5:  Comparison of annual performance in two objective functions (Hydrologic Benefit and ET, representing environmental and agricultural objectives, respectively) for brood years 1991-2025. The scenarios pictured are basecase (black circles) and a scenario from each of three categories: Enhanced Recharge, Crop Change, and eight thousand acres of irrigated crops converted to low-ET Native Vegetation. Dry-type water years (vertical bars) are 1991, ’92, ’94, 2001, ’09, ’13, ’14, ’18, and ’20-’22." title="" id="59" name="Picture"/>
+            <wp:docPr descr="Figure 5:  Comparison of annual performance in two objective functions (Hydrologic Benefit and ET, representing environmental and agricultural objectives, respectively) for brood years 1991-2025. The scenarios pictured are basecase (black circles) and a scenario from each of three categories: Enhanced Recharge, Crop Change, and eight thousand acres of irrigated crops converted to low-ET Native Vegetation. Dry-type water years (vertical bars) are 1991, ’92, ’94, 2001, ’09, ’13, ’14, ’18, and ’20-’22. Shown also in Supplement A." title="" id="60" name="Picture"/>
             <a:graphic>
               <a:graphicData uri="http://schemas.openxmlformats.org/drawingml/2006/picture">
                 <pic:pic>
                   <pic:nvPicPr>
-                    <pic:cNvPr descr="Graphics%20and%20Supplements/Figure%204.png" id="60" name="Picture"/>
+                    <pic:cNvPr descr="Graphics%20and%20Supplements/Figure%204.png" id="61" name="Picture"/>
                     <pic:cNvPicPr>
                       <a:picLocks noChangeArrowheads="1" noChangeAspect="1"/>
                     </pic:cNvPicPr>
                   </pic:nvPicPr>
                   <pic:blipFill>
-                    <a:blip r:embed="rId58"/>
+                    <a:blip r:embed="rId59"/>
                     <a:stretch>
                       <a:fillRect/>
                     </a:stretch>
@@ -8103,8 +8618,8 @@
       <w:pPr>
         <w:pStyle w:val="ImageCaption"/>
       </w:pPr>
-      <w:bookmarkStart w:id="61" w:name="fig:benefitByWYMainText"/>
-      <w:bookmarkEnd w:id="61"/>
+      <w:bookmarkStart w:id="62" w:name="fig:benefitByWYMainText"/>
+      <w:bookmarkEnd w:id="62"/>
       <w:r>
         <w:t xml:space="preserve">Figure 5:</w:t>
       </w:r>
@@ -8115,7 +8630,7 @@
         <w:t xml:space="preserve"> </w:t>
       </w:r>
       <w:r>
-        <w:t xml:space="preserve">Comparison of annual performance in two objective functions (Hydrologic Benefit and ET, representing environmental and agricultural objectives, respectively) for brood years 1991-2025. The scenarios pictured are basecase (black circles) and a scenario from each of three categories: Enhanced Recharge, Crop Change, and eight thousand acres of irrigated crops converted to low-ET Native Vegetation. Dry-type water years (vertical bars) are 1991, ’92, ’94, 2001, ’09, ’13, ’14, ’18, and ’20-’22.</w:t>
+        <w:t xml:space="preserve">Comparison of annual performance in two objective functions (Hydrologic Benefit and ET, representing environmental and agricultural objectives, respectively) for brood years 1991-2025. The scenarios pictured are basecase (black circles) and a scenario from each of three categories: Enhanced Recharge, Crop Change, and eight thousand acres of irrigated crops converted to low-ET Native Vegetation. Dry-type water years (vertical bars) are 1991, ’92, ’94, 2001, ’09, ’13, ’14, ’18, and ’20-’22. Shown also in Supplement A.</w:t>
       </w:r>
     </w:p>
     <w:p>
@@ -8147,18 +8662,18 @@
           <wp:inline>
             <wp:extent cx="5334000" cy="5334000"/>
             <wp:effectExtent b="0" l="0" r="0" t="0"/>
-            <wp:docPr descr="Figure 6:  Environmental and agricultural objective function performance (in terms of Hydrologic Benefit, or HB, value; and crop ET volume) for basecase (black circle in upper left) and 25 management scenarios. Symbol x and y coordinates are the average of 35 annual HB and ET values for each scenario over the full model period (water years 1991-2025); for exampe time series of annual values, see previous figure." title="" id="63" name="Picture"/>
+            <wp:docPr descr="Figure 6:  Environmental and agricultural objective function performance (in terms of Hydrologic Benefit, or HB, value; and crop ET volume) for basecase (black circle in upper left) and 25 management scenarios. Symbol x and y coordinates are the average of 35 annual HB and ET values for each scenario over the full model period (water years 1991-2025); for exampe time series of annual values, see previous figure." title="" id="64" name="Picture"/>
             <a:graphic>
               <a:graphicData uri="http://schemas.openxmlformats.org/drawingml/2006/picture">
                 <pic:pic>
                   <pic:nvPicPr>
-                    <pic:cNvPr descr="Graphics%20and%20Supplements/Figure%205.png" id="64" name="Picture"/>
+                    <pic:cNvPr descr="Graphics%20and%20Supplements/Figure%205.png" id="65" name="Picture"/>
                     <pic:cNvPicPr>
                       <a:picLocks noChangeArrowheads="1" noChangeAspect="1"/>
                     </pic:cNvPicPr>
                   </pic:nvPicPr>
                   <pic:blipFill>
-                    <a:blip r:embed="rId62"/>
+                    <a:blip r:embed="rId63"/>
                     <a:stretch>
                       <a:fillRect/>
                     </a:stretch>
@@ -8189,8 +8704,8 @@
       <w:pPr>
         <w:pStyle w:val="ImageCaption"/>
       </w:pPr>
-      <w:bookmarkStart w:id="65" w:name="fig:farmerFishTradeoffFigureMainText"/>
-      <w:bookmarkEnd w:id="65"/>
+      <w:bookmarkStart w:id="66" w:name="fig:farmerFishTradeoffFigureMainText"/>
+      <w:bookmarkEnd w:id="66"/>
       <w:r>
         <w:t xml:space="preserve">Figure 6:</w:t>
       </w:r>
@@ -8224,12 +8739,106 @@
         <w:t xml:space="preserve">##   2</w:t>
       </w:r>
     </w:p>
+    <w:bookmarkStart w:id="67" w:name="X7284884376ee93470eb63c20106f06dfdc86233"/>
     <w:p>
       <w:pPr>
+        <w:pStyle w:val="Heading2"/>
+      </w:pPr>
+      <w:r>
+        <w:rPr>
+          <w:rStyle w:val="SectionNumber"/>
+        </w:rPr>
+        <w:t xml:space="preserve">4.1</w:t>
+      </w:r>
+      <w:r>
+        <w:tab/>
+      </w:r>
+      <w:r>
+        <w:t xml:space="preserve">Hydrologic Benefit function basis: selected functional flows</w:t>
+      </w:r>
+    </w:p>
+    <w:p>
+      <w:pPr>
         <w:pStyle w:val="FirstParagraph"/>
       </w:pPr>
       <w:r>
-        <w:t xml:space="preserve">The aggregate hydrologic impact of each management scenario can be compared against the historical basecase using the annual objective function values over the full 35-year record (e.g., Figure</w:t>
+        <w:t xml:space="preserve">As stated above, the environmental objective (HB function) results can be interpreted as a prediction of the ~50% of variation in coho smolt production that is empirically</w:t>
+      </w:r>
+      <w:r>
+        <w:t xml:space="preserve"> </w:t>
+      </w:r>
+      <w:r>
+        <w:rPr>
+          <w:i/>
+          <w:iCs/>
+        </w:rPr>
+        <w:t xml:space="preserve">associated with</w:t>
+      </w:r>
+      <w:r>
+        <w:t xml:space="preserve"> </w:t>
+      </w:r>
+      <w:r>
+        <w:t xml:space="preserve">and appears to be</w:t>
+      </w:r>
+      <w:r>
+        <w:t xml:space="preserve"> </w:t>
+      </w:r>
+      <w:r>
+        <w:rPr>
+          <w:i/>
+          <w:iCs/>
+        </w:rPr>
+        <w:t xml:space="preserve">supported by</w:t>
+      </w:r>
+      <w:r>
+        <w:t xml:space="preserve"> </w:t>
+      </w:r>
+      <w:r>
+        <w:t xml:space="preserve">hydrologic factors. Because predictor values were standardized (Z-score transformed) before the statistical modeling exercise, absolute values of HB function coefficients for flow metrics can be interpreted as relative degree of influence on the relevant ecological outcome (Table</w:t>
+      </w:r>
+      <w:r>
+        <w:t xml:space="preserve"> </w:t>
+      </w:r>
+      <w:r>
+        <w:t xml:space="preserve">3</w:t>
+      </w:r>
+      <w:r>
+        <w:t xml:space="preserve">).</w:t>
+      </w:r>
+    </w:p>
+    <w:p>
+      <w:pPr>
+        <w:pStyle w:val="BodyText"/>
+      </w:pPr>
+      <w:r>
+        <w:t xml:space="preserve">For coho, in both absolute and spawner-normalized smolt units, the high-importance flows were fall-to-wet season transition metrics; for units of absolute smolt abundance, the spring recession rate was also important (Supplements A and B, Table 1). For Chinook, in both absolute and spawner-normalized smolt units, the wet season baseflow median magnitude was of greatest importance; for normalized smolt units, maximum spring recession rate was also selected (Supplements C and D, Table 1). Effectively, in the context of LASSO regression, the flows that explain the most variation in smolt production (without overfitting, as determined by k-fold validation) were related to, for coho, the timing of wet season onset and the magnitude of changes in fall flows; and for Chinook, the wet season baseflow.</w:t>
+      </w:r>
+    </w:p>
+    <w:bookmarkEnd w:id="67"/>
+    <w:bookmarkStart w:id="68" w:name="objective-function-results-over-time"/>
+    <w:p>
+      <w:pPr>
+        <w:pStyle w:val="Heading2"/>
+      </w:pPr>
+      <w:r>
+        <w:rPr>
+          <w:rStyle w:val="SectionNumber"/>
+        </w:rPr>
+        <w:t xml:space="preserve">4.2</w:t>
+      </w:r>
+      <w:r>
+        <w:tab/>
+      </w:r>
+      <w:r>
+        <w:t xml:space="preserve">Objective function results over time</w:t>
+      </w:r>
+    </w:p>
+    <w:p>
+      <w:pPr>
+        <w:pStyle w:val="FirstParagraph"/>
+      </w:pPr>
+      <w:r>
+        <w:t xml:space="preserve">Generally different management scenarios tended to have a uniform effect on total ET over time, shifting it by about the same amount each year (Figure</w:t>
       </w:r>
       <w:r>
         <w:t xml:space="preserve"> </w:t>
@@ -8238,67 +8847,15 @@
         <w:t xml:space="preserve">5</w:t>
       </w:r>
       <w:r>
-        <w:t xml:space="preserve">) or using the 35-year mean values for each scenario (Figure</w:t>
-      </w:r>
-      <w:r>
-        <w:t xml:space="preserve"> </w:t>
-      </w:r>
-      <w:r>
-        <w:t xml:space="preserve">??</w:t>
-      </w:r>
-      <w:r>
-        <w:t xml:space="preserve">; Table</w:t>
-      </w:r>
-      <w:r>
-        <w:t xml:space="preserve"> </w:t>
-      </w:r>
-      <w:r>
-        <w:t xml:space="preserve">5</w:t>
-      </w:r>
-      <w:r>
-        <w:t xml:space="preserve">). In the basecase scenario, the 35-year mean annual ET volume is 118 million m</w:t>
-      </w:r>
-      <w:r>
-        <w:rPr>
-          <w:vertAlign w:val="superscript"/>
-        </w:rPr>
-        <w:t xml:space="preserve">3</w:t>
-      </w:r>
-      <w:r>
-        <w:t xml:space="preserve"> </w:t>
-      </w:r>
-      <w:r>
-        <w:t xml:space="preserve">of water, and the 35-year mean of annual HB values is 7812 coho spf-equivalent (Table</w:t>
-      </w:r>
-      <w:r>
-        <w:t xml:space="preserve"> </w:t>
-      </w:r>
-      <w:r>
-        <w:t xml:space="preserve">5</w:t>
-      </w:r>
-      <w:r>
-        <w:t xml:space="preserve">). Annual ET volume is relatively stable over the model period of water years 1991-2025, while annual HB values are much more variable (Figure</w:t>
-      </w:r>
-      <w:r>
-        <w:t xml:space="preserve"> </w:t>
-      </w:r>
-      <w:r>
-        <w:t xml:space="preserve">??</w:t>
-      </w:r>
-      <w:r>
-        <w:t xml:space="preserve">). Among the 24 management scenarios, mean ET values ranged from 0 (for a no cultivated agriculture scenario) to 118 million m</w:t>
-      </w:r>
-      <w:r>
-        <w:rPr>
-          <w:vertAlign w:val="superscript"/>
-        </w:rPr>
-        <w:t xml:space="preserve">3</w:t>
-      </w:r>
-      <w:r>
-        <w:t xml:space="preserve"> </w:t>
-      </w:r>
-      <w:r>
-        <w:t xml:space="preserve">of water, while HB values ranged from 7696 to 8446 coho smolt-equivalent.</w:t>
+        <w:t xml:space="preserve">. Conversely, in some years, many scenarios seem to have very little effect on HB function, though this is variable over time, regardless of which HB units are used (Figure @ref(fig:benefitByWYMainText and Supplements A-D, Figure 1).</w:t>
+      </w:r>
+    </w:p>
+    <w:p>
+      <w:pPr>
+        <w:pStyle w:val="BodyText"/>
+      </w:pPr>
+      <w:r>
+        <w:t xml:space="preserve">The small effect of some scenarios on HB values implies that these scenarios do not alter the component flows relative to basecase (Supplements A-D, Figure 2).</w:t>
       </w:r>
     </w:p>
     <w:p>
@@ -8310,7 +8867,7 @@
           <w:b/>
           <w:bCs/>
         </w:rPr>
-        <w:t xml:space="preserve">results bullet points</w:t>
+        <w:t xml:space="preserve">CURRENTLY HERE</w:t>
       </w:r>
     </w:p>
     <w:p>
@@ -8322,7 +8879,7 @@
         </w:numPr>
       </w:pPr>
       <w:r>
-        <w:t xml:space="preserve">High-importance flows selected in LASSO regression and corroboration by other statistical approaches.</w:t>
+        <w:t xml:space="preserve">For HB components (SUpplements A-D, Figure 2):</w:t>
       </w:r>
     </w:p>
     <w:p>
@@ -8334,7 +8891,17 @@
         </w:numPr>
       </w:pPr>
       <w:r>
-        <w:t xml:space="preserve">For coho, in both absolute and spawner-normalized smolt units, LASSO regression identified at fall-to-wet season transition metrics as of high importance for predicting coho outcomes; for units of absolute smolt abundance, the spring recession rate was also selected (Supplements A and B, Table 1).</w:t>
+        <w:t xml:space="preserve">For coho juvenile abundance, in the basecase scenario, it seems that when the HB function predicts a particularly good year (</w:t>
+      </w:r>
+      <w:r>
+        <w:rPr>
+          <w:b/>
+          <w:bCs/>
+        </w:rPr>
+        <w:t xml:space="preserve">numerical definition</w:t>
+      </w:r>
+      <w:r>
+        <w:t xml:space="preserve">), it is driven by a large magnitude fall flow difference, or fall pulse. Conversely, in the years where the HB function predicts a particularly bad year, it is driven by a rapid first spring recession rate (Supplement A, Figure 2).</w:t>
       </w:r>
     </w:p>
     <w:p>
@@ -8346,10 +8913,7 @@
         </w:numPr>
       </w:pPr>
       <w:r>
-        <w:t xml:space="preserve">For Chinook, in both absolute and spawner-normalized smolt units, the wet season baseflow median magnitude was of greatest importance; for normalized smolt units, maximum spring recession rate was also selected (Supplements C and D, Table 1).</w:t>
-      </w:r>
-      <w:r>
-        <w:br/>
+        <w:t xml:space="preserve">Conversely, for coho juveniles per spawner (basecase), both good and bad years seem to be largely driven by wet season onset timing (Supplement B, Figure 2)</w:t>
       </w:r>
     </w:p>
     <w:p>
@@ -8361,7 +8925,7 @@
         </w:numPr>
       </w:pPr>
       <w:r>
-        <w:t xml:space="preserve">Effectively, in the context of LASSO regression, the flows that explain the most variation in smolt production (without overfitting, as determined by k-fold validation) were related to, for coho, the timing of wet season onset and the magnitude of changes in fall flows; and for Chinook, the wet season baseflow.</w:t>
+        <w:t xml:space="preserve">In both cases for coho, 2nd fall flow difference makes minor contributions (Supplements A and B, Figure 2), and is assigned a negative coefficient. This suggests higher flows in the second fall (for juvenile overwintering coho) are consistently associated with lower smolt production, but other factors such as first fall flow difference and wet season timing seem to exert greater overall influence.</w:t>
       </w:r>
     </w:p>
     <w:p>
@@ -8373,94 +8937,134 @@
         </w:numPr>
       </w:pPr>
       <w:r>
-        <w:t xml:space="preserve">The importance of wet season baseflows to Chinook and fall flows to coho is corroborated by the other statistical modeling approaches, i.e., LASSO regression predicting smolt production based on hydrology and spawner abundance, as well as MARSS regression models predicting smolt production with single hydrologic covariates</w:t>
-      </w:r>
-      <w:r>
-        <w:t xml:space="preserve"> </w:t>
-      </w:r>
-      <w:r>
-        <w:t xml:space="preserve">(Kouba et al. 2025)</w:t>
-      </w:r>
-      <w:r>
-        <w:t xml:space="preserve">. However, other metrics were also highlighted:</w:t>
-      </w:r>
-      <w:r>
-        <w:t xml:space="preserve"> </w:t>
+        <w:t xml:space="preserve">For Chinook, predictions of both high and low smolt production are driven by wet season baseflow magnitude (with a small contribution from maximum spring recession rate for juveniles per adult): high wet season flows are associated with lower smolt abundance.</w:t>
+      </w:r>
+    </w:p>
+    <w:bookmarkEnd w:id="68"/>
+    <w:bookmarkStart w:id="69" w:name="X5fdb465ae76c96bdfd4b77e04da6681552dfa21"/>
+    <w:p>
+      <w:pPr>
+        <w:pStyle w:val="Heading2"/>
+      </w:pPr>
+      <w:r>
+        <w:rPr>
+          <w:rStyle w:val="SectionNumber"/>
+        </w:rPr>
+        <w:t xml:space="preserve">4.3</w:t>
+      </w:r>
+      <w:r>
+        <w:tab/>
+      </w:r>
+      <w:r>
+        <w:t xml:space="preserve">Environmental-agricultural tradeoffs and efficiency</w:t>
+      </w:r>
+    </w:p>
+    <w:p>
+      <w:pPr>
+        <w:numPr>
+          <w:ilvl w:val="0"/>
+          <w:numId w:val="1008"/>
+        </w:numPr>
+      </w:pPr>
+      <w:r>
+        <w:t xml:space="preserve">Tradeoff plot (Figure</w:t>
+      </w:r>
+      <w:r>
+        <w:t xml:space="preserve"> </w:t>
+      </w:r>
+      <w:r>
+        <w:t xml:space="preserve">6</w:t>
+      </w:r>
+      <w:r>
+        <w:t xml:space="preserve">.</w:t>
+      </w:r>
+    </w:p>
+    <w:p>
+      <w:pPr>
+        <w:numPr>
+          <w:ilvl w:val="1"/>
+          <w:numId w:val="1009"/>
+        </w:numPr>
+      </w:pPr>
+      <w:r>
+        <w:t xml:space="preserve">Highest-HB value is total conversion of irrigated agriculture to native vegetation. (High-ET vegetation endmember for Chinook and low-ET for coho).</w:t>
+      </w:r>
+    </w:p>
+    <w:p>
+      <w:pPr>
+        <w:numPr>
+          <w:ilvl w:val="1"/>
+          <w:numId w:val="1009"/>
+        </w:numPr>
+      </w:pPr>
+      <w:r>
+        <w:t xml:space="preserve">reservoir scenarios don’t help coho much at all: small reservoirs just don’t have capacity to add fall flow during dry years when baseflows are lowest. Surprisingly, reservoir scenarios seem to help Chinook significantly more: even a small reservoir on one tributary can dampen wet season stormflows enough to benefit Chinook.</w:t>
+      </w:r>
+    </w:p>
+    <w:p>
+      <w:pPr>
+        <w:numPr>
+          <w:ilvl w:val="1"/>
+          <w:numId w:val="1009"/>
+        </w:numPr>
+      </w:pPr>
+      <w:r>
+        <w:t xml:space="preserve">In all four HB formulations, Enhanced Recharge produces virtually no change in either fish benefit or farmer cost relative to basecase (Supplements A-D, Figure 3). The lack of farmer cost is by design; this management strategy is intended to minimize any impacts on growing season operations. But the lack of any fish benefit may reflect limitations of current surface water diversion permit rules; the maximum amount permitted winter diversions may not be sufficient to generate baseflow increases at the end of the following dry season.</w:t>
+      </w:r>
+    </w:p>
+    <w:p>
+      <w:pPr>
+        <w:numPr>
+          <w:ilvl w:val="1"/>
+          <w:numId w:val="1009"/>
+        </w:numPr>
+      </w:pPr>
+      <w:r>
+        <w:t xml:space="preserve">For coho, Enhanced Recharge and Reservoir scenarios produce virtually no farmer cost.</w:t>
+      </w:r>
+    </w:p>
+    <w:p>
+      <w:pPr>
+        <w:numPr>
+          <w:ilvl w:val="1"/>
+          <w:numId w:val="1009"/>
+        </w:numPr>
+      </w:pPr>
+      <w:r>
+        <w:t xml:space="preserve">Irrigation efficiency seems</w:t>
+      </w:r>
+    </w:p>
+    <w:p>
+      <w:pPr>
+        <w:numPr>
+          <w:ilvl w:val="1"/>
+          <w:numId w:val="1009"/>
+        </w:numPr>
+      </w:pPr>
+      <w:r>
+        <w:t xml:space="preserve">Chinook plots of fish vs farmer tradeoffs are effectively meaningless, since wet season median flows are largely beyond human control in this undammed watershed. (</w:t>
       </w:r>
       <w:r>
         <w:rPr>
           <w:b/>
           <w:bCs/>
         </w:rPr>
-        <w:t xml:space="preserve">summarize hydro+spawner and MARSS results</w:t>
-      </w:r>
-      <w:r>
-        <w:t xml:space="preserve"> </w:t>
-      </w:r>
-      <w:r>
-        <w:t xml:space="preserve">(Kouba et al. 2025)</w:t>
+        <w:t xml:space="preserve">for discussion?</w:t>
+      </w:r>
+      <w:r>
+        <w:t xml:space="preserve">)</w:t>
       </w:r>
     </w:p>
     <w:p>
       <w:pPr>
-        <w:pStyle w:val="Compact"/>
-        <w:numPr>
-          <w:ilvl w:val="0"/>
-          <w:numId w:val="1006"/>
-        </w:numPr>
-      </w:pPr>
-      <w:r>
-        <w:t xml:space="preserve">for HB over time:</w:t>
-      </w:r>
-    </w:p>
-    <w:p>
-      <w:pPr>
-        <w:pStyle w:val="Compact"/>
-        <w:numPr>
-          <w:ilvl w:val="1"/>
-          <w:numId w:val="1008"/>
-        </w:numPr>
-      </w:pPr>
-      <w:r>
-        <w:t xml:space="preserve">Generally a uniform effect on ET, shifting it by about the same amount each year. Conversely, scenario effect on HB function is variable. (Supplements A-D, Fig.</w:t>
-      </w:r>
-      <w:r>
-        <w:t xml:space="preserve"> </w:t>
-      </w:r>
+        <w:pStyle w:val="FirstParagraph"/>
+      </w:pPr>
       <w:r>
         <w:rPr>
           <w:b/>
           <w:bCs/>
         </w:rPr>
-        <w:t xml:space="preserve">W</w:t>
-      </w:r>
-      <w:r>
-        <w:t xml:space="preserve">)</w:t>
-      </w:r>
-    </w:p>
-    <w:p>
-      <w:pPr>
-        <w:pStyle w:val="Compact"/>
-        <w:numPr>
-          <w:ilvl w:val="1"/>
-          <w:numId w:val="1008"/>
-        </w:numPr>
-      </w:pPr>
-      <w:r>
-        <w:t xml:space="preserve">For Hb over time, not a lot of difference between scenarios some years. Some scenarios may not change the component flows relative to basecase ((Supplements A-D, Fig.</w:t>
-      </w:r>
-      <w:r>
-        <w:t xml:space="preserve"> </w:t>
-      </w:r>
-      <w:r>
-        <w:rPr>
-          <w:b/>
-          <w:bCs/>
-        </w:rPr>
-        <w:t xml:space="preserve">X</w:t>
-      </w:r>
-      <w:r>
-        <w:t xml:space="preserve">))</w:t>
+        <w:t xml:space="preserve">check - is alf_curtail_07.31 actually alf_curtail_08.15?</w:t>
       </w:r>
     </w:p>
     <w:p>
@@ -8468,156 +9072,17 @@
         <w:pStyle w:val="Compact"/>
         <w:numPr>
           <w:ilvl w:val="0"/>
-          <w:numId w:val="1006"/>
-        </w:numPr>
-      </w:pPr>
-      <w:r>
-        <w:t xml:space="preserve">For HB components:</w:t>
-      </w:r>
-    </w:p>
-    <w:p>
-      <w:pPr>
-        <w:pStyle w:val="Compact"/>
-        <w:numPr>
-          <w:ilvl w:val="1"/>
-          <w:numId w:val="1009"/>
-        </w:numPr>
-      </w:pPr>
-      <w:r>
-        <w:t xml:space="preserve">For coho juvenile abundance, in the basecase scenario, it seems that when the HB function predicts a particularly good year (</w:t>
-      </w:r>
-      <w:r>
-        <w:rPr>
-          <w:b/>
-          <w:bCs/>
-        </w:rPr>
-        <w:t xml:space="preserve">numerical definition</w:t>
-      </w:r>
-      <w:r>
-        <w:t xml:space="preserve">), it is driven by a large magnitude fall flow difference, or fall pulse. Conversely, in the years where the HB function predicts a particularly bad year, it is driven by a rapid first spring recession rate (Supplement A, Fig</w:t>
-      </w:r>
-      <w:r>
-        <w:t xml:space="preserve"> </w:t>
-      </w:r>
-      <w:r>
-        <w:rPr>
-          <w:b/>
-          <w:bCs/>
-        </w:rPr>
-        <w:t xml:space="preserve">X</w:t>
-      </w:r>
-      <w:r>
-        <w:t xml:space="preserve">).</w:t>
-      </w:r>
-    </w:p>
-    <w:p>
-      <w:pPr>
-        <w:pStyle w:val="Compact"/>
-        <w:numPr>
-          <w:ilvl w:val="1"/>
-          <w:numId w:val="1009"/>
-        </w:numPr>
-      </w:pPr>
-      <w:r>
-        <w:t xml:space="preserve">Conversely, for coho juveniles per spawner (basecase), both good and bad years seem to be largely driven by wet season onset timing (Supplement B, Fig</w:t>
-      </w:r>
-      <w:r>
-        <w:t xml:space="preserve"> </w:t>
-      </w:r>
-      <w:r>
-        <w:rPr>
-          <w:b/>
-          <w:bCs/>
-        </w:rPr>
-        <w:t xml:space="preserve">X</w:t>
-      </w:r>
-      <w:r>
-        <w:t xml:space="preserve">)</w:t>
-      </w:r>
-    </w:p>
-    <w:p>
-      <w:pPr>
-        <w:pStyle w:val="Compact"/>
-        <w:numPr>
-          <w:ilvl w:val="1"/>
-          <w:numId w:val="1009"/>
-        </w:numPr>
-      </w:pPr>
-      <w:r>
-        <w:t xml:space="preserve">In both cases for coho, 2nd fall flow difference makes minor contributions (Supplements A and B, Fig</w:t>
-      </w:r>
-      <w:r>
-        <w:t xml:space="preserve"> </w:t>
-      </w:r>
-      <w:r>
-        <w:rPr>
-          <w:b/>
-          <w:bCs/>
-        </w:rPr>
-        <w:t xml:space="preserve">X</w:t>
-      </w:r>
-      <w:r>
-        <w:t xml:space="preserve">), and is assigned a negative coefficient. This suggests higher flows in the second fall (for juvenile overwintering coho) are consistently associated with lower smolt production, but other factors such as first fall flow difference and wet season timing seem to exert greater overall influence.</w:t>
-      </w:r>
-    </w:p>
-    <w:p>
-      <w:pPr>
-        <w:pStyle w:val="Compact"/>
-        <w:numPr>
-          <w:ilvl w:val="1"/>
-          <w:numId w:val="1009"/>
-        </w:numPr>
-      </w:pPr>
-      <w:r>
-        <w:t xml:space="preserve">For Chinook, predictions of both high and low smolt production are driven by wet season baseflow magnitude (with a small contribution from maximum spring recession rate for juveniles per adult): high wet season flows are associated with lower smolt abundance.</w:t>
-      </w:r>
-    </w:p>
-    <w:p>
-      <w:pPr>
-        <w:pStyle w:val="Compact"/>
-        <w:numPr>
-          <w:ilvl w:val="0"/>
-          <w:numId w:val="1006"/>
-        </w:numPr>
-      </w:pPr>
-      <w:r>
-        <w:t xml:space="preserve">Tradeoff plot.</w:t>
-      </w:r>
-    </w:p>
-    <w:p>
-      <w:pPr>
-        <w:pStyle w:val="Compact"/>
-        <w:numPr>
-          <w:ilvl w:val="1"/>
           <w:numId w:val="1010"/>
         </w:numPr>
       </w:pPr>
       <w:r>
-        <w:t xml:space="preserve">Highest-HB value is total conversion of irrigated agriculture to native vegetation. (High-ET vegetation endmember for Chinook and low-ET for coho).</w:t>
-      </w:r>
-    </w:p>
-    <w:p>
-      <w:pPr>
-        <w:pStyle w:val="Compact"/>
-        <w:numPr>
-          <w:ilvl w:val="1"/>
-          <w:numId w:val="1010"/>
-        </w:numPr>
-      </w:pPr>
-      <w:r>
-        <w:t xml:space="preserve">reservoir scenarios don’t help coho much at all: small reservoirs just don’t have capacity to add fall flow during dry years when baseflows are lowest. Surprisingly, reservoir scenarios seem to help Chinook significantly more: even a small reservoir on one tributary can dampen wet season stormflows enough to benefit Chinook.</w:t>
-      </w:r>
-    </w:p>
-    <w:p>
-      <w:pPr>
-        <w:pStyle w:val="Compact"/>
-        <w:numPr>
-          <w:ilvl w:val="0"/>
-          <w:numId w:val="1006"/>
-        </w:numPr>
-      </w:pPr>
-      <w:r>
-        <w:t xml:space="preserve">Efficiency plot</w:t>
+        <w:t xml:space="preserve">Efficiency plot (Figure</w:t>
+      </w:r>
+      <w:r>
+        <w:t xml:space="preserve"> </w:t>
+      </w:r>
+      <w:r>
+        <w:t xml:space="preserve">7</w:t>
       </w:r>
     </w:p>
     <w:p>
@@ -8637,11 +9102,17 @@
         <w:pStyle w:val="Compact"/>
         <w:numPr>
           <w:ilvl w:val="0"/>
-          <w:numId w:val="1006"/>
+          <w:numId w:val="1010"/>
         </w:numPr>
       </w:pPr>
       <w:r>
-        <w:t xml:space="preserve">3-D results figure</w:t>
+        <w:t xml:space="preserve">3-D results figure (Figure</w:t>
+      </w:r>
+      <w:r>
+        <w:t xml:space="preserve"> </w:t>
+      </w:r>
+      <w:r>
+        <w:t xml:space="preserve">8</w:t>
       </w:r>
     </w:p>
     <w:p>
@@ -8661,6 +9132,37 @@
         <w:pStyle w:val="FirstParagraph"/>
       </w:pPr>
       <w:r>
+        <w:rPr>
+          <w:b/>
+          <w:bCs/>
+        </w:rPr>
+        <w:t xml:space="preserve">begin old result text</w:t>
+      </w:r>
+    </w:p>
+    <w:bookmarkEnd w:id="69"/>
+    <w:bookmarkStart w:id="71" w:name="X7919b09686293416b4bcb59483f48ae87a57064"/>
+    <w:p>
+      <w:pPr>
+        <w:pStyle w:val="Heading2"/>
+      </w:pPr>
+      <w:r>
+        <w:rPr>
+          <w:rStyle w:val="SectionNumber"/>
+        </w:rPr>
+        <w:t xml:space="preserve">4.4</w:t>
+      </w:r>
+      <w:r>
+        <w:tab/>
+      </w:r>
+      <w:r>
+        <w:t xml:space="preserve">Environmental and agricultural objective function values</w:t>
+      </w:r>
+    </w:p>
+    <w:p>
+      <w:pPr>
+        <w:pStyle w:val="FirstParagraph"/>
+      </w:pPr>
+      <w:r>
         <w:t xml:space="preserve">Four scenario categories fall in a cluster with relatively high ET values, indicating that these scenarios conserve nearly all the basecase economic benefits for local growers: Enhanced Recharge, Expanded Enhanced Recharge, Irrigation Efficiency, and Small Reservoir (Figure</w:t>
       </w:r>
       <w:r>
@@ -8948,10 +9450,10 @@
       <w:pPr>
         <w:pStyle w:val="TableCaption"/>
       </w:pPr>
-      <w:bookmarkStart w:id="66" w:name="tab:scenarioResultsTabMainText"/>
-      <w:bookmarkEnd w:id="66"/>
-      <w:r>
-        <w:t xml:space="preserve">Table 5:</w:t>
+      <w:bookmarkStart w:id="70" w:name="tab:scenarioResultsTabMainText"/>
+      <w:bookmarkEnd w:id="70"/>
+      <w:r>
+        <w:t xml:space="preserve">Table 6:</w:t>
       </w:r>
       <w:r>
         <w:t xml:space="preserve"> </w:t>
@@ -17141,8 +17643,8 @@
         </w:tc>
       </w:tr>
     </w:tbl>
-    <w:bookmarkEnd w:id="67"/>
-    <w:bookmarkStart w:id="72" w:name="X5717be130d28923be971a1bdea556d769a5487a"/>
+    <w:bookmarkEnd w:id="71"/>
+    <w:bookmarkStart w:id="76" w:name="X5717be130d28923be971a1bdea556d769a5487a"/>
     <w:p>
       <w:pPr>
         <w:pStyle w:val="Heading2"/>
@@ -17151,7 +17653,7 @@
         <w:rPr>
           <w:rStyle w:val="SectionNumber"/>
         </w:rPr>
-        <w:t xml:space="preserve">4.2</w:t>
+        <w:t xml:space="preserve">4.5</w:t>
       </w:r>
       <w:r>
         <w:tab/>
@@ -17200,7 +17702,7 @@
         <w:t xml:space="preserve"> </w:t>
       </w:r>
       <w:r>
-        <w:t xml:space="preserve">5</w:t>
+        <w:t xml:space="preserve">6</w:t>
       </w:r>
       <w:r>
         <w:t xml:space="preserve">). The range covers two orders of magnitude because the denominator of the ratio, lost ET, ranges from 0% to 100%, while the HB gains fall more narrowly between -1.5% to 8.1%. Efficiencies greater than 1 indicate that a scenario produces more than a 1% increase in HB value per 1% loss in ET value. However, because the HB and ET units are non-commensurable, the absolute value of the trade-off efficiency is not of great significance; the trade-off efficiency metric is most useful for scenario comparisons.</w:t>
@@ -17312,18 +17814,18 @@
           <wp:inline>
             <wp:extent cx="5334000" cy="4000499"/>
             <wp:effectExtent b="0" l="0" r="0" t="0"/>
-            <wp:docPr descr="Figure 7:  Scenario trade-off efficiencies, or average Hydrologic Benefit value (a proxy for environmental benefit) gained per crop ET value lost (a proxy for farmer cost) (normalized to average basecase HB and ET values, respectively), in all 35 years. Some scenarios are excluded if they have no or negative ET loss, producing infinite or negative efficiency values." title="" id="69" name="Picture"/>
+            <wp:docPr descr="Figure 7:  Scenario trade-off efficiencies, or average Hydrologic Benefit value (a proxy for environmental benefit) gained per crop ET value lost (a proxy for farmer cost) (normalized to average basecase HB and ET values, respectively), in all 35 years. Some scenarios are excluded if they have no or negative ET loss, producing infinite or negative efficiency values." title="" id="73" name="Picture"/>
             <a:graphic>
               <a:graphicData uri="http://schemas.openxmlformats.org/drawingml/2006/picture">
                 <pic:pic>
                   <pic:nvPicPr>
-                    <pic:cNvPr descr="Graphics%20and%20Supplements/Figure%207.png" id="70" name="Picture"/>
+                    <pic:cNvPr descr="Graphics%20and%20Supplements/Figure%207.png" id="74" name="Picture"/>
                     <pic:cNvPicPr>
                       <a:picLocks noChangeArrowheads="1" noChangeAspect="1"/>
                     </pic:cNvPicPr>
                   </pic:nvPicPr>
                   <pic:blipFill>
-                    <a:blip r:embed="rId68"/>
+                    <a:blip r:embed="rId72"/>
                     <a:stretch>
                       <a:fillRect/>
                     </a:stretch>
@@ -17354,8 +17856,8 @@
       <w:pPr>
         <w:pStyle w:val="ImageCaption"/>
       </w:pPr>
-      <w:bookmarkStart w:id="71" w:name="fig:efficiencyMainText"/>
-      <w:bookmarkEnd w:id="71"/>
+      <w:bookmarkStart w:id="75" w:name="fig:efficiencyMainText"/>
+      <w:bookmarkEnd w:id="75"/>
       <w:r>
         <w:t xml:space="preserve">Figure 7:</w:t>
       </w:r>
@@ -17369,8 +17871,8 @@
         <w:t xml:space="preserve">Scenario trade-off efficiencies, or average Hydrologic Benefit value (a proxy for environmental benefit) gained per crop ET value lost (a proxy for farmer cost) (normalized to average basecase HB and ET values, respectively), in all 35 years. Some scenarios are excluded if they have no or negative ET loss, producing infinite or negative efficiency values.</w:t>
       </w:r>
     </w:p>
-    <w:bookmarkEnd w:id="72"/>
-    <w:bookmarkStart w:id="78" w:name="Xfbc83626841bb94e70b2ed42e58f7fe62bf81a6"/>
+    <w:bookmarkEnd w:id="76"/>
+    <w:bookmarkStart w:id="82" w:name="Xfbc83626841bb94e70b2ed42e58f7fe62bf81a6"/>
     <w:p>
       <w:pPr>
         <w:pStyle w:val="Heading2"/>
@@ -17379,7 +17881,7 @@
         <w:rPr>
           <w:rStyle w:val="SectionNumber"/>
         </w:rPr>
-        <w:t xml:space="preserve">4.3</w:t>
+        <w:t xml:space="preserve">4.6</w:t>
       </w:r>
       <w:r>
         <w:tab/>
@@ -17416,7 +17918,7 @@
         <w:t xml:space="preserve"> </w:t>
       </w:r>
       <w:r>
-        <w:t xml:space="preserve">5</w:t>
+        <w:t xml:space="preserve">6</w:t>
       </w:r>
       <w:r>
         <w:t xml:space="preserve">; Figure</w:t>
@@ -17476,7 +17978,7 @@
         <w:t xml:space="preserve"> </w:t>
       </w:r>
       <w:r>
-        <w:t xml:space="preserve">6</w:t>
+        <w:t xml:space="preserve">7</w:t>
       </w:r>
       <w:r>
         <w:t xml:space="preserve">); i.e., the GSP priorities demonstrate a preference for management actions with high trade-off efficiencies. Specifically, Enhanced Recharge and Irrigation Efficiency are represented in Tiers I and II, signifying they are considered implementable in the short- or medium-term. Another high-efficiency scenario, Low Flow Diversion Limits, is represented three times in Table</w:t>
@@ -17485,7 +17987,7 @@
         <w:t xml:space="preserve"> </w:t>
       </w:r>
       <w:r>
-        <w:t xml:space="preserve">6</w:t>
+        <w:t xml:space="preserve">7</w:t>
       </w:r>
       <w:r>
         <w:t xml:space="preserve">: the two analogs for it in Tier I are limited either in time (Water Trust Leasing, which occurs opportunistically in extreme droughts) or in space (the current two-creek extent of the existing watermaster program). An expanded watermaster program, which would more closely resemble the Low Flow Diversion Limits scenario, appears in Tier III.</w:t>
@@ -17523,20 +18025,20 @@
       <w:r>
         <w:drawing>
           <wp:inline>
-            <wp:extent cx="4038600" cy="4019550"/>
+            <wp:extent cx="2552700" cy="2352675"/>
             <wp:effectExtent b="0" l="0" r="0" t="0"/>
-            <wp:docPr descr="Figure 8:  A three-dimensional scatter plot of the objective function values for basecase and 39 management scenarios, averaged over 28 water years (1991-2018). Larger spheres are shown for the Pareto-optimal set of scenarios. Scenario colors correspond to legend in Figures 6 and 7." title="" id="74" name="Picture"/>
+            <wp:docPr descr="Figure 8:  A three-dimensional scatter plot of the objective function values for basecase and 39 management scenarios, averaged over 28 water years (1991-2018). Larger spheres are shown for the Pareto-optimal set of scenarios. Scenario colors correspond to legend in Figures 6 and 7." title="" id="78" name="Picture"/>
             <a:graphic>
               <a:graphicData uri="http://schemas.openxmlformats.org/drawingml/2006/picture">
                 <pic:pic>
                   <pic:nvPicPr>
-                    <pic:cNvPr descr="Graphics%20and%20Supplements/hbf%20et%20infra%20plot3d_2025.11.04.jpg" id="75" name="Picture"/>
+                    <pic:cNvPr descr="Graphics%20and%20Supplements/hbf%20et%20infra%20plot3d_2026.02.19.jpg" id="79" name="Picture"/>
                     <pic:cNvPicPr>
                       <a:picLocks noChangeArrowheads="1" noChangeAspect="1"/>
                     </pic:cNvPicPr>
                   </pic:nvPicPr>
                   <pic:blipFill>
-                    <a:blip r:embed="rId73"/>
+                    <a:blip r:embed="rId77"/>
                     <a:stretch>
                       <a:fillRect/>
                     </a:stretch>
@@ -17544,7 +18046,7 @@
                   <pic:spPr bwMode="auto">
                     <a:xfrm>
                       <a:off x="0" y="0"/>
-                      <a:ext cx="4038600" cy="4019550"/>
+                      <a:ext cx="2552700" cy="2352675"/>
                     </a:xfrm>
                     <a:prstGeom prst="rect">
                       <a:avLst/>
@@ -17567,8 +18069,8 @@
       <w:pPr>
         <w:pStyle w:val="ImageCaption"/>
       </w:pPr>
-      <w:bookmarkStart w:id="76" w:name="fig:farmerFishInfraFigure3D"/>
-      <w:bookmarkEnd w:id="76"/>
+      <w:bookmarkStart w:id="80" w:name="fig:farmerFishInfraFigure3D"/>
+      <w:bookmarkEnd w:id="80"/>
       <w:r>
         <w:t xml:space="preserve">Figure 8:</w:t>
       </w:r>
@@ -17586,10 +18088,10 @@
       <w:pPr>
         <w:pStyle w:val="TableCaption"/>
       </w:pPr>
-      <w:bookmarkStart w:id="77" w:name="tab:gspMgmtList"/>
-      <w:bookmarkEnd w:id="77"/>
-      <w:r>
-        <w:t xml:space="preserve">Table 6:</w:t>
+      <w:bookmarkStart w:id="81" w:name="tab:gspMgmtList"/>
+      <w:bookmarkEnd w:id="81"/>
+      <w:r>
+        <w:t xml:space="preserve">Table 7:</w:t>
       </w:r>
       <w:r>
         <w:t xml:space="preserve"> </w:t>
@@ -20580,9 +21082,9 @@
         <w:br w:type="page"/>
       </w:r>
     </w:p>
-    <w:bookmarkEnd w:id="78"/>
-    <w:bookmarkEnd w:id="79"/>
-    <w:bookmarkStart w:id="85" w:name="discussion"/>
+    <w:bookmarkEnd w:id="82"/>
+    <w:bookmarkEnd w:id="83"/>
+    <w:bookmarkStart w:id="89" w:name="discussion"/>
     <w:p>
       <w:pPr>
         <w:pStyle w:val="Heading1"/>
@@ -20641,7 +21143,7 @@
         <w:t xml:space="preserve">]. Though the ultimate future effect of these management actions would depend on climate variability and implementation details that have not been explicitly simulated (e.g., the precise location of pumps needed to divert surface water for the expanded enhanced recharge scenarios), it is possible to use objective functions and historical climate records to draw some high-level findings regarding their relative merits.</w:t>
       </w:r>
     </w:p>
-    <w:bookmarkStart w:id="80" w:name="Xa151cb59b4ad5c02348e31b83bab4d8169de230"/>
+    <w:bookmarkStart w:id="84" w:name="Xa151cb59b4ad5c02348e31b83bab4d8169de230"/>
     <w:p>
       <w:pPr>
         <w:pStyle w:val="Heading2"/>
@@ -20718,8 +21220,8 @@
         <w:t xml:space="preserve">These predicted on-the-ground consequences can facilitate interpretation of scenario results.</w:t>
       </w:r>
     </w:p>
-    <w:bookmarkEnd w:id="80"/>
-    <w:bookmarkStart w:id="81" w:name="Xeb4407dfc59ea709d91a13199c8e469abf09cea"/>
+    <w:bookmarkEnd w:id="84"/>
+    <w:bookmarkStart w:id="85" w:name="Xeb4407dfc59ea709d91a13199c8e469abf09cea"/>
     <w:p>
       <w:pPr>
         <w:pStyle w:val="Heading2"/>
@@ -20815,8 +21317,8 @@
         <w:t xml:space="preserve">), the low-coho year HB performance of various model scenarios is a key scenario differentiator.</w:t>
       </w:r>
     </w:p>
-    <w:bookmarkEnd w:id="81"/>
-    <w:bookmarkStart w:id="82" w:name="environmental-agricultural-trade-offs"/>
+    <w:bookmarkEnd w:id="85"/>
+    <w:bookmarkStart w:id="86" w:name="environmental-agricultural-trade-offs"/>
     <w:p>
       <w:pPr>
         <w:pStyle w:val="Heading2"/>
@@ -21000,7 +21502,7 @@
         <w:t xml:space="preserve"> </w:t>
       </w:r>
       <w:r>
-        <w:t xml:space="preserve">5</w:t>
+        <w:t xml:space="preserve">6</w:t>
       </w:r>
       <w:r>
         <w:t xml:space="preserve"> </w:t>
@@ -21086,14 +21588,14 @@
         <w:t xml:space="preserve"> </w:t>
       </w:r>
       <w:r>
-        <w:t xml:space="preserve">5</w:t>
+        <w:t xml:space="preserve">6</w:t>
       </w:r>
       <w:r>
         <w:t xml:space="preserve">).</w:t>
       </w:r>
     </w:p>
-    <w:bookmarkEnd w:id="82"/>
-    <w:bookmarkStart w:id="83" w:name="Xb48c0b1c357814727cacf50afe35e98b0bf92dd"/>
+    <w:bookmarkEnd w:id="86"/>
+    <w:bookmarkStart w:id="87" w:name="Xb48c0b1c357814727cacf50afe35e98b0bf92dd"/>
     <w:p>
       <w:pPr>
         <w:pStyle w:val="Heading2"/>
@@ -21143,7 +21645,7 @@
         <w:t xml:space="preserve"> </w:t>
       </w:r>
       <w:r>
-        <w:t xml:space="preserve">5</w:t>
+        <w:t xml:space="preserve">6</w:t>
       </w:r>
       <w:r>
         <w:t xml:space="preserve">). Native Vegetation scenarios, under two different assumptions about vegetation type/ET demand of the vegetation replacing cultivated agriculture, can produce significant HB improvements, but at a relatively high cost in regional agricultural productivity; these two scenario categories have the lowest trade-off efficiency (Figure</w:t>
@@ -21161,7 +21663,7 @@
         <w:t xml:space="preserve"> </w:t>
       </w:r>
       <w:r>
-        <w:t xml:space="preserve">5</w:t>
+        <w:t xml:space="preserve">6</w:t>
       </w:r>
       <w:r>
         <w:t xml:space="preserve">).</w:t>
@@ -21195,14 +21697,14 @@
         <w:t xml:space="preserve"> </w:t>
       </w:r>
       <w:r>
-        <w:t xml:space="preserve">6</w:t>
+        <w:t xml:space="preserve">7</w:t>
       </w:r>
       <w:r>
         <w:t xml:space="preserve">). Although the GSP management priorities emphasized infrastructure, in a strict application of these objective functions, both infrastructure-based and regulatory approaches fell within the Pareto-optimal set of management options.</w:t>
       </w:r>
     </w:p>
-    <w:bookmarkEnd w:id="83"/>
-    <w:bookmarkStart w:id="84" w:name="policy-implications"/>
+    <w:bookmarkEnd w:id="87"/>
+    <w:bookmarkStart w:id="88" w:name="policy-implications"/>
     <w:p>
       <w:pPr>
         <w:pStyle w:val="Heading2"/>
@@ -21251,7 +21753,7 @@
         <w:t xml:space="preserve"> </w:t>
       </w:r>
       <w:r>
-        <w:t xml:space="preserve">5</w:t>
+        <w:t xml:space="preserve">6</w:t>
       </w:r>
       <w:r>
         <w:t xml:space="preserve">).</w:t>
@@ -21320,9 +21822,9 @@
         <w:t xml:space="preserve">).</w:t>
       </w:r>
     </w:p>
-    <w:bookmarkEnd w:id="84"/>
-    <w:bookmarkEnd w:id="85"/>
-    <w:bookmarkStart w:id="86" w:name="conclusion"/>
+    <w:bookmarkEnd w:id="88"/>
+    <w:bookmarkEnd w:id="89"/>
+    <w:bookmarkStart w:id="90" w:name="conclusion"/>
     <w:p>
       <w:pPr>
         <w:pStyle w:val="Heading1"/>
@@ -21386,8 +21888,8 @@
         <w:br w:type="page"/>
       </w:r>
     </w:p>
-    <w:bookmarkEnd w:id="86"/>
-    <w:bookmarkStart w:id="87" w:name="acknowledgments"/>
+    <w:bookmarkEnd w:id="90"/>
+    <w:bookmarkStart w:id="91" w:name="acknowledgments"/>
     <w:p>
       <w:pPr>
         <w:pStyle w:val="Heading1"/>
@@ -21396,8 +21898,8 @@
         <w:t xml:space="preserve">Acknowledgments</w:t>
       </w:r>
     </w:p>
-    <w:bookmarkEnd w:id="87"/>
-    <w:bookmarkStart w:id="151" w:name="references"/>
+    <w:bookmarkEnd w:id="91"/>
+    <w:bookmarkStart w:id="155" w:name="references"/>
     <w:p>
       <w:pPr>
         <w:pStyle w:val="Heading1"/>
@@ -21415,8 +21917,8 @@
         <w:t xml:space="preserve">References</w:t>
       </w:r>
     </w:p>
-    <w:bookmarkStart w:id="150" w:name="refs"/>
-    <w:bookmarkStart w:id="88" w:name="ref-AgrawalEtAlPREDICTING2005"/>
+    <w:bookmarkStart w:id="154" w:name="refs"/>
+    <w:bookmarkStart w:id="92" w:name="ref-AgrawalEtAlPREDICTING2005"/>
     <w:p>
       <w:pPr>
         <w:pStyle w:val="Bibliography"/>
@@ -21452,8 +21954,8 @@
         <w:t xml:space="preserve">National Marine Fisheries Service.</w:t>
       </w:r>
     </w:p>
-    <w:bookmarkEnd w:id="88"/>
-    <w:bookmarkStart w:id="90" w:name="ref-BorkHirokawaTrends2021"/>
+    <w:bookmarkEnd w:id="92"/>
+    <w:bookmarkStart w:id="94" w:name="ref-BorkHirokawaTrends2021"/>
     <w:p>
       <w:pPr>
         <w:pStyle w:val="Bibliography"/>
@@ -21495,7 +21997,7 @@
       <w:r>
         <w:t xml:space="preserve"> </w:t>
       </w:r>
-      <w:hyperlink r:id="rId89">
+      <w:hyperlink r:id="rId93">
         <w:r>
           <w:rPr>
             <w:rStyle w:val="Hyperlink"/>
@@ -21507,8 +22009,8 @@
         <w:t xml:space="preserve">.</w:t>
       </w:r>
     </w:p>
-    <w:bookmarkEnd w:id="90"/>
-    <w:bookmarkStart w:id="92" w:name="ref-BrownEtAlHistorical1994"/>
+    <w:bookmarkEnd w:id="94"/>
+    <w:bookmarkStart w:id="96" w:name="ref-BrownEtAlHistorical1994"/>
     <w:p>
       <w:pPr>
         <w:pStyle w:val="Bibliography"/>
@@ -21586,7 +22088,7 @@
       <w:r>
         <w:t xml:space="preserve"> </w:t>
       </w:r>
-      <w:hyperlink r:id="rId91">
+      <w:hyperlink r:id="rId95">
         <w:r>
           <w:rPr>
             <w:rStyle w:val="Hyperlink"/>
@@ -21598,8 +22100,8 @@
         <w:t xml:space="preserve">.</w:t>
       </w:r>
     </w:p>
-    <w:bookmarkEnd w:id="92"/>
-    <w:bookmarkStart w:id="93" w:name="X534406a913d453049af97ddf853e5acf00f7d45"/>
+    <w:bookmarkEnd w:id="96"/>
+    <w:bookmarkStart w:id="97" w:name="X534406a913d453049af97ddf853e5acf00f7d45"/>
     <w:p>
       <w:pPr>
         <w:pStyle w:val="Bibliography"/>
@@ -21629,8 +22131,8 @@
         <w:t xml:space="preserve">.”</w:t>
       </w:r>
     </w:p>
-    <w:bookmarkEnd w:id="93"/>
-    <w:bookmarkStart w:id="94" w:name="Xc89eae4adec15389bd12509e9457a9dc8c09d75"/>
+    <w:bookmarkEnd w:id="97"/>
+    <w:bookmarkStart w:id="98" w:name="Xc89eae4adec15389bd12509e9457a9dc8c09d75"/>
     <w:p>
       <w:pPr>
         <w:pStyle w:val="Bibliography"/>
@@ -21675,8 +22177,8 @@
         <w:t xml:space="preserve">.”</w:t>
       </w:r>
     </w:p>
-    <w:bookmarkEnd w:id="94"/>
-    <w:bookmarkStart w:id="95" w:name="X7c5765d4bf46367820355fe718939efb3be661f"/>
+    <w:bookmarkEnd w:id="98"/>
+    <w:bookmarkStart w:id="99" w:name="X7c5765d4bf46367820355fe718939efb3be661f"/>
     <w:p>
       <w:pPr>
         <w:pStyle w:val="Bibliography"/>
@@ -21737,8 +22239,8 @@
         <w:t xml:space="preserve">. https://data.cnra.ca.gov/dataset/statewide-crop-mapping/resource/3b57898b-f013-487a-b472-17f54311edb5.</w:t>
       </w:r>
     </w:p>
-    <w:bookmarkEnd w:id="95"/>
-    <w:bookmarkStart w:id="96" w:name="Xe7b7ad2022eadb255e299639b3100f5357e120c"/>
+    <w:bookmarkEnd w:id="99"/>
+    <w:bookmarkStart w:id="100" w:name="Xe7b7ad2022eadb255e299639b3100f5357e120c"/>
     <w:p>
       <w:pPr>
         <w:pStyle w:val="Bibliography"/>
@@ -21798,8 +22300,8 @@
         <w:t xml:space="preserve">Superior Court of Siskiyou County.</w:t>
       </w:r>
     </w:p>
-    <w:bookmarkEnd w:id="96"/>
-    <w:bookmarkStart w:id="97" w:name="X6ef878f889213098c200c5acad35595649e9db2"/>
+    <w:bookmarkEnd w:id="100"/>
+    <w:bookmarkStart w:id="101" w:name="X6ef878f889213098c200c5acad35595649e9db2"/>
     <w:p>
       <w:pPr>
         <w:pStyle w:val="Bibliography"/>
@@ -21841,8 +22343,8 @@
         <w:t xml:space="preserve">.”</w:t>
       </w:r>
     </w:p>
-    <w:bookmarkEnd w:id="97"/>
-    <w:bookmarkStart w:id="98" w:name="ref-CarpenterAccurately2024"/>
+    <w:bookmarkEnd w:id="101"/>
+    <w:bookmarkStart w:id="102" w:name="ref-CarpenterAccurately2024"/>
     <w:p>
       <w:pPr>
         <w:pStyle w:val="Bibliography"/>
@@ -21896,8 +22398,8 @@
         <w:t xml:space="preserve">Master’s thesis, University of California, Davis.</w:t>
       </w:r>
     </w:p>
-    <w:bookmarkEnd w:id="98"/>
-    <w:bookmarkStart w:id="100" w:name="ref-CarterSheafferAlfalfa1983"/>
+    <w:bookmarkEnd w:id="102"/>
+    <w:bookmarkStart w:id="104" w:name="ref-CarterSheafferAlfalfa1983"/>
     <w:p>
       <w:pPr>
         <w:pStyle w:val="Bibliography"/>
@@ -22017,7 +22519,7 @@
       <w:r>
         <w:t xml:space="preserve"> </w:t>
       </w:r>
-      <w:hyperlink r:id="rId99">
+      <w:hyperlink r:id="rId103">
         <w:r>
           <w:rPr>
             <w:rStyle w:val="Hyperlink"/>
@@ -22029,8 +22531,8 @@
         <w:t xml:space="preserve">.</w:t>
       </w:r>
     </w:p>
-    <w:bookmarkEnd w:id="100"/>
-    <w:bookmarkStart w:id="102" w:name="ref-CohonMarksMultiobjective1973"/>
+    <w:bookmarkEnd w:id="104"/>
+    <w:bookmarkStart w:id="106" w:name="ref-CohonMarksMultiobjective1973"/>
     <w:p>
       <w:pPr>
         <w:pStyle w:val="Bibliography"/>
@@ -22063,7 +22565,7 @@
       <w:r>
         <w:t xml:space="preserve"> </w:t>
       </w:r>
-      <w:hyperlink r:id="rId101">
+      <w:hyperlink r:id="rId105">
         <w:r>
           <w:rPr>
             <w:rStyle w:val="Hyperlink"/>
@@ -22075,8 +22577,8 @@
         <w:t xml:space="preserve">.</w:t>
       </w:r>
     </w:p>
-    <w:bookmarkEnd w:id="102"/>
-    <w:bookmarkStart w:id="103" w:name="ref-FogliaEtAlScott2013"/>
+    <w:bookmarkEnd w:id="106"/>
+    <w:bookmarkStart w:id="107" w:name="ref-FogliaEtAlScott2013"/>
     <w:p>
       <w:pPr>
         <w:pStyle w:val="Bibliography"/>
@@ -22133,8 +22635,8 @@
         <w:t xml:space="preserve">Davis, CA: North Coast Regional Water Quality Control Board.</w:t>
       </w:r>
     </w:p>
-    <w:bookmarkEnd w:id="103"/>
-    <w:bookmarkStart w:id="104" w:name="Xff198d1a9510a26c6b6a97c9924d7fdc8be1418"/>
+    <w:bookmarkEnd w:id="107"/>
+    <w:bookmarkStart w:id="108" w:name="Xff198d1a9510a26c6b6a97c9924d7fdc8be1418"/>
     <w:p>
       <w:pPr>
         <w:pStyle w:val="Bibliography"/>
@@ -22176,8 +22678,8 @@
         <w:t xml:space="preserve">Ventura, CA: Fox Canyon Groundwater Manegement Agency.</w:t>
       </w:r>
     </w:p>
-    <w:bookmarkEnd w:id="104"/>
-    <w:bookmarkStart w:id="106" w:name="ref-FreemanWICKED2000"/>
+    <w:bookmarkEnd w:id="108"/>
+    <w:bookmarkStart w:id="110" w:name="ref-FreemanWICKED2000"/>
     <w:p>
       <w:pPr>
         <w:pStyle w:val="Bibliography"/>
@@ -22225,7 +22727,7 @@
       <w:r>
         <w:t xml:space="preserve"> </w:t>
       </w:r>
-      <w:hyperlink r:id="rId105">
+      <w:hyperlink r:id="rId109">
         <w:r>
           <w:rPr>
             <w:rStyle w:val="Hyperlink"/>
@@ -22237,8 +22739,8 @@
         <w:t xml:space="preserve">.</w:t>
       </w:r>
     </w:p>
-    <w:bookmarkEnd w:id="106"/>
-    <w:bookmarkStart w:id="107" w:name="ref-HarterHinesSCOTT2008"/>
+    <w:bookmarkEnd w:id="110"/>
+    <w:bookmarkStart w:id="111" w:name="ref-HarterHinesSCOTT2008"/>
     <w:p>
       <w:pPr>
         <w:pStyle w:val="Bibliography"/>
@@ -22265,8 +22767,8 @@
         <w:t xml:space="preserve">University of California, Davis.</w:t>
       </w:r>
     </w:p>
-    <w:bookmarkEnd w:id="107"/>
-    <w:bookmarkStart w:id="109" w:name="ref-KapelanEtAlMultiobjective2005"/>
+    <w:bookmarkEnd w:id="111"/>
+    <w:bookmarkStart w:id="113" w:name="ref-KapelanEtAlMultiobjective2005"/>
     <w:p>
       <w:pPr>
         <w:pStyle w:val="Bibliography"/>
@@ -22299,7 +22801,7 @@
       <w:r>
         <w:t xml:space="preserve"> </w:t>
       </w:r>
-      <w:hyperlink r:id="rId108">
+      <w:hyperlink r:id="rId112">
         <w:r>
           <w:rPr>
             <w:rStyle w:val="Hyperlink"/>
@@ -22311,8 +22813,8 @@
         <w:t xml:space="preserve">.</w:t>
       </w:r>
     </w:p>
-    <w:bookmarkEnd w:id="109"/>
-    <w:bookmarkStart w:id="110" w:name="ref-KnechtleGiudice20192020"/>
+    <w:bookmarkEnd w:id="113"/>
+    <w:bookmarkStart w:id="114" w:name="ref-KnechtleGiudice20192020"/>
     <w:p>
       <w:pPr>
         <w:pStyle w:val="Bibliography"/>
@@ -22345,8 +22847,8 @@
         <w:t xml:space="preserve">.</w:t>
       </w:r>
     </w:p>
-    <w:bookmarkEnd w:id="110"/>
-    <w:bookmarkStart w:id="112" w:name="ref-KoubaEtAlWatershedSpecific2025"/>
+    <w:bookmarkEnd w:id="114"/>
+    <w:bookmarkStart w:id="116" w:name="ref-KoubaEtAlWatershedSpecific2025"/>
     <w:p>
       <w:pPr>
         <w:pStyle w:val="Bibliography"/>
@@ -22400,7 +22902,7 @@
       <w:r>
         <w:t xml:space="preserve"> </w:t>
       </w:r>
-      <w:hyperlink r:id="rId111">
+      <w:hyperlink r:id="rId115">
         <w:r>
           <w:rPr>
             <w:rStyle w:val="Hyperlink"/>
@@ -22412,8 +22914,8 @@
         <w:t xml:space="preserve">.</w:t>
       </w:r>
     </w:p>
-    <w:bookmarkEnd w:id="112"/>
-    <w:bookmarkStart w:id="114" w:name="ref-MackGeology1958"/>
+    <w:bookmarkEnd w:id="116"/>
+    <w:bookmarkStart w:id="118" w:name="ref-MackGeology1958"/>
     <w:p>
       <w:pPr>
         <w:pStyle w:val="Bibliography"/>
@@ -22463,7 +22965,7 @@
       <w:r>
         <w:t xml:space="preserve"> </w:t>
       </w:r>
-      <w:hyperlink r:id="rId113">
+      <w:hyperlink r:id="rId117">
         <w:r>
           <w:rPr>
             <w:rStyle w:val="Hyperlink"/>
@@ -22475,8 +22977,8 @@
         <w:t xml:space="preserve">.</w:t>
       </w:r>
     </w:p>
-    <w:bookmarkEnd w:id="114"/>
-    <w:bookmarkStart w:id="115" w:name="ref-MagranetScott2015a"/>
+    <w:bookmarkEnd w:id="118"/>
+    <w:bookmarkStart w:id="119" w:name="ref-MagranetScott2015a"/>
     <w:p>
       <w:pPr>
         <w:pStyle w:val="Bibliography"/>
@@ -22506,8 +23008,8 @@
         <w:t xml:space="preserve">Etna, CA: Siskiyou Resource Conservation District.</w:t>
       </w:r>
     </w:p>
-    <w:bookmarkEnd w:id="115"/>
-    <w:bookmarkStart w:id="116" w:name="ref-MagranetScott2017"/>
+    <w:bookmarkEnd w:id="119"/>
+    <w:bookmarkStart w:id="120" w:name="ref-MagranetScott2017"/>
     <w:p>
       <w:pPr>
         <w:pStyle w:val="Bibliography"/>
@@ -22537,8 +23039,8 @@
         <w:t xml:space="preserve">Etna, CA: Siskiyou Resource Conservation District.</w:t>
       </w:r>
     </w:p>
-    <w:bookmarkEnd w:id="116"/>
-    <w:bookmarkStart w:id="117" w:name="ref-MagranetScott2018"/>
+    <w:bookmarkEnd w:id="120"/>
+    <w:bookmarkStart w:id="121" w:name="ref-MagranetScott2018"/>
     <w:p>
       <w:pPr>
         <w:pStyle w:val="Bibliography"/>
@@ -22580,8 +23082,8 @@
         <w:t xml:space="preserve">Etna, CA: Siskiyou Resource Conservation District.</w:t>
       </w:r>
     </w:p>
-    <w:bookmarkEnd w:id="117"/>
-    <w:bookmarkStart w:id="118" w:name="ref-MagranetYokelScott2017"/>
+    <w:bookmarkEnd w:id="121"/>
+    <w:bookmarkStart w:id="122" w:name="ref-MagranetYokelScott2017"/>
     <w:p>
       <w:pPr>
         <w:pStyle w:val="Bibliography"/>
@@ -22623,8 +23125,8 @@
         <w:t xml:space="preserve">Etna, CA: Siskiyou Resource Conservation District.</w:t>
       </w:r>
     </w:p>
-    <w:bookmarkEnd w:id="118"/>
-    <w:bookmarkStart w:id="120" w:name="ref-MahoneyRoodStreamflow1998"/>
+    <w:bookmarkEnd w:id="122"/>
+    <w:bookmarkStart w:id="124" w:name="ref-MahoneyRoodStreamflow1998"/>
     <w:p>
       <w:pPr>
         <w:pStyle w:val="Bibliography"/>
@@ -22666,7 +23168,7 @@
       <w:r>
         <w:t xml:space="preserve"> </w:t>
       </w:r>
-      <w:hyperlink r:id="rId119">
+      <w:hyperlink r:id="rId123">
         <w:r>
           <w:rPr>
             <w:rStyle w:val="Hyperlink"/>
@@ -22678,8 +23180,8 @@
         <w:t xml:space="preserve">.</w:t>
       </w:r>
     </w:p>
-    <w:bookmarkEnd w:id="120"/>
-    <w:bookmarkStart w:id="121" w:name="ref-McMahonHabitat1983"/>
+    <w:bookmarkEnd w:id="124"/>
+    <w:bookmarkStart w:id="125" w:name="ref-McMahonHabitat1983"/>
     <w:p>
       <w:pPr>
         <w:pStyle w:val="Bibliography"/>
@@ -22727,8 +23229,8 @@
         <w:t xml:space="preserve">.</w:t>
       </w:r>
     </w:p>
-    <w:bookmarkEnd w:id="121"/>
-    <w:bookmarkStart w:id="123" w:name="ref-MonarchiEtAlInteractive1973"/>
+    <w:bookmarkEnd w:id="125"/>
+    <w:bookmarkStart w:id="127" w:name="ref-MonarchiEtAlInteractive1973"/>
     <w:p>
       <w:pPr>
         <w:pStyle w:val="Bibliography"/>
@@ -22773,7 +23275,7 @@
       <w:r>
         <w:t xml:space="preserve"> </w:t>
       </w:r>
-      <w:hyperlink r:id="rId122">
+      <w:hyperlink r:id="rId126">
         <w:r>
           <w:rPr>
             <w:rStyle w:val="Hyperlink"/>
@@ -22785,8 +23287,8 @@
         <w:t xml:space="preserve">.</w:t>
       </w:r>
     </w:p>
-    <w:bookmarkEnd w:id="123"/>
-    <w:bookmarkStart w:id="124" w:name="ref-MoyleCoho2002"/>
+    <w:bookmarkEnd w:id="127"/>
+    <w:bookmarkStart w:id="128" w:name="ref-MoyleCoho2002"/>
     <w:p>
       <w:pPr>
         <w:pStyle w:val="Bibliography"/>
@@ -22889,8 +23391,8 @@
         <w:t xml:space="preserve">, 245–51. University of California Press.</w:t>
       </w:r>
     </w:p>
-    <w:bookmarkEnd w:id="124"/>
-    <w:bookmarkStart w:id="126" w:name="ref-NordgrenEtAlSupporting2016"/>
+    <w:bookmarkEnd w:id="128"/>
+    <w:bookmarkStart w:id="130" w:name="ref-NordgrenEtAlSupporting2016"/>
     <w:p>
       <w:pPr>
         <w:pStyle w:val="Bibliography"/>
@@ -22935,7 +23437,7 @@
       <w:r>
         <w:t xml:space="preserve"> </w:t>
       </w:r>
-      <w:hyperlink r:id="rId125">
+      <w:hyperlink r:id="rId129">
         <w:r>
           <w:rPr>
             <w:rStyle w:val="Hyperlink"/>
@@ -22947,8 +23449,8 @@
         <w:t xml:space="preserve">.</w:t>
       </w:r>
     </w:p>
-    <w:bookmarkEnd w:id="126"/>
-    <w:bookmarkStart w:id="128" w:name="ref-OhlbergerEtAlEffects2018"/>
+    <w:bookmarkEnd w:id="130"/>
+    <w:bookmarkStart w:id="132" w:name="ref-OhlbergerEtAlEffects2018"/>
     <w:p>
       <w:pPr>
         <w:pStyle w:val="Bibliography"/>
@@ -22981,7 +23483,7 @@
       <w:r>
         <w:t xml:space="preserve"> </w:t>
       </w:r>
-      <w:hyperlink r:id="rId127">
+      <w:hyperlink r:id="rId131">
         <w:r>
           <w:rPr>
             <w:rStyle w:val="Hyperlink"/>
@@ -22993,8 +23495,8 @@
         <w:t xml:space="preserve">.</w:t>
       </w:r>
     </w:p>
-    <w:bookmarkEnd w:id="128"/>
-    <w:bookmarkStart w:id="129" w:name="ref-ParetoCours1896"/>
+    <w:bookmarkEnd w:id="132"/>
+    <w:bookmarkStart w:id="133" w:name="ref-ParetoCours1896"/>
     <w:p>
       <w:pPr>
         <w:pStyle w:val="Bibliography"/>
@@ -23044,8 +23546,8 @@
         <w:t xml:space="preserve">. Lausanne.</w:t>
       </w:r>
     </w:p>
-    <w:bookmarkEnd w:id="129"/>
-    <w:bookmarkStart w:id="131" w:name="ref-PattersonEtAlHydrologic2020"/>
+    <w:bookmarkEnd w:id="133"/>
+    <w:bookmarkStart w:id="135" w:name="ref-PattersonEtAlHydrologic2020"/>
     <w:p>
       <w:pPr>
         <w:pStyle w:val="Bibliography"/>
@@ -23078,7 +23580,7 @@
       <w:r>
         <w:t xml:space="preserve"> </w:t>
       </w:r>
-      <w:hyperlink r:id="rId130">
+      <w:hyperlink r:id="rId134">
         <w:r>
           <w:rPr>
             <w:rStyle w:val="Hyperlink"/>
@@ -23090,8 +23592,8 @@
         <w:t xml:space="preserve">.</w:t>
       </w:r>
     </w:p>
-    <w:bookmarkEnd w:id="131"/>
-    <w:bookmarkStart w:id="132" w:name="X35601437fc25b0fdd92b478f2f9ddeaed3398df"/>
+    <w:bookmarkEnd w:id="135"/>
+    <w:bookmarkStart w:id="136" w:name="X35601437fc25b0fdd92b478f2f9ddeaed3398df"/>
     <w:p>
       <w:pPr>
         <w:pStyle w:val="Bibliography"/>
@@ -23137,227 +23639,28 @@
       </w:r>
       <w:r>
         <w:t xml:space="preserve">.”</w:t>
-      </w:r>
-    </w:p>
-    <w:bookmarkEnd w:id="132"/>
-    <w:bookmarkStart w:id="133" w:name="X334218043bd9d5b07a848a610917fcfef0168db"/>
-    <w:p>
-      <w:pPr>
-        <w:pStyle w:val="Bibliography"/>
-      </w:pPr>
-      <w:r>
-        <w:t xml:space="preserve">Scott Valley Area Plan Committee. 1980.</w:t>
-      </w:r>
-      <w:r>
-        <w:t xml:space="preserve"> </w:t>
-      </w:r>
-      <w:r>
-        <w:t xml:space="preserve">“Scott</w:t>
-      </w:r>
-      <w:r>
-        <w:t xml:space="preserve"> </w:t>
-      </w:r>
-      <w:r>
-        <w:t xml:space="preserve">Valley Area Plan</w:t>
-      </w:r>
-      <w:r>
-        <w:t xml:space="preserve">.”</w:t>
-      </w:r>
-      <w:r>
-        <w:t xml:space="preserve"> </w:t>
-      </w:r>
-      <w:r>
-        <w:t xml:space="preserve">Siskiyou County.</w:t>
-      </w:r>
-    </w:p>
-    <w:bookmarkEnd w:id="133"/>
-    <w:bookmarkStart w:id="134" w:name="ref-SiskiyouCountyScott2021"/>
-    <w:p>
-      <w:pPr>
-        <w:pStyle w:val="Bibliography"/>
-      </w:pPr>
-      <w:r>
-        <w:t xml:space="preserve">Siskiyou County. 2021.</w:t>
-      </w:r>
-      <w:r>
-        <w:t xml:space="preserve"> </w:t>
-      </w:r>
-      <w:r>
-        <w:t xml:space="preserve">“Scott</w:t>
-      </w:r>
-      <w:r>
-        <w:t xml:space="preserve"> </w:t>
-      </w:r>
-      <w:r>
-        <w:t xml:space="preserve">Valley Groundwater Sustainability Plan</w:t>
-      </w:r>
-      <w:r>
-        <w:t xml:space="preserve">.”</w:t>
-      </w:r>
-    </w:p>
-    <w:bookmarkEnd w:id="134"/>
-    <w:bookmarkStart w:id="135" w:name="X15105b7917297e4641cb2d2cfd1651756f7bcb0"/>
-    <w:p>
-      <w:pPr>
-        <w:pStyle w:val="Bibliography"/>
-      </w:pPr>
-      <w:r>
-        <w:t xml:space="preserve">Siskiyou County GSA - Scott Valley Groundwater Advisory Committee. 2021.</w:t>
-      </w:r>
-      <w:r>
-        <w:t xml:space="preserve"> </w:t>
-      </w:r>
-      <w:r>
-        <w:t xml:space="preserve">“Siskiyou</w:t>
-      </w:r>
-      <w:r>
-        <w:t xml:space="preserve"> </w:t>
-      </w:r>
-      <w:r>
-        <w:t xml:space="preserve">County Groundwater Sustainability Agency</w:t>
-      </w:r>
-      <w:r>
-        <w:t xml:space="preserve">:</w:t>
-      </w:r>
-      <w:r>
-        <w:t xml:space="preserve"> </w:t>
-      </w:r>
-      <w:r>
-        <w:t xml:space="preserve">Scott Valley Advisory Committee Meeting</w:t>
-      </w:r>
-      <w:r>
-        <w:t xml:space="preserve">.”</w:t>
-      </w:r>
-      <w:r>
-        <w:t xml:space="preserve"> </w:t>
-      </w:r>
-      <w:r>
-        <w:t xml:space="preserve">Fort Jones, CA: Siskiyou County.</w:t>
-      </w:r>
-    </w:p>
-    <w:bookmarkEnd w:id="135"/>
-    <w:bookmarkStart w:id="136" w:name="X2560a5ce8c29a4d10823717cd7284f11df015d4"/>
-    <w:p>
-      <w:pPr>
-        <w:pStyle w:val="Bibliography"/>
-      </w:pPr>
-      <w:r>
-        <w:t xml:space="preserve">State Water Resources Control Board. 2021.</w:t>
-      </w:r>
-      <w:r>
-        <w:t xml:space="preserve"> </w:t>
-      </w:r>
-      <w:r>
-        <w:t xml:space="preserve">“Establishment of</w:t>
-      </w:r>
-      <w:r>
-        <w:t xml:space="preserve"> </w:t>
-      </w:r>
-      <w:r>
-        <w:t xml:space="preserve">Minimum Instream Flow Requirements</w:t>
-      </w:r>
-      <w:r>
-        <w:t xml:space="preserve">,</w:t>
-      </w:r>
-      <w:r>
-        <w:t xml:space="preserve"> </w:t>
-      </w:r>
-      <w:r>
-        <w:t xml:space="preserve">Curtialment Authority</w:t>
-      </w:r>
-      <w:r>
-        <w:t xml:space="preserve">, and</w:t>
-      </w:r>
-      <w:r>
-        <w:t xml:space="preserve"> </w:t>
-      </w:r>
-      <w:r>
-        <w:t xml:space="preserve">Information Order</w:t>
-      </w:r>
-      <w:r>
-        <w:t xml:space="preserve"> </w:t>
-      </w:r>
-      <w:r>
-        <w:t xml:space="preserve">in the</w:t>
-      </w:r>
-      <w:r>
-        <w:t xml:space="preserve"> </w:t>
-      </w:r>
-      <w:r>
-        <w:t xml:space="preserve">Klamath Watershed</w:t>
-      </w:r>
-      <w:r>
-        <w:t xml:space="preserve">.”</w:t>
-      </w:r>
-      <w:r>
-        <w:t xml:space="preserve"> </w:t>
-      </w:r>
-      <w:r>
-        <w:t xml:space="preserve">{{NOTICE OF APPROVAL OF EMERGENCY REGULATORY ACTION}} OAL 2021-0820-05.</w:t>
       </w:r>
     </w:p>
     <w:bookmarkEnd w:id="136"/>
-    <w:bookmarkStart w:id="137" w:name="Xc65d78564b05799285cd4578f858a1851ca0d64"/>
+    <w:bookmarkStart w:id="137" w:name="X334218043bd9d5b07a848a610917fcfef0168db"/>
     <w:p>
       <w:pPr>
         <w:pStyle w:val="Bibliography"/>
       </w:pPr>
       <w:r>
-        <w:t xml:space="preserve">———. 2024a.</w:t>
-      </w:r>
-      <w:r>
-        <w:t xml:space="preserve"> </w:t>
-      </w:r>
-      <w:r>
-        <w:t xml:space="preserve">“Establishment of</w:t>
-      </w:r>
-      <w:r>
-        <w:t xml:space="preserve"> </w:t>
-      </w:r>
-      <w:r>
-        <w:t xml:space="preserve">Minimum Instream Flow Requirements</w:t>
-      </w:r>
-      <w:r>
-        <w:t xml:space="preserve">,</w:t>
-      </w:r>
-      <w:r>
-        <w:t xml:space="preserve"> </w:t>
-      </w:r>
-      <w:r>
-        <w:t xml:space="preserve">Curtialment Authority</w:t>
-      </w:r>
-      <w:r>
-        <w:t xml:space="preserve">, and</w:t>
-      </w:r>
-      <w:r>
-        <w:t xml:space="preserve"> </w:t>
-      </w:r>
-      <w:r>
-        <w:t xml:space="preserve">Information Order</w:t>
-      </w:r>
-      <w:r>
-        <w:t xml:space="preserve"> </w:t>
-      </w:r>
-      <w:r>
-        <w:t xml:space="preserve">in the</w:t>
-      </w:r>
-      <w:r>
-        <w:t xml:space="preserve"> </w:t>
-      </w:r>
-      <w:r>
-        <w:t xml:space="preserve">Scott River</w:t>
-      </w:r>
-      <w:r>
-        <w:t xml:space="preserve"> </w:t>
-      </w:r>
-      <w:r>
-        <w:t xml:space="preserve">and</w:t>
-      </w:r>
-      <w:r>
-        <w:t xml:space="preserve"> </w:t>
-      </w:r>
-      <w:r>
-        <w:t xml:space="preserve">Shasta River Watersheds</w:t>
+        <w:t xml:space="preserve">Scott Valley Area Plan Committee. 1980.</w:t>
+      </w:r>
+      <w:r>
+        <w:t xml:space="preserve"> </w:t>
+      </w:r>
+      <w:r>
+        <w:t xml:space="preserve">“Scott</w:t>
+      </w:r>
+      <w:r>
+        <w:t xml:space="preserve"> </w:t>
+      </w:r>
+      <w:r>
+        <w:t xml:space="preserve">Valley Area Plan</w:t>
       </w:r>
       <w:r>
         <w:t xml:space="preserve">.”</w:t>
@@ -23366,48 +23669,247 @@
         <w:t xml:space="preserve"> </w:t>
       </w:r>
       <w:r>
-        <w:t xml:space="preserve">{{NOTICE OF APPROVAL OF EMERGENCY REGULATORY ACTION}} OAL 2024-0123-03.</w:t>
+        <w:t xml:space="preserve">Siskiyou County.</w:t>
       </w:r>
     </w:p>
     <w:bookmarkEnd w:id="137"/>
-    <w:bookmarkStart w:id="138" w:name="Xa7b10fbb32571a990cee2341e679d296b855974"/>
+    <w:bookmarkStart w:id="138" w:name="ref-SiskiyouCountyScott2021"/>
     <w:p>
       <w:pPr>
         <w:pStyle w:val="Bibliography"/>
       </w:pPr>
       <w:r>
-        <w:t xml:space="preserve">———. 2024b.</w:t>
-      </w:r>
-      <w:r>
-        <w:t xml:space="preserve"> </w:t>
-      </w:r>
-      <w:r>
-        <w:t xml:space="preserve">“</w:t>
-      </w:r>
-      <w:r>
-        <w:t xml:space="preserve">RESOLUTION NO</w:t>
-      </w:r>
-      <w:r>
-        <w:t xml:space="preserve">. 2024-0036:</w:t>
-      </w:r>
-      <w:r>
-        <w:t xml:space="preserve"> </w:t>
-      </w:r>
-      <w:r>
-        <w:t xml:space="preserve">REGARDING FLOW EFFORTS IN THE SCOTT RIVER AND SHASTA RIVER WATERSHEDS</w:t>
+        <w:t xml:space="preserve">Siskiyou County. 2021.</w:t>
+      </w:r>
+      <w:r>
+        <w:t xml:space="preserve"> </w:t>
+      </w:r>
+      <w:r>
+        <w:t xml:space="preserve">“Scott</w:t>
+      </w:r>
+      <w:r>
+        <w:t xml:space="preserve"> </w:t>
+      </w:r>
+      <w:r>
+        <w:t xml:space="preserve">Valley Groundwater Sustainability Plan</w:t>
       </w:r>
       <w:r>
         <w:t xml:space="preserve">.”</w:t>
-      </w:r>
-      <w:r>
-        <w:t xml:space="preserve"> </w:t>
-      </w:r>
-      <w:r>
-        <w:t xml:space="preserve">2024-0036.</w:t>
       </w:r>
     </w:p>
     <w:bookmarkEnd w:id="138"/>
-    <w:bookmarkStart w:id="140" w:name="ref-SundingMeasuring1996"/>
+    <w:bookmarkStart w:id="139" w:name="X15105b7917297e4641cb2d2cfd1651756f7bcb0"/>
+    <w:p>
+      <w:pPr>
+        <w:pStyle w:val="Bibliography"/>
+      </w:pPr>
+      <w:r>
+        <w:t xml:space="preserve">Siskiyou County GSA - Scott Valley Groundwater Advisory Committee. 2021.</w:t>
+      </w:r>
+      <w:r>
+        <w:t xml:space="preserve"> </w:t>
+      </w:r>
+      <w:r>
+        <w:t xml:space="preserve">“Siskiyou</w:t>
+      </w:r>
+      <w:r>
+        <w:t xml:space="preserve"> </w:t>
+      </w:r>
+      <w:r>
+        <w:t xml:space="preserve">County Groundwater Sustainability Agency</w:t>
+      </w:r>
+      <w:r>
+        <w:t xml:space="preserve">:</w:t>
+      </w:r>
+      <w:r>
+        <w:t xml:space="preserve"> </w:t>
+      </w:r>
+      <w:r>
+        <w:t xml:space="preserve">Scott Valley Advisory Committee Meeting</w:t>
+      </w:r>
+      <w:r>
+        <w:t xml:space="preserve">.”</w:t>
+      </w:r>
+      <w:r>
+        <w:t xml:space="preserve"> </w:t>
+      </w:r>
+      <w:r>
+        <w:t xml:space="preserve">Fort Jones, CA: Siskiyou County.</w:t>
+      </w:r>
+    </w:p>
+    <w:bookmarkEnd w:id="139"/>
+    <w:bookmarkStart w:id="140" w:name="X2560a5ce8c29a4d10823717cd7284f11df015d4"/>
+    <w:p>
+      <w:pPr>
+        <w:pStyle w:val="Bibliography"/>
+      </w:pPr>
+      <w:r>
+        <w:t xml:space="preserve">State Water Resources Control Board. 2021.</w:t>
+      </w:r>
+      <w:r>
+        <w:t xml:space="preserve"> </w:t>
+      </w:r>
+      <w:r>
+        <w:t xml:space="preserve">“Establishment of</w:t>
+      </w:r>
+      <w:r>
+        <w:t xml:space="preserve"> </w:t>
+      </w:r>
+      <w:r>
+        <w:t xml:space="preserve">Minimum Instream Flow Requirements</w:t>
+      </w:r>
+      <w:r>
+        <w:t xml:space="preserve">,</w:t>
+      </w:r>
+      <w:r>
+        <w:t xml:space="preserve"> </w:t>
+      </w:r>
+      <w:r>
+        <w:t xml:space="preserve">Curtialment Authority</w:t>
+      </w:r>
+      <w:r>
+        <w:t xml:space="preserve">, and</w:t>
+      </w:r>
+      <w:r>
+        <w:t xml:space="preserve"> </w:t>
+      </w:r>
+      <w:r>
+        <w:t xml:space="preserve">Information Order</w:t>
+      </w:r>
+      <w:r>
+        <w:t xml:space="preserve"> </w:t>
+      </w:r>
+      <w:r>
+        <w:t xml:space="preserve">in the</w:t>
+      </w:r>
+      <w:r>
+        <w:t xml:space="preserve"> </w:t>
+      </w:r>
+      <w:r>
+        <w:t xml:space="preserve">Klamath Watershed</w:t>
+      </w:r>
+      <w:r>
+        <w:t xml:space="preserve">.”</w:t>
+      </w:r>
+      <w:r>
+        <w:t xml:space="preserve"> </w:t>
+      </w:r>
+      <w:r>
+        <w:t xml:space="preserve">{{NOTICE OF APPROVAL OF EMERGENCY REGULATORY ACTION}} OAL 2021-0820-05.</w:t>
+      </w:r>
+    </w:p>
+    <w:bookmarkEnd w:id="140"/>
+    <w:bookmarkStart w:id="141" w:name="Xc65d78564b05799285cd4578f858a1851ca0d64"/>
+    <w:p>
+      <w:pPr>
+        <w:pStyle w:val="Bibliography"/>
+      </w:pPr>
+      <w:r>
+        <w:t xml:space="preserve">———. 2024a.</w:t>
+      </w:r>
+      <w:r>
+        <w:t xml:space="preserve"> </w:t>
+      </w:r>
+      <w:r>
+        <w:t xml:space="preserve">“Establishment of</w:t>
+      </w:r>
+      <w:r>
+        <w:t xml:space="preserve"> </w:t>
+      </w:r>
+      <w:r>
+        <w:t xml:space="preserve">Minimum Instream Flow Requirements</w:t>
+      </w:r>
+      <w:r>
+        <w:t xml:space="preserve">,</w:t>
+      </w:r>
+      <w:r>
+        <w:t xml:space="preserve"> </w:t>
+      </w:r>
+      <w:r>
+        <w:t xml:space="preserve">Curtialment Authority</w:t>
+      </w:r>
+      <w:r>
+        <w:t xml:space="preserve">, and</w:t>
+      </w:r>
+      <w:r>
+        <w:t xml:space="preserve"> </w:t>
+      </w:r>
+      <w:r>
+        <w:t xml:space="preserve">Information Order</w:t>
+      </w:r>
+      <w:r>
+        <w:t xml:space="preserve"> </w:t>
+      </w:r>
+      <w:r>
+        <w:t xml:space="preserve">in the</w:t>
+      </w:r>
+      <w:r>
+        <w:t xml:space="preserve"> </w:t>
+      </w:r>
+      <w:r>
+        <w:t xml:space="preserve">Scott River</w:t>
+      </w:r>
+      <w:r>
+        <w:t xml:space="preserve"> </w:t>
+      </w:r>
+      <w:r>
+        <w:t xml:space="preserve">and</w:t>
+      </w:r>
+      <w:r>
+        <w:t xml:space="preserve"> </w:t>
+      </w:r>
+      <w:r>
+        <w:t xml:space="preserve">Shasta River Watersheds</w:t>
+      </w:r>
+      <w:r>
+        <w:t xml:space="preserve">.”</w:t>
+      </w:r>
+      <w:r>
+        <w:t xml:space="preserve"> </w:t>
+      </w:r>
+      <w:r>
+        <w:t xml:space="preserve">{{NOTICE OF APPROVAL OF EMERGENCY REGULATORY ACTION}} OAL 2024-0123-03.</w:t>
+      </w:r>
+    </w:p>
+    <w:bookmarkEnd w:id="141"/>
+    <w:bookmarkStart w:id="142" w:name="Xa7b10fbb32571a990cee2341e679d296b855974"/>
+    <w:p>
+      <w:pPr>
+        <w:pStyle w:val="Bibliography"/>
+      </w:pPr>
+      <w:r>
+        <w:t xml:space="preserve">———. 2024b.</w:t>
+      </w:r>
+      <w:r>
+        <w:t xml:space="preserve"> </w:t>
+      </w:r>
+      <w:r>
+        <w:t xml:space="preserve">“</w:t>
+      </w:r>
+      <w:r>
+        <w:t xml:space="preserve">RESOLUTION NO</w:t>
+      </w:r>
+      <w:r>
+        <w:t xml:space="preserve">. 2024-0036:</w:t>
+      </w:r>
+      <w:r>
+        <w:t xml:space="preserve"> </w:t>
+      </w:r>
+      <w:r>
+        <w:t xml:space="preserve">REGARDING FLOW EFFORTS IN THE SCOTT RIVER AND SHASTA RIVER WATERSHEDS</w:t>
+      </w:r>
+      <w:r>
+        <w:t xml:space="preserve">.”</w:t>
+      </w:r>
+      <w:r>
+        <w:t xml:space="preserve"> </w:t>
+      </w:r>
+      <w:r>
+        <w:t xml:space="preserve">2024-0036.</w:t>
+      </w:r>
+    </w:p>
+    <w:bookmarkEnd w:id="142"/>
+    <w:bookmarkStart w:id="144" w:name="ref-SundingMeasuring1996"/>
     <w:p>
       <w:pPr>
         <w:pStyle w:val="Bibliography"/>
@@ -23461,7 +23963,7 @@
       <w:r>
         <w:t xml:space="preserve"> </w:t>
       </w:r>
-      <w:hyperlink r:id="rId139">
+      <w:hyperlink r:id="rId143">
         <w:r>
           <w:rPr>
             <w:rStyle w:val="Hyperlink"/>
@@ -23473,8 +23975,8 @@
         <w:t xml:space="preserve">.</w:t>
       </w:r>
     </w:p>
-    <w:bookmarkEnd w:id="140"/>
-    <w:bookmarkStart w:id="142" w:name="ref-TolleyEtAlSensitivity2019"/>
+    <w:bookmarkEnd w:id="144"/>
+    <w:bookmarkStart w:id="146" w:name="ref-TolleyEtAlSensitivity2019"/>
     <w:p>
       <w:pPr>
         <w:pStyle w:val="Bibliography"/>
@@ -23564,7 +24066,7 @@
       <w:r>
         <w:t xml:space="preserve"> </w:t>
       </w:r>
-      <w:hyperlink r:id="rId141">
+      <w:hyperlink r:id="rId145">
         <w:r>
           <w:rPr>
             <w:rStyle w:val="Hyperlink"/>
@@ -23576,8 +24078,8 @@
         <w:t xml:space="preserve">.</w:t>
       </w:r>
     </w:p>
-    <w:bookmarkEnd w:id="142"/>
-    <w:bookmarkStart w:id="144" w:name="ref-VanSteenbergenPromoting2006"/>
+    <w:bookmarkEnd w:id="146"/>
+    <w:bookmarkStart w:id="148" w:name="ref-VanSteenbergenPromoting2006"/>
     <w:p>
       <w:pPr>
         <w:pStyle w:val="Bibliography"/>
@@ -23610,7 +24112,7 @@
       <w:r>
         <w:t xml:space="preserve"> </w:t>
       </w:r>
-      <w:hyperlink r:id="rId143">
+      <w:hyperlink r:id="rId147">
         <w:r>
           <w:rPr>
             <w:rStyle w:val="Hyperlink"/>
@@ -23622,8 +24124,8 @@
         <w:t xml:space="preserve">.</w:t>
       </w:r>
     </w:p>
-    <w:bookmarkEnd w:id="144"/>
-    <w:bookmarkStart w:id="146" w:name="ref-YarnellEtAlFunctional2015"/>
+    <w:bookmarkEnd w:id="148"/>
+    <w:bookmarkStart w:id="150" w:name="ref-YarnellEtAlFunctional2015"/>
     <w:p>
       <w:pPr>
         <w:pStyle w:val="Bibliography"/>
@@ -23707,7 +24209,7 @@
       <w:r>
         <w:t xml:space="preserve"> </w:t>
       </w:r>
-      <w:hyperlink r:id="rId145">
+      <w:hyperlink r:id="rId149">
         <w:r>
           <w:rPr>
             <w:rStyle w:val="Hyperlink"/>
@@ -23719,8 +24221,8 @@
         <w:t xml:space="preserve">.</w:t>
       </w:r>
     </w:p>
-    <w:bookmarkEnd w:id="146"/>
-    <w:bookmarkStart w:id="148" w:name="ref-YehBeckerMultiobjective1982"/>
+    <w:bookmarkEnd w:id="150"/>
+    <w:bookmarkStart w:id="152" w:name="ref-YehBeckerMultiobjective1982"/>
     <w:p>
       <w:pPr>
         <w:pStyle w:val="Bibliography"/>
@@ -23753,7 +24255,7 @@
       <w:r>
         <w:t xml:space="preserve"> </w:t>
       </w:r>
-      <w:hyperlink r:id="rId147">
+      <w:hyperlink r:id="rId151">
         <w:r>
           <w:rPr>
             <w:rStyle w:val="Hyperlink"/>
@@ -23765,8 +24267,8 @@
         <w:t xml:space="preserve">.</w:t>
       </w:r>
     </w:p>
-    <w:bookmarkEnd w:id="148"/>
-    <w:bookmarkStart w:id="149" w:name="X8bf5592004e543b04dfcfc3edb39663c8006d78"/>
+    <w:bookmarkEnd w:id="152"/>
+    <w:bookmarkStart w:id="153" w:name="X8bf5592004e543b04dfcfc3edb39663c8006d78"/>
     <w:p>
       <w:pPr>
         <w:pStyle w:val="Bibliography"/>
@@ -23796,15 +24298,15 @@
         <w:t xml:space="preserve">Woodland, CA.</w:t>
       </w:r>
     </w:p>
-    <w:bookmarkEnd w:id="149"/>
-    <w:bookmarkEnd w:id="150"/>
+    <w:bookmarkEnd w:id="153"/>
+    <w:bookmarkEnd w:id="154"/>
     <w:p>
       <w:r>
         <w:br w:type="page"/>
       </w:r>
     </w:p>
-    <w:bookmarkEnd w:id="151"/>
-    <w:bookmarkStart w:id="152" w:name="X6c1a78753bbdca554aba589b0aa85ab8ac746bf"/>
+    <w:bookmarkEnd w:id="155"/>
+    <w:bookmarkStart w:id="156" w:name="X6c1a78753bbdca554aba589b0aa85ab8ac746bf"/>
     <w:p>
       <w:pPr>
         <w:pStyle w:val="Heading1"/>
@@ -24011,7 +24513,7 @@
         <w:t xml:space="preserve">Consequently, only LASSO models dependent on hydrologic variables were evaluated as potential tools to forecast the outcomes of flow change on fish reproduction.</w:t>
       </w:r>
     </w:p>
-    <w:bookmarkEnd w:id="152"/>
+    <w:bookmarkEnd w:id="156"/>
     <w:sectPr>
       <w:footnotePr>
         <w:numRestart w:val="eachSect"/>

</xml_diff>

<commit_message>
troubleshooting results for alf scenarios
</commit_message>
<xml_diff>
--- a/Kouba_Fish_and_Ag_Benefit_MS.docx
+++ b/Kouba_Fish_and_Ag_Benefit_MS.docx
@@ -8012,7 +8012,7 @@
         <w:pStyle w:val="FirstParagraph"/>
       </w:pPr>
       <w:r>
-        <w:t xml:space="preserve">As described above, objective functions were used to quantitatively summarize the achievement of environmental and agricultural goals for the basecase and 24 management scenarios. For the agricultural objective (total crop ET volume) and for the environmental objective (a Hydrologic Benefit [HB] value in units of predicted smolt abundance for coho) were calculated for each water year in the 35-year simulation period, for each scenario (Table</w:t>
+        <w:t xml:space="preserve">The degree to which the basecase and 24 scenarios achieved local management goals was summarized using two objective functions. A summary value for the agricultural objective (total crop ET volume) and for the environmental objective (a Hydrologic Benefit [HB] value in units of predicted smolt abundance for coho) were calculated for each water year/brood year in the 35-year simulation period, for each scenario (Table</w:t>
       </w:r>
       <w:r>
         <w:t xml:space="preserve"> </w:t>
@@ -8021,7 +8021,7 @@
         <w:t xml:space="preserve">6</w:t>
       </w:r>
       <w:r>
-        <w:t xml:space="preserve">). (See Supplemental Material for these results calculated for an HB function with three different units: coho smolt per adult spawner, Chinook smolt abundance, or Chinook smolt per adult; Table</w:t>
+        <w:t xml:space="preserve">). (See Supplemental Material for HB function results in different units; Table</w:t>
       </w:r>
       <w:r>
         <w:t xml:space="preserve"> </w:t>
@@ -8523,7 +8523,7 @@
         <w:t xml:space="preserve">6</w:t>
       </w:r>
       <w:r>
-        <w:t xml:space="preserve">). Annual ET volume is relatively stable over the model period of water years 1991-2025, while annual HB values are much more variable (Figure</w:t>
+        <w:t xml:space="preserve">). Annual ET volume is relatively stable over the model period of water years 1991-2025, while about annual HB values are more variable, with about 10% being high outliers (Figure</w:t>
       </w:r>
       <w:r>
         <w:t xml:space="preserve"> </w:t>
@@ -8532,7 +8532,7 @@
         <w:t xml:space="preserve">5</w:t>
       </w:r>
       <w:r>
-        <w:t xml:space="preserve">). Among the 24 management scenarios, mean ET values ranged from 0 (for a no-irrigated-agriculture scenario) to 118 million m</w:t>
+        <w:t xml:space="preserve">). Among the 24 management scenarios, mean ET values ranged from 0 (i.e., no irrigated agriculture) to 118 million m</w:t>
       </w:r>
       <w:r>
         <w:rPr>
@@ -8544,7 +8544,7 @@
         <w:t xml:space="preserve"> </w:t>
       </w:r>
       <w:r>
-        <w:t xml:space="preserve">of water, while HB values ranged from 7696 to 8446 coho smolt-equivalent.</w:t>
+        <w:t xml:space="preserve">of water (i.e., no reduction from basecase crop ET), while HB values ranged from 7696 to 8446 coho smolt-equivalent.</w:t>
       </w:r>
     </w:p>
     <w:p>
@@ -8762,7 +8762,7 @@
         <w:pStyle w:val="FirstParagraph"/>
       </w:pPr>
       <w:r>
-        <w:t xml:space="preserve">As stated above, the environmental objective (HB function) results can be interpreted as a prediction of the ~50% of variation in coho smolt production that is empirically</w:t>
+        <w:t xml:space="preserve">As stated above, the environmental objective (HB function) results can be interpreted as a prediction of the 40% to 60% of variation in coho smolt production that is empirically</w:t>
       </w:r>
       <w:r>
         <w:t xml:space="preserve"> </w:t>
@@ -8794,22 +8794,51 @@
         <w:t xml:space="preserve"> </w:t>
       </w:r>
       <w:r>
-        <w:t xml:space="preserve">hydrologic factors. Because predictor values were standardized (Z-score transformed) before the statistical modeling exercise, absolute values of HB function coefficients for flow metrics can be interpreted as relative degree of influence on the relevant ecological outcome (Table</w:t>
-      </w:r>
-      <w:r>
-        <w:t xml:space="preserve"> </w:t>
-      </w:r>
-      <w:r>
-        <w:t xml:space="preserve">3</w:t>
-      </w:r>
-      <w:r>
-        <w:t xml:space="preserve">).</w:t>
+        <w:t xml:space="preserve">hydrologic factors; correspondingly, it is assumed that the remaining variation in observed smolt abundance is due to non-hydrologic factors like water quality or population dynamics</w:t>
+      </w:r>
+      <w:r>
+        <w:t xml:space="preserve"> </w:t>
+      </w:r>
+      <w:r>
+        <w:t xml:space="preserve">(Kouba et al. 2025)</w:t>
+      </w:r>
+      <w:r>
+        <w:t xml:space="preserve">.</w:t>
       </w:r>
     </w:p>
     <w:p>
       <w:pPr>
         <w:pStyle w:val="BodyText"/>
       </w:pPr>
+      <w:r>
+        <w:t xml:space="preserve">Because functional flow values were standardized (Z-score transformed) before the statistical modeling exercise, absolute values of HB function coefficients for flow metrics can be interpreted as relative degree of influence on the relevant ecological outcome (Table</w:t>
+      </w:r>
+      <w:r>
+        <w:t xml:space="preserve"> </w:t>
+      </w:r>
+      <w:r>
+        <w:t xml:space="preserve">3</w:t>
+      </w:r>
+      <w:r>
+        <w:t xml:space="preserve">).</w:t>
+      </w:r>
+    </w:p>
+    <w:p>
+      <w:pPr>
+        <w:pStyle w:val="BodyText"/>
+      </w:pPr>
+      <w:r>
+        <w:t xml:space="preserve">The HB formulations represent four ways of answering the question,</w:t>
+      </w:r>
+      <w:r>
+        <w:t xml:space="preserve"> </w:t>
+      </w:r>
+      <w:r>
+        <w:t xml:space="preserve">“how good was this water year for this species?”</w:t>
+      </w:r>
+      <w:r>
+        <w:t xml:space="preserve"> </w:t>
+      </w:r>
       <w:r>
         <w:t xml:space="preserve">For coho, in both absolute and spawner-normalized smolt units, the high-importance flows were fall-to-wet season transition metrics; for units of absolute smolt abundance, the spring recession rate was also important (Supplements A and B, Table 1). For Chinook, in both absolute and spawner-normalized smolt units, the wet season baseflow median magnitude was of greatest importance; for normalized smolt units, maximum spring recession rate was also selected (Supplements C and D, Table 1). Effectively, in the context of LASSO regression, the flows that explain the most variation in smolt production (without overfitting, as determined by k-fold validation) were related to, for coho, the timing of wet season onset and the magnitude of changes in fall flows; and for Chinook, the wet season baseflow.</w:t>
       </w:r>
@@ -8838,7 +8867,7 @@
         <w:pStyle w:val="FirstParagraph"/>
       </w:pPr>
       <w:r>
-        <w:t xml:space="preserve">Generally different management scenarios tended to have a uniform effect on total ET over time, shifting it by about the same amount each year (Figure</w:t>
+        <w:t xml:space="preserve">Management scenarios tended to have a uniform effect on total ET over time, shifting it by about the same amount each year relative to basecase (Figure</w:t>
       </w:r>
       <w:r>
         <w:t xml:space="preserve"> </w:t>
@@ -8847,7 +8876,16 @@
         <w:t xml:space="preserve">5</w:t>
       </w:r>
       <w:r>
-        <w:t xml:space="preserve">. Conversely, in some years, many scenarios seem to have very little effect on HB function, though this is variable over time, regardless of which HB units are used (Figure @ref(fig:benefitByWYMainText and Supplements A-D, Figure 1).</w:t>
+        <w:t xml:space="preserve">). Conversely, in some years, many scenarios seem to have very little effect on HB function, though this is variable over time, regardless of which HB units are used (Figure</w:t>
+      </w:r>
+      <w:r>
+        <w:t xml:space="preserve"> </w:t>
+      </w:r>
+      <w:r>
+        <w:t xml:space="preserve">5</w:t>
+      </w:r>
+      <w:r>
+        <w:t xml:space="preserve">) and Supplements A-D, Figure 1).</w:t>
       </w:r>
     </w:p>
     <w:p>
@@ -8855,7 +8893,19 @@
         <w:pStyle w:val="BodyText"/>
       </w:pPr>
       <w:r>
-        <w:t xml:space="preserve">The small effect of some scenarios on HB values implies that these scenarios do not alter the component flows relative to basecase (Supplements A-D, Figure 2).</w:t>
+        <w:t xml:space="preserve">The small effect of some scenarios on HB values implies that these scenarios do not alter the HB function component flows relative to basecase (Supplements A-D, Figure 2). For coho juvenile abundance, in the basecase scenario, it seems that when the HB function predicts a particularly good year (i.e., &gt; 20,000 coho smolt-equiv.), it is driven by a large magnitude fall flow difference, or fall pulse. Conversely, in the years where the HB function predicts a particularly bad year (i.e., ’95, ’98, ’04), it is driven by a rapid first spring recession rate (Figure</w:t>
+      </w:r>
+      <w:r>
+        <w:t xml:space="preserve"> </w:t>
+      </w:r>
+      <w:r>
+        <w:t xml:space="preserve">5</w:t>
+      </w:r>
+      <w:r>
+        <w:t xml:space="preserve"> </w:t>
+      </w:r>
+      <w:r>
+        <w:t xml:space="preserve">and Supplement A, Figure 2). Conversely, for coho juveniles per spawner (basecase), both good and bad years seem to be largely driven by wet season onset timing (Supplement B, Figure 2).</w:t>
       </w:r>
     </w:p>
     <w:p>
@@ -8863,182 +8913,116 @@
         <w:pStyle w:val="BodyText"/>
       </w:pPr>
       <w:r>
-        <w:rPr>
-          <w:b/>
-          <w:bCs/>
-        </w:rPr>
-        <w:t xml:space="preserve">CURRENTLY HERE</w:t>
+        <w:t xml:space="preserve">In both cases for coho, 2nd fall flow difference makes minor contributions (Supplements A and B, Figure 2), and is assigned a negative coefficient. This suggests higher flows in the second fall (for juvenile overwintering coho) are consistently associated with lower smolt production, but other factors such as first fall flow difference and wet season timing seem to exert greater overall influence.</w:t>
       </w:r>
     </w:p>
     <w:p>
       <w:pPr>
-        <w:pStyle w:val="Compact"/>
+        <w:pStyle w:val="BodyText"/>
+      </w:pPr>
+      <w:r>
+        <w:t xml:space="preserve">For Chinook, predictions of both high and low smolt production are driven by wet season baseflow magnitude (with a small contribution from maximum spring recession rate for juveniles per adult): high wet season flows are associated with lower smolt abundance (Supplements C and D, Figure 2).</w:t>
+      </w:r>
+    </w:p>
+    <w:bookmarkEnd w:id="68"/>
+    <w:bookmarkStart w:id="69" w:name="X5fdb465ae76c96bdfd4b77e04da6681552dfa21"/>
+    <w:p>
+      <w:pPr>
+        <w:pStyle w:val="Heading2"/>
+      </w:pPr>
+      <w:r>
+        <w:rPr>
+          <w:rStyle w:val="SectionNumber"/>
+        </w:rPr>
+        <w:t xml:space="preserve">4.3</w:t>
+      </w:r>
+      <w:r>
+        <w:tab/>
+      </w:r>
+      <w:r>
+        <w:t xml:space="preserve">Environmental-agricultural tradeoffs and efficiency</w:t>
+      </w:r>
+    </w:p>
+    <w:p>
+      <w:pPr>
         <w:numPr>
           <w:ilvl w:val="0"/>
           <w:numId w:val="1006"/>
         </w:numPr>
       </w:pPr>
       <w:r>
-        <w:t xml:space="preserve">For HB components (SUpplements A-D, Figure 2):</w:t>
+        <w:t xml:space="preserve">Tradeoff plot (Figure</w:t>
+      </w:r>
+      <w:r>
+        <w:t xml:space="preserve"> </w:t>
+      </w:r>
+      <w:r>
+        <w:t xml:space="preserve">6</w:t>
+      </w:r>
+      <w:r>
+        <w:t xml:space="preserve">.</w:t>
       </w:r>
     </w:p>
     <w:p>
       <w:pPr>
-        <w:pStyle w:val="Compact"/>
         <w:numPr>
           <w:ilvl w:val="1"/>
           <w:numId w:val="1007"/>
         </w:numPr>
       </w:pPr>
       <w:r>
-        <w:t xml:space="preserve">For coho juvenile abundance, in the basecase scenario, it seems that when the HB function predicts a particularly good year (</w:t>
-      </w:r>
-      <w:r>
-        <w:rPr>
-          <w:b/>
-          <w:bCs/>
-        </w:rPr>
-        <w:t xml:space="preserve">numerical definition</w:t>
-      </w:r>
-      <w:r>
-        <w:t xml:space="preserve">), it is driven by a large magnitude fall flow difference, or fall pulse. Conversely, in the years where the HB function predicts a particularly bad year, it is driven by a rapid first spring recession rate (Supplement A, Figure 2).</w:t>
+        <w:t xml:space="preserve">Highest-HB value is total conversion of irrigated agriculture to native vegetation. (High-ET vegetation endmember for Chinook and low-ET for coho).</w:t>
       </w:r>
     </w:p>
     <w:p>
       <w:pPr>
-        <w:pStyle w:val="Compact"/>
         <w:numPr>
           <w:ilvl w:val="1"/>
           <w:numId w:val="1007"/>
         </w:numPr>
       </w:pPr>
       <w:r>
-        <w:t xml:space="preserve">Conversely, for coho juveniles per spawner (basecase), both good and bad years seem to be largely driven by wet season onset timing (Supplement B, Figure 2)</w:t>
+        <w:t xml:space="preserve">reservoir scenarios don’t help coho much at all: small reservoirs just don’t have capacity to add fall flow during dry years when baseflows are lowest. Surprisingly, reservoir scenarios seem to help Chinook significantly more: even a small reservoir on one tributary can dampen wet season stormflows enough to benefit Chinook.</w:t>
       </w:r>
     </w:p>
     <w:p>
       <w:pPr>
-        <w:pStyle w:val="Compact"/>
         <w:numPr>
           <w:ilvl w:val="1"/>
           <w:numId w:val="1007"/>
         </w:numPr>
       </w:pPr>
       <w:r>
-        <w:t xml:space="preserve">In both cases for coho, 2nd fall flow difference makes minor contributions (Supplements A and B, Figure 2), and is assigned a negative coefficient. This suggests higher flows in the second fall (for juvenile overwintering coho) are consistently associated with lower smolt production, but other factors such as first fall flow difference and wet season timing seem to exert greater overall influence.</w:t>
+        <w:t xml:space="preserve">In all four HB formulations, Enhanced Recharge produces virtually no change in either fish benefit or farmer cost relative to basecase (Supplements A-D, Figure 3). The lack of farmer cost is by design; this management strategy is intended to minimize any impacts on growing season operations. But the lack of any fish benefit may reflect limitations of current surface water diversion permit rules; the maximum amount permitted winter diversions may not be sufficient to generate baseflow increases at the end of the following dry season.</w:t>
       </w:r>
     </w:p>
     <w:p>
       <w:pPr>
-        <w:pStyle w:val="Compact"/>
         <w:numPr>
           <w:ilvl w:val="1"/>
           <w:numId w:val="1007"/>
         </w:numPr>
       </w:pPr>
       <w:r>
-        <w:t xml:space="preserve">For Chinook, predictions of both high and low smolt production are driven by wet season baseflow magnitude (with a small contribution from maximum spring recession rate for juveniles per adult): high wet season flows are associated with lower smolt abundance.</w:t>
-      </w:r>
-    </w:p>
-    <w:bookmarkEnd w:id="68"/>
-    <w:bookmarkStart w:id="69" w:name="X5fdb465ae76c96bdfd4b77e04da6681552dfa21"/>
-    <w:p>
-      <w:pPr>
-        <w:pStyle w:val="Heading2"/>
-      </w:pPr>
-      <w:r>
-        <w:rPr>
-          <w:rStyle w:val="SectionNumber"/>
-        </w:rPr>
-        <w:t xml:space="preserve">4.3</w:t>
-      </w:r>
-      <w:r>
-        <w:tab/>
-      </w:r>
-      <w:r>
-        <w:t xml:space="preserve">Environmental-agricultural tradeoffs and efficiency</w:t>
+        <w:t xml:space="preserve">For coho, Enhanced Recharge and Reservoir scenarios produce virtually no farmer cost.</w:t>
       </w:r>
     </w:p>
     <w:p>
       <w:pPr>
         <w:numPr>
-          <w:ilvl w:val="0"/>
-          <w:numId w:val="1008"/>
+          <w:ilvl w:val="1"/>
+          <w:numId w:val="1007"/>
         </w:numPr>
       </w:pPr>
       <w:r>
-        <w:t xml:space="preserve">Tradeoff plot (Figure</w:t>
-      </w:r>
-      <w:r>
-        <w:t xml:space="preserve"> </w:t>
-      </w:r>
-      <w:r>
-        <w:t xml:space="preserve">6</w:t>
-      </w:r>
-      <w:r>
-        <w:t xml:space="preserve">.</w:t>
+        <w:t xml:space="preserve">Irrigation efficiency seems</w:t>
       </w:r>
     </w:p>
     <w:p>
       <w:pPr>
         <w:numPr>
           <w:ilvl w:val="1"/>
-          <w:numId w:val="1009"/>
-        </w:numPr>
-      </w:pPr>
-      <w:r>
-        <w:t xml:space="preserve">Highest-HB value is total conversion of irrigated agriculture to native vegetation. (High-ET vegetation endmember for Chinook and low-ET for coho).</w:t>
-      </w:r>
-    </w:p>
-    <w:p>
-      <w:pPr>
-        <w:numPr>
-          <w:ilvl w:val="1"/>
-          <w:numId w:val="1009"/>
-        </w:numPr>
-      </w:pPr>
-      <w:r>
-        <w:t xml:space="preserve">reservoir scenarios don’t help coho much at all: small reservoirs just don’t have capacity to add fall flow during dry years when baseflows are lowest. Surprisingly, reservoir scenarios seem to help Chinook significantly more: even a small reservoir on one tributary can dampen wet season stormflows enough to benefit Chinook.</w:t>
-      </w:r>
-    </w:p>
-    <w:p>
-      <w:pPr>
-        <w:numPr>
-          <w:ilvl w:val="1"/>
-          <w:numId w:val="1009"/>
-        </w:numPr>
-      </w:pPr>
-      <w:r>
-        <w:t xml:space="preserve">In all four HB formulations, Enhanced Recharge produces virtually no change in either fish benefit or farmer cost relative to basecase (Supplements A-D, Figure 3). The lack of farmer cost is by design; this management strategy is intended to minimize any impacts on growing season operations. But the lack of any fish benefit may reflect limitations of current surface water diversion permit rules; the maximum amount permitted winter diversions may not be sufficient to generate baseflow increases at the end of the following dry season.</w:t>
-      </w:r>
-    </w:p>
-    <w:p>
-      <w:pPr>
-        <w:numPr>
-          <w:ilvl w:val="1"/>
-          <w:numId w:val="1009"/>
-        </w:numPr>
-      </w:pPr>
-      <w:r>
-        <w:t xml:space="preserve">For coho, Enhanced Recharge and Reservoir scenarios produce virtually no farmer cost.</w:t>
-      </w:r>
-    </w:p>
-    <w:p>
-      <w:pPr>
-        <w:numPr>
-          <w:ilvl w:val="1"/>
-          <w:numId w:val="1009"/>
-        </w:numPr>
-      </w:pPr>
-      <w:r>
-        <w:t xml:space="preserve">Irrigation efficiency seems</w:t>
-      </w:r>
-    </w:p>
-    <w:p>
-      <w:pPr>
-        <w:numPr>
-          <w:ilvl w:val="1"/>
-          <w:numId w:val="1009"/>
+          <w:numId w:val="1007"/>
         </w:numPr>
       </w:pPr>
       <w:r>
@@ -9072,7 +9056,7 @@
         <w:pStyle w:val="Compact"/>
         <w:numPr>
           <w:ilvl w:val="0"/>
-          <w:numId w:val="1010"/>
+          <w:numId w:val="1008"/>
         </w:numPr>
       </w:pPr>
       <w:r>
@@ -9090,7 +9074,7 @@
         <w:pStyle w:val="Compact"/>
         <w:numPr>
           <w:ilvl w:val="1"/>
-          <w:numId w:val="1011"/>
+          <w:numId w:val="1009"/>
         </w:numPr>
       </w:pPr>
       <w:r>
@@ -9102,7 +9086,7 @@
         <w:pStyle w:val="Compact"/>
         <w:numPr>
           <w:ilvl w:val="0"/>
-          <w:numId w:val="1010"/>
+          <w:numId w:val="1008"/>
         </w:numPr>
       </w:pPr>
       <w:r>
@@ -9120,7 +9104,7 @@
         <w:pStyle w:val="Compact"/>
         <w:numPr>
           <w:ilvl w:val="1"/>
-          <w:numId w:val="1012"/>
+          <w:numId w:val="1010"/>
         </w:numPr>
       </w:pPr>
       <w:r>
@@ -21743,7 +21727,7 @@
         <w:pStyle w:val="Compact"/>
         <w:numPr>
           <w:ilvl w:val="0"/>
-          <w:numId w:val="1013"/>
+          <w:numId w:val="1011"/>
         </w:numPr>
       </w:pPr>
       <w:r>
@@ -21764,7 +21748,7 @@
         <w:pStyle w:val="Compact"/>
         <w:numPr>
           <w:ilvl w:val="0"/>
-          <w:numId w:val="1013"/>
+          <w:numId w:val="1011"/>
         </w:numPr>
       </w:pPr>
       <w:r>
@@ -21776,7 +21760,7 @@
         <w:pStyle w:val="Compact"/>
         <w:numPr>
           <w:ilvl w:val="0"/>
-          <w:numId w:val="1013"/>
+          <w:numId w:val="1011"/>
         </w:numPr>
       </w:pPr>
       <w:r>
@@ -21797,7 +21781,7 @@
         <w:pStyle w:val="Compact"/>
         <w:numPr>
           <w:ilvl w:val="0"/>
-          <w:numId w:val="1013"/>
+          <w:numId w:val="1011"/>
         </w:numPr>
       </w:pPr>
       <w:r>
@@ -25097,12 +25081,6 @@
     <w:abstractNumId w:val="991"/>
   </w:num>
   <w:num w:numId="1011">
-    <w:abstractNumId w:val="991"/>
-  </w:num>
-  <w:num w:numId="1012">
-    <w:abstractNumId w:val="991"/>
-  </w:num>
-  <w:num w:numId="1013">
     <w:abstractNumId w:val="991"/>
   </w:num>
 </w:numbering>

</xml_diff>

<commit_message>
figure out interp thing that was bugging you. continue results writeup
</commit_message>
<xml_diff>
--- a/Kouba_Fish_and_Ag_Benefit_MS.docx
+++ b/Kouba_Fish_and_Ag_Benefit_MS.docx
@@ -86,6 +86,33 @@
       </w:r>
       <w:r>
         <w:t xml:space="preserve">, and can help clarify trade-offs in ongoing local water planning efforts.</w:t>
+      </w:r>
+    </w:p>
+    <w:p>
+      <w:pPr>
+        <w:pStyle w:val="BodyText"/>
+      </w:pPr>
+      <w:r>
+        <w:rPr>
+          <w:b/>
+          <w:bCs/>
+        </w:rPr>
+        <w:t xml:space="preserve">TO DO</w:t>
+      </w:r>
+    </w:p>
+    <w:p>
+      <w:pPr>
+        <w:pStyle w:val="Compact"/>
+        <w:numPr>
+          <w:ilvl w:val="0"/>
+          <w:numId w:val="1001"/>
+        </w:numPr>
+      </w:pPr>
+      <w:r>
+        <w:t xml:space="preserve">Supplement E - scenario design info. MAR map</w:t>
+      </w:r>
+      <w:r>
+        <w:t xml:space="preserve"> </w:t>
       </w:r>
     </w:p>
     <w:p>
@@ -2101,43 +2128,11 @@
         <w:pStyle w:val="Compact"/>
         <w:numPr>
           <w:ilvl w:val="0"/>
-          <w:numId w:val="1001"/>
+          <w:numId w:val="1002"/>
         </w:numPr>
       </w:pPr>
       <w:r>
         <w:t xml:space="preserve">Fall flows, increasing after the dry season in response to early wet season storms, that are sufficient to provide coho spawners access to preferred spawning reaches within the fall-run time window;</w:t>
-      </w:r>
-    </w:p>
-    <w:p>
-      <w:pPr>
-        <w:pStyle w:val="Compact"/>
-        <w:numPr>
-          <w:ilvl w:val="0"/>
-          <w:numId w:val="1001"/>
-        </w:numPr>
-      </w:pPr>
-      <w:r>
-        <w:t xml:space="preserve">Flows providing habitat for rearing juvenile salmon for their ~12-15 months of freshwater residence; and</w:t>
-      </w:r>
-    </w:p>
-    <w:p>
-      <w:pPr>
-        <w:pStyle w:val="Compact"/>
-        <w:numPr>
-          <w:ilvl w:val="0"/>
-          <w:numId w:val="1001"/>
-        </w:numPr>
-      </w:pPr>
-      <w:r>
-        <w:t xml:space="preserve">Sufficient flow in the spring for yearling smolts to migrate to the ocean.</w:t>
-      </w:r>
-    </w:p>
-    <w:p>
-      <w:pPr>
-        <w:pStyle w:val="FirstParagraph"/>
-      </w:pPr>
-      <w:r>
-        <w:t xml:space="preserve">While Chinook also require fall flows for spawning, their specific flow requirements are somewhat distinct from coho due to their different life histories:</w:t>
       </w:r>
     </w:p>
     <w:p>
@@ -2149,25 +2144,7 @@
         </w:numPr>
       </w:pPr>
       <w:r>
-        <w:t xml:space="preserve">Chinook juveniles spend less than one year in the freshwater environment</w:t>
-      </w:r>
-      <w:r>
-        <w:t xml:space="preserve"> </w:t>
-      </w:r>
-      <w:r>
-        <w:t xml:space="preserve">(Agrawal et al. 2005)</w:t>
-      </w:r>
-      <w:r>
-        <w:t xml:space="preserve">, while coho overwinter and typically migrate to the ocean at 1+ years old</w:t>
-      </w:r>
-      <w:r>
-        <w:t xml:space="preserve"> </w:t>
-      </w:r>
-      <w:r>
-        <w:t xml:space="preserve">(Moyle 2002; McMahon 1983)</w:t>
-      </w:r>
-      <w:r>
-        <w:t xml:space="preserve">;</w:t>
+        <w:t xml:space="preserve">Flows providing habitat for rearing juvenile salmon for their ~12-15 months of freshwater residence; and</w:t>
       </w:r>
     </w:p>
     <w:p>
@@ -2179,16 +2156,15 @@
         </w:numPr>
       </w:pPr>
       <w:r>
-        <w:t xml:space="preserve">Chinook tend to spawn earlier in the fall than coho</w:t>
-      </w:r>
-      <w:r>
-        <w:t xml:space="preserve"> </w:t>
-      </w:r>
-      <w:r>
-        <w:t xml:space="preserve">(Knechtle and Giudice 2020; Magranet 2015, 2017)</w:t>
-      </w:r>
-      <w:r>
-        <w:t xml:space="preserve">;</w:t>
+        <w:t xml:space="preserve">Sufficient flow in the spring for yearling smolts to migrate to the ocean.</w:t>
+      </w:r>
+    </w:p>
+    <w:p>
+      <w:pPr>
+        <w:pStyle w:val="FirstParagraph"/>
+      </w:pPr>
+      <w:r>
+        <w:t xml:space="preserve">While Chinook also require fall flows for spawning, their specific flow requirements are somewhat distinct from coho due to their different life histories:</w:t>
       </w:r>
     </w:p>
     <w:p>
@@ -2196,7 +2172,58 @@
         <w:pStyle w:val="Compact"/>
         <w:numPr>
           <w:ilvl w:val="0"/>
-          <w:numId w:val="1002"/>
+          <w:numId w:val="1003"/>
+        </w:numPr>
+      </w:pPr>
+      <w:r>
+        <w:t xml:space="preserve">Chinook juveniles spend less than one year in the freshwater environment</w:t>
+      </w:r>
+      <w:r>
+        <w:t xml:space="preserve"> </w:t>
+      </w:r>
+      <w:r>
+        <w:t xml:space="preserve">(Agrawal et al. 2005)</w:t>
+      </w:r>
+      <w:r>
+        <w:t xml:space="preserve">, while coho overwinter and typically migrate to the ocean at 1+ years old</w:t>
+      </w:r>
+      <w:r>
+        <w:t xml:space="preserve"> </w:t>
+      </w:r>
+      <w:r>
+        <w:t xml:space="preserve">(Moyle 2002; McMahon 1983)</w:t>
+      </w:r>
+      <w:r>
+        <w:t xml:space="preserve">;</w:t>
+      </w:r>
+    </w:p>
+    <w:p>
+      <w:pPr>
+        <w:pStyle w:val="Compact"/>
+        <w:numPr>
+          <w:ilvl w:val="0"/>
+          <w:numId w:val="1003"/>
+        </w:numPr>
+      </w:pPr>
+      <w:r>
+        <w:t xml:space="preserve">Chinook tend to spawn earlier in the fall than coho</w:t>
+      </w:r>
+      <w:r>
+        <w:t xml:space="preserve"> </w:t>
+      </w:r>
+      <w:r>
+        <w:t xml:space="preserve">(Knechtle and Giudice 2020; Magranet 2015, 2017)</w:t>
+      </w:r>
+      <w:r>
+        <w:t xml:space="preserve">;</w:t>
+      </w:r>
+    </w:p>
+    <w:p>
+      <w:pPr>
+        <w:pStyle w:val="Compact"/>
+        <w:numPr>
+          <w:ilvl w:val="0"/>
+          <w:numId w:val="1003"/>
         </w:numPr>
       </w:pPr>
       <w:r>
@@ -2619,7 +2646,7 @@
         <w:pStyle w:val="Compact"/>
         <w:numPr>
           <w:ilvl w:val="0"/>
-          <w:numId w:val="1003"/>
+          <w:numId w:val="1004"/>
         </w:numPr>
       </w:pPr>
       <w:r>
@@ -2631,7 +2658,7 @@
         <w:pStyle w:val="Compact"/>
         <w:numPr>
           <w:ilvl w:val="0"/>
-          <w:numId w:val="1003"/>
+          <w:numId w:val="1004"/>
         </w:numPr>
       </w:pPr>
       <w:r>
@@ -2643,7 +2670,7 @@
         <w:pStyle w:val="Compact"/>
         <w:numPr>
           <w:ilvl w:val="0"/>
-          <w:numId w:val="1003"/>
+          <w:numId w:val="1004"/>
         </w:numPr>
       </w:pPr>
       <w:r>
@@ -4319,7 +4346,7 @@
         <w:pStyle w:val="Compact"/>
         <w:numPr>
           <w:ilvl w:val="0"/>
-          <w:numId w:val="1004"/>
+          <w:numId w:val="1005"/>
         </w:numPr>
       </w:pPr>
       <w:r>
@@ -4331,7 +4358,7 @@
         <w:pStyle w:val="Compact"/>
         <w:numPr>
           <w:ilvl w:val="0"/>
-          <w:numId w:val="1004"/>
+          <w:numId w:val="1005"/>
         </w:numPr>
       </w:pPr>
       <w:r>
@@ -4343,7 +4370,7 @@
         <w:pStyle w:val="Compact"/>
         <w:numPr>
           <w:ilvl w:val="0"/>
-          <w:numId w:val="1004"/>
+          <w:numId w:val="1005"/>
         </w:numPr>
       </w:pPr>
       <w:r>
@@ -4355,7 +4382,7 @@
         <w:pStyle w:val="Compact"/>
         <w:numPr>
           <w:ilvl w:val="0"/>
-          <w:numId w:val="1004"/>
+          <w:numId w:val="1005"/>
         </w:numPr>
       </w:pPr>
       <w:r>
@@ -4367,7 +4394,7 @@
         <w:pStyle w:val="Compact"/>
         <w:numPr>
           <w:ilvl w:val="0"/>
-          <w:numId w:val="1004"/>
+          <w:numId w:val="1005"/>
         </w:numPr>
       </w:pPr>
       <w:r>
@@ -5379,7 +5406,7 @@
         <w:pStyle w:val="Compact"/>
         <w:numPr>
           <w:ilvl w:val="0"/>
-          <w:numId w:val="1005"/>
+          <w:numId w:val="1006"/>
         </w:numPr>
       </w:pPr>
       <w:r>
@@ -5391,7 +5418,7 @@
         <w:pStyle w:val="Compact"/>
         <w:numPr>
           <w:ilvl w:val="0"/>
-          <w:numId w:val="1005"/>
+          <w:numId w:val="1006"/>
         </w:numPr>
       </w:pPr>
       <w:r>
@@ -7989,7 +8016,7 @@
     </w:tbl>
     <w:bookmarkEnd w:id="56"/>
     <w:bookmarkEnd w:id="57"/>
-    <w:bookmarkStart w:id="83" w:name="results"/>
+    <w:bookmarkStart w:id="92" w:name="results"/>
     <w:p>
       <w:pPr>
         <w:pStyle w:val="Heading1"/>
@@ -8820,7 +8847,7 @@
         <w:t xml:space="preserve">3</w:t>
       </w:r>
       <w:r>
-        <w:t xml:space="preserve">).</w:t>
+        <w:t xml:space="preserve">; see Supplement A for tabulated, untransformed functional flow values).</w:t>
       </w:r>
     </w:p>
     <w:p>
@@ -8834,7 +8861,7 @@
         <w:t xml:space="preserve"> </w:t>
       </w:r>
       <w:r>
-        <w:t xml:space="preserve">“how good was this water year for this species?”</w:t>
+        <w:t xml:space="preserve">“how good was this water year for this species, and which flows matter?”</w:t>
       </w:r>
       <w:r>
         <w:t xml:space="preserve"> </w:t>
@@ -8885,7 +8912,10 @@
         <w:t xml:space="preserve">5</w:t>
       </w:r>
       <w:r>
-        <w:t xml:space="preserve">) and Supplements A-D, Figure 1).</w:t>
+        <w:t xml:space="preserve"> </w:t>
+      </w:r>
+      <w:r>
+        <w:t xml:space="preserve">and Supplements A-D, Figure 1).</w:t>
       </w:r>
     </w:p>
     <w:p>
@@ -8893,19 +8923,7 @@
         <w:pStyle w:val="BodyText"/>
       </w:pPr>
       <w:r>
-        <w:t xml:space="preserve">The small effect of some scenarios on HB values implies that these scenarios do not alter the HB function component flows relative to basecase (Supplements A-D, Figure 2). For coho juvenile abundance, in the basecase scenario, it seems that when the HB function predicts a particularly good year (i.e., &gt; 20,000 coho smolt-equiv.), it is driven by a large magnitude fall flow difference, or fall pulse. Conversely, in the years where the HB function predicts a particularly bad year (i.e., ’95, ’98, ’04), it is driven by a rapid first spring recession rate (Figure</w:t>
-      </w:r>
-      <w:r>
-        <w:t xml:space="preserve"> </w:t>
-      </w:r>
-      <w:r>
-        <w:t xml:space="preserve">5</w:t>
-      </w:r>
-      <w:r>
-        <w:t xml:space="preserve"> </w:t>
-      </w:r>
-      <w:r>
-        <w:t xml:space="preserve">and Supplement A, Figure 2). Conversely, for coho juveniles per spawner (basecase), both good and bad years seem to be largely driven by wet season onset timing (Supplement B, Figure 2).</w:t>
+        <w:t xml:space="preserve">The small effect of some scenarios on HB values implies that these scenarios do not alter the HB function component flows relative to basecase (Supplements A-D, Figure 2). For coho juvenile abundance, in the basecase scenario, it seems that when the HB function predicts a particularly good year (i.e., &gt; 20,000 coho smolt-equiv.), it is driven by a large magnitude fall flow difference, or fall pulse. Conversely, in the years where the HB function predicts a particularly bad year (i.e., ’95, ’98, ’04), it is driven by a rapid first spring recession rate (Supplement A, Figure 2). Conversely, for coho juveniles per spawner (basecase), both good and bad years seem to be largely driven by wet season onset timing (Supplement B, Figure 2).</w:t>
       </w:r>
     </w:p>
     <w:p>
@@ -8913,7 +8931,16 @@
         <w:pStyle w:val="BodyText"/>
       </w:pPr>
       <w:r>
-        <w:t xml:space="preserve">In both cases for coho, 2nd fall flow difference makes minor contributions (Supplements A and B, Figure 2), and is assigned a negative coefficient. This suggests higher flows in the second fall (for juvenile overwintering coho) are consistently associated with lower smolt production, but other factors such as first fall flow difference and wet season timing seem to exert greater overall influence.</w:t>
+        <w:t xml:space="preserve">In both cases for coho, second fall flow difference makes minor contributions (Supplements A and B, Figure 2), and is assigned a negative coefficient (Table</w:t>
+      </w:r>
+      <w:r>
+        <w:t xml:space="preserve"> </w:t>
+      </w:r>
+      <w:r>
+        <w:t xml:space="preserve">3</w:t>
+      </w:r>
+      <w:r>
+        <w:t xml:space="preserve">). This suggests higher flows in the second fall (for juvenile overwintering coho) are consistently associated with lower smolt production, but other factors such as first fall flow difference and wet season timing seem to exert greater overall influence.</w:t>
       </w:r>
     </w:p>
     <w:p>
@@ -8925,7 +8952,7 @@
       </w:r>
     </w:p>
     <w:bookmarkEnd w:id="68"/>
-    <w:bookmarkStart w:id="69" w:name="X5fdb465ae76c96bdfd4b77e04da6681552dfa21"/>
+    <w:bookmarkStart w:id="77" w:name="X90e3ce3c48e7ea41c56b26fe6b0606cf118095a"/>
     <w:p>
       <w:pPr>
         <w:pStyle w:val="Heading2"/>
@@ -8940,88 +8967,85 @@
         <w:tab/>
       </w:r>
       <w:r>
-        <w:t xml:space="preserve">Environmental-agricultural tradeoffs and efficiency</w:t>
-      </w:r>
-    </w:p>
-    <w:p>
-      <w:pPr>
+        <w:t xml:space="preserve">Environmental-agricultural tradeoffs within and scenario categories</w:t>
+      </w:r>
+    </w:p>
+    <w:p>
+      <w:pPr>
+        <w:pStyle w:val="FirstParagraph"/>
+      </w:pPr>
+      <w:r>
+        <w:t xml:space="preserve">The 35-year mean values of HB and ET can be used to map all scenarios on one two-dimensional landscape, which is useful for evaluating trade-offs between objectives (Figure</w:t>
+      </w:r>
+      <w:r>
+        <w:t xml:space="preserve"> </w:t>
+      </w:r>
+      <w:r>
+        <w:t xml:space="preserve">6</w:t>
+      </w:r>
+      <w:r>
+        <w:t xml:space="preserve">).</w:t>
+      </w:r>
+    </w:p>
+    <w:p>
+      <w:pPr>
+        <w:pStyle w:val="BodyText"/>
+      </w:pPr>
+      <w:r>
+        <w:t xml:space="preserve">In units of coho smolt abundance, three management scenarios actually produce poorer fish outcomes than basecase, but the majority of scenarios produce more favorable flows for smolt production (Figure</w:t>
+      </w:r>
+      <w:r>
+        <w:t xml:space="preserve"> </w:t>
+      </w:r>
+      <w:r>
+        <w:t xml:space="preserve">6</w:t>
+      </w:r>
+      <w:r>
+        <w:t xml:space="preserve">). We expect that this is due to scenario impacts on the largest single component of the HB function for coho smolt abundance, first fall flow difference or</w:t>
+      </w:r>
+      <w:r>
+        <w:t xml:space="preserve"> </w:t>
+      </w:r>
+      <w:r>
+        <w:rPr>
+          <w:rStyle w:val="VerbatimChar"/>
+        </w:rPr>
+        <w:t xml:space="preserve">f1_FA_Dif_num</w:t>
+      </w:r>
+      <w:r>
+        <w:t xml:space="preserve">. This metric is calculated as the difference between dry season median discharge and peak fall pulse discharge; in years with no detectable fall pulse flow, this value is set to 0</w:t>
+      </w:r>
+      <w:r>
+        <w:t xml:space="preserve"> </w:t>
+      </w:r>
+      <w:r>
+        <w:t xml:space="preserve">(Carpenter 2024; Baruch et al. 2024)</w:t>
+      </w:r>
+      <w:r>
+        <w:t xml:space="preserve"> </w:t>
+      </w:r>
+      <w:r>
+        <w:t xml:space="preserve">(see also Supplement A, Figure 5 and Table 3). The high degree of correlation between this flow and coho smolt abundance is corroborated by the species’ natural history: fall run timing is somewhat more flexible for coho than Chinook, and coho seem to respond strongly to pulse flows, possibly due to olfactory signals from their natal streams [</w:t>
+      </w:r>
+      <w:r>
+        <w:rPr>
+          <w:b/>
+          <w:bCs/>
+        </w:rPr>
+        <w:t xml:space="preserve">CITE</w:t>
+      </w:r>
+      <w:r>
+        <w:t xml:space="preserve">]. Because changes in water use can affect both the dry season minimum and the magnitude of a fall pulse flow, management scenarios may have positive or negative effect on this functional flow, which in turn will influence the total calculated HB value.</w:t>
+      </w:r>
+      <w:r>
+        <w:t xml:space="preserve"> </w:t>
+      </w:r>
+    </w:p>
+    <w:p>
+      <w:pPr>
+        <w:pStyle w:val="Compact"/>
         <w:numPr>
           <w:ilvl w:val="0"/>
-          <w:numId w:val="1006"/>
-        </w:numPr>
-      </w:pPr>
-      <w:r>
-        <w:t xml:space="preserve">Tradeoff plot (Figure</w:t>
-      </w:r>
-      <w:r>
-        <w:t xml:space="preserve"> </w:t>
-      </w:r>
-      <w:r>
-        <w:t xml:space="preserve">6</w:t>
-      </w:r>
-      <w:r>
-        <w:t xml:space="preserve">.</w:t>
-      </w:r>
-    </w:p>
-    <w:p>
-      <w:pPr>
-        <w:numPr>
-          <w:ilvl w:val="1"/>
-          <w:numId w:val="1007"/>
-        </w:numPr>
-      </w:pPr>
-      <w:r>
-        <w:t xml:space="preserve">Highest-HB value is total conversion of irrigated agriculture to native vegetation. (High-ET vegetation endmember for Chinook and low-ET for coho).</w:t>
-      </w:r>
-    </w:p>
-    <w:p>
-      <w:pPr>
-        <w:numPr>
-          <w:ilvl w:val="1"/>
-          <w:numId w:val="1007"/>
-        </w:numPr>
-      </w:pPr>
-      <w:r>
-        <w:t xml:space="preserve">reservoir scenarios don’t help coho much at all: small reservoirs just don’t have capacity to add fall flow during dry years when baseflows are lowest. Surprisingly, reservoir scenarios seem to help Chinook significantly more: even a small reservoir on one tributary can dampen wet season stormflows enough to benefit Chinook.</w:t>
-      </w:r>
-    </w:p>
-    <w:p>
-      <w:pPr>
-        <w:numPr>
-          <w:ilvl w:val="1"/>
-          <w:numId w:val="1007"/>
-        </w:numPr>
-      </w:pPr>
-      <w:r>
-        <w:t xml:space="preserve">In all four HB formulations, Enhanced Recharge produces virtually no change in either fish benefit or farmer cost relative to basecase (Supplements A-D, Figure 3). The lack of farmer cost is by design; this management strategy is intended to minimize any impacts on growing season operations. But the lack of any fish benefit may reflect limitations of current surface water diversion permit rules; the maximum amount permitted winter diversions may not be sufficient to generate baseflow increases at the end of the following dry season.</w:t>
-      </w:r>
-    </w:p>
-    <w:p>
-      <w:pPr>
-        <w:numPr>
-          <w:ilvl w:val="1"/>
-          <w:numId w:val="1007"/>
-        </w:numPr>
-      </w:pPr>
-      <w:r>
-        <w:t xml:space="preserve">For coho, Enhanced Recharge and Reservoir scenarios produce virtually no farmer cost.</w:t>
-      </w:r>
-    </w:p>
-    <w:p>
-      <w:pPr>
-        <w:numPr>
-          <w:ilvl w:val="1"/>
-          <w:numId w:val="1007"/>
-        </w:numPr>
-      </w:pPr>
-      <w:r>
-        <w:t xml:space="preserve">Irrigation efficiency seems</w:t>
-      </w:r>
-    </w:p>
-    <w:p>
-      <w:pPr>
-        <w:numPr>
-          <w:ilvl w:val="1"/>
           <w:numId w:val="1007"/>
         </w:numPr>
       </w:pPr>
@@ -9039,16 +9063,401 @@
         <w:t xml:space="preserve">)</w:t>
       </w:r>
     </w:p>
+    <w:bookmarkStart w:id="69" w:name="reservoir"/>
+    <w:p>
+      <w:pPr>
+        <w:pStyle w:val="Heading3"/>
+      </w:pPr>
+      <w:r>
+        <w:rPr>
+          <w:rStyle w:val="SectionNumber"/>
+        </w:rPr>
+        <w:t xml:space="preserve">4.3.1</w:t>
+      </w:r>
+      <w:r>
+        <w:tab/>
+      </w:r>
+      <w:r>
+        <w:t xml:space="preserve">Reservoir</w:t>
+      </w:r>
+    </w:p>
     <w:p>
       <w:pPr>
         <w:pStyle w:val="FirstParagraph"/>
       </w:pPr>
+      <w:r>
+        <w:t xml:space="preserve">Reservoir scenarios simulate how flows would change if a small reservoir (9 thousand acre-feet, or 11.1 10</w:t>
+      </w:r>
+      <w:r>
+        <w:rPr>
+          <w:vertAlign w:val="superscript"/>
+        </w:rPr>
+        <w:t xml:space="preserve">6</w:t>
+      </w:r>
+      <w:r>
+        <w:t xml:space="preserve"> </w:t>
+      </w:r>
+      <w:r>
+        <w:t xml:space="preserve">m</w:t>
+      </w:r>
+      <w:r>
+        <w:rPr>
+          <w:vertAlign w:val="superscript"/>
+        </w:rPr>
+        <w:t xml:space="preserve">3</w:t>
+      </w:r>
+      <w:r>
+        <w:t xml:space="preserve">), located in the headwaters on one of 3 tributaries, were operated with the following objectives: retain winter flow until fill (Dec-Mar), pass along growing season flow (Apr-Aug), and supplement dry season flow (Sep-Nov).</w:t>
+      </w:r>
+    </w:p>
+    <w:p>
+      <w:pPr>
+        <w:pStyle w:val="BodyText"/>
+      </w:pPr>
+      <w:r>
+        <w:t xml:space="preserve">Somewhat contrary to expectations, reservoir scenarios don’t help coho much, relative to other management options: small reservoirs may not have capacity to add fall flow during dry years when baseflows are lowest (Figure</w:t>
+      </w:r>
+      <w:r>
+        <w:t xml:space="preserve"> </w:t>
+      </w:r>
+      <w:r>
+        <w:t xml:space="preserve">6</w:t>
+      </w:r>
+      <w:r>
+        <w:t xml:space="preserve"> </w:t>
+      </w:r>
+      <w:r>
+        <w:t xml:space="preserve">and Supplements A and B, Figure 3). Surprisingly, reservoir scenarios seem to help Chinook significantly more than coho: even a small reservoir on one tributary appears to dampen wet season stormflows enough to benefit Chinook (Supplements C and D, Figure 3).</w:t>
+      </w:r>
+    </w:p>
+    <w:bookmarkEnd w:id="69"/>
+    <w:bookmarkStart w:id="70" w:name="enhanced-recharge"/>
+    <w:p>
+      <w:pPr>
+        <w:pStyle w:val="Heading3"/>
+      </w:pPr>
+      <w:r>
+        <w:rPr>
+          <w:rStyle w:val="SectionNumber"/>
+        </w:rPr>
+        <w:t xml:space="preserve">4.3.2</w:t>
+      </w:r>
+      <w:r>
+        <w:tab/>
+      </w:r>
+      <w:r>
+        <w:t xml:space="preserve">Enhanced Recharge</w:t>
+      </w:r>
+    </w:p>
+    <w:p>
+      <w:pPr>
+        <w:pStyle w:val="FirstParagraph"/>
+      </w:pPr>
+      <w:r>
+        <w:t xml:space="preserve">The Enhanced Recharge scenario simulates a Managed Aquifer Recharge (MAR) program diverting</w:t>
+      </w:r>
+      <w:r>
+        <w:t xml:space="preserve"> </w:t>
+      </w:r>
       <w:r>
         <w:rPr>
           <w:b/>
           <w:bCs/>
         </w:rPr>
-        <w:t xml:space="preserve">check - is alf_curtail_07.31 actually alf_curtail_08.15?</w:t>
+        <w:t xml:space="preserve">XXX</w:t>
+      </w:r>
+      <w:r>
+        <w:t xml:space="preserve"> </w:t>
+      </w:r>
+      <w:r>
+        <w:t xml:space="preserve">maximum total water volume from the Scott River, Jan-March, and applying it as winter recharge on</w:t>
+      </w:r>
+      <w:r>
+        <w:t xml:space="preserve"> </w:t>
+      </w:r>
+      <w:r>
+        <w:rPr>
+          <w:b/>
+          <w:bCs/>
+        </w:rPr>
+        <w:t xml:space="preserve">X</w:t>
+      </w:r>
+      <w:r>
+        <w:t xml:space="preserve"> </w:t>
+      </w:r>
+      <w:r>
+        <w:t xml:space="preserve">fields covering</w:t>
+      </w:r>
+      <w:r>
+        <w:t xml:space="preserve"> </w:t>
+      </w:r>
+      <w:r>
+        <w:rPr>
+          <w:b/>
+          <w:bCs/>
+        </w:rPr>
+        <w:t xml:space="preserve">XXX</w:t>
+      </w:r>
+      <w:r>
+        <w:t xml:space="preserve"> </w:t>
+      </w:r>
+      <w:r>
+        <w:t xml:space="preserve">acres (</w:t>
+      </w:r>
+      <w:r>
+        <w:rPr>
+          <w:b/>
+          <w:bCs/>
+        </w:rPr>
+        <w:t xml:space="preserve">XXXX</w:t>
+      </w:r>
+      <w:r>
+        <w:t xml:space="preserve"> </w:t>
+      </w:r>
+      <w:r>
+        <w:t xml:space="preserve">m</w:t>
+      </w:r>
+      <w:r>
+        <w:rPr>
+          <w:vertAlign w:val="superscript"/>
+        </w:rPr>
+        <w:t xml:space="preserve">2</w:t>
+      </w:r>
+      <w:r>
+        <w:t xml:space="preserve">; see</w:t>
+      </w:r>
+      <w:r>
+        <w:t xml:space="preserve"> </w:t>
+      </w:r>
+      <w:r>
+        <w:rPr>
+          <w:b/>
+          <w:bCs/>
+        </w:rPr>
+        <w:t xml:space="preserve">Supplement E</w:t>
+      </w:r>
+      <w:r>
+        <w:t xml:space="preserve"> </w:t>
+      </w:r>
+      <w:r>
+        <w:t xml:space="preserve">for map of recharge areas).</w:t>
+      </w:r>
+    </w:p>
+    <w:p>
+      <w:pPr>
+        <w:pStyle w:val="BodyText"/>
+      </w:pPr>
+      <w:r>
+        <w:t xml:space="preserve">In all four HB formulations, Enhanced Recharge produces virtually no change in either fish benefit or farmer cost relative to basecase (Figure</w:t>
+      </w:r>
+      <w:r>
+        <w:t xml:space="preserve"> </w:t>
+      </w:r>
+      <w:r>
+        <w:t xml:space="preserve">6</w:t>
+      </w:r>
+      <w:r>
+        <w:t xml:space="preserve"> </w:t>
+      </w:r>
+      <w:r>
+        <w:t xml:space="preserve">and Supplements A-D, Figure 3). The lack of farmer cost is by design; this management strategy is intended to avoid any impacts on growing season operations. But the lack of any fish benefit suggests that current maximum permitted surface water diversions are insufficient to improve flow conditions for fish.</w:t>
+      </w:r>
+      <w:r>
+        <w:t xml:space="preserve"> </w:t>
+      </w:r>
+      <w:r>
+        <w:rPr>
+          <w:b/>
+          <w:bCs/>
+        </w:rPr>
+        <w:t xml:space="preserve">for discussion? &gt;</w:t>
+      </w:r>
+      <w:r>
+        <w:t xml:space="preserve"> </w:t>
+      </w:r>
+      <w:r>
+        <w:t xml:space="preserve">The popularity of this management action points to a need, in Scott Valley, California, and semi-arid agricultural regions more broadly, regarding effective spatial, timing, and water volume elements of an effective MAR program.</w:t>
+      </w:r>
+    </w:p>
+    <w:bookmarkEnd w:id="70"/>
+    <w:bookmarkStart w:id="71" w:name="alfalfa-irrigation"/>
+    <w:p>
+      <w:pPr>
+        <w:pStyle w:val="Heading3"/>
+      </w:pPr>
+      <w:r>
+        <w:rPr>
+          <w:rStyle w:val="SectionNumber"/>
+        </w:rPr>
+        <w:t xml:space="preserve">4.3.3</w:t>
+      </w:r>
+      <w:r>
+        <w:tab/>
+      </w:r>
+      <w:r>
+        <w:t xml:space="preserve">Alfalfa Irrigation</w:t>
+      </w:r>
+    </w:p>
+    <w:p>
+      <w:pPr>
+        <w:pStyle w:val="FirstParagraph"/>
+      </w:pPr>
+      <w:r>
+        <w:t xml:space="preserve">Early cessation of irrigation on alfalfa fields effectively means that growers forgo the harvest of one or more hay cuttings. The irrigation cutoff dates for alfala in this category are Aug 15 (closest to basecase), July 31, and July 15.</w:t>
+      </w:r>
+    </w:p>
+    <w:p>
+      <w:pPr>
+        <w:pStyle w:val="BodyText"/>
+      </w:pPr>
+      <w:r>
+        <w:rPr>
+          <w:b/>
+          <w:bCs/>
+        </w:rPr>
+        <w:t xml:space="preserve">CURRENTLY HERE.</w:t>
+      </w:r>
+      <w:r>
+        <w:t xml:space="preserve"> </w:t>
+      </w:r>
+      <w:r>
+        <w:t xml:space="preserve">iNTERPRET Alfalfa, Irr Curt, Crop Change, Irr Eff, and Low Flow Div. Also NatVeg high and low.</w:t>
+      </w:r>
+    </w:p>
+    <w:bookmarkEnd w:id="71"/>
+    <w:bookmarkStart w:id="72" w:name="irrigation-curtailment"/>
+    <w:p>
+      <w:pPr>
+        <w:pStyle w:val="Heading3"/>
+      </w:pPr>
+      <w:r>
+        <w:rPr>
+          <w:rStyle w:val="SectionNumber"/>
+        </w:rPr>
+        <w:t xml:space="preserve">4.3.4</w:t>
+      </w:r>
+      <w:r>
+        <w:tab/>
+      </w:r>
+      <w:r>
+        <w:t xml:space="preserve">Irrigation Curtailment</w:t>
+      </w:r>
+    </w:p>
+    <w:bookmarkEnd w:id="72"/>
+    <w:bookmarkStart w:id="73" w:name="crop-change"/>
+    <w:p>
+      <w:pPr>
+        <w:pStyle w:val="Heading3"/>
+      </w:pPr>
+      <w:r>
+        <w:rPr>
+          <w:rStyle w:val="SectionNumber"/>
+        </w:rPr>
+        <w:t xml:space="preserve">4.3.5</w:t>
+      </w:r>
+      <w:r>
+        <w:tab/>
+      </w:r>
+      <w:r>
+        <w:t xml:space="preserve">Crop Change</w:t>
+      </w:r>
+    </w:p>
+    <w:p>
+      <w:pPr>
+        <w:pStyle w:val="FirstParagraph"/>
+      </w:pPr>
+      <w:r>
+        <w:t xml:space="preserve">The ET values in the Crop Change category are challenging to compare directly to those in other categories, since the</w:t>
+      </w:r>
+    </w:p>
+    <w:p>
+      <w:pPr>
+        <w:pStyle w:val="BodyText"/>
+      </w:pPr>
+      <w:r>
+        <w:t xml:space="preserve">; a change in ET in this scenario category may not correspond to a similar change in crop value if commodity prices for grain produce greater economic benefit than for alfalfa.</w:t>
+      </w:r>
+    </w:p>
+    <w:bookmarkEnd w:id="73"/>
+    <w:bookmarkStart w:id="74" w:name="irrigation-efficiency"/>
+    <w:p>
+      <w:pPr>
+        <w:pStyle w:val="Heading3"/>
+      </w:pPr>
+      <w:r>
+        <w:rPr>
+          <w:rStyle w:val="SectionNumber"/>
+        </w:rPr>
+        <w:t xml:space="preserve">4.3.6</w:t>
+      </w:r>
+      <w:r>
+        <w:tab/>
+      </w:r>
+      <w:r>
+        <w:t xml:space="preserve">Irrigation Efficiency</w:t>
+      </w:r>
+    </w:p>
+    <w:p>
+      <w:pPr>
+        <w:pStyle w:val="FirstParagraph"/>
+      </w:pPr>
+      <w:r>
+        <w:t xml:space="preserve">Irrigation efficiency seems to have a minimal effect on crop ET and a small positive or negative effect on environmental benefit;</w:t>
+      </w:r>
+    </w:p>
+    <w:bookmarkEnd w:id="74"/>
+    <w:bookmarkStart w:id="75" w:name="low-flow-diversion-limits"/>
+    <w:p>
+      <w:pPr>
+        <w:pStyle w:val="Heading3"/>
+      </w:pPr>
+      <w:r>
+        <w:rPr>
+          <w:rStyle w:val="SectionNumber"/>
+        </w:rPr>
+        <w:t xml:space="preserve">4.3.7</w:t>
+      </w:r>
+      <w:r>
+        <w:tab/>
+      </w:r>
+      <w:r>
+        <w:t xml:space="preserve">Low Flow Diversion Limits</w:t>
+      </w:r>
+    </w:p>
+    <w:p>
+      <w:pPr>
+        <w:pStyle w:val="FirstParagraph"/>
+      </w:pPr>
+      <w:r>
+        <w:t xml:space="preserve">In the basecase, surface water diversions to meet crop water demand are permitted until the stream volume is totally depleted (which is a common occurrence in some reaches of this ephemeral stream system); conversely, in this scenario, surface water was not diverted if flow fell below minimum tributary flowrates corresponding to the CDFW emergency drought flow regime</w:t>
+      </w:r>
+      <w:r>
+        <w:t xml:space="preserve"> </w:t>
+      </w:r>
+      <w:r>
+        <w:t xml:space="preserve">(State Water Resources Control Board 2024a)</w:t>
+      </w:r>
+      <w:r>
+        <w:t xml:space="preserve">.</w:t>
+      </w:r>
+    </w:p>
+    <w:bookmarkEnd w:id="75"/>
+    <w:bookmarkStart w:id="76" w:name="native-vegetation"/>
+    <w:p>
+      <w:pPr>
+        <w:pStyle w:val="Heading3"/>
+      </w:pPr>
+      <w:r>
+        <w:rPr>
+          <w:rStyle w:val="SectionNumber"/>
+        </w:rPr>
+        <w:t xml:space="preserve">4.3.8</w:t>
+      </w:r>
+      <w:r>
+        <w:tab/>
+      </w:r>
+      <w:r>
+        <w:t xml:space="preserve">Native Vegetation</w:t>
       </w:r>
     </w:p>
     <w:p>
@@ -9060,25 +9469,7 @@
         </w:numPr>
       </w:pPr>
       <w:r>
-        <w:t xml:space="preserve">Efficiency plot (Figure</w:t>
-      </w:r>
-      <w:r>
-        <w:t xml:space="preserve"> </w:t>
-      </w:r>
-      <w:r>
-        <w:t xml:space="preserve">7</w:t>
-      </w:r>
-    </w:p>
-    <w:p>
-      <w:pPr>
-        <w:pStyle w:val="Compact"/>
-        <w:numPr>
-          <w:ilvl w:val="1"/>
-          <w:numId w:val="1009"/>
-        </w:numPr>
-      </w:pPr>
-      <w:r>
-        <w:t xml:space="preserve">For coho,</w:t>
+        <w:t xml:space="preserve">two vegetation types simulated</w:t>
       </w:r>
     </w:p>
     <w:p>
@@ -9090,6 +9481,48 @@
         </w:numPr>
       </w:pPr>
       <w:r>
+        <w:t xml:space="preserve">high ET obviously increases consumptive use in the valley</w:t>
+      </w:r>
+    </w:p>
+    <w:bookmarkEnd w:id="76"/>
+    <w:bookmarkEnd w:id="77"/>
+    <w:bookmarkStart w:id="78" w:name="Xb1d6363a0142b3ddbad42495f6318fce999d2e5"/>
+    <w:p>
+      <w:pPr>
+        <w:pStyle w:val="Heading2"/>
+      </w:pPr>
+      <w:r>
+        <w:rPr>
+          <w:rStyle w:val="SectionNumber"/>
+        </w:rPr>
+        <w:t xml:space="preserve">4.4</w:t>
+      </w:r>
+      <w:r>
+        <w:tab/>
+      </w:r>
+      <w:r>
+        <w:t xml:space="preserve">Trade-off efficiency and considering infrastructure cost</w:t>
+      </w:r>
+    </w:p>
+    <w:p>
+      <w:pPr>
+        <w:pStyle w:val="FirstParagraph"/>
+      </w:pPr>
+      <w:r>
+        <w:t xml:space="preserve">(Figure</w:t>
+      </w:r>
+      <w:r>
+        <w:t xml:space="preserve"> </w:t>
+      </w:r>
+      <w:r>
+        <w:t xml:space="preserve">7</w:t>
+      </w:r>
+    </w:p>
+    <w:p>
+      <w:pPr>
+        <w:pStyle w:val="BodyText"/>
+      </w:pPr>
+      <w:r>
         <w:t xml:space="preserve">3-D results figure (Figure</w:t>
       </w:r>
       <w:r>
@@ -9101,11 +9534,7 @@
     </w:p>
     <w:p>
       <w:pPr>
-        <w:pStyle w:val="Compact"/>
-        <w:numPr>
-          <w:ilvl w:val="1"/>
-          <w:numId w:val="1010"/>
-        </w:numPr>
+        <w:pStyle w:val="BodyText"/>
       </w:pPr>
       <w:r>
         <w:t xml:space="preserve">For coho, trade-off curves in every category.</w:t>
@@ -9113,7 +9542,7 @@
     </w:p>
     <w:p>
       <w:pPr>
-        <w:pStyle w:val="FirstParagraph"/>
+        <w:pStyle w:val="BodyText"/>
       </w:pPr>
       <w:r>
         <w:rPr>
@@ -9123,8 +9552,8 @@
         <w:t xml:space="preserve">begin old result text</w:t>
       </w:r>
     </w:p>
-    <w:bookmarkEnd w:id="69"/>
-    <w:bookmarkStart w:id="71" w:name="X7919b09686293416b4bcb59483f48ae87a57064"/>
+    <w:bookmarkEnd w:id="78"/>
+    <w:bookmarkStart w:id="80" w:name="X7919b09686293416b4bcb59483f48ae87a57064"/>
     <w:p>
       <w:pPr>
         <w:pStyle w:val="Heading2"/>
@@ -9133,7 +9562,7 @@
         <w:rPr>
           <w:rStyle w:val="SectionNumber"/>
         </w:rPr>
-        <w:t xml:space="preserve">4.4</w:t>
+        <w:t xml:space="preserve">4.5</w:t>
       </w:r>
       <w:r>
         <w:tab/>
@@ -9434,8 +9863,8 @@
       <w:pPr>
         <w:pStyle w:val="TableCaption"/>
       </w:pPr>
-      <w:bookmarkStart w:id="70" w:name="tab:scenarioResultsTabMainText"/>
-      <w:bookmarkEnd w:id="70"/>
+      <w:bookmarkStart w:id="79" w:name="tab:scenarioResultsTabMainText"/>
+      <w:bookmarkEnd w:id="79"/>
       <w:r>
         <w:t xml:space="preserve">Table 6:</w:t>
       </w:r>
@@ -17627,8 +18056,8 @@
         </w:tc>
       </w:tr>
     </w:tbl>
-    <w:bookmarkEnd w:id="71"/>
-    <w:bookmarkStart w:id="76" w:name="X5717be130d28923be971a1bdea556d769a5487a"/>
+    <w:bookmarkEnd w:id="80"/>
+    <w:bookmarkStart w:id="85" w:name="X5717be130d28923be971a1bdea556d769a5487a"/>
     <w:p>
       <w:pPr>
         <w:pStyle w:val="Heading2"/>
@@ -17637,7 +18066,7 @@
         <w:rPr>
           <w:rStyle w:val="SectionNumber"/>
         </w:rPr>
-        <w:t xml:space="preserve">4.5</w:t>
+        <w:t xml:space="preserve">4.6</w:t>
       </w:r>
       <w:r>
         <w:tab/>
@@ -17798,18 +18227,18 @@
           <wp:inline>
             <wp:extent cx="5334000" cy="4000499"/>
             <wp:effectExtent b="0" l="0" r="0" t="0"/>
-            <wp:docPr descr="Figure 7:  Scenario trade-off efficiencies, or average Hydrologic Benefit value (a proxy for environmental benefit) gained per crop ET value lost (a proxy for farmer cost) (normalized to average basecase HB and ET values, respectively), in all 35 years. Some scenarios are excluded if they have no or negative ET loss, producing infinite or negative efficiency values." title="" id="73" name="Picture"/>
+            <wp:docPr descr="Figure 7:  Scenario trade-off efficiencies, or average Hydrologic Benefit value (a proxy for environmental benefit) gained per crop ET value lost (a proxy for farmer cost) (normalized to average basecase HB and ET values, respectively), in all 35 years. Some scenarios are excluded if they have no or negative ET loss, producing infinite or negative efficiency values." title="" id="82" name="Picture"/>
             <a:graphic>
               <a:graphicData uri="http://schemas.openxmlformats.org/drawingml/2006/picture">
                 <pic:pic>
                   <pic:nvPicPr>
-                    <pic:cNvPr descr="Graphics%20and%20Supplements/Figure%207.png" id="74" name="Picture"/>
+                    <pic:cNvPr descr="Graphics%20and%20Supplements/Figure%207.png" id="83" name="Picture"/>
                     <pic:cNvPicPr>
                       <a:picLocks noChangeArrowheads="1" noChangeAspect="1"/>
                     </pic:cNvPicPr>
                   </pic:nvPicPr>
                   <pic:blipFill>
-                    <a:blip r:embed="rId72"/>
+                    <a:blip r:embed="rId81"/>
                     <a:stretch>
                       <a:fillRect/>
                     </a:stretch>
@@ -17840,8 +18269,8 @@
       <w:pPr>
         <w:pStyle w:val="ImageCaption"/>
       </w:pPr>
-      <w:bookmarkStart w:id="75" w:name="fig:efficiencyMainText"/>
-      <w:bookmarkEnd w:id="75"/>
+      <w:bookmarkStart w:id="84" w:name="fig:efficiencyMainText"/>
+      <w:bookmarkEnd w:id="84"/>
       <w:r>
         <w:t xml:space="preserve">Figure 7:</w:t>
       </w:r>
@@ -17855,8 +18284,8 @@
         <w:t xml:space="preserve">Scenario trade-off efficiencies, or average Hydrologic Benefit value (a proxy for environmental benefit) gained per crop ET value lost (a proxy for farmer cost) (normalized to average basecase HB and ET values, respectively), in all 35 years. Some scenarios are excluded if they have no or negative ET loss, producing infinite or negative efficiency values.</w:t>
       </w:r>
     </w:p>
-    <w:bookmarkEnd w:id="76"/>
-    <w:bookmarkStart w:id="82" w:name="Xfbc83626841bb94e70b2ed42e58f7fe62bf81a6"/>
+    <w:bookmarkEnd w:id="85"/>
+    <w:bookmarkStart w:id="91" w:name="Xfbc83626841bb94e70b2ed42e58f7fe62bf81a6"/>
     <w:p>
       <w:pPr>
         <w:pStyle w:val="Heading2"/>
@@ -17865,7 +18294,7 @@
         <w:rPr>
           <w:rStyle w:val="SectionNumber"/>
         </w:rPr>
-        <w:t xml:space="preserve">4.6</w:t>
+        <w:t xml:space="preserve">4.7</w:t>
       </w:r>
       <w:r>
         <w:tab/>
@@ -18011,18 +18440,18 @@
           <wp:inline>
             <wp:extent cx="2552700" cy="2352675"/>
             <wp:effectExtent b="0" l="0" r="0" t="0"/>
-            <wp:docPr descr="Figure 8:  A three-dimensional scatter plot of the objective function values for basecase and 39 management scenarios, averaged over 28 water years (1991-2018). Larger spheres are shown for the Pareto-optimal set of scenarios. Scenario colors correspond to legend in Figures 6 and 7." title="" id="78" name="Picture"/>
+            <wp:docPr descr="Figure 8:  A three-dimensional scatter plot of the objective function values for basecase and 39 management scenarios, averaged over 28 water years (1991-2018). Larger spheres are shown for the Pareto-optimal set of scenarios. Scenario colors correspond to legend in Figures 6 and 7." title="" id="87" name="Picture"/>
             <a:graphic>
               <a:graphicData uri="http://schemas.openxmlformats.org/drawingml/2006/picture">
                 <pic:pic>
                   <pic:nvPicPr>
-                    <pic:cNvPr descr="Graphics%20and%20Supplements/hbf%20et%20infra%20plot3d_2026.02.19.jpg" id="79" name="Picture"/>
+                    <pic:cNvPr descr="Graphics%20and%20Supplements/hbf%20et%20infra%20plot3d_2026.02.19.jpg" id="88" name="Picture"/>
                     <pic:cNvPicPr>
                       <a:picLocks noChangeArrowheads="1" noChangeAspect="1"/>
                     </pic:cNvPicPr>
                   </pic:nvPicPr>
                   <pic:blipFill>
-                    <a:blip r:embed="rId77"/>
+                    <a:blip r:embed="rId86"/>
                     <a:stretch>
                       <a:fillRect/>
                     </a:stretch>
@@ -18053,8 +18482,8 @@
       <w:pPr>
         <w:pStyle w:val="ImageCaption"/>
       </w:pPr>
-      <w:bookmarkStart w:id="80" w:name="fig:farmerFishInfraFigure3D"/>
-      <w:bookmarkEnd w:id="80"/>
+      <w:bookmarkStart w:id="89" w:name="fig:farmerFishInfraFigure3D"/>
+      <w:bookmarkEnd w:id="89"/>
       <w:r>
         <w:t xml:space="preserve">Figure 8:</w:t>
       </w:r>
@@ -18072,8 +18501,8 @@
       <w:pPr>
         <w:pStyle w:val="TableCaption"/>
       </w:pPr>
-      <w:bookmarkStart w:id="81" w:name="tab:gspMgmtList"/>
-      <w:bookmarkEnd w:id="81"/>
+      <w:bookmarkStart w:id="90" w:name="tab:gspMgmtList"/>
+      <w:bookmarkEnd w:id="90"/>
       <w:r>
         <w:t xml:space="preserve">Table 7:</w:t>
       </w:r>
@@ -21066,9 +21495,9 @@
         <w:br w:type="page"/>
       </w:r>
     </w:p>
-    <w:bookmarkEnd w:id="82"/>
-    <w:bookmarkEnd w:id="83"/>
-    <w:bookmarkStart w:id="89" w:name="discussion"/>
+    <w:bookmarkEnd w:id="91"/>
+    <w:bookmarkEnd w:id="92"/>
+    <w:bookmarkStart w:id="98" w:name="discussion"/>
     <w:p>
       <w:pPr>
         <w:pStyle w:val="Heading1"/>
@@ -21127,7 +21556,7 @@
         <w:t xml:space="preserve">]. Though the ultimate future effect of these management actions would depend on climate variability and implementation details that have not been explicitly simulated (e.g., the precise location of pumps needed to divert surface water for the expanded enhanced recharge scenarios), it is possible to use objective functions and historical climate records to draw some high-level findings regarding their relative merits.</w:t>
       </w:r>
     </w:p>
-    <w:bookmarkStart w:id="84" w:name="Xa151cb59b4ad5c02348e31b83bab4d8169de230"/>
+    <w:bookmarkStart w:id="93" w:name="Xa151cb59b4ad5c02348e31b83bab4d8169de230"/>
     <w:p>
       <w:pPr>
         <w:pStyle w:val="Heading2"/>
@@ -21204,8 +21633,8 @@
         <w:t xml:space="preserve">These predicted on-the-ground consequences can facilitate interpretation of scenario results.</w:t>
       </w:r>
     </w:p>
-    <w:bookmarkEnd w:id="84"/>
-    <w:bookmarkStart w:id="85" w:name="Xeb4407dfc59ea709d91a13199c8e469abf09cea"/>
+    <w:bookmarkEnd w:id="93"/>
+    <w:bookmarkStart w:id="94" w:name="Xeb4407dfc59ea709d91a13199c8e469abf09cea"/>
     <w:p>
       <w:pPr>
         <w:pStyle w:val="Heading2"/>
@@ -21301,8 +21730,8 @@
         <w:t xml:space="preserve">), the low-coho year HB performance of various model scenarios is a key scenario differentiator.</w:t>
       </w:r>
     </w:p>
-    <w:bookmarkEnd w:id="85"/>
-    <w:bookmarkStart w:id="86" w:name="environmental-agricultural-trade-offs"/>
+    <w:bookmarkEnd w:id="94"/>
+    <w:bookmarkStart w:id="95" w:name="environmental-agricultural-trade-offs"/>
     <w:p>
       <w:pPr>
         <w:pStyle w:val="Heading2"/>
@@ -21578,8 +22007,8 @@
         <w:t xml:space="preserve">).</w:t>
       </w:r>
     </w:p>
-    <w:bookmarkEnd w:id="86"/>
-    <w:bookmarkStart w:id="87" w:name="Xb48c0b1c357814727cacf50afe35e98b0bf92dd"/>
+    <w:bookmarkEnd w:id="95"/>
+    <w:bookmarkStart w:id="96" w:name="Xb48c0b1c357814727cacf50afe35e98b0bf92dd"/>
     <w:p>
       <w:pPr>
         <w:pStyle w:val="Heading2"/>
@@ -21687,8 +22116,8 @@
         <w:t xml:space="preserve">). Although the GSP management priorities emphasized infrastructure, in a strict application of these objective functions, both infrastructure-based and regulatory approaches fell within the Pareto-optimal set of management options.</w:t>
       </w:r>
     </w:p>
-    <w:bookmarkEnd w:id="87"/>
-    <w:bookmarkStart w:id="88" w:name="policy-implications"/>
+    <w:bookmarkEnd w:id="96"/>
+    <w:bookmarkStart w:id="97" w:name="policy-implications"/>
     <w:p>
       <w:pPr>
         <w:pStyle w:val="Heading2"/>
@@ -21727,7 +22156,7 @@
         <w:pStyle w:val="Compact"/>
         <w:numPr>
           <w:ilvl w:val="0"/>
-          <w:numId w:val="1011"/>
+          <w:numId w:val="1009"/>
         </w:numPr>
       </w:pPr>
       <w:r>
@@ -21748,7 +22177,7 @@
         <w:pStyle w:val="Compact"/>
         <w:numPr>
           <w:ilvl w:val="0"/>
-          <w:numId w:val="1011"/>
+          <w:numId w:val="1009"/>
         </w:numPr>
       </w:pPr>
       <w:r>
@@ -21760,7 +22189,7 @@
         <w:pStyle w:val="Compact"/>
         <w:numPr>
           <w:ilvl w:val="0"/>
-          <w:numId w:val="1011"/>
+          <w:numId w:val="1009"/>
         </w:numPr>
       </w:pPr>
       <w:r>
@@ -21781,7 +22210,7 @@
         <w:pStyle w:val="Compact"/>
         <w:numPr>
           <w:ilvl w:val="0"/>
-          <w:numId w:val="1011"/>
+          <w:numId w:val="1009"/>
         </w:numPr>
       </w:pPr>
       <w:r>
@@ -21806,9 +22235,9 @@
         <w:t xml:space="preserve">).</w:t>
       </w:r>
     </w:p>
-    <w:bookmarkEnd w:id="88"/>
-    <w:bookmarkEnd w:id="89"/>
-    <w:bookmarkStart w:id="90" w:name="conclusion"/>
+    <w:bookmarkEnd w:id="97"/>
+    <w:bookmarkEnd w:id="98"/>
+    <w:bookmarkStart w:id="99" w:name="conclusion"/>
     <w:p>
       <w:pPr>
         <w:pStyle w:val="Heading1"/>
@@ -21872,8 +22301,8 @@
         <w:br w:type="page"/>
       </w:r>
     </w:p>
-    <w:bookmarkEnd w:id="90"/>
-    <w:bookmarkStart w:id="91" w:name="acknowledgments"/>
+    <w:bookmarkEnd w:id="99"/>
+    <w:bookmarkStart w:id="100" w:name="acknowledgments"/>
     <w:p>
       <w:pPr>
         <w:pStyle w:val="Heading1"/>
@@ -21882,8 +22311,8 @@
         <w:t xml:space="preserve">Acknowledgments</w:t>
       </w:r>
     </w:p>
-    <w:bookmarkEnd w:id="91"/>
-    <w:bookmarkStart w:id="155" w:name="references"/>
+    <w:bookmarkEnd w:id="100"/>
+    <w:bookmarkStart w:id="166" w:name="references"/>
     <w:p>
       <w:pPr>
         <w:pStyle w:val="Heading1"/>
@@ -21901,8 +22330,8 @@
         <w:t xml:space="preserve">References</w:t>
       </w:r>
     </w:p>
-    <w:bookmarkStart w:id="154" w:name="refs"/>
-    <w:bookmarkStart w:id="92" w:name="ref-AgrawalEtAlPREDICTING2005"/>
+    <w:bookmarkStart w:id="165" w:name="refs"/>
+    <w:bookmarkStart w:id="101" w:name="ref-AgrawalEtAlPREDICTING2005"/>
     <w:p>
       <w:pPr>
         <w:pStyle w:val="Bibliography"/>
@@ -21938,8 +22367,54 @@
         <w:t xml:space="preserve">National Marine Fisheries Service.</w:t>
       </w:r>
     </w:p>
-    <w:bookmarkEnd w:id="92"/>
-    <w:bookmarkStart w:id="94" w:name="ref-BorkHirokawaTrends2021"/>
+    <w:bookmarkEnd w:id="101"/>
+    <w:bookmarkStart w:id="103" w:name="ref-BaruchEtAlMimicking2024"/>
+    <w:p>
+      <w:pPr>
+        <w:pStyle w:val="Bibliography"/>
+      </w:pPr>
+      <w:r>
+        <w:t xml:space="preserve">Baruch, Ethan M., Sarah M. Yarnell, Theodore E. Grantham, Jessica R. Ayers, Andrew L. Rypel, and Robert A. Lusardi. 2024.</w:t>
+      </w:r>
+      <w:r>
+        <w:t xml:space="preserve"> </w:t>
+      </w:r>
+      <w:r>
+        <w:t xml:space="preserve">“Mimicking Functional Elements of the Natural Flow Regime Promotes Native Fish Recovery in a Regulated River.”</w:t>
+      </w:r>
+      <w:r>
+        <w:t xml:space="preserve"> </w:t>
+      </w:r>
+      <w:r>
+        <w:rPr>
+          <w:i/>
+          <w:iCs/>
+        </w:rPr>
+        <w:t xml:space="preserve">Ecological Applications</w:t>
+      </w:r>
+      <w:r>
+        <w:t xml:space="preserve"> </w:t>
+      </w:r>
+      <w:r>
+        <w:t xml:space="preserve">34 (6): e3013.</w:t>
+      </w:r>
+      <w:r>
+        <w:t xml:space="preserve"> </w:t>
+      </w:r>
+      <w:hyperlink r:id="rId102">
+        <w:r>
+          <w:rPr>
+            <w:rStyle w:val="Hyperlink"/>
+          </w:rPr>
+          <w:t xml:space="preserve">https://doi.org/10.1002/eap.3013</w:t>
+        </w:r>
+      </w:hyperlink>
+      <w:r>
+        <w:t xml:space="preserve">.</w:t>
+      </w:r>
+    </w:p>
+    <w:bookmarkEnd w:id="103"/>
+    <w:bookmarkStart w:id="105" w:name="ref-BorkHirokawaTrends2021"/>
     <w:p>
       <w:pPr>
         <w:pStyle w:val="Bibliography"/>
@@ -21981,7 +22456,7 @@
       <w:r>
         <w:t xml:space="preserve"> </w:t>
       </w:r>
-      <w:hyperlink r:id="rId93">
+      <w:hyperlink r:id="rId104">
         <w:r>
           <w:rPr>
             <w:rStyle w:val="Hyperlink"/>
@@ -21993,8 +22468,8 @@
         <w:t xml:space="preserve">.</w:t>
       </w:r>
     </w:p>
-    <w:bookmarkEnd w:id="94"/>
-    <w:bookmarkStart w:id="96" w:name="ref-BrownEtAlHistorical1994"/>
+    <w:bookmarkEnd w:id="105"/>
+    <w:bookmarkStart w:id="107" w:name="ref-BrownEtAlHistorical1994"/>
     <w:p>
       <w:pPr>
         <w:pStyle w:val="Bibliography"/>
@@ -22072,7 +22547,7 @@
       <w:r>
         <w:t xml:space="preserve"> </w:t>
       </w:r>
-      <w:hyperlink r:id="rId95">
+      <w:hyperlink r:id="rId106">
         <w:r>
           <w:rPr>
             <w:rStyle w:val="Hyperlink"/>
@@ -22084,8 +22559,8 @@
         <w:t xml:space="preserve">.</w:t>
       </w:r>
     </w:p>
-    <w:bookmarkEnd w:id="96"/>
-    <w:bookmarkStart w:id="97" w:name="X534406a913d453049af97ddf853e5acf00f7d45"/>
+    <w:bookmarkEnd w:id="107"/>
+    <w:bookmarkStart w:id="108" w:name="X534406a913d453049af97ddf853e5acf00f7d45"/>
     <w:p>
       <w:pPr>
         <w:pStyle w:val="Bibliography"/>
@@ -22115,8 +22590,8 @@
         <w:t xml:space="preserve">.”</w:t>
       </w:r>
     </w:p>
-    <w:bookmarkEnd w:id="97"/>
-    <w:bookmarkStart w:id="98" w:name="Xc89eae4adec15389bd12509e9457a9dc8c09d75"/>
+    <w:bookmarkEnd w:id="108"/>
+    <w:bookmarkStart w:id="109" w:name="Xc89eae4adec15389bd12509e9457a9dc8c09d75"/>
     <w:p>
       <w:pPr>
         <w:pStyle w:val="Bibliography"/>
@@ -22161,8 +22636,8 @@
         <w:t xml:space="preserve">.”</w:t>
       </w:r>
     </w:p>
-    <w:bookmarkEnd w:id="98"/>
-    <w:bookmarkStart w:id="99" w:name="X7c5765d4bf46367820355fe718939efb3be661f"/>
+    <w:bookmarkEnd w:id="109"/>
+    <w:bookmarkStart w:id="110" w:name="X7c5765d4bf46367820355fe718939efb3be661f"/>
     <w:p>
       <w:pPr>
         <w:pStyle w:val="Bibliography"/>
@@ -22223,8 +22698,8 @@
         <w:t xml:space="preserve">. https://data.cnra.ca.gov/dataset/statewide-crop-mapping/resource/3b57898b-f013-487a-b472-17f54311edb5.</w:t>
       </w:r>
     </w:p>
-    <w:bookmarkEnd w:id="99"/>
-    <w:bookmarkStart w:id="100" w:name="Xe7b7ad2022eadb255e299639b3100f5357e120c"/>
+    <w:bookmarkEnd w:id="110"/>
+    <w:bookmarkStart w:id="111" w:name="Xe7b7ad2022eadb255e299639b3100f5357e120c"/>
     <w:p>
       <w:pPr>
         <w:pStyle w:val="Bibliography"/>
@@ -22284,8 +22759,8 @@
         <w:t xml:space="preserve">Superior Court of Siskiyou County.</w:t>
       </w:r>
     </w:p>
-    <w:bookmarkEnd w:id="100"/>
-    <w:bookmarkStart w:id="101" w:name="X6ef878f889213098c200c5acad35595649e9db2"/>
+    <w:bookmarkEnd w:id="111"/>
+    <w:bookmarkStart w:id="112" w:name="X6ef878f889213098c200c5acad35595649e9db2"/>
     <w:p>
       <w:pPr>
         <w:pStyle w:val="Bibliography"/>
@@ -22327,8 +22802,8 @@
         <w:t xml:space="preserve">.”</w:t>
       </w:r>
     </w:p>
-    <w:bookmarkEnd w:id="101"/>
-    <w:bookmarkStart w:id="102" w:name="ref-CarpenterAccurately2024"/>
+    <w:bookmarkEnd w:id="112"/>
+    <w:bookmarkStart w:id="113" w:name="ref-CarpenterAccurately2024"/>
     <w:p>
       <w:pPr>
         <w:pStyle w:val="Bibliography"/>
@@ -22382,8 +22857,8 @@
         <w:t xml:space="preserve">Master’s thesis, University of California, Davis.</w:t>
       </w:r>
     </w:p>
-    <w:bookmarkEnd w:id="102"/>
-    <w:bookmarkStart w:id="104" w:name="ref-CarterSheafferAlfalfa1983"/>
+    <w:bookmarkEnd w:id="113"/>
+    <w:bookmarkStart w:id="115" w:name="ref-CarterSheafferAlfalfa1983"/>
     <w:p>
       <w:pPr>
         <w:pStyle w:val="Bibliography"/>
@@ -22503,7 +22978,7 @@
       <w:r>
         <w:t xml:space="preserve"> </w:t>
       </w:r>
-      <w:hyperlink r:id="rId103">
+      <w:hyperlink r:id="rId114">
         <w:r>
           <w:rPr>
             <w:rStyle w:val="Hyperlink"/>
@@ -22515,8 +22990,8 @@
         <w:t xml:space="preserve">.</w:t>
       </w:r>
     </w:p>
-    <w:bookmarkEnd w:id="104"/>
-    <w:bookmarkStart w:id="106" w:name="ref-CohonMarksMultiobjective1973"/>
+    <w:bookmarkEnd w:id="115"/>
+    <w:bookmarkStart w:id="117" w:name="ref-CohonMarksMultiobjective1973"/>
     <w:p>
       <w:pPr>
         <w:pStyle w:val="Bibliography"/>
@@ -22549,7 +23024,7 @@
       <w:r>
         <w:t xml:space="preserve"> </w:t>
       </w:r>
-      <w:hyperlink r:id="rId105">
+      <w:hyperlink r:id="rId116">
         <w:r>
           <w:rPr>
             <w:rStyle w:val="Hyperlink"/>
@@ -22561,8 +23036,8 @@
         <w:t xml:space="preserve">.</w:t>
       </w:r>
     </w:p>
-    <w:bookmarkEnd w:id="106"/>
-    <w:bookmarkStart w:id="107" w:name="ref-FogliaEtAlScott2013"/>
+    <w:bookmarkEnd w:id="117"/>
+    <w:bookmarkStart w:id="118" w:name="ref-FogliaEtAlScott2013"/>
     <w:p>
       <w:pPr>
         <w:pStyle w:val="Bibliography"/>
@@ -22619,8 +23094,8 @@
         <w:t xml:space="preserve">Davis, CA: North Coast Regional Water Quality Control Board.</w:t>
       </w:r>
     </w:p>
-    <w:bookmarkEnd w:id="107"/>
-    <w:bookmarkStart w:id="108" w:name="Xff198d1a9510a26c6b6a97c9924d7fdc8be1418"/>
+    <w:bookmarkEnd w:id="118"/>
+    <w:bookmarkStart w:id="119" w:name="Xff198d1a9510a26c6b6a97c9924d7fdc8be1418"/>
     <w:p>
       <w:pPr>
         <w:pStyle w:val="Bibliography"/>
@@ -22662,8 +23137,8 @@
         <w:t xml:space="preserve">Ventura, CA: Fox Canyon Groundwater Manegement Agency.</w:t>
       </w:r>
     </w:p>
-    <w:bookmarkEnd w:id="108"/>
-    <w:bookmarkStart w:id="110" w:name="ref-FreemanWICKED2000"/>
+    <w:bookmarkEnd w:id="119"/>
+    <w:bookmarkStart w:id="121" w:name="ref-FreemanWICKED2000"/>
     <w:p>
       <w:pPr>
         <w:pStyle w:val="Bibliography"/>
@@ -22711,7 +23186,7 @@
       <w:r>
         <w:t xml:space="preserve"> </w:t>
       </w:r>
-      <w:hyperlink r:id="rId109">
+      <w:hyperlink r:id="rId120">
         <w:r>
           <w:rPr>
             <w:rStyle w:val="Hyperlink"/>
@@ -22723,8 +23198,8 @@
         <w:t xml:space="preserve">.</w:t>
       </w:r>
     </w:p>
-    <w:bookmarkEnd w:id="110"/>
-    <w:bookmarkStart w:id="111" w:name="ref-HarterHinesSCOTT2008"/>
+    <w:bookmarkEnd w:id="121"/>
+    <w:bookmarkStart w:id="122" w:name="ref-HarterHinesSCOTT2008"/>
     <w:p>
       <w:pPr>
         <w:pStyle w:val="Bibliography"/>
@@ -22751,8 +23226,8 @@
         <w:t xml:space="preserve">University of California, Davis.</w:t>
       </w:r>
     </w:p>
-    <w:bookmarkEnd w:id="111"/>
-    <w:bookmarkStart w:id="113" w:name="ref-KapelanEtAlMultiobjective2005"/>
+    <w:bookmarkEnd w:id="122"/>
+    <w:bookmarkStart w:id="124" w:name="ref-KapelanEtAlMultiobjective2005"/>
     <w:p>
       <w:pPr>
         <w:pStyle w:val="Bibliography"/>
@@ -22785,7 +23260,7 @@
       <w:r>
         <w:t xml:space="preserve"> </w:t>
       </w:r>
-      <w:hyperlink r:id="rId112">
+      <w:hyperlink r:id="rId123">
         <w:r>
           <w:rPr>
             <w:rStyle w:val="Hyperlink"/>
@@ -22797,8 +23272,8 @@
         <w:t xml:space="preserve">.</w:t>
       </w:r>
     </w:p>
-    <w:bookmarkEnd w:id="113"/>
-    <w:bookmarkStart w:id="114" w:name="ref-KnechtleGiudice20192020"/>
+    <w:bookmarkEnd w:id="124"/>
+    <w:bookmarkStart w:id="125" w:name="ref-KnechtleGiudice20192020"/>
     <w:p>
       <w:pPr>
         <w:pStyle w:val="Bibliography"/>
@@ -22831,8 +23306,8 @@
         <w:t xml:space="preserve">.</w:t>
       </w:r>
     </w:p>
-    <w:bookmarkEnd w:id="114"/>
-    <w:bookmarkStart w:id="116" w:name="ref-KoubaEtAlWatershedSpecific2025"/>
+    <w:bookmarkEnd w:id="125"/>
+    <w:bookmarkStart w:id="127" w:name="ref-KoubaEtAlWatershedSpecific2025"/>
     <w:p>
       <w:pPr>
         <w:pStyle w:val="Bibliography"/>
@@ -22886,7 +23361,7 @@
       <w:r>
         <w:t xml:space="preserve"> </w:t>
       </w:r>
-      <w:hyperlink r:id="rId115">
+      <w:hyperlink r:id="rId126">
         <w:r>
           <w:rPr>
             <w:rStyle w:val="Hyperlink"/>
@@ -22898,8 +23373,8 @@
         <w:t xml:space="preserve">.</w:t>
       </w:r>
     </w:p>
-    <w:bookmarkEnd w:id="116"/>
-    <w:bookmarkStart w:id="118" w:name="ref-MackGeology1958"/>
+    <w:bookmarkEnd w:id="127"/>
+    <w:bookmarkStart w:id="129" w:name="ref-MackGeology1958"/>
     <w:p>
       <w:pPr>
         <w:pStyle w:val="Bibliography"/>
@@ -22949,7 +23424,7 @@
       <w:r>
         <w:t xml:space="preserve"> </w:t>
       </w:r>
-      <w:hyperlink r:id="rId117">
+      <w:hyperlink r:id="rId128">
         <w:r>
           <w:rPr>
             <w:rStyle w:val="Hyperlink"/>
@@ -22961,8 +23436,8 @@
         <w:t xml:space="preserve">.</w:t>
       </w:r>
     </w:p>
-    <w:bookmarkEnd w:id="118"/>
-    <w:bookmarkStart w:id="119" w:name="ref-MagranetScott2015a"/>
+    <w:bookmarkEnd w:id="129"/>
+    <w:bookmarkStart w:id="130" w:name="ref-MagranetScott2015a"/>
     <w:p>
       <w:pPr>
         <w:pStyle w:val="Bibliography"/>
@@ -22992,8 +23467,8 @@
         <w:t xml:space="preserve">Etna, CA: Siskiyou Resource Conservation District.</w:t>
       </w:r>
     </w:p>
-    <w:bookmarkEnd w:id="119"/>
-    <w:bookmarkStart w:id="120" w:name="ref-MagranetScott2017"/>
+    <w:bookmarkEnd w:id="130"/>
+    <w:bookmarkStart w:id="131" w:name="ref-MagranetScott2017"/>
     <w:p>
       <w:pPr>
         <w:pStyle w:val="Bibliography"/>
@@ -23023,8 +23498,8 @@
         <w:t xml:space="preserve">Etna, CA: Siskiyou Resource Conservation District.</w:t>
       </w:r>
     </w:p>
-    <w:bookmarkEnd w:id="120"/>
-    <w:bookmarkStart w:id="121" w:name="ref-MagranetScott2018"/>
+    <w:bookmarkEnd w:id="131"/>
+    <w:bookmarkStart w:id="132" w:name="ref-MagranetScott2018"/>
     <w:p>
       <w:pPr>
         <w:pStyle w:val="Bibliography"/>
@@ -23066,8 +23541,8 @@
         <w:t xml:space="preserve">Etna, CA: Siskiyou Resource Conservation District.</w:t>
       </w:r>
     </w:p>
-    <w:bookmarkEnd w:id="121"/>
-    <w:bookmarkStart w:id="122" w:name="ref-MagranetYokelScott2017"/>
+    <w:bookmarkEnd w:id="132"/>
+    <w:bookmarkStart w:id="133" w:name="ref-MagranetYokelScott2017"/>
     <w:p>
       <w:pPr>
         <w:pStyle w:val="Bibliography"/>
@@ -23109,8 +23584,8 @@
         <w:t xml:space="preserve">Etna, CA: Siskiyou Resource Conservation District.</w:t>
       </w:r>
     </w:p>
-    <w:bookmarkEnd w:id="122"/>
-    <w:bookmarkStart w:id="124" w:name="ref-MahoneyRoodStreamflow1998"/>
+    <w:bookmarkEnd w:id="133"/>
+    <w:bookmarkStart w:id="135" w:name="ref-MahoneyRoodStreamflow1998"/>
     <w:p>
       <w:pPr>
         <w:pStyle w:val="Bibliography"/>
@@ -23152,7 +23627,7 @@
       <w:r>
         <w:t xml:space="preserve"> </w:t>
       </w:r>
-      <w:hyperlink r:id="rId123">
+      <w:hyperlink r:id="rId134">
         <w:r>
           <w:rPr>
             <w:rStyle w:val="Hyperlink"/>
@@ -23164,8 +23639,8 @@
         <w:t xml:space="preserve">.</w:t>
       </w:r>
     </w:p>
-    <w:bookmarkEnd w:id="124"/>
-    <w:bookmarkStart w:id="125" w:name="ref-McMahonHabitat1983"/>
+    <w:bookmarkEnd w:id="135"/>
+    <w:bookmarkStart w:id="136" w:name="ref-McMahonHabitat1983"/>
     <w:p>
       <w:pPr>
         <w:pStyle w:val="Bibliography"/>
@@ -23213,8 +23688,8 @@
         <w:t xml:space="preserve">.</w:t>
       </w:r>
     </w:p>
-    <w:bookmarkEnd w:id="125"/>
-    <w:bookmarkStart w:id="127" w:name="ref-MonarchiEtAlInteractive1973"/>
+    <w:bookmarkEnd w:id="136"/>
+    <w:bookmarkStart w:id="138" w:name="ref-MonarchiEtAlInteractive1973"/>
     <w:p>
       <w:pPr>
         <w:pStyle w:val="Bibliography"/>
@@ -23259,7 +23734,7 @@
       <w:r>
         <w:t xml:space="preserve"> </w:t>
       </w:r>
-      <w:hyperlink r:id="rId126">
+      <w:hyperlink r:id="rId137">
         <w:r>
           <w:rPr>
             <w:rStyle w:val="Hyperlink"/>
@@ -23271,8 +23746,8 @@
         <w:t xml:space="preserve">.</w:t>
       </w:r>
     </w:p>
-    <w:bookmarkEnd w:id="127"/>
-    <w:bookmarkStart w:id="128" w:name="ref-MoyleCoho2002"/>
+    <w:bookmarkEnd w:id="138"/>
+    <w:bookmarkStart w:id="139" w:name="ref-MoyleCoho2002"/>
     <w:p>
       <w:pPr>
         <w:pStyle w:val="Bibliography"/>
@@ -23375,8 +23850,8 @@
         <w:t xml:space="preserve">, 245–51. University of California Press.</w:t>
       </w:r>
     </w:p>
-    <w:bookmarkEnd w:id="128"/>
-    <w:bookmarkStart w:id="130" w:name="ref-NordgrenEtAlSupporting2016"/>
+    <w:bookmarkEnd w:id="139"/>
+    <w:bookmarkStart w:id="141" w:name="ref-NordgrenEtAlSupporting2016"/>
     <w:p>
       <w:pPr>
         <w:pStyle w:val="Bibliography"/>
@@ -23421,7 +23896,7 @@
       <w:r>
         <w:t xml:space="preserve"> </w:t>
       </w:r>
-      <w:hyperlink r:id="rId129">
+      <w:hyperlink r:id="rId140">
         <w:r>
           <w:rPr>
             <w:rStyle w:val="Hyperlink"/>
@@ -23433,8 +23908,8 @@
         <w:t xml:space="preserve">.</w:t>
       </w:r>
     </w:p>
-    <w:bookmarkEnd w:id="130"/>
-    <w:bookmarkStart w:id="132" w:name="ref-OhlbergerEtAlEffects2018"/>
+    <w:bookmarkEnd w:id="141"/>
+    <w:bookmarkStart w:id="143" w:name="ref-OhlbergerEtAlEffects2018"/>
     <w:p>
       <w:pPr>
         <w:pStyle w:val="Bibliography"/>
@@ -23467,7 +23942,7 @@
       <w:r>
         <w:t xml:space="preserve"> </w:t>
       </w:r>
-      <w:hyperlink r:id="rId131">
+      <w:hyperlink r:id="rId142">
         <w:r>
           <w:rPr>
             <w:rStyle w:val="Hyperlink"/>
@@ -23479,8 +23954,8 @@
         <w:t xml:space="preserve">.</w:t>
       </w:r>
     </w:p>
-    <w:bookmarkEnd w:id="132"/>
-    <w:bookmarkStart w:id="133" w:name="ref-ParetoCours1896"/>
+    <w:bookmarkEnd w:id="143"/>
+    <w:bookmarkStart w:id="144" w:name="ref-ParetoCours1896"/>
     <w:p>
       <w:pPr>
         <w:pStyle w:val="Bibliography"/>
@@ -23530,8 +24005,8 @@
         <w:t xml:space="preserve">. Lausanne.</w:t>
       </w:r>
     </w:p>
-    <w:bookmarkEnd w:id="133"/>
-    <w:bookmarkStart w:id="135" w:name="ref-PattersonEtAlHydrologic2020"/>
+    <w:bookmarkEnd w:id="144"/>
+    <w:bookmarkStart w:id="146" w:name="ref-PattersonEtAlHydrologic2020"/>
     <w:p>
       <w:pPr>
         <w:pStyle w:val="Bibliography"/>
@@ -23564,7 +24039,7 @@
       <w:r>
         <w:t xml:space="preserve"> </w:t>
       </w:r>
-      <w:hyperlink r:id="rId134">
+      <w:hyperlink r:id="rId145">
         <w:r>
           <w:rPr>
             <w:rStyle w:val="Hyperlink"/>
@@ -23576,8 +24051,8 @@
         <w:t xml:space="preserve">.</w:t>
       </w:r>
     </w:p>
-    <w:bookmarkEnd w:id="135"/>
-    <w:bookmarkStart w:id="136" w:name="X35601437fc25b0fdd92b478f2f9ddeaed3398df"/>
+    <w:bookmarkEnd w:id="146"/>
+    <w:bookmarkStart w:id="147" w:name="X35601437fc25b0fdd92b478f2f9ddeaed3398df"/>
     <w:p>
       <w:pPr>
         <w:pStyle w:val="Bibliography"/>
@@ -23625,8 +24100,8 @@
         <w:t xml:space="preserve">.”</w:t>
       </w:r>
     </w:p>
-    <w:bookmarkEnd w:id="136"/>
-    <w:bookmarkStart w:id="137" w:name="X334218043bd9d5b07a848a610917fcfef0168db"/>
+    <w:bookmarkEnd w:id="147"/>
+    <w:bookmarkStart w:id="148" w:name="X334218043bd9d5b07a848a610917fcfef0168db"/>
     <w:p>
       <w:pPr>
         <w:pStyle w:val="Bibliography"/>
@@ -23656,8 +24131,8 @@
         <w:t xml:space="preserve">Siskiyou County.</w:t>
       </w:r>
     </w:p>
-    <w:bookmarkEnd w:id="137"/>
-    <w:bookmarkStart w:id="138" w:name="ref-SiskiyouCountyScott2021"/>
+    <w:bookmarkEnd w:id="148"/>
+    <w:bookmarkStart w:id="149" w:name="ref-SiskiyouCountyScott2021"/>
     <w:p>
       <w:pPr>
         <w:pStyle w:val="Bibliography"/>
@@ -23681,8 +24156,8 @@
         <w:t xml:space="preserve">.”</w:t>
       </w:r>
     </w:p>
-    <w:bookmarkEnd w:id="138"/>
-    <w:bookmarkStart w:id="139" w:name="X15105b7917297e4641cb2d2cfd1651756f7bcb0"/>
+    <w:bookmarkEnd w:id="149"/>
+    <w:bookmarkStart w:id="150" w:name="X15105b7917297e4641cb2d2cfd1651756f7bcb0"/>
     <w:p>
       <w:pPr>
         <w:pStyle w:val="Bibliography"/>
@@ -23721,8 +24196,8 @@
         <w:t xml:space="preserve">Fort Jones, CA: Siskiyou County.</w:t>
       </w:r>
     </w:p>
-    <w:bookmarkEnd w:id="139"/>
-    <w:bookmarkStart w:id="140" w:name="X2560a5ce8c29a4d10823717cd7284f11df015d4"/>
+    <w:bookmarkEnd w:id="150"/>
+    <w:bookmarkStart w:id="151" w:name="X2560a5ce8c29a4d10823717cd7284f11df015d4"/>
     <w:p>
       <w:pPr>
         <w:pStyle w:val="Bibliography"/>
@@ -23782,8 +24257,8 @@
         <w:t xml:space="preserve">{{NOTICE OF APPROVAL OF EMERGENCY REGULATORY ACTION}} OAL 2021-0820-05.</w:t>
       </w:r>
     </w:p>
-    <w:bookmarkEnd w:id="140"/>
-    <w:bookmarkStart w:id="141" w:name="Xc65d78564b05799285cd4578f858a1851ca0d64"/>
+    <w:bookmarkEnd w:id="151"/>
+    <w:bookmarkStart w:id="152" w:name="Xc65d78564b05799285cd4578f858a1851ca0d64"/>
     <w:p>
       <w:pPr>
         <w:pStyle w:val="Bibliography"/>
@@ -23855,8 +24330,8 @@
         <w:t xml:space="preserve">{{NOTICE OF APPROVAL OF EMERGENCY REGULATORY ACTION}} OAL 2024-0123-03.</w:t>
       </w:r>
     </w:p>
-    <w:bookmarkEnd w:id="141"/>
-    <w:bookmarkStart w:id="142" w:name="Xa7b10fbb32571a990cee2341e679d296b855974"/>
+    <w:bookmarkEnd w:id="152"/>
+    <w:bookmarkStart w:id="153" w:name="Xa7b10fbb32571a990cee2341e679d296b855974"/>
     <w:p>
       <w:pPr>
         <w:pStyle w:val="Bibliography"/>
@@ -23892,8 +24367,8 @@
         <w:t xml:space="preserve">2024-0036.</w:t>
       </w:r>
     </w:p>
-    <w:bookmarkEnd w:id="142"/>
-    <w:bookmarkStart w:id="144" w:name="ref-SundingMeasuring1996"/>
+    <w:bookmarkEnd w:id="153"/>
+    <w:bookmarkStart w:id="155" w:name="ref-SundingMeasuring1996"/>
     <w:p>
       <w:pPr>
         <w:pStyle w:val="Bibliography"/>
@@ -23947,7 +24422,7 @@
       <w:r>
         <w:t xml:space="preserve"> </w:t>
       </w:r>
-      <w:hyperlink r:id="rId143">
+      <w:hyperlink r:id="rId154">
         <w:r>
           <w:rPr>
             <w:rStyle w:val="Hyperlink"/>
@@ -23959,8 +24434,8 @@
         <w:t xml:space="preserve">.</w:t>
       </w:r>
     </w:p>
-    <w:bookmarkEnd w:id="144"/>
-    <w:bookmarkStart w:id="146" w:name="ref-TolleyEtAlSensitivity2019"/>
+    <w:bookmarkEnd w:id="155"/>
+    <w:bookmarkStart w:id="157" w:name="ref-TolleyEtAlSensitivity2019"/>
     <w:p>
       <w:pPr>
         <w:pStyle w:val="Bibliography"/>
@@ -24050,7 +24525,7 @@
       <w:r>
         <w:t xml:space="preserve"> </w:t>
       </w:r>
-      <w:hyperlink r:id="rId145">
+      <w:hyperlink r:id="rId156">
         <w:r>
           <w:rPr>
             <w:rStyle w:val="Hyperlink"/>
@@ -24062,8 +24537,8 @@
         <w:t xml:space="preserve">.</w:t>
       </w:r>
     </w:p>
-    <w:bookmarkEnd w:id="146"/>
-    <w:bookmarkStart w:id="148" w:name="ref-VanSteenbergenPromoting2006"/>
+    <w:bookmarkEnd w:id="157"/>
+    <w:bookmarkStart w:id="159" w:name="ref-VanSteenbergenPromoting2006"/>
     <w:p>
       <w:pPr>
         <w:pStyle w:val="Bibliography"/>
@@ -24096,7 +24571,7 @@
       <w:r>
         <w:t xml:space="preserve"> </w:t>
       </w:r>
-      <w:hyperlink r:id="rId147">
+      <w:hyperlink r:id="rId158">
         <w:r>
           <w:rPr>
             <w:rStyle w:val="Hyperlink"/>
@@ -24108,8 +24583,8 @@
         <w:t xml:space="preserve">.</w:t>
       </w:r>
     </w:p>
-    <w:bookmarkEnd w:id="148"/>
-    <w:bookmarkStart w:id="150" w:name="ref-YarnellEtAlFunctional2015"/>
+    <w:bookmarkEnd w:id="159"/>
+    <w:bookmarkStart w:id="161" w:name="ref-YarnellEtAlFunctional2015"/>
     <w:p>
       <w:pPr>
         <w:pStyle w:val="Bibliography"/>
@@ -24193,7 +24668,7 @@
       <w:r>
         <w:t xml:space="preserve"> </w:t>
       </w:r>
-      <w:hyperlink r:id="rId149">
+      <w:hyperlink r:id="rId160">
         <w:r>
           <w:rPr>
             <w:rStyle w:val="Hyperlink"/>
@@ -24205,8 +24680,8 @@
         <w:t xml:space="preserve">.</w:t>
       </w:r>
     </w:p>
-    <w:bookmarkEnd w:id="150"/>
-    <w:bookmarkStart w:id="152" w:name="ref-YehBeckerMultiobjective1982"/>
+    <w:bookmarkEnd w:id="161"/>
+    <w:bookmarkStart w:id="163" w:name="ref-YehBeckerMultiobjective1982"/>
     <w:p>
       <w:pPr>
         <w:pStyle w:val="Bibliography"/>
@@ -24239,7 +24714,7 @@
       <w:r>
         <w:t xml:space="preserve"> </w:t>
       </w:r>
-      <w:hyperlink r:id="rId151">
+      <w:hyperlink r:id="rId162">
         <w:r>
           <w:rPr>
             <w:rStyle w:val="Hyperlink"/>
@@ -24251,8 +24726,8 @@
         <w:t xml:space="preserve">.</w:t>
       </w:r>
     </w:p>
-    <w:bookmarkEnd w:id="152"/>
-    <w:bookmarkStart w:id="153" w:name="X8bf5592004e543b04dfcfc3edb39663c8006d78"/>
+    <w:bookmarkEnd w:id="163"/>
+    <w:bookmarkStart w:id="164" w:name="X8bf5592004e543b04dfcfc3edb39663c8006d78"/>
     <w:p>
       <w:pPr>
         <w:pStyle w:val="Bibliography"/>
@@ -24282,15 +24757,15 @@
         <w:t xml:space="preserve">Woodland, CA.</w:t>
       </w:r>
     </w:p>
-    <w:bookmarkEnd w:id="153"/>
-    <w:bookmarkEnd w:id="154"/>
+    <w:bookmarkEnd w:id="164"/>
+    <w:bookmarkEnd w:id="165"/>
     <w:p>
       <w:r>
         <w:br w:type="page"/>
       </w:r>
     </w:p>
-    <w:bookmarkEnd w:id="155"/>
-    <w:bookmarkStart w:id="156" w:name="X6c1a78753bbdca554aba589b0aa85ab8ac746bf"/>
+    <w:bookmarkEnd w:id="166"/>
+    <w:bookmarkStart w:id="167" w:name="X6c1a78753bbdca554aba589b0aa85ab8ac746bf"/>
     <w:p>
       <w:pPr>
         <w:pStyle w:val="Heading1"/>
@@ -24497,7 +24972,7 @@
         <w:t xml:space="preserve">Consequently, only LASSO models dependent on hydrologic variables were evaluated as potential tools to forecast the outcomes of flow change on fish reproduction.</w:t>
       </w:r>
     </w:p>
-    <w:bookmarkEnd w:id="156"/>
+    <w:bookmarkEnd w:id="167"/>
     <w:sectPr>
       <w:footnotePr>
         <w:numRestart w:val="eachSect"/>
@@ -24976,6 +25451,9 @@
     <w:abstractNumId w:val="991"/>
   </w:num>
   <w:num w:numId="1003">
+    <w:abstractNumId w:val="991"/>
+  </w:num>
+  <w:num w:numId="1004">
     <w:abstractNumId w:val="99421"/>
     <w:lvlOverride w:ilvl="0">
       <w:startOverride w:val="1"/>
@@ -25005,7 +25483,7 @@
       <w:startOverride w:val="1"/>
     </w:lvlOverride>
   </w:num>
-  <w:num w:numId="1004">
+  <w:num w:numId="1005">
     <w:abstractNumId w:val="99410"/>
     <w:lvlOverride w:ilvl="0">
       <w:startOverride w:val="0"/>
@@ -25035,7 +25513,7 @@
       <w:startOverride w:val="0"/>
     </w:lvlOverride>
   </w:num>
-  <w:num w:numId="1005">
+  <w:num w:numId="1006">
     <w:abstractNumId w:val="99411"/>
     <w:lvlOverride w:ilvl="0">
       <w:startOverride w:val="1"/>
@@ -25065,9 +25543,6 @@
       <w:startOverride w:val="1"/>
     </w:lvlOverride>
   </w:num>
-  <w:num w:numId="1006">
-    <w:abstractNumId w:val="991"/>
-  </w:num>
   <w:num w:numId="1007">
     <w:abstractNumId w:val="991"/>
   </w:num>
@@ -25075,12 +25550,6 @@
     <w:abstractNumId w:val="991"/>
   </w:num>
   <w:num w:numId="1009">
-    <w:abstractNumId w:val="991"/>
-  </w:num>
-  <w:num w:numId="1010">
-    <w:abstractNumId w:val="991"/>
-  </w:num>
-  <w:num w:numId="1011">
     <w:abstractNumId w:val="991"/>
   </w:num>
 </w:numbering>

</xml_diff>

<commit_message>
through discussion. on to conclusion. NEARLY THERE
</commit_message>
<xml_diff>
--- a/Kouba_Fish_and_Ag_Benefit_MS.docx
+++ b/Kouba_Fish_and_Ag_Benefit_MS.docx
@@ -5458,7 +5458,7 @@
         <w:t xml:space="preserve">4</w:t>
       </w:r>
       <w:r>
-        <w:t xml:space="preserve">). Within each category various details were altered (e.g., an alfalfa irrigation cessation date of July 10 versus August 15). Additional scenario descriptions are included below in Results and in Supplement E.</w:t>
+        <w:t xml:space="preserve">). Within each category various details were altered (e.g., an alfalfa irrigation cessation date of July 10 versus August 15). Additional scenario descriptions are included below in Results and in Supplement A.</w:t>
       </w:r>
     </w:p>
     <w:p>
@@ -8300,7 +8300,7 @@
                 <w:szCs w:val="22"/>
                 <w:color w:val="000000"/>
               </w:rPr>
-              <w:t xml:space="preserve">Highlighted in text and Supp. A</w:t>
+              <w:t xml:space="preserve">Highlighted in text and Supp. B</w:t>
             </w:r>
           </w:p>
         </w:tc>
@@ -8344,7 +8344,7 @@
                 <w:szCs w:val="22"/>
                 <w:color w:val="000000"/>
               </w:rPr>
-              <w:t xml:space="preserve">Supplement C</w:t>
+              <w:t xml:space="preserve">Supplement D</w:t>
             </w:r>
           </w:p>
         </w:tc>
@@ -8438,7 +8438,7 @@
                 <w:szCs w:val="22"/>
                 <w:color w:val="000000"/>
               </w:rPr>
-              <w:t xml:space="preserve">Supplement B</w:t>
+              <w:t xml:space="preserve">Supplement C</w:t>
             </w:r>
           </w:p>
         </w:tc>
@@ -8482,7 +8482,7 @@
                 <w:szCs w:val="22"/>
                 <w:color w:val="000000"/>
               </w:rPr>
-              <w:t xml:space="preserve">Supplement D</w:t>
+              <w:t xml:space="preserve">Supplement E</w:t>
             </w:r>
           </w:p>
         </w:tc>
@@ -8619,7 +8619,7 @@
         <w:t xml:space="preserve">3</w:t>
       </w:r>
       <w:r>
-        <w:t xml:space="preserve">; see Supplement A for tabulated, untransformed functional flow values).</w:t>
+        <w:t xml:space="preserve">; see Supplement B for tabulated, untransformed functional flow values).</w:t>
       </w:r>
     </w:p>
     <w:p>
@@ -8639,7 +8639,7 @@
         <w:t xml:space="preserve"> </w:t>
       </w:r>
       <w:r>
-        <w:t xml:space="preserve">For coho, in both absolute and spawner-normalized smolt units, the high-importance flows were fall-to-wet season transition metrics; for units of absolute smolt abundance, the spring recession rate was also important (Supplements A and B, Table 1). For Chinook, in both absolute and spawner-normalized smolt units, the wet season baseflow median magnitude was of greatest importance; for normalized smolt units, maximum spring recession rate was also selected (Supplements C and D, Table 1). Effectively, in the context of LASSO regression, the flows that explain the most variation in smolt production (with minimal overfitting, as determined by k-fold validation) were related to, for coho, the timing of wet season onset and the magnitude of changes in fall flows; and for Chinook, the wet season baseflow.</w:t>
+        <w:t xml:space="preserve">For coho, in both absolute and spawner-normalized smolt units, the high-importance flows were fall-to-wet season transition metrics; for units of absolute smolt abundance, the spring recession rate was also important (Supplements B and C , Table 1). For Chinook, in both absolute and spawner-normalized smolt units, the wet season baseflow median magnitude was of greatest importance; for normalized smolt units, maximum spring recession rate was also selected (Supplements D and E, Table 1). Effectively, in the context of LASSO regression, the flows that explain the most variation in smolt production (with minimal overfitting, as determined by k-fold validation) were related to, for coho, the timing of wet season onset and the magnitude of changes in fall flows; and for Chinook, the wet season baseflow.</w:t>
       </w:r>
     </w:p>
     <w:bookmarkEnd w:id="59"/>
@@ -8687,7 +8687,7 @@
         <w:t xml:space="preserve"> </w:t>
       </w:r>
       <w:r>
-        <w:t xml:space="preserve">and Supplements A-D, Figure 1).</w:t>
+        <w:t xml:space="preserve">and Supplements B-E, Figure 1).</w:t>
       </w:r>
     </w:p>
     <w:p>
@@ -8719,7 +8719,7 @@
           <wp:inline>
             <wp:extent cx="5334000" cy="5000625"/>
             <wp:effectExtent b="0" l="0" r="0" t="0"/>
-            <wp:docPr descr="Figure 5:  Comparison of annual performance in two objective functions (Hydrologic Benefit and ET, representing environmental and agricultural objectives, respectively) for brood years 1991-2025. The scenarios pictured are basecase (black circles) and a scenario from each of three categories: Enhanced Recharge, Crop Change, and eight thousand acres of irrigated crops converted to low-ET Native Vegetation. Dry-type water years (vertical bars) are 1991, ’92, ’94, 2001, ’09, ’13, ’14, ’18, and ’20-’22. Shown also in Supplement A." title="" id="61" name="Picture"/>
+            <wp:docPr descr="Figure 5:  Comparison of annual performance in two objective functions (Hydrologic Benefit and ET, representing environmental and agricultural objectives, respectively) for brood years 1991-2025. The scenarios pictured are basecase (black circles) and a scenario from each of three categories: Enhanced Recharge, Crop Change, and eight thousand acres of irrigated crops converted to low-ET Native Vegetation. Dry-type water years (vertical bars) are 1991, ’92, ’94, 2001, ’09, ’13, ’14, ’18, and ’20-’22. Shown also in Supplement B." title="" id="61" name="Picture"/>
             <a:graphic>
               <a:graphicData uri="http://schemas.openxmlformats.org/drawingml/2006/picture">
                 <pic:pic>
@@ -8773,7 +8773,7 @@
         <w:t xml:space="preserve"> </w:t>
       </w:r>
       <w:r>
-        <w:t xml:space="preserve">Comparison of annual performance in two objective functions (Hydrologic Benefit and ET, representing environmental and agricultural objectives, respectively) for brood years 1991-2025. The scenarios pictured are basecase (black circles) and a scenario from each of three categories: Enhanced Recharge, Crop Change, and eight thousand acres of irrigated crops converted to low-ET Native Vegetation. Dry-type water years (vertical bars) are 1991, ’92, ’94, 2001, ’09, ’13, ’14, ’18, and ’20-’22. Shown also in Supplement A.</w:t>
+        <w:t xml:space="preserve">Comparison of annual performance in two objective functions (Hydrologic Benefit and ET, representing environmental and agricultural objectives, respectively) for brood years 1991-2025. The scenarios pictured are basecase (black circles) and a scenario from each of three categories: Enhanced Recharge, Crop Change, and eight thousand acres of irrigated crops converted to low-ET Native Vegetation. Dry-type water years (vertical bars) are 1991, ’92, ’94, 2001, ’09, ’13, ’14, ’18, and ’20-’22. Shown also in Supplement B.</w:t>
       </w:r>
     </w:p>
     <w:p>
@@ -8781,7 +8781,7 @@
         <w:pStyle w:val="BodyText"/>
       </w:pPr>
       <w:r>
-        <w:t xml:space="preserve">The small effect of some scenarios on HB values implies that these scenarios do not alter the HB function component flows relative to basecase (Supplements A-D, Figure 2). For coho juvenile abundance, in the basecase scenario, it seems that when the HB function predicts a particularly good year (i.e., &gt; 20,000 coho smolt-equiv.), it is driven by a large magnitude fall flow difference, or fall pulse. Conversely, in the years where the HB function predicts a particularly bad year (i.e., ’95, ’98, ’04), it is driven by a rapid first spring recession rate (Supplement A, Figure 2). Conversely, for coho juveniles per spawner (basecase), both good and bad years seem to be largely driven by wet season onset timing (Supplement B, Figure 2).</w:t>
+        <w:t xml:space="preserve">The small effect of some scenarios on HB values implies that these scenarios do not alter the HB function component flows relative to basecase (Supplements B-E, Figure 2). For coho juvenile abundance, in the basecase scenario, it seems that when the HB function predicts a particularly good year (i.e., &gt; 20,000 coho smolt-equiv.), it is driven by a large magnitude fall flow difference, or fall pulse. Conversely, in the years where the HB function predicts a particularly bad year (i.e., ’95, ’98, ’04), it is driven by a rapid first spring recession rate (Supplement B, Figure 2). Conversely, for coho juveniles per spawner (basecase), both good and bad years seem to be largely driven by wet season onset timing (Supplement C, Figure 2).</w:t>
       </w:r>
     </w:p>
     <w:p>
@@ -8789,7 +8789,7 @@
         <w:pStyle w:val="BodyText"/>
       </w:pPr>
       <w:r>
-        <w:t xml:space="preserve">In both cases for coho, second fall flow difference makes minor contributions (Supplements A and B, Figure 2), and is assigned a negative coefficient (Table</w:t>
+        <w:t xml:space="preserve">In both cases for coho, second fall flow difference makes minor contributions (Supplements B and C , Figure 2), and is assigned a negative coefficient (Table</w:t>
       </w:r>
       <w:r>
         <w:t xml:space="preserve"> </w:t>
@@ -8806,7 +8806,7 @@
         <w:pStyle w:val="BodyText"/>
       </w:pPr>
       <w:r>
-        <w:t xml:space="preserve">For Chinook, predictions of both high and low smolt production are driven by wet season baseflow magnitude (with a small contribution from maximum spring recession rate for juveniles per adult): high wet season flows are associated with lower smolt abundance (Supplements C and D, Figure 2).</w:t>
+        <w:t xml:space="preserve">For Chinook, predictions of both high and low smolt production are driven by wet season baseflow magnitude (with a small contribution from maximum spring recession rate for juveniles per adult): high wet season flows are associated with lower smolt abundance (Supplements D and E, Figure 2).</w:t>
       </w:r>
     </w:p>
     <w:bookmarkEnd w:id="64"/>
@@ -17191,7 +17191,7 @@
         <w:t xml:space="preserve"> </w:t>
       </w:r>
       <w:r>
-        <w:t xml:space="preserve">(see also Supplement A, Table 3, and Supplement E, Figure 2). The high degree of correlation between this flow and coho smolt abundance is corroborated by the species’ natural history: fall run timing is somewhat more flexible for coho than Chinook, and coho seem to respond strongly to pulse flows, possibly due to olfactory signals from their natal streams</w:t>
+        <w:t xml:space="preserve">(see also Supplement B, Table 3, and Supplement B, Figure 2). The high degree of correlation between this flow and coho smolt abundance is corroborated by the species’ natural history: fall run timing is somewhat more flexible for coho than Chinook, and coho seem to respond strongly to pulse flows, possibly due to olfactory signals from their natal streams</w:t>
       </w:r>
       <w:r>
         <w:t xml:space="preserve"> </w:t>
@@ -17289,7 +17289,7 @@
         <w:t xml:space="preserve">6</w:t>
       </w:r>
       <w:r>
-        <w:t xml:space="preserve">, green squares, and Supplements A and B, Figure 3). Reservoir scenarios seem to help Chinook significantly more than coho: even a small reservoir on one tributary appears to dampen wet season stormflows enough to benefit Chinook (Supplements C and D, Figure 3).</w:t>
+        <w:t xml:space="preserve">, green squares, and Supplements B and C, Figure 3). Reservoir scenarios seem to help Chinook significantly more than coho: even a small reservoir on one tributary appears to dampen wet season stormflows enough to benefit Chinook (Supplements D and E, Figure 3).</w:t>
       </w:r>
     </w:p>
     <w:bookmarkEnd w:id="70"/>
@@ -17378,7 +17378,7 @@
         <w:t xml:space="preserve"> </w:t>
       </w:r>
       <w:r>
-        <w:t xml:space="preserve">(1395 acres; see Supplement E for map of recharge areas).</w:t>
+        <w:t xml:space="preserve">(1395 acres; see Supplement A for map of recharge areas).</w:t>
       </w:r>
     </w:p>
     <w:p>
@@ -17407,7 +17407,7 @@
         <w:t xml:space="preserve">6</w:t>
       </w:r>
       <w:r>
-        <w:t xml:space="preserve">; see also Supplements A-D, Figure 3). The lack of farmer cost is by design; this management strategy is intended to avoid any impacts on growing season operations.</w:t>
+        <w:t xml:space="preserve">; see also Supplements B-E, Figure 3). The lack of farmer cost is by design; this management strategy is intended to avoid any impacts on growing season operations.</w:t>
       </w:r>
     </w:p>
     <w:p>
@@ -17435,7 +17435,7 @@
       </w:r>
     </w:p>
     <w:bookmarkEnd w:id="71"/>
-    <w:bookmarkStart w:id="72" w:name="Xc70080cdc051cfe4afcf6c382a6d95ca648272b"/>
+    <w:bookmarkStart w:id="72" w:name="irrigation-curtailment-alfalfa-all-crops"/>
     <w:p>
       <w:pPr>
         <w:pStyle w:val="Heading3"/>
@@ -17450,7 +17450,7 @@
         <w:tab/>
       </w:r>
       <w:r>
-        <w:t xml:space="preserve">Alfalfa Irrigation and Total Irrigation Curtailment</w:t>
+        <w:t xml:space="preserve">Irrigation Curtailment (alfalfa; all crops)</w:t>
       </w:r>
     </w:p>
     <w:p>
@@ -17502,7 +17502,7 @@
         <w:pStyle w:val="BodyText"/>
       </w:pPr>
       <w:r>
-        <w:t xml:space="preserve">In general, this series of cutoff dates has a progressive effect on fall flows: the earlier the cutoff date, the greater the impact on raising summer low flows, producing earlier fall flow increases, and slowing the spring recession rate (see alfalfa scenario flow results in Supplement E, Figure 2). For Chinook HB units, the impact on HB values is similarly progressive (Supplements C and D, Table 2 and Figure 3), but for coho units, the impact on HB values is more variable, since management scenarios may have a positive or negative effect on a</w:t>
+        <w:t xml:space="preserve">In general, this series of cutoff dates has a progressive effect on fall flows: the earlier the cutoff date, the greater the impact on raising summer low flows, producing earlier fall flow increases, and slowing the spring recession rate (see alfalfa scenario flow results in Supplement A, Figure 2). For Chinook HB units, the impact on HB values is similarly progressive (Supplements D and E, Table 2 and Figure 3), but for coho units, the impact on HB values is more variable, since management scenarios may have a positive or negative effect on a</w:t>
       </w:r>
       <w:r>
         <w:t xml:space="preserve"> </w:t>
@@ -17684,7 +17684,7 @@
         <w:pStyle w:val="FirstParagraph"/>
       </w:pPr>
       <w:r>
-        <w:t xml:space="preserve">The two categories of Native Vegetation scenario are two end-member answers to the question: if currently-cultivated land were converted to native vegetation, what water consumption pattern would replace it? The high-ET vegetation is designed to be analogous to well-watered riparian plants or deep-rooted trees, while low-ET vegetation represents something like chaparral or grasslands. All of these vegetation types are found in various places within the Scott River watershed.</w:t>
+        <w:t xml:space="preserve">The two categories of Native Vegetation scenario (NatVegL and NatVegH, for low and and high ET) are two end-member answers to the question: if currently-cultivated land were converted to native vegetation, what water consumption pattern would replace it? The first category (NatVeg) assumes a native vegetation crop coefficient of 0.6, while the second category (NatVegET) assumes a native vegetation crop coefficient of 1.0 and a maximum rooting depth of 4.5 m. The first category could be interpreted as chaparral or sage scrub-type vegetation cover, while the second category could represent a mixed bunchgrass and clover prairie with extensive riparian vegetation corridors and wetlands.</w:t>
       </w:r>
     </w:p>
     <w:p>
@@ -17692,23 +17692,7 @@
         <w:pStyle w:val="BodyText"/>
       </w:pPr>
       <w:r>
-        <w:t xml:space="preserve">On average, area-normalized ET from native vegetation is 36 cm/year (42% of average annual crop ET). Simulating native vegetation in place of irrigated acreage results in a greater proportion of water leaving the SVIHM model domain via surface flows rather than as transpiration. Consequently the NatVeg and NatVeg ET scenarios generate higher simulated FJ streamflow in most months of the model period. The first category (NatVeg) assumes a native vegetation crop coefficient of 0.6, while the second category (NatVegET) assumes a native vegetation crop coefficient of 1.0 and a maximum rooting depth of 4.5 m. The first category could be interpreted as chaparral or sage scrub-type vegetation cover, while the second category could represent a mixed bunchgrass and clover prairie with extensive riparian vegetation corridors and wetlands. (See</w:t>
-      </w:r>
-      <w:r>
-        <w:t xml:space="preserve"> </w:t>
-      </w:r>
-      <w:r>
-        <w:rPr>
-          <w:i/>
-          <w:iCs/>
-        </w:rPr>
-        <w:t xml:space="preserve">Supplemental Material</w:t>
-      </w:r>
-      <w:r>
-        <w:t xml:space="preserve"> </w:t>
-      </w:r>
-      <w:r>
-        <w:t xml:space="preserve">for more details on this scenario design.)</w:t>
+        <w:t xml:space="preserve">On average, area-normalized ET from native vegetation is 36 cm/year (42% of average annual crop ET). Simulating native vegetation in place of irrigated acreage results in a greater proportion of water leaving the SVIHM model domain via surface flows rather than as transpiration. Consequently the two NatVeg scenarios generate higher simulated FJ streamflow in most months of the model period.</w:t>
       </w:r>
     </w:p>
     <w:p>
@@ -17716,7 +17700,7 @@
         <w:pStyle w:val="BodyText"/>
       </w:pPr>
       <w:r>
-        <w:t xml:space="preserve">For both coho and Chinook, as we would expect, increasing acreage of native vegetation produces decreasing total crop ET (Figure</w:t>
+        <w:t xml:space="preserve">For both coho and Chinook, as we would expect, increasing acreage of native vegetation reduces total crop ET (Figure</w:t>
       </w:r>
       <w:r>
         <w:t xml:space="preserve"> </w:t>
@@ -17737,7 +17721,7 @@
         <w:t xml:space="preserve">6</w:t>
       </w:r>
       <w:r>
-        <w:t xml:space="preserve">; see also Supplements A-D, Figure 3). For coho, the effect on the environmental benefit is not strictly monotonic, but generally, more native vegetation produces higher HB values, and low-ET vegetation produces higher HB values than high-ET vegetation (Supplements A and B, Figure 3). For Chinook, the environmental effects of native vegatation scenarios are variable: one and four scenarios are worse than basecase for Chinook juveniles per spawner and juvenile abundance, respectively, while the absolute highest HB value for both HB formulations was total native vegetation conversion, high ET.</w:t>
+        <w:t xml:space="preserve">; see also Supplements B-E, Figure 3). For coho (juvenile abundance), the effect on the environmental benefit is not strictly monotonic, but generally, more native vegetation produces higher HB values, and low-ET vegetation produces higher HB values than high-ET vegetation (Supplements B and C , Figure 3). For Chinook, the environmental effects of native vegetation scenarios are more variable (Supplpments D and E, Figure 3)</w:t>
       </w:r>
     </w:p>
     <w:bookmarkEnd w:id="75"/>
@@ -17765,7 +17749,7 @@
         <w:pStyle w:val="FirstParagraph"/>
       </w:pPr>
       <w:r>
-        <w:t xml:space="preserve">By plotting the environmental, agricultural, and infrastructure objectives in a three-dimensional scatterplot, it is possible to visualize the combined set of management scenarios as four different trade-off arcs in different infrastructure categories (Figure</w:t>
+        <w:t xml:space="preserve">By plotting the environmental, agricultural, and infrastructure objectives in a three-dimensional scatterplot, it is possible to visualize the combined set of management scenarios as four different trade-off arcs in the five infrastructure categories 0-4. Some differences emerge when using coho juvenile abundance units (Figure</w:t>
       </w:r>
       <w:r>
         <w:t xml:space="preserve"> </w:t>
@@ -17774,7 +17758,79 @@
         <w:t xml:space="preserve">7</w:t>
       </w:r>
       <w:r>
-        <w:t xml:space="preserve">). Categories containing at least one Pareto-optimal solution were Reservoir (3 of 3 scenarios), FlowLims (1 of 1), IrrEff (1 of 2), NatVegH (1 of 4, full conversion), AlfIrr (2 of 3) and Curtail (2 of 3).</w:t>
+        <w:t xml:space="preserve">; see also Supplements B, Figure 5) versus the other three HB units evaluated here (Supplements C-E, Figure 5), but overall patterns are similar. Among all 4 HB formulations, categories containing at least one Pareto-optimal solution were:</w:t>
+      </w:r>
+    </w:p>
+    <w:p>
+      <w:pPr>
+        <w:pStyle w:val="Compact"/>
+        <w:numPr>
+          <w:ilvl w:val="0"/>
+          <w:numId w:val="1008"/>
+        </w:numPr>
+      </w:pPr>
+      <w:r>
+        <w:t xml:space="preserve">Reservoir (3 of 3 scenarios)</w:t>
+      </w:r>
+    </w:p>
+    <w:p>
+      <w:pPr>
+        <w:pStyle w:val="Compact"/>
+        <w:numPr>
+          <w:ilvl w:val="0"/>
+          <w:numId w:val="1008"/>
+        </w:numPr>
+      </w:pPr>
+      <w:r>
+        <w:t xml:space="preserve">FlowLims (0-1 of 1)</w:t>
+      </w:r>
+    </w:p>
+    <w:p>
+      <w:pPr>
+        <w:pStyle w:val="Compact"/>
+        <w:numPr>
+          <w:ilvl w:val="0"/>
+          <w:numId w:val="1008"/>
+        </w:numPr>
+      </w:pPr>
+      <w:r>
+        <w:t xml:space="preserve">IrrEff (0-1 of 2)</w:t>
+      </w:r>
+    </w:p>
+    <w:p>
+      <w:pPr>
+        <w:pStyle w:val="Compact"/>
+        <w:numPr>
+          <w:ilvl w:val="0"/>
+          <w:numId w:val="1008"/>
+        </w:numPr>
+      </w:pPr>
+      <w:r>
+        <w:t xml:space="preserve">NatVeg low-ET (for coho) and high-ET (for Chinook) (1 of 4, full conversion only)</w:t>
+      </w:r>
+    </w:p>
+    <w:p>
+      <w:pPr>
+        <w:pStyle w:val="Compact"/>
+        <w:numPr>
+          <w:ilvl w:val="0"/>
+          <w:numId w:val="1008"/>
+        </w:numPr>
+      </w:pPr>
+      <w:r>
+        <w:t xml:space="preserve">AlfIrr (2-3 of 3), and</w:t>
+      </w:r>
+    </w:p>
+    <w:p>
+      <w:pPr>
+        <w:pStyle w:val="Compact"/>
+        <w:numPr>
+          <w:ilvl w:val="0"/>
+          <w:numId w:val="1008"/>
+        </w:numPr>
+      </w:pPr>
+      <w:r>
+        <w:t xml:space="preserve">Curtail (2-3 of 3).</w:t>
       </w:r>
     </w:p>
     <w:p>
@@ -17786,7 +17842,7 @@
           <wp:inline>
             <wp:extent cx="4267200" cy="4075288"/>
             <wp:effectExtent b="0" l="0" r="0" t="0"/>
-            <wp:docPr descr="Figure 7:  A three-dimensional scatter plot of the objective function values for basecase and 24 management scenarios, averaged over 35 water years (1991-2025). Larger spheres are shown for the Pareto-optimal set of scenarios. Scenario colors correspond to legend in Figures 6 and 7. The corner corresponding to optimal values of all objective functions (the ‘best’ corner) is highlighted with a red arrow." title="" id="78" name="Picture"/>
+            <wp:docPr descr="Figure 7:  A three-dimensional scatter plot of the objective function values for basecase and 24 management scenarios, averaged over 35 water years (1991-2025). Larger spheres are shown for the Pareto-optimal set of scenarios. Scenario colors correspond to legend in Figure 6. The corner corresponding to optimal values of all objective functions (the ‘best’ corner) is highlighted with a red arrow." title="" id="78" name="Picture"/>
             <a:graphic>
               <a:graphicData uri="http://schemas.openxmlformats.org/drawingml/2006/picture">
                 <pic:pic>
@@ -17840,7 +17896,7 @@
         <w:t xml:space="preserve"> </w:t>
       </w:r>
       <w:r>
-        <w:t xml:space="preserve">A three-dimensional scatter plot of the objective function values for basecase and 24 management scenarios, averaged over 35 water years (1991-2025). Larger spheres are shown for the Pareto-optimal set of scenarios. Scenario colors correspond to legend in Figures 6 and 7. The corner corresponding to optimal values of all objective functions (the</w:t>
+        <w:t xml:space="preserve">A three-dimensional scatter plot of the objective function values for basecase and 24 management scenarios, averaged over 35 water years (1991-2025). Larger spheres are shown for the Pareto-optimal set of scenarios. Scenario colors correspond to legend in Figure 6. The corner corresponding to optimal values of all objective functions (the</w:t>
       </w:r>
       <w:r>
         <w:t xml:space="preserve"> </w:t>
@@ -17860,7 +17916,7 @@
         <w:pStyle w:val="BodyText"/>
       </w:pPr>
       <w:r>
-        <w:t xml:space="preserve">For coho juvenile abundance units of the HB function, the Pareto-optimal set of management actions (i.e., the scenarios with an objective/category value that cannot be improved upon without sacrificing value in another objective/category) includes 11 of the 35 simulated scenarios (Table</w:t>
+        <w:t xml:space="preserve">For HB function in coho juvenile abundance units, the Pareto-optimal set of management actions (i.e., the scenarios with an objective/category value that cannot be improved upon without sacrificing value in another objective/category) includes 11 of the 35 simulated scenarios (Table</w:t>
       </w:r>
       <w:r>
         <w:t xml:space="preserve"> </w:t>
@@ -17878,7 +17934,7 @@
         <w:t xml:space="preserve">7</w:t>
       </w:r>
       <w:r>
-        <w:t xml:space="preserve">).This set includes the basecase, as it is the only scenario with an infrastructure category of 0 (no change needed); it includes five regulatory scenarios in category 1 (no new infrastructure needed); it includes two scenarios from category 2 (1-2 years timeline); and it includes all three reservoir scenarios, as they trace a small trade-off curve within their own category (5+ years timeline).</w:t>
+        <w:t xml:space="preserve">). This set includes the basecase, as it is the only scenario with an infrastructure category of 0 (no change needed); it includes five regulatory scenarios in category 1 (no new infrastructure needed); it includes two scenarios from category 2 (1-2 years timeline); and it includes all three reservoir scenarios, as they trace a small trade-off curve within their own category (5+ years timeline).</w:t>
       </w:r>
     </w:p>
     <w:p>
@@ -17886,7 +17942,7 @@
         <w:pStyle w:val="BodyText"/>
       </w:pPr>
       <w:r>
-        <w:t xml:space="preserve">Several categories (such as Alfalfa Irrigation) include Pareto-optimal and suboptimal scenarios, suggesting that the details of implementation may be more important than any one strategy in determining management impact. Also, the Pareto-optimality of Crop Change scenarios is difficult to evaluate here, since the relationship between total ET and conceptual farmer benefit is different than in the remainder of the scenarios.</w:t>
+        <w:t xml:space="preserve">Several categories (such as Alfalfa Irrigation) include Pareto-optimal and suboptimal scenarios, suggesting that the details of implementation may be more important than selecting any one strategy in determining management impact. Also, the Pareto-optimality of Crop Change scenarios is difficult to evaluate here, since the relationship between total ET and conceptual farmer benefit is different than in the remainder of the scenarios.</w:t>
       </w:r>
     </w:p>
     <w:bookmarkEnd w:id="81"/>
@@ -17913,7 +17969,16 @@
         <w:pStyle w:val="FirstParagraph"/>
       </w:pPr>
       <w:r>
-        <w:t xml:space="preserve">To determine if the strict application of objective functions would produce different management priorities than the public policy development process that took place 2018-2021, we made a high-level, conceptual comparison of the Pareto-optimal set of management actions and the management actions and projects listed for consideration in the GSP</w:t>
+        <w:t xml:space="preserve">To determine if the strict application of objective functions would produce different management priorities than the public policy development process that took place 2018-2021, we made a high-level, conceptual comparison (Table</w:t>
+      </w:r>
+      <w:r>
+        <w:t xml:space="preserve"> </w:t>
+      </w:r>
+      <w:r>
+        <w:t xml:space="preserve">7</w:t>
+      </w:r>
+      <w:r>
+        <w:t xml:space="preserve">) of the Pareto-optimal set of management actions and the management actions and projects listed for consideration in the GSP</w:t>
       </w:r>
       <w:r>
         <w:t xml:space="preserve"> </w:t>
@@ -17922,16 +17987,7 @@
         <w:t xml:space="preserve">(Siskiyou County 2021)</w:t>
       </w:r>
       <w:r>
-        <w:t xml:space="preserve">. Management actions considered in the GSP have some analogs in the set of 25 simulated scenarios, though the details of implementation may be quite different (Table</w:t>
-      </w:r>
-      <w:r>
-        <w:t xml:space="preserve"> </w:t>
-      </w:r>
-      <w:r>
-        <w:t xml:space="preserve">7</w:t>
-      </w:r>
-      <w:r>
-        <w:t xml:space="preserve">).</w:t>
+        <w:t xml:space="preserve">.</w:t>
       </w:r>
     </w:p>
     <w:p>
@@ -17939,7 +17995,7 @@
         <w:pStyle w:val="BodyText"/>
       </w:pPr>
       <w:r>
-        <w:t xml:space="preserve">Tier I and II scenarios, assigned highest priority and considered implementable in the near term and medium term, respectively, tend to be associated with higher high crop ET values (e.g., six out of seven scenarios with &gt; 114 10</w:t>
+        <w:t xml:space="preserve">Tier I and II scenarios, assigned highest priority and considered implementable in the near term and medium term, respectively, tend to be associated with higher crop ET values (e.g., six out of seven scenarios with &gt; 114 10</w:t>
       </w:r>
       <w:r>
         <w:rPr>
@@ -17960,32 +18016,19 @@
         <w:t xml:space="preserve">3</w:t>
       </w:r>
       <w:r>
-        <w:t xml:space="preserve">), reflecting the community’s commitment to avoid negative impacts on growers. With one exception, the scenarios with relatively high environmental benefit (e.g., &gt; 7.9 HB value) are in Tier III, considered implementable in the long-term.</w:t>
-      </w:r>
-    </w:p>
-    <w:p>
-      <w:pPr>
-        <w:pStyle w:val="BodyText"/>
-      </w:pPr>
-      <w:r>
-        <w:t xml:space="preserve">Although implementation details are unspecified for GSP Management Actions (MAs), they can be mapped onto these results by matching each MA with its closest simulated analogue/category, and considering whether these categories included at least one Pareto-optimal scenario. For three of three Tier I MAs, one of four Tier II MAs, and two of four Tier II MAs, the closest categories included a Pareto-optimal scenario (assuming that the Voluntary Managed Land Repurposing MA does not include full conversion of irrigated crops to native vegetation).</w:t>
-      </w:r>
-    </w:p>
-    <w:p>
-      <w:pPr>
-        <w:pStyle w:val="BodyText"/>
-      </w:pPr>
-      <w:r>
-        <w:t xml:space="preserve">The final category with at least one Pareto-optimal scenario, Alfalfa Irrigation, is not included in the list of management actions; conversely, low-efficiency scenarios in categories NatVeg and Crop Change were included, in a spatially-limited form, in Tier II under the umbrella of</w:t>
-      </w:r>
-      <w:r>
-        <w:t xml:space="preserve"> </w:t>
-      </w:r>
-      <w:r>
-        <w:t xml:space="preserve">“Voluntary Managed Land Repurposing”</w:t>
-      </w:r>
-      <w:r>
-        <w:t xml:space="preserve">. This indicates that political considerations not currently included in the three objective functions produce a preference for some amount of land repurposing rather than imposing limitations on alfalfa irrigation.</w:t>
+        <w:t xml:space="preserve">), reflecting the community’s commitment to avoid negative impacts on growers. With one exception, the scenarios with relatively high environmental benefit (e.g., &gt; 7.9 10</w:t>
+      </w:r>
+      <w:r>
+        <w:rPr>
+          <w:vertAlign w:val="superscript"/>
+        </w:rPr>
+        <w:t xml:space="preserve">3</w:t>
+      </w:r>
+      <w:r>
+        <w:t xml:space="preserve"> </w:t>
+      </w:r>
+      <w:r>
+        <w:t xml:space="preserve">coho smolt-equiv. HB value) are in Tier III, reflecting that they are technically and/or politically more challenging than Tiers I and II, and thus considered potentially implementable in the long-term.</w:t>
       </w:r>
     </w:p>
     <w:p>
@@ -21034,68 +21077,123 @@
     </w:p>
     <w:p>
       <w:pPr>
-        <w:pStyle w:val="Compact"/>
-        <w:numPr>
-          <w:ilvl w:val="0"/>
-          <w:numId w:val="1008"/>
-        </w:numPr>
-      </w:pPr>
-      <w:r>
-        <w:t xml:space="preserve">need sufficient years of data. More than a decade</w:t>
+        <w:pStyle w:val="FirstParagraph"/>
+      </w:pPr>
+      <w:r>
+        <w:t xml:space="preserve">This study uses a physical model to predict changes in flow, and a statistical model to extrapolate these changes into ecological impacts. However, even within just one watershed, there are many other possible ways to design an environmental benefit objective function based on a statistical model.</w:t>
       </w:r>
     </w:p>
     <w:p>
       <w:pPr>
-        <w:pStyle w:val="Compact"/>
-        <w:numPr>
-          <w:ilvl w:val="0"/>
-          <w:numId w:val="1008"/>
-        </w:numPr>
-      </w:pPr>
-      <w:r>
-        <w:t xml:space="preserve">Other aquatic species, like steelhead trout or Pacific lamprey</w:t>
+        <w:pStyle w:val="BodyText"/>
+      </w:pPr>
+      <w:r>
+        <w:t xml:space="preserve">Regardless of the design, the first requirement is sufficient data. The present study is based off of 14 to 19 years of ecological observations (depending on which units are selected)</w:t>
+      </w:r>
+      <w:r>
+        <w:t xml:space="preserve"> </w:t>
+      </w:r>
+      <w:r>
+        <w:t xml:space="preserve">(Kouba et al. 2025)</w:t>
+      </w:r>
+      <w:r>
+        <w:t xml:space="preserve">. Hydrologic data is often relatively abundant, with ecological observations as the limiting factor; the authors recommend at least a decade of ecological data, ideally covering all water year types, to build a new hydrologic-ecological relationship.</w:t>
       </w:r>
     </w:p>
     <w:p>
       <w:pPr>
-        <w:pStyle w:val="Compact"/>
-        <w:numPr>
-          <w:ilvl w:val="0"/>
-          <w:numId w:val="1008"/>
-        </w:numPr>
-      </w:pPr>
-      <w:r>
-        <w:t xml:space="preserve">hydrology that supports GDEs - flowrates associated with sufficient spatial habitat or groundwater elevation supporting riparian vegetation</w:t>
+        <w:pStyle w:val="BodyText"/>
+      </w:pPr>
+      <w:r>
+        <w:t xml:space="preserve">Although salmon are often considered a</w:t>
+      </w:r>
+      <w:r>
+        <w:t xml:space="preserve"> </w:t>
+      </w:r>
+      <w:r>
+        <w:t xml:space="preserve">“keystone species”</w:t>
+      </w:r>
+      <w:r>
+        <w:t xml:space="preserve"> </w:t>
+      </w:r>
+      <w:r>
+        <w:t xml:space="preserve">(Mills and Doak 1993)</w:t>
+      </w:r>
+      <w:r>
+        <w:t xml:space="preserve">, one obvious alternative to a salmon-based HB function is to base it on another suitable aquatic species. Two candidates in the Scott River watershed would be steelhead trout or potentially Pacific lamprey. Suitability depend on a strong known or suspected relationship between flow and an observable ecological outcome. Another alternative would be to investigate the specific hydrology that supports groundwater-dependent ecosystems; i.e., flowrates associated with sufficient spatial habitat in specific reaches, or groundwater elevation supporting riparian vegetation. All of these options are</w:t>
+      </w:r>
+      <w:r>
+        <w:t xml:space="preserve"> </w:t>
+      </w:r>
+      <w:r>
+        <w:t xml:space="preserve">“bottom-up”</w:t>
+      </w:r>
+      <w:r>
+        <w:t xml:space="preserve"> </w:t>
+      </w:r>
+      <w:r>
+        <w:t xml:space="preserve">descriptions</w:t>
+      </w:r>
+      <w:r>
+        <w:t xml:space="preserve"> </w:t>
+      </w:r>
+      <w:r>
+        <w:t xml:space="preserve">(Tharme 2003)</w:t>
+      </w:r>
+      <w:r>
+        <w:t xml:space="preserve"> </w:t>
+      </w:r>
+      <w:r>
+        <w:t xml:space="preserve">of relationships between flow and isolated ecological functions; still another option would be to base the HB functon on a</w:t>
+      </w:r>
+      <w:r>
+        <w:t xml:space="preserve"> </w:t>
+      </w:r>
+      <w:r>
+        <w:t xml:space="preserve">“top-down”</w:t>
+      </w:r>
+      <w:r>
+        <w:t xml:space="preserve"> </w:t>
+      </w:r>
+      <w:r>
+        <w:t xml:space="preserve">method, such as indices of alteration, that aims to preserve</w:t>
+      </w:r>
+      <w:r>
+        <w:t xml:space="preserve"> </w:t>
+      </w:r>
+      <w:r>
+        <w:rPr>
+          <w:i/>
+          <w:iCs/>
+        </w:rPr>
+        <w:t xml:space="preserve">all</w:t>
+      </w:r>
+      <w:r>
+        <w:t xml:space="preserve"> </w:t>
+      </w:r>
+      <w:r>
+        <w:t xml:space="preserve">ecological functions of the unimpaired stream</w:t>
+      </w:r>
+      <w:r>
+        <w:t xml:space="preserve"> </w:t>
+      </w:r>
+      <w:r>
+        <w:t xml:space="preserve">(e.g., Richter et al. 1996; Poff et al. 1997; discussed further in Kouba et al. 2025)</w:t>
+      </w:r>
+      <w:r>
+        <w:t xml:space="preserve">.</w:t>
       </w:r>
     </w:p>
     <w:p>
       <w:pPr>
-        <w:pStyle w:val="Compact"/>
-        <w:numPr>
-          <w:ilvl w:val="0"/>
-          <w:numId w:val="1008"/>
-        </w:numPr>
-      </w:pPr>
-      <w:r>
-        <w:t xml:space="preserve">Indices of alteration</w:t>
-      </w:r>
-      <w:r>
-        <w:t xml:space="preserve"> </w:t>
-      </w:r>
-      <w:r>
-        <w:t xml:space="preserve">(Kouba et al. 2025)</w:t>
-      </w:r>
-    </w:p>
-    <w:p>
-      <w:pPr>
-        <w:pStyle w:val="FirstParagraph"/>
-      </w:pPr>
-      <w:r>
-        <w:t xml:space="preserve">Utility of the environmental function is somewhat dependent on which flows are highlighted. While the Chinook HB function is valuable in highlighting which flows are of highest importance, Chinook plots of fish vs farmer tradeoffs are effectively meaningless, since wet season median flows are largely beyond human control in this undammed watershed. (for discussion?)</w:t>
+        <w:pStyle w:val="BodyText"/>
+      </w:pPr>
+      <w:r>
+        <w:t xml:space="preserve">Finally, it is worth noting that the utility of the environmental function is somewhat dependent on which flows are considered important. While the Chinook HB function is valuable in highlighting which flows are of highest importance statistically, Chinook plots of fish versus farmer tradeoffs are effectively meaningless, since wet season median flows are largely beyond human control in this undammed watershed.</w:t>
       </w:r>
     </w:p>
     <w:bookmarkEnd w:id="85"/>
-    <w:bookmarkStart w:id="86" w:name="environmental-agricultural-trade-offs"/>
+    <w:bookmarkStart w:id="86" w:name="trade-offs-among-all-three-objectives"/>
     <w:p>
       <w:pPr>
         <w:pStyle w:val="Heading2"/>
@@ -21110,7 +21208,162 @@
         <w:tab/>
       </w:r>
       <w:r>
-        <w:t xml:space="preserve">Environmental-agricultural trade-offs</w:t>
+        <w:t xml:space="preserve">Trade-offs among all three objectives</w:t>
+      </w:r>
+    </w:p>
+    <w:p>
+      <w:pPr>
+        <w:pStyle w:val="FirstParagraph"/>
+      </w:pPr>
+      <w:r>
+        <w:t xml:space="preserve">For all HB formulations, reservoirs and regulatory scenarios (curtailment, alfalfa irrigation, diversion limits) were the categories with highest fraction of Pareto-optimal scenarios (Table</w:t>
+      </w:r>
+      <w:r>
+        <w:t xml:space="preserve"> </w:t>
+      </w:r>
+      <w:r>
+        <w:t xml:space="preserve">6</w:t>
+      </w:r>
+      <w:r>
+        <w:t xml:space="preserve">; Figure</w:t>
+      </w:r>
+      <w:r>
+        <w:t xml:space="preserve"> </w:t>
+      </w:r>
+      <w:r>
+        <w:t xml:space="preserve">7</w:t>
+      </w:r>
+      <w:r>
+        <w:t xml:space="preserve">). This suggests that the regulatory scenarios in category 1 (no new infrastructure needed) define an arc of trade-offs between environmental benefit and agricultural cost, and the low-to-moderate infrastructure cost scenarios (categories 2 and 3) do not improve on this. Among the set of options considered here, it takes a high infrastructure cost (reservoir scenarios) to escape the trade-offs defined in the regulatory scenario categories.</w:t>
+      </w:r>
+    </w:p>
+    <w:p>
+      <w:pPr>
+        <w:pStyle w:val="BodyText"/>
+      </w:pPr>
+      <w:r>
+        <w:t xml:space="preserve">It’s clear that design details (date of implementation, number of acres affected) produce greater variation within scenario categories than between categories, and so it may well be possible to design, for instance, a Pareto-optimal enhanced recharge scenario for this watershed, if the recharge areas and total water volume diverted were altered. The current popularity of enhanced recharge</w:t>
+      </w:r>
+      <w:r>
+        <w:t xml:space="preserve"> </w:t>
+      </w:r>
+      <w:r>
+        <w:t xml:space="preserve">(e.g., CNRA et al. 2022)</w:t>
+      </w:r>
+      <w:r>
+        <w:t xml:space="preserve"> </w:t>
+      </w:r>
+      <w:r>
+        <w:t xml:space="preserve">points to a need (in Scott Valley, and in California and semi-arid agricultural regions more broadly) regarding effective spatial, timing, and water volume elements of an effective and feasible MAR program.</w:t>
+      </w:r>
+    </w:p>
+    <w:p>
+      <w:pPr>
+        <w:pStyle w:val="BodyText"/>
+      </w:pPr>
+      <w:r>
+        <w:t xml:space="preserve">Additionally, it is difficult to evaluate the total ET value, and thus the Pareto-optimality, of scenarios in the Crop Change category. If we assume, based on current practices, that a yearly alfalfa harvest is worth more than a yearly grain harvest, a widespread conversion to permanent grain could reduce profits in Scott Valley; however, permanent grain might provide more certainty and potentially better economic yield if the choice were between the widespread conversion to permanent grain and frequent mid-season irrigation cutoffs (on alfalfa or all crops).</w:t>
+      </w:r>
+    </w:p>
+    <w:bookmarkEnd w:id="86"/>
+    <w:bookmarkStart w:id="87" w:name="Xb48c0b1c357814727cacf50afe35e98b0bf92dd"/>
+    <w:p>
+      <w:pPr>
+        <w:pStyle w:val="Heading2"/>
+      </w:pPr>
+      <w:r>
+        <w:rPr>
+          <w:rStyle w:val="SectionNumber"/>
+        </w:rPr>
+        <w:t xml:space="preserve">5.3</w:t>
+      </w:r>
+      <w:r>
+        <w:tab/>
+      </w:r>
+      <w:r>
+        <w:t xml:space="preserve">Pareto-optimal solution set and GSP priority management actions</w:t>
+      </w:r>
+    </w:p>
+    <w:p>
+      <w:pPr>
+        <w:pStyle w:val="FirstParagraph"/>
+      </w:pPr>
+      <w:r>
+        <w:t xml:space="preserve">Within the proposed suite of management actions, across all four HB formulations, approximately half (10-13 of 25) fall within the Pareto-optimal set, based on the cost proxy and the 35-year average values of two objective functions (Supplements B-E, Figure 5 and Table 2). (As mentioned above, Pareto-suboptimal status is less certain in the case of the Crop Change scenario.)</w:t>
+      </w:r>
+    </w:p>
+    <w:p>
+      <w:pPr>
+        <w:pStyle w:val="BodyText"/>
+      </w:pPr>
+      <w:r>
+        <w:t xml:space="preserve">Many of the simulated scenarios were included in the ultimate list of management priorities in the adopted GSP</w:t>
+      </w:r>
+      <w:r>
+        <w:t xml:space="preserve"> </w:t>
+      </w:r>
+      <w:r>
+        <w:t xml:space="preserve">(Siskiyou County 2021)</w:t>
+      </w:r>
+      <w:r>
+        <w:t xml:space="preserve">, though in a variety of forms (e.g., the Low Flow Diversion Limits scenario, which is the closest simulated analogue for a watermaster program and a surface water leasing program; Table</w:t>
+      </w:r>
+      <w:r>
+        <w:t xml:space="preserve"> </w:t>
+      </w:r>
+      <w:r>
+        <w:t xml:space="preserve">7</w:t>
+      </w:r>
+      <w:r>
+        <w:t xml:space="preserve">). Although the GSP management priorities emphasized infrastructure and minimal farmer cost, in a strict application of these objective functions, regulatory approaches were fell within the Pareto-optimal set of management options.</w:t>
+      </w:r>
+    </w:p>
+    <w:bookmarkEnd w:id="87"/>
+    <w:bookmarkStart w:id="88" w:name="policy-implications"/>
+    <w:p>
+      <w:pPr>
+        <w:pStyle w:val="Heading2"/>
+      </w:pPr>
+      <w:r>
+        <w:rPr>
+          <w:rStyle w:val="SectionNumber"/>
+        </w:rPr>
+        <w:t xml:space="preserve">5.4</w:t>
+      </w:r>
+      <w:r>
+        <w:tab/>
+      </w:r>
+      <w:r>
+        <w:t xml:space="preserve">Policy implications</w:t>
+      </w:r>
+    </w:p>
+    <w:p>
+      <w:pPr>
+        <w:pStyle w:val="FirstParagraph"/>
+      </w:pPr>
+      <w:r>
+        <w:t xml:space="preserve">The portfolio of scenarios proposed by stakeholders and simulated for this study included a range of infrastructure investments, regulatory actions and major land use changes. The number and diversity of simulated scenarios was made possible by a surface- and groundwater model designed to approximate existing land use and agricultural water use behavior in the local context [SVIHM;</w:t>
+      </w:r>
+      <w:r>
+        <w:t xml:space="preserve"> </w:t>
+      </w:r>
+      <w:r>
+        <w:t xml:space="preserve">Tolley, Foglia, and Harter (2019)</w:t>
+      </w:r>
+      <w:r>
+        <w:t xml:space="preserve">]. When combined with summarizing objective functions, these results create a landscape of possible management alternatives, which can support evaluations of what is</w:t>
+      </w:r>
+      <w:r>
+        <w:t xml:space="preserve"> </w:t>
+      </w:r>
+      <w:r>
+        <w:t xml:space="preserve">“reasonable”</w:t>
+      </w:r>
+      <w:r>
+        <w:t xml:space="preserve"> </w:t>
+      </w:r>
+      <w:r>
+        <w:t xml:space="preserve">under SGMA.</w:t>
       </w:r>
     </w:p>
     <w:p>
@@ -21122,76 +21375,7 @@
         </w:numPr>
       </w:pPr>
       <w:r>
-        <w:t xml:space="preserve">Reservoirs and regulatory scenarios (curtailment, diversion limits) were categories with highest number of optimal scenarios</w:t>
-      </w:r>
-    </w:p>
-    <w:p>
-      <w:pPr>
-        <w:pStyle w:val="FirstParagraph"/>
-      </w:pPr>
-      <w:r>
-        <w:t xml:space="preserve">Balancing agricultural and environmental water demands in this watershed commonly takes the form of seeking management actions that can improve flow conditions while minimizing the resulting reduction in agricultural water availability. Consequently, a subset of the proposed scenarios rely on infrastructure investments to produce modest HB improvements with minimal-to-no ET reductions (Enhanced Recharge, Irrigation Efficiency, and Reservoirs) (Figure</w:t>
-      </w:r>
-      <w:r>
-        <w:t xml:space="preserve"> </w:t>
-      </w:r>
-      <w:r>
-        <w:t xml:space="preserve">6</w:t>
-      </w:r>
-      <w:r>
-        <w:t xml:space="preserve">). The remaining categories tend to include some level of ET reduction, due to reduced water availability for irrigation.</w:t>
-      </w:r>
-    </w:p>
-    <w:p>
-      <w:pPr>
-        <w:pStyle w:val="BodyText"/>
-      </w:pPr>
-      <w:r>
-        <w:t xml:space="preserve">The environmental gain-agricultural cost trade-off is evident both within individual categories and between distinct scenario categories.</w:t>
-      </w:r>
-    </w:p>
-    <w:p>
-      <w:pPr>
-        <w:pStyle w:val="BodyText"/>
-      </w:pPr>
-      <w:r>
-        <w:rPr>
-          <w:b/>
-          <w:bCs/>
-        </w:rPr>
-        <w:t xml:space="preserve">add discussion of how to interpret grain ET results. might need to check with TH</w:t>
-      </w:r>
-      <w:r>
-        <w:t xml:space="preserve"> </w:t>
-      </w:r>
-      <w:r>
-        <w:t xml:space="preserve">Assuming that a yearly alfalfa harvest is worth more than a yearly grain harvest, a widespread conversion to permanent grain could reduce profits in Scott Valley; however, permanent grain might provide more certainty and potentially better economic yield if the choice were between the Crop Change scenarios and frequent mid-season irrigation cutoffs (of alfalfa or all crops).</w:t>
-      </w:r>
-    </w:p>
-    <w:p>
-      <w:pPr>
-        <w:pStyle w:val="BodyText"/>
-      </w:pPr>
-      <w:r>
-        <w:t xml:space="preserve">Among Alfalfa Irrigation scenarios, and ET costs are small (averaging 1 and 3 million m</w:t>
-      </w:r>
-      <w:r>
-        <w:rPr>
-          <w:vertAlign w:val="superscript"/>
-        </w:rPr>
-        <w:t xml:space="preserve">3</w:t>
-      </w:r>
-      <w:r>
-        <w:t xml:space="preserve">, respectively, in all years); conversely, the more extreme July 10th cutoff date produces an average of 8 million m</w:t>
-      </w:r>
-      <w:r>
-        <w:rPr>
-          <w:vertAlign w:val="superscript"/>
-        </w:rPr>
-        <w:t xml:space="preserve">3</w:t>
-      </w:r>
-      <w:r>
-        <w:t xml:space="preserve">, or 7%, reduction in ET in all years (panels A and B of Figure</w:t>
+        <w:t xml:space="preserve">Key data gaps limit interpretability of some scenario results. An agronomic study of alternate crops that could be cultivated in Scott Valley, for example, could better constrain the agricultural benefits of a Crop Change scenario. Conversely, the acreage of land converted in various Native Vegetation scenarios is likely higher than any realistic land use change scenario, meaning that for a hypothetical management action involving a reduction of irrigated acreage in the valley, the HB gains and ET costs may be smaller than shown in Figure</w:t>
       </w:r>
       <w:r>
         <w:t xml:space="preserve"> </w:t>
@@ -21200,206 +21384,7 @@
         <w:t xml:space="preserve">??</w:t>
       </w:r>
       <w:r>
-        <w:t xml:space="preserve">).</w:t>
-      </w:r>
-    </w:p>
-    <w:p>
-      <w:pPr>
-        <w:pStyle w:val="BodyText"/>
-      </w:pPr>
-      <w:r>
-        <w:t xml:space="preserve">Trade-off is also evident between scenario categories. The Enhanced Recharge scenario</w:t>
-      </w:r>
-      <w:r>
-        <w:t xml:space="preserve"> </w:t>
-      </w:r>
-      <w:r>
-        <w:rPr>
-          <w:rStyle w:val="VerbatimChar"/>
-        </w:rPr>
-        <w:t xml:space="preserve">mar_ilr</w:t>
-      </w:r>
-      <w:r>
-        <w:t xml:space="preserve"> </w:t>
-      </w:r>
-      <w:r>
-        <w:t xml:space="preserve">has a minimal ET cost (an average of 0 million m</w:t>
-      </w:r>
-      <w:r>
-        <w:rPr>
-          <w:vertAlign w:val="superscript"/>
-        </w:rPr>
-        <w:t xml:space="preserve">3</w:t>
-      </w:r>
-      <w:r>
-        <w:t xml:space="preserve"> </w:t>
-      </w:r>
-      <w:r>
-        <w:t xml:space="preserve">less than basecase in all years). At the other extreme, the Curtailment scenario in which all irrigation is cut off on August 1st (</w:t>
-      </w:r>
-      <w:r>
-        <w:rPr>
-          <w:rStyle w:val="VerbatimChar"/>
-        </w:rPr>
-        <w:t xml:space="preserve">curtail_start_07.31</w:t>
-      </w:r>
-      <w:r>
-        <w:t xml:space="preserve">), but reduces ET by an average of 9 million m</w:t>
-      </w:r>
-      <w:r>
-        <w:rPr>
-          <w:vertAlign w:val="superscript"/>
-        </w:rPr>
-        <w:t xml:space="preserve">3</w:t>
-      </w:r>
-      <w:r>
-        <w:t xml:space="preserve"> </w:t>
-      </w:r>
-      <w:r>
-        <w:t xml:space="preserve">or 7% (panels C and D of Figure</w:t>
-      </w:r>
-      <w:r>
-        <w:t xml:space="preserve"> </w:t>
-      </w:r>
-      <w:r>
-        <w:t xml:space="preserve">??</w:t>
-      </w:r>
-      <w:r>
-        <w:t xml:space="preserve">). Compared to</w:t>
-      </w:r>
-      <w:r>
-        <w:t xml:space="preserve"> </w:t>
-      </w:r>
-      <w:r>
-        <w:rPr>
-          <w:rStyle w:val="VerbatimChar"/>
-        </w:rPr>
-        <w:t xml:space="preserve">curtail_start_07.31</w:t>
-      </w:r>
-      <w:r>
-        <w:t xml:space="preserve">, the Low Flow Diversion Limits (</w:t>
-      </w:r>
-      <w:r>
-        <w:rPr>
-          <w:rStyle w:val="VerbatimChar"/>
-        </w:rPr>
-        <w:t xml:space="preserve">flowlims</w:t>
-      </w:r>
-      <w:r>
-        <w:t xml:space="preserve">) scenario reduces ET by an average of 3%.</w:t>
-      </w:r>
-    </w:p>
-    <w:bookmarkEnd w:id="86"/>
-    <w:bookmarkStart w:id="87" w:name="Xb48c0b1c357814727cacf50afe35e98b0bf92dd"/>
-    <w:p>
-      <w:pPr>
-        <w:pStyle w:val="Heading2"/>
-      </w:pPr>
-      <w:r>
-        <w:rPr>
-          <w:rStyle w:val="SectionNumber"/>
-        </w:rPr>
-        <w:t xml:space="preserve">5.3</w:t>
-      </w:r>
-      <w:r>
-        <w:tab/>
-      </w:r>
-      <w:r>
-        <w:t xml:space="preserve">Pareto-optimal solution set and GSP priority management actions</w:t>
-      </w:r>
-    </w:p>
-    <w:p>
-      <w:pPr>
-        <w:pStyle w:val="FirstParagraph"/>
-      </w:pPr>
-      <w:r>
-        <w:t xml:space="preserve">Within the proposed suite of management actions, nearly half (11 of 25, including the basecase) fall within the Pareto-optimal set based on the infrastructure category and the 35-year average values of objective functions. Pareto-suboptimal status is less certain in the case of the Crop Change scenario.</w:t>
-      </w:r>
-    </w:p>
-    <w:p>
-      <w:pPr>
-        <w:pStyle w:val="BodyText"/>
-      </w:pPr>
-      <w:r>
-        <w:t xml:space="preserve">Many of the simulated scenarios were included in the ultimate list of management priorities in the adopted GSP</w:t>
-      </w:r>
-      <w:r>
-        <w:t xml:space="preserve"> </w:t>
-      </w:r>
-      <w:r>
-        <w:t xml:space="preserve">(Siskiyou County 2021)</w:t>
-      </w:r>
-      <w:r>
-        <w:t xml:space="preserve">, though in a variety of forms (e.g., the Low Flow Diversion Limits scenario, which is the closest simulated analogue for a watermaster program and a surface water leasing program; Table</w:t>
-      </w:r>
-      <w:r>
-        <w:t xml:space="preserve"> </w:t>
-      </w:r>
-      <w:r>
-        <w:t xml:space="preserve">7</w:t>
-      </w:r>
-      <w:r>
-        <w:t xml:space="preserve">). Although the GSP management priorities emphasized infrastructure and minimal farmer cost, in a strict application of these objective functions, both infrastructure-based and regulatory approaches fell within the Pareto-optimal set of management options.</w:t>
-      </w:r>
-    </w:p>
-    <w:p>
-      <w:pPr>
-        <w:pStyle w:val="BodyText"/>
-      </w:pPr>
-      <w:r>
-        <w:rPr>
-          <w:b/>
-          <w:bCs/>
-        </w:rPr>
-        <w:t xml:space="preserve">The popularity of enhanced recharge [CITE?] points to a need (in Scott Valley, and in California and semi-arid agricultural regions more broadly) regarding effective spatial, timing, and water volume elements of an effective and feasible MAR program.</w:t>
-      </w:r>
-    </w:p>
-    <w:bookmarkEnd w:id="87"/>
-    <w:bookmarkStart w:id="88" w:name="policy-implications"/>
-    <w:p>
-      <w:pPr>
-        <w:pStyle w:val="Heading2"/>
-      </w:pPr>
-      <w:r>
-        <w:rPr>
-          <w:rStyle w:val="SectionNumber"/>
-        </w:rPr>
-        <w:t xml:space="preserve">5.4</w:t>
-      </w:r>
-      <w:r>
-        <w:tab/>
-      </w:r>
-      <w:r>
-        <w:t xml:space="preserve">Policy implications</w:t>
-      </w:r>
-    </w:p>
-    <w:p>
-      <w:pPr>
-        <w:pStyle w:val="FirstParagraph"/>
-      </w:pPr>
-      <w:r>
-        <w:t xml:space="preserve">The portfolio of scenarios proposed by stakeholders and simulated for this study included a range of infrastructure investments, regulatory actions and major land use changes. The number and diversity of simulated scenarios was made possible by a surface- and groundwater model designed to approximate existing land use and agricultural water use behavior in the local context [SVIHM;</w:t>
-      </w:r>
-      <w:r>
-        <w:t xml:space="preserve"> </w:t>
-      </w:r>
-      <w:r>
-        <w:t xml:space="preserve">Tolley, Foglia, and Harter (2019)</w:t>
-      </w:r>
-      <w:r>
-        <w:t xml:space="preserve">]. When combined with summarizing objective functions, these results create a landscape of possible management alternatives, which can support evaluations of what is</w:t>
-      </w:r>
-      <w:r>
-        <w:t xml:space="preserve"> </w:t>
-      </w:r>
-      <w:r>
-        <w:t xml:space="preserve">“reasonable”</w:t>
-      </w:r>
-      <w:r>
-        <w:t xml:space="preserve"> </w:t>
-      </w:r>
-      <w:r>
-        <w:t xml:space="preserve">under SGMA.</w:t>
+        <w:t xml:space="preserve">.</w:t>
       </w:r>
     </w:p>
     <w:p>
@@ -21407,28 +21392,7 @@
         <w:pStyle w:val="Compact"/>
         <w:numPr>
           <w:ilvl w:val="0"/>
-          <w:numId w:val="1010"/>
-        </w:numPr>
-      </w:pPr>
-      <w:r>
-        <w:t xml:space="preserve">Key data gaps limit interpretability of some scenario results. An agronomic study of alternate crops that could be cultivated in Scott Valley, for example, could better constrain the agricultural benefits of a Crop Change scenario. Conversely, the acreage of land converted in various Native Vegetation scenarios is likely higher than any realistic land use change scenario, meaning that for a hypothetical management action involving a reduction of irrigated acreage in the valley, the HB gains and ET costs may be smaller than shown in Figure</w:t>
-      </w:r>
-      <w:r>
-        <w:t xml:space="preserve"> </w:t>
-      </w:r>
-      <w:r>
-        <w:t xml:space="preserve">??</w:t>
-      </w:r>
-      <w:r>
-        <w:t xml:space="preserve">.</w:t>
-      </w:r>
-    </w:p>
-    <w:p>
-      <w:pPr>
-        <w:pStyle w:val="Compact"/>
-        <w:numPr>
-          <w:ilvl w:val="0"/>
-          <w:numId w:val="1010"/>
+          <w:numId w:val="1009"/>
         </w:numPr>
       </w:pPr>
       <w:r>
@@ -21530,7 +21494,7 @@
       </w:r>
     </w:p>
     <w:bookmarkEnd w:id="91"/>
-    <w:bookmarkStart w:id="150" w:name="references"/>
+    <w:bookmarkStart w:id="159" w:name="references"/>
     <w:p>
       <w:pPr>
         <w:pStyle w:val="Heading1"/>
@@ -21548,7 +21512,7 @@
         <w:t xml:space="preserve">References</w:t>
       </w:r>
     </w:p>
-    <w:bookmarkStart w:id="149" w:name="refs"/>
+    <w:bookmarkStart w:id="158" w:name="refs"/>
     <w:bookmarkStart w:id="92" w:name="ref-AgrawalEtAlPREDICTING2005"/>
     <w:p>
       <w:pPr>
@@ -21901,25 +21865,49 @@
       </w:r>
     </w:p>
     <w:bookmarkEnd w:id="100"/>
-    <w:bookmarkStart w:id="101" w:name="X6ef878f889213098c200c5acad35595649e9db2"/>
+    <w:bookmarkStart w:id="101" w:name="ref-CNRAEtAlCalifornias2022"/>
     <w:p>
       <w:pPr>
         <w:pStyle w:val="Bibliography"/>
       </w:pPr>
       <w:r>
-        <w:t xml:space="preserve">California State Water Resources Control Board (SWRCB). 1975.</w:t>
-      </w:r>
-      <w:r>
-        <w:t xml:space="preserve"> </w:t>
-      </w:r>
-      <w:r>
-        <w:t xml:space="preserve">“Report on</w:t>
-      </w:r>
-      <w:r>
-        <w:t xml:space="preserve"> </w:t>
-      </w:r>
-      <w:r>
-        <w:t xml:space="preserve">Hydrogeologic Conditions</w:t>
+        <w:t xml:space="preserve">California Natural Resources Agency, California For All, California Department of Water Resources, California Water Boards, California Environmental Protection Agency, and California Department of Food &amp; Agriculture. 2022.</w:t>
+      </w:r>
+      <w:r>
+        <w:t xml:space="preserve"> </w:t>
+      </w:r>
+      <w:r>
+        <w:t xml:space="preserve">“</w:t>
+      </w:r>
+      <w:r>
+        <w:t xml:space="preserve">CALIFORNIA</w:t>
+      </w:r>
+      <w:r>
+        <w:t xml:space="preserve">’</w:t>
+      </w:r>
+      <w:r>
+        <w:t xml:space="preserve">S WATER SUPPLY STRATEGY</w:t>
+      </w:r>
+      <w:r>
+        <w:t xml:space="preserve">:</w:t>
+      </w:r>
+      <w:r>
+        <w:t xml:space="preserve"> </w:t>
+      </w:r>
+      <w:r>
+        <w:t xml:space="preserve">Adapting</w:t>
+      </w:r>
+      <w:r>
+        <w:t xml:space="preserve"> </w:t>
+      </w:r>
+      <w:r>
+        <w:t xml:space="preserve">to a</w:t>
+      </w:r>
+      <w:r>
+        <w:t xml:space="preserve"> </w:t>
+      </w:r>
+      <w:r>
+        <w:t xml:space="preserve">Hotter</w:t>
       </w:r>
       <w:r>
         <w:t xml:space="preserve">,</w:t>
@@ -21928,78 +21916,112 @@
         <w:t xml:space="preserve"> </w:t>
       </w:r>
       <w:r>
-        <w:t xml:space="preserve">Scott River Valley</w:t>
-      </w:r>
-      <w:r>
-        <w:t xml:space="preserve">,</w:t>
-      </w:r>
-      <w:r>
-        <w:t xml:space="preserve"> </w:t>
-      </w:r>
-      <w:r>
-        <w:t xml:space="preserve">Scott River Valley</w:t>
+        <w:t xml:space="preserve">Drier Future</w:t>
       </w:r>
       <w:r>
         <w:t xml:space="preserve">.”</w:t>
       </w:r>
     </w:p>
     <w:bookmarkEnd w:id="101"/>
-    <w:bookmarkStart w:id="102" w:name="ref-CarpenterAccurately2024"/>
+    <w:bookmarkStart w:id="102" w:name="X6ef878f889213098c200c5acad35595649e9db2"/>
     <w:p>
       <w:pPr>
         <w:pStyle w:val="Bibliography"/>
       </w:pPr>
       <w:r>
-        <w:t xml:space="preserve">Carpenter, Cameron. 2024.</w:t>
-      </w:r>
-      <w:r>
-        <w:t xml:space="preserve"> </w:t>
-      </w:r>
-      <w:r>
-        <w:t xml:space="preserve">“Accurately</w:t>
-      </w:r>
-      <w:r>
-        <w:t xml:space="preserve"> </w:t>
-      </w:r>
-      <w:r>
-        <w:t xml:space="preserve">Identifying Functional Flow Metrics</w:t>
-      </w:r>
-      <w:r>
-        <w:t xml:space="preserve"> </w:t>
-      </w:r>
-      <w:r>
-        <w:t xml:space="preserve">in</w:t>
-      </w:r>
-      <w:r>
-        <w:t xml:space="preserve"> </w:t>
-      </w:r>
-      <w:r>
-        <w:t xml:space="preserve">Flashy</w:t>
-      </w:r>
-      <w:r>
-        <w:t xml:space="preserve"> </w:t>
-      </w:r>
-      <w:r>
-        <w:t xml:space="preserve">and</w:t>
-      </w:r>
-      <w:r>
-        <w:t xml:space="preserve"> </w:t>
-      </w:r>
-      <w:r>
-        <w:t xml:space="preserve">Highly Altered Stream Systems</w:t>
+        <w:t xml:space="preserve">California State Water Resources Control Board (SWRCB). 1975.</w:t>
+      </w:r>
+      <w:r>
+        <w:t xml:space="preserve"> </w:t>
+      </w:r>
+      <w:r>
+        <w:t xml:space="preserve">“Report on</w:t>
+      </w:r>
+      <w:r>
+        <w:t xml:space="preserve"> </w:t>
+      </w:r>
+      <w:r>
+        <w:t xml:space="preserve">Hydrogeologic Conditions</w:t>
+      </w:r>
+      <w:r>
+        <w:t xml:space="preserve">,</w:t>
+      </w:r>
+      <w:r>
+        <w:t xml:space="preserve"> </w:t>
+      </w:r>
+      <w:r>
+        <w:t xml:space="preserve">Scott River Valley</w:t>
+      </w:r>
+      <w:r>
+        <w:t xml:space="preserve">,</w:t>
+      </w:r>
+      <w:r>
+        <w:t xml:space="preserve"> </w:t>
+      </w:r>
+      <w:r>
+        <w:t xml:space="preserve">Scott River Valley</w:t>
       </w:r>
       <w:r>
         <w:t xml:space="preserve">.”</w:t>
-      </w:r>
-      <w:r>
-        <w:t xml:space="preserve"> </w:t>
-      </w:r>
-      <w:r>
-        <w:t xml:space="preserve">Master’s thesis, University of California, Davis.</w:t>
       </w:r>
     </w:p>
     <w:bookmarkEnd w:id="102"/>
-    <w:bookmarkStart w:id="104" w:name="ref-CarterSheafferAlfalfa1983"/>
+    <w:bookmarkStart w:id="103" w:name="ref-CarpenterAccurately2024"/>
+    <w:p>
+      <w:pPr>
+        <w:pStyle w:val="Bibliography"/>
+      </w:pPr>
+      <w:r>
+        <w:t xml:space="preserve">Carpenter, Cameron. 2024.</w:t>
+      </w:r>
+      <w:r>
+        <w:t xml:space="preserve"> </w:t>
+      </w:r>
+      <w:r>
+        <w:t xml:space="preserve">“Accurately</w:t>
+      </w:r>
+      <w:r>
+        <w:t xml:space="preserve"> </w:t>
+      </w:r>
+      <w:r>
+        <w:t xml:space="preserve">Identifying Functional Flow Metrics</w:t>
+      </w:r>
+      <w:r>
+        <w:t xml:space="preserve"> </w:t>
+      </w:r>
+      <w:r>
+        <w:t xml:space="preserve">in</w:t>
+      </w:r>
+      <w:r>
+        <w:t xml:space="preserve"> </w:t>
+      </w:r>
+      <w:r>
+        <w:t xml:space="preserve">Flashy</w:t>
+      </w:r>
+      <w:r>
+        <w:t xml:space="preserve"> </w:t>
+      </w:r>
+      <w:r>
+        <w:t xml:space="preserve">and</w:t>
+      </w:r>
+      <w:r>
+        <w:t xml:space="preserve"> </w:t>
+      </w:r>
+      <w:r>
+        <w:t xml:space="preserve">Highly Altered Stream Systems</w:t>
+      </w:r>
+      <w:r>
+        <w:t xml:space="preserve">.”</w:t>
+      </w:r>
+      <w:r>
+        <w:t xml:space="preserve"> </w:t>
+      </w:r>
+      <w:r>
+        <w:t xml:space="preserve">Master’s thesis, University of California, Davis.</w:t>
+      </w:r>
+    </w:p>
+    <w:bookmarkEnd w:id="103"/>
+    <w:bookmarkStart w:id="105" w:name="ref-CarterSheafferAlfalfa1983"/>
     <w:p>
       <w:pPr>
         <w:pStyle w:val="Bibliography"/>
@@ -22119,7 +22141,7 @@
       <w:r>
         <w:t xml:space="preserve"> </w:t>
       </w:r>
-      <w:hyperlink r:id="rId103">
+      <w:hyperlink r:id="rId104">
         <w:r>
           <w:rPr>
             <w:rStyle w:val="Hyperlink"/>
@@ -22131,8 +22153,8 @@
         <w:t xml:space="preserve">.</w:t>
       </w:r>
     </w:p>
-    <w:bookmarkEnd w:id="104"/>
-    <w:bookmarkStart w:id="106" w:name="ref-CohonMarksMultiobjective1973"/>
+    <w:bookmarkEnd w:id="105"/>
+    <w:bookmarkStart w:id="107" w:name="ref-CohonMarksMultiobjective1973"/>
     <w:p>
       <w:pPr>
         <w:pStyle w:val="Bibliography"/>
@@ -22165,7 +22187,7 @@
       <w:r>
         <w:t xml:space="preserve"> </w:t>
       </w:r>
-      <w:hyperlink r:id="rId105">
+      <w:hyperlink r:id="rId106">
         <w:r>
           <w:rPr>
             <w:rStyle w:val="Hyperlink"/>
@@ -22177,8 +22199,8 @@
         <w:t xml:space="preserve">.</w:t>
       </w:r>
     </w:p>
-    <w:bookmarkEnd w:id="106"/>
-    <w:bookmarkStart w:id="107" w:name="ref-FogliaEtAlScott2013"/>
+    <w:bookmarkEnd w:id="107"/>
+    <w:bookmarkStart w:id="108" w:name="ref-FogliaEtAlScott2013"/>
     <w:p>
       <w:pPr>
         <w:pStyle w:val="Bibliography"/>
@@ -22233,53 +22255,53 @@
       </w:r>
       <w:r>
         <w:t xml:space="preserve">Davis, CA: North Coast Regional Water Quality Control Board.</w:t>
-      </w:r>
-    </w:p>
-    <w:bookmarkEnd w:id="107"/>
-    <w:bookmarkStart w:id="108" w:name="Xff198d1a9510a26c6b6a97c9924d7fdc8be1418"/>
-    <w:p>
-      <w:pPr>
-        <w:pStyle w:val="Bibliography"/>
-      </w:pPr>
-      <w:r>
-        <w:t xml:space="preserve">Fox Canyon Groundwater Management Agency. 2019.</w:t>
-      </w:r>
-      <w:r>
-        <w:t xml:space="preserve"> </w:t>
-      </w:r>
-      <w:r>
-        <w:t xml:space="preserve">“Groundwater</w:t>
-      </w:r>
-      <w:r>
-        <w:t xml:space="preserve"> </w:t>
-      </w:r>
-      <w:r>
-        <w:t xml:space="preserve">Sustainability Plan</w:t>
-      </w:r>
-      <w:r>
-        <w:t xml:space="preserve"> </w:t>
-      </w:r>
-      <w:r>
-        <w:t xml:space="preserve">for the</w:t>
-      </w:r>
-      <w:r>
-        <w:t xml:space="preserve"> </w:t>
-      </w:r>
-      <w:r>
-        <w:t xml:space="preserve">Oxnard Subbasin</w:t>
-      </w:r>
-      <w:r>
-        <w:t xml:space="preserve">.”</w:t>
-      </w:r>
-      <w:r>
-        <w:t xml:space="preserve"> </w:t>
-      </w:r>
-      <w:r>
-        <w:t xml:space="preserve">Ventura, CA: Fox Canyon Groundwater Manegement Agency.</w:t>
       </w:r>
     </w:p>
     <w:bookmarkEnd w:id="108"/>
-    <w:bookmarkStart w:id="110" w:name="ref-FreemanWICKED2000"/>
+    <w:bookmarkStart w:id="109" w:name="Xff198d1a9510a26c6b6a97c9924d7fdc8be1418"/>
+    <w:p>
+      <w:pPr>
+        <w:pStyle w:val="Bibliography"/>
+      </w:pPr>
+      <w:r>
+        <w:t xml:space="preserve">Fox Canyon Groundwater Management Agency. 2019.</w:t>
+      </w:r>
+      <w:r>
+        <w:t xml:space="preserve"> </w:t>
+      </w:r>
+      <w:r>
+        <w:t xml:space="preserve">“Groundwater</w:t>
+      </w:r>
+      <w:r>
+        <w:t xml:space="preserve"> </w:t>
+      </w:r>
+      <w:r>
+        <w:t xml:space="preserve">Sustainability Plan</w:t>
+      </w:r>
+      <w:r>
+        <w:t xml:space="preserve"> </w:t>
+      </w:r>
+      <w:r>
+        <w:t xml:space="preserve">for the</w:t>
+      </w:r>
+      <w:r>
+        <w:t xml:space="preserve"> </w:t>
+      </w:r>
+      <w:r>
+        <w:t xml:space="preserve">Oxnard Subbasin</w:t>
+      </w:r>
+      <w:r>
+        <w:t xml:space="preserve">.”</w:t>
+      </w:r>
+      <w:r>
+        <w:t xml:space="preserve"> </w:t>
+      </w:r>
+      <w:r>
+        <w:t xml:space="preserve">Ventura, CA: Fox Canyon Groundwater Manegement Agency.</w:t>
+      </w:r>
+    </w:p>
+    <w:bookmarkEnd w:id="109"/>
+    <w:bookmarkStart w:id="111" w:name="ref-FreemanWICKED2000"/>
     <w:p>
       <w:pPr>
         <w:pStyle w:val="Bibliography"/>
@@ -22327,7 +22349,7 @@
       <w:r>
         <w:t xml:space="preserve"> </w:t>
       </w:r>
-      <w:hyperlink r:id="rId109">
+      <w:hyperlink r:id="rId110">
         <w:r>
           <w:rPr>
             <w:rStyle w:val="Hyperlink"/>
@@ -22339,8 +22361,8 @@
         <w:t xml:space="preserve">.</w:t>
       </w:r>
     </w:p>
-    <w:bookmarkEnd w:id="110"/>
-    <w:bookmarkStart w:id="111" w:name="ref-HarterHinesSCOTT2008"/>
+    <w:bookmarkEnd w:id="111"/>
+    <w:bookmarkStart w:id="112" w:name="ref-HarterHinesSCOTT2008"/>
     <w:p>
       <w:pPr>
         <w:pStyle w:val="Bibliography"/>
@@ -22367,8 +22389,8 @@
         <w:t xml:space="preserve">University of California, Davis.</w:t>
       </w:r>
     </w:p>
-    <w:bookmarkEnd w:id="111"/>
-    <w:bookmarkStart w:id="113" w:name="ref-KapelanEtAlMultiobjective2005"/>
+    <w:bookmarkEnd w:id="112"/>
+    <w:bookmarkStart w:id="114" w:name="ref-KapelanEtAlMultiobjective2005"/>
     <w:p>
       <w:pPr>
         <w:pStyle w:val="Bibliography"/>
@@ -22401,7 +22423,7 @@
       <w:r>
         <w:t xml:space="preserve"> </w:t>
       </w:r>
-      <w:hyperlink r:id="rId112">
+      <w:hyperlink r:id="rId113">
         <w:r>
           <w:rPr>
             <w:rStyle w:val="Hyperlink"/>
@@ -22413,8 +22435,8 @@
         <w:t xml:space="preserve">.</w:t>
       </w:r>
     </w:p>
-    <w:bookmarkEnd w:id="113"/>
-    <w:bookmarkStart w:id="114" w:name="ref-KnechtleGiudice20192020"/>
+    <w:bookmarkEnd w:id="114"/>
+    <w:bookmarkStart w:id="115" w:name="ref-KnechtleGiudice20192020"/>
     <w:p>
       <w:pPr>
         <w:pStyle w:val="Bibliography"/>
@@ -22447,8 +22469,8 @@
         <w:t xml:space="preserve">.</w:t>
       </w:r>
     </w:p>
-    <w:bookmarkEnd w:id="114"/>
-    <w:bookmarkStart w:id="116" w:name="ref-KoubaEtAlWatershedSpecific2025"/>
+    <w:bookmarkEnd w:id="115"/>
+    <w:bookmarkStart w:id="117" w:name="ref-KoubaEtAlWatershedSpecific2025"/>
     <w:p>
       <w:pPr>
         <w:pStyle w:val="Bibliography"/>
@@ -22502,7 +22524,7 @@
       <w:r>
         <w:t xml:space="preserve"> </w:t>
       </w:r>
-      <w:hyperlink r:id="rId115">
+      <w:hyperlink r:id="rId116">
         <w:r>
           <w:rPr>
             <w:rStyle w:val="Hyperlink"/>
@@ -22514,8 +22536,8 @@
         <w:t xml:space="preserve">.</w:t>
       </w:r>
     </w:p>
-    <w:bookmarkEnd w:id="116"/>
-    <w:bookmarkStart w:id="118" w:name="ref-MackGeology1958"/>
+    <w:bookmarkEnd w:id="117"/>
+    <w:bookmarkStart w:id="119" w:name="ref-MackGeology1958"/>
     <w:p>
       <w:pPr>
         <w:pStyle w:val="Bibliography"/>
@@ -22565,7 +22587,7 @@
       <w:r>
         <w:t xml:space="preserve"> </w:t>
       </w:r>
-      <w:hyperlink r:id="rId117">
+      <w:hyperlink r:id="rId118">
         <w:r>
           <w:rPr>
             <w:rStyle w:val="Hyperlink"/>
@@ -22577,45 +22599,14 @@
         <w:t xml:space="preserve">.</w:t>
       </w:r>
     </w:p>
-    <w:bookmarkEnd w:id="118"/>
-    <w:bookmarkStart w:id="119" w:name="ref-MagranetScott2015a"/>
+    <w:bookmarkEnd w:id="119"/>
+    <w:bookmarkStart w:id="120" w:name="ref-MagranetScott2015a"/>
     <w:p>
       <w:pPr>
         <w:pStyle w:val="Bibliography"/>
       </w:pPr>
       <w:r>
         <w:t xml:space="preserve">Magranet, Lindsay. 2015.</w:t>
-      </w:r>
-      <w:r>
-        <w:t xml:space="preserve"> </w:t>
-      </w:r>
-      <w:r>
-        <w:t xml:space="preserve">“Scott</w:t>
-      </w:r>
-      <w:r>
-        <w:t xml:space="preserve"> </w:t>
-      </w:r>
-      <w:r>
-        <w:t xml:space="preserve">River Fall Chinook Spawning Ground Surveys</w:t>
-      </w:r>
-      <w:r>
-        <w:t xml:space="preserve">.”</w:t>
-      </w:r>
-      <w:r>
-        <w:t xml:space="preserve"> </w:t>
-      </w:r>
-      <w:r>
-        <w:t xml:space="preserve">Etna, CA: Siskiyou Resource Conservation District.</w:t>
-      </w:r>
-    </w:p>
-    <w:bookmarkEnd w:id="119"/>
-    <w:bookmarkStart w:id="120" w:name="ref-MagranetScott2017"/>
-    <w:p>
-      <w:pPr>
-        <w:pStyle w:val="Bibliography"/>
-      </w:pPr>
-      <w:r>
-        <w:t xml:space="preserve">———. 2017.</w:t>
       </w:r>
       <w:r>
         <w:t xml:space="preserve"> </w:t>
@@ -22640,13 +22631,13 @@
       </w:r>
     </w:p>
     <w:bookmarkEnd w:id="120"/>
-    <w:bookmarkStart w:id="121" w:name="ref-MagranetScott2018"/>
+    <w:bookmarkStart w:id="121" w:name="ref-MagranetScott2017"/>
     <w:p>
       <w:pPr>
         <w:pStyle w:val="Bibliography"/>
       </w:pPr>
       <w:r>
-        <w:t xml:space="preserve">———. 2018.</w:t>
+        <w:t xml:space="preserve">———. 2017.</w:t>
       </w:r>
       <w:r>
         <w:t xml:space="preserve"> </w:t>
@@ -22659,18 +22650,6 @@
       </w:r>
       <w:r>
         <w:t xml:space="preserve">River Fall Chinook Spawning Ground Surveys</w:t>
-      </w:r>
-      <w:r>
-        <w:t xml:space="preserve"> </w:t>
-      </w:r>
-      <w:r>
-        <w:t xml:space="preserve">2017</w:t>
-      </w:r>
-      <w:r>
-        <w:t xml:space="preserve"> </w:t>
-      </w:r>
-      <w:r>
-        <w:t xml:space="preserve">Season</w:t>
       </w:r>
       <w:r>
         <w:t xml:space="preserve">.”</w:t>
@@ -22683,13 +22662,13 @@
       </w:r>
     </w:p>
     <w:bookmarkEnd w:id="121"/>
-    <w:bookmarkStart w:id="122" w:name="ref-MagranetYokelScott2017"/>
+    <w:bookmarkStart w:id="122" w:name="ref-MagranetScott2018"/>
     <w:p>
       <w:pPr>
         <w:pStyle w:val="Bibliography"/>
       </w:pPr>
       <w:r>
-        <w:t xml:space="preserve">Magranet, Lindsay, and Erich Yokel. 2017.</w:t>
+        <w:t xml:space="preserve">———. 2018.</w:t>
       </w:r>
       <w:r>
         <w:t xml:space="preserve"> </w:t>
@@ -22701,13 +22680,13 @@
         <w:t xml:space="preserve"> </w:t>
       </w:r>
       <w:r>
-        <w:t xml:space="preserve">River Adult Coho Spawning Ground Surveys</w:t>
-      </w:r>
-      <w:r>
-        <w:t xml:space="preserve"> </w:t>
-      </w:r>
-      <w:r>
-        <w:t xml:space="preserve">2016-2017</w:t>
+        <w:t xml:space="preserve">River Fall Chinook Spawning Ground Surveys</w:t>
+      </w:r>
+      <w:r>
+        <w:t xml:space="preserve"> </w:t>
+      </w:r>
+      <w:r>
+        <w:t xml:space="preserve">2017</w:t>
       </w:r>
       <w:r>
         <w:t xml:space="preserve"> </w:t>
@@ -22726,7 +22705,50 @@
       </w:r>
     </w:p>
     <w:bookmarkEnd w:id="122"/>
-    <w:bookmarkStart w:id="124" w:name="ref-MahoneyRoodStreamflow1998"/>
+    <w:bookmarkStart w:id="123" w:name="ref-MagranetYokelScott2017"/>
+    <w:p>
+      <w:pPr>
+        <w:pStyle w:val="Bibliography"/>
+      </w:pPr>
+      <w:r>
+        <w:t xml:space="preserve">Magranet, Lindsay, and Erich Yokel. 2017.</w:t>
+      </w:r>
+      <w:r>
+        <w:t xml:space="preserve"> </w:t>
+      </w:r>
+      <w:r>
+        <w:t xml:space="preserve">“Scott</w:t>
+      </w:r>
+      <w:r>
+        <w:t xml:space="preserve"> </w:t>
+      </w:r>
+      <w:r>
+        <w:t xml:space="preserve">River Adult Coho Spawning Ground Surveys</w:t>
+      </w:r>
+      <w:r>
+        <w:t xml:space="preserve"> </w:t>
+      </w:r>
+      <w:r>
+        <w:t xml:space="preserve">2016-2017</w:t>
+      </w:r>
+      <w:r>
+        <w:t xml:space="preserve"> </w:t>
+      </w:r>
+      <w:r>
+        <w:t xml:space="preserve">Season</w:t>
+      </w:r>
+      <w:r>
+        <w:t xml:space="preserve">.”</w:t>
+      </w:r>
+      <w:r>
+        <w:t xml:space="preserve"> </w:t>
+      </w:r>
+      <w:r>
+        <w:t xml:space="preserve">Etna, CA: Siskiyou Resource Conservation District.</w:t>
+      </w:r>
+    </w:p>
+    <w:bookmarkEnd w:id="123"/>
+    <w:bookmarkStart w:id="125" w:name="ref-MahoneyRoodStreamflow1998"/>
     <w:p>
       <w:pPr>
         <w:pStyle w:val="Bibliography"/>
@@ -22768,7 +22790,7 @@
       <w:r>
         <w:t xml:space="preserve"> </w:t>
       </w:r>
-      <w:hyperlink r:id="rId123">
+      <w:hyperlink r:id="rId124">
         <w:r>
           <w:rPr>
             <w:rStyle w:val="Hyperlink"/>
@@ -22780,8 +22802,8 @@
         <w:t xml:space="preserve">.</w:t>
       </w:r>
     </w:p>
-    <w:bookmarkEnd w:id="124"/>
-    <w:bookmarkStart w:id="125" w:name="ref-McMahonHabitat1983"/>
+    <w:bookmarkEnd w:id="125"/>
+    <w:bookmarkStart w:id="126" w:name="ref-McMahonHabitat1983"/>
     <w:p>
       <w:pPr>
         <w:pStyle w:val="Bibliography"/>
@@ -22829,8 +22851,87 @@
         <w:t xml:space="preserve">.</w:t>
       </w:r>
     </w:p>
-    <w:bookmarkEnd w:id="125"/>
-    <w:bookmarkStart w:id="127" w:name="ref-MonarchiEtAlInteractive1973"/>
+    <w:bookmarkEnd w:id="126"/>
+    <w:bookmarkStart w:id="128" w:name="ref-MillsDoakKeystoneSpecies1993"/>
+    <w:p>
+      <w:pPr>
+        <w:pStyle w:val="Bibliography"/>
+      </w:pPr>
+      <w:r>
+        <w:t xml:space="preserve">Mills, L. Scott, and Daniel F. Doak. 1993.</w:t>
+      </w:r>
+      <w:r>
+        <w:t xml:space="preserve"> </w:t>
+      </w:r>
+      <w:r>
+        <w:t xml:space="preserve">“The</w:t>
+      </w:r>
+      <w:r>
+        <w:t xml:space="preserve"> </w:t>
+      </w:r>
+      <w:r>
+        <w:t xml:space="preserve">Keystone-Species Concept</w:t>
+      </w:r>
+      <w:r>
+        <w:t xml:space="preserve"> </w:t>
+      </w:r>
+      <w:r>
+        <w:t xml:space="preserve">in</w:t>
+      </w:r>
+      <w:r>
+        <w:t xml:space="preserve"> </w:t>
+      </w:r>
+      <w:r>
+        <w:t xml:space="preserve">Ecology</w:t>
+      </w:r>
+      <w:r>
+        <w:t xml:space="preserve"> </w:t>
+      </w:r>
+      <w:r>
+        <w:t xml:space="preserve">and</w:t>
+      </w:r>
+      <w:r>
+        <w:t xml:space="preserve"> </w:t>
+      </w:r>
+      <w:r>
+        <w:t xml:space="preserve">Conservation</w:t>
+      </w:r>
+      <w:r>
+        <w:t xml:space="preserve">.”</w:t>
+      </w:r>
+      <w:r>
+        <w:t xml:space="preserve"> </w:t>
+      </w:r>
+      <w:r>
+        <w:rPr>
+          <w:i/>
+          <w:iCs/>
+        </w:rPr>
+        <w:t xml:space="preserve">BioScience</w:t>
+      </w:r>
+      <w:r>
+        <w:t xml:space="preserve"> </w:t>
+      </w:r>
+      <w:r>
+        <w:t xml:space="preserve">43 (4): 219–24.</w:t>
+      </w:r>
+      <w:r>
+        <w:t xml:space="preserve"> </w:t>
+      </w:r>
+      <w:hyperlink r:id="rId127">
+        <w:r>
+          <w:rPr>
+            <w:rStyle w:val="Hyperlink"/>
+          </w:rPr>
+          <w:t xml:space="preserve">https://doi.org/10.2307/1312122</w:t>
+        </w:r>
+      </w:hyperlink>
+      <w:r>
+        <w:t xml:space="preserve">.</w:t>
+      </w:r>
+    </w:p>
+    <w:bookmarkEnd w:id="128"/>
+    <w:bookmarkStart w:id="130" w:name="ref-MonarchiEtAlInteractive1973"/>
     <w:p>
       <w:pPr>
         <w:pStyle w:val="Bibliography"/>
@@ -22875,7 +22976,7 @@
       <w:r>
         <w:t xml:space="preserve"> </w:t>
       </w:r>
-      <w:hyperlink r:id="rId126">
+      <w:hyperlink r:id="rId129">
         <w:r>
           <w:rPr>
             <w:rStyle w:val="Hyperlink"/>
@@ -22887,8 +22988,8 @@
         <w:t xml:space="preserve">.</w:t>
       </w:r>
     </w:p>
-    <w:bookmarkEnd w:id="127"/>
-    <w:bookmarkStart w:id="128" w:name="ref-MoyleCoho2002"/>
+    <w:bookmarkEnd w:id="130"/>
+    <w:bookmarkStart w:id="131" w:name="ref-MoyleCoho2002"/>
     <w:p>
       <w:pPr>
         <w:pStyle w:val="Bibliography"/>
@@ -22991,8 +23092,8 @@
         <w:t xml:space="preserve">, 245–51. University of California Press.</w:t>
       </w:r>
     </w:p>
-    <w:bookmarkEnd w:id="128"/>
-    <w:bookmarkStart w:id="130" w:name="ref-NordgrenEtAlSupporting2016"/>
+    <w:bookmarkEnd w:id="131"/>
+    <w:bookmarkStart w:id="133" w:name="ref-NordgrenEtAlSupporting2016"/>
     <w:p>
       <w:pPr>
         <w:pStyle w:val="Bibliography"/>
@@ -23037,7 +23138,7 @@
       <w:r>
         <w:t xml:space="preserve"> </w:t>
       </w:r>
-      <w:hyperlink r:id="rId129">
+      <w:hyperlink r:id="rId132">
         <w:r>
           <w:rPr>
             <w:rStyle w:val="Hyperlink"/>
@@ -23049,8 +23150,8 @@
         <w:t xml:space="preserve">.</w:t>
       </w:r>
     </w:p>
-    <w:bookmarkEnd w:id="130"/>
-    <w:bookmarkStart w:id="131" w:name="ref-ParetoCours1896"/>
+    <w:bookmarkEnd w:id="133"/>
+    <w:bookmarkStart w:id="134" w:name="ref-ParetoCours1896"/>
     <w:p>
       <w:pPr>
         <w:pStyle w:val="Bibliography"/>
@@ -23100,8 +23201,8 @@
         <w:t xml:space="preserve">. Lausanne.</w:t>
       </w:r>
     </w:p>
-    <w:bookmarkEnd w:id="131"/>
-    <w:bookmarkStart w:id="133" w:name="ref-PattersonEtAlHydrologic2020"/>
+    <w:bookmarkEnd w:id="134"/>
+    <w:bookmarkStart w:id="136" w:name="ref-PattersonEtAlHydrologic2020"/>
     <w:p>
       <w:pPr>
         <w:pStyle w:val="Bibliography"/>
@@ -23134,7 +23235,7 @@
       <w:r>
         <w:t xml:space="preserve"> </w:t>
       </w:r>
-      <w:hyperlink r:id="rId132">
+      <w:hyperlink r:id="rId135">
         <w:r>
           <w:rPr>
             <w:rStyle w:val="Hyperlink"/>
@@ -23146,252 +23247,386 @@
         <w:t xml:space="preserve">.</w:t>
       </w:r>
     </w:p>
-    <w:bookmarkEnd w:id="133"/>
-    <w:bookmarkStart w:id="134" w:name="X35601437fc25b0fdd92b478f2f9ddeaed3398df"/>
+    <w:bookmarkEnd w:id="136"/>
+    <w:bookmarkStart w:id="138" w:name="ref-PoffEtAlNatural1997"/>
     <w:p>
       <w:pPr>
         <w:pStyle w:val="Bibliography"/>
       </w:pPr>
       <w:r>
-        <w:t xml:space="preserve">Scott River Watershed Council. 2018.</w:t>
-      </w:r>
-      <w:r>
-        <w:t xml:space="preserve"> </w:t>
-      </w:r>
-      <w:r>
-        <w:t xml:space="preserve">“Restoring</w:t>
-      </w:r>
-      <w:r>
-        <w:t xml:space="preserve"> </w:t>
-      </w:r>
-      <w:r>
-        <w:t xml:space="preserve">Priority Coho Habitat</w:t>
-      </w:r>
-      <w:r>
-        <w:t xml:space="preserve"> </w:t>
-      </w:r>
-      <w:r>
-        <w:t xml:space="preserve">in the</w:t>
-      </w:r>
-      <w:r>
-        <w:t xml:space="preserve"> </w:t>
-      </w:r>
-      <w:r>
-        <w:t xml:space="preserve">Scott River Watershed Modeling</w:t>
-      </w:r>
-      <w:r>
-        <w:t xml:space="preserve"> </w:t>
-      </w:r>
-      <w:r>
-        <w:t xml:space="preserve">and</w:t>
-      </w:r>
-      <w:r>
-        <w:t xml:space="preserve"> </w:t>
-      </w:r>
-      <w:r>
-        <w:t xml:space="preserve">Planning Report</w:t>
+        <w:t xml:space="preserve">Poff, N. LeRoy, J. David Allan, Mark B. Bain, James R. Karr, Karen L. Prestegaard, Brian D. Richter, Richard E. Sparks, and Julie C. Stromberg. 1997.</w:t>
+      </w:r>
+      <w:r>
+        <w:t xml:space="preserve"> </w:t>
+      </w:r>
+      <w:r>
+        <w:t xml:space="preserve">“The</w:t>
+      </w:r>
+      <w:r>
+        <w:t xml:space="preserve"> </w:t>
+      </w:r>
+      <w:r>
+        <w:t xml:space="preserve">Natural Flow Regime</w:t>
       </w:r>
       <w:r>
         <w:t xml:space="preserve">.”</w:t>
       </w:r>
-    </w:p>
-    <w:bookmarkEnd w:id="134"/>
-    <w:bookmarkStart w:id="135" w:name="X334218043bd9d5b07a848a610917fcfef0168db"/>
-    <w:p>
-      <w:pPr>
-        <w:pStyle w:val="Bibliography"/>
-      </w:pPr>
-      <w:r>
-        <w:t xml:space="preserve">Scott Valley Area Plan Committee. 1980.</w:t>
-      </w:r>
-      <w:r>
-        <w:t xml:space="preserve"> </w:t>
-      </w:r>
-      <w:r>
-        <w:t xml:space="preserve">“Scott</w:t>
-      </w:r>
-      <w:r>
-        <w:t xml:space="preserve"> </w:t>
-      </w:r>
-      <w:r>
-        <w:t xml:space="preserve">Valley Area Plan</w:t>
-      </w:r>
-      <w:r>
-        <w:t xml:space="preserve">.”</w:t>
-      </w:r>
-      <w:r>
-        <w:t xml:space="preserve"> </w:t>
-      </w:r>
-      <w:r>
-        <w:t xml:space="preserve">Siskiyou County.</w:t>
-      </w:r>
-    </w:p>
-    <w:bookmarkEnd w:id="135"/>
-    <w:bookmarkStart w:id="136" w:name="ref-SiskiyouCountyScott2021"/>
-    <w:p>
-      <w:pPr>
-        <w:pStyle w:val="Bibliography"/>
-      </w:pPr>
-      <w:r>
-        <w:t xml:space="preserve">Siskiyou County. 2021.</w:t>
-      </w:r>
-      <w:r>
-        <w:t xml:space="preserve"> </w:t>
-      </w:r>
-      <w:r>
-        <w:t xml:space="preserve">“Scott</w:t>
-      </w:r>
-      <w:r>
-        <w:t xml:space="preserve"> </w:t>
-      </w:r>
-      <w:r>
-        <w:t xml:space="preserve">Valley Groundwater Sustainability Plan</w:t>
-      </w:r>
-      <w:r>
-        <w:t xml:space="preserve">.”</w:t>
-      </w:r>
-    </w:p>
-    <w:bookmarkEnd w:id="136"/>
-    <w:bookmarkStart w:id="137" w:name="X2560a5ce8c29a4d10823717cd7284f11df015d4"/>
-    <w:p>
-      <w:pPr>
-        <w:pStyle w:val="Bibliography"/>
-      </w:pPr>
-      <w:r>
-        <w:t xml:space="preserve">State Water Resources Control Board. 2021.</w:t>
-      </w:r>
-      <w:r>
-        <w:t xml:space="preserve"> </w:t>
-      </w:r>
-      <w:r>
-        <w:t xml:space="preserve">“Establishment of</w:t>
-      </w:r>
-      <w:r>
-        <w:t xml:space="preserve"> </w:t>
-      </w:r>
-      <w:r>
-        <w:t xml:space="preserve">Minimum Instream Flow Requirements</w:t>
-      </w:r>
-      <w:r>
-        <w:t xml:space="preserve">,</w:t>
-      </w:r>
-      <w:r>
-        <w:t xml:space="preserve"> </w:t>
-      </w:r>
-      <w:r>
-        <w:t xml:space="preserve">Curtialment Authority</w:t>
-      </w:r>
-      <w:r>
-        <w:t xml:space="preserve">, and</w:t>
-      </w:r>
-      <w:r>
-        <w:t xml:space="preserve"> </w:t>
-      </w:r>
-      <w:r>
-        <w:t xml:space="preserve">Information Order</w:t>
-      </w:r>
-      <w:r>
-        <w:t xml:space="preserve"> </w:t>
-      </w:r>
-      <w:r>
-        <w:t xml:space="preserve">in the</w:t>
-      </w:r>
-      <w:r>
-        <w:t xml:space="preserve"> </w:t>
-      </w:r>
-      <w:r>
-        <w:t xml:space="preserve">Klamath Watershed</w:t>
-      </w:r>
-      <w:r>
-        <w:t xml:space="preserve">.”</w:t>
-      </w:r>
-      <w:r>
-        <w:t xml:space="preserve"> </w:t>
-      </w:r>
-      <w:r>
-        <w:t xml:space="preserve">{{NOTICE OF APPROVAL OF EMERGENCY REGULATORY ACTION}} OAL 2021-0820-05.</w:t>
-      </w:r>
-    </w:p>
-    <w:bookmarkEnd w:id="137"/>
-    <w:bookmarkStart w:id="138" w:name="Xc65d78564b05799285cd4578f858a1851ca0d64"/>
-    <w:p>
-      <w:pPr>
-        <w:pStyle w:val="Bibliography"/>
-      </w:pPr>
-      <w:r>
-        <w:t xml:space="preserve">———. 2024a.</w:t>
-      </w:r>
-      <w:r>
-        <w:t xml:space="preserve"> </w:t>
-      </w:r>
-      <w:r>
-        <w:t xml:space="preserve">“Establishment of</w:t>
-      </w:r>
-      <w:r>
-        <w:t xml:space="preserve"> </w:t>
-      </w:r>
-      <w:r>
-        <w:t xml:space="preserve">Minimum Instream Flow Requirements</w:t>
-      </w:r>
-      <w:r>
-        <w:t xml:space="preserve">,</w:t>
-      </w:r>
-      <w:r>
-        <w:t xml:space="preserve"> </w:t>
-      </w:r>
-      <w:r>
-        <w:t xml:space="preserve">Curtialment Authority</w:t>
-      </w:r>
-      <w:r>
-        <w:t xml:space="preserve">, and</w:t>
-      </w:r>
-      <w:r>
-        <w:t xml:space="preserve"> </w:t>
-      </w:r>
-      <w:r>
-        <w:t xml:space="preserve">Information Order</w:t>
-      </w:r>
-      <w:r>
-        <w:t xml:space="preserve"> </w:t>
-      </w:r>
-      <w:r>
-        <w:t xml:space="preserve">in the</w:t>
-      </w:r>
-      <w:r>
-        <w:t xml:space="preserve"> </w:t>
-      </w:r>
-      <w:r>
-        <w:t xml:space="preserve">Scott River</w:t>
-      </w:r>
-      <w:r>
-        <w:t xml:space="preserve"> </w:t>
-      </w:r>
-      <w:r>
-        <w:t xml:space="preserve">and</w:t>
-      </w:r>
-      <w:r>
-        <w:t xml:space="preserve"> </w:t>
-      </w:r>
-      <w:r>
-        <w:t xml:space="preserve">Shasta River Watersheds</w:t>
-      </w:r>
-      <w:r>
-        <w:t xml:space="preserve">.”</w:t>
-      </w:r>
-      <w:r>
-        <w:t xml:space="preserve"> </w:t>
-      </w:r>
-      <w:r>
-        <w:t xml:space="preserve">{{NOTICE OF APPROVAL OF EMERGENCY REGULATORY ACTION}} OAL 2024-0123-03.</w:t>
+      <w:r>
+        <w:t xml:space="preserve"> </w:t>
+      </w:r>
+      <w:r>
+        <w:rPr>
+          <w:i/>
+          <w:iCs/>
+        </w:rPr>
+        <w:t xml:space="preserve">BioScience</w:t>
+      </w:r>
+      <w:r>
+        <w:t xml:space="preserve"> </w:t>
+      </w:r>
+      <w:r>
+        <w:t xml:space="preserve">47 (11): 769–84.</w:t>
+      </w:r>
+      <w:r>
+        <w:t xml:space="preserve"> </w:t>
+      </w:r>
+      <w:hyperlink r:id="rId137">
+        <w:r>
+          <w:rPr>
+            <w:rStyle w:val="Hyperlink"/>
+          </w:rPr>
+          <w:t xml:space="preserve">https://doi.org/10.2307/1313099</w:t>
+        </w:r>
+      </w:hyperlink>
+      <w:r>
+        <w:t xml:space="preserve">.</w:t>
       </w:r>
     </w:p>
     <w:bookmarkEnd w:id="138"/>
-    <w:bookmarkStart w:id="139" w:name="Xa7b10fbb32571a990cee2341e679d296b855974"/>
+    <w:bookmarkStart w:id="140" w:name="ref-RichterEtAlMethod1996"/>
     <w:p>
       <w:pPr>
         <w:pStyle w:val="Bibliography"/>
       </w:pPr>
       <w:r>
+        <w:t xml:space="preserve">Richter, Brian D., Jeffrey V. Baumgartner, Jennifer Powell, and David P. Braun. 1996.</w:t>
+      </w:r>
+      <w:r>
+        <w:t xml:space="preserve"> </w:t>
+      </w:r>
+      <w:r>
+        <w:t xml:space="preserve">“A</w:t>
+      </w:r>
+      <w:r>
+        <w:t xml:space="preserve"> </w:t>
+      </w:r>
+      <w:r>
+        <w:t xml:space="preserve">Method</w:t>
+      </w:r>
+      <w:r>
+        <w:t xml:space="preserve"> </w:t>
+      </w:r>
+      <w:r>
+        <w:t xml:space="preserve">for</w:t>
+      </w:r>
+      <w:r>
+        <w:t xml:space="preserve"> </w:t>
+      </w:r>
+      <w:r>
+        <w:t xml:space="preserve">Assessing Hydrologic Alteration</w:t>
+      </w:r>
+      <w:r>
+        <w:t xml:space="preserve"> </w:t>
+      </w:r>
+      <w:r>
+        <w:t xml:space="preserve">Within</w:t>
+      </w:r>
+      <w:r>
+        <w:t xml:space="preserve"> </w:t>
+      </w:r>
+      <w:r>
+        <w:t xml:space="preserve">Ecosystems</w:t>
+      </w:r>
+      <w:r>
+        <w:t xml:space="preserve">.”</w:t>
+      </w:r>
+      <w:r>
+        <w:t xml:space="preserve"> </w:t>
+      </w:r>
+      <w:r>
+        <w:rPr>
+          <w:i/>
+          <w:iCs/>
+        </w:rPr>
+        <w:t xml:space="preserve">Conservation Biology</w:t>
+      </w:r>
+      <w:r>
+        <w:t xml:space="preserve"> </w:t>
+      </w:r>
+      <w:r>
+        <w:t xml:space="preserve">10 (4): 1163–74.</w:t>
+      </w:r>
+      <w:r>
+        <w:t xml:space="preserve"> </w:t>
+      </w:r>
+      <w:hyperlink r:id="rId139">
+        <w:r>
+          <w:rPr>
+            <w:rStyle w:val="Hyperlink"/>
+          </w:rPr>
+          <w:t xml:space="preserve">https://doi.org/10.1046/j.1523-1739.1996.10041163.x</w:t>
+        </w:r>
+      </w:hyperlink>
+      <w:r>
+        <w:t xml:space="preserve">.</w:t>
+      </w:r>
+    </w:p>
+    <w:bookmarkEnd w:id="140"/>
+    <w:bookmarkStart w:id="141" w:name="X35601437fc25b0fdd92b478f2f9ddeaed3398df"/>
+    <w:p>
+      <w:pPr>
+        <w:pStyle w:val="Bibliography"/>
+      </w:pPr>
+      <w:r>
+        <w:t xml:space="preserve">Scott River Watershed Council. 2018.</w:t>
+      </w:r>
+      <w:r>
+        <w:t xml:space="preserve"> </w:t>
+      </w:r>
+      <w:r>
+        <w:t xml:space="preserve">“Restoring</w:t>
+      </w:r>
+      <w:r>
+        <w:t xml:space="preserve"> </w:t>
+      </w:r>
+      <w:r>
+        <w:t xml:space="preserve">Priority Coho Habitat</w:t>
+      </w:r>
+      <w:r>
+        <w:t xml:space="preserve"> </w:t>
+      </w:r>
+      <w:r>
+        <w:t xml:space="preserve">in the</w:t>
+      </w:r>
+      <w:r>
+        <w:t xml:space="preserve"> </w:t>
+      </w:r>
+      <w:r>
+        <w:t xml:space="preserve">Scott River Watershed Modeling</w:t>
+      </w:r>
+      <w:r>
+        <w:t xml:space="preserve"> </w:t>
+      </w:r>
+      <w:r>
+        <w:t xml:space="preserve">and</w:t>
+      </w:r>
+      <w:r>
+        <w:t xml:space="preserve"> </w:t>
+      </w:r>
+      <w:r>
+        <w:t xml:space="preserve">Planning Report</w:t>
+      </w:r>
+      <w:r>
+        <w:t xml:space="preserve">.”</w:t>
+      </w:r>
+    </w:p>
+    <w:bookmarkEnd w:id="141"/>
+    <w:bookmarkStart w:id="142" w:name="X334218043bd9d5b07a848a610917fcfef0168db"/>
+    <w:p>
+      <w:pPr>
+        <w:pStyle w:val="Bibliography"/>
+      </w:pPr>
+      <w:r>
+        <w:t xml:space="preserve">Scott Valley Area Plan Committee. 1980.</w:t>
+      </w:r>
+      <w:r>
+        <w:t xml:space="preserve"> </w:t>
+      </w:r>
+      <w:r>
+        <w:t xml:space="preserve">“Scott</w:t>
+      </w:r>
+      <w:r>
+        <w:t xml:space="preserve"> </w:t>
+      </w:r>
+      <w:r>
+        <w:t xml:space="preserve">Valley Area Plan</w:t>
+      </w:r>
+      <w:r>
+        <w:t xml:space="preserve">.”</w:t>
+      </w:r>
+      <w:r>
+        <w:t xml:space="preserve"> </w:t>
+      </w:r>
+      <w:r>
+        <w:t xml:space="preserve">Siskiyou County.</w:t>
+      </w:r>
+    </w:p>
+    <w:bookmarkEnd w:id="142"/>
+    <w:bookmarkStart w:id="143" w:name="ref-SiskiyouCountyScott2021"/>
+    <w:p>
+      <w:pPr>
+        <w:pStyle w:val="Bibliography"/>
+      </w:pPr>
+      <w:r>
+        <w:t xml:space="preserve">Siskiyou County. 2021.</w:t>
+      </w:r>
+      <w:r>
+        <w:t xml:space="preserve"> </w:t>
+      </w:r>
+      <w:r>
+        <w:t xml:space="preserve">“Scott</w:t>
+      </w:r>
+      <w:r>
+        <w:t xml:space="preserve"> </w:t>
+      </w:r>
+      <w:r>
+        <w:t xml:space="preserve">Valley Groundwater Sustainability Plan</w:t>
+      </w:r>
+      <w:r>
+        <w:t xml:space="preserve">.”</w:t>
+      </w:r>
+    </w:p>
+    <w:bookmarkEnd w:id="143"/>
+    <w:bookmarkStart w:id="144" w:name="X2560a5ce8c29a4d10823717cd7284f11df015d4"/>
+    <w:p>
+      <w:pPr>
+        <w:pStyle w:val="Bibliography"/>
+      </w:pPr>
+      <w:r>
+        <w:t xml:space="preserve">State Water Resources Control Board. 2021.</w:t>
+      </w:r>
+      <w:r>
+        <w:t xml:space="preserve"> </w:t>
+      </w:r>
+      <w:r>
+        <w:t xml:space="preserve">“Establishment of</w:t>
+      </w:r>
+      <w:r>
+        <w:t xml:space="preserve"> </w:t>
+      </w:r>
+      <w:r>
+        <w:t xml:space="preserve">Minimum Instream Flow Requirements</w:t>
+      </w:r>
+      <w:r>
+        <w:t xml:space="preserve">,</w:t>
+      </w:r>
+      <w:r>
+        <w:t xml:space="preserve"> </w:t>
+      </w:r>
+      <w:r>
+        <w:t xml:space="preserve">Curtialment Authority</w:t>
+      </w:r>
+      <w:r>
+        <w:t xml:space="preserve">, and</w:t>
+      </w:r>
+      <w:r>
+        <w:t xml:space="preserve"> </w:t>
+      </w:r>
+      <w:r>
+        <w:t xml:space="preserve">Information Order</w:t>
+      </w:r>
+      <w:r>
+        <w:t xml:space="preserve"> </w:t>
+      </w:r>
+      <w:r>
+        <w:t xml:space="preserve">in the</w:t>
+      </w:r>
+      <w:r>
+        <w:t xml:space="preserve"> </w:t>
+      </w:r>
+      <w:r>
+        <w:t xml:space="preserve">Klamath Watershed</w:t>
+      </w:r>
+      <w:r>
+        <w:t xml:space="preserve">.”</w:t>
+      </w:r>
+      <w:r>
+        <w:t xml:space="preserve"> </w:t>
+      </w:r>
+      <w:r>
+        <w:t xml:space="preserve">{{NOTICE OF APPROVAL OF EMERGENCY REGULATORY ACTION}} OAL 2021-0820-05.</w:t>
+      </w:r>
+    </w:p>
+    <w:bookmarkEnd w:id="144"/>
+    <w:bookmarkStart w:id="145" w:name="Xc65d78564b05799285cd4578f858a1851ca0d64"/>
+    <w:p>
+      <w:pPr>
+        <w:pStyle w:val="Bibliography"/>
+      </w:pPr>
+      <w:r>
+        <w:t xml:space="preserve">———. 2024a.</w:t>
+      </w:r>
+      <w:r>
+        <w:t xml:space="preserve"> </w:t>
+      </w:r>
+      <w:r>
+        <w:t xml:space="preserve">“Establishment of</w:t>
+      </w:r>
+      <w:r>
+        <w:t xml:space="preserve"> </w:t>
+      </w:r>
+      <w:r>
+        <w:t xml:space="preserve">Minimum Instream Flow Requirements</w:t>
+      </w:r>
+      <w:r>
+        <w:t xml:space="preserve">,</w:t>
+      </w:r>
+      <w:r>
+        <w:t xml:space="preserve"> </w:t>
+      </w:r>
+      <w:r>
+        <w:t xml:space="preserve">Curtialment Authority</w:t>
+      </w:r>
+      <w:r>
+        <w:t xml:space="preserve">, and</w:t>
+      </w:r>
+      <w:r>
+        <w:t xml:space="preserve"> </w:t>
+      </w:r>
+      <w:r>
+        <w:t xml:space="preserve">Information Order</w:t>
+      </w:r>
+      <w:r>
+        <w:t xml:space="preserve"> </w:t>
+      </w:r>
+      <w:r>
+        <w:t xml:space="preserve">in the</w:t>
+      </w:r>
+      <w:r>
+        <w:t xml:space="preserve"> </w:t>
+      </w:r>
+      <w:r>
+        <w:t xml:space="preserve">Scott River</w:t>
+      </w:r>
+      <w:r>
+        <w:t xml:space="preserve"> </w:t>
+      </w:r>
+      <w:r>
+        <w:t xml:space="preserve">and</w:t>
+      </w:r>
+      <w:r>
+        <w:t xml:space="preserve"> </w:t>
+      </w:r>
+      <w:r>
+        <w:t xml:space="preserve">Shasta River Watersheds</w:t>
+      </w:r>
+      <w:r>
+        <w:t xml:space="preserve">.”</w:t>
+      </w:r>
+      <w:r>
+        <w:t xml:space="preserve"> </w:t>
+      </w:r>
+      <w:r>
+        <w:t xml:space="preserve">{{NOTICE OF APPROVAL OF EMERGENCY REGULATORY ACTION}} OAL 2024-0123-03.</w:t>
+      </w:r>
+    </w:p>
+    <w:bookmarkEnd w:id="145"/>
+    <w:bookmarkStart w:id="146" w:name="Xa7b10fbb32571a990cee2341e679d296b855974"/>
+    <w:p>
+      <w:pPr>
+        <w:pStyle w:val="Bibliography"/>
+      </w:pPr>
+      <w:r>
         <w:t xml:space="preserve">———. 2024b.</w:t>
       </w:r>
       <w:r>
@@ -23422,8 +23657,66 @@
         <w:t xml:space="preserve">2024-0036.</w:t>
       </w:r>
     </w:p>
-    <w:bookmarkEnd w:id="139"/>
-    <w:bookmarkStart w:id="141" w:name="ref-TolleyEtAlSensitivity2019"/>
+    <w:bookmarkEnd w:id="146"/>
+    <w:bookmarkStart w:id="148" w:name="ref-TharmeGlobal2003"/>
+    <w:p>
+      <w:pPr>
+        <w:pStyle w:val="Bibliography"/>
+      </w:pPr>
+      <w:r>
+        <w:t xml:space="preserve">Tharme, R. E. 2003.</w:t>
+      </w:r>
+      <w:r>
+        <w:t xml:space="preserve"> </w:t>
+      </w:r>
+      <w:r>
+        <w:t xml:space="preserve">“A Global Perspective on Environmental Flow Assessment:</w:t>
+      </w:r>
+      <w:r>
+        <w:t xml:space="preserve"> </w:t>
+      </w:r>
+      <w:r>
+        <w:t xml:space="preserve">Emerging</w:t>
+      </w:r>
+      <w:r>
+        <w:t xml:space="preserve"> </w:t>
+      </w:r>
+      <w:r>
+        <w:t xml:space="preserve">Trends in the Development and Application of Environmental Flow Methodologies for Rivers.”</w:t>
+      </w:r>
+      <w:r>
+        <w:t xml:space="preserve"> </w:t>
+      </w:r>
+      <w:r>
+        <w:rPr>
+          <w:i/>
+          <w:iCs/>
+        </w:rPr>
+        <w:t xml:space="preserve">River Research and Applications</w:t>
+      </w:r>
+      <w:r>
+        <w:t xml:space="preserve"> </w:t>
+      </w:r>
+      <w:r>
+        <w:t xml:space="preserve">19 (5-6): 397–441.</w:t>
+      </w:r>
+      <w:r>
+        <w:t xml:space="preserve"> </w:t>
+      </w:r>
+      <w:hyperlink r:id="rId147">
+        <w:r>
+          <w:rPr>
+            <w:rStyle w:val="Hyperlink"/>
+          </w:rPr>
+          <w:t xml:space="preserve">https://doi.org/10.1002/rra.736</w:t>
+        </w:r>
+      </w:hyperlink>
+      <w:r>
+        <w:t xml:space="preserve">.</w:t>
+      </w:r>
+    </w:p>
+    <w:bookmarkEnd w:id="148"/>
+    <w:bookmarkStart w:id="150" w:name="ref-TolleyEtAlSensitivity2019"/>
     <w:p>
       <w:pPr>
         <w:pStyle w:val="Bibliography"/>
@@ -23513,7 +23806,7 @@
       <w:r>
         <w:t xml:space="preserve"> </w:t>
       </w:r>
-      <w:hyperlink r:id="rId140">
+      <w:hyperlink r:id="rId149">
         <w:r>
           <w:rPr>
             <w:rStyle w:val="Hyperlink"/>
@@ -23525,8 +23818,8 @@
         <w:t xml:space="preserve">.</w:t>
       </w:r>
     </w:p>
-    <w:bookmarkEnd w:id="141"/>
-    <w:bookmarkStart w:id="143" w:name="ref-VanSteenbergenPromoting2006"/>
+    <w:bookmarkEnd w:id="150"/>
+    <w:bookmarkStart w:id="152" w:name="ref-VanSteenbergenPromoting2006"/>
     <w:p>
       <w:pPr>
         <w:pStyle w:val="Bibliography"/>
@@ -23559,7 +23852,7 @@
       <w:r>
         <w:t xml:space="preserve"> </w:t>
       </w:r>
-      <w:hyperlink r:id="rId142">
+      <w:hyperlink r:id="rId151">
         <w:r>
           <w:rPr>
             <w:rStyle w:val="Hyperlink"/>
@@ -23571,8 +23864,8 @@
         <w:t xml:space="preserve">.</w:t>
       </w:r>
     </w:p>
-    <w:bookmarkEnd w:id="143"/>
-    <w:bookmarkStart w:id="145" w:name="ref-YarnellEtAlFunctional2015"/>
+    <w:bookmarkEnd w:id="152"/>
+    <w:bookmarkStart w:id="154" w:name="ref-YarnellEtAlFunctional2015"/>
     <w:p>
       <w:pPr>
         <w:pStyle w:val="Bibliography"/>
@@ -23656,7 +23949,7 @@
       <w:r>
         <w:t xml:space="preserve"> </w:t>
       </w:r>
-      <w:hyperlink r:id="rId144">
+      <w:hyperlink r:id="rId153">
         <w:r>
           <w:rPr>
             <w:rStyle w:val="Hyperlink"/>
@@ -23668,8 +23961,8 @@
         <w:t xml:space="preserve">.</w:t>
       </w:r>
     </w:p>
-    <w:bookmarkEnd w:id="145"/>
-    <w:bookmarkStart w:id="147" w:name="ref-YehBeckerMultiobjective1982"/>
+    <w:bookmarkEnd w:id="154"/>
+    <w:bookmarkStart w:id="156" w:name="ref-YehBeckerMultiobjective1982"/>
     <w:p>
       <w:pPr>
         <w:pStyle w:val="Bibliography"/>
@@ -23702,7 +23995,7 @@
       <w:r>
         <w:t xml:space="preserve"> </w:t>
       </w:r>
-      <w:hyperlink r:id="rId146">
+      <w:hyperlink r:id="rId155">
         <w:r>
           <w:rPr>
             <w:rStyle w:val="Hyperlink"/>
@@ -23714,8 +24007,8 @@
         <w:t xml:space="preserve">.</w:t>
       </w:r>
     </w:p>
-    <w:bookmarkEnd w:id="147"/>
-    <w:bookmarkStart w:id="148" w:name="X8bf5592004e543b04dfcfc3edb39663c8006d78"/>
+    <w:bookmarkEnd w:id="156"/>
+    <w:bookmarkStart w:id="157" w:name="X8bf5592004e543b04dfcfc3edb39663c8006d78"/>
     <w:p>
       <w:pPr>
         <w:pStyle w:val="Bibliography"/>
@@ -23745,222 +24038,14 @@
         <w:t xml:space="preserve">Woodland, CA.</w:t>
       </w:r>
     </w:p>
-    <w:bookmarkEnd w:id="148"/>
-    <w:bookmarkEnd w:id="149"/>
+    <w:bookmarkEnd w:id="157"/>
+    <w:bookmarkEnd w:id="158"/>
     <w:p>
       <w:r>
         <w:br w:type="page"/>
       </w:r>
     </w:p>
-    <w:bookmarkEnd w:id="150"/>
-    <w:bookmarkStart w:id="151" w:name="X6c1a78753bbdca554aba589b0aa85ab8ac746bf"/>
-    <w:p>
-      <w:pPr>
-        <w:pStyle w:val="Heading1"/>
-      </w:pPr>
-      <w:r>
-        <w:rPr>
-          <w:rStyle w:val="SectionNumber"/>
-        </w:rPr>
-        <w:t xml:space="preserve">8</w:t>
-      </w:r>
-      <w:r>
-        <w:tab/>
-      </w:r>
-      <w:r>
-        <w:t xml:space="preserve">Supplement: Fish-Farm Results from all four Hydrologic Benefit function formulations</w:t>
-      </w:r>
-    </w:p>
-    <w:p>
-      <w:pPr>
-        <w:pStyle w:val="FirstParagraph"/>
-      </w:pPr>
-      <w:r>
-        <w:t xml:space="preserve">For each species, across all statistical methods, the coefficients for any single predictor were consistently negative or positive; e.g.,</w:t>
-      </w:r>
-    </w:p>
-    <w:p>
-      <w:pPr>
-        <w:pStyle w:val="BodyText"/>
-      </w:pPr>
-      <w:r>
-        <w:t xml:space="preserve">The Hydrologic Benefit (HB) function is intended to estimate the ecological value (in units of fish production) provided to fish by specific flow values (e.g., timing of fall flow increase; magnitude of dry season flow). This is expressed in conceptual mathematical terms as</w:t>
-      </w:r>
-      <w:r>
-        <w:t xml:space="preserve"> </w:t>
-      </w:r>
-      <m:oMath>
-        <m:r>
-          <m:t>f</m:t>
-        </m:r>
-        <m:r>
-          <m:t>i</m:t>
-        </m:r>
-        <m:r>
-          <m:t>s</m:t>
-        </m:r>
-        <m:r>
-          <m:t>h</m:t>
-        </m:r>
-        <m:r>
-          <m:rPr>
-            <m:sty m:val="p"/>
-          </m:rPr>
-          <m:t>=</m:t>
-        </m:r>
-        <m:r>
-          <m:t>b</m:t>
-        </m:r>
-        <m:r>
-          <m:rPr>
-            <m:sty m:val="p"/>
-          </m:rPr>
-          <m:t>+</m:t>
-        </m:r>
-        <m:sSub>
-          <m:e>
-            <m:r>
-              <m:t>m</m:t>
-            </m:r>
-          </m:e>
-          <m:sub>
-            <m:r>
-              <m:t>1</m:t>
-            </m:r>
-          </m:sub>
-        </m:sSub>
-        <m:r>
-          <m:rPr>
-            <m:sty m:val="p"/>
-          </m:rPr>
-          <m:t>*</m:t>
-        </m:r>
-        <m:r>
-          <m:t>f</m:t>
-        </m:r>
-        <m:r>
-          <m:t>l</m:t>
-        </m:r>
-        <m:r>
-          <m:t>o</m:t>
-        </m:r>
-        <m:sSub>
-          <m:e>
-            <m:r>
-              <m:t>w</m:t>
-            </m:r>
-          </m:e>
-          <m:sub>
-            <m:r>
-              <m:t>1</m:t>
-            </m:r>
-          </m:sub>
-        </m:sSub>
-        <m:r>
-          <m:rPr>
-            <m:sty m:val="p"/>
-          </m:rPr>
-          <m:t>+</m:t>
-        </m:r>
-        <m:sSub>
-          <m:e>
-            <m:r>
-              <m:t>m</m:t>
-            </m:r>
-          </m:e>
-          <m:sub>
-            <m:r>
-              <m:t>1</m:t>
-            </m:r>
-          </m:sub>
-        </m:sSub>
-        <m:r>
-          <m:rPr>
-            <m:sty m:val="p"/>
-          </m:rPr>
-          <m:t>*</m:t>
-        </m:r>
-        <m:r>
-          <m:t>f</m:t>
-        </m:r>
-        <m:r>
-          <m:t>l</m:t>
-        </m:r>
-        <m:r>
-          <m:t>o</m:t>
-        </m:r>
-        <m:sSub>
-          <m:e>
-            <m:r>
-              <m:t>w</m:t>
-            </m:r>
-          </m:e>
-          <m:sub>
-            <m:r>
-              <m:t>2</m:t>
-            </m:r>
-          </m:sub>
-        </m:sSub>
-        <m:r>
-          <m:t> </m:t>
-        </m:r>
-        <m:r>
-          <m:rPr>
-            <m:sty m:val="p"/>
-          </m:rPr>
-          <m:t>⋯</m:t>
-        </m:r>
-      </m:oMath>
-      <w:r>
-        <w:t xml:space="preserve">; see methods in</w:t>
-      </w:r>
-      <w:r>
-        <w:t xml:space="preserve"> </w:t>
-      </w:r>
-      <w:r>
-        <w:t xml:space="preserve">Kouba et al. (2025)</w:t>
-      </w:r>
-      <w:r>
-        <w:t xml:space="preserve"> </w:t>
-      </w:r>
-      <w:r>
-        <w:t xml:space="preserve">for more details. It’s important to note that, in this dataset, only 40-60% of variation in fish outcome was explained in models based on flow data, and the HB function does not constitute a prediction of the number of fish outmigrating in a given year.</w:t>
-      </w:r>
-    </w:p>
-    <w:p>
-      <w:pPr>
-        <w:pStyle w:val="BodyText"/>
-      </w:pPr>
-      <w:r>
-        <w:t xml:space="preserve">Specifically, the results below are based on statistical models, using LASSO regression, of reproductive output for two species of salmon (coho and Chinook) in the Scott River stream system. Reproductive output is expressed in units of outmigrating juvenile abundance and normalized juveniles-per-adult spawner; two reproductive units for two species yields the four HB function formulations.</w:t>
-      </w:r>
-    </w:p>
-    <w:p>
-      <w:pPr>
-        <w:pStyle w:val="BodyText"/>
-      </w:pPr>
-      <w:r>
-        <w:t xml:space="preserve">While MARSS models were used as a tool for identifying important functional flows in</w:t>
-      </w:r>
-      <w:r>
-        <w:t xml:space="preserve"> </w:t>
-      </w:r>
-      <w:r>
-        <w:t xml:space="preserve">(Kouba et al. 2025)</w:t>
-      </w:r>
-      <w:r>
-        <w:t xml:space="preserve">, they are unsuitable for this hydrologic scenario outcome forecasting purpose, because they are autoregressive in nature: the forecasting of future fish outcomes requires historical observations of fish outcomes. Therefore, to use MARSS models in estimating the ecological effects of flow changes under different management scenarios, it would be necessary to have historical fish records collected in an alternate reality under the different management scenarios, which is not possible. Similarly, LASSO models which included spawner abundance as a predictor were also not included in this exercise.</w:t>
-      </w:r>
-    </w:p>
-    <w:p>
-      <w:pPr>
-        <w:pStyle w:val="BodyText"/>
-      </w:pPr>
-      <w:r>
-        <w:t xml:space="preserve">Consequently, only LASSO models dependent on hydrologic variables were evaluated as potential tools to forecast the outcomes of flow change on fish reproduction.</w:t>
-      </w:r>
-    </w:p>
-    <w:bookmarkEnd w:id="151"/>
+    <w:bookmarkEnd w:id="159"/>
     <w:sectPr>
       <w:footnotePr>
         <w:numRestart w:val="eachSect"/>
@@ -24538,9 +24623,6 @@
     <w:abstractNumId w:val="991"/>
   </w:num>
   <w:num w:numId="1009">
-    <w:abstractNumId w:val="991"/>
-  </w:num>
-  <w:num w:numId="1010">
     <w:abstractNumId w:val="991"/>
   </w:num>
 </w:numbering>

</xml_diff>

<commit_message>
LS comments part 1 of 2
</commit_message>
<xml_diff>
--- a/Kouba_Fish_and_Ag_Benefit_MS.docx
+++ b/Kouba_Fish_and_Ag_Benefit_MS.docx
@@ -15,7 +15,7 @@
         <w:pStyle w:val="Author"/>
       </w:pPr>
       <w:r>
-        <w:t xml:space="preserve">Claire Kouba, Laura Foglia, Leland Scantlebury, Thomas Harter</w:t>
+        <w:t xml:space="preserve">Claire Kouba, Leland Scantlebury, Thomas Harter</w:t>
       </w:r>
     </w:p>
     <w:p>
@@ -40,7 +40,7 @@
         <w:pStyle w:val="FirstParagraph"/>
       </w:pPr>
       <w:r>
-        <w:t xml:space="preserve">In rural semi-arid places, water needs of agriculture and ecosystems are often in complex competition, particularly in connected surface- and groundwater systems. Managing this trade-off with buy-in from the local community requires an understanding of</w:t>
+        <w:t xml:space="preserve">In rural semi-arid places, water needs of agriculture and ecosystems are often in complex competition, particularly in connected surface water and groundwater systems. Managing this trade-off with buy-in from the local community requires an understanding of</w:t>
       </w:r>
       <w:r>
         <w:t xml:space="preserve"> </w:t>
@@ -52,7 +52,7 @@
         <w:t xml:space="preserve"> </w:t>
       </w:r>
       <w:r>
-        <w:t xml:space="preserve">options and trade-offs. In this study, we propose that combining hydrologic models with stakeholder-driven design of both management scenarios and objective functions can 1) identify a politically-relevant, computationally feasible set of scenarios; 2) build a management</w:t>
+        <w:t xml:space="preserve">options and trade-offs. In this study, we propose that combining hydrologic models with stakeholder-driven design of both management scenarios and objective functions can 1) identify a politically relevant, computationally feasible set of scenarios; 2) build a management</w:t>
       </w:r>
       <w:r>
         <w:t xml:space="preserve"> </w:t>
@@ -72,7 +72,7 @@
         <w:pStyle w:val="BodyText"/>
       </w:pPr>
       <w:r>
-        <w:t xml:space="preserve">We test this in Scott Valley, a case study jurisdiction in northern California, which is in the process of implementing a long-term Groundwater Sustainability Plan (GSP). We developed a summary statistic or proxy for each of the three primary policy considerations in the GSP (environmental, agricultural, and project cost). We then used them to summarize the results of 25 management scenarios developed for the GSP based on stakeholder input, which were simulated using an existing integrated surface- and groundwater model. We found that, among the set of options considered here, it takes a high infrastructure cost (i.e., reservoir scenarios) to escape the trade-offs defined in the lower-cost regulatory scenario categories. Furthermore, although the existing GSP management priorities emphasized minimal agricultural water cuts, the Pareto-optimal set of management actions included many regulatory approaches and high-cost reservoirs. This work demonstrates that basin-specific, stakeholder-informed scenario design and objective functions can increase the value of existing hydrologic models, and can help clarify trade-offs in ongoing local water planning efforts.</w:t>
+        <w:t xml:space="preserve">We demonstrate this in Scott Valley, a case study jurisdiction in northern California, which is in the process of implementing a long-term Groundwater Sustainability Plan (GSP). We developed a quantitative metric for each of the three primary policy considerations in the GSP (environmental, agricultural, and project cost). These metrics were used to summarize the results of 25 management scenarios developed for the GSP based on stakeholder input, which were simulated using an existing integrated surface- and groundwater model. Among the set of options considered, avoiding trade-offs between environmental outcomes and agricultural water use generally required costly reservoir infrastructure, whereas lower-cost Pareto-optimal scenarios required regulatory reductions in agricultural water use. This work demonstrates that basin-specific, stakeholder-informed scenario design and objective functions can connect hydrologic modeling with decisionmaking, and can help clarify trade-offs in ongoing local water planning efforts.</w:t>
       </w:r>
     </w:p>
     <w:p>
@@ -166,7 +166,7 @@
         <w:pStyle w:val="BodyText"/>
       </w:pPr>
       <w:r>
-        <w:t xml:space="preserve">This is unfortunate, because effective climate adaptation in the water sector, in its many facets – e.g., securing water and food supplies, updating infrastructure to reduce flood and drought risk, and preserving ecosystem function – depends on local implementation</w:t>
+        <w:t xml:space="preserve">This is unfortunate, because effective climate adaptation in the water sector – e.g., securing water and food supplies, updating infrastructure to reduce flood and drought risk, and preserving ecosystem function – depends on local implementation</w:t>
       </w:r>
       <w:r>
         <w:t xml:space="preserve"> </w:t>
@@ -3280,7 +3280,7 @@
         <w:pStyle w:val="BodyText"/>
       </w:pPr>
       <w:r>
-        <w:t xml:space="preserve">There are many different possible HB function formulations; one example HB function is included below and three additional formulations are explored in Supplemental Material. These four HB functions correspond to the best-fit statistical model for two species (coho and Chinook) as measured using two different units of annual salmon reproduction (outmigrating smolt abundance and normalized smolt-per-adult-spawner in the relevant brood year). See Supplemental Material for more HB function design information.</w:t>
+        <w:t xml:space="preserve">There are many different possible HB function formulations; one example HB function is included below and three additional formulations are explored in Supporting Information, Text S1. These four HB functions correspond to the best-fit statistical model for two species (coho and Chinook) as measured using two different units of annual salmon reproduction (outmigrating smolt abundance and normalized smolt-per-adult-spawner in the relevant brood year). See Supporting Information, Text S1 for more HB function design information.</w:t>
       </w:r>
     </w:p>
     <w:p>
@@ -4300,9 +4300,6 @@
       </m:oMath>
       <w:r>
         <w:t xml:space="preserve">, making them directly comparable to HB values derived from the simulated FJ flow records in the hypothetical management scenarios.</w:t>
-      </w:r>
-      <w:r>
-        <w:t xml:space="preserve"> </w:t>
       </w:r>
     </w:p>
     <w:bookmarkEnd w:id="47"/>
@@ -5528,7 +5525,7 @@
         <w:t xml:space="preserve">4</w:t>
       </w:r>
       <w:r>
-        <w:t xml:space="preserve">). Within each category various details were altered (e.g., an alfalfa irrigation cessation date of July 10 versus August 15). Additional scenario descriptions are included below in Results and in Supplement A.</w:t>
+        <w:t xml:space="preserve">). Within each category various details were altered (e.g., an alfalfa irrigation cessation date of July 10 versus August 15). Additional scenario descriptions are included below in Results and in Supporting Information, Figures S1 and S2.</w:t>
       </w:r>
     </w:p>
     <w:p>
@@ -8082,7 +8079,7 @@
         <w:t xml:space="preserve">6</w:t>
       </w:r>
       <w:r>
-        <w:t xml:space="preserve">). (See Supplemental Material for HB function results in different units; Table</w:t>
+        <w:t xml:space="preserve">). (See Supporting Information, Tables S1-S4, for HB function results in different units; Table</w:t>
       </w:r>
       <w:r>
         <w:t xml:space="preserve"> </w:t>
@@ -8370,7 +8367,7 @@
                 <w:szCs w:val="22"/>
                 <w:color w:val="000000"/>
               </w:rPr>
-              <w:t xml:space="preserve">Highlighted in text and Supp. B</w:t>
+              <w:t xml:space="preserve">Highlighted in text and Table S1</w:t>
             </w:r>
           </w:p>
         </w:tc>
@@ -8414,7 +8411,7 @@
                 <w:szCs w:val="22"/>
                 <w:color w:val="000000"/>
               </w:rPr>
-              <w:t xml:space="preserve">Supplement D</w:t>
+              <w:t xml:space="preserve">Table S3</w:t>
             </w:r>
           </w:p>
         </w:tc>
@@ -8508,7 +8505,7 @@
                 <w:szCs w:val="22"/>
                 <w:color w:val="000000"/>
               </w:rPr>
-              <w:t xml:space="preserve">Supplement C</w:t>
+              <w:t xml:space="preserve">Table S2</w:t>
             </w:r>
           </w:p>
         </w:tc>
@@ -8552,7 +8549,7 @@
                 <w:szCs w:val="22"/>
                 <w:color w:val="000000"/>
               </w:rPr>
-              <w:t xml:space="preserve">Supplement E</w:t>
+              <w:t xml:space="preserve">Table S4</w:t>
             </w:r>
           </w:p>
         </w:tc>
@@ -8689,7 +8686,7 @@
         <w:t xml:space="preserve">3</w:t>
       </w:r>
       <w:r>
-        <w:t xml:space="preserve">; see Supplement B for tabulated, untransformed functional flow values).</w:t>
+        <w:t xml:space="preserve">; see Supporting Information, Data Set 1, for tabulated, untransformed functional flow values).</w:t>
       </w:r>
     </w:p>
     <w:p>
@@ -8709,7 +8706,7 @@
         <w:t xml:space="preserve"> </w:t>
       </w:r>
       <w:r>
-        <w:t xml:space="preserve">For coho, in both absolute and spawner-normalized smolt units, the high-importance flows were fall-to-wet season transition metrics; for units of absolute smolt abundance, the spring recession rate was also important (Supplements B and C , Table 1). For Chinook, in both absolute and spawner-normalized smolt units, the wet season baseflow median magnitude was of greatest importance; for normalized smolt units, maximum spring recession rate was also selected (Supplements D and E, Table 1). Effectively, in the context of LASSO regression, the flows that explain the most variation in smolt production (with minimal overfitting, as determined by k-fold validation) were related to, for coho, the timing of wet season onset and the magnitude of changes in fall flows; and for Chinook, the wet season baseflow.</w:t>
+        <w:t xml:space="preserve">For coho, in both absolute and spawner-normalized smolt units, the high-importance flows were fall-to-wet season transition metrics; for units of absolute smolt abundance, the spring recession rate was also important (Tables S1 and S2). For Chinook, in both absolute and spawner-normalized smolt units, the wet season baseflow median magnitude was of greatest importance; for normalized smolt units, maximum spring recession rate was also selected (Tables S3 and S4). Effectively, in the context of LASSO regression, the flows that explain the most variation in smolt production (with minimal overfitting, as determined by k-fold validation) were related to, for coho, the timing of wet season onset and the magnitude of changes in fall flows; and for Chinook, the wet season baseflow.</w:t>
       </w:r>
     </w:p>
     <w:bookmarkEnd w:id="59"/>
@@ -8757,7 +8754,7 @@
         <w:t xml:space="preserve"> </w:t>
       </w:r>
       <w:r>
-        <w:t xml:space="preserve">and Supplements B-E, Figure 1).</w:t>
+        <w:t xml:space="preserve">and Figures S3-S6).</w:t>
       </w:r>
     </w:p>
     <w:p>
@@ -8769,7 +8766,7 @@
           <wp:inline>
             <wp:extent cx="5334000" cy="5000625"/>
             <wp:effectExtent b="0" l="0" r="0" t="0"/>
-            <wp:docPr descr="Figure 5:  Comparison of annual performance in two objective functions (Hydrologic Benefit and ET, representing environmental and agricultural objectives, respectively) for brood years 1991-2025. The scenarios pictured are basecase (black circles) and a scenario from each of three categories: Enhanced Recharge, Crop Change, and eight thousand acres of irrigated crops converted to low-ET Native Vegetation. Dry-type water years (vertical bars) are 1991, ’92, ’94, 2001, ’09, ’13, ’14, ’18, and ’20-’22. Shown also in Supplement B." title="" id="61" name="Picture"/>
+            <wp:docPr descr="Figure 5:  Comparison of annual performance in two objective functions (Hydrologic Benefit and ET, representing environmental and agricultural objectives, respectively) for brood years 1991-2025. The scenarios pictured are basecase (black circles) and a scenario from each of three categories: Enhanced Recharge, Crop Change, and eight thousand acres of irrigated crops converted to low-ET Native Vegetation. Dry-type water years (vertical bars) are 1991, ’92, ’94, 2001, ’09, ’13, ’14, ’18, and ’20-’22. Shown also in Figure S3." title="" id="61" name="Picture"/>
             <a:graphic>
               <a:graphicData uri="http://schemas.openxmlformats.org/drawingml/2006/picture">
                 <pic:pic>
@@ -8823,7 +8820,7 @@
         <w:t xml:space="preserve"> </w:t>
       </w:r>
       <w:r>
-        <w:t xml:space="preserve">Comparison of annual performance in two objective functions (Hydrologic Benefit and ET, representing environmental and agricultural objectives, respectively) for brood years 1991-2025. The scenarios pictured are basecase (black circles) and a scenario from each of three categories: Enhanced Recharge, Crop Change, and eight thousand acres of irrigated crops converted to low-ET Native Vegetation. Dry-type water years (vertical bars) are 1991, ’92, ’94, 2001, ’09, ’13, ’14, ’18, and ’20-’22. Shown also in Supplement B.</w:t>
+        <w:t xml:space="preserve">Comparison of annual performance in two objective functions (Hydrologic Benefit and ET, representing environmental and agricultural objectives, respectively) for brood years 1991-2025. The scenarios pictured are basecase (black circles) and a scenario from each of three categories: Enhanced Recharge, Crop Change, and eight thousand acres of irrigated crops converted to low-ET Native Vegetation. Dry-type water years (vertical bars) are 1991, ’92, ’94, 2001, ’09, ’13, ’14, ’18, and ’20-’22. Shown also in Figure S3.</w:t>
       </w:r>
     </w:p>
     <w:p>
@@ -8831,7 +8828,7 @@
         <w:pStyle w:val="BodyText"/>
       </w:pPr>
       <w:r>
-        <w:t xml:space="preserve">The small effect of some scenarios on HB values implies that these scenarios do not alter the HB function component flows relative to basecase (Supplements B-E, Figure 2). For coho juvenile abundance, in the basecase scenario, it seems that when the HB function predicts a particularly good year for smolt production (i.e., &gt; 20,000 coho smolt-equiv.), it is driven by a large magnitude fall flow difference, or fall pulse. Conversely, in the years where the HB function predicts a particularly bad year (i.e., ’95, ’98, ’04), it is driven by a rapid first spring recession rate (Supplement B, Figure 2). Conversely, for coho juveniles per spawner (basecase), both good and bad years seem to be largely driven by wet season onset timing (Supplement C, Figure 2).</w:t>
+        <w:t xml:space="preserve">The small effect of some scenarios on HB values implies that these scenarios do not alter the HB function component flows relative to basecase (Figures S7-S10). For coho juvenile abundance, in the basecase scenario, it seems that when the HB function predicts a particularly good year for smolt production (i.e., &gt; 20,000 coho smolt-equiv.), it is driven by a large magnitude fall flow difference, or fall pulse. Conversely, in the years where the HB function predicts a particularly bad year (i.e., ’95, ’98, ’04), it is driven by a rapid first spring recession rate (Figure S7). Conversely, for coho juveniles per spawner (basecase), both good and bad years seem to be largely driven by wet season onset timing (Figure S8).</w:t>
       </w:r>
     </w:p>
     <w:p>
@@ -8839,7 +8836,7 @@
         <w:pStyle w:val="BodyText"/>
       </w:pPr>
       <w:r>
-        <w:t xml:space="preserve">In both cases for coho, second fall flow difference makes minor contributions (Supplements B and C , Figure 2), and is assigned a negative coefficient (Table</w:t>
+        <w:t xml:space="preserve">In both cases for coho, second fall flow difference makes minor contributions (Figures S7 and S8), and is assigned a negative coefficient (Table</w:t>
       </w:r>
       <w:r>
         <w:t xml:space="preserve"> </w:t>
@@ -8856,7 +8853,7 @@
         <w:pStyle w:val="BodyText"/>
       </w:pPr>
       <w:r>
-        <w:t xml:space="preserve">For Chinook, predictions of both high and low smolt production are driven by wet season baseflow magnitude (with a small contribution from maximum spring recession rate for juveniles per adult): high wet season flows are associated with lower smolt abundance (Supplements D and E, Figure 2).</w:t>
+        <w:t xml:space="preserve">For Chinook, predictions of both high and low smolt production are driven by wet season baseflow magnitude (with a small contribution from maximum spring recession rate for juveniles per adult): high wet season flows are associated with lower smolt abundance (Figures S9 and S10).</w:t>
       </w:r>
     </w:p>
     <w:bookmarkEnd w:id="64"/>
@@ -17201,7 +17198,7 @@
         <w:t xml:space="preserve"> </w:t>
       </w:r>
       <w:r>
-        <w:t xml:space="preserve">(see also Supplement B, Table 3, and Supplement B, Figure 2). The high degree of correlation between this flow and coho smolt abundance is corroborated by the species’ natural history: fall run timing is somewhat more flexible for coho than Chinook, and coho seem to respond strongly to pulse flows, possibly due to olfactory signals from their natal streams</w:t>
+        <w:t xml:space="preserve">(see also Supporting Information, Data Set 1, and Figure S7). The high degree of correlation between this flow and coho smolt abundance is corroborated by the species’ natural history: fall run timing is somewhat more flexible for coho than Chinook, and coho seem to respond strongly to pulse flows, possibly due to olfactory signals from their natal streams</w:t>
       </w:r>
       <w:r>
         <w:t xml:space="preserve"> </w:t>
@@ -17211,9 +17208,6 @@
       </w:r>
       <w:r>
         <w:t xml:space="preserve">. Because changes in water use can affect both the dry season minimum and the magnitude of a fall pulse flow, management scenarios may have positive or negative effect on this functional flow, which in turn will influence the total calculated HB value.</w:t>
-      </w:r>
-      <w:r>
-        <w:t xml:space="preserve"> </w:t>
       </w:r>
     </w:p>
     <w:bookmarkStart w:id="70" w:name="small-reservoir"/>
@@ -17277,7 +17271,7 @@
         <w:t xml:space="preserve">6</w:t>
       </w:r>
       <w:r>
-        <w:t xml:space="preserve">, green squares, and Supplements B and C, Figure 3). Reservoir scenarios seem to support Chinook populations significantly more than coho: even a small reservoir on one tributary appears to dampen wet season stormflows enough to benefit Chinook (Supplements D and E, Figure 3).</w:t>
+        <w:t xml:space="preserve">, green squares, and Figures S11 and S12). Reservoir scenarios seem to support Chinook populations significantly more than coho: even a small reservoir on one tributary appears to dampen wet season stormflows enough to benefit Chinook (Figures S13 and S14).</w:t>
       </w:r>
     </w:p>
     <w:bookmarkEnd w:id="70"/>
@@ -17366,7 +17360,7 @@
         <w:t xml:space="preserve"> </w:t>
       </w:r>
       <w:r>
-        <w:t xml:space="preserve">(1395 acres; see Supplement A for map of recharge areas).</w:t>
+        <w:t xml:space="preserve">(1395 acres; see Figure S1 for map of recharge areas).</w:t>
       </w:r>
     </w:p>
     <w:p>
@@ -17395,7 +17389,7 @@
         <w:t xml:space="preserve">6</w:t>
       </w:r>
       <w:r>
-        <w:t xml:space="preserve">; see also Supplements B-E, Figure 3). The lack of farmer cost is by design; this management strategy is intended to avoid any impacts on growing season operations.</w:t>
+        <w:t xml:space="preserve">; see also Figures S11-S14). The lack of farmer cost is by design; this management strategy is intended to avoid any impacts on growing season operations.</w:t>
       </w:r>
     </w:p>
     <w:p>
@@ -17474,7 +17468,7 @@
         <w:pStyle w:val="BodyText"/>
       </w:pPr>
       <w:r>
-        <w:t xml:space="preserve">In general, this series of cutoff dates has a progressive effect on fall flows: the earlier the cutoff date, the greater the impact on raising summer low flows, producing earlier fall flow increases, and slowing the spring recession rate (see alfalfa scenario flow results in Supplement A, Figure 2). For Chinook HB units, the impact on HB values is similarly progressive (Supplements D and E, Table 2 and Figure 3), but for coho units, the impact on HB values is more variable, since management scenarios may have a positive or negative effect on a</w:t>
+        <w:t xml:space="preserve">In general, this series of cutoff dates has a progressive effect on fall flows: the earlier the cutoff date, the greater the impact on raising summer low flows, producing earlier fall flow increases, and slowing the spring recession rate (see alfalfa scenario flow results in Figure S2). For Chinook HB units, the impact on HB values is similarly progressive (Table S7 and S8 and Figures S13-S14), but for coho units, the impact on HB values is more variable, since management scenarios may have a positive or negative effect on a</w:t>
       </w:r>
       <w:r>
         <w:t xml:space="preserve"> </w:t>
@@ -17550,9 +17544,6 @@
       <w:r>
         <w:t xml:space="preserve">). As mentioned before, the ET values in the Crop Change category are challenging to compare directly to those in other categories (see Discussion).</w:t>
       </w:r>
-      <w:r>
-        <w:t xml:space="preserve"> </w:t>
-      </w:r>
     </w:p>
     <w:bookmarkEnd w:id="73"/>
     <w:bookmarkStart w:id="74" w:name="low-flow-diversion-limits"/>
@@ -17683,7 +17674,7 @@
         <w:t xml:space="preserve">6</w:t>
       </w:r>
       <w:r>
-        <w:t xml:space="preserve">; see also Supplements B-E, Figure 3). For coho (juvenile abundance), the effect on the environmental benefit is not strictly monotonic, but generally, more native vegetation produces higher HB values, and low-ET vegetation produces higher HB values than high-ET vegetation (Supplements B and C , Figure 3). For Chinook, the environmental effects of native vegetation scenarios are more variable (Supplpments D and E, Figure 3).</w:t>
+        <w:t xml:space="preserve">; see also Figures S11-S14). For coho (juvenile abundance), the effect on the environmental benefit is not strictly monotonic, but generally, more native vegetation produces higher HB values, and low-ET vegetation produces higher HB values than high-ET vegetation (Figures S11 and S12). For Chinook, the environmental effects of native vegetation scenarios are more variable (Figures S13 and S14).</w:t>
       </w:r>
     </w:p>
     <w:bookmarkEnd w:id="75"/>
@@ -17720,7 +17711,7 @@
         <w:t xml:space="preserve">7</w:t>
       </w:r>
       <w:r>
-        <w:t xml:space="preserve">; see also Supplement B, Figure 5) versus the other three HB units evaluated here (Supplements C-E, Figure 5), but overall patterns are similar. Among all 4 HB formulations, categories containing at least one Pareto-optimal solution were:</w:t>
+        <w:t xml:space="preserve">; see also Figure S15) versus the other three HB units evaluated here (Figures S16-S18), but overall patterns are similar. Among all 4 HB formulations, categories containing at least one Pareto-optimal solution were:</w:t>
       </w:r>
     </w:p>
     <w:p>
@@ -21260,7 +21251,7 @@
         <w:pStyle w:val="FirstParagraph"/>
       </w:pPr>
       <w:r>
-        <w:t xml:space="preserve">Within the proposed suite of management actions, across all four HB formulations, approximately half (10-13 of 25) fall within the Pareto-optimal set, based on the cost proxy and the 35-year average values of two objective functions (Supplements B-E, Figure 5 and Table 2). (As mentioned above, Pareto-suboptimal status is less certain in the case of the Crop Change scenarios.)</w:t>
+        <w:t xml:space="preserve">Within the proposed suite of management actions, across all four HB formulations, approximately half (10-13 of 25) fall within the Pareto-optimal set, based on the cost proxy and the 35-year average values of two objective functions (Figures S15-S18 and Tables S5-S8). (As mentioned above, Pareto-suboptimal status is less certain in the case of the Crop Change scenarios.)</w:t>
       </w:r>
     </w:p>
     <w:p>

</xml_diff>